<commit_message>
trilha visual de fluxo: fonte comprovada em verde, origem nao comprovada em laranja, contas intermediarias, despesa com vinculo em azul e sem vinculo em vermelho, com balao de contrato; secao de fluxo no parecer; gerador do docx portado para o repositorio e integrado a rotina
</commit_message>
<xml_diff>
--- a/relatorios/Parecer_Fiscalizacao_2026.docx
+++ b/relatorios/Parecer_Fiscalizacao_2026.docx
@@ -291,7 +291,7 @@
         </w:rPr>
         <w:t xml:space="preserve">. Documento consultado em: </w:t>
       </w:r>
-      <w:hyperlink w:history="1" r:id="rIddzposfk9lranfzgift6vf">
+      <w:hyperlink w:history="1" r:id="rIdirvjgwcamaksnm7xesfuj">
         <w:r>
           <w:rPr>
             <w:rStyle w:val="Hyperlink"/>
@@ -2210,7 +2210,7 @@
         </w:rPr>
         <w:t xml:space="preserve">Deveria estar em: </w:t>
       </w:r>
-      <w:hyperlink w:history="1" r:id="rIdto9ti1w7tt2yatlcvd0yn">
+      <w:hyperlink w:history="1" r:id="rIdthkhc8zkcwviuovymxopb">
         <w:r>
           <w:rPr>
             <w:rStyle w:val="Hyperlink"/>
@@ -2284,7 +2284,7 @@
         </w:rPr>
         <w:t xml:space="preserve">Deveria estar em: </w:t>
       </w:r>
-      <w:hyperlink w:history="1" r:id="rIdnbnpbmoe-i25b5gvzqtvz">
+      <w:hyperlink w:history="1" r:id="rIdxx10lsvp3fwus0rrkzq7i">
         <w:r>
           <w:rPr>
             <w:rStyle w:val="Hyperlink"/>
@@ -2358,7 +2358,7 @@
         </w:rPr>
         <w:t xml:space="preserve">Deveria estar em: </w:t>
       </w:r>
-      <w:hyperlink w:history="1" r:id="rIdbyrqlvvd9ppfcoeu3cfri">
+      <w:hyperlink w:history="1" r:id="rIddmio1nsdocn1aqhpbkjor">
         <w:r>
           <w:rPr>
             <w:rStyle w:val="Hyperlink"/>
@@ -2432,7 +2432,7 @@
         </w:rPr>
         <w:t xml:space="preserve">Deveria estar em: </w:t>
       </w:r>
-      <w:hyperlink w:history="1" r:id="rIdaf-nkdj3lqvpvamfrpnca">
+      <w:hyperlink w:history="1" r:id="rId_77a7rer2knxhxf3htanq">
         <w:r>
           <w:rPr>
             <w:rStyle w:val="Hyperlink"/>
@@ -2506,7 +2506,7 @@
         </w:rPr>
         <w:t xml:space="preserve">Deveria estar em: </w:t>
       </w:r>
-      <w:hyperlink w:history="1" r:id="rId8bx5tc8rg0nptqyp_o7s1">
+      <w:hyperlink w:history="1" r:id="rIdixkecvlveaddzmqz4jtjx">
         <w:r>
           <w:rPr>
             <w:rStyle w:val="Hyperlink"/>
@@ -2580,7 +2580,7 @@
         </w:rPr>
         <w:t xml:space="preserve">Deveria estar em: </w:t>
       </w:r>
-      <w:hyperlink w:history="1" r:id="rIdgbxxjemka0pdrqgh_z78h">
+      <w:hyperlink w:history="1" r:id="rIdup9wxxe5kmfezjtsroddr">
         <w:r>
           <w:rPr>
             <w:rStyle w:val="Hyperlink"/>
@@ -2633,7 +2633,2314 @@
           <w:sz w:val="26"/>
           <w:szCs w:val="26"/>
         </w:rPr>
-        <w:t xml:space="preserve">IV — Irregularidades Apuradas</w:t>
+        <w:t xml:space="preserve">IV — De Onde Veio, Onde Passou, Para Onde Foi</w:t>
+      </w:r>
+    </w:p>
+    <w:p>
+      <w:pPr>
+        <w:spacing w:line="276"/>
+        <w:ind w:firstLine="1133"/>
+        <w:jc w:val="both"/>
+      </w:pPr>
+      <w:r>
+        <w:rPr>
+          <w:rFonts w:ascii="Bookman Old Style" w:cs="Bookman Old Style" w:eastAsia="Bookman Old Style" w:hAnsi="Bookman Old Style"/>
+          <w:sz w:val="22"/>
+          <w:szCs w:val="22"/>
+        </w:rPr>
+        <w:t xml:space="preserve">Entraram </w:t>
+      </w:r>
+      <w:r>
+        <w:rPr>
+          <w:rFonts w:ascii="Bookman Old Style" w:cs="Bookman Old Style" w:eastAsia="Bookman Old Style" w:hAnsi="Bookman Old Style"/>
+          <w:b/>
+          <w:bCs/>
+          <w:sz w:val="22"/>
+          <w:szCs w:val="22"/>
+        </w:rPr>
+        <w:t xml:space="preserve">R$ 23.218.000,00</w:t>
+      </w:r>
+      <w:r>
+        <w:rPr>
+          <w:rFonts w:ascii="Bookman Old Style" w:cs="Bookman Old Style" w:eastAsia="Bookman Old Style" w:hAnsi="Bookman Old Style"/>
+          <w:sz w:val="22"/>
+          <w:szCs w:val="22"/>
+        </w:rPr>
+        <w:t xml:space="preserve"> no Fundo. Destes, </w:t>
+      </w:r>
+      <w:r>
+        <w:rPr>
+          <w:rFonts w:ascii="Bookman Old Style" w:cs="Bookman Old Style" w:eastAsia="Bookman Old Style" w:hAnsi="Bookman Old Style"/>
+          <w:b/>
+          <w:bCs/>
+          <w:sz w:val="22"/>
+          <w:szCs w:val="22"/>
+        </w:rPr>
+        <w:t xml:space="preserve">R$ 19.937.000,00</w:t>
+      </w:r>
+      <w:r>
+        <w:rPr>
+          <w:rFonts w:ascii="Bookman Old Style" w:cs="Bookman Old Style" w:eastAsia="Bookman Old Style" w:hAnsi="Bookman Old Style"/>
+          <w:sz w:val="22"/>
+          <w:szCs w:val="22"/>
+        </w:rPr>
+        <w:t xml:space="preserve"> têm ente de origem identificado e </w:t>
+      </w:r>
+      <w:r>
+        <w:rPr>
+          <w:rFonts w:ascii="Bookman Old Style" w:cs="Bookman Old Style" w:eastAsia="Bookman Old Style" w:hAnsi="Bookman Old Style"/>
+          <w:b/>
+          <w:bCs/>
+          <w:sz w:val="22"/>
+          <w:szCs w:val="22"/>
+        </w:rPr>
+        <w:t xml:space="preserve">R$ 3.281.000,00</w:t>
+      </w:r>
+      <w:r>
+        <w:rPr>
+          <w:rFonts w:ascii="Bookman Old Style" w:cs="Bookman Old Style" w:eastAsia="Bookman Old Style" w:hAnsi="Bookman Old Style"/>
+          <w:sz w:val="22"/>
+          <w:szCs w:val="22"/>
+        </w:rPr>
+        <w:t xml:space="preserve"> não têm. Do lado da saída, apenas </w:t>
+      </w:r>
+      <w:r>
+        <w:rPr>
+          <w:rFonts w:ascii="Bookman Old Style" w:cs="Bookman Old Style" w:eastAsia="Bookman Old Style" w:hAnsi="Bookman Old Style"/>
+          <w:b/>
+          <w:bCs/>
+          <w:sz w:val="22"/>
+          <w:szCs w:val="22"/>
+        </w:rPr>
+        <w:t xml:space="preserve">R$ 2.360.980,54</w:t>
+      </w:r>
+      <w:r>
+        <w:rPr>
+          <w:rFonts w:ascii="Bookman Old Style" w:cs="Bookman Old Style" w:eastAsia="Bookman Old Style" w:hAnsi="Bookman Old Style"/>
+          <w:sz w:val="22"/>
+          <w:szCs w:val="22"/>
+        </w:rPr>
+        <w:t xml:space="preserve"> puderam ser atribuídos a um beneficiário — </w:t>
+      </w:r>
+      <w:r>
+        <w:rPr>
+          <w:rFonts w:ascii="Bookman Old Style" w:cs="Bookman Old Style" w:eastAsia="Bookman Old Style" w:hAnsi="Bookman Old Style"/>
+          <w:b/>
+          <w:bCs/>
+          <w:sz w:val="22"/>
+          <w:szCs w:val="22"/>
+        </w:rPr>
+        <w:t xml:space="preserve">10.2%</w:t>
+      </w:r>
+      <w:r>
+        <w:rPr>
+          <w:rFonts w:ascii="Bookman Old Style" w:cs="Bookman Old Style" w:eastAsia="Bookman Old Style" w:hAnsi="Bookman Old Style"/>
+          <w:sz w:val="22"/>
+          <w:szCs w:val="22"/>
+        </w:rPr>
+        <w:t xml:space="preserve"> do movimento do Fundo. Desse pouco, </w:t>
+      </w:r>
+      <w:r>
+        <w:rPr>
+          <w:rFonts w:ascii="Bookman Old Style" w:cs="Bookman Old Style" w:eastAsia="Bookman Old Style" w:hAnsi="Bookman Old Style"/>
+          <w:b/>
+          <w:bCs/>
+          <w:sz w:val="22"/>
+          <w:szCs w:val="22"/>
+        </w:rPr>
+        <w:t xml:space="preserve">R$ 1.422.609,94</w:t>
+      </w:r>
+      <w:r>
+        <w:rPr>
+          <w:rFonts w:ascii="Bookman Old Style" w:cs="Bookman Old Style" w:eastAsia="Bookman Old Style" w:hAnsi="Bookman Old Style"/>
+          <w:sz w:val="22"/>
+          <w:szCs w:val="22"/>
+        </w:rPr>
+        <w:t xml:space="preserve"> têm contrato ou termo publicado e </w:t>
+      </w:r>
+      <w:r>
+        <w:rPr>
+          <w:rFonts w:ascii="Bookman Old Style" w:cs="Bookman Old Style" w:eastAsia="Bookman Old Style" w:hAnsi="Bookman Old Style"/>
+          <w:b/>
+          <w:bCs/>
+          <w:sz w:val="22"/>
+          <w:szCs w:val="22"/>
+        </w:rPr>
+        <w:t xml:space="preserve">R$ 938.370,60</w:t>
+      </w:r>
+      <w:r>
+        <w:rPr>
+          <w:rFonts w:ascii="Bookman Old Style" w:cs="Bookman Old Style" w:eastAsia="Bookman Old Style" w:hAnsi="Bookman Old Style"/>
+          <w:sz w:val="22"/>
+          <w:szCs w:val="22"/>
+        </w:rPr>
+        <w:t xml:space="preserve"> não têm. E fora do Fundo, sem passar pelo controle do Conselho, corre ainda </w:t>
+      </w:r>
+      <w:r>
+        <w:rPr>
+          <w:rFonts w:ascii="Bookman Old Style" w:cs="Bookman Old Style" w:eastAsia="Bookman Old Style" w:hAnsi="Bookman Old Style"/>
+          <w:b/>
+          <w:bCs/>
+          <w:sz w:val="22"/>
+          <w:szCs w:val="22"/>
+        </w:rPr>
+        <w:t xml:space="preserve">R$ 81.202.000,00</w:t>
+      </w:r>
+      <w:r>
+        <w:rPr>
+          <w:rFonts w:ascii="Bookman Old Style" w:cs="Bookman Old Style" w:eastAsia="Bookman Old Style" w:hAnsi="Bookman Old Style"/>
+          <w:sz w:val="22"/>
+          <w:szCs w:val="22"/>
+        </w:rPr>
+        <w:t xml:space="preserve"> na unidade do Gabinete.</w:t>
+      </w:r>
+    </w:p>
+    <w:p>
+      <w:pPr>
+        <w:spacing w:line="276"/>
+      </w:pPr>
+      <w:r>
+        <w:rPr>
+          <w:rFonts w:ascii="Bookman Old Style" w:cs="Bookman Old Style" w:eastAsia="Bookman Old Style" w:hAnsi="Bookman Old Style"/>
+          <w:sz w:val="22"/>
+          <w:szCs w:val="22"/>
+        </w:rPr>
+        <w:t xml:space="preserve"/>
+      </w:r>
+    </w:p>
+    <w:p>
+      <w:pPr>
+        <w:spacing w:after="60"/>
+        <w:jc w:val="center"/>
+      </w:pPr>
+      <w:r>
+        <w:rPr>
+          <w:rFonts w:ascii="Bookman Old Style" w:cs="Bookman Old Style" w:eastAsia="Bookman Old Style" w:hAnsi="Bookman Old Style"/>
+          <w:b/>
+          <w:bCs/>
+          <w:sz w:val="20"/>
+          <w:szCs w:val="20"/>
+        </w:rPr>
+        <w:t xml:space="preserve">Origem do dinheiro</w:t>
+      </w:r>
+    </w:p>
+    <w:tbl>
+      <w:tblPr>
+        <w:tblW w:type="dxa" w:w="8200"/>
+        <w:tblBorders>
+          <w:top w:val="single" w:color="auto" w:sz="4"/>
+          <w:left w:val="single" w:color="auto" w:sz="4"/>
+          <w:bottom w:val="single" w:color="auto" w:sz="4"/>
+          <w:right w:val="single" w:color="auto" w:sz="4"/>
+          <w:insideH w:val="single" w:color="auto" w:sz="4"/>
+          <w:insideV w:val="single" w:color="auto" w:sz="4"/>
+        </w:tblBorders>
+      </w:tblPr>
+      <w:tblGrid>
+        <w:gridCol w:w="3900"/>
+        <w:gridCol w:w="900"/>
+        <w:gridCol w:w="1900"/>
+        <w:gridCol w:w="1500"/>
+      </w:tblGrid>
+      <w:tr>
+        <w:tc>
+          <w:tcPr>
+            <w:tcW w:type="dxa" w:w="3900"/>
+            <w:shd w:fill="EAE6DC" w:val="clear"/>
+          </w:tcPr>
+          <w:p>
+            <w:pPr>
+              <w:jc w:val="left"/>
+            </w:pPr>
+            <w:r>
+              <w:rPr>
+                <w:rFonts w:ascii="Bookman Old Style" w:cs="Bookman Old Style" w:eastAsia="Bookman Old Style" w:hAnsi="Bookman Old Style"/>
+                <w:b/>
+                <w:bCs/>
+                <w:sz w:val="18"/>
+                <w:szCs w:val="18"/>
+              </w:rPr>
+              <w:t xml:space="preserve">Origem</w:t>
+            </w:r>
+          </w:p>
+        </w:tc>
+        <w:tc>
+          <w:tcPr>
+            <w:tcW w:type="dxa" w:w="900"/>
+            <w:shd w:fill="EAE6DC" w:val="clear"/>
+          </w:tcPr>
+          <w:p>
+            <w:pPr>
+              <w:jc w:val="left"/>
+            </w:pPr>
+            <w:r>
+              <w:rPr>
+                <w:rFonts w:ascii="Bookman Old Style" w:cs="Bookman Old Style" w:eastAsia="Bookman Old Style" w:hAnsi="Bookman Old Style"/>
+                <w:b/>
+                <w:bCs/>
+                <w:sz w:val="18"/>
+                <w:szCs w:val="18"/>
+              </w:rPr>
+              <w:t xml:space="preserve">Fonte</w:t>
+            </w:r>
+          </w:p>
+        </w:tc>
+        <w:tc>
+          <w:tcPr>
+            <w:tcW w:type="dxa" w:w="1900"/>
+            <w:shd w:fill="EAE6DC" w:val="clear"/>
+          </w:tcPr>
+          <w:p>
+            <w:pPr>
+              <w:jc w:val="left"/>
+            </w:pPr>
+            <w:r>
+              <w:rPr>
+                <w:rFonts w:ascii="Bookman Old Style" w:cs="Bookman Old Style" w:eastAsia="Bookman Old Style" w:hAnsi="Bookman Old Style"/>
+                <w:b/>
+                <w:bCs/>
+                <w:sz w:val="18"/>
+                <w:szCs w:val="18"/>
+              </w:rPr>
+              <w:t xml:space="preserve">Valor</w:t>
+            </w:r>
+          </w:p>
+        </w:tc>
+        <w:tc>
+          <w:tcPr>
+            <w:tcW w:type="dxa" w:w="1500"/>
+            <w:shd w:fill="EAE6DC" w:val="clear"/>
+          </w:tcPr>
+          <w:p>
+            <w:pPr>
+              <w:jc w:val="left"/>
+            </w:pPr>
+            <w:r>
+              <w:rPr>
+                <w:rFonts w:ascii="Bookman Old Style" w:cs="Bookman Old Style" w:eastAsia="Bookman Old Style" w:hAnsi="Bookman Old Style"/>
+                <w:b/>
+                <w:bCs/>
+                <w:sz w:val="18"/>
+                <w:szCs w:val="18"/>
+              </w:rPr>
+              <w:t xml:space="preserve">Comprovação</w:t>
+            </w:r>
+          </w:p>
+        </w:tc>
+      </w:tr>
+      <w:tr>
+        <w:tc>
+          <w:tcPr>
+            <w:tcW w:type="dxa" w:w="3900"/>
+          </w:tcPr>
+          <w:p>
+            <w:pPr>
+              <w:jc w:val="left"/>
+            </w:pPr>
+            <w:r>
+              <w:rPr>
+                <w:rFonts w:ascii="Bookman Old Style" w:cs="Bookman Old Style" w:eastAsia="Bookman Old Style" w:hAnsi="Bookman Old Style"/>
+                <w:sz w:val="18"/>
+                <w:szCs w:val="18"/>
+              </w:rPr>
+              <w:t xml:space="preserve">União — Fundo Nacional de Assistência Social</w:t>
+            </w:r>
+          </w:p>
+        </w:tc>
+        <w:tc>
+          <w:tcPr>
+            <w:tcW w:type="dxa" w:w="900"/>
+          </w:tcPr>
+          <w:p>
+            <w:pPr>
+              <w:jc w:val="right"/>
+            </w:pPr>
+            <w:r>
+              <w:rPr>
+                <w:rFonts w:ascii="Bookman Old Style" w:cs="Bookman Old Style" w:eastAsia="Bookman Old Style" w:hAnsi="Bookman Old Style"/>
+                <w:sz w:val="18"/>
+                <w:szCs w:val="18"/>
+              </w:rPr>
+              <w:t xml:space="preserve">1660</w:t>
+            </w:r>
+          </w:p>
+        </w:tc>
+        <w:tc>
+          <w:tcPr>
+            <w:tcW w:type="dxa" w:w="1900"/>
+          </w:tcPr>
+          <w:p>
+            <w:pPr>
+              <w:jc w:val="right"/>
+            </w:pPr>
+            <w:r>
+              <w:rPr>
+                <w:rFonts w:ascii="Bookman Old Style" w:cs="Bookman Old Style" w:eastAsia="Bookman Old Style" w:hAnsi="Bookman Old Style"/>
+                <w:sz w:val="18"/>
+                <w:szCs w:val="18"/>
+              </w:rPr>
+              <w:t xml:space="preserve">R$ 8.250.000,00</w:t>
+            </w:r>
+          </w:p>
+        </w:tc>
+        <w:tc>
+          <w:tcPr>
+            <w:tcW w:type="dxa" w:w="1500"/>
+          </w:tcPr>
+          <w:p>
+            <w:pPr>
+              <w:jc w:val="left"/>
+            </w:pPr>
+            <w:r>
+              <w:rPr>
+                <w:rFonts w:ascii="Bookman Old Style" w:cs="Bookman Old Style" w:eastAsia="Bookman Old Style" w:hAnsi="Bookman Old Style"/>
+                <w:sz w:val="18"/>
+                <w:szCs w:val="18"/>
+              </w:rPr>
+              <w:t xml:space="preserve">origem identificada</w:t>
+            </w:r>
+          </w:p>
+        </w:tc>
+      </w:tr>
+      <w:tr>
+        <w:tc>
+          <w:tcPr>
+            <w:tcW w:type="dxa" w:w="3900"/>
+          </w:tcPr>
+          <w:p>
+            <w:pPr>
+              <w:jc w:val="left"/>
+            </w:pPr>
+            <w:r>
+              <w:rPr>
+                <w:rFonts w:ascii="Bookman Old Style" w:cs="Bookman Old Style" w:eastAsia="Bookman Old Style" w:hAnsi="Bookman Old Style"/>
+                <w:sz w:val="18"/>
+                <w:szCs w:val="18"/>
+              </w:rPr>
+              <w:t xml:space="preserve">Estado — Assistência Social</w:t>
+            </w:r>
+          </w:p>
+        </w:tc>
+        <w:tc>
+          <w:tcPr>
+            <w:tcW w:type="dxa" w:w="900"/>
+          </w:tcPr>
+          <w:p>
+            <w:pPr>
+              <w:jc w:val="right"/>
+            </w:pPr>
+            <w:r>
+              <w:rPr>
+                <w:rFonts w:ascii="Bookman Old Style" w:cs="Bookman Old Style" w:eastAsia="Bookman Old Style" w:hAnsi="Bookman Old Style"/>
+                <w:sz w:val="18"/>
+                <w:szCs w:val="18"/>
+              </w:rPr>
+              <w:t xml:space="preserve">1661</w:t>
+            </w:r>
+          </w:p>
+        </w:tc>
+        <w:tc>
+          <w:tcPr>
+            <w:tcW w:type="dxa" w:w="1900"/>
+          </w:tcPr>
+          <w:p>
+            <w:pPr>
+              <w:jc w:val="right"/>
+            </w:pPr>
+            <w:r>
+              <w:rPr>
+                <w:rFonts w:ascii="Bookman Old Style" w:cs="Bookman Old Style" w:eastAsia="Bookman Old Style" w:hAnsi="Bookman Old Style"/>
+                <w:sz w:val="18"/>
+                <w:szCs w:val="18"/>
+              </w:rPr>
+              <w:t xml:space="preserve">R$ 6.000.000,00</w:t>
+            </w:r>
+          </w:p>
+        </w:tc>
+        <w:tc>
+          <w:tcPr>
+            <w:tcW w:type="dxa" w:w="1500"/>
+          </w:tcPr>
+          <w:p>
+            <w:pPr>
+              <w:jc w:val="left"/>
+            </w:pPr>
+            <w:r>
+              <w:rPr>
+                <w:rFonts w:ascii="Bookman Old Style" w:cs="Bookman Old Style" w:eastAsia="Bookman Old Style" w:hAnsi="Bookman Old Style"/>
+                <w:sz w:val="18"/>
+                <w:szCs w:val="18"/>
+              </w:rPr>
+              <w:t xml:space="preserve">origem identificada</w:t>
+            </w:r>
+          </w:p>
+        </w:tc>
+      </w:tr>
+      <w:tr>
+        <w:tc>
+          <w:tcPr>
+            <w:tcW w:type="dxa" w:w="3900"/>
+          </w:tcPr>
+          <w:p>
+            <w:pPr>
+              <w:jc w:val="left"/>
+            </w:pPr>
+            <w:r>
+              <w:rPr>
+                <w:rFonts w:ascii="Bookman Old Style" w:cs="Bookman Old Style" w:eastAsia="Bookman Old Style" w:hAnsi="Bookman Old Style"/>
+                <w:sz w:val="18"/>
+                <w:szCs w:val="18"/>
+              </w:rPr>
+              <w:t xml:space="preserve">Estado — Programas de Assistência Social</w:t>
+            </w:r>
+          </w:p>
+        </w:tc>
+        <w:tc>
+          <w:tcPr>
+            <w:tcW w:type="dxa" w:w="900"/>
+          </w:tcPr>
+          <w:p>
+            <w:pPr>
+              <w:jc w:val="right"/>
+            </w:pPr>
+            <w:r>
+              <w:rPr>
+                <w:rFonts w:ascii="Bookman Old Style" w:cs="Bookman Old Style" w:eastAsia="Bookman Old Style" w:hAnsi="Bookman Old Style"/>
+                <w:sz w:val="18"/>
+                <w:szCs w:val="18"/>
+              </w:rPr>
+              <w:t xml:space="preserve">1665</w:t>
+            </w:r>
+          </w:p>
+        </w:tc>
+        <w:tc>
+          <w:tcPr>
+            <w:tcW w:type="dxa" w:w="1900"/>
+          </w:tcPr>
+          <w:p>
+            <w:pPr>
+              <w:jc w:val="right"/>
+            </w:pPr>
+            <w:r>
+              <w:rPr>
+                <w:rFonts w:ascii="Bookman Old Style" w:cs="Bookman Old Style" w:eastAsia="Bookman Old Style" w:hAnsi="Bookman Old Style"/>
+                <w:sz w:val="18"/>
+                <w:szCs w:val="18"/>
+              </w:rPr>
+              <w:t xml:space="preserve">R$ 3.104.000,00</w:t>
+            </w:r>
+          </w:p>
+        </w:tc>
+        <w:tc>
+          <w:tcPr>
+            <w:tcW w:type="dxa" w:w="1500"/>
+          </w:tcPr>
+          <w:p>
+            <w:pPr>
+              <w:jc w:val="left"/>
+            </w:pPr>
+            <w:r>
+              <w:rPr>
+                <w:rFonts w:ascii="Bookman Old Style" w:cs="Bookman Old Style" w:eastAsia="Bookman Old Style" w:hAnsi="Bookman Old Style"/>
+                <w:sz w:val="18"/>
+                <w:szCs w:val="18"/>
+              </w:rPr>
+              <w:t xml:space="preserve">origem identificada</w:t>
+            </w:r>
+          </w:p>
+        </w:tc>
+      </w:tr>
+      <w:tr>
+        <w:tc>
+          <w:tcPr>
+            <w:tcW w:type="dxa" w:w="3900"/>
+          </w:tcPr>
+          <w:p>
+            <w:pPr>
+              <w:jc w:val="left"/>
+            </w:pPr>
+            <w:r>
+              <w:rPr>
+                <w:rFonts w:ascii="Bookman Old Style" w:cs="Bookman Old Style" w:eastAsia="Bookman Old Style" w:hAnsi="Bookman Old Style"/>
+                <w:sz w:val="18"/>
+                <w:szCs w:val="18"/>
+              </w:rPr>
+              <w:t xml:space="preserve">Rendimento de aplicação financeira</w:t>
+            </w:r>
+          </w:p>
+        </w:tc>
+        <w:tc>
+          <w:tcPr>
+            <w:tcW w:type="dxa" w:w="900"/>
+          </w:tcPr>
+          <w:p>
+            <w:pPr>
+              <w:jc w:val="left"/>
+            </w:pPr>
+            <w:r>
+              <w:rPr>
+                <w:rFonts w:ascii="Bookman Old Style" w:cs="Bookman Old Style" w:eastAsia="Bookman Old Style" w:hAnsi="Bookman Old Style"/>
+                <w:sz w:val="18"/>
+                <w:szCs w:val="18"/>
+              </w:rPr>
+              <w:t xml:space="preserve">própria</w:t>
+            </w:r>
+          </w:p>
+        </w:tc>
+        <w:tc>
+          <w:tcPr>
+            <w:tcW w:type="dxa" w:w="1900"/>
+          </w:tcPr>
+          <w:p>
+            <w:pPr>
+              <w:jc w:val="right"/>
+            </w:pPr>
+            <w:r>
+              <w:rPr>
+                <w:rFonts w:ascii="Bookman Old Style" w:cs="Bookman Old Style" w:eastAsia="Bookman Old Style" w:hAnsi="Bookman Old Style"/>
+                <w:sz w:val="18"/>
+                <w:szCs w:val="18"/>
+              </w:rPr>
+              <w:t xml:space="preserve">R$ 2.574.000,00</w:t>
+            </w:r>
+          </w:p>
+        </w:tc>
+        <w:tc>
+          <w:tcPr>
+            <w:tcW w:type="dxa" w:w="1500"/>
+          </w:tcPr>
+          <w:p>
+            <w:pPr>
+              <w:jc w:val="left"/>
+            </w:pPr>
+            <w:r>
+              <w:rPr>
+                <w:rFonts w:ascii="Bookman Old Style" w:cs="Bookman Old Style" w:eastAsia="Bookman Old Style" w:hAnsi="Bookman Old Style"/>
+                <w:sz w:val="18"/>
+                <w:szCs w:val="18"/>
+              </w:rPr>
+              <w:t xml:space="preserve">origem identificada</w:t>
+            </w:r>
+          </w:p>
+        </w:tc>
+      </w:tr>
+      <w:tr>
+        <w:tc>
+          <w:tcPr>
+            <w:tcW w:type="dxa" w:w="3900"/>
+          </w:tcPr>
+          <w:p>
+            <w:pPr>
+              <w:jc w:val="left"/>
+            </w:pPr>
+            <w:r>
+              <w:rPr>
+                <w:rFonts w:ascii="Bookman Old Style" w:cs="Bookman Old Style" w:eastAsia="Bookman Old Style" w:hAnsi="Bookman Old Style"/>
+                <w:sz w:val="18"/>
+                <w:szCs w:val="18"/>
+              </w:rPr>
+              <w:t xml:space="preserve">Município — Tesouro Municipal</w:t>
+            </w:r>
+          </w:p>
+        </w:tc>
+        <w:tc>
+          <w:tcPr>
+            <w:tcW w:type="dxa" w:w="900"/>
+          </w:tcPr>
+          <w:p>
+            <w:pPr>
+              <w:jc w:val="left"/>
+            </w:pPr>
+            <w:r>
+              <w:rPr>
+                <w:rFonts w:ascii="Bookman Old Style" w:cs="Bookman Old Style" w:eastAsia="Bookman Old Style" w:hAnsi="Bookman Old Style"/>
+                <w:sz w:val="18"/>
+                <w:szCs w:val="18"/>
+              </w:rPr>
+              <w:t xml:space="preserve">tesouro</w:t>
+            </w:r>
+          </w:p>
+        </w:tc>
+        <w:tc>
+          <w:tcPr>
+            <w:tcW w:type="dxa" w:w="1900"/>
+          </w:tcPr>
+          <w:p>
+            <w:pPr>
+              <w:jc w:val="right"/>
+            </w:pPr>
+            <w:r>
+              <w:rPr>
+                <w:rFonts w:ascii="Bookman Old Style" w:cs="Bookman Old Style" w:eastAsia="Bookman Old Style" w:hAnsi="Bookman Old Style"/>
+                <w:sz w:val="18"/>
+                <w:szCs w:val="18"/>
+              </w:rPr>
+              <w:t xml:space="preserve">R$ 9.000,00</w:t>
+            </w:r>
+          </w:p>
+        </w:tc>
+        <w:tc>
+          <w:tcPr>
+            <w:tcW w:type="dxa" w:w="1500"/>
+          </w:tcPr>
+          <w:p>
+            <w:pPr>
+              <w:jc w:val="left"/>
+            </w:pPr>
+            <w:r>
+              <w:rPr>
+                <w:rFonts w:ascii="Bookman Old Style" w:cs="Bookman Old Style" w:eastAsia="Bookman Old Style" w:hAnsi="Bookman Old Style"/>
+                <w:sz w:val="18"/>
+                <w:szCs w:val="18"/>
+              </w:rPr>
+              <w:t xml:space="preserve">origem identificada</w:t>
+            </w:r>
+          </w:p>
+        </w:tc>
+      </w:tr>
+      <w:tr>
+        <w:tc>
+          <w:tcPr>
+            <w:tcW w:type="dxa" w:w="3900"/>
+          </w:tcPr>
+          <w:p>
+            <w:pPr>
+              <w:jc w:val="left"/>
+            </w:pPr>
+            <w:r>
+              <w:rPr>
+                <w:rFonts w:ascii="Bookman Old Style" w:cs="Bookman Old Style" w:eastAsia="Bookman Old Style" w:hAnsi="Bookman Old Style"/>
+                <w:sz w:val="18"/>
+                <w:szCs w:val="18"/>
+              </w:rPr>
+              <w:t xml:space="preserve">Transferências correntes sem fonte identificada</w:t>
+            </w:r>
+          </w:p>
+        </w:tc>
+        <w:tc>
+          <w:tcPr>
+            <w:tcW w:type="dxa" w:w="900"/>
+          </w:tcPr>
+          <w:p>
+            <w:pPr>
+              <w:jc w:val="left"/>
+            </w:pPr>
+            <w:r>
+              <w:rPr>
+                <w:rFonts w:ascii="Bookman Old Style" w:cs="Bookman Old Style" w:eastAsia="Bookman Old Style" w:hAnsi="Bookman Old Style"/>
+                <w:sz w:val="18"/>
+                <w:szCs w:val="18"/>
+              </w:rPr>
+              <w:t xml:space="preserve">—</w:t>
+            </w:r>
+          </w:p>
+        </w:tc>
+        <w:tc>
+          <w:tcPr>
+            <w:tcW w:type="dxa" w:w="1900"/>
+          </w:tcPr>
+          <w:p>
+            <w:pPr>
+              <w:jc w:val="right"/>
+            </w:pPr>
+            <w:r>
+              <w:rPr>
+                <w:rFonts w:ascii="Bookman Old Style" w:cs="Bookman Old Style" w:eastAsia="Bookman Old Style" w:hAnsi="Bookman Old Style"/>
+                <w:sz w:val="18"/>
+                <w:szCs w:val="18"/>
+              </w:rPr>
+              <w:t xml:space="preserve">R$ 2.071.000,00</w:t>
+            </w:r>
+          </w:p>
+        </w:tc>
+        <w:tc>
+          <w:tcPr>
+            <w:tcW w:type="dxa" w:w="1500"/>
+          </w:tcPr>
+          <w:p>
+            <w:pPr>
+              <w:jc w:val="left"/>
+            </w:pPr>
+            <w:r>
+              <w:rPr>
+                <w:rFonts w:ascii="Bookman Old Style" w:cs="Bookman Old Style" w:eastAsia="Bookman Old Style" w:hAnsi="Bookman Old Style"/>
+                <w:sz w:val="18"/>
+                <w:szCs w:val="18"/>
+              </w:rPr>
+              <w:t xml:space="preserve">origem não comprovada</w:t>
+            </w:r>
+          </w:p>
+        </w:tc>
+      </w:tr>
+      <w:tr>
+        <w:tc>
+          <w:tcPr>
+            <w:tcW w:type="dxa" w:w="3900"/>
+          </w:tcPr>
+          <w:p>
+            <w:pPr>
+              <w:jc w:val="left"/>
+            </w:pPr>
+            <w:r>
+              <w:rPr>
+                <w:rFonts w:ascii="Bookman Old Style" w:cs="Bookman Old Style" w:eastAsia="Bookman Old Style" w:hAnsi="Bookman Old Style"/>
+                <w:sz w:val="18"/>
+                <w:szCs w:val="18"/>
+              </w:rPr>
+              <w:t xml:space="preserve">Transferências de capital</w:t>
+            </w:r>
+          </w:p>
+        </w:tc>
+        <w:tc>
+          <w:tcPr>
+            <w:tcW w:type="dxa" w:w="900"/>
+          </w:tcPr>
+          <w:p>
+            <w:pPr>
+              <w:jc w:val="left"/>
+            </w:pPr>
+            <w:r>
+              <w:rPr>
+                <w:rFonts w:ascii="Bookman Old Style" w:cs="Bookman Old Style" w:eastAsia="Bookman Old Style" w:hAnsi="Bookman Old Style"/>
+                <w:sz w:val="18"/>
+                <w:szCs w:val="18"/>
+              </w:rPr>
+              <w:t xml:space="preserve">—</w:t>
+            </w:r>
+          </w:p>
+        </w:tc>
+        <w:tc>
+          <w:tcPr>
+            <w:tcW w:type="dxa" w:w="1900"/>
+          </w:tcPr>
+          <w:p>
+            <w:pPr>
+              <w:jc w:val="right"/>
+            </w:pPr>
+            <w:r>
+              <w:rPr>
+                <w:rFonts w:ascii="Bookman Old Style" w:cs="Bookman Old Style" w:eastAsia="Bookman Old Style" w:hAnsi="Bookman Old Style"/>
+                <w:sz w:val="18"/>
+                <w:szCs w:val="18"/>
+              </w:rPr>
+              <w:t xml:space="preserve">R$ 1.115.000,00</w:t>
+            </w:r>
+          </w:p>
+        </w:tc>
+        <w:tc>
+          <w:tcPr>
+            <w:tcW w:type="dxa" w:w="1500"/>
+          </w:tcPr>
+          <w:p>
+            <w:pPr>
+              <w:jc w:val="left"/>
+            </w:pPr>
+            <w:r>
+              <w:rPr>
+                <w:rFonts w:ascii="Bookman Old Style" w:cs="Bookman Old Style" w:eastAsia="Bookman Old Style" w:hAnsi="Bookman Old Style"/>
+                <w:sz w:val="18"/>
+                <w:szCs w:val="18"/>
+              </w:rPr>
+              <w:t xml:space="preserve">origem não comprovada</w:t>
+            </w:r>
+          </w:p>
+        </w:tc>
+      </w:tr>
+      <w:tr>
+        <w:tc>
+          <w:tcPr>
+            <w:tcW w:type="dxa" w:w="3900"/>
+          </w:tcPr>
+          <w:p>
+            <w:pPr>
+              <w:jc w:val="left"/>
+            </w:pPr>
+            <w:r>
+              <w:rPr>
+                <w:rFonts w:ascii="Bookman Old Style" w:cs="Bookman Old Style" w:eastAsia="Bookman Old Style" w:hAnsi="Bookman Old Style"/>
+                <w:sz w:val="18"/>
+                <w:szCs w:val="18"/>
+              </w:rPr>
+              <w:t xml:space="preserve">Outras receitas correntes</w:t>
+            </w:r>
+          </w:p>
+        </w:tc>
+        <w:tc>
+          <w:tcPr>
+            <w:tcW w:type="dxa" w:w="900"/>
+          </w:tcPr>
+          <w:p>
+            <w:pPr>
+              <w:jc w:val="left"/>
+            </w:pPr>
+            <w:r>
+              <w:rPr>
+                <w:rFonts w:ascii="Bookman Old Style" w:cs="Bookman Old Style" w:eastAsia="Bookman Old Style" w:hAnsi="Bookman Old Style"/>
+                <w:sz w:val="18"/>
+                <w:szCs w:val="18"/>
+              </w:rPr>
+              <w:t xml:space="preserve">—</w:t>
+            </w:r>
+          </w:p>
+        </w:tc>
+        <w:tc>
+          <w:tcPr>
+            <w:tcW w:type="dxa" w:w="1900"/>
+          </w:tcPr>
+          <w:p>
+            <w:pPr>
+              <w:jc w:val="right"/>
+            </w:pPr>
+            <w:r>
+              <w:rPr>
+                <w:rFonts w:ascii="Bookman Old Style" w:cs="Bookman Old Style" w:eastAsia="Bookman Old Style" w:hAnsi="Bookman Old Style"/>
+                <w:sz w:val="18"/>
+                <w:szCs w:val="18"/>
+              </w:rPr>
+              <w:t xml:space="preserve">R$ 95.000,00</w:t>
+            </w:r>
+          </w:p>
+        </w:tc>
+        <w:tc>
+          <w:tcPr>
+            <w:tcW w:type="dxa" w:w="1500"/>
+          </w:tcPr>
+          <w:p>
+            <w:pPr>
+              <w:jc w:val="left"/>
+            </w:pPr>
+            <w:r>
+              <w:rPr>
+                <w:rFonts w:ascii="Bookman Old Style" w:cs="Bookman Old Style" w:eastAsia="Bookman Old Style" w:hAnsi="Bookman Old Style"/>
+                <w:sz w:val="18"/>
+                <w:szCs w:val="18"/>
+              </w:rPr>
+              <w:t xml:space="preserve">origem não comprovada</w:t>
+            </w:r>
+          </w:p>
+        </w:tc>
+      </w:tr>
+    </w:tbl>
+    <w:p>
+      <w:pPr>
+        <w:spacing w:line="276"/>
+      </w:pPr>
+      <w:r>
+        <w:rPr>
+          <w:rFonts w:ascii="Bookman Old Style" w:cs="Bookman Old Style" w:eastAsia="Bookman Old Style" w:hAnsi="Bookman Old Style"/>
+          <w:sz w:val="22"/>
+          <w:szCs w:val="22"/>
+        </w:rPr>
+        <w:t xml:space="preserve"/>
+      </w:r>
+    </w:p>
+    <w:p>
+      <w:pPr>
+        <w:spacing w:after="60"/>
+        <w:jc w:val="center"/>
+      </w:pPr>
+      <w:r>
+        <w:rPr>
+          <w:rFonts w:ascii="Bookman Old Style" w:cs="Bookman Old Style" w:eastAsia="Bookman Old Style" w:hAnsi="Bookman Old Style"/>
+          <w:b/>
+          <w:bCs/>
+          <w:sz w:val="20"/>
+          <w:szCs w:val="20"/>
+        </w:rPr>
+        <w:t xml:space="preserve">Por onde passa</w:t>
+      </w:r>
+    </w:p>
+    <w:tbl>
+      <w:tblPr>
+        <w:tblW w:type="dxa" w:w="8200"/>
+        <w:tblBorders>
+          <w:top w:val="single" w:color="auto" w:sz="4"/>
+          <w:left w:val="single" w:color="auto" w:sz="4"/>
+          <w:bottom w:val="single" w:color="auto" w:sz="4"/>
+          <w:right w:val="single" w:color="auto" w:sz="4"/>
+          <w:insideH w:val="single" w:color="auto" w:sz="4"/>
+          <w:insideV w:val="single" w:color="auto" w:sz="4"/>
+        </w:tblBorders>
+      </w:tblPr>
+      <w:tblGrid>
+        <w:gridCol w:w="4900"/>
+        <w:gridCol w:w="1900"/>
+        <w:gridCol w:w="1400"/>
+      </w:tblGrid>
+      <w:tr>
+        <w:tc>
+          <w:tcPr>
+            <w:tcW w:type="dxa" w:w="4900"/>
+            <w:shd w:fill="EAE6DC" w:val="clear"/>
+          </w:tcPr>
+          <w:p>
+            <w:pPr>
+              <w:jc w:val="left"/>
+            </w:pPr>
+            <w:r>
+              <w:rPr>
+                <w:rFonts w:ascii="Bookman Old Style" w:cs="Bookman Old Style" w:eastAsia="Bookman Old Style" w:hAnsi="Bookman Old Style"/>
+                <w:b/>
+                <w:bCs/>
+                <w:sz w:val="18"/>
+                <w:szCs w:val="18"/>
+              </w:rPr>
+              <w:t xml:space="preserve">Conta ou unidade</w:t>
+            </w:r>
+          </w:p>
+        </w:tc>
+        <w:tc>
+          <w:tcPr>
+            <w:tcW w:type="dxa" w:w="1900"/>
+            <w:shd w:fill="EAE6DC" w:val="clear"/>
+          </w:tcPr>
+          <w:p>
+            <w:pPr>
+              <w:jc w:val="left"/>
+            </w:pPr>
+            <w:r>
+              <w:rPr>
+                <w:rFonts w:ascii="Bookman Old Style" w:cs="Bookman Old Style" w:eastAsia="Bookman Old Style" w:hAnsi="Bookman Old Style"/>
+                <w:b/>
+                <w:bCs/>
+                <w:sz w:val="18"/>
+                <w:szCs w:val="18"/>
+              </w:rPr>
+              <w:t xml:space="preserve">Valor</w:t>
+            </w:r>
+          </w:p>
+        </w:tc>
+        <w:tc>
+          <w:tcPr>
+            <w:tcW w:type="dxa" w:w="1400"/>
+            <w:shd w:fill="EAE6DC" w:val="clear"/>
+          </w:tcPr>
+          <w:p>
+            <w:pPr>
+              <w:jc w:val="left"/>
+            </w:pPr>
+            <w:r>
+              <w:rPr>
+                <w:rFonts w:ascii="Bookman Old Style" w:cs="Bookman Old Style" w:eastAsia="Bookman Old Style" w:hAnsi="Bookman Old Style"/>
+                <w:b/>
+                <w:bCs/>
+                <w:sz w:val="18"/>
+                <w:szCs w:val="18"/>
+              </w:rPr>
+              <w:t xml:space="preserve">Situação</w:t>
+            </w:r>
+          </w:p>
+        </w:tc>
+      </w:tr>
+      <w:tr>
+        <w:tc>
+          <w:tcPr>
+            <w:tcW w:type="dxa" w:w="4900"/>
+          </w:tcPr>
+          <w:p>
+            <w:pPr>
+              <w:jc w:val="left"/>
+            </w:pPr>
+            <w:r>
+              <w:rPr>
+                <w:rFonts w:ascii="Bookman Old Style" w:cs="Bookman Old Style" w:eastAsia="Bookman Old Style" w:hAnsi="Bookman Old Style"/>
+                <w:sz w:val="18"/>
+                <w:szCs w:val="18"/>
+              </w:rPr>
+              <w:t xml:space="preserve">Conta especial do Fundo Municipal de Assistência Social</w:t>
+            </w:r>
+          </w:p>
+        </w:tc>
+        <w:tc>
+          <w:tcPr>
+            <w:tcW w:type="dxa" w:w="1900"/>
+          </w:tcPr>
+          <w:p>
+            <w:pPr>
+              <w:jc w:val="right"/>
+            </w:pPr>
+            <w:r>
+              <w:rPr>
+                <w:rFonts w:ascii="Bookman Old Style" w:cs="Bookman Old Style" w:eastAsia="Bookman Old Style" w:hAnsi="Bookman Old Style"/>
+                <w:sz w:val="18"/>
+                <w:szCs w:val="18"/>
+              </w:rPr>
+              <w:t xml:space="preserve">R$ 23.218.000,00</w:t>
+            </w:r>
+          </w:p>
+        </w:tc>
+        <w:tc>
+          <w:tcPr>
+            <w:tcW w:type="dxa" w:w="1400"/>
+          </w:tcPr>
+          <w:p>
+            <w:pPr>
+              <w:jc w:val="left"/>
+            </w:pPr>
+            <w:r>
+              <w:rPr>
+                <w:rFonts w:ascii="Bookman Old Style" w:cs="Bookman Old Style" w:eastAsia="Bookman Old Style" w:hAnsi="Bookman Old Style"/>
+                <w:sz w:val="18"/>
+                <w:szCs w:val="18"/>
+              </w:rPr>
+              <w:t xml:space="preserve">dentro do Fundo</w:t>
+            </w:r>
+          </w:p>
+        </w:tc>
+      </w:tr>
+      <w:tr>
+        <w:tc>
+          <w:tcPr>
+            <w:tcW w:type="dxa" w:w="4900"/>
+          </w:tcPr>
+          <w:p>
+            <w:pPr>
+              <w:jc w:val="left"/>
+            </w:pPr>
+            <w:r>
+              <w:rPr>
+                <w:rFonts w:ascii="Bookman Old Style" w:cs="Bookman Old Style" w:eastAsia="Bookman Old Style" w:hAnsi="Bookman Old Style"/>
+                <w:sz w:val="18"/>
+                <w:szCs w:val="18"/>
+              </w:rPr>
+              <w:t xml:space="preserve">Unidade orçamentária 3601 — Gabinete da Secretaria</w:t>
+            </w:r>
+          </w:p>
+        </w:tc>
+        <w:tc>
+          <w:tcPr>
+            <w:tcW w:type="dxa" w:w="1900"/>
+          </w:tcPr>
+          <w:p>
+            <w:pPr>
+              <w:jc w:val="right"/>
+            </w:pPr>
+            <w:r>
+              <w:rPr>
+                <w:rFonts w:ascii="Bookman Old Style" w:cs="Bookman Old Style" w:eastAsia="Bookman Old Style" w:hAnsi="Bookman Old Style"/>
+                <w:sz w:val="18"/>
+                <w:szCs w:val="18"/>
+              </w:rPr>
+              <w:t xml:space="preserve">R$ 81.202.000,00</w:t>
+            </w:r>
+          </w:p>
+        </w:tc>
+        <w:tc>
+          <w:tcPr>
+            <w:tcW w:type="dxa" w:w="1400"/>
+          </w:tcPr>
+          <w:p>
+            <w:pPr>
+              <w:jc w:val="left"/>
+            </w:pPr>
+            <w:r>
+              <w:rPr>
+                <w:rFonts w:ascii="Bookman Old Style" w:cs="Bookman Old Style" w:eastAsia="Bookman Old Style" w:hAnsi="Bookman Old Style"/>
+                <w:sz w:val="18"/>
+                <w:szCs w:val="18"/>
+              </w:rPr>
+              <w:t xml:space="preserve">fora do Fundo</w:t>
+            </w:r>
+          </w:p>
+        </w:tc>
+      </w:tr>
+    </w:tbl>
+    <w:p>
+      <w:pPr>
+        <w:spacing w:line="276"/>
+      </w:pPr>
+      <w:r>
+        <w:rPr>
+          <w:rFonts w:ascii="Bookman Old Style" w:cs="Bookman Old Style" w:eastAsia="Bookman Old Style" w:hAnsi="Bookman Old Style"/>
+          <w:sz w:val="22"/>
+          <w:szCs w:val="22"/>
+        </w:rPr>
+        <w:t xml:space="preserve"/>
+      </w:r>
+    </w:p>
+    <w:p>
+      <w:pPr>
+        <w:spacing w:after="60"/>
+        <w:jc w:val="center"/>
+      </w:pPr>
+      <w:r>
+        <w:rPr>
+          <w:rFonts w:ascii="Bookman Old Style" w:cs="Bookman Old Style" w:eastAsia="Bookman Old Style" w:hAnsi="Bookman Old Style"/>
+          <w:b/>
+          <w:bCs/>
+          <w:sz w:val="20"/>
+          <w:szCs w:val="20"/>
+        </w:rPr>
+        <w:t xml:space="preserve">Despesas com vínculo jurídico publicado</w:t>
+      </w:r>
+    </w:p>
+    <w:tbl>
+      <w:tblPr>
+        <w:tblW w:type="dxa" w:w="8200"/>
+        <w:tblBorders>
+          <w:top w:val="single" w:color="auto" w:sz="4"/>
+          <w:left w:val="single" w:color="auto" w:sz="4"/>
+          <w:bottom w:val="single" w:color="auto" w:sz="4"/>
+          <w:right w:val="single" w:color="auto" w:sz="4"/>
+          <w:insideH w:val="single" w:color="auto" w:sz="4"/>
+          <w:insideV w:val="single" w:color="auto" w:sz="4"/>
+        </w:tblBorders>
+      </w:tblPr>
+      <w:tblGrid>
+        <w:gridCol w:w="1200"/>
+        <w:gridCol w:w="2000"/>
+        <w:gridCol w:w="1700"/>
+        <w:gridCol w:w="3300"/>
+      </w:tblGrid>
+      <w:tr>
+        <w:tc>
+          <w:tcPr>
+            <w:tcW w:type="dxa" w:w="1200"/>
+            <w:shd w:fill="EAE6DC" w:val="clear"/>
+          </w:tcPr>
+          <w:p>
+            <w:pPr>
+              <w:jc w:val="left"/>
+            </w:pPr>
+            <w:r>
+              <w:rPr>
+                <w:rFonts w:ascii="Bookman Old Style" w:cs="Bookman Old Style" w:eastAsia="Bookman Old Style" w:hAnsi="Bookman Old Style"/>
+                <w:b/>
+                <w:bCs/>
+                <w:sz w:val="18"/>
+                <w:szCs w:val="18"/>
+              </w:rPr>
+              <w:t xml:space="preserve">Data</w:t>
+            </w:r>
+          </w:p>
+        </w:tc>
+        <w:tc>
+          <w:tcPr>
+            <w:tcW w:type="dxa" w:w="2000"/>
+            <w:shd w:fill="EAE6DC" w:val="clear"/>
+          </w:tcPr>
+          <w:p>
+            <w:pPr>
+              <w:jc w:val="left"/>
+            </w:pPr>
+            <w:r>
+              <w:rPr>
+                <w:rFonts w:ascii="Bookman Old Style" w:cs="Bookman Old Style" w:eastAsia="Bookman Old Style" w:hAnsi="Bookman Old Style"/>
+                <w:b/>
+                <w:bCs/>
+                <w:sz w:val="18"/>
+                <w:szCs w:val="18"/>
+              </w:rPr>
+              <w:t xml:space="preserve">Beneficiário</w:t>
+            </w:r>
+          </w:p>
+        </w:tc>
+        <w:tc>
+          <w:tcPr>
+            <w:tcW w:type="dxa" w:w="1700"/>
+            <w:shd w:fill="EAE6DC" w:val="clear"/>
+          </w:tcPr>
+          <w:p>
+            <w:pPr>
+              <w:jc w:val="left"/>
+            </w:pPr>
+            <w:r>
+              <w:rPr>
+                <w:rFonts w:ascii="Bookman Old Style" w:cs="Bookman Old Style" w:eastAsia="Bookman Old Style" w:hAnsi="Bookman Old Style"/>
+                <w:b/>
+                <w:bCs/>
+                <w:sz w:val="18"/>
+                <w:szCs w:val="18"/>
+              </w:rPr>
+              <w:t xml:space="preserve">Valor</w:t>
+            </w:r>
+          </w:p>
+        </w:tc>
+        <w:tc>
+          <w:tcPr>
+            <w:tcW w:type="dxa" w:w="3300"/>
+            <w:shd w:fill="EAE6DC" w:val="clear"/>
+          </w:tcPr>
+          <w:p>
+            <w:pPr>
+              <w:jc w:val="left"/>
+            </w:pPr>
+            <w:r>
+              <w:rPr>
+                <w:rFonts w:ascii="Bookman Old Style" w:cs="Bookman Old Style" w:eastAsia="Bookman Old Style" w:hAnsi="Bookman Old Style"/>
+                <w:b/>
+                <w:bCs/>
+                <w:sz w:val="18"/>
+                <w:szCs w:val="18"/>
+              </w:rPr>
+              <w:t xml:space="preserve">Contrato ou termo</w:t>
+            </w:r>
+          </w:p>
+        </w:tc>
+      </w:tr>
+      <w:tr>
+        <w:tc>
+          <w:tcPr>
+            <w:tcW w:type="dxa" w:w="1200"/>
+          </w:tcPr>
+          <w:p>
+            <w:pPr>
+              <w:jc w:val="left"/>
+            </w:pPr>
+            <w:r>
+              <w:rPr>
+                <w:rFonts w:ascii="Bookman Old Style" w:cs="Bookman Old Style" w:eastAsia="Bookman Old Style" w:hAnsi="Bookman Old Style"/>
+                <w:sz w:val="18"/>
+                <w:szCs w:val="18"/>
+              </w:rPr>
+              <w:t xml:space="preserve">09/06/2026</w:t>
+            </w:r>
+          </w:p>
+        </w:tc>
+        <w:tc>
+          <w:tcPr>
+            <w:tcW w:type="dxa" w:w="2000"/>
+          </w:tcPr>
+          <w:p>
+            <w:pPr>
+              <w:jc w:val="right"/>
+            </w:pPr>
+            <w:r>
+              <w:rPr>
+                <w:rFonts w:ascii="Bookman Old Style" w:cs="Bookman Old Style" w:eastAsia="Bookman Old Style" w:hAnsi="Bookman Old Style"/>
+                <w:sz w:val="18"/>
+                <w:szCs w:val="18"/>
+              </w:rPr>
+              <w:t xml:space="preserve">15.649.514/0001-40</w:t>
+            </w:r>
+          </w:p>
+        </w:tc>
+        <w:tc>
+          <w:tcPr>
+            <w:tcW w:type="dxa" w:w="1700"/>
+          </w:tcPr>
+          <w:p>
+            <w:pPr>
+              <w:jc w:val="right"/>
+            </w:pPr>
+            <w:r>
+              <w:rPr>
+                <w:rFonts w:ascii="Bookman Old Style" w:cs="Bookman Old Style" w:eastAsia="Bookman Old Style" w:hAnsi="Bookman Old Style"/>
+                <w:sz w:val="18"/>
+                <w:szCs w:val="18"/>
+              </w:rPr>
+              <w:t xml:space="preserve">R$ 1.054.025,52</w:t>
+            </w:r>
+          </w:p>
+        </w:tc>
+        <w:tc>
+          <w:tcPr>
+            <w:tcW w:type="dxa" w:w="3300"/>
+          </w:tcPr>
+          <w:p>
+            <w:pPr>
+              <w:jc w:val="left"/>
+            </w:pPr>
+            <w:r>
+              <w:rPr>
+                <w:rFonts w:ascii="Bookman Old Style" w:cs="Bookman Old Style" w:eastAsia="Bookman Old Style" w:hAnsi="Bookman Old Style"/>
+                <w:sz w:val="18"/>
+                <w:szCs w:val="18"/>
+              </w:rPr>
+              <w:t xml:space="preserve">CONTRATO 08/2026 · CONTRATO 61/2026 · TERMO DE FOMENTO 008/2024</w:t>
+            </w:r>
+          </w:p>
+        </w:tc>
+      </w:tr>
+      <w:tr>
+        <w:tc>
+          <w:tcPr>
+            <w:tcW w:type="dxa" w:w="1200"/>
+          </w:tcPr>
+          <w:p>
+            <w:pPr>
+              <w:jc w:val="left"/>
+            </w:pPr>
+            <w:r>
+              <w:rPr>
+                <w:rFonts w:ascii="Bookman Old Style" w:cs="Bookman Old Style" w:eastAsia="Bookman Old Style" w:hAnsi="Bookman Old Style"/>
+                <w:sz w:val="18"/>
+                <w:szCs w:val="18"/>
+              </w:rPr>
+              <w:t xml:space="preserve">13/04/2026</w:t>
+            </w:r>
+          </w:p>
+        </w:tc>
+        <w:tc>
+          <w:tcPr>
+            <w:tcW w:type="dxa" w:w="2000"/>
+          </w:tcPr>
+          <w:p>
+            <w:pPr>
+              <w:jc w:val="right"/>
+            </w:pPr>
+            <w:r>
+              <w:rPr>
+                <w:rFonts w:ascii="Bookman Old Style" w:cs="Bookman Old Style" w:eastAsia="Bookman Old Style" w:hAnsi="Bookman Old Style"/>
+                <w:sz w:val="18"/>
+                <w:szCs w:val="18"/>
+              </w:rPr>
+              <w:t xml:space="preserve">33.931.327/0001-36</w:t>
+            </w:r>
+          </w:p>
+        </w:tc>
+        <w:tc>
+          <w:tcPr>
+            <w:tcW w:type="dxa" w:w="1700"/>
+          </w:tcPr>
+          <w:p>
+            <w:pPr>
+              <w:jc w:val="right"/>
+            </w:pPr>
+            <w:r>
+              <w:rPr>
+                <w:rFonts w:ascii="Bookman Old Style" w:cs="Bookman Old Style" w:eastAsia="Bookman Old Style" w:hAnsi="Bookman Old Style"/>
+                <w:sz w:val="18"/>
+                <w:szCs w:val="18"/>
+              </w:rPr>
+              <w:t xml:space="preserve">R$ 200.000,00</w:t>
+            </w:r>
+          </w:p>
+        </w:tc>
+        <w:tc>
+          <w:tcPr>
+            <w:tcW w:type="dxa" w:w="3300"/>
+          </w:tcPr>
+          <w:p>
+            <w:pPr>
+              <w:jc w:val="left"/>
+            </w:pPr>
+            <w:r>
+              <w:rPr>
+                <w:rFonts w:ascii="Bookman Old Style" w:cs="Bookman Old Style" w:eastAsia="Bookman Old Style" w:hAnsi="Bookman Old Style"/>
+                <w:sz w:val="18"/>
+                <w:szCs w:val="18"/>
+              </w:rPr>
+              <w:t xml:space="preserve">TERMO DE FOMENTO 017/2026</w:t>
+            </w:r>
+          </w:p>
+        </w:tc>
+      </w:tr>
+      <w:tr>
+        <w:tc>
+          <w:tcPr>
+            <w:tcW w:type="dxa" w:w="1200"/>
+          </w:tcPr>
+          <w:p>
+            <w:pPr>
+              <w:jc w:val="left"/>
+            </w:pPr>
+            <w:r>
+              <w:rPr>
+                <w:rFonts w:ascii="Bookman Old Style" w:cs="Bookman Old Style" w:eastAsia="Bookman Old Style" w:hAnsi="Bookman Old Style"/>
+                <w:sz w:val="18"/>
+                <w:szCs w:val="18"/>
+              </w:rPr>
+              <w:t xml:space="preserve">07/07/2026</w:t>
+            </w:r>
+          </w:p>
+        </w:tc>
+        <w:tc>
+          <w:tcPr>
+            <w:tcW w:type="dxa" w:w="2000"/>
+          </w:tcPr>
+          <w:p>
+            <w:pPr>
+              <w:jc w:val="right"/>
+            </w:pPr>
+            <w:r>
+              <w:rPr>
+                <w:rFonts w:ascii="Bookman Old Style" w:cs="Bookman Old Style" w:eastAsia="Bookman Old Style" w:hAnsi="Bookman Old Style"/>
+                <w:sz w:val="18"/>
+                <w:szCs w:val="18"/>
+              </w:rPr>
+              <w:t xml:space="preserve">04.369.147/0001-04</w:t>
+            </w:r>
+          </w:p>
+        </w:tc>
+        <w:tc>
+          <w:tcPr>
+            <w:tcW w:type="dxa" w:w="1700"/>
+          </w:tcPr>
+          <w:p>
+            <w:pPr>
+              <w:jc w:val="right"/>
+            </w:pPr>
+            <w:r>
+              <w:rPr>
+                <w:rFonts w:ascii="Bookman Old Style" w:cs="Bookman Old Style" w:eastAsia="Bookman Old Style" w:hAnsi="Bookman Old Style"/>
+                <w:sz w:val="18"/>
+                <w:szCs w:val="18"/>
+              </w:rPr>
+              <w:t xml:space="preserve">R$ 122.384,42</w:t>
+            </w:r>
+          </w:p>
+        </w:tc>
+        <w:tc>
+          <w:tcPr>
+            <w:tcW w:type="dxa" w:w="3300"/>
+          </w:tcPr>
+          <w:p>
+            <w:pPr>
+              <w:jc w:val="left"/>
+            </w:pPr>
+            <w:r>
+              <w:rPr>
+                <w:rFonts w:ascii="Bookman Old Style" w:cs="Bookman Old Style" w:eastAsia="Bookman Old Style" w:hAnsi="Bookman Old Style"/>
+                <w:sz w:val="18"/>
+                <w:szCs w:val="18"/>
+              </w:rPr>
+              <w:t xml:space="preserve">CONTRATO 065/2026 · TERMO DE FOMENTO 055/2025 · Termo de Fomento 055/2025</w:t>
+            </w:r>
+          </w:p>
+        </w:tc>
+      </w:tr>
+      <w:tr>
+        <w:tc>
+          <w:tcPr>
+            <w:tcW w:type="dxa" w:w="1200"/>
+          </w:tcPr>
+          <w:p>
+            <w:pPr>
+              <w:jc w:val="left"/>
+            </w:pPr>
+            <w:r>
+              <w:rPr>
+                <w:rFonts w:ascii="Bookman Old Style" w:cs="Bookman Old Style" w:eastAsia="Bookman Old Style" w:hAnsi="Bookman Old Style"/>
+                <w:sz w:val="18"/>
+                <w:szCs w:val="18"/>
+              </w:rPr>
+              <w:t xml:space="preserve">02/02/2026</w:t>
+            </w:r>
+          </w:p>
+        </w:tc>
+        <w:tc>
+          <w:tcPr>
+            <w:tcW w:type="dxa" w:w="2000"/>
+          </w:tcPr>
+          <w:p>
+            <w:pPr>
+              <w:jc w:val="right"/>
+            </w:pPr>
+            <w:r>
+              <w:rPr>
+                <w:rFonts w:ascii="Bookman Old Style" w:cs="Bookman Old Style" w:eastAsia="Bookman Old Style" w:hAnsi="Bookman Old Style"/>
+                <w:sz w:val="18"/>
+                <w:szCs w:val="18"/>
+              </w:rPr>
+              <w:t xml:space="preserve">42.619.993/0001-24</w:t>
+            </w:r>
+          </w:p>
+        </w:tc>
+        <w:tc>
+          <w:tcPr>
+            <w:tcW w:type="dxa" w:w="1700"/>
+          </w:tcPr>
+          <w:p>
+            <w:pPr>
+              <w:jc w:val="right"/>
+            </w:pPr>
+            <w:r>
+              <w:rPr>
+                <w:rFonts w:ascii="Bookman Old Style" w:cs="Bookman Old Style" w:eastAsia="Bookman Old Style" w:hAnsi="Bookman Old Style"/>
+                <w:sz w:val="18"/>
+                <w:szCs w:val="18"/>
+              </w:rPr>
+              <w:t xml:space="preserve">R$ 46.200,00</w:t>
+            </w:r>
+          </w:p>
+        </w:tc>
+        <w:tc>
+          <w:tcPr>
+            <w:tcW w:type="dxa" w:w="3300"/>
+          </w:tcPr>
+          <w:p>
+            <w:pPr>
+              <w:jc w:val="left"/>
+            </w:pPr>
+            <w:r>
+              <w:rPr>
+                <w:rFonts w:ascii="Bookman Old Style" w:cs="Bookman Old Style" w:eastAsia="Bookman Old Style" w:hAnsi="Bookman Old Style"/>
+                <w:sz w:val="18"/>
+                <w:szCs w:val="18"/>
+              </w:rPr>
+              <w:t xml:space="preserve">TERMO DE FOMENTO 102/2026 · Termo de Fomento 052/2023</w:t>
+            </w:r>
+          </w:p>
+        </w:tc>
+      </w:tr>
+    </w:tbl>
+    <w:p>
+      <w:pPr>
+        <w:spacing w:line="276"/>
+      </w:pPr>
+      <w:r>
+        <w:rPr>
+          <w:rFonts w:ascii="Bookman Old Style" w:cs="Bookman Old Style" w:eastAsia="Bookman Old Style" w:hAnsi="Bookman Old Style"/>
+          <w:sz w:val="22"/>
+          <w:szCs w:val="22"/>
+        </w:rPr>
+        <w:t xml:space="preserve"/>
+      </w:r>
+    </w:p>
+    <w:p>
+      <w:pPr>
+        <w:spacing w:after="60"/>
+        <w:jc w:val="center"/>
+      </w:pPr>
+      <w:r>
+        <w:rPr>
+          <w:rFonts w:ascii="Bookman Old Style" w:cs="Bookman Old Style" w:eastAsia="Bookman Old Style" w:hAnsi="Bookman Old Style"/>
+          <w:b/>
+          <w:bCs/>
+          <w:sz w:val="20"/>
+          <w:szCs w:val="20"/>
+        </w:rPr>
+        <w:t xml:space="preserve">Despesas sem vínculo identificado</w:t>
+      </w:r>
+    </w:p>
+    <w:tbl>
+      <w:tblPr>
+        <w:tblW w:type="dxa" w:w="8200"/>
+        <w:tblBorders>
+          <w:top w:val="single" w:color="auto" w:sz="4"/>
+          <w:left w:val="single" w:color="auto" w:sz="4"/>
+          <w:bottom w:val="single" w:color="auto" w:sz="4"/>
+          <w:right w:val="single" w:color="auto" w:sz="4"/>
+          <w:insideH w:val="single" w:color="auto" w:sz="4"/>
+          <w:insideV w:val="single" w:color="auto" w:sz="4"/>
+        </w:tblBorders>
+      </w:tblPr>
+      <w:tblGrid>
+        <w:gridCol w:w="1200"/>
+        <w:gridCol w:w="2000"/>
+        <w:gridCol w:w="1700"/>
+        <w:gridCol w:w="3300"/>
+      </w:tblGrid>
+      <w:tr>
+        <w:tc>
+          <w:tcPr>
+            <w:tcW w:type="dxa" w:w="1200"/>
+            <w:shd w:fill="EAE6DC" w:val="clear"/>
+          </w:tcPr>
+          <w:p>
+            <w:pPr>
+              <w:jc w:val="left"/>
+            </w:pPr>
+            <w:r>
+              <w:rPr>
+                <w:rFonts w:ascii="Bookman Old Style" w:cs="Bookman Old Style" w:eastAsia="Bookman Old Style" w:hAnsi="Bookman Old Style"/>
+                <w:b/>
+                <w:bCs/>
+                <w:sz w:val="18"/>
+                <w:szCs w:val="18"/>
+              </w:rPr>
+              <w:t xml:space="preserve">Data</w:t>
+            </w:r>
+          </w:p>
+        </w:tc>
+        <w:tc>
+          <w:tcPr>
+            <w:tcW w:type="dxa" w:w="2000"/>
+            <w:shd w:fill="EAE6DC" w:val="clear"/>
+          </w:tcPr>
+          <w:p>
+            <w:pPr>
+              <w:jc w:val="left"/>
+            </w:pPr>
+            <w:r>
+              <w:rPr>
+                <w:rFonts w:ascii="Bookman Old Style" w:cs="Bookman Old Style" w:eastAsia="Bookman Old Style" w:hAnsi="Bookman Old Style"/>
+                <w:b/>
+                <w:bCs/>
+                <w:sz w:val="18"/>
+                <w:szCs w:val="18"/>
+              </w:rPr>
+              <w:t xml:space="preserve">Beneficiário</w:t>
+            </w:r>
+          </w:p>
+        </w:tc>
+        <w:tc>
+          <w:tcPr>
+            <w:tcW w:type="dxa" w:w="1700"/>
+            <w:shd w:fill="EAE6DC" w:val="clear"/>
+          </w:tcPr>
+          <w:p>
+            <w:pPr>
+              <w:jc w:val="left"/>
+            </w:pPr>
+            <w:r>
+              <w:rPr>
+                <w:rFonts w:ascii="Bookman Old Style" w:cs="Bookman Old Style" w:eastAsia="Bookman Old Style" w:hAnsi="Bookman Old Style"/>
+                <w:b/>
+                <w:bCs/>
+                <w:sz w:val="18"/>
+                <w:szCs w:val="18"/>
+              </w:rPr>
+              <w:t xml:space="preserve">Valor</w:t>
+            </w:r>
+          </w:p>
+        </w:tc>
+        <w:tc>
+          <w:tcPr>
+            <w:tcW w:type="dxa" w:w="3300"/>
+            <w:shd w:fill="EAE6DC" w:val="clear"/>
+          </w:tcPr>
+          <w:p>
+            <w:pPr>
+              <w:jc w:val="left"/>
+            </w:pPr>
+            <w:r>
+              <w:rPr>
+                <w:rFonts w:ascii="Bookman Old Style" w:cs="Bookman Old Style" w:eastAsia="Bookman Old Style" w:hAnsi="Bookman Old Style"/>
+                <w:b/>
+                <w:bCs/>
+                <w:sz w:val="18"/>
+                <w:szCs w:val="18"/>
+              </w:rPr>
+              <w:t xml:space="preserve">O que falta</w:t>
+            </w:r>
+          </w:p>
+        </w:tc>
+      </w:tr>
+      <w:tr>
+        <w:tc>
+          <w:tcPr>
+            <w:tcW w:type="dxa" w:w="1200"/>
+          </w:tcPr>
+          <w:p>
+            <w:pPr>
+              <w:jc w:val="left"/>
+            </w:pPr>
+            <w:r>
+              <w:rPr>
+                <w:rFonts w:ascii="Bookman Old Style" w:cs="Bookman Old Style" w:eastAsia="Bookman Old Style" w:hAnsi="Bookman Old Style"/>
+                <w:sz w:val="18"/>
+                <w:szCs w:val="18"/>
+              </w:rPr>
+              <w:t xml:space="preserve">07/01/2026</w:t>
+            </w:r>
+          </w:p>
+        </w:tc>
+        <w:tc>
+          <w:tcPr>
+            <w:tcW w:type="dxa" w:w="2000"/>
+          </w:tcPr>
+          <w:p>
+            <w:pPr>
+              <w:jc w:val="right"/>
+            </w:pPr>
+            <w:r>
+              <w:rPr>
+                <w:rFonts w:ascii="Bookman Old Style" w:cs="Bookman Old Style" w:eastAsia="Bookman Old Style" w:hAnsi="Bookman Old Style"/>
+                <w:sz w:val="18"/>
+                <w:szCs w:val="18"/>
+              </w:rPr>
+              <w:t xml:space="preserve">17.439.987/0001-48</w:t>
+            </w:r>
+          </w:p>
+        </w:tc>
+        <w:tc>
+          <w:tcPr>
+            <w:tcW w:type="dxa" w:w="1700"/>
+          </w:tcPr>
+          <w:p>
+            <w:pPr>
+              <w:jc w:val="right"/>
+            </w:pPr>
+            <w:r>
+              <w:rPr>
+                <w:rFonts w:ascii="Bookman Old Style" w:cs="Bookman Old Style" w:eastAsia="Bookman Old Style" w:hAnsi="Bookman Old Style"/>
+                <w:sz w:val="18"/>
+                <w:szCs w:val="18"/>
+              </w:rPr>
+              <w:t xml:space="preserve">R$ 300.000,00</w:t>
+            </w:r>
+          </w:p>
+        </w:tc>
+        <w:tc>
+          <w:tcPr>
+            <w:tcW w:type="dxa" w:w="3300"/>
+          </w:tcPr>
+          <w:p>
+            <w:pPr>
+              <w:jc w:val="left"/>
+            </w:pPr>
+            <w:r>
+              <w:rPr>
+                <w:rFonts w:ascii="Bookman Old Style" w:cs="Bookman Old Style" w:eastAsia="Bookman Old Style" w:hAnsi="Bookman Old Style"/>
+                <w:sz w:val="18"/>
+                <w:szCs w:val="18"/>
+              </w:rPr>
+              <w:t xml:space="preserve">Contrato, termo ou convênio</w:t>
+            </w:r>
+          </w:p>
+        </w:tc>
+      </w:tr>
+      <w:tr>
+        <w:tc>
+          <w:tcPr>
+            <w:tcW w:type="dxa" w:w="1200"/>
+          </w:tcPr>
+          <w:p>
+            <w:pPr>
+              <w:jc w:val="left"/>
+            </w:pPr>
+            <w:r>
+              <w:rPr>
+                <w:rFonts w:ascii="Bookman Old Style" w:cs="Bookman Old Style" w:eastAsia="Bookman Old Style" w:hAnsi="Bookman Old Style"/>
+                <w:sz w:val="18"/>
+                <w:szCs w:val="18"/>
+              </w:rPr>
+              <w:t xml:space="preserve">10/04/2026</w:t>
+            </w:r>
+          </w:p>
+        </w:tc>
+        <w:tc>
+          <w:tcPr>
+            <w:tcW w:type="dxa" w:w="2000"/>
+          </w:tcPr>
+          <w:p>
+            <w:pPr>
+              <w:jc w:val="right"/>
+            </w:pPr>
+            <w:r>
+              <w:rPr>
+                <w:rFonts w:ascii="Bookman Old Style" w:cs="Bookman Old Style" w:eastAsia="Bookman Old Style" w:hAnsi="Bookman Old Style"/>
+                <w:sz w:val="18"/>
+                <w:szCs w:val="18"/>
+              </w:rPr>
+              <w:t xml:space="preserve">55.390.465/0001-98</w:t>
+            </w:r>
+          </w:p>
+        </w:tc>
+        <w:tc>
+          <w:tcPr>
+            <w:tcW w:type="dxa" w:w="1700"/>
+          </w:tcPr>
+          <w:p>
+            <w:pPr>
+              <w:jc w:val="right"/>
+            </w:pPr>
+            <w:r>
+              <w:rPr>
+                <w:rFonts w:ascii="Bookman Old Style" w:cs="Bookman Old Style" w:eastAsia="Bookman Old Style" w:hAnsi="Bookman Old Style"/>
+                <w:sz w:val="18"/>
+                <w:szCs w:val="18"/>
+              </w:rPr>
+              <w:t xml:space="preserve">R$ 257.040,00</w:t>
+            </w:r>
+          </w:p>
+        </w:tc>
+        <w:tc>
+          <w:tcPr>
+            <w:tcW w:type="dxa" w:w="3300"/>
+          </w:tcPr>
+          <w:p>
+            <w:pPr>
+              <w:jc w:val="left"/>
+            </w:pPr>
+            <w:r>
+              <w:rPr>
+                <w:rFonts w:ascii="Bookman Old Style" w:cs="Bookman Old Style" w:eastAsia="Bookman Old Style" w:hAnsi="Bookman Old Style"/>
+                <w:sz w:val="18"/>
+                <w:szCs w:val="18"/>
+              </w:rPr>
+              <w:t xml:space="preserve">Contrato, termo ou convênio</w:t>
+            </w:r>
+          </w:p>
+        </w:tc>
+      </w:tr>
+      <w:tr>
+        <w:tc>
+          <w:tcPr>
+            <w:tcW w:type="dxa" w:w="1200"/>
+          </w:tcPr>
+          <w:p>
+            <w:pPr>
+              <w:jc w:val="left"/>
+            </w:pPr>
+            <w:r>
+              <w:rPr>
+                <w:rFonts w:ascii="Bookman Old Style" w:cs="Bookman Old Style" w:eastAsia="Bookman Old Style" w:hAnsi="Bookman Old Style"/>
+                <w:sz w:val="18"/>
+                <w:szCs w:val="18"/>
+              </w:rPr>
+              <w:t xml:space="preserve">28/07/2026</w:t>
+            </w:r>
+          </w:p>
+        </w:tc>
+        <w:tc>
+          <w:tcPr>
+            <w:tcW w:type="dxa" w:w="2000"/>
+          </w:tcPr>
+          <w:p>
+            <w:pPr>
+              <w:jc w:val="right"/>
+            </w:pPr>
+            <w:r>
+              <w:rPr>
+                <w:rFonts w:ascii="Bookman Old Style" w:cs="Bookman Old Style" w:eastAsia="Bookman Old Style" w:hAnsi="Bookman Old Style"/>
+                <w:sz w:val="18"/>
+                <w:szCs w:val="18"/>
+              </w:rPr>
+              <w:t xml:space="preserve">01.682.475/0001-78</w:t>
+            </w:r>
+          </w:p>
+        </w:tc>
+        <w:tc>
+          <w:tcPr>
+            <w:tcW w:type="dxa" w:w="1700"/>
+          </w:tcPr>
+          <w:p>
+            <w:pPr>
+              <w:jc w:val="right"/>
+            </w:pPr>
+            <w:r>
+              <w:rPr>
+                <w:rFonts w:ascii="Bookman Old Style" w:cs="Bookman Old Style" w:eastAsia="Bookman Old Style" w:hAnsi="Bookman Old Style"/>
+                <w:sz w:val="18"/>
+                <w:szCs w:val="18"/>
+              </w:rPr>
+              <w:t xml:space="preserve">R$ 200.000,00</w:t>
+            </w:r>
+          </w:p>
+        </w:tc>
+        <w:tc>
+          <w:tcPr>
+            <w:tcW w:type="dxa" w:w="3300"/>
+          </w:tcPr>
+          <w:p>
+            <w:pPr>
+              <w:jc w:val="left"/>
+            </w:pPr>
+            <w:r>
+              <w:rPr>
+                <w:rFonts w:ascii="Bookman Old Style" w:cs="Bookman Old Style" w:eastAsia="Bookman Old Style" w:hAnsi="Bookman Old Style"/>
+                <w:sz w:val="18"/>
+                <w:szCs w:val="18"/>
+              </w:rPr>
+              <w:t xml:space="preserve">Contrato, termo ou convênio</w:t>
+            </w:r>
+          </w:p>
+        </w:tc>
+      </w:tr>
+      <w:tr>
+        <w:tc>
+          <w:tcPr>
+            <w:tcW w:type="dxa" w:w="1200"/>
+          </w:tcPr>
+          <w:p>
+            <w:pPr>
+              <w:jc w:val="left"/>
+            </w:pPr>
+            <w:r>
+              <w:rPr>
+                <w:rFonts w:ascii="Bookman Old Style" w:cs="Bookman Old Style" w:eastAsia="Bookman Old Style" w:hAnsi="Bookman Old Style"/>
+                <w:sz w:val="18"/>
+                <w:szCs w:val="18"/>
+              </w:rPr>
+              <w:t xml:space="preserve">19/05/2026</w:t>
+            </w:r>
+          </w:p>
+        </w:tc>
+        <w:tc>
+          <w:tcPr>
+            <w:tcW w:type="dxa" w:w="2000"/>
+          </w:tcPr>
+          <w:p>
+            <w:pPr>
+              <w:jc w:val="right"/>
+            </w:pPr>
+            <w:r>
+              <w:rPr>
+                <w:rFonts w:ascii="Bookman Old Style" w:cs="Bookman Old Style" w:eastAsia="Bookman Old Style" w:hAnsi="Bookman Old Style"/>
+                <w:sz w:val="18"/>
+                <w:szCs w:val="18"/>
+              </w:rPr>
+              <w:t xml:space="preserve">97.546.623/0001-04</w:t>
+            </w:r>
+          </w:p>
+        </w:tc>
+        <w:tc>
+          <w:tcPr>
+            <w:tcW w:type="dxa" w:w="1700"/>
+          </w:tcPr>
+          <w:p>
+            <w:pPr>
+              <w:jc w:val="right"/>
+            </w:pPr>
+            <w:r>
+              <w:rPr>
+                <w:rFonts w:ascii="Bookman Old Style" w:cs="Bookman Old Style" w:eastAsia="Bookman Old Style" w:hAnsi="Bookman Old Style"/>
+                <w:sz w:val="18"/>
+                <w:szCs w:val="18"/>
+              </w:rPr>
+              <w:t xml:space="preserve">R$ 69.744,00</w:t>
+            </w:r>
+          </w:p>
+        </w:tc>
+        <w:tc>
+          <w:tcPr>
+            <w:tcW w:type="dxa" w:w="3300"/>
+          </w:tcPr>
+          <w:p>
+            <w:pPr>
+              <w:jc w:val="left"/>
+            </w:pPr>
+            <w:r>
+              <w:rPr>
+                <w:rFonts w:ascii="Bookman Old Style" w:cs="Bookman Old Style" w:eastAsia="Bookman Old Style" w:hAnsi="Bookman Old Style"/>
+                <w:sz w:val="18"/>
+                <w:szCs w:val="18"/>
+              </w:rPr>
+              <w:t xml:space="preserve">Contrato, termo ou convênio</w:t>
+            </w:r>
+          </w:p>
+        </w:tc>
+      </w:tr>
+      <w:tr>
+        <w:tc>
+          <w:tcPr>
+            <w:tcW w:type="dxa" w:w="1200"/>
+          </w:tcPr>
+          <w:p>
+            <w:pPr>
+              <w:jc w:val="left"/>
+            </w:pPr>
+            <w:r>
+              <w:rPr>
+                <w:rFonts w:ascii="Bookman Old Style" w:cs="Bookman Old Style" w:eastAsia="Bookman Old Style" w:hAnsi="Bookman Old Style"/>
+                <w:sz w:val="18"/>
+                <w:szCs w:val="18"/>
+              </w:rPr>
+              <w:t xml:space="preserve">01/07/2026</w:t>
+            </w:r>
+          </w:p>
+        </w:tc>
+        <w:tc>
+          <w:tcPr>
+            <w:tcW w:type="dxa" w:w="2000"/>
+          </w:tcPr>
+          <w:p>
+            <w:pPr>
+              <w:jc w:val="right"/>
+            </w:pPr>
+            <w:r>
+              <w:rPr>
+                <w:rFonts w:ascii="Bookman Old Style" w:cs="Bookman Old Style" w:eastAsia="Bookman Old Style" w:hAnsi="Bookman Old Style"/>
+                <w:sz w:val="18"/>
+                <w:szCs w:val="18"/>
+              </w:rPr>
+              <w:t xml:space="preserve">58.600.411/0001-06</w:t>
+            </w:r>
+          </w:p>
+        </w:tc>
+        <w:tc>
+          <w:tcPr>
+            <w:tcW w:type="dxa" w:w="1700"/>
+          </w:tcPr>
+          <w:p>
+            <w:pPr>
+              <w:jc w:val="right"/>
+            </w:pPr>
+            <w:r>
+              <w:rPr>
+                <w:rFonts w:ascii="Bookman Old Style" w:cs="Bookman Old Style" w:eastAsia="Bookman Old Style" w:hAnsi="Bookman Old Style"/>
+                <w:sz w:val="18"/>
+                <w:szCs w:val="18"/>
+              </w:rPr>
+              <w:t xml:space="preserve">R$ 55.750,50</w:t>
+            </w:r>
+          </w:p>
+        </w:tc>
+        <w:tc>
+          <w:tcPr>
+            <w:tcW w:type="dxa" w:w="3300"/>
+          </w:tcPr>
+          <w:p>
+            <w:pPr>
+              <w:jc w:val="left"/>
+            </w:pPr>
+            <w:r>
+              <w:rPr>
+                <w:rFonts w:ascii="Bookman Old Style" w:cs="Bookman Old Style" w:eastAsia="Bookman Old Style" w:hAnsi="Bookman Old Style"/>
+                <w:sz w:val="18"/>
+                <w:szCs w:val="18"/>
+              </w:rPr>
+              <w:t xml:space="preserve">Contrato, termo ou convênio</w:t>
+            </w:r>
+          </w:p>
+        </w:tc>
+      </w:tr>
+      <w:tr>
+        <w:tc>
+          <w:tcPr>
+            <w:tcW w:type="dxa" w:w="1200"/>
+          </w:tcPr>
+          <w:p>
+            <w:pPr>
+              <w:jc w:val="left"/>
+            </w:pPr>
+            <w:r>
+              <w:rPr>
+                <w:rFonts w:ascii="Bookman Old Style" w:cs="Bookman Old Style" w:eastAsia="Bookman Old Style" w:hAnsi="Bookman Old Style"/>
+                <w:sz w:val="18"/>
+                <w:szCs w:val="18"/>
+              </w:rPr>
+              <w:t xml:space="preserve">03/07/2026</w:t>
+            </w:r>
+          </w:p>
+        </w:tc>
+        <w:tc>
+          <w:tcPr>
+            <w:tcW w:type="dxa" w:w="2000"/>
+          </w:tcPr>
+          <w:p>
+            <w:pPr>
+              <w:jc w:val="right"/>
+            </w:pPr>
+            <w:r>
+              <w:rPr>
+                <w:rFonts w:ascii="Bookman Old Style" w:cs="Bookman Old Style" w:eastAsia="Bookman Old Style" w:hAnsi="Bookman Old Style"/>
+                <w:sz w:val="18"/>
+                <w:szCs w:val="18"/>
+              </w:rPr>
+              <w:t xml:space="preserve">44.728.295/0001-92</w:t>
+            </w:r>
+          </w:p>
+        </w:tc>
+        <w:tc>
+          <w:tcPr>
+            <w:tcW w:type="dxa" w:w="1700"/>
+          </w:tcPr>
+          <w:p>
+            <w:pPr>
+              <w:jc w:val="right"/>
+            </w:pPr>
+            <w:r>
+              <w:rPr>
+                <w:rFonts w:ascii="Bookman Old Style" w:cs="Bookman Old Style" w:eastAsia="Bookman Old Style" w:hAnsi="Bookman Old Style"/>
+                <w:sz w:val="18"/>
+                <w:szCs w:val="18"/>
+              </w:rPr>
+              <w:t xml:space="preserve">R$ 42.250,00</w:t>
+            </w:r>
+          </w:p>
+        </w:tc>
+        <w:tc>
+          <w:tcPr>
+            <w:tcW w:type="dxa" w:w="3300"/>
+          </w:tcPr>
+          <w:p>
+            <w:pPr>
+              <w:jc w:val="left"/>
+            </w:pPr>
+            <w:r>
+              <w:rPr>
+                <w:rFonts w:ascii="Bookman Old Style" w:cs="Bookman Old Style" w:eastAsia="Bookman Old Style" w:hAnsi="Bookman Old Style"/>
+                <w:sz w:val="18"/>
+                <w:szCs w:val="18"/>
+              </w:rPr>
+              <w:t xml:space="preserve">Contrato, termo ou convênio</w:t>
+            </w:r>
+          </w:p>
+        </w:tc>
+      </w:tr>
+      <w:tr>
+        <w:tc>
+          <w:tcPr>
+            <w:tcW w:type="dxa" w:w="1200"/>
+          </w:tcPr>
+          <w:p>
+            <w:pPr>
+              <w:jc w:val="left"/>
+            </w:pPr>
+            <w:r>
+              <w:rPr>
+                <w:rFonts w:ascii="Bookman Old Style" w:cs="Bookman Old Style" w:eastAsia="Bookman Old Style" w:hAnsi="Bookman Old Style"/>
+                <w:sz w:val="18"/>
+                <w:szCs w:val="18"/>
+              </w:rPr>
+              <w:t xml:space="preserve">02/02/2026</w:t>
+            </w:r>
+          </w:p>
+        </w:tc>
+        <w:tc>
+          <w:tcPr>
+            <w:tcW w:type="dxa" w:w="2000"/>
+          </w:tcPr>
+          <w:p>
+            <w:pPr>
+              <w:jc w:val="right"/>
+            </w:pPr>
+            <w:r>
+              <w:rPr>
+                <w:rFonts w:ascii="Bookman Old Style" w:cs="Bookman Old Style" w:eastAsia="Bookman Old Style" w:hAnsi="Bookman Old Style"/>
+                <w:sz w:val="18"/>
+                <w:szCs w:val="18"/>
+              </w:rPr>
+              <w:t xml:space="preserve">03.647.755/0001-70</w:t>
+            </w:r>
+          </w:p>
+        </w:tc>
+        <w:tc>
+          <w:tcPr>
+            <w:tcW w:type="dxa" w:w="1700"/>
+          </w:tcPr>
+          <w:p>
+            <w:pPr>
+              <w:jc w:val="right"/>
+            </w:pPr>
+            <w:r>
+              <w:rPr>
+                <w:rFonts w:ascii="Bookman Old Style" w:cs="Bookman Old Style" w:eastAsia="Bookman Old Style" w:hAnsi="Bookman Old Style"/>
+                <w:sz w:val="18"/>
+                <w:szCs w:val="18"/>
+              </w:rPr>
+              <w:t xml:space="preserve">R$ 13.586,10</w:t>
+            </w:r>
+          </w:p>
+        </w:tc>
+        <w:tc>
+          <w:tcPr>
+            <w:tcW w:type="dxa" w:w="3300"/>
+          </w:tcPr>
+          <w:p>
+            <w:pPr>
+              <w:jc w:val="left"/>
+            </w:pPr>
+            <w:r>
+              <w:rPr>
+                <w:rFonts w:ascii="Bookman Old Style" w:cs="Bookman Old Style" w:eastAsia="Bookman Old Style" w:hAnsi="Bookman Old Style"/>
+                <w:sz w:val="18"/>
+                <w:szCs w:val="18"/>
+              </w:rPr>
+              <w:t xml:space="preserve">Contrato, termo ou convênio</w:t>
+            </w:r>
+          </w:p>
+        </w:tc>
+      </w:tr>
+    </w:tbl>
+    <w:p>
+      <w:pPr>
+        <w:spacing w:line="276"/>
+      </w:pPr>
+      <w:r>
+        <w:rPr>
+          <w:rFonts w:ascii="Bookman Old Style" w:cs="Bookman Old Style" w:eastAsia="Bookman Old Style" w:hAnsi="Bookman Old Style"/>
+          <w:sz w:val="22"/>
+          <w:szCs w:val="22"/>
+        </w:rPr>
+        <w:t xml:space="preserve"/>
+      </w:r>
+    </w:p>
+    <w:p>
+      <w:pPr>
+        <w:spacing w:line="276"/>
+        <w:ind w:firstLine="1133"/>
+        <w:jc w:val="both"/>
+      </w:pPr>
+      <w:r>
+        <w:rPr>
+          <w:rFonts w:ascii="Bookman Old Style" w:cs="Bookman Old Style" w:eastAsia="Bookman Old Style" w:hAnsi="Bookman Old Style"/>
+          <w:sz w:val="22"/>
+          <w:szCs w:val="22"/>
+        </w:rPr>
+        <w:t xml:space="preserve">Há ainda </w:t>
+      </w:r>
+      <w:r>
+        <w:rPr>
+          <w:rFonts w:ascii="Bookman Old Style" w:cs="Bookman Old Style" w:eastAsia="Bookman Old Style" w:hAnsi="Bookman Old Style"/>
+          <w:b/>
+          <w:bCs/>
+          <w:sz w:val="22"/>
+          <w:szCs w:val="22"/>
+        </w:rPr>
+        <w:t xml:space="preserve">82</w:t>
+      </w:r>
+      <w:r>
+        <w:rPr>
+          <w:rFonts w:ascii="Bookman Old Style" w:cs="Bookman Old Style" w:eastAsia="Bookman Old Style" w:hAnsi="Bookman Old Style"/>
+          <w:sz w:val="22"/>
+          <w:szCs w:val="22"/>
+        </w:rPr>
+        <w:t xml:space="preserve"> lançamentos cujo valor não é atribuível a um beneficiário: a publicação lista várias inscrições e um único valor. Atribuir esse valor a cada inscrição multiplicaria o gasto. Permanecem sem destinatário conhecido até que os empenhos sejam publicados individualmente.</w:t>
+      </w:r>
+    </w:p>
+    <w:p>
+      <w:pPr>
+        <w:spacing w:line="276"/>
+      </w:pPr>
+      <w:r>
+        <w:rPr>
+          <w:rFonts w:ascii="Bookman Old Style" w:cs="Bookman Old Style" w:eastAsia="Bookman Old Style" w:hAnsi="Bookman Old Style"/>
+          <w:sz w:val="22"/>
+          <w:szCs w:val="22"/>
+        </w:rPr>
+        <w:t xml:space="preserve"/>
+      </w:r>
+    </w:p>
+    <w:p>
+      <w:pPr>
+        <w:spacing w:line="276"/>
+        <w:ind w:firstLine="1133"/>
+        <w:jc w:val="both"/>
+      </w:pPr>
+      <w:r>
+        <w:rPr>
+          <w:rFonts w:ascii="Bookman Old Style" w:cs="Bookman Old Style" w:eastAsia="Bookman Old Style" w:hAnsi="Bookman Old Style"/>
+          <w:sz w:val="22"/>
+          <w:szCs w:val="22"/>
+        </w:rPr>
+        <w:t xml:space="preserve">A versão interativa desta trilha, com o detalhe de cada contrato, está em </w:t>
+      </w:r>
+      <w:hyperlink w:history="1" r:id="rId-afuttsgh6o2modjod5bm">
+        <w:r>
+          <w:rPr>
+            <w:rStyle w:val="Hyperlink"/>
+            <w:rFonts w:ascii="Bookman Old Style" w:cs="Bookman Old Style" w:eastAsia="Bookman Old Style" w:hAnsi="Bookman Old Style"/>
+            <w:sz w:val="20"/>
+            <w:szCs w:val="20"/>
+            <w:u w:val="single"/>
+          </w:rPr>
+          <w:t xml:space="preserve">docs/fluxo_2026.html no repositório</w:t>
+        </w:r>
+      </w:hyperlink>
+      <w:r>
+        <w:rPr>
+          <w:rFonts w:ascii="Bookman Old Style" w:cs="Bookman Old Style" w:eastAsia="Bookman Old Style" w:hAnsi="Bookman Old Style"/>
+          <w:sz w:val="22"/>
+          <w:szCs w:val="22"/>
+        </w:rPr>
+        <w:t xml:space="preserve">. Verde indica fonte comprovada; laranja, origem não comprovada; azul, despesa com vínculo; vermelho, despesa sem vínculo.</w:t>
+      </w:r>
+    </w:p>
+    <w:p>
+      <w:r>
+        <w:br w:type="page"/>
+      </w:r>
+    </w:p>
+    <w:p>
+      <w:pPr>
+        <w:pStyle w:val="Heading1"/>
+        <w:spacing w:after="120" w:before="240"/>
+        <w:jc w:val="center"/>
+      </w:pPr>
+      <w:r>
+        <w:rPr>
+          <w:rFonts w:ascii="Bookman Old Style" w:cs="Bookman Old Style" w:eastAsia="Bookman Old Style" w:hAnsi="Bookman Old Style"/>
+          <w:b/>
+          <w:bCs/>
+          <w:sz w:val="26"/>
+          <w:szCs w:val="26"/>
+        </w:rPr>
+        <w:t xml:space="preserve">V — Irregularidades Apuradas</w:t>
       </w:r>
     </w:p>
     <w:p>
@@ -2727,7 +5034,7 @@
         </w:rPr>
         <w:t xml:space="preserve">Diário Oficial do Município, Edição 8830, última edição publicada, 29/07/2026 — </w:t>
       </w:r>
-      <w:hyperlink w:history="1" r:id="rId4cndzcy3chbdriy2opjy1">
+      <w:hyperlink w:history="1" r:id="rIdg3ufiibvsw-2j0l1vlltf">
         <w:r>
           <w:rPr>
             <w:rStyle w:val="Hyperlink"/>
@@ -2755,7 +5062,7 @@
         </w:rPr>
         <w:t xml:space="preserve">Acervo do Diário Oficial coletado, 161 eventos entre 2025 e 2026, com digest de cada edição — </w:t>
       </w:r>
-      <w:hyperlink w:history="1" r:id="rIdohprfdys6hcxfvhnmjqzh">
+      <w:hyperlink w:history="1" r:id="rIdihnnnepocdpbx7cuehnwp">
         <w:r>
           <w:rPr>
             <w:rStyle w:val="Hyperlink"/>
@@ -2792,7 +5099,7 @@
         </w:rPr>
         <w:t xml:space="preserve">Onde deveria estar publicado. </w:t>
       </w:r>
-      <w:hyperlink w:history="1" r:id="rIdwavzs9qks6tespv6hu9jr">
+      <w:hyperlink w:history="1" r:id="rIdlsqthbph9-zivt8yatbbq">
         <w:r>
           <w:rPr>
             <w:rStyle w:val="Hyperlink"/>
@@ -3019,7 +5326,7 @@
         </w:rPr>
         <w:t xml:space="preserve">Acervo do Diário Oficial coletado, 161 eventos entre 2025 e 2026, com digest de cada edição — </w:t>
       </w:r>
-      <w:hyperlink w:history="1" r:id="rIdjdby7md5667-elxh2lab1">
+      <w:hyperlink w:history="1" r:id="rId6syj3h811bhh3nzl0q4co">
         <w:r>
           <w:rPr>
             <w:rStyle w:val="Hyperlink"/>
@@ -3047,7 +5354,7 @@
         </w:rPr>
         <w:t xml:space="preserve">Sítio próprio do Conselho, sem documento posterior a dezembro de 2023 — </w:t>
       </w:r>
-      <w:hyperlink w:history="1" r:id="rIdkyacopjcqujlwael6efw1">
+      <w:hyperlink w:history="1" r:id="rIdvsxc9zk6caaplajcplwb6">
         <w:r>
           <w:rPr>
             <w:rStyle w:val="Hyperlink"/>
@@ -3084,7 +5391,7 @@
         </w:rPr>
         <w:t xml:space="preserve">Onde deveria estar publicado. </w:t>
       </w:r>
-      <w:hyperlink w:history="1" r:id="rIdsixowwjhb0mdqfjgdl6re">
+      <w:hyperlink w:history="1" r:id="rIdjorzrx0cfs1edav2ih9-a">
         <w:r>
           <w:rPr>
             <w:rStyle w:val="Hyperlink"/>
@@ -3104,7 +5411,7 @@
         </w:rPr>
         <w:t xml:space="preserve">; </w:t>
       </w:r>
-      <w:hyperlink w:history="1" r:id="rIddxk0prrldhq_gd3e30uoe">
+      <w:hyperlink w:history="1" r:id="rIdnmajwtrv4kummnae8jlzo">
         <w:r>
           <w:rPr>
             <w:rStyle w:val="Hyperlink"/>
@@ -3344,7 +5651,7 @@
         </w:rPr>
         <w:t xml:space="preserve">Lei Orçamentária Anual 11.590/2026, anexos, Diário Oficial do Município, Edição 8697, de 09/01/2026, Edição Extra — </w:t>
       </w:r>
-      <w:hyperlink w:history="1" r:id="rIdvsl7lr5jdl04kta5y_xeo">
+      <w:hyperlink w:history="1" r:id="rIdj7o8yfp4lodmikkgu2t0i">
         <w:r>
           <w:rPr>
             <w:rStyle w:val="Hyperlink"/>
@@ -3372,7 +5679,7 @@
         </w:rPr>
         <w:t xml:space="preserve">Lei Orçamentária Anual 11.315/2025, anexos, Diário Oficial do Município, de 07/01/2025 — </w:t>
       </w:r>
-      <w:hyperlink w:history="1" r:id="rIdt37hecsfn3hjamzddcf1q">
+      <w:hyperlink w:history="1" r:id="rId1a2gbyajb7znmoqosnpoy">
         <w:r>
           <w:rPr>
             <w:rStyle w:val="Hyperlink"/>
@@ -3409,7 +5716,7 @@
         </w:rPr>
         <w:t xml:space="preserve">Onde deveria estar publicado. </w:t>
       </w:r>
-      <w:hyperlink w:history="1" r:id="rIdd0tdc3vgrd9rgdl7jnwfc">
+      <w:hyperlink w:history="1" r:id="rIdnkycrgssxdk4lx2mh0cf7">
         <w:r>
           <w:rPr>
             <w:rStyle w:val="Hyperlink"/>
@@ -3429,7 +5736,7 @@
         </w:rPr>
         <w:t xml:space="preserve">; </w:t>
       </w:r>
-      <w:hyperlink w:history="1" r:id="rIdans4obczminkvqlmjo8h9">
+      <w:hyperlink w:history="1" r:id="rIdjkni62vrit29sril9jr_i">
         <w:r>
           <w:rPr>
             <w:rStyle w:val="Hyperlink"/>
@@ -3658,7 +5965,7 @@
         </w:rPr>
         <w:t xml:space="preserve">Acervo do Diário Oficial coletado, 161 eventos entre 2025 e 2026, com digest de cada edição — </w:t>
       </w:r>
-      <w:hyperlink w:history="1" r:id="rIdhglaz7t3rtejd_csrdggz">
+      <w:hyperlink w:history="1" r:id="rIddtbku3o0uwmzleasebqzr">
         <w:r>
           <w:rPr>
             <w:rStyle w:val="Hyperlink"/>
@@ -3695,7 +6002,7 @@
         </w:rPr>
         <w:t xml:space="preserve">Onde deveria estar publicado. </w:t>
       </w:r>
-      <w:hyperlink w:history="1" r:id="rIdcluecdffogwvhmqk9-0fo">
+      <w:hyperlink w:history="1" r:id="rIdtoturfjm8epnpwvqqqhlk">
         <w:r>
           <w:rPr>
             <w:rStyle w:val="Hyperlink"/>
@@ -3930,7 +6237,7 @@
         </w:rPr>
         <w:t xml:space="preserve">Lei Orçamentária Anual 11.590/2026, anexos, Diário Oficial do Município, Edição 8697, de 09/01/2026, Edição Extra — </w:t>
       </w:r>
-      <w:hyperlink w:history="1" r:id="rIdwilpxmu2jyee_kn2psbtk">
+      <w:hyperlink w:history="1" r:id="rIdco5c0j9t6-fhsctjmbvko">
         <w:r>
           <w:rPr>
             <w:rStyle w:val="Hyperlink"/>
@@ -3958,7 +6265,7 @@
         </w:rPr>
         <w:t xml:space="preserve">Lei municipal 7.531/1995 — </w:t>
       </w:r>
-      <w:hyperlink w:history="1" r:id="rId1pweddlzpotpcqacbvjpa">
+      <w:hyperlink w:history="1" r:id="rIdbed-kbxwkquszvmja2csl">
         <w:r>
           <w:rPr>
             <w:rStyle w:val="Hyperlink"/>
@@ -3995,7 +6302,7 @@
         </w:rPr>
         <w:t xml:space="preserve">Onde deveria estar publicado. </w:t>
       </w:r>
-      <w:hyperlink w:history="1" r:id="rIdtz6jftczc7dirq4z4hm1t">
+      <w:hyperlink w:history="1" r:id="rIdxudenvylomx50sy7prqpb">
         <w:r>
           <w:rPr>
             <w:rStyle w:val="Hyperlink"/>
@@ -4015,7 +6322,7 @@
         </w:rPr>
         <w:t xml:space="preserve">; </w:t>
       </w:r>
-      <w:hyperlink w:history="1" r:id="rId2t65ux9lihxmjo1eizhnm">
+      <w:hyperlink w:history="1" r:id="rIdwvz83bvnwpfxzaabgjvd4">
         <w:r>
           <w:rPr>
             <w:rStyle w:val="Hyperlink"/>
@@ -4244,7 +6551,7 @@
         </w:rPr>
         <w:t xml:space="preserve">Lei Orçamentária Anual 11.590/2026, anexos, Diário Oficial do Município, Edição 8697, de 09/01/2026, Edição Extra — </w:t>
       </w:r>
-      <w:hyperlink w:history="1" r:id="rIdpvbsj8kqmad3x3lfwck71">
+      <w:hyperlink w:history="1" r:id="rIdercoiuu98mnmzirzh7ani">
         <w:r>
           <w:rPr>
             <w:rStyle w:val="Hyperlink"/>
@@ -4272,7 +6579,7 @@
         </w:rPr>
         <w:t xml:space="preserve">Resolução CNAS/MDS 202/2025, Diário Oficial da União de 28/07/2025, Edição 140, Seção 1, Página 87 — </w:t>
       </w:r>
-      <w:hyperlink w:history="1" r:id="rIdrxqgm21xmzfppbnrmgzod">
+      <w:hyperlink w:history="1" r:id="rIdzj7pk6jwrhzihh20peewl">
         <w:r>
           <w:rPr>
             <w:rStyle w:val="Hyperlink"/>
@@ -4309,7 +6616,7 @@
         </w:rPr>
         <w:t xml:space="preserve">Onde deveria estar publicado. </w:t>
       </w:r>
-      <w:hyperlink w:history="1" r:id="rIdubkenkhmhhcyccpxubijx">
+      <w:hyperlink w:history="1" r:id="rIdcnfolyh5iclez5ujasmlj">
         <w:r>
           <w:rPr>
             <w:rStyle w:val="Hyperlink"/>
@@ -4329,7 +6636,7 @@
         </w:rPr>
         <w:t xml:space="preserve">; </w:t>
       </w:r>
-      <w:hyperlink w:history="1" r:id="rId6_smdv5htq1hwtqr6njvt">
+      <w:hyperlink w:history="1" r:id="rIdh2nhc016-qy-grfwgrg6g">
         <w:r>
           <w:rPr>
             <w:rStyle w:val="Hyperlink"/>
@@ -4581,7 +6888,7 @@
         </w:rPr>
         <w:t xml:space="preserve">Resolução CNAS/MDS 202/2025, Diário Oficial da União de 28/07/2025, Edição 140, Seção 1, Página 87 — </w:t>
       </w:r>
-      <w:hyperlink w:history="1" r:id="rIdxldxfcrq-waaso5ko_swe">
+      <w:hyperlink w:history="1" r:id="rIdiaoyaik8dnjhqdc1hny1i">
         <w:r>
           <w:rPr>
             <w:rStyle w:val="Hyperlink"/>
@@ -4618,7 +6925,7 @@
         </w:rPr>
         <w:t xml:space="preserve">Onde deveria estar publicado. </w:t>
       </w:r>
-      <w:hyperlink w:history="1" r:id="rIdsao1hyhuwbdq2gwo4qohw">
+      <w:hyperlink w:history="1" r:id="rIdtkyjpg1ivtgfr4e60s90f">
         <w:r>
           <w:rPr>
             <w:rStyle w:val="Hyperlink"/>
@@ -4856,7 +7163,7 @@
         </w:rPr>
         <w:t xml:space="preserve">Sítio próprio do Conselho, sem documento posterior a dezembro de 2023 — </w:t>
       </w:r>
-      <w:hyperlink w:history="1" r:id="rIdtx_u71fi726kfkn9ikljf">
+      <w:hyperlink w:history="1" r:id="rIdtndhey3kq5qgokackykh0">
         <w:r>
           <w:rPr>
             <w:rStyle w:val="Hyperlink"/>
@@ -4893,7 +7200,7 @@
         </w:rPr>
         <w:t xml:space="preserve">Onde deveria estar publicado. </w:t>
       </w:r>
-      <w:hyperlink w:history="1" r:id="rIdvmqfua6qctbq4hgxgcpzn">
+      <w:hyperlink w:history="1" r:id="rIdxi-mf5s-wmr6-xkalsbb3">
         <w:r>
           <w:rPr>
             <w:rStyle w:val="Hyperlink"/>
@@ -4913,7 +7220,7 @@
         </w:rPr>
         <w:t xml:space="preserve">; </w:t>
       </w:r>
-      <w:hyperlink w:history="1" r:id="rIdmgnffbx_hvvgaeuq8thw0">
+      <w:hyperlink w:history="1" r:id="rIdmv_vdxl2rtsim6zzwgm4m">
         <w:r>
           <w:rPr>
             <w:rStyle w:val="Hyperlink"/>
@@ -5136,7 +7443,7 @@
         </w:rPr>
         <w:t xml:space="preserve">Acervo do Diário Oficial coletado, 161 eventos entre 2025 e 2026, com digest de cada edição — </w:t>
       </w:r>
-      <w:hyperlink w:history="1" r:id="rIdifdk5bgibq0skdmnwvtyb">
+      <w:hyperlink w:history="1" r:id="rId1r3u-sjzjab3pe0wukjyw">
         <w:r>
           <w:rPr>
             <w:rStyle w:val="Hyperlink"/>
@@ -5173,7 +7480,7 @@
         </w:rPr>
         <w:t xml:space="preserve">Onde deveria estar publicado. </w:t>
       </w:r>
-      <w:hyperlink w:history="1" r:id="rIdsgy7jcv05ps-haa7qsih7">
+      <w:hyperlink w:history="1" r:id="rIdqxj5whtmqxikbxytuufvk">
         <w:r>
           <w:rPr>
             <w:rStyle w:val="Hyperlink"/>
@@ -5193,7 +7500,7 @@
         </w:rPr>
         <w:t xml:space="preserve">; </w:t>
       </w:r>
-      <w:hyperlink w:history="1" r:id="rIddpfjgt1ux8jhursprrt7r">
+      <w:hyperlink w:history="1" r:id="rId1euiq6cushey9ddxhu7f3">
         <w:r>
           <w:rPr>
             <w:rStyle w:val="Hyperlink"/>
@@ -5416,7 +7723,7 @@
         </w:rPr>
         <w:t xml:space="preserve">Resolução CNAS/MDS 202/2025, Diário Oficial da União de 28/07/2025, Edição 140, Seção 1, Página 87 — </w:t>
       </w:r>
-      <w:hyperlink w:history="1" r:id="rIdpzsxsa8gcfth56oaiidtz">
+      <w:hyperlink w:history="1" r:id="rIdzck5cpoejgz6vrtmtxink">
         <w:r>
           <w:rPr>
             <w:rStyle w:val="Hyperlink"/>
@@ -5453,7 +7760,7 @@
         </w:rPr>
         <w:t xml:space="preserve">Onde deveria estar publicado. </w:t>
       </w:r>
-      <w:hyperlink w:history="1" r:id="rIdmbpe_y4zd46qz1ud4alzq">
+      <w:hyperlink w:history="1" r:id="rIdkxgx83irj1z2_wlamglaz">
         <w:r>
           <w:rPr>
             <w:rStyle w:val="Hyperlink"/>
@@ -5674,7 +7981,7 @@
         </w:rPr>
         <w:t xml:space="preserve">Acervo do Diário Oficial coletado, 161 eventos entre 2025 e 2026, com digest de cada edição — </w:t>
       </w:r>
-      <w:hyperlink w:history="1" r:id="rIdryrc3g4ogagqzmunaoikh">
+      <w:hyperlink w:history="1" r:id="rIdhp7hf8jqe3zhajrc12olk">
         <w:r>
           <w:rPr>
             <w:rStyle w:val="Hyperlink"/>
@@ -5711,7 +8018,7 @@
         </w:rPr>
         <w:t xml:space="preserve">Onde deveria estar publicado. </w:t>
       </w:r>
-      <w:hyperlink w:history="1" r:id="rId3mkasn7ffzeao35el0gpy">
+      <w:hyperlink w:history="1" r:id="rIdsxxob-qqlauk1cz1tck3i">
         <w:r>
           <w:rPr>
             <w:rStyle w:val="Hyperlink"/>
@@ -5951,7 +8258,7 @@
         </w:rPr>
         <w:t xml:space="preserve">Lei Orçamentária Anual 11.590/2026, anexos, Diário Oficial do Município, Edição 8697, de 09/01/2026, Edição Extra — </w:t>
       </w:r>
-      <w:hyperlink w:history="1" r:id="rIdqqo76ssyjvscgfyfi_tck">
+      <w:hyperlink w:history="1" r:id="rIdzp0znlnbn65udxngmdnkl">
         <w:r>
           <w:rPr>
             <w:rStyle w:val="Hyperlink"/>
@@ -5988,7 +8295,7 @@
         </w:rPr>
         <w:t xml:space="preserve">Onde deveria estar publicado. </w:t>
       </w:r>
-      <w:hyperlink w:history="1" r:id="rIdkqnjg01lzaxc8gh7ot9ee">
+      <w:hyperlink w:history="1" r:id="rIdvapgga2ndgsrcuxw61uab">
         <w:r>
           <w:rPr>
             <w:rStyle w:val="Hyperlink"/>
@@ -6217,7 +8524,7 @@
         </w:rPr>
         <w:t xml:space="preserve">Lei Orçamentária Anual 11.590/2026, anexos, Diário Oficial do Município, Edição 8697, de 09/01/2026, Edição Extra — </w:t>
       </w:r>
-      <w:hyperlink w:history="1" r:id="rId19icxlxywnqkntdmvuxfo">
+      <w:hyperlink w:history="1" r:id="rIdvpsxnxiamn_cwmhche0mu">
         <w:r>
           <w:rPr>
             <w:rStyle w:val="Hyperlink"/>
@@ -6254,7 +8561,7 @@
         </w:rPr>
         <w:t xml:space="preserve">Onde deveria estar publicado. </w:t>
       </w:r>
-      <w:hyperlink w:history="1" r:id="rIdj2ji-xkx8n_nnwvyc1n1d">
+      <w:hyperlink w:history="1" r:id="rIdehmtgkf2gwgp6dc-xkeu1">
         <w:r>
           <w:rPr>
             <w:rStyle w:val="Hyperlink"/>
@@ -6477,7 +8784,7 @@
         </w:rPr>
         <w:t xml:space="preserve">Lei Orçamentária Anual 11.590/2026, anexos, Diário Oficial do Município, Edição 8697, de 09/01/2026, Edição Extra — </w:t>
       </w:r>
-      <w:hyperlink w:history="1" r:id="rIdr2nzdbzkihsrark4atjdp">
+      <w:hyperlink w:history="1" r:id="rIdivn_qwcwdbos3cfgpmqjc">
         <w:r>
           <w:rPr>
             <w:rStyle w:val="Hyperlink"/>
@@ -6505,7 +8812,7 @@
         </w:rPr>
         <w:t xml:space="preserve">Lei municipal 9.009/2010 — </w:t>
       </w:r>
-      <w:hyperlink w:history="1" r:id="rId8ubcizziz0q4_atps0hqu">
+      <w:hyperlink w:history="1" r:id="rIdpzl5vjw25elgjltnftnji">
         <w:r>
           <w:rPr>
             <w:rStyle w:val="Hyperlink"/>
@@ -6542,7 +8849,7 @@
         </w:rPr>
         <w:t xml:space="preserve">Onde deveria estar publicado. </w:t>
       </w:r>
-      <w:hyperlink w:history="1" r:id="rIdm-nya_djezmnnhttza1ez">
+      <w:hyperlink w:history="1" r:id="rIdm0i40ddbxuwnsofgzurb-">
         <w:r>
           <w:rPr>
             <w:rStyle w:val="Hyperlink"/>
@@ -6771,7 +9078,7 @@
         </w:rPr>
         <w:t xml:space="preserve">Lei Orçamentária Anual 11.590/2026, anexos, Diário Oficial do Município, Edição 8697, de 09/01/2026, Edição Extra — </w:t>
       </w:r>
-      <w:hyperlink w:history="1" r:id="rId6hv0o5hyp5ruhafcal0pw">
+      <w:hyperlink w:history="1" r:id="rIdldqzyncuogcu83ksnfqvw">
         <w:r>
           <w:rPr>
             <w:rStyle w:val="Hyperlink"/>
@@ -6808,7 +9115,7 @@
         </w:rPr>
         <w:t xml:space="preserve">Onde deveria estar publicado. </w:t>
       </w:r>
-      <w:hyperlink w:history="1" r:id="rIdp0cba-qrmasoahaayjgmd">
+      <w:hyperlink w:history="1" r:id="rIdmr53puf7-z3mfc_lg3pm0">
         <w:r>
           <w:rPr>
             <w:rStyle w:val="Hyperlink"/>
@@ -7052,7 +9359,7 @@
         </w:rPr>
         <w:t xml:space="preserve">Acervo do Diário Oficial coletado, 161 eventos entre 2025 e 2026, com digest de cada edição — </w:t>
       </w:r>
-      <w:hyperlink w:history="1" r:id="rIdan-z4vkvmpfcc3otpkzhk">
+      <w:hyperlink w:history="1" r:id="rIdeszz47ryuzgidzkfjtqml">
         <w:r>
           <w:rPr>
             <w:rStyle w:val="Hyperlink"/>
@@ -7089,7 +9396,7 @@
         </w:rPr>
         <w:t xml:space="preserve">Onde deveria estar publicado. </w:t>
       </w:r>
-      <w:hyperlink w:history="1" r:id="rIdkmksrlw1bsyj8g8mx5z3r">
+      <w:hyperlink w:history="1" r:id="rIdqavzzj72cbt2o89mjevpt">
         <w:r>
           <w:rPr>
             <w:rStyle w:val="Hyperlink"/>
@@ -7316,7 +9623,7 @@
         </w:rPr>
         <w:t xml:space="preserve">Acervo do Diário Oficial coletado, 161 eventos entre 2025 e 2026, com digest de cada edição — </w:t>
       </w:r>
-      <w:hyperlink w:history="1" r:id="rIdqo688-l1wdzp_w5mcqbf8">
+      <w:hyperlink w:history="1" r:id="rIdzzemhddtyqunqa50utvc3">
         <w:r>
           <w:rPr>
             <w:rStyle w:val="Hyperlink"/>
@@ -7353,7 +9660,7 @@
         </w:rPr>
         <w:t xml:space="preserve">Onde deveria estar publicado. </w:t>
       </w:r>
-      <w:hyperlink w:history="1" r:id="rIdxxeyydtjg-ebsm02ut77m">
+      <w:hyperlink w:history="1" r:id="rIdehsnys-83uj36vn9_qpy_">
         <w:r>
           <w:rPr>
             <w:rStyle w:val="Hyperlink"/>
@@ -7373,7 +9680,7 @@
         </w:rPr>
         <w:t xml:space="preserve">; </w:t>
       </w:r>
-      <w:hyperlink w:history="1" r:id="rIdqfidjikl5dnu3ezbbhei2">
+      <w:hyperlink w:history="1" r:id="rIdr7rgefamj23p1jflj2hks">
         <w:r>
           <w:rPr>
             <w:rStyle w:val="Hyperlink"/>
@@ -7602,7 +9909,7 @@
         </w:rPr>
         <w:t xml:space="preserve">Lei municipal 7.531/1995 — </w:t>
       </w:r>
-      <w:hyperlink w:history="1" r:id="rIdjtlardaogzftov3tedm_n">
+      <w:hyperlink w:history="1" r:id="rIdw-zyaj194rgo9qtwuohpy">
         <w:r>
           <w:rPr>
             <w:rStyle w:val="Hyperlink"/>
@@ -7639,7 +9946,7 @@
         </w:rPr>
         <w:t xml:space="preserve">Onde deveria estar publicado. </w:t>
       </w:r>
-      <w:hyperlink w:history="1" r:id="rIdqmfbkiinblkfcc1epdy2v">
+      <w:hyperlink w:history="1" r:id="rIdb369ddluolzvxsyks1gjl">
         <w:r>
           <w:rPr>
             <w:rStyle w:val="Hyperlink"/>
@@ -7659,7 +9966,7 @@
         </w:rPr>
         <w:t xml:space="preserve">; </w:t>
       </w:r>
-      <w:hyperlink w:history="1" r:id="rIdc_q5ngy9np88dflrtjzrn">
+      <w:hyperlink w:history="1" r:id="rIdwe-p1ml-heloboag5szeq">
         <w:r>
           <w:rPr>
             <w:rStyle w:val="Hyperlink"/>
@@ -7880,7 +10187,7 @@
         </w:rPr>
         <w:t xml:space="preserve">Acervo do Diário Oficial coletado, 161 eventos entre 2025 e 2026, com digest de cada edição — </w:t>
       </w:r>
-      <w:hyperlink w:history="1" r:id="rIdfedfiiv8__kk9fbmdhmtx">
+      <w:hyperlink w:history="1" r:id="rIdr1f9rclvvfeuzudf15ktg">
         <w:r>
           <w:rPr>
             <w:rStyle w:val="Hyperlink"/>
@@ -7917,7 +10224,7 @@
         </w:rPr>
         <w:t xml:space="preserve">Onde deveria estar publicado. </w:t>
       </w:r>
-      <w:hyperlink w:history="1" r:id="rId5mzdtqbdgr1gxyi92nfdk">
+      <w:hyperlink w:history="1" r:id="rIdukfxwizybkn4x9g3n6g5j">
         <w:r>
           <w:rPr>
             <w:rStyle w:val="Hyperlink"/>
@@ -8138,7 +10445,7 @@
         </w:rPr>
         <w:t xml:space="preserve">Acervo do Diário Oficial coletado, 161 eventos entre 2025 e 2026, com digest de cada edição — </w:t>
       </w:r>
-      <w:hyperlink w:history="1" r:id="rIdqajbx-jrbmgcr01ge5ktw">
+      <w:hyperlink w:history="1" r:id="rIds2vlwif3w0yqghhxcn-pw">
         <w:r>
           <w:rPr>
             <w:rStyle w:val="Hyperlink"/>
@@ -8175,7 +10482,7 @@
         </w:rPr>
         <w:t xml:space="preserve">Onde deveria estar publicado. </w:t>
       </w:r>
-      <w:hyperlink w:history="1" r:id="rId00etgohhqnzz8vo1hta_e">
+      <w:hyperlink w:history="1" r:id="rIdt42hyasc1lp5yhnbh4g9w">
         <w:r>
           <w:rPr>
             <w:rStyle w:val="Hyperlink"/>
@@ -8415,7 +10722,7 @@
         </w:rPr>
         <w:t xml:space="preserve">Acervo do Diário Oficial coletado, 161 eventos entre 2025 e 2026, com digest de cada edição — </w:t>
       </w:r>
-      <w:hyperlink w:history="1" r:id="rId4pzycgdh6dp21z2_igr4t">
+      <w:hyperlink w:history="1" r:id="rId2rmt4fdbevxew-gqvbda3">
         <w:r>
           <w:rPr>
             <w:rStyle w:val="Hyperlink"/>
@@ -8452,7 +10759,7 @@
         </w:rPr>
         <w:t xml:space="preserve">Onde deveria estar publicado. </w:t>
       </w:r>
-      <w:hyperlink w:history="1" r:id="rIdsmb4fv8wh0onudsfztmsz">
+      <w:hyperlink w:history="1" r:id="rIdjmhm6b7ma-12jynpe-uat">
         <w:r>
           <w:rPr>
             <w:rStyle w:val="Hyperlink"/>
@@ -8673,7 +10980,7 @@
         </w:rPr>
         <w:t xml:space="preserve">Acervo do Diário Oficial coletado, 161 eventos entre 2025 e 2026, com digest de cada edição — </w:t>
       </w:r>
-      <w:hyperlink w:history="1" r:id="rIdgoyae-gmfxbexrgisjiqi">
+      <w:hyperlink w:history="1" r:id="rIdkgf59ywdsua21rfiwp2je">
         <w:r>
           <w:rPr>
             <w:rStyle w:val="Hyperlink"/>
@@ -8710,7 +11017,7 @@
         </w:rPr>
         <w:t xml:space="preserve">Onde deveria estar publicado. </w:t>
       </w:r>
-      <w:hyperlink w:history="1" r:id="rIdoh_mpmhmii85723wdmjiq">
+      <w:hyperlink w:history="1" r:id="rIdfh8iyvnpqsokio0zmjwif">
         <w:r>
           <w:rPr>
             <w:rStyle w:val="Hyperlink"/>
@@ -8950,7 +11257,7 @@
         </w:rPr>
         <w:t xml:space="preserve">Lei Orçamentária Anual 11.590/2026, anexos, Diário Oficial do Município, Edição 8697, de 09/01/2026, Edição Extra — </w:t>
       </w:r>
-      <w:hyperlink w:history="1" r:id="rIdgadm50lpdzotoogw3x0ba">
+      <w:hyperlink w:history="1" r:id="rIdw5xmrq7plhl9pfy6k8kic">
         <w:r>
           <w:rPr>
             <w:rStyle w:val="Hyperlink"/>
@@ -8978,7 +11285,7 @@
         </w:rPr>
         <w:t xml:space="preserve">Acervo do Diário Oficial coletado, 161 eventos entre 2025 e 2026, com digest de cada edição — </w:t>
       </w:r>
-      <w:hyperlink w:history="1" r:id="rIdwoc20acbizjsux19gs72j">
+      <w:hyperlink w:history="1" r:id="rIdbnppopm5qzwwkyndtthdo">
         <w:r>
           <w:rPr>
             <w:rStyle w:val="Hyperlink"/>
@@ -9015,7 +11322,7 @@
         </w:rPr>
         <w:t xml:space="preserve">Onde deveria estar publicado. </w:t>
       </w:r>
-      <w:hyperlink w:history="1" r:id="rIdnd_6ldcppj2ucrgfu0xuy">
+      <w:hyperlink w:history="1" r:id="rId1bcba1n9nw5-siekcajzq">
         <w:r>
           <w:rPr>
             <w:rStyle w:val="Hyperlink"/>
@@ -9259,7 +11566,7 @@
         </w:rPr>
         <w:t xml:space="preserve">Acervo do Diário Oficial coletado, 161 eventos entre 2025 e 2026, com digest de cada edição — </w:t>
       </w:r>
-      <w:hyperlink w:history="1" r:id="rId-fuknczmbuzbr1jsnziwf">
+      <w:hyperlink w:history="1" r:id="rIdxwfupmqjmxvdv5_gvwzkj">
         <w:r>
           <w:rPr>
             <w:rStyle w:val="Hyperlink"/>
@@ -9296,7 +11603,7 @@
         </w:rPr>
         <w:t xml:space="preserve">Onde deveria estar publicado. </w:t>
       </w:r>
-      <w:hyperlink w:history="1" r:id="rIdszwpqwvinihs2f_muk9cu">
+      <w:hyperlink w:history="1" r:id="rIdx_4gt8s_sbmcuipoun7po">
         <w:r>
           <w:rPr>
             <w:rStyle w:val="Hyperlink"/>
@@ -9534,7 +11841,7 @@
         </w:rPr>
         <w:t xml:space="preserve">Acervo do Diário Oficial coletado, 161 eventos entre 2025 e 2026, com digest de cada edição — </w:t>
       </w:r>
-      <w:hyperlink w:history="1" r:id="rIdgxjw02m7p_j_ezvsv0l95">
+      <w:hyperlink w:history="1" r:id="rIdqygddfgxs2nurczx4gxnl">
         <w:r>
           <w:rPr>
             <w:rStyle w:val="Hyperlink"/>
@@ -9571,7 +11878,7 @@
         </w:rPr>
         <w:t xml:space="preserve">Onde deveria estar publicado. </w:t>
       </w:r>
-      <w:hyperlink w:history="1" r:id="rIduajxm3nqu28b1skrxlo2y">
+      <w:hyperlink w:history="1" r:id="rIdnay8rj2wmnwihx5zopi_c">
         <w:r>
           <w:rPr>
             <w:rStyle w:val="Hyperlink"/>
@@ -9737,7 +12044,7 @@
           <w:sz w:val="26"/>
           <w:szCs w:val="26"/>
         </w:rPr>
-        <w:t xml:space="preserve">V — Providências</w:t>
+        <w:t xml:space="preserve">VI — Providências</w:t>
       </w:r>
     </w:p>
     <w:p>
@@ -9772,7 +12079,7 @@
         </w:rPr>
         <w:t xml:space="preserve"> Canal: </w:t>
       </w:r>
-      <w:hyperlink w:history="1" r:id="rIdsvq2hflijqqpwk3ztkrhf">
+      <w:hyperlink w:history="1" r:id="rIdyw_wlpycqaijxhe1yu8t-">
         <w:r>
           <w:rPr>
             <w:rStyle w:val="Hyperlink"/>
@@ -9838,7 +12145,7 @@
         </w:rPr>
         <w:t xml:space="preserve"> Canal: </w:t>
       </w:r>
-      <w:hyperlink w:history="1" r:id="rIdo3zclm93d4vmlyqac3-em">
+      <w:hyperlink w:history="1" r:id="rIdg1ague9xavnmaeyj2kfag">
         <w:r>
           <w:rPr>
             <w:rStyle w:val="Hyperlink"/>
@@ -9942,7 +12249,7 @@
         </w:rPr>
         <w:t xml:space="preserve"> Canal: </w:t>
       </w:r>
-      <w:hyperlink w:history="1" r:id="rIdc4rkqycdnnm-hxuqe6kn8">
+      <w:hyperlink w:history="1" r:id="rIdrdowpxztab3euzmcxrwna">
         <w:r>
           <w:rPr>
             <w:rStyle w:val="Hyperlink"/>
@@ -9990,7 +12297,7 @@
           <w:sz w:val="26"/>
           <w:szCs w:val="26"/>
         </w:rPr>
-        <w:t xml:space="preserve">VI — Ressalva</w:t>
+        <w:t xml:space="preserve">VII — Ressalva</w:t>
       </w:r>
     </w:p>
     <w:p>

</xml_diff>

<commit_message>
parametros de tribunal de contas: 27 novos em limites, conciliacoes, atos e efetividade; taxonomia de 5 categorias de despesa com subcategorias de pessoal; classificador com decisao em cascata; trilha didatica em 4 estacoes com alerta de teto; secao de limites no parecer
</commit_message>
<xml_diff>
--- a/relatorios/Parecer_Fiscalizacao_2026.docx
+++ b/relatorios/Parecer_Fiscalizacao_2026.docx
@@ -291,7 +291,7 @@
         </w:rPr>
         <w:t xml:space="preserve">. Documento consultado em: </w:t>
       </w:r>
-      <w:hyperlink w:history="1" r:id="rIdirvjgwcamaksnm7xesfuj">
+      <w:hyperlink w:history="1" r:id="rIdvfa2k41zmtibdrij4a7kx">
         <w:r>
           <w:rPr>
             <w:rStyle w:val="Hyperlink"/>
@@ -1523,7 +1523,7 @@
           <w:sz w:val="26"/>
           <w:szCs w:val="26"/>
         </w:rPr>
-        <w:t xml:space="preserve">III — Nível de Transparência dos Dados</w:t>
+        <w:t xml:space="preserve">II-B — Nível de Transparência dos Dados</w:t>
       </w:r>
     </w:p>
     <w:p>
@@ -2210,7 +2210,7 @@
         </w:rPr>
         <w:t xml:space="preserve">Deveria estar em: </w:t>
       </w:r>
-      <w:hyperlink w:history="1" r:id="rIdthkhc8zkcwviuovymxopb">
+      <w:hyperlink w:history="1" r:id="rIdovnl04ah52gqpl3kaerox">
         <w:r>
           <w:rPr>
             <w:rStyle w:val="Hyperlink"/>
@@ -2284,7 +2284,7 @@
         </w:rPr>
         <w:t xml:space="preserve">Deveria estar em: </w:t>
       </w:r>
-      <w:hyperlink w:history="1" r:id="rIdxx10lsvp3fwus0rrkzq7i">
+      <w:hyperlink w:history="1" r:id="rIduvwmi99ktxol-bmdyssdl">
         <w:r>
           <w:rPr>
             <w:rStyle w:val="Hyperlink"/>
@@ -2358,7 +2358,7 @@
         </w:rPr>
         <w:t xml:space="preserve">Deveria estar em: </w:t>
       </w:r>
-      <w:hyperlink w:history="1" r:id="rIddmio1nsdocn1aqhpbkjor">
+      <w:hyperlink w:history="1" r:id="rIdqtxtpnkyiqbxk-ks3e6vv">
         <w:r>
           <w:rPr>
             <w:rStyle w:val="Hyperlink"/>
@@ -2432,7 +2432,7 @@
         </w:rPr>
         <w:t xml:space="preserve">Deveria estar em: </w:t>
       </w:r>
-      <w:hyperlink w:history="1" r:id="rId_77a7rer2knxhxf3htanq">
+      <w:hyperlink w:history="1" r:id="rIdvfl--wh3qw3cl9-it6rlp">
         <w:r>
           <w:rPr>
             <w:rStyle w:val="Hyperlink"/>
@@ -2506,7 +2506,7 @@
         </w:rPr>
         <w:t xml:space="preserve">Deveria estar em: </w:t>
       </w:r>
-      <w:hyperlink w:history="1" r:id="rIdixkecvlveaddzmqz4jtjx">
+      <w:hyperlink w:history="1" r:id="rIdjsgmewmcdubqiod916f_i">
         <w:r>
           <w:rPr>
             <w:rStyle w:val="Hyperlink"/>
@@ -2580,7 +2580,7 @@
         </w:rPr>
         <w:t xml:space="preserve">Deveria estar em: </w:t>
       </w:r>
-      <w:hyperlink w:history="1" r:id="rIdup9wxxe5kmfezjtsroddr">
+      <w:hyperlink w:history="1" r:id="rId-mj42fjpuj4br8kczbyej">
         <w:r>
           <w:rPr>
             <w:rStyle w:val="Hyperlink"/>
@@ -2633,7 +2633,7 @@
           <w:sz w:val="26"/>
           <w:szCs w:val="26"/>
         </w:rPr>
-        <w:t xml:space="preserve">IV — De Onde Veio, Onde Passou, Para Onde Foi</w:t>
+        <w:t xml:space="preserve">III — De Onde Veio, Onde Passou, Para Onde Foi</w:t>
       </w:r>
     </w:p>
     <w:p>
@@ -4900,7 +4900,7 @@
         </w:rPr>
         <w:t xml:space="preserve">A versão interativa desta trilha, com o detalhe de cada contrato, está em </w:t>
       </w:r>
-      <w:hyperlink w:history="1" r:id="rId-afuttsgh6o2modjod5bm">
+      <w:hyperlink w:history="1" r:id="rId4kxmiutatjh3whp1frese">
         <w:r>
           <w:rPr>
             <w:rStyle w:val="Hyperlink"/>
@@ -4940,6 +4940,923 @@
           <w:sz w:val="26"/>
           <w:szCs w:val="26"/>
         </w:rPr>
+        <w:t xml:space="preserve">IV — Parâmetros de Controle e Limites Legais</w:t>
+      </w:r>
+    </w:p>
+    <w:p>
+      <w:pPr>
+        <w:spacing w:line="276"/>
+        <w:ind w:firstLine="1133"/>
+        <w:jc w:val="both"/>
+      </w:pPr>
+      <w:r>
+        <w:rPr>
+          <w:rFonts w:ascii="Bookman Old Style" w:cs="Bookman Old Style" w:eastAsia="Bookman Old Style" w:hAnsi="Bookman Old Style"/>
+          <w:sz w:val="22"/>
+          <w:szCs w:val="22"/>
+        </w:rPr>
+        <w:t xml:space="preserve">Um julgador de contas verifica três coisas antes de examinar mérito: se há limite legal rompido, se as contas conciliam entre si, e se o ato administrativo seguiu o rito. Os quadros abaixo respondem às três.</w:t>
+      </w:r>
+    </w:p>
+    <w:p>
+      <w:pPr>
+        <w:spacing w:line="276"/>
+      </w:pPr>
+      <w:r>
+        <w:rPr>
+          <w:rFonts w:ascii="Bookman Old Style" w:cs="Bookman Old Style" w:eastAsia="Bookman Old Style" w:hAnsi="Bookman Old Style"/>
+          <w:sz w:val="22"/>
+          <w:szCs w:val="22"/>
+        </w:rPr>
+        <w:t xml:space="preserve"/>
+      </w:r>
+    </w:p>
+    <w:p>
+      <w:pPr>
+        <w:spacing w:after="60"/>
+        <w:jc w:val="center"/>
+      </w:pPr>
+      <w:r>
+        <w:rPr>
+          <w:rFonts w:ascii="Bookman Old Style" w:cs="Bookman Old Style" w:eastAsia="Bookman Old Style" w:hAnsi="Bookman Old Style"/>
+          <w:b/>
+          <w:bCs/>
+          <w:sz w:val="20"/>
+          <w:szCs w:val="20"/>
+        </w:rPr>
+        <w:t xml:space="preserve">Limites e tetos</w:t>
+      </w:r>
+    </w:p>
+    <w:tbl>
+      <w:tblPr>
+        <w:tblW w:type="dxa" w:w="8200"/>
+        <w:tblBorders>
+          <w:top w:val="single" w:color="auto" w:sz="4"/>
+          <w:left w:val="single" w:color="auto" w:sz="4"/>
+          <w:bottom w:val="single" w:color="auto" w:sz="4"/>
+          <w:right w:val="single" w:color="auto" w:sz="4"/>
+          <w:insideH w:val="single" w:color="auto" w:sz="4"/>
+          <w:insideV w:val="single" w:color="auto" w:sz="4"/>
+        </w:tblBorders>
+      </w:tblPr>
+      <w:tblGrid>
+        <w:gridCol w:w="3400"/>
+        <w:gridCol w:w="3000"/>
+        <w:gridCol w:w="1800"/>
+      </w:tblGrid>
+      <w:tr>
+        <w:tc>
+          <w:tcPr>
+            <w:tcW w:type="dxa" w:w="3400"/>
+            <w:shd w:fill="EAE6DC" w:val="clear"/>
+          </w:tcPr>
+          <w:p>
+            <w:pPr>
+              <w:jc w:val="left"/>
+            </w:pPr>
+            <w:r>
+              <w:rPr>
+                <w:rFonts w:ascii="Bookman Old Style" w:cs="Bookman Old Style" w:eastAsia="Bookman Old Style" w:hAnsi="Bookman Old Style"/>
+                <w:b/>
+                <w:bCs/>
+                <w:sz w:val="18"/>
+                <w:szCs w:val="18"/>
+              </w:rPr>
+              <w:t xml:space="preserve">Limite</w:t>
+            </w:r>
+          </w:p>
+        </w:tc>
+        <w:tc>
+          <w:tcPr>
+            <w:tcW w:type="dxa" w:w="3000"/>
+            <w:shd w:fill="EAE6DC" w:val="clear"/>
+          </w:tcPr>
+          <w:p>
+            <w:pPr>
+              <w:jc w:val="left"/>
+            </w:pPr>
+            <w:r>
+              <w:rPr>
+                <w:rFonts w:ascii="Bookman Old Style" w:cs="Bookman Old Style" w:eastAsia="Bookman Old Style" w:hAnsi="Bookman Old Style"/>
+                <w:b/>
+                <w:bCs/>
+                <w:sz w:val="18"/>
+                <w:szCs w:val="18"/>
+              </w:rPr>
+              <w:t xml:space="preserve">Situação</w:t>
+            </w:r>
+          </w:p>
+        </w:tc>
+        <w:tc>
+          <w:tcPr>
+            <w:tcW w:type="dxa" w:w="1800"/>
+            <w:shd w:fill="EAE6DC" w:val="clear"/>
+          </w:tcPr>
+          <w:p>
+            <w:pPr>
+              <w:jc w:val="left"/>
+            </w:pPr>
+            <w:r>
+              <w:rPr>
+                <w:rFonts w:ascii="Bookman Old Style" w:cs="Bookman Old Style" w:eastAsia="Bookman Old Style" w:hAnsi="Bookman Old Style"/>
+                <w:b/>
+                <w:bCs/>
+                <w:sz w:val="18"/>
+                <w:szCs w:val="18"/>
+              </w:rPr>
+              <w:t xml:space="preserve">Observação</w:t>
+            </w:r>
+          </w:p>
+        </w:tc>
+      </w:tr>
+      <w:tr>
+        <w:tc>
+          <w:tcPr>
+            <w:tcW w:type="dxa" w:w="3400"/>
+          </w:tcPr>
+          <w:p>
+            <w:pPr>
+              <w:jc w:val="left"/>
+            </w:pPr>
+            <w:r>
+              <w:rPr>
+                <w:rFonts w:ascii="Bookman Old Style" w:cs="Bookman Old Style" w:eastAsia="Bookman Old Style" w:hAnsi="Bookman Old Style"/>
+                <w:sz w:val="18"/>
+                <w:szCs w:val="18"/>
+              </w:rPr>
+              <w:t xml:space="preserve">Pessoal e custeio no Fundo, sobre recursos do Tesouro</w:t>
+            </w:r>
+          </w:p>
+        </w:tc>
+        <w:tc>
+          <w:tcPr>
+            <w:tcW w:type="dxa" w:w="3000"/>
+          </w:tcPr>
+          <w:p>
+            <w:pPr>
+              <w:jc w:val="left"/>
+            </w:pPr>
+            <w:r>
+              <w:rPr>
+                <w:rFonts w:ascii="Bookman Old Style" w:cs="Bookman Old Style" w:eastAsia="Bookman Old Style" w:hAnsi="Bookman Old Style"/>
+                <w:sz w:val="18"/>
+                <w:szCs w:val="18"/>
+              </w:rPr>
+              <w:t xml:space="preserve">INAFERÍVEL — a folha não está publicada</w:t>
+            </w:r>
+          </w:p>
+        </w:tc>
+        <w:tc>
+          <w:tcPr>
+            <w:tcW w:type="dxa" w:w="1800"/>
+          </w:tcPr>
+          <w:p>
+            <w:pPr>
+              <w:jc w:val="left"/>
+            </w:pPr>
+            <w:r>
+              <w:rPr>
+                <w:rFonts w:ascii="Bookman Old Style" w:cs="Bookman Old Style" w:eastAsia="Bookman Old Style" w:hAnsi="Bookman Old Style"/>
+                <w:sz w:val="18"/>
+                <w:szCs w:val="18"/>
+              </w:rPr>
+              <w:t xml:space="preserve">Limite R$ 2.700,00</w:t>
+            </w:r>
+          </w:p>
+        </w:tc>
+      </w:tr>
+      <w:tr>
+        <w:tc>
+          <w:tcPr>
+            <w:tcW w:type="dxa" w:w="3400"/>
+          </w:tcPr>
+          <w:p>
+            <w:pPr>
+              <w:jc w:val="left"/>
+            </w:pPr>
+            <w:r>
+              <w:rPr>
+                <w:rFonts w:ascii="Bookman Old Style" w:cs="Bookman Old Style" w:eastAsia="Bookman Old Style" w:hAnsi="Bookman Old Style"/>
+                <w:sz w:val="18"/>
+                <w:szCs w:val="18"/>
+              </w:rPr>
+              <w:t xml:space="preserve">Piso do Índice de Gestão Descentralizada ao controle social</w:t>
+            </w:r>
+          </w:p>
+        </w:tc>
+        <w:tc>
+          <w:tcPr>
+            <w:tcW w:type="dxa" w:w="3000"/>
+          </w:tcPr>
+          <w:p>
+            <w:pPr>
+              <w:jc w:val="left"/>
+            </w:pPr>
+            <w:r>
+              <w:rPr>
+                <w:rFonts w:ascii="Bookman Old Style" w:cs="Bookman Old Style" w:eastAsia="Bookman Old Style" w:hAnsi="Bookman Old Style"/>
+                <w:sz w:val="18"/>
+                <w:szCs w:val="18"/>
+              </w:rPr>
+              <w:t xml:space="preserve">DESCUMPRIDO</w:t>
+            </w:r>
+          </w:p>
+        </w:tc>
+        <w:tc>
+          <w:tcPr>
+            <w:tcW w:type="dxa" w:w="1800"/>
+          </w:tcPr>
+          <w:p>
+            <w:pPr>
+              <w:jc w:val="left"/>
+            </w:pPr>
+            <w:r>
+              <w:rPr>
+                <w:rFonts w:ascii="Bookman Old Style" w:cs="Bookman Old Style" w:eastAsia="Bookman Old Style" w:hAnsi="Bookman Old Style"/>
+                <w:sz w:val="18"/>
+                <w:szCs w:val="18"/>
+              </w:rPr>
+              <w:t xml:space="preserve">Limite R$ 70.670,72</w:t>
+            </w:r>
+          </w:p>
+        </w:tc>
+      </w:tr>
+      <w:tr>
+        <w:tc>
+          <w:tcPr>
+            <w:tcW w:type="dxa" w:w="3400"/>
+          </w:tcPr>
+          <w:p>
+            <w:pPr>
+              <w:jc w:val="left"/>
+            </w:pPr>
+            <w:r>
+              <w:rPr>
+                <w:rFonts w:ascii="Bookman Old Style" w:cs="Bookman Old Style" w:eastAsia="Bookman Old Style" w:hAnsi="Bookman Old Style"/>
+                <w:sz w:val="18"/>
+                <w:szCs w:val="18"/>
+              </w:rPr>
+              <w:t xml:space="preserve">Despesa total com pessoal do Município</w:t>
+            </w:r>
+          </w:p>
+        </w:tc>
+        <w:tc>
+          <w:tcPr>
+            <w:tcW w:type="dxa" w:w="3000"/>
+          </w:tcPr>
+          <w:p>
+            <w:pPr>
+              <w:jc w:val="left"/>
+            </w:pPr>
+            <w:r>
+              <w:rPr>
+                <w:rFonts w:ascii="Bookman Old Style" w:cs="Bookman Old Style" w:eastAsia="Bookman Old Style" w:hAnsi="Bookman Old Style"/>
+                <w:sz w:val="18"/>
+                <w:szCs w:val="18"/>
+              </w:rPr>
+              <w:t xml:space="preserve">INAFERÍVEL — falta o Relatório de Gestão Fiscal</w:t>
+            </w:r>
+          </w:p>
+        </w:tc>
+        <w:tc>
+          <w:tcPr>
+            <w:tcW w:type="dxa" w:w="1800"/>
+          </w:tcPr>
+          <w:p>
+            <w:pPr>
+              <w:jc w:val="left"/>
+            </w:pPr>
+            <w:r>
+              <w:rPr>
+                <w:rFonts w:ascii="Bookman Old Style" w:cs="Bookman Old Style" w:eastAsia="Bookman Old Style" w:hAnsi="Bookman Old Style"/>
+                <w:sz w:val="18"/>
+                <w:szCs w:val="18"/>
+              </w:rPr>
+              <w:t xml:space="preserve">—</w:t>
+            </w:r>
+          </w:p>
+        </w:tc>
+      </w:tr>
+      <w:tr>
+        <w:tc>
+          <w:tcPr>
+            <w:tcW w:type="dxa" w:w="3400"/>
+          </w:tcPr>
+          <w:p>
+            <w:pPr>
+              <w:jc w:val="left"/>
+            </w:pPr>
+            <w:r>
+              <w:rPr>
+                <w:rFonts w:ascii="Bookman Old Style" w:cs="Bookman Old Style" w:eastAsia="Bookman Old Style" w:hAnsi="Bookman Old Style"/>
+                <w:sz w:val="18"/>
+                <w:szCs w:val="18"/>
+              </w:rPr>
+              <w:t xml:space="preserve">Teto remuneratório municipal</w:t>
+            </w:r>
+          </w:p>
+        </w:tc>
+        <w:tc>
+          <w:tcPr>
+            <w:tcW w:type="dxa" w:w="3000"/>
+          </w:tcPr>
+          <w:p>
+            <w:pPr>
+              <w:jc w:val="left"/>
+            </w:pPr>
+            <w:r>
+              <w:rPr>
+                <w:rFonts w:ascii="Bookman Old Style" w:cs="Bookman Old Style" w:eastAsia="Bookman Old Style" w:hAnsi="Bookman Old Style"/>
+                <w:sz w:val="18"/>
+                <w:szCs w:val="18"/>
+              </w:rPr>
+              <w:t xml:space="preserve">INAFERÍVEL — falta a folha e a lei do subsídio do Prefeito</w:t>
+            </w:r>
+          </w:p>
+        </w:tc>
+        <w:tc>
+          <w:tcPr>
+            <w:tcW w:type="dxa" w:w="1800"/>
+          </w:tcPr>
+          <w:p>
+            <w:pPr>
+              <w:jc w:val="left"/>
+            </w:pPr>
+            <w:r>
+              <w:rPr>
+                <w:rFonts w:ascii="Bookman Old Style" w:cs="Bookman Old Style" w:eastAsia="Bookman Old Style" w:hAnsi="Bookman Old Style"/>
+                <w:sz w:val="18"/>
+                <w:szCs w:val="18"/>
+              </w:rPr>
+              <w:t xml:space="preserve">—</w:t>
+            </w:r>
+          </w:p>
+        </w:tc>
+      </w:tr>
+    </w:tbl>
+    <w:p>
+      <w:pPr>
+        <w:spacing w:line="276"/>
+      </w:pPr>
+      <w:r>
+        <w:rPr>
+          <w:rFonts w:ascii="Bookman Old Style" w:cs="Bookman Old Style" w:eastAsia="Bookman Old Style" w:hAnsi="Bookman Old Style"/>
+          <w:sz w:val="22"/>
+          <w:szCs w:val="22"/>
+        </w:rPr>
+        <w:t xml:space="preserve"/>
+      </w:r>
+    </w:p>
+    <w:p>
+      <w:pPr>
+        <w:spacing w:line="276"/>
+        <w:ind w:firstLine="1133"/>
+        <w:jc w:val="both"/>
+      </w:pPr>
+      <w:r>
+        <w:rPr>
+          <w:rFonts w:ascii="Bookman Old Style" w:cs="Bookman Old Style" w:eastAsia="Bookman Old Style" w:hAnsi="Bookman Old Style"/>
+          <w:b/>
+          <w:bCs/>
+          <w:sz w:val="22"/>
+          <w:szCs w:val="22"/>
+        </w:rPr>
+        <w:t xml:space="preserve">Um limite está descumprido e três são inaferíveis. </w:t>
+      </w:r>
+      <w:r>
+        <w:rPr>
+          <w:rFonts w:ascii="Bookman Old Style" w:cs="Bookman Old Style" w:eastAsia="Bookman Old Style" w:hAnsi="Bookman Old Style"/>
+          <w:sz w:val="22"/>
+          <w:szCs w:val="22"/>
+        </w:rPr>
+        <w:t xml:space="preserve">O piso de dez por cento do Índice de Gestão Descentralizada não registra execução. Os demais — despesa total com pessoal, teto de trinta por cento no Fundo e teto remuneratório — não podem ser calculados porque a folha de pagamento e o Relatório de Gestão Fiscal não estão públicos. Limite que não se afere não é limite cumprido: é limite sem controle.</w:t>
+      </w:r>
+    </w:p>
+    <w:p>
+      <w:pPr>
+        <w:spacing w:line="276"/>
+      </w:pPr>
+      <w:r>
+        <w:rPr>
+          <w:rFonts w:ascii="Bookman Old Style" w:cs="Bookman Old Style" w:eastAsia="Bookman Old Style" w:hAnsi="Bookman Old Style"/>
+          <w:sz w:val="22"/>
+          <w:szCs w:val="22"/>
+        </w:rPr>
+        <w:t xml:space="preserve"/>
+      </w:r>
+    </w:p>
+    <w:p>
+      <w:pPr>
+        <w:spacing w:after="60"/>
+        <w:jc w:val="center"/>
+      </w:pPr>
+      <w:r>
+        <w:rPr>
+          <w:rFonts w:ascii="Bookman Old Style" w:cs="Bookman Old Style" w:eastAsia="Bookman Old Style" w:hAnsi="Bookman Old Style"/>
+          <w:b/>
+          <w:bCs/>
+          <w:sz w:val="20"/>
+          <w:szCs w:val="20"/>
+        </w:rPr>
+        <w:t xml:space="preserve">Despesa por categoria</w:t>
+      </w:r>
+    </w:p>
+    <w:tbl>
+      <w:tblPr>
+        <w:tblW w:type="dxa" w:w="8200"/>
+        <w:tblBorders>
+          <w:top w:val="single" w:color="auto" w:sz="4"/>
+          <w:left w:val="single" w:color="auto" w:sz="4"/>
+          <w:bottom w:val="single" w:color="auto" w:sz="4"/>
+          <w:right w:val="single" w:color="auto" w:sz="4"/>
+          <w:insideH w:val="single" w:color="auto" w:sz="4"/>
+          <w:insideV w:val="single" w:color="auto" w:sz="4"/>
+        </w:tblBorders>
+      </w:tblPr>
+      <w:tblGrid>
+        <w:gridCol w:w="3400"/>
+        <w:gridCol w:w="1500"/>
+        <w:gridCol w:w="1500"/>
+        <w:gridCol w:w="1800"/>
+      </w:tblGrid>
+      <w:tr>
+        <w:tc>
+          <w:tcPr>
+            <w:tcW w:type="dxa" w:w="3400"/>
+            <w:shd w:fill="EAE6DC" w:val="clear"/>
+          </w:tcPr>
+          <w:p>
+            <w:pPr>
+              <w:jc w:val="left"/>
+            </w:pPr>
+            <w:r>
+              <w:rPr>
+                <w:rFonts w:ascii="Bookman Old Style" w:cs="Bookman Old Style" w:eastAsia="Bookman Old Style" w:hAnsi="Bookman Old Style"/>
+                <w:b/>
+                <w:bCs/>
+                <w:sz w:val="18"/>
+                <w:szCs w:val="18"/>
+              </w:rPr>
+              <w:t xml:space="preserve">Categoria</w:t>
+            </w:r>
+          </w:p>
+        </w:tc>
+        <w:tc>
+          <w:tcPr>
+            <w:tcW w:type="dxa" w:w="1500"/>
+            <w:shd w:fill="EAE6DC" w:val="clear"/>
+          </w:tcPr>
+          <w:p>
+            <w:pPr>
+              <w:jc w:val="left"/>
+            </w:pPr>
+            <w:r>
+              <w:rPr>
+                <w:rFonts w:ascii="Bookman Old Style" w:cs="Bookman Old Style" w:eastAsia="Bookman Old Style" w:hAnsi="Bookman Old Style"/>
+                <w:b/>
+                <w:bCs/>
+                <w:sz w:val="18"/>
+                <w:szCs w:val="18"/>
+              </w:rPr>
+              <w:t xml:space="preserve">Lançamentos</w:t>
+            </w:r>
+          </w:p>
+        </w:tc>
+        <w:tc>
+          <w:tcPr>
+            <w:tcW w:type="dxa" w:w="1500"/>
+            <w:shd w:fill="EAE6DC" w:val="clear"/>
+          </w:tcPr>
+          <w:p>
+            <w:pPr>
+              <w:jc w:val="left"/>
+            </w:pPr>
+            <w:r>
+              <w:rPr>
+                <w:rFonts w:ascii="Bookman Old Style" w:cs="Bookman Old Style" w:eastAsia="Bookman Old Style" w:hAnsi="Bookman Old Style"/>
+                <w:b/>
+                <w:bCs/>
+                <w:sz w:val="18"/>
+                <w:szCs w:val="18"/>
+              </w:rPr>
+              <w:t xml:space="preserve">Com contrato</w:t>
+            </w:r>
+          </w:p>
+        </w:tc>
+        <w:tc>
+          <w:tcPr>
+            <w:tcW w:type="dxa" w:w="1800"/>
+            <w:shd w:fill="EAE6DC" w:val="clear"/>
+          </w:tcPr>
+          <w:p>
+            <w:pPr>
+              <w:jc w:val="left"/>
+            </w:pPr>
+            <w:r>
+              <w:rPr>
+                <w:rFonts w:ascii="Bookman Old Style" w:cs="Bookman Old Style" w:eastAsia="Bookman Old Style" w:hAnsi="Bookman Old Style"/>
+                <w:b/>
+                <w:bCs/>
+                <w:sz w:val="18"/>
+                <w:szCs w:val="18"/>
+              </w:rPr>
+              <w:t xml:space="preserve">Valor</w:t>
+            </w:r>
+          </w:p>
+        </w:tc>
+      </w:tr>
+      <w:tr>
+        <w:tc>
+          <w:tcPr>
+            <w:tcW w:type="dxa" w:w="3400"/>
+          </w:tcPr>
+          <w:p>
+            <w:pPr>
+              <w:jc w:val="left"/>
+            </w:pPr>
+            <w:r>
+              <w:rPr>
+                <w:rFonts w:ascii="Bookman Old Style" w:cs="Bookman Old Style" w:eastAsia="Bookman Old Style" w:hAnsi="Bookman Old Style"/>
+                <w:sz w:val="18"/>
+                <w:szCs w:val="18"/>
+              </w:rPr>
+              <w:t xml:space="preserve">Repasse a instituições</w:t>
+            </w:r>
+          </w:p>
+        </w:tc>
+        <w:tc>
+          <w:tcPr>
+            <w:tcW w:type="dxa" w:w="1500"/>
+          </w:tcPr>
+          <w:p>
+            <w:pPr>
+              <w:jc w:val="right"/>
+            </w:pPr>
+            <w:r>
+              <w:rPr>
+                <w:rFonts w:ascii="Bookman Old Style" w:cs="Bookman Old Style" w:eastAsia="Bookman Old Style" w:hAnsi="Bookman Old Style"/>
+                <w:sz w:val="18"/>
+                <w:szCs w:val="18"/>
+              </w:rPr>
+              <w:t xml:space="preserve">4</w:t>
+            </w:r>
+          </w:p>
+        </w:tc>
+        <w:tc>
+          <w:tcPr>
+            <w:tcW w:type="dxa" w:w="1500"/>
+          </w:tcPr>
+          <w:p>
+            <w:pPr>
+              <w:jc w:val="right"/>
+            </w:pPr>
+            <w:r>
+              <w:rPr>
+                <w:rFonts w:ascii="Bookman Old Style" w:cs="Bookman Old Style" w:eastAsia="Bookman Old Style" w:hAnsi="Bookman Old Style"/>
+                <w:sz w:val="18"/>
+                <w:szCs w:val="18"/>
+              </w:rPr>
+              <w:t xml:space="preserve">4</w:t>
+            </w:r>
+          </w:p>
+        </w:tc>
+        <w:tc>
+          <w:tcPr>
+            <w:tcW w:type="dxa" w:w="1800"/>
+          </w:tcPr>
+          <w:p>
+            <w:pPr>
+              <w:jc w:val="right"/>
+            </w:pPr>
+            <w:r>
+              <w:rPr>
+                <w:rFonts w:ascii="Bookman Old Style" w:cs="Bookman Old Style" w:eastAsia="Bookman Old Style" w:hAnsi="Bookman Old Style"/>
+                <w:sz w:val="18"/>
+                <w:szCs w:val="18"/>
+              </w:rPr>
+              <w:t xml:space="preserve">R$ 1.422.609,94</w:t>
+            </w:r>
+          </w:p>
+        </w:tc>
+      </w:tr>
+      <w:tr>
+        <w:tc>
+          <w:tcPr>
+            <w:tcW w:type="dxa" w:w="3400"/>
+          </w:tcPr>
+          <w:p>
+            <w:pPr>
+              <w:jc w:val="left"/>
+            </w:pPr>
+            <w:r>
+              <w:rPr>
+                <w:rFonts w:ascii="Bookman Old Style" w:cs="Bookman Old Style" w:eastAsia="Bookman Old Style" w:hAnsi="Bookman Old Style"/>
+                <w:sz w:val="18"/>
+                <w:szCs w:val="18"/>
+              </w:rPr>
+              <w:t xml:space="preserve">Sem classificação</w:t>
+            </w:r>
+          </w:p>
+        </w:tc>
+        <w:tc>
+          <w:tcPr>
+            <w:tcW w:type="dxa" w:w="1500"/>
+          </w:tcPr>
+          <w:p>
+            <w:pPr>
+              <w:jc w:val="right"/>
+            </w:pPr>
+            <w:r>
+              <w:rPr>
+                <w:rFonts w:ascii="Bookman Old Style" w:cs="Bookman Old Style" w:eastAsia="Bookman Old Style" w:hAnsi="Bookman Old Style"/>
+                <w:sz w:val="18"/>
+                <w:szCs w:val="18"/>
+              </w:rPr>
+              <w:t xml:space="preserve">5</w:t>
+            </w:r>
+          </w:p>
+        </w:tc>
+        <w:tc>
+          <w:tcPr>
+            <w:tcW w:type="dxa" w:w="1500"/>
+          </w:tcPr>
+          <w:p>
+            <w:pPr>
+              <w:jc w:val="right"/>
+            </w:pPr>
+            <w:r>
+              <w:rPr>
+                <w:rFonts w:ascii="Bookman Old Style" w:cs="Bookman Old Style" w:eastAsia="Bookman Old Style" w:hAnsi="Bookman Old Style"/>
+                <w:sz w:val="18"/>
+                <w:szCs w:val="18"/>
+              </w:rPr>
+              <w:t xml:space="preserve">0</w:t>
+            </w:r>
+          </w:p>
+        </w:tc>
+        <w:tc>
+          <w:tcPr>
+            <w:tcW w:type="dxa" w:w="1800"/>
+          </w:tcPr>
+          <w:p>
+            <w:pPr>
+              <w:jc w:val="right"/>
+            </w:pPr>
+            <w:r>
+              <w:rPr>
+                <w:rFonts w:ascii="Bookman Old Style" w:cs="Bookman Old Style" w:eastAsia="Bookman Old Style" w:hAnsi="Bookman Old Style"/>
+                <w:sz w:val="18"/>
+                <w:szCs w:val="18"/>
+              </w:rPr>
+              <w:t xml:space="preserve">R$ 667.744,50</w:t>
+            </w:r>
+          </w:p>
+        </w:tc>
+      </w:tr>
+      <w:tr>
+        <w:tc>
+          <w:tcPr>
+            <w:tcW w:type="dxa" w:w="3400"/>
+          </w:tcPr>
+          <w:p>
+            <w:pPr>
+              <w:jc w:val="left"/>
+            </w:pPr>
+            <w:r>
+              <w:rPr>
+                <w:rFonts w:ascii="Bookman Old Style" w:cs="Bookman Old Style" w:eastAsia="Bookman Old Style" w:hAnsi="Bookman Old Style"/>
+                <w:sz w:val="18"/>
+                <w:szCs w:val="18"/>
+              </w:rPr>
+              <w:t xml:space="preserve">Contratos e serviços</w:t>
+            </w:r>
+          </w:p>
+        </w:tc>
+        <w:tc>
+          <w:tcPr>
+            <w:tcW w:type="dxa" w:w="1500"/>
+          </w:tcPr>
+          <w:p>
+            <w:pPr>
+              <w:jc w:val="right"/>
+            </w:pPr>
+            <w:r>
+              <w:rPr>
+                <w:rFonts w:ascii="Bookman Old Style" w:cs="Bookman Old Style" w:eastAsia="Bookman Old Style" w:hAnsi="Bookman Old Style"/>
+                <w:sz w:val="18"/>
+                <w:szCs w:val="18"/>
+              </w:rPr>
+              <w:t xml:space="preserve">2</w:t>
+            </w:r>
+          </w:p>
+        </w:tc>
+        <w:tc>
+          <w:tcPr>
+            <w:tcW w:type="dxa" w:w="1500"/>
+          </w:tcPr>
+          <w:p>
+            <w:pPr>
+              <w:jc w:val="right"/>
+            </w:pPr>
+            <w:r>
+              <w:rPr>
+                <w:rFonts w:ascii="Bookman Old Style" w:cs="Bookman Old Style" w:eastAsia="Bookman Old Style" w:hAnsi="Bookman Old Style"/>
+                <w:sz w:val="18"/>
+                <w:szCs w:val="18"/>
+              </w:rPr>
+              <w:t xml:space="preserve">0</w:t>
+            </w:r>
+          </w:p>
+        </w:tc>
+        <w:tc>
+          <w:tcPr>
+            <w:tcW w:type="dxa" w:w="1800"/>
+          </w:tcPr>
+          <w:p>
+            <w:pPr>
+              <w:jc w:val="right"/>
+            </w:pPr>
+            <w:r>
+              <w:rPr>
+                <w:rFonts w:ascii="Bookman Old Style" w:cs="Bookman Old Style" w:eastAsia="Bookman Old Style" w:hAnsi="Bookman Old Style"/>
+                <w:sz w:val="18"/>
+                <w:szCs w:val="18"/>
+              </w:rPr>
+              <w:t xml:space="preserve">R$ 270.626,10</w:t>
+            </w:r>
+          </w:p>
+        </w:tc>
+      </w:tr>
+      <w:tr>
+        <w:tc>
+          <w:tcPr>
+            <w:tcW w:type="dxa" w:w="3400"/>
+          </w:tcPr>
+          <w:p>
+            <w:pPr>
+              <w:jc w:val="left"/>
+            </w:pPr>
+            <w:r>
+              <w:rPr>
+                <w:rFonts w:ascii="Bookman Old Style" w:cs="Bookman Old Style" w:eastAsia="Bookman Old Style" w:hAnsi="Bookman Old Style"/>
+                <w:sz w:val="18"/>
+                <w:szCs w:val="18"/>
+              </w:rPr>
+              <w:t xml:space="preserve">Gasto com pessoal</w:t>
+            </w:r>
+          </w:p>
+        </w:tc>
+        <w:tc>
+          <w:tcPr>
+            <w:tcW w:type="dxa" w:w="1500"/>
+          </w:tcPr>
+          <w:p>
+            <w:pPr>
+              <w:jc w:val="right"/>
+            </w:pPr>
+            <w:r>
+              <w:rPr>
+                <w:rFonts w:ascii="Bookman Old Style" w:cs="Bookman Old Style" w:eastAsia="Bookman Old Style" w:hAnsi="Bookman Old Style"/>
+                <w:sz w:val="18"/>
+                <w:szCs w:val="18"/>
+              </w:rPr>
+              <w:t xml:space="preserve">1</w:t>
+            </w:r>
+          </w:p>
+        </w:tc>
+        <w:tc>
+          <w:tcPr>
+            <w:tcW w:type="dxa" w:w="1500"/>
+          </w:tcPr>
+          <w:p>
+            <w:pPr>
+              <w:jc w:val="right"/>
+            </w:pPr>
+            <w:r>
+              <w:rPr>
+                <w:rFonts w:ascii="Bookman Old Style" w:cs="Bookman Old Style" w:eastAsia="Bookman Old Style" w:hAnsi="Bookman Old Style"/>
+                <w:sz w:val="18"/>
+                <w:szCs w:val="18"/>
+              </w:rPr>
+              <w:t xml:space="preserve">0</w:t>
+            </w:r>
+          </w:p>
+        </w:tc>
+        <w:tc>
+          <w:tcPr>
+            <w:tcW w:type="dxa" w:w="1800"/>
+          </w:tcPr>
+          <w:p>
+            <w:pPr>
+              <w:jc w:val="right"/>
+            </w:pPr>
+            <w:r>
+              <w:rPr>
+                <w:rFonts w:ascii="Bookman Old Style" w:cs="Bookman Old Style" w:eastAsia="Bookman Old Style" w:hAnsi="Bookman Old Style"/>
+                <w:sz w:val="18"/>
+                <w:szCs w:val="18"/>
+              </w:rPr>
+              <w:t xml:space="preserve">R$ 0,00</w:t>
+            </w:r>
+          </w:p>
+        </w:tc>
+      </w:tr>
+    </w:tbl>
+    <w:p>
+      <w:pPr>
+        <w:spacing w:line="276"/>
+      </w:pPr>
+      <w:r>
+        <w:rPr>
+          <w:rFonts w:ascii="Bookman Old Style" w:cs="Bookman Old Style" w:eastAsia="Bookman Old Style" w:hAnsi="Bookman Old Style"/>
+          <w:sz w:val="22"/>
+          <w:szCs w:val="22"/>
+        </w:rPr>
+        <w:t xml:space="preserve"/>
+      </w:r>
+    </w:p>
+    <w:p>
+      <w:pPr>
+        <w:spacing w:line="276"/>
+        <w:ind w:firstLine="1133"/>
+        <w:jc w:val="both"/>
+      </w:pPr>
+      <w:r>
+        <w:rPr>
+          <w:rFonts w:ascii="Bookman Old Style" w:cs="Bookman Old Style" w:eastAsia="Bookman Old Style" w:hAnsi="Bookman Old Style"/>
+          <w:sz w:val="22"/>
+          <w:szCs w:val="22"/>
+        </w:rPr>
+        <w:t xml:space="preserve">A categorização separa gasto com pessoal, contrato fixo, repasse a instituição, programa e investimento. Dentro de pessoal, distingue folha, diárias, reembolso e demais verbas. Nos repasses, distingue a instituição recebedora do programa financiado. Registros que a publicação não permite classificar ficam em categoria própria e aparecem no relatório — nunca são rateados entre as demais.</w:t>
+      </w:r>
+    </w:p>
+    <w:p>
+      <w:pPr>
+        <w:spacing w:line="276"/>
+      </w:pPr>
+      <w:r>
+        <w:rPr>
+          <w:rFonts w:ascii="Bookman Old Style" w:cs="Bookman Old Style" w:eastAsia="Bookman Old Style" w:hAnsi="Bookman Old Style"/>
+          <w:sz w:val="22"/>
+          <w:szCs w:val="22"/>
+        </w:rPr>
+        <w:t xml:space="preserve"/>
+      </w:r>
+    </w:p>
+    <w:p>
+      <w:pPr>
+        <w:spacing w:line="276"/>
+        <w:ind w:firstLine="1133"/>
+        <w:jc w:val="both"/>
+      </w:pPr>
+      <w:r>
+        <w:rPr>
+          <w:rFonts w:ascii="Bookman Old Style" w:cs="Bookman Old Style" w:eastAsia="Bookman Old Style" w:hAnsi="Bookman Old Style"/>
+          <w:sz w:val="22"/>
+          <w:szCs w:val="22"/>
+        </w:rPr>
+        <w:t xml:space="preserve">A versão didática desta trilha, feita para leitura por quem não é da área, está em </w:t>
+      </w:r>
+      <w:hyperlink w:history="1" r:id="rIdrvr2d4qdiyyqqgjmjd_my">
+        <w:r>
+          <w:rPr>
+            <w:rStyle w:val="Hyperlink"/>
+            <w:rFonts w:ascii="Bookman Old Style" w:cs="Bookman Old Style" w:eastAsia="Bookman Old Style" w:hAnsi="Bookman Old Style"/>
+            <w:sz w:val="20"/>
+            <w:szCs w:val="20"/>
+            <w:u w:val="single"/>
+          </w:rPr>
+          <w:t xml:space="preserve">docs/trilha_didatica_2026.html</w:t>
+        </w:r>
+      </w:hyperlink>
+      <w:r>
+        <w:rPr>
+          <w:rFonts w:ascii="Bookman Old Style" w:cs="Bookman Old Style" w:eastAsia="Bookman Old Style" w:hAnsi="Bookman Old Style"/>
+          <w:sz w:val="22"/>
+          <w:szCs w:val="22"/>
+        </w:rPr>
+        <w:t xml:space="preserve">. Quatro estações: quem paga, onde o dinheiro fica, em que foi gasto e quem recebeu.</w:t>
+      </w:r>
+    </w:p>
+    <w:p>
+      <w:r>
+        <w:br w:type="page"/>
+      </w:r>
+    </w:p>
+    <w:p>
+      <w:pPr>
+        <w:pStyle w:val="Heading1"/>
+        <w:spacing w:after="120" w:before="240"/>
+        <w:jc w:val="center"/>
+      </w:pPr>
+      <w:r>
+        <w:rPr>
+          <w:rFonts w:ascii="Bookman Old Style" w:cs="Bookman Old Style" w:eastAsia="Bookman Old Style" w:hAnsi="Bookman Old Style"/>
+          <w:b/>
+          <w:bCs/>
+          <w:sz w:val="26"/>
+          <w:szCs w:val="26"/>
+        </w:rPr>
         <w:t xml:space="preserve">V — Irregularidades Apuradas</w:t>
       </w:r>
     </w:p>
@@ -5034,7 +5951,7 @@
         </w:rPr>
         <w:t xml:space="preserve">Diário Oficial do Município, Edição 8830, última edição publicada, 29/07/2026 — </w:t>
       </w:r>
-      <w:hyperlink w:history="1" r:id="rIdg3ufiibvsw-2j0l1vlltf">
+      <w:hyperlink w:history="1" r:id="rId-g2m9gjvnqmb5sqjcrqll">
         <w:r>
           <w:rPr>
             <w:rStyle w:val="Hyperlink"/>
@@ -5062,7 +5979,7 @@
         </w:rPr>
         <w:t xml:space="preserve">Acervo do Diário Oficial coletado, 161 eventos entre 2025 e 2026, com digest de cada edição — </w:t>
       </w:r>
-      <w:hyperlink w:history="1" r:id="rIdihnnnepocdpbx7cuehnwp">
+      <w:hyperlink w:history="1" r:id="rIdoawnp_2cymnpfouj93scv">
         <w:r>
           <w:rPr>
             <w:rStyle w:val="Hyperlink"/>
@@ -5099,7 +6016,7 @@
         </w:rPr>
         <w:t xml:space="preserve">Onde deveria estar publicado. </w:t>
       </w:r>
-      <w:hyperlink w:history="1" r:id="rIdlsqthbph9-zivt8yatbbq">
+      <w:hyperlink w:history="1" r:id="rIdcqcf9lbwhpf_roaxddb8c">
         <w:r>
           <w:rPr>
             <w:rStyle w:val="Hyperlink"/>
@@ -5326,7 +6243,7 @@
         </w:rPr>
         <w:t xml:space="preserve">Acervo do Diário Oficial coletado, 161 eventos entre 2025 e 2026, com digest de cada edição — </w:t>
       </w:r>
-      <w:hyperlink w:history="1" r:id="rId6syj3h811bhh3nzl0q4co">
+      <w:hyperlink w:history="1" r:id="rIdw3otu0qgm3htufxjn2fuw">
         <w:r>
           <w:rPr>
             <w:rStyle w:val="Hyperlink"/>
@@ -5354,7 +6271,7 @@
         </w:rPr>
         <w:t xml:space="preserve">Sítio próprio do Conselho, sem documento posterior a dezembro de 2023 — </w:t>
       </w:r>
-      <w:hyperlink w:history="1" r:id="rIdvsxc9zk6caaplajcplwb6">
+      <w:hyperlink w:history="1" r:id="rIdmhdssm3z7t--oea3rrev6">
         <w:r>
           <w:rPr>
             <w:rStyle w:val="Hyperlink"/>
@@ -5391,7 +6308,7 @@
         </w:rPr>
         <w:t xml:space="preserve">Onde deveria estar publicado. </w:t>
       </w:r>
-      <w:hyperlink w:history="1" r:id="rIdjorzrx0cfs1edav2ih9-a">
+      <w:hyperlink w:history="1" r:id="rIddy2lnfa9uueu-vaprdhat">
         <w:r>
           <w:rPr>
             <w:rStyle w:val="Hyperlink"/>
@@ -5411,7 +6328,7 @@
         </w:rPr>
         <w:t xml:space="preserve">; </w:t>
       </w:r>
-      <w:hyperlink w:history="1" r:id="rIdnmajwtrv4kummnae8jlzo">
+      <w:hyperlink w:history="1" r:id="rIdewhopl0dbtyll8riwgzik">
         <w:r>
           <w:rPr>
             <w:rStyle w:val="Hyperlink"/>
@@ -5651,7 +6568,7 @@
         </w:rPr>
         <w:t xml:space="preserve">Lei Orçamentária Anual 11.590/2026, anexos, Diário Oficial do Município, Edição 8697, de 09/01/2026, Edição Extra — </w:t>
       </w:r>
-      <w:hyperlink w:history="1" r:id="rIdj7o8yfp4lodmikkgu2t0i">
+      <w:hyperlink w:history="1" r:id="rId2ypnoorcnkudzraayhsee">
         <w:r>
           <w:rPr>
             <w:rStyle w:val="Hyperlink"/>
@@ -5679,7 +6596,7 @@
         </w:rPr>
         <w:t xml:space="preserve">Lei Orçamentária Anual 11.315/2025, anexos, Diário Oficial do Município, de 07/01/2025 — </w:t>
       </w:r>
-      <w:hyperlink w:history="1" r:id="rId1a2gbyajb7znmoqosnpoy">
+      <w:hyperlink w:history="1" r:id="rId7optbdl1qbhv4tzl04uz3">
         <w:r>
           <w:rPr>
             <w:rStyle w:val="Hyperlink"/>
@@ -5716,7 +6633,7 @@
         </w:rPr>
         <w:t xml:space="preserve">Onde deveria estar publicado. </w:t>
       </w:r>
-      <w:hyperlink w:history="1" r:id="rIdnkycrgssxdk4lx2mh0cf7">
+      <w:hyperlink w:history="1" r:id="rIdwysvriu4fvnnolsuo5d-n">
         <w:r>
           <w:rPr>
             <w:rStyle w:val="Hyperlink"/>
@@ -5736,7 +6653,7 @@
         </w:rPr>
         <w:t xml:space="preserve">; </w:t>
       </w:r>
-      <w:hyperlink w:history="1" r:id="rIdjkni62vrit29sril9jr_i">
+      <w:hyperlink w:history="1" r:id="rIdf8yds8xvrnczsgdrwf7pq">
         <w:r>
           <w:rPr>
             <w:rStyle w:val="Hyperlink"/>
@@ -5965,7 +6882,7 @@
         </w:rPr>
         <w:t xml:space="preserve">Acervo do Diário Oficial coletado, 161 eventos entre 2025 e 2026, com digest de cada edição — </w:t>
       </w:r>
-      <w:hyperlink w:history="1" r:id="rIddtbku3o0uwmzleasebqzr">
+      <w:hyperlink w:history="1" r:id="rId9yfq8r8gj0hhmlkecta59">
         <w:r>
           <w:rPr>
             <w:rStyle w:val="Hyperlink"/>
@@ -6002,7 +6919,7 @@
         </w:rPr>
         <w:t xml:space="preserve">Onde deveria estar publicado. </w:t>
       </w:r>
-      <w:hyperlink w:history="1" r:id="rIdtoturfjm8epnpwvqqqhlk">
+      <w:hyperlink w:history="1" r:id="rIdbtdzo3xtmweelsepu6cnq">
         <w:r>
           <w:rPr>
             <w:rStyle w:val="Hyperlink"/>
@@ -6237,7 +7154,7 @@
         </w:rPr>
         <w:t xml:space="preserve">Lei Orçamentária Anual 11.590/2026, anexos, Diário Oficial do Município, Edição 8697, de 09/01/2026, Edição Extra — </w:t>
       </w:r>
-      <w:hyperlink w:history="1" r:id="rIdco5c0j9t6-fhsctjmbvko">
+      <w:hyperlink w:history="1" r:id="rIdsjp6xdjizq5tn4cn5hw9x">
         <w:r>
           <w:rPr>
             <w:rStyle w:val="Hyperlink"/>
@@ -6265,7 +7182,7 @@
         </w:rPr>
         <w:t xml:space="preserve">Lei municipal 7.531/1995 — </w:t>
       </w:r>
-      <w:hyperlink w:history="1" r:id="rIdbed-kbxwkquszvmja2csl">
+      <w:hyperlink w:history="1" r:id="rIdj17kynqk3fwgm4z794r_c">
         <w:r>
           <w:rPr>
             <w:rStyle w:val="Hyperlink"/>
@@ -6302,7 +7219,7 @@
         </w:rPr>
         <w:t xml:space="preserve">Onde deveria estar publicado. </w:t>
       </w:r>
-      <w:hyperlink w:history="1" r:id="rIdxudenvylomx50sy7prqpb">
+      <w:hyperlink w:history="1" r:id="rIdgryvcwoqth13v1wn3tjkz">
         <w:r>
           <w:rPr>
             <w:rStyle w:val="Hyperlink"/>
@@ -6322,7 +7239,7 @@
         </w:rPr>
         <w:t xml:space="preserve">; </w:t>
       </w:r>
-      <w:hyperlink w:history="1" r:id="rIdwvz83bvnwpfxzaabgjvd4">
+      <w:hyperlink w:history="1" r:id="rIdpomlxplsaceaie5qdf5hy">
         <w:r>
           <w:rPr>
             <w:rStyle w:val="Hyperlink"/>
@@ -6551,7 +7468,7 @@
         </w:rPr>
         <w:t xml:space="preserve">Lei Orçamentária Anual 11.590/2026, anexos, Diário Oficial do Município, Edição 8697, de 09/01/2026, Edição Extra — </w:t>
       </w:r>
-      <w:hyperlink w:history="1" r:id="rIdercoiuu98mnmzirzh7ani">
+      <w:hyperlink w:history="1" r:id="rIdpo-en_axni1wcivkypyq1">
         <w:r>
           <w:rPr>
             <w:rStyle w:val="Hyperlink"/>
@@ -6579,7 +7496,7 @@
         </w:rPr>
         <w:t xml:space="preserve">Resolução CNAS/MDS 202/2025, Diário Oficial da União de 28/07/2025, Edição 140, Seção 1, Página 87 — </w:t>
       </w:r>
-      <w:hyperlink w:history="1" r:id="rIdzj7pk6jwrhzihh20peewl">
+      <w:hyperlink w:history="1" r:id="rIdrw5p6xfbp1akitkckvxad">
         <w:r>
           <w:rPr>
             <w:rStyle w:val="Hyperlink"/>
@@ -6616,7 +7533,7 @@
         </w:rPr>
         <w:t xml:space="preserve">Onde deveria estar publicado. </w:t>
       </w:r>
-      <w:hyperlink w:history="1" r:id="rIdcnfolyh5iclez5ujasmlj">
+      <w:hyperlink w:history="1" r:id="rIddpu8l1pjyhr8kkxohzejz">
         <w:r>
           <w:rPr>
             <w:rStyle w:val="Hyperlink"/>
@@ -6636,7 +7553,7 @@
         </w:rPr>
         <w:t xml:space="preserve">; </w:t>
       </w:r>
-      <w:hyperlink w:history="1" r:id="rIdh2nhc016-qy-grfwgrg6g">
+      <w:hyperlink w:history="1" r:id="rId9pozyufzy1ovgthbn6z84">
         <w:r>
           <w:rPr>
             <w:rStyle w:val="Hyperlink"/>
@@ -6888,7 +7805,7 @@
         </w:rPr>
         <w:t xml:space="preserve">Resolução CNAS/MDS 202/2025, Diário Oficial da União de 28/07/2025, Edição 140, Seção 1, Página 87 — </w:t>
       </w:r>
-      <w:hyperlink w:history="1" r:id="rIdiaoyaik8dnjhqdc1hny1i">
+      <w:hyperlink w:history="1" r:id="rIdjgpw5qfdg455saljo9xme">
         <w:r>
           <w:rPr>
             <w:rStyle w:val="Hyperlink"/>
@@ -6925,7 +7842,7 @@
         </w:rPr>
         <w:t xml:space="preserve">Onde deveria estar publicado. </w:t>
       </w:r>
-      <w:hyperlink w:history="1" r:id="rIdtkyjpg1ivtgfr4e60s90f">
+      <w:hyperlink w:history="1" r:id="rIdrgri1lcalgbiwek0zjbt-">
         <w:r>
           <w:rPr>
             <w:rStyle w:val="Hyperlink"/>
@@ -7163,7 +8080,7 @@
         </w:rPr>
         <w:t xml:space="preserve">Sítio próprio do Conselho, sem documento posterior a dezembro de 2023 — </w:t>
       </w:r>
-      <w:hyperlink w:history="1" r:id="rIdtndhey3kq5qgokackykh0">
+      <w:hyperlink w:history="1" r:id="rIdtzsg4ozrdcd2tfefiecac">
         <w:r>
           <w:rPr>
             <w:rStyle w:val="Hyperlink"/>
@@ -7200,7 +8117,7 @@
         </w:rPr>
         <w:t xml:space="preserve">Onde deveria estar publicado. </w:t>
       </w:r>
-      <w:hyperlink w:history="1" r:id="rIdxi-mf5s-wmr6-xkalsbb3">
+      <w:hyperlink w:history="1" r:id="rIdem1ztp6uxuj5c2vcjhyno">
         <w:r>
           <w:rPr>
             <w:rStyle w:val="Hyperlink"/>
@@ -7220,7 +8137,7 @@
         </w:rPr>
         <w:t xml:space="preserve">; </w:t>
       </w:r>
-      <w:hyperlink w:history="1" r:id="rIdmv_vdxl2rtsim6zzwgm4m">
+      <w:hyperlink w:history="1" r:id="rIdspjudslgpwqld3moehrhm">
         <w:r>
           <w:rPr>
             <w:rStyle w:val="Hyperlink"/>
@@ -7443,7 +8360,7 @@
         </w:rPr>
         <w:t xml:space="preserve">Acervo do Diário Oficial coletado, 161 eventos entre 2025 e 2026, com digest de cada edição — </w:t>
       </w:r>
-      <w:hyperlink w:history="1" r:id="rId1r3u-sjzjab3pe0wukjyw">
+      <w:hyperlink w:history="1" r:id="rIdfdfdb-gvckmz8suvxgazz">
         <w:r>
           <w:rPr>
             <w:rStyle w:val="Hyperlink"/>
@@ -7480,7 +8397,7 @@
         </w:rPr>
         <w:t xml:space="preserve">Onde deveria estar publicado. </w:t>
       </w:r>
-      <w:hyperlink w:history="1" r:id="rIdqxj5whtmqxikbxytuufvk">
+      <w:hyperlink w:history="1" r:id="rId5pca9ncejpylv3mok2s90">
         <w:r>
           <w:rPr>
             <w:rStyle w:val="Hyperlink"/>
@@ -7500,7 +8417,7 @@
         </w:rPr>
         <w:t xml:space="preserve">; </w:t>
       </w:r>
-      <w:hyperlink w:history="1" r:id="rId1euiq6cushey9ddxhu7f3">
+      <w:hyperlink w:history="1" r:id="rIdprcwkc_vv6v9gpgmmcnaa">
         <w:r>
           <w:rPr>
             <w:rStyle w:val="Hyperlink"/>
@@ -7723,7 +8640,7 @@
         </w:rPr>
         <w:t xml:space="preserve">Resolução CNAS/MDS 202/2025, Diário Oficial da União de 28/07/2025, Edição 140, Seção 1, Página 87 — </w:t>
       </w:r>
-      <w:hyperlink w:history="1" r:id="rIdzck5cpoejgz6vrtmtxink">
+      <w:hyperlink w:history="1" r:id="rId24a_dm037sy0w8xlhcodp">
         <w:r>
           <w:rPr>
             <w:rStyle w:val="Hyperlink"/>
@@ -7760,7 +8677,7 @@
         </w:rPr>
         <w:t xml:space="preserve">Onde deveria estar publicado. </w:t>
       </w:r>
-      <w:hyperlink w:history="1" r:id="rIdkxgx83irj1z2_wlamglaz">
+      <w:hyperlink w:history="1" r:id="rId59jf2t_kxpwjfc2rj5p_g">
         <w:r>
           <w:rPr>
             <w:rStyle w:val="Hyperlink"/>
@@ -7981,7 +8898,7 @@
         </w:rPr>
         <w:t xml:space="preserve">Acervo do Diário Oficial coletado, 161 eventos entre 2025 e 2026, com digest de cada edição — </w:t>
       </w:r>
-      <w:hyperlink w:history="1" r:id="rIdhp7hf8jqe3zhajrc12olk">
+      <w:hyperlink w:history="1" r:id="rId9ytex6x18whku_akmbhnb">
         <w:r>
           <w:rPr>
             <w:rStyle w:val="Hyperlink"/>
@@ -8018,7 +8935,7 @@
         </w:rPr>
         <w:t xml:space="preserve">Onde deveria estar publicado. </w:t>
       </w:r>
-      <w:hyperlink w:history="1" r:id="rIdsxxob-qqlauk1cz1tck3i">
+      <w:hyperlink w:history="1" r:id="rIdxpxnmgwsfm88ndfma2u5d">
         <w:r>
           <w:rPr>
             <w:rStyle w:val="Hyperlink"/>
@@ -8258,7 +9175,7 @@
         </w:rPr>
         <w:t xml:space="preserve">Lei Orçamentária Anual 11.590/2026, anexos, Diário Oficial do Município, Edição 8697, de 09/01/2026, Edição Extra — </w:t>
       </w:r>
-      <w:hyperlink w:history="1" r:id="rIdzp0znlnbn65udxngmdnkl">
+      <w:hyperlink w:history="1" r:id="rIdw_0gpl33glcm4vbhrerig">
         <w:r>
           <w:rPr>
             <w:rStyle w:val="Hyperlink"/>
@@ -8295,7 +9212,7 @@
         </w:rPr>
         <w:t xml:space="preserve">Onde deveria estar publicado. </w:t>
       </w:r>
-      <w:hyperlink w:history="1" r:id="rIdvapgga2ndgsrcuxw61uab">
+      <w:hyperlink w:history="1" r:id="rIdeiht317hyxsb7ok551uzh">
         <w:r>
           <w:rPr>
             <w:rStyle w:val="Hyperlink"/>
@@ -8524,7 +9441,7 @@
         </w:rPr>
         <w:t xml:space="preserve">Lei Orçamentária Anual 11.590/2026, anexos, Diário Oficial do Município, Edição 8697, de 09/01/2026, Edição Extra — </w:t>
       </w:r>
-      <w:hyperlink w:history="1" r:id="rIdvpsxnxiamn_cwmhche0mu">
+      <w:hyperlink w:history="1" r:id="rId1qclxlq24cbsupnjhrqpi">
         <w:r>
           <w:rPr>
             <w:rStyle w:val="Hyperlink"/>
@@ -8561,7 +9478,7 @@
         </w:rPr>
         <w:t xml:space="preserve">Onde deveria estar publicado. </w:t>
       </w:r>
-      <w:hyperlink w:history="1" r:id="rIdehmtgkf2gwgp6dc-xkeu1">
+      <w:hyperlink w:history="1" r:id="rIdi-b7oh_vbdj4mepthffws">
         <w:r>
           <w:rPr>
             <w:rStyle w:val="Hyperlink"/>
@@ -8784,7 +9701,7 @@
         </w:rPr>
         <w:t xml:space="preserve">Lei Orçamentária Anual 11.590/2026, anexos, Diário Oficial do Município, Edição 8697, de 09/01/2026, Edição Extra — </w:t>
       </w:r>
-      <w:hyperlink w:history="1" r:id="rIdivn_qwcwdbos3cfgpmqjc">
+      <w:hyperlink w:history="1" r:id="rIdtny3_wftbbp2yxlpsv4rq">
         <w:r>
           <w:rPr>
             <w:rStyle w:val="Hyperlink"/>
@@ -8812,7 +9729,7 @@
         </w:rPr>
         <w:t xml:space="preserve">Lei municipal 9.009/2010 — </w:t>
       </w:r>
-      <w:hyperlink w:history="1" r:id="rIdpzl5vjw25elgjltnftnji">
+      <w:hyperlink w:history="1" r:id="rIdm0d-wzgodfqgnua2vgfay">
         <w:r>
           <w:rPr>
             <w:rStyle w:val="Hyperlink"/>
@@ -8849,7 +9766,7 @@
         </w:rPr>
         <w:t xml:space="preserve">Onde deveria estar publicado. </w:t>
       </w:r>
-      <w:hyperlink w:history="1" r:id="rIdm0i40ddbxuwnsofgzurb-">
+      <w:hyperlink w:history="1" r:id="rIdntgyyyed2wa4h4kyvuppi">
         <w:r>
           <w:rPr>
             <w:rStyle w:val="Hyperlink"/>
@@ -9078,7 +9995,7 @@
         </w:rPr>
         <w:t xml:space="preserve">Lei Orçamentária Anual 11.590/2026, anexos, Diário Oficial do Município, Edição 8697, de 09/01/2026, Edição Extra — </w:t>
       </w:r>
-      <w:hyperlink w:history="1" r:id="rIdldqzyncuogcu83ksnfqvw">
+      <w:hyperlink w:history="1" r:id="rIdabf1mswaefym9ohds6lml">
         <w:r>
           <w:rPr>
             <w:rStyle w:val="Hyperlink"/>
@@ -9115,7 +10032,7 @@
         </w:rPr>
         <w:t xml:space="preserve">Onde deveria estar publicado. </w:t>
       </w:r>
-      <w:hyperlink w:history="1" r:id="rIdmr53puf7-z3mfc_lg3pm0">
+      <w:hyperlink w:history="1" r:id="rIdbrjn1u1z4rteqvurrjyt_">
         <w:r>
           <w:rPr>
             <w:rStyle w:val="Hyperlink"/>
@@ -9359,7 +10276,7 @@
         </w:rPr>
         <w:t xml:space="preserve">Acervo do Diário Oficial coletado, 161 eventos entre 2025 e 2026, com digest de cada edição — </w:t>
       </w:r>
-      <w:hyperlink w:history="1" r:id="rIdeszz47ryuzgidzkfjtqml">
+      <w:hyperlink w:history="1" r:id="rIdcsl7kn-pyupjwtwlickhb">
         <w:r>
           <w:rPr>
             <w:rStyle w:val="Hyperlink"/>
@@ -9396,7 +10313,7 @@
         </w:rPr>
         <w:t xml:space="preserve">Onde deveria estar publicado. </w:t>
       </w:r>
-      <w:hyperlink w:history="1" r:id="rIdqavzzj72cbt2o89mjevpt">
+      <w:hyperlink w:history="1" r:id="rIdodv-yn8jbdjpv2moyhhsy">
         <w:r>
           <w:rPr>
             <w:rStyle w:val="Hyperlink"/>
@@ -9623,7 +10540,7 @@
         </w:rPr>
         <w:t xml:space="preserve">Acervo do Diário Oficial coletado, 161 eventos entre 2025 e 2026, com digest de cada edição — </w:t>
       </w:r>
-      <w:hyperlink w:history="1" r:id="rIdzzemhddtyqunqa50utvc3">
+      <w:hyperlink w:history="1" r:id="rIdny16-1-2hnoywlch8adqd">
         <w:r>
           <w:rPr>
             <w:rStyle w:val="Hyperlink"/>
@@ -9660,7 +10577,7 @@
         </w:rPr>
         <w:t xml:space="preserve">Onde deveria estar publicado. </w:t>
       </w:r>
-      <w:hyperlink w:history="1" r:id="rIdehsnys-83uj36vn9_qpy_">
+      <w:hyperlink w:history="1" r:id="rIdqwbtxsjqsdyccvegh0h9c">
         <w:r>
           <w:rPr>
             <w:rStyle w:val="Hyperlink"/>
@@ -9680,7 +10597,7 @@
         </w:rPr>
         <w:t xml:space="preserve">; </w:t>
       </w:r>
-      <w:hyperlink w:history="1" r:id="rIdr7rgefamj23p1jflj2hks">
+      <w:hyperlink w:history="1" r:id="rId7cep6kpxzmltgqpnv6rf1">
         <w:r>
           <w:rPr>
             <w:rStyle w:val="Hyperlink"/>
@@ -9909,7 +10826,7 @@
         </w:rPr>
         <w:t xml:space="preserve">Lei municipal 7.531/1995 — </w:t>
       </w:r>
-      <w:hyperlink w:history="1" r:id="rIdw-zyaj194rgo9qtwuohpy">
+      <w:hyperlink w:history="1" r:id="rIdcj3gabihm1mhkpdw9jjwy">
         <w:r>
           <w:rPr>
             <w:rStyle w:val="Hyperlink"/>
@@ -9946,7 +10863,7 @@
         </w:rPr>
         <w:t xml:space="preserve">Onde deveria estar publicado. </w:t>
       </w:r>
-      <w:hyperlink w:history="1" r:id="rIdb369ddluolzvxsyks1gjl">
+      <w:hyperlink w:history="1" r:id="rIduq4bg3r-tp29fh-ts4084">
         <w:r>
           <w:rPr>
             <w:rStyle w:val="Hyperlink"/>
@@ -9966,7 +10883,7 @@
         </w:rPr>
         <w:t xml:space="preserve">; </w:t>
       </w:r>
-      <w:hyperlink w:history="1" r:id="rIdwe-p1ml-heloboag5szeq">
+      <w:hyperlink w:history="1" r:id="rIdozdws5hkbm23jhetc_j5f">
         <w:r>
           <w:rPr>
             <w:rStyle w:val="Hyperlink"/>
@@ -10187,7 +11104,7 @@
         </w:rPr>
         <w:t xml:space="preserve">Acervo do Diário Oficial coletado, 161 eventos entre 2025 e 2026, com digest de cada edição — </w:t>
       </w:r>
-      <w:hyperlink w:history="1" r:id="rIdr1f9rclvvfeuzudf15ktg">
+      <w:hyperlink w:history="1" r:id="rId67qkudv6yrci6gqmxr_e8">
         <w:r>
           <w:rPr>
             <w:rStyle w:val="Hyperlink"/>
@@ -10224,7 +11141,7 @@
         </w:rPr>
         <w:t xml:space="preserve">Onde deveria estar publicado. </w:t>
       </w:r>
-      <w:hyperlink w:history="1" r:id="rIdukfxwizybkn4x9g3n6g5j">
+      <w:hyperlink w:history="1" r:id="rIdsa_sqqv7iytvheupvuljt">
         <w:r>
           <w:rPr>
             <w:rStyle w:val="Hyperlink"/>
@@ -10445,7 +11362,7 @@
         </w:rPr>
         <w:t xml:space="preserve">Acervo do Diário Oficial coletado, 161 eventos entre 2025 e 2026, com digest de cada edição — </w:t>
       </w:r>
-      <w:hyperlink w:history="1" r:id="rIds2vlwif3w0yqghhxcn-pw">
+      <w:hyperlink w:history="1" r:id="rIdit4thai9sdbjyztpxw9ry">
         <w:r>
           <w:rPr>
             <w:rStyle w:val="Hyperlink"/>
@@ -10482,7 +11399,7 @@
         </w:rPr>
         <w:t xml:space="preserve">Onde deveria estar publicado. </w:t>
       </w:r>
-      <w:hyperlink w:history="1" r:id="rIdt42hyasc1lp5yhnbh4g9w">
+      <w:hyperlink w:history="1" r:id="rIdcv4ip9na5rd9wbgkma6yo">
         <w:r>
           <w:rPr>
             <w:rStyle w:val="Hyperlink"/>
@@ -10722,7 +11639,7 @@
         </w:rPr>
         <w:t xml:space="preserve">Acervo do Diário Oficial coletado, 161 eventos entre 2025 e 2026, com digest de cada edição — </w:t>
       </w:r>
-      <w:hyperlink w:history="1" r:id="rId2rmt4fdbevxew-gqvbda3">
+      <w:hyperlink w:history="1" r:id="rIdu4mux-9s3xlhm1kteqjst">
         <w:r>
           <w:rPr>
             <w:rStyle w:val="Hyperlink"/>
@@ -10759,7 +11676,7 @@
         </w:rPr>
         <w:t xml:space="preserve">Onde deveria estar publicado. </w:t>
       </w:r>
-      <w:hyperlink w:history="1" r:id="rIdjmhm6b7ma-12jynpe-uat">
+      <w:hyperlink w:history="1" r:id="rIdj77payc2itf_3edfpevxz">
         <w:r>
           <w:rPr>
             <w:rStyle w:val="Hyperlink"/>
@@ -10980,7 +11897,7 @@
         </w:rPr>
         <w:t xml:space="preserve">Acervo do Diário Oficial coletado, 161 eventos entre 2025 e 2026, com digest de cada edição — </w:t>
       </w:r>
-      <w:hyperlink w:history="1" r:id="rIdkgf59ywdsua21rfiwp2je">
+      <w:hyperlink w:history="1" r:id="rId1_ncmy6dmzua1r3zqq6vo">
         <w:r>
           <w:rPr>
             <w:rStyle w:val="Hyperlink"/>
@@ -11017,7 +11934,7 @@
         </w:rPr>
         <w:t xml:space="preserve">Onde deveria estar publicado. </w:t>
       </w:r>
-      <w:hyperlink w:history="1" r:id="rIdfh8iyvnpqsokio0zmjwif">
+      <w:hyperlink w:history="1" r:id="rIdu4toaryrqfnc7ufpe3xam">
         <w:r>
           <w:rPr>
             <w:rStyle w:val="Hyperlink"/>
@@ -11257,7 +12174,7 @@
         </w:rPr>
         <w:t xml:space="preserve">Lei Orçamentária Anual 11.590/2026, anexos, Diário Oficial do Município, Edição 8697, de 09/01/2026, Edição Extra — </w:t>
       </w:r>
-      <w:hyperlink w:history="1" r:id="rIdw5xmrq7plhl9pfy6k8kic">
+      <w:hyperlink w:history="1" r:id="rIdvopbiyh5xywagyaz5skxy">
         <w:r>
           <w:rPr>
             <w:rStyle w:val="Hyperlink"/>
@@ -11285,7 +12202,7 @@
         </w:rPr>
         <w:t xml:space="preserve">Acervo do Diário Oficial coletado, 161 eventos entre 2025 e 2026, com digest de cada edição — </w:t>
       </w:r>
-      <w:hyperlink w:history="1" r:id="rIdbnppopm5qzwwkyndtthdo">
+      <w:hyperlink w:history="1" r:id="rIdfdl2mmfnbzlq6tnexq0n_">
         <w:r>
           <w:rPr>
             <w:rStyle w:val="Hyperlink"/>
@@ -11322,7 +12239,7 @@
         </w:rPr>
         <w:t xml:space="preserve">Onde deveria estar publicado. </w:t>
       </w:r>
-      <w:hyperlink w:history="1" r:id="rId1bcba1n9nw5-siekcajzq">
+      <w:hyperlink w:history="1" r:id="rIdhrkkorgibkf5zq66xnoma">
         <w:r>
           <w:rPr>
             <w:rStyle w:val="Hyperlink"/>
@@ -11566,7 +12483,7 @@
         </w:rPr>
         <w:t xml:space="preserve">Acervo do Diário Oficial coletado, 161 eventos entre 2025 e 2026, com digest de cada edição — </w:t>
       </w:r>
-      <w:hyperlink w:history="1" r:id="rIdxwfupmqjmxvdv5_gvwzkj">
+      <w:hyperlink w:history="1" r:id="rId4blra_zcogeu9vmli10-c">
         <w:r>
           <w:rPr>
             <w:rStyle w:val="Hyperlink"/>
@@ -11603,7 +12520,7 @@
         </w:rPr>
         <w:t xml:space="preserve">Onde deveria estar publicado. </w:t>
       </w:r>
-      <w:hyperlink w:history="1" r:id="rIdx_4gt8s_sbmcuipoun7po">
+      <w:hyperlink w:history="1" r:id="rIdtbptiyoen9evbdvzse6yq">
         <w:r>
           <w:rPr>
             <w:rStyle w:val="Hyperlink"/>
@@ -11841,7 +12758,7 @@
         </w:rPr>
         <w:t xml:space="preserve">Acervo do Diário Oficial coletado, 161 eventos entre 2025 e 2026, com digest de cada edição — </w:t>
       </w:r>
-      <w:hyperlink w:history="1" r:id="rIdqygddfgxs2nurczx4gxnl">
+      <w:hyperlink w:history="1" r:id="rIdobyys10ogaldagc5xqjbh">
         <w:r>
           <w:rPr>
             <w:rStyle w:val="Hyperlink"/>
@@ -11878,7 +12795,7 @@
         </w:rPr>
         <w:t xml:space="preserve">Onde deveria estar publicado. </w:t>
       </w:r>
-      <w:hyperlink w:history="1" r:id="rIdnay8rj2wmnwihx5zopi_c">
+      <w:hyperlink w:history="1" r:id="rId9eixaoworm3y-qnicyans">
         <w:r>
           <w:rPr>
             <w:rStyle w:val="Hyperlink"/>
@@ -12079,7 +12996,7 @@
         </w:rPr>
         <w:t xml:space="preserve"> Canal: </w:t>
       </w:r>
-      <w:hyperlink w:history="1" r:id="rIdyw_wlpycqaijxhe1yu8t-">
+      <w:hyperlink w:history="1" r:id="rIdjljtcovgi3dhgylpzdlus">
         <w:r>
           <w:rPr>
             <w:rStyle w:val="Hyperlink"/>
@@ -12145,7 +13062,7 @@
         </w:rPr>
         <w:t xml:space="preserve"> Canal: </w:t>
       </w:r>
-      <w:hyperlink w:history="1" r:id="rIdg1ague9xavnmaeyj2kfag">
+      <w:hyperlink w:history="1" r:id="rIdiltu3pbkhpucbtmdxrvey">
         <w:r>
           <w:rPr>
             <w:rStyle w:val="Hyperlink"/>
@@ -12249,7 +13166,7 @@
         </w:rPr>
         <w:t xml:space="preserve"> Canal: </w:t>
       </w:r>
-      <w:hyperlink w:history="1" r:id="rIdrdowpxztab3euzmcxrwna">
+      <w:hyperlink w:history="1" r:id="rIdqwc2onhziws5y4g0h411t">
         <w:r>
           <w:rPr>
             <w:rStyle w:val="Hyperlink"/>

</xml_diff>

<commit_message>
piso de 10% do artigo 6 da Resolucao CNAS/MDS 202/2025 embutido na fonte federal; leitura do Quadro de Detalhamento de Despesas dentro dos anexos da LOA; aferição por fonte de recurso e por competência mensal
</commit_message>
<xml_diff>
--- a/relatorios/Parecer_Fiscalizacao_2026.docx
+++ b/relatorios/Parecer_Fiscalizacao_2026.docx
@@ -291,7 +291,7 @@
         </w:rPr>
         <w:t xml:space="preserve">. Documento consultado em: </w:t>
       </w:r>
-      <w:hyperlink w:history="1" r:id="rIdvfa2k41zmtibdrij4a7kx">
+      <w:hyperlink w:history="1" r:id="rIdslex4-l0csd_gc0s3e3jn">
         <w:r>
           <w:rPr>
             <w:rStyle w:val="Hyperlink"/>
@@ -2210,7 +2210,7 @@
         </w:rPr>
         <w:t xml:space="preserve">Deveria estar em: </w:t>
       </w:r>
-      <w:hyperlink w:history="1" r:id="rIdovnl04ah52gqpl3kaerox">
+      <w:hyperlink w:history="1" r:id="rIdtccjweiqmvbw6tiahzrzm">
         <w:r>
           <w:rPr>
             <w:rStyle w:val="Hyperlink"/>
@@ -2284,7 +2284,7 @@
         </w:rPr>
         <w:t xml:space="preserve">Deveria estar em: </w:t>
       </w:r>
-      <w:hyperlink w:history="1" r:id="rIduvwmi99ktxol-bmdyssdl">
+      <w:hyperlink w:history="1" r:id="rIdgzpunhkyg49tcxd5jwxbs">
         <w:r>
           <w:rPr>
             <w:rStyle w:val="Hyperlink"/>
@@ -2358,7 +2358,7 @@
         </w:rPr>
         <w:t xml:space="preserve">Deveria estar em: </w:t>
       </w:r>
-      <w:hyperlink w:history="1" r:id="rIdqtxtpnkyiqbxk-ks3e6vv">
+      <w:hyperlink w:history="1" r:id="rIdq2gjyq1rsgfrwzpbt8n5n">
         <w:r>
           <w:rPr>
             <w:rStyle w:val="Hyperlink"/>
@@ -2432,7 +2432,7 @@
         </w:rPr>
         <w:t xml:space="preserve">Deveria estar em: </w:t>
       </w:r>
-      <w:hyperlink w:history="1" r:id="rIdvfl--wh3qw3cl9-it6rlp">
+      <w:hyperlink w:history="1" r:id="rIda2gb_767mwbyo5qli1dpj">
         <w:r>
           <w:rPr>
             <w:rStyle w:val="Hyperlink"/>
@@ -2506,7 +2506,7 @@
         </w:rPr>
         <w:t xml:space="preserve">Deveria estar em: </w:t>
       </w:r>
-      <w:hyperlink w:history="1" r:id="rIdjsgmewmcdubqiod916f_i">
+      <w:hyperlink w:history="1" r:id="rIdkg4tkdvbkvvqir91banp8">
         <w:r>
           <w:rPr>
             <w:rStyle w:val="Hyperlink"/>
@@ -2580,7 +2580,7 @@
         </w:rPr>
         <w:t xml:space="preserve">Deveria estar em: </w:t>
       </w:r>
-      <w:hyperlink w:history="1" r:id="rId-mj42fjpuj4br8kczbyej">
+      <w:hyperlink w:history="1" r:id="rIden08ggccfdzlxod0agc9x">
         <w:r>
           <w:rPr>
             <w:rStyle w:val="Hyperlink"/>
@@ -4900,7 +4900,7 @@
         </w:rPr>
         <w:t xml:space="preserve">A versão interativa desta trilha, com o detalhe de cada contrato, está em </w:t>
       </w:r>
-      <w:hyperlink w:history="1" r:id="rId4kxmiutatjh3whp1frese">
+      <w:hyperlink w:history="1" r:id="rIdbpq-s8jylrpgi6bgmqfdh">
         <w:r>
           <w:rPr>
             <w:rStyle w:val="Hyperlink"/>
@@ -5817,7 +5817,7 @@
         </w:rPr>
         <w:t xml:space="preserve">A versão didática desta trilha, feita para leitura por quem não é da área, está em </w:t>
       </w:r>
-      <w:hyperlink w:history="1" r:id="rIdrvr2d4qdiyyqqgjmjd_my">
+      <w:hyperlink w:history="1" r:id="rIdmwypj5ypmexeysqurzijk">
         <w:r>
           <w:rPr>
             <w:rStyle w:val="Hyperlink"/>
@@ -5951,7 +5951,7 @@
         </w:rPr>
         <w:t xml:space="preserve">Diário Oficial do Município, Edição 8830, última edição publicada, 29/07/2026 — </w:t>
       </w:r>
-      <w:hyperlink w:history="1" r:id="rId-g2m9gjvnqmb5sqjcrqll">
+      <w:hyperlink w:history="1" r:id="rIdldfqw3n9l4etlgomkuxgm">
         <w:r>
           <w:rPr>
             <w:rStyle w:val="Hyperlink"/>
@@ -5979,7 +5979,7 @@
         </w:rPr>
         <w:t xml:space="preserve">Acervo do Diário Oficial coletado, 161 eventos entre 2025 e 2026, com digest de cada edição — </w:t>
       </w:r>
-      <w:hyperlink w:history="1" r:id="rIdoawnp_2cymnpfouj93scv">
+      <w:hyperlink w:history="1" r:id="rIdwptu2na5iv2nqc2orhalc">
         <w:r>
           <w:rPr>
             <w:rStyle w:val="Hyperlink"/>
@@ -6016,7 +6016,7 @@
         </w:rPr>
         <w:t xml:space="preserve">Onde deveria estar publicado. </w:t>
       </w:r>
-      <w:hyperlink w:history="1" r:id="rIdcqcf9lbwhpf_roaxddb8c">
+      <w:hyperlink w:history="1" r:id="rIdr1l5qggh9wm_vbn9yxibw">
         <w:r>
           <w:rPr>
             <w:rStyle w:val="Hyperlink"/>
@@ -6243,7 +6243,7 @@
         </w:rPr>
         <w:t xml:space="preserve">Acervo do Diário Oficial coletado, 161 eventos entre 2025 e 2026, com digest de cada edição — </w:t>
       </w:r>
-      <w:hyperlink w:history="1" r:id="rIdw3otu0qgm3htufxjn2fuw">
+      <w:hyperlink w:history="1" r:id="rIdzafat3emtasi6-9lnkwkw">
         <w:r>
           <w:rPr>
             <w:rStyle w:val="Hyperlink"/>
@@ -6271,7 +6271,7 @@
         </w:rPr>
         <w:t xml:space="preserve">Sítio próprio do Conselho, sem documento posterior a dezembro de 2023 — </w:t>
       </w:r>
-      <w:hyperlink w:history="1" r:id="rIdmhdssm3z7t--oea3rrev6">
+      <w:hyperlink w:history="1" r:id="rIdoiw3d8i6_4tejbudtck3n">
         <w:r>
           <w:rPr>
             <w:rStyle w:val="Hyperlink"/>
@@ -6308,7 +6308,7 @@
         </w:rPr>
         <w:t xml:space="preserve">Onde deveria estar publicado. </w:t>
       </w:r>
-      <w:hyperlink w:history="1" r:id="rIddy2lnfa9uueu-vaprdhat">
+      <w:hyperlink w:history="1" r:id="rIdbmc6ttc3xtmvpaumk4la4">
         <w:r>
           <w:rPr>
             <w:rStyle w:val="Hyperlink"/>
@@ -6328,7 +6328,7 @@
         </w:rPr>
         <w:t xml:space="preserve">; </w:t>
       </w:r>
-      <w:hyperlink w:history="1" r:id="rIdewhopl0dbtyll8riwgzik">
+      <w:hyperlink w:history="1" r:id="rIdbcl8tef7x6vqpwto6wmjj">
         <w:r>
           <w:rPr>
             <w:rStyle w:val="Hyperlink"/>
@@ -6568,7 +6568,7 @@
         </w:rPr>
         <w:t xml:space="preserve">Lei Orçamentária Anual 11.590/2026, anexos, Diário Oficial do Município, Edição 8697, de 09/01/2026, Edição Extra — </w:t>
       </w:r>
-      <w:hyperlink w:history="1" r:id="rId2ypnoorcnkudzraayhsee">
+      <w:hyperlink w:history="1" r:id="rIdxumzslnsjlhrpvqo5-q7f">
         <w:r>
           <w:rPr>
             <w:rStyle w:val="Hyperlink"/>
@@ -6596,7 +6596,7 @@
         </w:rPr>
         <w:t xml:space="preserve">Lei Orçamentária Anual 11.315/2025, anexos, Diário Oficial do Município, de 07/01/2025 — </w:t>
       </w:r>
-      <w:hyperlink w:history="1" r:id="rId7optbdl1qbhv4tzl04uz3">
+      <w:hyperlink w:history="1" r:id="rIdeqf3iwaudx2ggcw6qmyrw">
         <w:r>
           <w:rPr>
             <w:rStyle w:val="Hyperlink"/>
@@ -6633,7 +6633,7 @@
         </w:rPr>
         <w:t xml:space="preserve">Onde deveria estar publicado. </w:t>
       </w:r>
-      <w:hyperlink w:history="1" r:id="rIdwysvriu4fvnnolsuo5d-n">
+      <w:hyperlink w:history="1" r:id="rIdmcqiw1-aouynpejpd-6a8">
         <w:r>
           <w:rPr>
             <w:rStyle w:val="Hyperlink"/>
@@ -6653,7 +6653,7 @@
         </w:rPr>
         <w:t xml:space="preserve">; </w:t>
       </w:r>
-      <w:hyperlink w:history="1" r:id="rIdf8yds8xvrnczsgdrwf7pq">
+      <w:hyperlink w:history="1" r:id="rId4cakhqkkkgicgfhse-qd3">
         <w:r>
           <w:rPr>
             <w:rStyle w:val="Hyperlink"/>
@@ -6882,7 +6882,7 @@
         </w:rPr>
         <w:t xml:space="preserve">Acervo do Diário Oficial coletado, 161 eventos entre 2025 e 2026, com digest de cada edição — </w:t>
       </w:r>
-      <w:hyperlink w:history="1" r:id="rId9yfq8r8gj0hhmlkecta59">
+      <w:hyperlink w:history="1" r:id="rId4bupqp5wn1d8y39dtgbub">
         <w:r>
           <w:rPr>
             <w:rStyle w:val="Hyperlink"/>
@@ -6919,7 +6919,7 @@
         </w:rPr>
         <w:t xml:space="preserve">Onde deveria estar publicado. </w:t>
       </w:r>
-      <w:hyperlink w:history="1" r:id="rIdbtdzo3xtmweelsepu6cnq">
+      <w:hyperlink w:history="1" r:id="rIdenhsflcl2sjwk1mtzgizj">
         <w:r>
           <w:rPr>
             <w:rStyle w:val="Hyperlink"/>
@@ -7154,7 +7154,7 @@
         </w:rPr>
         <w:t xml:space="preserve">Lei Orçamentária Anual 11.590/2026, anexos, Diário Oficial do Município, Edição 8697, de 09/01/2026, Edição Extra — </w:t>
       </w:r>
-      <w:hyperlink w:history="1" r:id="rIdsjp6xdjizq5tn4cn5hw9x">
+      <w:hyperlink w:history="1" r:id="rId7tftvvn42rbhypw1wwsts">
         <w:r>
           <w:rPr>
             <w:rStyle w:val="Hyperlink"/>
@@ -7182,7 +7182,7 @@
         </w:rPr>
         <w:t xml:space="preserve">Lei municipal 7.531/1995 — </w:t>
       </w:r>
-      <w:hyperlink w:history="1" r:id="rIdj17kynqk3fwgm4z794r_c">
+      <w:hyperlink w:history="1" r:id="rId-gmez8onzlzzkegqjz34k">
         <w:r>
           <w:rPr>
             <w:rStyle w:val="Hyperlink"/>
@@ -7219,7 +7219,7 @@
         </w:rPr>
         <w:t xml:space="preserve">Onde deveria estar publicado. </w:t>
       </w:r>
-      <w:hyperlink w:history="1" r:id="rIdgryvcwoqth13v1wn3tjkz">
+      <w:hyperlink w:history="1" r:id="rIdnfz881yl2isiaog4rlk7n">
         <w:r>
           <w:rPr>
             <w:rStyle w:val="Hyperlink"/>
@@ -7239,7 +7239,7 @@
         </w:rPr>
         <w:t xml:space="preserve">; </w:t>
       </w:r>
-      <w:hyperlink w:history="1" r:id="rIdpomlxplsaceaie5qdf5hy">
+      <w:hyperlink w:history="1" r:id="rIdzhfhvw6fv5kos-motjdis">
         <w:r>
           <w:rPr>
             <w:rStyle w:val="Hyperlink"/>
@@ -7406,7 +7406,7 @@
           <w:sz w:val="22"/>
           <w:szCs w:val="22"/>
         </w:rPr>
-        <w:t xml:space="preserve">IGD-01 — Piso de 10% do Índice de Gestão Descentralizada ao controle social sem execução</w:t>
+        <w:t xml:space="preserve">IGD-01 — Piso de 10% do Índice de Gestão Descentralizada cumprido em apenas 22.6%</w:t>
       </w:r>
     </w:p>
     <w:p>
@@ -7468,7 +7468,7 @@
         </w:rPr>
         <w:t xml:space="preserve">Lei Orçamentária Anual 11.590/2026, anexos, Diário Oficial do Município, Edição 8697, de 09/01/2026, Edição Extra — </w:t>
       </w:r>
-      <w:hyperlink w:history="1" r:id="rIdpo-en_axni1wcivkypyq1">
+      <w:hyperlink w:history="1" r:id="rIdzgp9xtusmvll0bbj7exyp">
         <w:r>
           <w:rPr>
             <w:rStyle w:val="Hyperlink"/>
@@ -7496,7 +7496,7 @@
         </w:rPr>
         <w:t xml:space="preserve">Resolução CNAS/MDS 202/2025, Diário Oficial da União de 28/07/2025, Edição 140, Seção 1, Página 87 — </w:t>
       </w:r>
-      <w:hyperlink w:history="1" r:id="rIdrw5p6xfbp1akitkckvxad">
+      <w:hyperlink w:history="1" r:id="rIdl9aizxwncva83vm71twjm">
         <w:r>
           <w:rPr>
             <w:rStyle w:val="Hyperlink"/>
@@ -7533,7 +7533,7 @@
         </w:rPr>
         <w:t xml:space="preserve">Onde deveria estar publicado. </w:t>
       </w:r>
-      <w:hyperlink w:history="1" r:id="rIddpu8l1pjyhr8kkxohzejz">
+      <w:hyperlink w:history="1" r:id="rIdohj6bvhtucrjnnoxf3wxy">
         <w:r>
           <w:rPr>
             <w:rStyle w:val="Hyperlink"/>
@@ -7553,7 +7553,7 @@
         </w:rPr>
         <w:t xml:space="preserve">; </w:t>
       </w:r>
-      <w:hyperlink w:history="1" r:id="rId9pozyufzy1ovgthbn6z84">
+      <w:hyperlink w:history="1" r:id="rIdxixiqsnuguf_gaj9l_caa">
         <w:r>
           <w:rPr>
             <w:rStyle w:val="Hyperlink"/>
@@ -7621,7 +7621,7 @@
           <w:sz w:val="22"/>
           <w:szCs w:val="22"/>
         </w:rPr>
-        <w:t xml:space="preserve">Base do Índice de Gestão Descentralizada nos decretos de crédito de 2026: R$ 706.707,15. Devido ao controle social: R$ 70.670,71. Executado: R$ 0,00. Percentual extraido do corpus, nao digitado.</w:t>
+        <w:t xml:space="preserve">Base do Índice: R$ 706.707,15. Devido ao controle social: R$ 70.670,72. O Quadro de Detalhamento de Despesas reserva ao Conselho R$ 256.000,00 na ação 3650.0824401082.591, mas apenas R$ 16.000,00 na fonte 1660, que é a fonte federal onde o Índice trafega; R$ 240.000,00 vêm da fonte estadual 1661. Faltam R$ 54.670,72. O artigo 6º admite outras fontes de financiamento, mas elas não substituem o piso federal. E o percentual incide sobre o repasse mensal, não sobre o total anual: não há demonstrativo mensal publicado.</w:t>
       </w:r>
       <w:r>
         <w:rPr>
@@ -7805,7 +7805,7 @@
         </w:rPr>
         <w:t xml:space="preserve">Resolução CNAS/MDS 202/2025, Diário Oficial da União de 28/07/2025, Edição 140, Seção 1, Página 87 — </w:t>
       </w:r>
-      <w:hyperlink w:history="1" r:id="rIdjgpw5qfdg455saljo9xme">
+      <w:hyperlink w:history="1" r:id="rIdlklus52wxq5wykijfrj0j">
         <w:r>
           <w:rPr>
             <w:rStyle w:val="Hyperlink"/>
@@ -7842,7 +7842,7 @@
         </w:rPr>
         <w:t xml:space="preserve">Onde deveria estar publicado. </w:t>
       </w:r>
-      <w:hyperlink w:history="1" r:id="rIdrgri1lcalgbiwek0zjbt-">
+      <w:hyperlink w:history="1" r:id="rIdiiklvogv6orxrlwtdrtdj">
         <w:r>
           <w:rPr>
             <w:rStyle w:val="Hyperlink"/>
@@ -8080,7 +8080,7 @@
         </w:rPr>
         <w:t xml:space="preserve">Sítio próprio do Conselho, sem documento posterior a dezembro de 2023 — </w:t>
       </w:r>
-      <w:hyperlink w:history="1" r:id="rIdtzsg4ozrdcd2tfefiecac">
+      <w:hyperlink w:history="1" r:id="rIdngso7-i5vzw1d1olv1ncw">
         <w:r>
           <w:rPr>
             <w:rStyle w:val="Hyperlink"/>
@@ -8117,7 +8117,7 @@
         </w:rPr>
         <w:t xml:space="preserve">Onde deveria estar publicado. </w:t>
       </w:r>
-      <w:hyperlink w:history="1" r:id="rIdem1ztp6uxuj5c2vcjhyno">
+      <w:hyperlink w:history="1" r:id="rId0yyaykz-mzxxjyrt7thyt">
         <w:r>
           <w:rPr>
             <w:rStyle w:val="Hyperlink"/>
@@ -8137,7 +8137,7 @@
         </w:rPr>
         <w:t xml:space="preserve">; </w:t>
       </w:r>
-      <w:hyperlink w:history="1" r:id="rIdspjudslgpwqld3moehrhm">
+      <w:hyperlink w:history="1" r:id="rIda8zv5rkjsrbxm2-mtva2a">
         <w:r>
           <w:rPr>
             <w:rStyle w:val="Hyperlink"/>
@@ -8360,7 +8360,7 @@
         </w:rPr>
         <w:t xml:space="preserve">Acervo do Diário Oficial coletado, 161 eventos entre 2025 e 2026, com digest de cada edição — </w:t>
       </w:r>
-      <w:hyperlink w:history="1" r:id="rIdfdfdb-gvckmz8suvxgazz">
+      <w:hyperlink w:history="1" r:id="rIdurrqodiidlkca-iyawf7i">
         <w:r>
           <w:rPr>
             <w:rStyle w:val="Hyperlink"/>
@@ -8397,7 +8397,7 @@
         </w:rPr>
         <w:t xml:space="preserve">Onde deveria estar publicado. </w:t>
       </w:r>
-      <w:hyperlink w:history="1" r:id="rId5pca9ncejpylv3mok2s90">
+      <w:hyperlink w:history="1" r:id="rId9hoxyqnmamvqhafsgtymm">
         <w:r>
           <w:rPr>
             <w:rStyle w:val="Hyperlink"/>
@@ -8417,7 +8417,7 @@
         </w:rPr>
         <w:t xml:space="preserve">; </w:t>
       </w:r>
-      <w:hyperlink w:history="1" r:id="rIdprcwkc_vv6v9gpgmmcnaa">
+      <w:hyperlink w:history="1" r:id="rIdssyn2f7i3hgq6crmbev3b">
         <w:r>
           <w:rPr>
             <w:rStyle w:val="Hyperlink"/>
@@ -8640,7 +8640,7 @@
         </w:rPr>
         <w:t xml:space="preserve">Resolução CNAS/MDS 202/2025, Diário Oficial da União de 28/07/2025, Edição 140, Seção 1, Página 87 — </w:t>
       </w:r>
-      <w:hyperlink w:history="1" r:id="rId24a_dm037sy0w8xlhcodp">
+      <w:hyperlink w:history="1" r:id="rIddiffv5yqjbh3swzmcshch">
         <w:r>
           <w:rPr>
             <w:rStyle w:val="Hyperlink"/>
@@ -8677,7 +8677,7 @@
         </w:rPr>
         <w:t xml:space="preserve">Onde deveria estar publicado. </w:t>
       </w:r>
-      <w:hyperlink w:history="1" r:id="rId59jf2t_kxpwjfc2rj5p_g">
+      <w:hyperlink w:history="1" r:id="rIdmpw0wktsughzkljlfpeqq">
         <w:r>
           <w:rPr>
             <w:rStyle w:val="Hyperlink"/>
@@ -8898,7 +8898,7 @@
         </w:rPr>
         <w:t xml:space="preserve">Acervo do Diário Oficial coletado, 161 eventos entre 2025 e 2026, com digest de cada edição — </w:t>
       </w:r>
-      <w:hyperlink w:history="1" r:id="rId9ytex6x18whku_akmbhnb">
+      <w:hyperlink w:history="1" r:id="rIdb9yc0beexrfj9ndf2r5mf">
         <w:r>
           <w:rPr>
             <w:rStyle w:val="Hyperlink"/>
@@ -8935,7 +8935,7 @@
         </w:rPr>
         <w:t xml:space="preserve">Onde deveria estar publicado. </w:t>
       </w:r>
-      <w:hyperlink w:history="1" r:id="rIdxpxnmgwsfm88ndfma2u5d">
+      <w:hyperlink w:history="1" r:id="rIdh2wstm4nn22eds0dul2be">
         <w:r>
           <w:rPr>
             <w:rStyle w:val="Hyperlink"/>
@@ -9175,7 +9175,7 @@
         </w:rPr>
         <w:t xml:space="preserve">Lei Orçamentária Anual 11.590/2026, anexos, Diário Oficial do Município, Edição 8697, de 09/01/2026, Edição Extra — </w:t>
       </w:r>
-      <w:hyperlink w:history="1" r:id="rIdw_0gpl33glcm4vbhrerig">
+      <w:hyperlink w:history="1" r:id="rIdm4lvqmc3jlktyjeflavoc">
         <w:r>
           <w:rPr>
             <w:rStyle w:val="Hyperlink"/>
@@ -9212,7 +9212,7 @@
         </w:rPr>
         <w:t xml:space="preserve">Onde deveria estar publicado. </w:t>
       </w:r>
-      <w:hyperlink w:history="1" r:id="rIdeiht317hyxsb7ok551uzh">
+      <w:hyperlink w:history="1" r:id="rIdmae4mdkmo5oi1g284hchc">
         <w:r>
           <w:rPr>
             <w:rStyle w:val="Hyperlink"/>
@@ -9441,7 +9441,7 @@
         </w:rPr>
         <w:t xml:space="preserve">Lei Orçamentária Anual 11.590/2026, anexos, Diário Oficial do Município, Edição 8697, de 09/01/2026, Edição Extra — </w:t>
       </w:r>
-      <w:hyperlink w:history="1" r:id="rId1qclxlq24cbsupnjhrqpi">
+      <w:hyperlink w:history="1" r:id="rIdtbphra8m8xbecvtwwo6mr">
         <w:r>
           <w:rPr>
             <w:rStyle w:val="Hyperlink"/>
@@ -9478,7 +9478,7 @@
         </w:rPr>
         <w:t xml:space="preserve">Onde deveria estar publicado. </w:t>
       </w:r>
-      <w:hyperlink w:history="1" r:id="rIdi-b7oh_vbdj4mepthffws">
+      <w:hyperlink w:history="1" r:id="rIdb_an1vrm6bw4vtmxi_siu">
         <w:r>
           <w:rPr>
             <w:rStyle w:val="Hyperlink"/>
@@ -9701,7 +9701,7 @@
         </w:rPr>
         <w:t xml:space="preserve">Lei Orçamentária Anual 11.590/2026, anexos, Diário Oficial do Município, Edição 8697, de 09/01/2026, Edição Extra — </w:t>
       </w:r>
-      <w:hyperlink w:history="1" r:id="rIdtny3_wftbbp2yxlpsv4rq">
+      <w:hyperlink w:history="1" r:id="rIdp8mjjfjlrqsk_vikkyiip">
         <w:r>
           <w:rPr>
             <w:rStyle w:val="Hyperlink"/>
@@ -9729,7 +9729,7 @@
         </w:rPr>
         <w:t xml:space="preserve">Lei municipal 9.009/2010 — </w:t>
       </w:r>
-      <w:hyperlink w:history="1" r:id="rIdm0d-wzgodfqgnua2vgfay">
+      <w:hyperlink w:history="1" r:id="rIdilq0x74g8jlfk7ijgx0dn">
         <w:r>
           <w:rPr>
             <w:rStyle w:val="Hyperlink"/>
@@ -9766,7 +9766,7 @@
         </w:rPr>
         <w:t xml:space="preserve">Onde deveria estar publicado. </w:t>
       </w:r>
-      <w:hyperlink w:history="1" r:id="rIdntgyyyed2wa4h4kyvuppi">
+      <w:hyperlink w:history="1" r:id="rIdlaqt8oynf3lahcsx8afbl">
         <w:r>
           <w:rPr>
             <w:rStyle w:val="Hyperlink"/>
@@ -9995,7 +9995,7 @@
         </w:rPr>
         <w:t xml:space="preserve">Lei Orçamentária Anual 11.590/2026, anexos, Diário Oficial do Município, Edição 8697, de 09/01/2026, Edição Extra — </w:t>
       </w:r>
-      <w:hyperlink w:history="1" r:id="rIdabf1mswaefym9ohds6lml">
+      <w:hyperlink w:history="1" r:id="rIdmxhdfkmpjmauloflmozda">
         <w:r>
           <w:rPr>
             <w:rStyle w:val="Hyperlink"/>
@@ -10032,7 +10032,7 @@
         </w:rPr>
         <w:t xml:space="preserve">Onde deveria estar publicado. </w:t>
       </w:r>
-      <w:hyperlink w:history="1" r:id="rIdbrjn1u1z4rteqvurrjyt_">
+      <w:hyperlink w:history="1" r:id="rIdbww8qldmclnbzpigfedt4">
         <w:r>
           <w:rPr>
             <w:rStyle w:val="Hyperlink"/>
@@ -10276,7 +10276,7 @@
         </w:rPr>
         <w:t xml:space="preserve">Acervo do Diário Oficial coletado, 161 eventos entre 2025 e 2026, com digest de cada edição — </w:t>
       </w:r>
-      <w:hyperlink w:history="1" r:id="rIdcsl7kn-pyupjwtwlickhb">
+      <w:hyperlink w:history="1" r:id="rIdklvzrstjmedxw4axdtoh2">
         <w:r>
           <w:rPr>
             <w:rStyle w:val="Hyperlink"/>
@@ -10313,7 +10313,7 @@
         </w:rPr>
         <w:t xml:space="preserve">Onde deveria estar publicado. </w:t>
       </w:r>
-      <w:hyperlink w:history="1" r:id="rIdodv-yn8jbdjpv2moyhhsy">
+      <w:hyperlink w:history="1" r:id="rIdrqvncm_qxio399yci8od5">
         <w:r>
           <w:rPr>
             <w:rStyle w:val="Hyperlink"/>
@@ -10540,7 +10540,7 @@
         </w:rPr>
         <w:t xml:space="preserve">Acervo do Diário Oficial coletado, 161 eventos entre 2025 e 2026, com digest de cada edição — </w:t>
       </w:r>
-      <w:hyperlink w:history="1" r:id="rIdny16-1-2hnoywlch8adqd">
+      <w:hyperlink w:history="1" r:id="rIdxbqb68u4uj6wjwx_kjhfi">
         <w:r>
           <w:rPr>
             <w:rStyle w:val="Hyperlink"/>
@@ -10577,7 +10577,7 @@
         </w:rPr>
         <w:t xml:space="preserve">Onde deveria estar publicado. </w:t>
       </w:r>
-      <w:hyperlink w:history="1" r:id="rIdqwbtxsjqsdyccvegh0h9c">
+      <w:hyperlink w:history="1" r:id="rIdgifvshia8zpr1zatpl9mk">
         <w:r>
           <w:rPr>
             <w:rStyle w:val="Hyperlink"/>
@@ -10597,7 +10597,7 @@
         </w:rPr>
         <w:t xml:space="preserve">; </w:t>
       </w:r>
-      <w:hyperlink w:history="1" r:id="rId7cep6kpxzmltgqpnv6rf1">
+      <w:hyperlink w:history="1" r:id="rId_11v0j8nqmk8v_jmgdfel">
         <w:r>
           <w:rPr>
             <w:rStyle w:val="Hyperlink"/>
@@ -10826,7 +10826,7 @@
         </w:rPr>
         <w:t xml:space="preserve">Lei municipal 7.531/1995 — </w:t>
       </w:r>
-      <w:hyperlink w:history="1" r:id="rIdcj3gabihm1mhkpdw9jjwy">
+      <w:hyperlink w:history="1" r:id="rIdmjtqfg42qzx7g6oppemzp">
         <w:r>
           <w:rPr>
             <w:rStyle w:val="Hyperlink"/>
@@ -10863,7 +10863,7 @@
         </w:rPr>
         <w:t xml:space="preserve">Onde deveria estar publicado. </w:t>
       </w:r>
-      <w:hyperlink w:history="1" r:id="rIduq4bg3r-tp29fh-ts4084">
+      <w:hyperlink w:history="1" r:id="rIdsdel5zxpu2zuatt61updd">
         <w:r>
           <w:rPr>
             <w:rStyle w:val="Hyperlink"/>
@@ -10883,7 +10883,7 @@
         </w:rPr>
         <w:t xml:space="preserve">; </w:t>
       </w:r>
-      <w:hyperlink w:history="1" r:id="rIdozdws5hkbm23jhetc_j5f">
+      <w:hyperlink w:history="1" r:id="rIdt03075ps7cexhaxn3u8j2">
         <w:r>
           <w:rPr>
             <w:rStyle w:val="Hyperlink"/>
@@ -11104,7 +11104,7 @@
         </w:rPr>
         <w:t xml:space="preserve">Acervo do Diário Oficial coletado, 161 eventos entre 2025 e 2026, com digest de cada edição — </w:t>
       </w:r>
-      <w:hyperlink w:history="1" r:id="rId67qkudv6yrci6gqmxr_e8">
+      <w:hyperlink w:history="1" r:id="rIdtitlqypesbc-skptc3ofn">
         <w:r>
           <w:rPr>
             <w:rStyle w:val="Hyperlink"/>
@@ -11141,7 +11141,7 @@
         </w:rPr>
         <w:t xml:space="preserve">Onde deveria estar publicado. </w:t>
       </w:r>
-      <w:hyperlink w:history="1" r:id="rIdsa_sqqv7iytvheupvuljt">
+      <w:hyperlink w:history="1" r:id="rIdftcfr0uivsijan-m6iyxj">
         <w:r>
           <w:rPr>
             <w:rStyle w:val="Hyperlink"/>
@@ -11362,7 +11362,7 @@
         </w:rPr>
         <w:t xml:space="preserve">Acervo do Diário Oficial coletado, 161 eventos entre 2025 e 2026, com digest de cada edição — </w:t>
       </w:r>
-      <w:hyperlink w:history="1" r:id="rIdit4thai9sdbjyztpxw9ry">
+      <w:hyperlink w:history="1" r:id="rIdnflavqhhyikaufyej6_c_">
         <w:r>
           <w:rPr>
             <w:rStyle w:val="Hyperlink"/>
@@ -11399,7 +11399,7 @@
         </w:rPr>
         <w:t xml:space="preserve">Onde deveria estar publicado. </w:t>
       </w:r>
-      <w:hyperlink w:history="1" r:id="rIdcv4ip9na5rd9wbgkma6yo">
+      <w:hyperlink w:history="1" r:id="rIdel-b2m7w1_2l7abr7zn9b">
         <w:r>
           <w:rPr>
             <w:rStyle w:val="Hyperlink"/>
@@ -11639,7 +11639,7 @@
         </w:rPr>
         <w:t xml:space="preserve">Acervo do Diário Oficial coletado, 161 eventos entre 2025 e 2026, com digest de cada edição — </w:t>
       </w:r>
-      <w:hyperlink w:history="1" r:id="rIdu4mux-9s3xlhm1kteqjst">
+      <w:hyperlink w:history="1" r:id="rIdzafla8eogyiql5yu6gx70">
         <w:r>
           <w:rPr>
             <w:rStyle w:val="Hyperlink"/>
@@ -11676,7 +11676,7 @@
         </w:rPr>
         <w:t xml:space="preserve">Onde deveria estar publicado. </w:t>
       </w:r>
-      <w:hyperlink w:history="1" r:id="rIdj77payc2itf_3edfpevxz">
+      <w:hyperlink w:history="1" r:id="rId2jgl1wbwm3sglihcfrqri">
         <w:r>
           <w:rPr>
             <w:rStyle w:val="Hyperlink"/>
@@ -11897,7 +11897,7 @@
         </w:rPr>
         <w:t xml:space="preserve">Acervo do Diário Oficial coletado, 161 eventos entre 2025 e 2026, com digest de cada edição — </w:t>
       </w:r>
-      <w:hyperlink w:history="1" r:id="rId1_ncmy6dmzua1r3zqq6vo">
+      <w:hyperlink w:history="1" r:id="rIdq33pxs1khbq5e3khvijcr">
         <w:r>
           <w:rPr>
             <w:rStyle w:val="Hyperlink"/>
@@ -11934,7 +11934,7 @@
         </w:rPr>
         <w:t xml:space="preserve">Onde deveria estar publicado. </w:t>
       </w:r>
-      <w:hyperlink w:history="1" r:id="rIdu4toaryrqfnc7ufpe3xam">
+      <w:hyperlink w:history="1" r:id="rIdsqftuxsev1cxmmhaehjpi">
         <w:r>
           <w:rPr>
             <w:rStyle w:val="Hyperlink"/>
@@ -12174,7 +12174,7 @@
         </w:rPr>
         <w:t xml:space="preserve">Lei Orçamentária Anual 11.590/2026, anexos, Diário Oficial do Município, Edição 8697, de 09/01/2026, Edição Extra — </w:t>
       </w:r>
-      <w:hyperlink w:history="1" r:id="rIdvopbiyh5xywagyaz5skxy">
+      <w:hyperlink w:history="1" r:id="rIdaqkjm6qm0mgpwhryacxy7">
         <w:r>
           <w:rPr>
             <w:rStyle w:val="Hyperlink"/>
@@ -12202,7 +12202,7 @@
         </w:rPr>
         <w:t xml:space="preserve">Acervo do Diário Oficial coletado, 161 eventos entre 2025 e 2026, com digest de cada edição — </w:t>
       </w:r>
-      <w:hyperlink w:history="1" r:id="rIdfdl2mmfnbzlq6tnexq0n_">
+      <w:hyperlink w:history="1" r:id="rIde6crjndofji8zeb0p_szd">
         <w:r>
           <w:rPr>
             <w:rStyle w:val="Hyperlink"/>
@@ -12239,7 +12239,7 @@
         </w:rPr>
         <w:t xml:space="preserve">Onde deveria estar publicado. </w:t>
       </w:r>
-      <w:hyperlink w:history="1" r:id="rIdhrkkorgibkf5zq66xnoma">
+      <w:hyperlink w:history="1" r:id="rIdxc9lf1g26cl_f0vdltgrd">
         <w:r>
           <w:rPr>
             <w:rStyle w:val="Hyperlink"/>
@@ -12483,7 +12483,7 @@
         </w:rPr>
         <w:t xml:space="preserve">Acervo do Diário Oficial coletado, 161 eventos entre 2025 e 2026, com digest de cada edição — </w:t>
       </w:r>
-      <w:hyperlink w:history="1" r:id="rId4blra_zcogeu9vmli10-c">
+      <w:hyperlink w:history="1" r:id="rIdmko3seiv4925y2pw0k8ul">
         <w:r>
           <w:rPr>
             <w:rStyle w:val="Hyperlink"/>
@@ -12520,7 +12520,7 @@
         </w:rPr>
         <w:t xml:space="preserve">Onde deveria estar publicado. </w:t>
       </w:r>
-      <w:hyperlink w:history="1" r:id="rIdtbptiyoen9evbdvzse6yq">
+      <w:hyperlink w:history="1" r:id="rIdvovbeu8zd5tpykfhisxp6">
         <w:r>
           <w:rPr>
             <w:rStyle w:val="Hyperlink"/>
@@ -12758,7 +12758,7 @@
         </w:rPr>
         <w:t xml:space="preserve">Acervo do Diário Oficial coletado, 161 eventos entre 2025 e 2026, com digest de cada edição — </w:t>
       </w:r>
-      <w:hyperlink w:history="1" r:id="rIdobyys10ogaldagc5xqjbh">
+      <w:hyperlink w:history="1" r:id="rIdpmc9bxziwaktil8_mipmu">
         <w:r>
           <w:rPr>
             <w:rStyle w:val="Hyperlink"/>
@@ -12795,7 +12795,7 @@
         </w:rPr>
         <w:t xml:space="preserve">Onde deveria estar publicado. </w:t>
       </w:r>
-      <w:hyperlink w:history="1" r:id="rId9eixaoworm3y-qnicyans">
+      <w:hyperlink w:history="1" r:id="rIdezeirvmj2brj0z_whggkn">
         <w:r>
           <w:rPr>
             <w:rStyle w:val="Hyperlink"/>
@@ -12996,7 +12996,7 @@
         </w:rPr>
         <w:t xml:space="preserve"> Canal: </w:t>
       </w:r>
-      <w:hyperlink w:history="1" r:id="rIdjljtcovgi3dhgylpzdlus">
+      <w:hyperlink w:history="1" r:id="rIdyb2p2abl-hwdbxii0k_gs">
         <w:r>
           <w:rPr>
             <w:rStyle w:val="Hyperlink"/>
@@ -13062,7 +13062,7 @@
         </w:rPr>
         <w:t xml:space="preserve"> Canal: </w:t>
       </w:r>
-      <w:hyperlink w:history="1" r:id="rIdiltu3pbkhpucbtmdxrvey">
+      <w:hyperlink w:history="1" r:id="rIdxhxg-ci4lwmvbg-96iqks">
         <w:r>
           <w:rPr>
             <w:rStyle w:val="Hyperlink"/>
@@ -13166,7 +13166,7 @@
         </w:rPr>
         <w:t xml:space="preserve"> Canal: </w:t>
       </w:r>
-      <w:hyperlink w:history="1" r:id="rIdqwc2onhziws5y4g0h411t">
+      <w:hyperlink w:history="1" r:id="rIdilvjg7t1tnt3hejoz3eim">
         <w:r>
           <w:rPr>
             <w:rStyle w:val="Hyperlink"/>

</xml_diff>

<commit_message>
receita mensal conciliada com LOA e LDO, com distincao entre parcela mensal e saldo acumulado; piso mensal do IGD por competencia; analise separada das contas do CMASGyn com afericao do apoio material, estrutural e financeiro ao conselheiro
</commit_message>
<xml_diff>
--- a/relatorios/Parecer_Fiscalizacao_2026.docx
+++ b/relatorios/Parecer_Fiscalizacao_2026.docx
@@ -61,7 +61,7 @@
           <w:sz w:val="22"/>
           <w:szCs w:val="22"/>
         </w:rPr>
-        <w:t xml:space="preserve">25 irregularidades — 7 críticas, 15 altas, 3 médias</w:t>
+        <w:t xml:space="preserve">32 irregularidades — 8 críticas, 19 altas, 5 médias</w:t>
       </w:r>
     </w:p>
     <w:p>
@@ -89,7 +89,7 @@
           <w:sz w:val="20"/>
           <w:szCs w:val="20"/>
         </w:rPr>
-        <w:t xml:space="preserve">81 documentos complementares requisitados</w:t>
+        <w:t xml:space="preserve">101 documentos complementares requisitados</w:t>
       </w:r>
     </w:p>
     <w:p>
@@ -291,7 +291,7 @@
         </w:rPr>
         <w:t xml:space="preserve">. Documento consultado em: </w:t>
       </w:r>
-      <w:hyperlink w:history="1" r:id="rIdslex4-l0csd_gc0s3e3jn">
+      <w:hyperlink w:history="1" r:id="rIdzy1z_j9ih2tpxxvy8jckt">
         <w:r>
           <w:rPr>
             <w:rStyle w:val="Hyperlink"/>
@@ -2210,7 +2210,7 @@
         </w:rPr>
         <w:t xml:space="preserve">Deveria estar em: </w:t>
       </w:r>
-      <w:hyperlink w:history="1" r:id="rIdtccjweiqmvbw6tiahzrzm">
+      <w:hyperlink w:history="1" r:id="rId894seod4qareloaxpvsic">
         <w:r>
           <w:rPr>
             <w:rStyle w:val="Hyperlink"/>
@@ -2284,7 +2284,7 @@
         </w:rPr>
         <w:t xml:space="preserve">Deveria estar em: </w:t>
       </w:r>
-      <w:hyperlink w:history="1" r:id="rIdgzpunhkyg49tcxd5jwxbs">
+      <w:hyperlink w:history="1" r:id="rIdrjee5xsjokrbpcjlzbzlw">
         <w:r>
           <w:rPr>
             <w:rStyle w:val="Hyperlink"/>
@@ -2358,7 +2358,7 @@
         </w:rPr>
         <w:t xml:space="preserve">Deveria estar em: </w:t>
       </w:r>
-      <w:hyperlink w:history="1" r:id="rIdq2gjyq1rsgfrwzpbt8n5n">
+      <w:hyperlink w:history="1" r:id="rId4wptjuidmyohn-ndhh9qn">
         <w:r>
           <w:rPr>
             <w:rStyle w:val="Hyperlink"/>
@@ -2432,7 +2432,7 @@
         </w:rPr>
         <w:t xml:space="preserve">Deveria estar em: </w:t>
       </w:r>
-      <w:hyperlink w:history="1" r:id="rIda2gb_767mwbyo5qli1dpj">
+      <w:hyperlink w:history="1" r:id="rIdh73lq_fxcvsjcvw2gkozo">
         <w:r>
           <w:rPr>
             <w:rStyle w:val="Hyperlink"/>
@@ -2506,7 +2506,7 @@
         </w:rPr>
         <w:t xml:space="preserve">Deveria estar em: </w:t>
       </w:r>
-      <w:hyperlink w:history="1" r:id="rIdkg4tkdvbkvvqir91banp8">
+      <w:hyperlink w:history="1" r:id="rId5xdgn39v63gymdw2rok7r">
         <w:r>
           <w:rPr>
             <w:rStyle w:val="Hyperlink"/>
@@ -2580,7 +2580,7 @@
         </w:rPr>
         <w:t xml:space="preserve">Deveria estar em: </w:t>
       </w:r>
-      <w:hyperlink w:history="1" r:id="rIden08ggccfdzlxod0agc9x">
+      <w:hyperlink w:history="1" r:id="rIdtrauqdphxouqbjmf0ldao">
         <w:r>
           <w:rPr>
             <w:rStyle w:val="Hyperlink"/>
@@ -4900,7 +4900,7 @@
         </w:rPr>
         <w:t xml:space="preserve">A versão interativa desta trilha, com o detalhe de cada contrato, está em </w:t>
       </w:r>
-      <w:hyperlink w:history="1" r:id="rIdbpq-s8jylrpgi6bgmqfdh">
+      <w:hyperlink w:history="1" r:id="rIdkczr48e4xabpqh2eyfmwc">
         <w:r>
           <w:rPr>
             <w:rStyle w:val="Hyperlink"/>
@@ -5817,7 +5817,7 @@
         </w:rPr>
         <w:t xml:space="preserve">A versão didática desta trilha, feita para leitura por quem não é da área, está em </w:t>
       </w:r>
-      <w:hyperlink w:history="1" r:id="rIdmwypj5ypmexeysqurzijk">
+      <w:hyperlink w:history="1" r:id="rIdtslix7gspearof4mhazpi">
         <w:r>
           <w:rPr>
             <w:rStyle w:val="Hyperlink"/>
@@ -5857,7 +5857,1979 @@
           <w:sz w:val="26"/>
           <w:szCs w:val="26"/>
         </w:rPr>
-        <w:t xml:space="preserve">V — Irregularidades Apuradas</w:t>
+        <w:t xml:space="preserve">V — Receita Mensal e Conciliação com a Lei Orçamentária e a Lei de Diretrizes</w:t>
+      </w:r>
+    </w:p>
+    <w:p>
+      <w:pPr>
+        <w:spacing w:line="276"/>
+        <w:ind w:firstLine="1133"/>
+        <w:jc w:val="both"/>
+      </w:pPr>
+      <w:r>
+        <w:rPr>
+          <w:rFonts w:ascii="Bookman Old Style" w:cs="Bookman Old Style" w:eastAsia="Bookman Old Style" w:hAnsi="Bookman Old Style"/>
+          <w:sz w:val="22"/>
+          <w:szCs w:val="22"/>
+        </w:rPr>
+        <w:t xml:space="preserve">A Lei Orçamentária prevê </w:t>
+      </w:r>
+      <w:r>
+        <w:rPr>
+          <w:rFonts w:ascii="Bookman Old Style" w:cs="Bookman Old Style" w:eastAsia="Bookman Old Style" w:hAnsi="Bookman Old Style"/>
+          <w:b/>
+          <w:bCs/>
+          <w:sz w:val="22"/>
+          <w:szCs w:val="22"/>
+        </w:rPr>
+        <w:t xml:space="preserve">R$ 23.218.000,00</w:t>
+      </w:r>
+      <w:r>
+        <w:rPr>
+          <w:rFonts w:ascii="Bookman Old Style" w:cs="Bookman Old Style" w:eastAsia="Bookman Old Style" w:hAnsi="Bookman Old Style"/>
+          <w:sz w:val="22"/>
+          <w:szCs w:val="22"/>
+        </w:rPr>
+        <w:t xml:space="preserve"> para o Fundo em 2026. A Lei de Diretrizes fixa meta de </w:t>
+      </w:r>
+      <w:r>
+        <w:rPr>
+          <w:rFonts w:ascii="Bookman Old Style" w:cs="Bookman Old Style" w:eastAsia="Bookman Old Style" w:hAnsi="Bookman Old Style"/>
+          <w:b/>
+          <w:bCs/>
+          <w:sz w:val="22"/>
+          <w:szCs w:val="22"/>
+        </w:rPr>
+        <w:t xml:space="preserve">R$ 41.265.955,98</w:t>
+      </w:r>
+      <w:r>
+        <w:rPr>
+          <w:rFonts w:ascii="Bookman Old Style" w:cs="Bookman Old Style" w:eastAsia="Bookman Old Style" w:hAnsi="Bookman Old Style"/>
+          <w:sz w:val="22"/>
+          <w:szCs w:val="22"/>
+        </w:rPr>
+        <w:t xml:space="preserve"> para o setor, mas a meta reúne políticas de mulher e direitos humanos, e inclui manutenção de cemitérios — não é comparável diretamente com a função 08. Nenhuma das doze competências de 2026 tem receita realizada publicada, de modo que a conciliação entre previsto e realizado é impossível com o que está público.</w:t>
+      </w:r>
+    </w:p>
+    <w:p>
+      <w:pPr>
+        <w:spacing w:line="276"/>
+      </w:pPr>
+      <w:r>
+        <w:rPr>
+          <w:rFonts w:ascii="Bookman Old Style" w:cs="Bookman Old Style" w:eastAsia="Bookman Old Style" w:hAnsi="Bookman Old Style"/>
+          <w:sz w:val="22"/>
+          <w:szCs w:val="22"/>
+        </w:rPr>
+        <w:t xml:space="preserve"/>
+      </w:r>
+    </w:p>
+    <w:p>
+      <w:pPr>
+        <w:spacing w:after="60"/>
+        <w:jc w:val="center"/>
+      </w:pPr>
+      <w:r>
+        <w:rPr>
+          <w:rFonts w:ascii="Bookman Old Style" w:cs="Bookman Old Style" w:eastAsia="Bookman Old Style" w:hAnsi="Bookman Old Style"/>
+          <w:b/>
+          <w:bCs/>
+          <w:sz w:val="20"/>
+          <w:szCs w:val="20"/>
+        </w:rPr>
+        <w:t xml:space="preserve">Previsão anual e parcela mensal esperada, por fonte</w:t>
+      </w:r>
+    </w:p>
+    <w:tbl>
+      <w:tblPr>
+        <w:tblW w:type="dxa" w:w="8700"/>
+        <w:tblBorders>
+          <w:top w:val="single" w:color="auto" w:sz="4"/>
+          <w:left w:val="single" w:color="auto" w:sz="4"/>
+          <w:bottom w:val="single" w:color="auto" w:sz="4"/>
+          <w:right w:val="single" w:color="auto" w:sz="4"/>
+          <w:insideH w:val="single" w:color="auto" w:sz="4"/>
+          <w:insideV w:val="single" w:color="auto" w:sz="4"/>
+        </w:tblBorders>
+      </w:tblPr>
+      <w:tblGrid>
+        <w:gridCol w:w="2800"/>
+        <w:gridCol w:w="2400"/>
+        <w:gridCol w:w="1900"/>
+        <w:gridCol w:w="1600"/>
+      </w:tblGrid>
+      <w:tr>
+        <w:tc>
+          <w:tcPr>
+            <w:tcW w:type="dxa" w:w="2800"/>
+            <w:shd w:fill="EAE6DC" w:val="clear"/>
+          </w:tcPr>
+          <w:p>
+            <w:pPr>
+              <w:jc w:val="left"/>
+            </w:pPr>
+            <w:r>
+              <w:rPr>
+                <w:rFonts w:ascii="Bookman Old Style" w:cs="Bookman Old Style" w:eastAsia="Bookman Old Style" w:hAnsi="Bookman Old Style"/>
+                <w:b/>
+                <w:bCs/>
+                <w:sz w:val="18"/>
+                <w:szCs w:val="18"/>
+              </w:rPr>
+              <w:t xml:space="preserve">Fonte</w:t>
+            </w:r>
+          </w:p>
+        </w:tc>
+        <w:tc>
+          <w:tcPr>
+            <w:tcW w:type="dxa" w:w="2400"/>
+            <w:shd w:fill="EAE6DC" w:val="clear"/>
+          </w:tcPr>
+          <w:p>
+            <w:pPr>
+              <w:jc w:val="left"/>
+            </w:pPr>
+            <w:r>
+              <w:rPr>
+                <w:rFonts w:ascii="Bookman Old Style" w:cs="Bookman Old Style" w:eastAsia="Bookman Old Style" w:hAnsi="Bookman Old Style"/>
+                <w:b/>
+                <w:bCs/>
+                <w:sz w:val="18"/>
+                <w:szCs w:val="18"/>
+              </w:rPr>
+              <w:t xml:space="preserve">Regime de entrada</w:t>
+            </w:r>
+          </w:p>
+        </w:tc>
+        <w:tc>
+          <w:tcPr>
+            <w:tcW w:type="dxa" w:w="1900"/>
+            <w:shd w:fill="EAE6DC" w:val="clear"/>
+          </w:tcPr>
+          <w:p>
+            <w:pPr>
+              <w:jc w:val="left"/>
+            </w:pPr>
+            <w:r>
+              <w:rPr>
+                <w:rFonts w:ascii="Bookman Old Style" w:cs="Bookman Old Style" w:eastAsia="Bookman Old Style" w:hAnsi="Bookman Old Style"/>
+                <w:b/>
+                <w:bCs/>
+                <w:sz w:val="18"/>
+                <w:szCs w:val="18"/>
+              </w:rPr>
+              <w:t xml:space="preserve">Previsto no ano</w:t>
+            </w:r>
+          </w:p>
+        </w:tc>
+        <w:tc>
+          <w:tcPr>
+            <w:tcW w:type="dxa" w:w="1600"/>
+            <w:shd w:fill="EAE6DC" w:val="clear"/>
+          </w:tcPr>
+          <w:p>
+            <w:pPr>
+              <w:jc w:val="left"/>
+            </w:pPr>
+            <w:r>
+              <w:rPr>
+                <w:rFonts w:ascii="Bookman Old Style" w:cs="Bookman Old Style" w:eastAsia="Bookman Old Style" w:hAnsi="Bookman Old Style"/>
+                <w:b/>
+                <w:bCs/>
+                <w:sz w:val="18"/>
+                <w:szCs w:val="18"/>
+              </w:rPr>
+              <w:t xml:space="preserve">Parcela mensal</w:t>
+            </w:r>
+          </w:p>
+        </w:tc>
+      </w:tr>
+      <w:tr>
+        <w:tc>
+          <w:tcPr>
+            <w:tcW w:type="dxa" w:w="2800"/>
+          </w:tcPr>
+          <w:p>
+            <w:pPr>
+              <w:jc w:val="left"/>
+            </w:pPr>
+            <w:r>
+              <w:rPr>
+                <w:rFonts w:ascii="Bookman Old Style" w:cs="Bookman Old Style" w:eastAsia="Bookman Old Style" w:hAnsi="Bookman Old Style"/>
+                <w:sz w:val="18"/>
+                <w:szCs w:val="18"/>
+              </w:rPr>
+              <w:t xml:space="preserve">União — Fundo Nacional de Assistência Social</w:t>
+            </w:r>
+          </w:p>
+        </w:tc>
+        <w:tc>
+          <w:tcPr>
+            <w:tcW w:type="dxa" w:w="2400"/>
+          </w:tcPr>
+          <w:p>
+            <w:pPr>
+              <w:jc w:val="left"/>
+            </w:pPr>
+            <w:r>
+              <w:rPr>
+                <w:rFonts w:ascii="Bookman Old Style" w:cs="Bookman Old Style" w:eastAsia="Bookman Old Style" w:hAnsi="Bookman Old Style"/>
+                <w:sz w:val="18"/>
+                <w:szCs w:val="18"/>
+              </w:rPr>
+              <w:t xml:space="preserve">fundo a fundo, parcela mensal</w:t>
+            </w:r>
+          </w:p>
+        </w:tc>
+        <w:tc>
+          <w:tcPr>
+            <w:tcW w:type="dxa" w:w="1900"/>
+          </w:tcPr>
+          <w:p>
+            <w:pPr>
+              <w:jc w:val="right"/>
+            </w:pPr>
+            <w:r>
+              <w:rPr>
+                <w:rFonts w:ascii="Bookman Old Style" w:cs="Bookman Old Style" w:eastAsia="Bookman Old Style" w:hAnsi="Bookman Old Style"/>
+                <w:sz w:val="18"/>
+                <w:szCs w:val="18"/>
+              </w:rPr>
+              <w:t xml:space="preserve">R$ 8.250.000,00</w:t>
+            </w:r>
+          </w:p>
+        </w:tc>
+        <w:tc>
+          <w:tcPr>
+            <w:tcW w:type="dxa" w:w="1600"/>
+          </w:tcPr>
+          <w:p>
+            <w:pPr>
+              <w:jc w:val="right"/>
+            </w:pPr>
+            <w:r>
+              <w:rPr>
+                <w:rFonts w:ascii="Bookman Old Style" w:cs="Bookman Old Style" w:eastAsia="Bookman Old Style" w:hAnsi="Bookman Old Style"/>
+                <w:sz w:val="18"/>
+                <w:szCs w:val="18"/>
+              </w:rPr>
+              <w:t xml:space="preserve">R$ 687.500,00</w:t>
+            </w:r>
+          </w:p>
+        </w:tc>
+      </w:tr>
+      <w:tr>
+        <w:tc>
+          <w:tcPr>
+            <w:tcW w:type="dxa" w:w="2800"/>
+          </w:tcPr>
+          <w:p>
+            <w:pPr>
+              <w:jc w:val="left"/>
+            </w:pPr>
+            <w:r>
+              <w:rPr>
+                <w:rFonts w:ascii="Bookman Old Style" w:cs="Bookman Old Style" w:eastAsia="Bookman Old Style" w:hAnsi="Bookman Old Style"/>
+                <w:sz w:val="18"/>
+                <w:szCs w:val="18"/>
+              </w:rPr>
+              <w:t xml:space="preserve">Estado — Assistência Social</w:t>
+            </w:r>
+          </w:p>
+        </w:tc>
+        <w:tc>
+          <w:tcPr>
+            <w:tcW w:type="dxa" w:w="2400"/>
+          </w:tcPr>
+          <w:p>
+            <w:pPr>
+              <w:jc w:val="left"/>
+            </w:pPr>
+            <w:r>
+              <w:rPr>
+                <w:rFonts w:ascii="Bookman Old Style" w:cs="Bookman Old Style" w:eastAsia="Bookman Old Style" w:hAnsi="Bookman Old Style"/>
+                <w:sz w:val="18"/>
+                <w:szCs w:val="18"/>
+              </w:rPr>
+              <w:t xml:space="preserve">transferência estadual</w:t>
+            </w:r>
+          </w:p>
+        </w:tc>
+        <w:tc>
+          <w:tcPr>
+            <w:tcW w:type="dxa" w:w="1900"/>
+          </w:tcPr>
+          <w:p>
+            <w:pPr>
+              <w:jc w:val="right"/>
+            </w:pPr>
+            <w:r>
+              <w:rPr>
+                <w:rFonts w:ascii="Bookman Old Style" w:cs="Bookman Old Style" w:eastAsia="Bookman Old Style" w:hAnsi="Bookman Old Style"/>
+                <w:sz w:val="18"/>
+                <w:szCs w:val="18"/>
+              </w:rPr>
+              <w:t xml:space="preserve">R$ 6.000.000,00</w:t>
+            </w:r>
+          </w:p>
+        </w:tc>
+        <w:tc>
+          <w:tcPr>
+            <w:tcW w:type="dxa" w:w="1600"/>
+          </w:tcPr>
+          <w:p>
+            <w:pPr>
+              <w:jc w:val="right"/>
+            </w:pPr>
+            <w:r>
+              <w:rPr>
+                <w:rFonts w:ascii="Bookman Old Style" w:cs="Bookman Old Style" w:eastAsia="Bookman Old Style" w:hAnsi="Bookman Old Style"/>
+                <w:sz w:val="18"/>
+                <w:szCs w:val="18"/>
+              </w:rPr>
+              <w:t xml:space="preserve">R$ 500.000,00</w:t>
+            </w:r>
+          </w:p>
+        </w:tc>
+      </w:tr>
+      <w:tr>
+        <w:tc>
+          <w:tcPr>
+            <w:tcW w:type="dxa" w:w="2800"/>
+          </w:tcPr>
+          <w:p>
+            <w:pPr>
+              <w:jc w:val="left"/>
+            </w:pPr>
+            <w:r>
+              <w:rPr>
+                <w:rFonts w:ascii="Bookman Old Style" w:cs="Bookman Old Style" w:eastAsia="Bookman Old Style" w:hAnsi="Bookman Old Style"/>
+                <w:sz w:val="18"/>
+                <w:szCs w:val="18"/>
+              </w:rPr>
+              <w:t xml:space="preserve">Estado — Programas de Assistência Social</w:t>
+            </w:r>
+          </w:p>
+        </w:tc>
+        <w:tc>
+          <w:tcPr>
+            <w:tcW w:type="dxa" w:w="2400"/>
+          </w:tcPr>
+          <w:p>
+            <w:pPr>
+              <w:jc w:val="left"/>
+            </w:pPr>
+            <w:r>
+              <w:rPr>
+                <w:rFonts w:ascii="Bookman Old Style" w:cs="Bookman Old Style" w:eastAsia="Bookman Old Style" w:hAnsi="Bookman Old Style"/>
+                <w:sz w:val="18"/>
+                <w:szCs w:val="18"/>
+              </w:rPr>
+              <w:t xml:space="preserve">transferência estadual</w:t>
+            </w:r>
+          </w:p>
+        </w:tc>
+        <w:tc>
+          <w:tcPr>
+            <w:tcW w:type="dxa" w:w="1900"/>
+          </w:tcPr>
+          <w:p>
+            <w:pPr>
+              <w:jc w:val="right"/>
+            </w:pPr>
+            <w:r>
+              <w:rPr>
+                <w:rFonts w:ascii="Bookman Old Style" w:cs="Bookman Old Style" w:eastAsia="Bookman Old Style" w:hAnsi="Bookman Old Style"/>
+                <w:sz w:val="18"/>
+                <w:szCs w:val="18"/>
+              </w:rPr>
+              <w:t xml:space="preserve">R$ 3.104.000,00</w:t>
+            </w:r>
+          </w:p>
+        </w:tc>
+        <w:tc>
+          <w:tcPr>
+            <w:tcW w:type="dxa" w:w="1600"/>
+          </w:tcPr>
+          <w:p>
+            <w:pPr>
+              <w:jc w:val="right"/>
+            </w:pPr>
+            <w:r>
+              <w:rPr>
+                <w:rFonts w:ascii="Bookman Old Style" w:cs="Bookman Old Style" w:eastAsia="Bookman Old Style" w:hAnsi="Bookman Old Style"/>
+                <w:sz w:val="18"/>
+                <w:szCs w:val="18"/>
+              </w:rPr>
+              <w:t xml:space="preserve">R$ 258.666,67</w:t>
+            </w:r>
+          </w:p>
+        </w:tc>
+      </w:tr>
+      <w:tr>
+        <w:tc>
+          <w:tcPr>
+            <w:tcW w:type="dxa" w:w="2800"/>
+          </w:tcPr>
+          <w:p>
+            <w:pPr>
+              <w:jc w:val="left"/>
+            </w:pPr>
+            <w:r>
+              <w:rPr>
+                <w:rFonts w:ascii="Bookman Old Style" w:cs="Bookman Old Style" w:eastAsia="Bookman Old Style" w:hAnsi="Bookman Old Style"/>
+                <w:sz w:val="18"/>
+                <w:szCs w:val="18"/>
+              </w:rPr>
+              <w:t xml:space="preserve">Município — Tesouro Municipal</w:t>
+            </w:r>
+          </w:p>
+        </w:tc>
+        <w:tc>
+          <w:tcPr>
+            <w:tcW w:type="dxa" w:w="2400"/>
+          </w:tcPr>
+          <w:p>
+            <w:pPr>
+              <w:jc w:val="left"/>
+            </w:pPr>
+            <w:r>
+              <w:rPr>
+                <w:rFonts w:ascii="Bookman Old Style" w:cs="Bookman Old Style" w:eastAsia="Bookman Old Style" w:hAnsi="Bookman Old Style"/>
+                <w:sz w:val="18"/>
+                <w:szCs w:val="18"/>
+              </w:rPr>
+              <w:t xml:space="preserve">programação financeira; transferência automática ao Fundo</w:t>
+            </w:r>
+          </w:p>
+        </w:tc>
+        <w:tc>
+          <w:tcPr>
+            <w:tcW w:type="dxa" w:w="1900"/>
+          </w:tcPr>
+          <w:p>
+            <w:pPr>
+              <w:jc w:val="right"/>
+            </w:pPr>
+            <w:r>
+              <w:rPr>
+                <w:rFonts w:ascii="Bookman Old Style" w:cs="Bookman Old Style" w:eastAsia="Bookman Old Style" w:hAnsi="Bookman Old Style"/>
+                <w:sz w:val="18"/>
+                <w:szCs w:val="18"/>
+              </w:rPr>
+              <w:t xml:space="preserve">R$ 9.000,00</w:t>
+            </w:r>
+          </w:p>
+        </w:tc>
+        <w:tc>
+          <w:tcPr>
+            <w:tcW w:type="dxa" w:w="1600"/>
+          </w:tcPr>
+          <w:p>
+            <w:pPr>
+              <w:jc w:val="right"/>
+            </w:pPr>
+            <w:r>
+              <w:rPr>
+                <w:rFonts w:ascii="Bookman Old Style" w:cs="Bookman Old Style" w:eastAsia="Bookman Old Style" w:hAnsi="Bookman Old Style"/>
+                <w:sz w:val="18"/>
+                <w:szCs w:val="18"/>
+              </w:rPr>
+              <w:t xml:space="preserve">R$ 750,00</w:t>
+            </w:r>
+          </w:p>
+        </w:tc>
+      </w:tr>
+      <w:tr>
+        <w:tc>
+          <w:tcPr>
+            <w:tcW w:type="dxa" w:w="2800"/>
+          </w:tcPr>
+          <w:p>
+            <w:pPr>
+              <w:jc w:val="left"/>
+            </w:pPr>
+            <w:r>
+              <w:rPr>
+                <w:rFonts w:ascii="Bookman Old Style" w:cs="Bookman Old Style" w:eastAsia="Bookman Old Style" w:hAnsi="Bookman Old Style"/>
+                <w:sz w:val="18"/>
+                <w:szCs w:val="18"/>
+              </w:rPr>
+              <w:t xml:space="preserve">Rendimento de aplicação financeira</w:t>
+            </w:r>
+          </w:p>
+        </w:tc>
+        <w:tc>
+          <w:tcPr>
+            <w:tcW w:type="dxa" w:w="2400"/>
+          </w:tcPr>
+          <w:p>
+            <w:pPr>
+              <w:jc w:val="left"/>
+            </w:pPr>
+            <w:r>
+              <w:rPr>
+                <w:rFonts w:ascii="Bookman Old Style" w:cs="Bookman Old Style" w:eastAsia="Bookman Old Style" w:hAnsi="Bookman Old Style"/>
+                <w:sz w:val="18"/>
+                <w:szCs w:val="18"/>
+              </w:rPr>
+              <w:t xml:space="preserve">crédito mensal sobre saldo aplicado</w:t>
+            </w:r>
+          </w:p>
+        </w:tc>
+        <w:tc>
+          <w:tcPr>
+            <w:tcW w:type="dxa" w:w="1900"/>
+          </w:tcPr>
+          <w:p>
+            <w:pPr>
+              <w:jc w:val="right"/>
+            </w:pPr>
+            <w:r>
+              <w:rPr>
+                <w:rFonts w:ascii="Bookman Old Style" w:cs="Bookman Old Style" w:eastAsia="Bookman Old Style" w:hAnsi="Bookman Old Style"/>
+                <w:sz w:val="18"/>
+                <w:szCs w:val="18"/>
+              </w:rPr>
+              <w:t xml:space="preserve">R$ 2.574.000,00</w:t>
+            </w:r>
+          </w:p>
+        </w:tc>
+        <w:tc>
+          <w:tcPr>
+            <w:tcW w:type="dxa" w:w="1600"/>
+          </w:tcPr>
+          <w:p>
+            <w:pPr>
+              <w:jc w:val="right"/>
+            </w:pPr>
+            <w:r>
+              <w:rPr>
+                <w:rFonts w:ascii="Bookman Old Style" w:cs="Bookman Old Style" w:eastAsia="Bookman Old Style" w:hAnsi="Bookman Old Style"/>
+                <w:sz w:val="18"/>
+                <w:szCs w:val="18"/>
+              </w:rPr>
+              <w:t xml:space="preserve">R$ 214.500,00</w:t>
+            </w:r>
+          </w:p>
+        </w:tc>
+      </w:tr>
+      <w:tr>
+        <w:tc>
+          <w:tcPr>
+            <w:tcW w:type="dxa" w:w="2800"/>
+          </w:tcPr>
+          <w:p>
+            <w:pPr>
+              <w:jc w:val="left"/>
+            </w:pPr>
+            <w:r>
+              <w:rPr>
+                <w:rFonts w:ascii="Bookman Old Style" w:cs="Bookman Old Style" w:eastAsia="Bookman Old Style" w:hAnsi="Bookman Old Style"/>
+                <w:sz w:val="18"/>
+                <w:szCs w:val="18"/>
+              </w:rPr>
+              <w:t xml:space="preserve">Transferências correntes sem fonte declarada</w:t>
+            </w:r>
+          </w:p>
+        </w:tc>
+        <w:tc>
+          <w:tcPr>
+            <w:tcW w:type="dxa" w:w="2400"/>
+          </w:tcPr>
+          <w:p>
+            <w:pPr>
+              <w:jc w:val="left"/>
+            </w:pPr>
+            <w:r>
+              <w:rPr>
+                <w:rFonts w:ascii="Bookman Old Style" w:cs="Bookman Old Style" w:eastAsia="Bookman Old Style" w:hAnsi="Bookman Old Style"/>
+                <w:sz w:val="18"/>
+                <w:szCs w:val="18"/>
+              </w:rPr>
+              <w:t xml:space="preserve">indeterminado</w:t>
+            </w:r>
+          </w:p>
+        </w:tc>
+        <w:tc>
+          <w:tcPr>
+            <w:tcW w:type="dxa" w:w="1900"/>
+          </w:tcPr>
+          <w:p>
+            <w:pPr>
+              <w:jc w:val="right"/>
+            </w:pPr>
+            <w:r>
+              <w:rPr>
+                <w:rFonts w:ascii="Bookman Old Style" w:cs="Bookman Old Style" w:eastAsia="Bookman Old Style" w:hAnsi="Bookman Old Style"/>
+                <w:sz w:val="18"/>
+                <w:szCs w:val="18"/>
+              </w:rPr>
+              <w:t xml:space="preserve">R$ 2.071.000,00</w:t>
+            </w:r>
+          </w:p>
+        </w:tc>
+        <w:tc>
+          <w:tcPr>
+            <w:tcW w:type="dxa" w:w="1600"/>
+          </w:tcPr>
+          <w:p>
+            <w:pPr>
+              <w:jc w:val="right"/>
+            </w:pPr>
+            <w:r>
+              <w:rPr>
+                <w:rFonts w:ascii="Bookman Old Style" w:cs="Bookman Old Style" w:eastAsia="Bookman Old Style" w:hAnsi="Bookman Old Style"/>
+                <w:sz w:val="18"/>
+                <w:szCs w:val="18"/>
+              </w:rPr>
+              <w:t xml:space="preserve">R$ 172.583,33</w:t>
+            </w:r>
+          </w:p>
+        </w:tc>
+      </w:tr>
+      <w:tr>
+        <w:tc>
+          <w:tcPr>
+            <w:tcW w:type="dxa" w:w="2800"/>
+          </w:tcPr>
+          <w:p>
+            <w:pPr>
+              <w:jc w:val="left"/>
+            </w:pPr>
+            <w:r>
+              <w:rPr>
+                <w:rFonts w:ascii="Bookman Old Style" w:cs="Bookman Old Style" w:eastAsia="Bookman Old Style" w:hAnsi="Bookman Old Style"/>
+                <w:sz w:val="18"/>
+                <w:szCs w:val="18"/>
+              </w:rPr>
+              <w:t xml:space="preserve">Transferências de capital</w:t>
+            </w:r>
+          </w:p>
+        </w:tc>
+        <w:tc>
+          <w:tcPr>
+            <w:tcW w:type="dxa" w:w="2400"/>
+          </w:tcPr>
+          <w:p>
+            <w:pPr>
+              <w:jc w:val="left"/>
+            </w:pPr>
+            <w:r>
+              <w:rPr>
+                <w:rFonts w:ascii="Bookman Old Style" w:cs="Bookman Old Style" w:eastAsia="Bookman Old Style" w:hAnsi="Bookman Old Style"/>
+                <w:sz w:val="18"/>
+                <w:szCs w:val="18"/>
+              </w:rPr>
+              <w:t xml:space="preserve">parcela única ou por etapa de projeto</w:t>
+            </w:r>
+          </w:p>
+        </w:tc>
+        <w:tc>
+          <w:tcPr>
+            <w:tcW w:type="dxa" w:w="1900"/>
+          </w:tcPr>
+          <w:p>
+            <w:pPr>
+              <w:jc w:val="right"/>
+            </w:pPr>
+            <w:r>
+              <w:rPr>
+                <w:rFonts w:ascii="Bookman Old Style" w:cs="Bookman Old Style" w:eastAsia="Bookman Old Style" w:hAnsi="Bookman Old Style"/>
+                <w:sz w:val="18"/>
+                <w:szCs w:val="18"/>
+              </w:rPr>
+              <w:t xml:space="preserve">R$ 1.115.000,00</w:t>
+            </w:r>
+          </w:p>
+        </w:tc>
+        <w:tc>
+          <w:tcPr>
+            <w:tcW w:type="dxa" w:w="1600"/>
+          </w:tcPr>
+          <w:p>
+            <w:pPr>
+              <w:jc w:val="left"/>
+            </w:pPr>
+            <w:r>
+              <w:rPr>
+                <w:rFonts w:ascii="Bookman Old Style" w:cs="Bookman Old Style" w:eastAsia="Bookman Old Style" w:hAnsi="Bookman Old Style"/>
+                <w:sz w:val="18"/>
+                <w:szCs w:val="18"/>
+              </w:rPr>
+              <w:t xml:space="preserve">parcela única</w:t>
+            </w:r>
+          </w:p>
+        </w:tc>
+      </w:tr>
+    </w:tbl>
+    <w:p>
+      <w:pPr>
+        <w:spacing w:line="276"/>
+      </w:pPr>
+      <w:r>
+        <w:rPr>
+          <w:rFonts w:ascii="Bookman Old Style" w:cs="Bookman Old Style" w:eastAsia="Bookman Old Style" w:hAnsi="Bookman Old Style"/>
+          <w:sz w:val="22"/>
+          <w:szCs w:val="22"/>
+        </w:rPr>
+        <w:t xml:space="preserve"/>
+      </w:r>
+    </w:p>
+    <w:p>
+      <w:pPr>
+        <w:spacing w:line="276"/>
+        <w:ind w:firstLine="1133"/>
+        <w:jc w:val="both"/>
+      </w:pPr>
+      <w:r>
+        <w:rPr>
+          <w:rFonts w:ascii="Bookman Old Style" w:cs="Bookman Old Style" w:eastAsia="Bookman Old Style" w:hAnsi="Bookman Old Style"/>
+          <w:b/>
+          <w:bCs/>
+          <w:sz w:val="22"/>
+          <w:szCs w:val="22"/>
+        </w:rPr>
+        <w:t xml:space="preserve">Parcela mensal ou depósito consumido? </w:t>
+      </w:r>
+      <w:r>
+        <w:rPr>
+          <w:rFonts w:ascii="Bookman Old Style" w:cs="Bookman Old Style" w:eastAsia="Bookman Old Style" w:hAnsi="Bookman Old Style"/>
+          <w:sz w:val="22"/>
+          <w:szCs w:val="22"/>
+        </w:rPr>
+        <w:t xml:space="preserve">Os dois regimes convivem. Os repasses federal e estadual entram em parcelas mensais, e o rendimento de aplicação é creditado mês a mês. Mas os decretos de crédito de 2026 reabriram </w:t>
+      </w:r>
+      <w:r>
+        <w:rPr>
+          <w:rFonts w:ascii="Bookman Old Style" w:cs="Bookman Old Style" w:eastAsia="Bookman Old Style" w:hAnsi="Bookman Old Style"/>
+          <w:b/>
+          <w:bCs/>
+          <w:sz w:val="22"/>
+          <w:szCs w:val="22"/>
+        </w:rPr>
+        <w:t xml:space="preserve">R$ 33.059.000,00</w:t>
+      </w:r>
+      <w:r>
+        <w:rPr>
+          <w:rFonts w:ascii="Bookman Old Style" w:cs="Bookman Old Style" w:eastAsia="Bookman Old Style" w:hAnsi="Bookman Old Style"/>
+          <w:sz w:val="22"/>
+          <w:szCs w:val="22"/>
+        </w:rPr>
+        <w:t xml:space="preserve"> contra fontes de exercícios anteriores — valor superior ao orçamento anual inteiro do Fundo. Isso não é entrada nova: é sobra do que não se gastou. A receita patrimonial de </w:t>
+      </w:r>
+      <w:r>
+        <w:rPr>
+          <w:rFonts w:ascii="Bookman Old Style" w:cs="Bookman Old Style" w:eastAsia="Bookman Old Style" w:hAnsi="Bookman Old Style"/>
+          <w:b/>
+          <w:bCs/>
+          <w:sz w:val="22"/>
+          <w:szCs w:val="22"/>
+        </w:rPr>
+        <w:t xml:space="preserve">R$ 2.574.876,20</w:t>
+      </w:r>
+      <w:r>
+        <w:rPr>
+          <w:rFonts w:ascii="Bookman Old Style" w:cs="Bookman Old Style" w:eastAsia="Bookman Old Style" w:hAnsi="Bookman Old Style"/>
+          <w:sz w:val="22"/>
+          <w:szCs w:val="22"/>
+        </w:rPr>
+        <w:t xml:space="preserve"> confirma pelo outro lado: rendimento nessa proporção pressupõe saldo médio aplicado próximo do orçamento anual. O retrato é de um fundo que acumula e não executa.</w:t>
+      </w:r>
+    </w:p>
+    <w:p>
+      <w:pPr>
+        <w:spacing w:line="276"/>
+      </w:pPr>
+      <w:r>
+        <w:rPr>
+          <w:rFonts w:ascii="Bookman Old Style" w:cs="Bookman Old Style" w:eastAsia="Bookman Old Style" w:hAnsi="Bookman Old Style"/>
+          <w:sz w:val="22"/>
+          <w:szCs w:val="22"/>
+        </w:rPr>
+        <w:t xml:space="preserve"/>
+      </w:r>
+    </w:p>
+    <w:p>
+      <w:pPr>
+        <w:spacing w:line="276"/>
+        <w:ind w:firstLine="1133"/>
+        <w:jc w:val="both"/>
+      </w:pPr>
+      <w:r>
+        <w:rPr>
+          <w:rFonts w:ascii="Bookman Old Style" w:cs="Bookman Old Style" w:eastAsia="Bookman Old Style" w:hAnsi="Bookman Old Style"/>
+          <w:b/>
+          <w:bCs/>
+          <w:sz w:val="22"/>
+          <w:szCs w:val="22"/>
+        </w:rPr>
+        <w:t xml:space="preserve">Piso mensal do Índice ao controle social. </w:t>
+      </w:r>
+      <w:r>
+        <w:rPr>
+          <w:rFonts w:ascii="Bookman Old Style" w:cs="Bookman Old Style" w:eastAsia="Bookman Old Style" w:hAnsi="Bookman Old Style"/>
+          <w:sz w:val="22"/>
+          <w:szCs w:val="22"/>
+        </w:rPr>
+        <w:t xml:space="preserve">Estimando a base do Índice em doze parcelas, seriam </w:t>
+      </w:r>
+      <w:r>
+        <w:rPr>
+          <w:rFonts w:ascii="Bookman Old Style" w:cs="Bookman Old Style" w:eastAsia="Bookman Old Style" w:hAnsi="Bookman Old Style"/>
+          <w:b/>
+          <w:bCs/>
+          <w:sz w:val="22"/>
+          <w:szCs w:val="22"/>
+        </w:rPr>
+        <w:t xml:space="preserve">R$ 5.889,23</w:t>
+      </w:r>
+      <w:r>
+        <w:rPr>
+          <w:rFonts w:ascii="Bookman Old Style" w:cs="Bookman Old Style" w:eastAsia="Bookman Old Style" w:hAnsi="Bookman Old Style"/>
+          <w:sz w:val="22"/>
+          <w:szCs w:val="22"/>
+        </w:rPr>
+        <w:t xml:space="preserve"> devidos por competência. Nenhuma das doze tem demonstrativo publicado. A estimativa dimensiona, não acusa: o repasse real varia mês a mês e só a Consulta de Pagamentos do Fundo Nacional o revela.</w:t>
+      </w:r>
+    </w:p>
+    <w:p>
+      <w:r>
+        <w:br w:type="page"/>
+      </w:r>
+    </w:p>
+    <w:p>
+      <w:pPr>
+        <w:pStyle w:val="Heading1"/>
+        <w:spacing w:after="120" w:before="240"/>
+        <w:jc w:val="center"/>
+      </w:pPr>
+      <w:r>
+        <w:rPr>
+          <w:rFonts w:ascii="Bookman Old Style" w:cs="Bookman Old Style" w:eastAsia="Bookman Old Style" w:hAnsi="Bookman Old Style"/>
+          <w:b/>
+          <w:bCs/>
+          <w:sz w:val="26"/>
+          <w:szCs w:val="26"/>
+        </w:rPr>
+        <w:t xml:space="preserve">VI — Contas do Conselho Municipal de Assistência Social</w:t>
+      </w:r>
+    </w:p>
+    <w:p>
+      <w:pPr>
+        <w:spacing w:line="276"/>
+        <w:ind w:firstLine="1133"/>
+        <w:jc w:val="both"/>
+      </w:pPr>
+      <w:r>
+        <w:rPr>
+          <w:rFonts w:ascii="Bookman Old Style" w:cs="Bookman Old Style" w:eastAsia="Bookman Old Style" w:hAnsi="Bookman Old Style"/>
+          <w:sz w:val="22"/>
+          <w:szCs w:val="22"/>
+        </w:rPr>
+        <w:t xml:space="preserve">A ação 3650.0824401082.591 reserva </w:t>
+      </w:r>
+      <w:r>
+        <w:rPr>
+          <w:rFonts w:ascii="Bookman Old Style" w:cs="Bookman Old Style" w:eastAsia="Bookman Old Style" w:hAnsi="Bookman Old Style"/>
+          <w:b/>
+          <w:bCs/>
+          <w:sz w:val="22"/>
+          <w:szCs w:val="22"/>
+        </w:rPr>
+        <w:t xml:space="preserve">R$ 256.000,00</w:t>
+      </w:r>
+      <w:r>
+        <w:rPr>
+          <w:rFonts w:ascii="Bookman Old Style" w:cs="Bookman Old Style" w:eastAsia="Bookman Old Style" w:hAnsi="Bookman Old Style"/>
+          <w:sz w:val="22"/>
+          <w:szCs w:val="22"/>
+        </w:rPr>
+        <w:t xml:space="preserve"> ao Conselho em 2026, sendo </w:t>
+      </w:r>
+      <w:r>
+        <w:rPr>
+          <w:rFonts w:ascii="Bookman Old Style" w:cs="Bookman Old Style" w:eastAsia="Bookman Old Style" w:hAnsi="Bookman Old Style"/>
+          <w:b/>
+          <w:bCs/>
+          <w:sz w:val="22"/>
+          <w:szCs w:val="22"/>
+        </w:rPr>
+        <w:t xml:space="preserve">R$ 16.000,00</w:t>
+      </w:r>
+      <w:r>
+        <w:rPr>
+          <w:rFonts w:ascii="Bookman Old Style" w:cs="Bookman Old Style" w:eastAsia="Bookman Old Style" w:hAnsi="Bookman Old Style"/>
+          <w:sz w:val="22"/>
+          <w:szCs w:val="22"/>
+        </w:rPr>
+        <w:t xml:space="preserve"> da fonte federal e </w:t>
+      </w:r>
+      <w:r>
+        <w:rPr>
+          <w:rFonts w:ascii="Bookman Old Style" w:cs="Bookman Old Style" w:eastAsia="Bookman Old Style" w:hAnsi="Bookman Old Style"/>
+          <w:b/>
+          <w:bCs/>
+          <w:sz w:val="22"/>
+          <w:szCs w:val="22"/>
+        </w:rPr>
+        <w:t xml:space="preserve">R$ 240.000,00</w:t>
+      </w:r>
+      <w:r>
+        <w:rPr>
+          <w:rFonts w:ascii="Bookman Old Style" w:cs="Bookman Old Style" w:eastAsia="Bookman Old Style" w:hAnsi="Bookman Old Style"/>
+          <w:sz w:val="22"/>
+          <w:szCs w:val="22"/>
+        </w:rPr>
+        <w:t xml:space="preserve"> da fonte estadual. Em proporção ao Fundo que fiscaliza, são </w:t>
+      </w:r>
+      <w:r>
+        <w:rPr>
+          <w:rFonts w:ascii="Bookman Old Style" w:cs="Bookman Old Style" w:eastAsia="Bookman Old Style" w:hAnsi="Bookman Old Style"/>
+          <w:b/>
+          <w:bCs/>
+          <w:sz w:val="22"/>
+          <w:szCs w:val="22"/>
+        </w:rPr>
+        <w:t xml:space="preserve">1.1%</w:t>
+      </w:r>
+      <w:r>
+        <w:rPr>
+          <w:rFonts w:ascii="Bookman Old Style" w:cs="Bookman Old Style" w:eastAsia="Bookman Old Style" w:hAnsi="Bookman Old Style"/>
+          <w:sz w:val="22"/>
+          <w:szCs w:val="22"/>
+        </w:rPr>
+        <w:t xml:space="preserve">, contra </w:t>
+      </w:r>
+      <w:r>
+        <w:rPr>
+          <w:rFonts w:ascii="Bookman Old Style" w:cs="Bookman Old Style" w:eastAsia="Bookman Old Style" w:hAnsi="Bookman Old Style"/>
+          <w:b/>
+          <w:bCs/>
+          <w:sz w:val="22"/>
+          <w:szCs w:val="22"/>
+        </w:rPr>
+        <w:t xml:space="preserve">9.98%</w:t>
+      </w:r>
+      <w:r>
+        <w:rPr>
+          <w:rFonts w:ascii="Bookman Old Style" w:cs="Bookman Old Style" w:eastAsia="Bookman Old Style" w:hAnsi="Bookman Old Style"/>
+          <w:sz w:val="22"/>
+          <w:szCs w:val="22"/>
+        </w:rPr>
+        <w:t xml:space="preserve"> do Conselho Municipal do Idoso, na mesma Secretaria.</w:t>
+      </w:r>
+    </w:p>
+    <w:p>
+      <w:pPr>
+        <w:spacing w:line="276"/>
+      </w:pPr>
+      <w:r>
+        <w:rPr>
+          <w:rFonts w:ascii="Bookman Old Style" w:cs="Bookman Old Style" w:eastAsia="Bookman Old Style" w:hAnsi="Bookman Old Style"/>
+          <w:sz w:val="22"/>
+          <w:szCs w:val="22"/>
+        </w:rPr>
+        <w:t xml:space="preserve"/>
+      </w:r>
+    </w:p>
+    <w:p>
+      <w:pPr>
+        <w:spacing w:after="60"/>
+        <w:jc w:val="center"/>
+      </w:pPr>
+      <w:r>
+        <w:rPr>
+          <w:rFonts w:ascii="Bookman Old Style" w:cs="Bookman Old Style" w:eastAsia="Bookman Old Style" w:hAnsi="Bookman Old Style"/>
+          <w:b/>
+          <w:bCs/>
+          <w:sz w:val="20"/>
+          <w:szCs w:val="20"/>
+        </w:rPr>
+        <w:t xml:space="preserve">Rubricas do Conselho</w:t>
+      </w:r>
+    </w:p>
+    <w:tbl>
+      <w:tblPr>
+        <w:tblW w:type="dxa" w:w="8700"/>
+        <w:tblBorders>
+          <w:top w:val="single" w:color="auto" w:sz="4"/>
+          <w:left w:val="single" w:color="auto" w:sz="4"/>
+          <w:bottom w:val="single" w:color="auto" w:sz="4"/>
+          <w:right w:val="single" w:color="auto" w:sz="4"/>
+          <w:insideH w:val="single" w:color="auto" w:sz="4"/>
+          <w:insideV w:val="single" w:color="auto" w:sz="4"/>
+        </w:tblBorders>
+      </w:tblPr>
+      <w:tblGrid>
+        <w:gridCol w:w="1900"/>
+        <w:gridCol w:w="4800"/>
+        <w:gridCol w:w="2000"/>
+      </w:tblGrid>
+      <w:tr>
+        <w:tc>
+          <w:tcPr>
+            <w:tcW w:type="dxa" w:w="1900"/>
+            <w:shd w:fill="EAE6DC" w:val="clear"/>
+          </w:tcPr>
+          <w:p>
+            <w:pPr>
+              <w:jc w:val="left"/>
+            </w:pPr>
+            <w:r>
+              <w:rPr>
+                <w:rFonts w:ascii="Bookman Old Style" w:cs="Bookman Old Style" w:eastAsia="Bookman Old Style" w:hAnsi="Bookman Old Style"/>
+                <w:b/>
+                <w:bCs/>
+                <w:sz w:val="18"/>
+                <w:szCs w:val="18"/>
+              </w:rPr>
+              <w:t xml:space="preserve">Natureza</w:t>
+            </w:r>
+          </w:p>
+        </w:tc>
+        <w:tc>
+          <w:tcPr>
+            <w:tcW w:type="dxa" w:w="4800"/>
+            <w:shd w:fill="EAE6DC" w:val="clear"/>
+          </w:tcPr>
+          <w:p>
+            <w:pPr>
+              <w:jc w:val="left"/>
+            </w:pPr>
+            <w:r>
+              <w:rPr>
+                <w:rFonts w:ascii="Bookman Old Style" w:cs="Bookman Old Style" w:eastAsia="Bookman Old Style" w:hAnsi="Bookman Old Style"/>
+                <w:b/>
+                <w:bCs/>
+                <w:sz w:val="18"/>
+                <w:szCs w:val="18"/>
+              </w:rPr>
+              <w:t xml:space="preserve">Denominação</w:t>
+            </w:r>
+          </w:p>
+        </w:tc>
+        <w:tc>
+          <w:tcPr>
+            <w:tcW w:type="dxa" w:w="2000"/>
+            <w:shd w:fill="EAE6DC" w:val="clear"/>
+          </w:tcPr>
+          <w:p>
+            <w:pPr>
+              <w:jc w:val="left"/>
+            </w:pPr>
+            <w:r>
+              <w:rPr>
+                <w:rFonts w:ascii="Bookman Old Style" w:cs="Bookman Old Style" w:eastAsia="Bookman Old Style" w:hAnsi="Bookman Old Style"/>
+                <w:b/>
+                <w:bCs/>
+                <w:sz w:val="18"/>
+                <w:szCs w:val="18"/>
+              </w:rPr>
+              <w:t xml:space="preserve">Valor</w:t>
+            </w:r>
+          </w:p>
+        </w:tc>
+      </w:tr>
+      <w:tr>
+        <w:tc>
+          <w:tcPr>
+            <w:tcW w:type="dxa" w:w="1900"/>
+          </w:tcPr>
+          <w:p>
+            <w:pPr>
+              <w:jc w:val="left"/>
+            </w:pPr>
+            <w:r>
+              <w:rPr>
+                <w:rFonts w:ascii="Bookman Old Style" w:cs="Bookman Old Style" w:eastAsia="Bookman Old Style" w:hAnsi="Bookman Old Style"/>
+                <w:sz w:val="18"/>
+                <w:szCs w:val="18"/>
+              </w:rPr>
+              <w:t xml:space="preserve">3.3.90.39.00</w:t>
+            </w:r>
+          </w:p>
+        </w:tc>
+        <w:tc>
+          <w:tcPr>
+            <w:tcW w:type="dxa" w:w="4800"/>
+          </w:tcPr>
+          <w:p>
+            <w:pPr>
+              <w:jc w:val="left"/>
+            </w:pPr>
+            <w:r>
+              <w:rPr>
+                <w:rFonts w:ascii="Bookman Old Style" w:cs="Bookman Old Style" w:eastAsia="Bookman Old Style" w:hAnsi="Bookman Old Style"/>
+                <w:sz w:val="18"/>
+                <w:szCs w:val="18"/>
+              </w:rPr>
+              <w:t xml:space="preserve">Outros serviços de terceiros — pessoa jurídica</w:t>
+            </w:r>
+          </w:p>
+        </w:tc>
+        <w:tc>
+          <w:tcPr>
+            <w:tcW w:type="dxa" w:w="2000"/>
+          </w:tcPr>
+          <w:p>
+            <w:pPr>
+              <w:jc w:val="right"/>
+            </w:pPr>
+            <w:r>
+              <w:rPr>
+                <w:rFonts w:ascii="Bookman Old Style" w:cs="Bookman Old Style" w:eastAsia="Bookman Old Style" w:hAnsi="Bookman Old Style"/>
+                <w:sz w:val="18"/>
+                <w:szCs w:val="18"/>
+              </w:rPr>
+              <w:t xml:space="preserve">R$ 131.000,00</w:t>
+            </w:r>
+          </w:p>
+        </w:tc>
+      </w:tr>
+      <w:tr>
+        <w:tc>
+          <w:tcPr>
+            <w:tcW w:type="dxa" w:w="1900"/>
+          </w:tcPr>
+          <w:p>
+            <w:pPr>
+              <w:jc w:val="left"/>
+            </w:pPr>
+            <w:r>
+              <w:rPr>
+                <w:rFonts w:ascii="Bookman Old Style" w:cs="Bookman Old Style" w:eastAsia="Bookman Old Style" w:hAnsi="Bookman Old Style"/>
+                <w:sz w:val="18"/>
+                <w:szCs w:val="18"/>
+              </w:rPr>
+              <w:t xml:space="preserve">3.3.90.30.00</w:t>
+            </w:r>
+          </w:p>
+        </w:tc>
+        <w:tc>
+          <w:tcPr>
+            <w:tcW w:type="dxa" w:w="4800"/>
+          </w:tcPr>
+          <w:p>
+            <w:pPr>
+              <w:jc w:val="left"/>
+            </w:pPr>
+            <w:r>
+              <w:rPr>
+                <w:rFonts w:ascii="Bookman Old Style" w:cs="Bookman Old Style" w:eastAsia="Bookman Old Style" w:hAnsi="Bookman Old Style"/>
+                <w:sz w:val="18"/>
+                <w:szCs w:val="18"/>
+              </w:rPr>
+              <w:t xml:space="preserve">Material de consumo</w:t>
+            </w:r>
+          </w:p>
+        </w:tc>
+        <w:tc>
+          <w:tcPr>
+            <w:tcW w:type="dxa" w:w="2000"/>
+          </w:tcPr>
+          <w:p>
+            <w:pPr>
+              <w:jc w:val="right"/>
+            </w:pPr>
+            <w:r>
+              <w:rPr>
+                <w:rFonts w:ascii="Bookman Old Style" w:cs="Bookman Old Style" w:eastAsia="Bookman Old Style" w:hAnsi="Bookman Old Style"/>
+                <w:sz w:val="18"/>
+                <w:szCs w:val="18"/>
+              </w:rPr>
+              <w:t xml:space="preserve">R$ 58.000,00</w:t>
+            </w:r>
+          </w:p>
+        </w:tc>
+      </w:tr>
+      <w:tr>
+        <w:tc>
+          <w:tcPr>
+            <w:tcW w:type="dxa" w:w="1900"/>
+          </w:tcPr>
+          <w:p>
+            <w:pPr>
+              <w:jc w:val="left"/>
+            </w:pPr>
+            <w:r>
+              <w:rPr>
+                <w:rFonts w:ascii="Bookman Old Style" w:cs="Bookman Old Style" w:eastAsia="Bookman Old Style" w:hAnsi="Bookman Old Style"/>
+                <w:sz w:val="18"/>
+                <w:szCs w:val="18"/>
+              </w:rPr>
+              <w:t xml:space="preserve">4.4.90.52.00</w:t>
+            </w:r>
+          </w:p>
+        </w:tc>
+        <w:tc>
+          <w:tcPr>
+            <w:tcW w:type="dxa" w:w="4800"/>
+          </w:tcPr>
+          <w:p>
+            <w:pPr>
+              <w:jc w:val="left"/>
+            </w:pPr>
+            <w:r>
+              <w:rPr>
+                <w:rFonts w:ascii="Bookman Old Style" w:cs="Bookman Old Style" w:eastAsia="Bookman Old Style" w:hAnsi="Bookman Old Style"/>
+                <w:sz w:val="18"/>
+                <w:szCs w:val="18"/>
+              </w:rPr>
+              <w:t xml:space="preserve">Equipamentos e material permanente</w:t>
+            </w:r>
+          </w:p>
+        </w:tc>
+        <w:tc>
+          <w:tcPr>
+            <w:tcW w:type="dxa" w:w="2000"/>
+          </w:tcPr>
+          <w:p>
+            <w:pPr>
+              <w:jc w:val="right"/>
+            </w:pPr>
+            <w:r>
+              <w:rPr>
+                <w:rFonts w:ascii="Bookman Old Style" w:cs="Bookman Old Style" w:eastAsia="Bookman Old Style" w:hAnsi="Bookman Old Style"/>
+                <w:sz w:val="18"/>
+                <w:szCs w:val="18"/>
+              </w:rPr>
+              <w:t xml:space="preserve">R$ 47.000,00</w:t>
+            </w:r>
+          </w:p>
+        </w:tc>
+      </w:tr>
+      <w:tr>
+        <w:tc>
+          <w:tcPr>
+            <w:tcW w:type="dxa" w:w="1900"/>
+          </w:tcPr>
+          <w:p>
+            <w:pPr>
+              <w:jc w:val="left"/>
+            </w:pPr>
+            <w:r>
+              <w:rPr>
+                <w:rFonts w:ascii="Bookman Old Style" w:cs="Bookman Old Style" w:eastAsia="Bookman Old Style" w:hAnsi="Bookman Old Style"/>
+                <w:sz w:val="18"/>
+                <w:szCs w:val="18"/>
+              </w:rPr>
+              <w:t xml:space="preserve">3.3.90.40.00</w:t>
+            </w:r>
+          </w:p>
+        </w:tc>
+        <w:tc>
+          <w:tcPr>
+            <w:tcW w:type="dxa" w:w="4800"/>
+          </w:tcPr>
+          <w:p>
+            <w:pPr>
+              <w:jc w:val="left"/>
+            </w:pPr>
+            <w:r>
+              <w:rPr>
+                <w:rFonts w:ascii="Bookman Old Style" w:cs="Bookman Old Style" w:eastAsia="Bookman Old Style" w:hAnsi="Bookman Old Style"/>
+                <w:sz w:val="18"/>
+                <w:szCs w:val="18"/>
+              </w:rPr>
+              <w:t xml:space="preserve">Serviços de tecnologia da informação</w:t>
+            </w:r>
+          </w:p>
+        </w:tc>
+        <w:tc>
+          <w:tcPr>
+            <w:tcW w:type="dxa" w:w="2000"/>
+          </w:tcPr>
+          <w:p>
+            <w:pPr>
+              <w:jc w:val="right"/>
+            </w:pPr>
+            <w:r>
+              <w:rPr>
+                <w:rFonts w:ascii="Bookman Old Style" w:cs="Bookman Old Style" w:eastAsia="Bookman Old Style" w:hAnsi="Bookman Old Style"/>
+                <w:sz w:val="18"/>
+                <w:szCs w:val="18"/>
+              </w:rPr>
+              <w:t xml:space="preserve">R$ 15.000,00</w:t>
+            </w:r>
+          </w:p>
+        </w:tc>
+      </w:tr>
+      <w:tr>
+        <w:tc>
+          <w:tcPr>
+            <w:tcW w:type="dxa" w:w="1900"/>
+          </w:tcPr>
+          <w:p>
+            <w:pPr>
+              <w:jc w:val="left"/>
+            </w:pPr>
+            <w:r>
+              <w:rPr>
+                <w:rFonts w:ascii="Bookman Old Style" w:cs="Bookman Old Style" w:eastAsia="Bookman Old Style" w:hAnsi="Bookman Old Style"/>
+                <w:sz w:val="18"/>
+                <w:szCs w:val="18"/>
+              </w:rPr>
+              <w:t xml:space="preserve">3.3.90.36.00</w:t>
+            </w:r>
+          </w:p>
+        </w:tc>
+        <w:tc>
+          <w:tcPr>
+            <w:tcW w:type="dxa" w:w="4800"/>
+          </w:tcPr>
+          <w:p>
+            <w:pPr>
+              <w:jc w:val="left"/>
+            </w:pPr>
+            <w:r>
+              <w:rPr>
+                <w:rFonts w:ascii="Bookman Old Style" w:cs="Bookman Old Style" w:eastAsia="Bookman Old Style" w:hAnsi="Bookman Old Style"/>
+                <w:sz w:val="18"/>
+                <w:szCs w:val="18"/>
+              </w:rPr>
+              <w:t xml:space="preserve">Outros serviços de terceiros — pessoa física (dotação simbólica)</w:t>
+            </w:r>
+          </w:p>
+        </w:tc>
+        <w:tc>
+          <w:tcPr>
+            <w:tcW w:type="dxa" w:w="2000"/>
+          </w:tcPr>
+          <w:p>
+            <w:pPr>
+              <w:jc w:val="right"/>
+            </w:pPr>
+            <w:r>
+              <w:rPr>
+                <w:rFonts w:ascii="Bookman Old Style" w:cs="Bookman Old Style" w:eastAsia="Bookman Old Style" w:hAnsi="Bookman Old Style"/>
+                <w:sz w:val="18"/>
+                <w:szCs w:val="18"/>
+              </w:rPr>
+              <w:t xml:space="preserve">R$ 2.000,00</w:t>
+            </w:r>
+          </w:p>
+        </w:tc>
+      </w:tr>
+      <w:tr>
+        <w:tc>
+          <w:tcPr>
+            <w:tcW w:type="dxa" w:w="1900"/>
+          </w:tcPr>
+          <w:p>
+            <w:pPr>
+              <w:jc w:val="left"/>
+            </w:pPr>
+            <w:r>
+              <w:rPr>
+                <w:rFonts w:ascii="Bookman Old Style" w:cs="Bookman Old Style" w:eastAsia="Bookman Old Style" w:hAnsi="Bookman Old Style"/>
+                <w:sz w:val="18"/>
+                <w:szCs w:val="18"/>
+              </w:rPr>
+              <w:t xml:space="preserve">3.3.90.92.00</w:t>
+            </w:r>
+          </w:p>
+        </w:tc>
+        <w:tc>
+          <w:tcPr>
+            <w:tcW w:type="dxa" w:w="4800"/>
+          </w:tcPr>
+          <w:p>
+            <w:pPr>
+              <w:jc w:val="left"/>
+            </w:pPr>
+            <w:r>
+              <w:rPr>
+                <w:rFonts w:ascii="Bookman Old Style" w:cs="Bookman Old Style" w:eastAsia="Bookman Old Style" w:hAnsi="Bookman Old Style"/>
+                <w:sz w:val="18"/>
+                <w:szCs w:val="18"/>
+              </w:rPr>
+              <w:t xml:space="preserve">Despesas de exercícios anteriores (dotação simbólica)</w:t>
+            </w:r>
+          </w:p>
+        </w:tc>
+        <w:tc>
+          <w:tcPr>
+            <w:tcW w:type="dxa" w:w="2000"/>
+          </w:tcPr>
+          <w:p>
+            <w:pPr>
+              <w:jc w:val="right"/>
+            </w:pPr>
+            <w:r>
+              <w:rPr>
+                <w:rFonts w:ascii="Bookman Old Style" w:cs="Bookman Old Style" w:eastAsia="Bookman Old Style" w:hAnsi="Bookman Old Style"/>
+                <w:sz w:val="18"/>
+                <w:szCs w:val="18"/>
+              </w:rPr>
+              <w:t xml:space="preserve">R$ 2.000,00</w:t>
+            </w:r>
+          </w:p>
+        </w:tc>
+      </w:tr>
+      <w:tr>
+        <w:tc>
+          <w:tcPr>
+            <w:tcW w:type="dxa" w:w="1900"/>
+          </w:tcPr>
+          <w:p>
+            <w:pPr>
+              <w:jc w:val="left"/>
+            </w:pPr>
+            <w:r>
+              <w:rPr>
+                <w:rFonts w:ascii="Bookman Old Style" w:cs="Bookman Old Style" w:eastAsia="Bookman Old Style" w:hAnsi="Bookman Old Style"/>
+                <w:sz w:val="18"/>
+                <w:szCs w:val="18"/>
+              </w:rPr>
+              <w:t xml:space="preserve">4.4.90.51.00</w:t>
+            </w:r>
+          </w:p>
+        </w:tc>
+        <w:tc>
+          <w:tcPr>
+            <w:tcW w:type="dxa" w:w="4800"/>
+          </w:tcPr>
+          <w:p>
+            <w:pPr>
+              <w:jc w:val="left"/>
+            </w:pPr>
+            <w:r>
+              <w:rPr>
+                <w:rFonts w:ascii="Bookman Old Style" w:cs="Bookman Old Style" w:eastAsia="Bookman Old Style" w:hAnsi="Bookman Old Style"/>
+                <w:sz w:val="18"/>
+                <w:szCs w:val="18"/>
+              </w:rPr>
+              <w:t xml:space="preserve">Obras e instalações (dotação simbólica)</w:t>
+            </w:r>
+          </w:p>
+        </w:tc>
+        <w:tc>
+          <w:tcPr>
+            <w:tcW w:type="dxa" w:w="2000"/>
+          </w:tcPr>
+          <w:p>
+            <w:pPr>
+              <w:jc w:val="right"/>
+            </w:pPr>
+            <w:r>
+              <w:rPr>
+                <w:rFonts w:ascii="Bookman Old Style" w:cs="Bookman Old Style" w:eastAsia="Bookman Old Style" w:hAnsi="Bookman Old Style"/>
+                <w:sz w:val="18"/>
+                <w:szCs w:val="18"/>
+              </w:rPr>
+              <w:t xml:space="preserve">R$ 1.000,00</w:t>
+            </w:r>
+          </w:p>
+        </w:tc>
+      </w:tr>
+    </w:tbl>
+    <w:p>
+      <w:pPr>
+        <w:spacing w:line="276"/>
+      </w:pPr>
+      <w:r>
+        <w:rPr>
+          <w:rFonts w:ascii="Bookman Old Style" w:cs="Bookman Old Style" w:eastAsia="Bookman Old Style" w:hAnsi="Bookman Old Style"/>
+          <w:sz w:val="22"/>
+          <w:szCs w:val="22"/>
+        </w:rPr>
+        <w:t xml:space="preserve"/>
+      </w:r>
+    </w:p>
+    <w:p>
+      <w:pPr>
+        <w:spacing w:after="60"/>
+        <w:jc w:val="center"/>
+      </w:pPr>
+      <w:r>
+        <w:rPr>
+          <w:rFonts w:ascii="Bookman Old Style" w:cs="Bookman Old Style" w:eastAsia="Bookman Old Style" w:hAnsi="Bookman Old Style"/>
+          <w:b/>
+          <w:bCs/>
+          <w:sz w:val="20"/>
+          <w:szCs w:val="20"/>
+        </w:rPr>
+        <w:t xml:space="preserve">Apoio ao conselheiro para exercício da função</w:t>
+      </w:r>
+    </w:p>
+    <w:tbl>
+      <w:tblPr>
+        <w:tblW w:type="dxa" w:w="8700"/>
+        <w:tblBorders>
+          <w:top w:val="single" w:color="auto" w:sz="4"/>
+          <w:left w:val="single" w:color="auto" w:sz="4"/>
+          <w:bottom w:val="single" w:color="auto" w:sz="4"/>
+          <w:right w:val="single" w:color="auto" w:sz="4"/>
+          <w:insideH w:val="single" w:color="auto" w:sz="4"/>
+          <w:insideV w:val="single" w:color="auto" w:sz="4"/>
+        </w:tblBorders>
+      </w:tblPr>
+      <w:tblGrid>
+        <w:gridCol w:w="4200"/>
+        <w:gridCol w:w="2500"/>
+        <w:gridCol w:w="2000"/>
+      </w:tblGrid>
+      <w:tr>
+        <w:tc>
+          <w:tcPr>
+            <w:tcW w:type="dxa" w:w="4200"/>
+            <w:shd w:fill="EAE6DC" w:val="clear"/>
+          </w:tcPr>
+          <w:p>
+            <w:pPr>
+              <w:jc w:val="left"/>
+            </w:pPr>
+            <w:r>
+              <w:rPr>
+                <w:rFonts w:ascii="Bookman Old Style" w:cs="Bookman Old Style" w:eastAsia="Bookman Old Style" w:hAnsi="Bookman Old Style"/>
+                <w:b/>
+                <w:bCs/>
+                <w:sz w:val="18"/>
+                <w:szCs w:val="18"/>
+              </w:rPr>
+              <w:t xml:space="preserve">Espécie de apoio</w:t>
+            </w:r>
+          </w:p>
+        </w:tc>
+        <w:tc>
+          <w:tcPr>
+            <w:tcW w:type="dxa" w:w="2500"/>
+            <w:shd w:fill="EAE6DC" w:val="clear"/>
+          </w:tcPr>
+          <w:p>
+            <w:pPr>
+              <w:jc w:val="left"/>
+            </w:pPr>
+            <w:r>
+              <w:rPr>
+                <w:rFonts w:ascii="Bookman Old Style" w:cs="Bookman Old Style" w:eastAsia="Bookman Old Style" w:hAnsi="Bookman Old Style"/>
+                <w:b/>
+                <w:bCs/>
+                <w:sz w:val="18"/>
+                <w:szCs w:val="18"/>
+              </w:rPr>
+              <w:t xml:space="preserve">Situação</w:t>
+            </w:r>
+          </w:p>
+        </w:tc>
+        <w:tc>
+          <w:tcPr>
+            <w:tcW w:type="dxa" w:w="2000"/>
+            <w:shd w:fill="EAE6DC" w:val="clear"/>
+          </w:tcPr>
+          <w:p>
+            <w:pPr>
+              <w:jc w:val="left"/>
+            </w:pPr>
+            <w:r>
+              <w:rPr>
+                <w:rFonts w:ascii="Bookman Old Style" w:cs="Bookman Old Style" w:eastAsia="Bookman Old Style" w:hAnsi="Bookman Old Style"/>
+                <w:b/>
+                <w:bCs/>
+                <w:sz w:val="18"/>
+                <w:szCs w:val="18"/>
+              </w:rPr>
+              <w:t xml:space="preserve">Valor</w:t>
+            </w:r>
+          </w:p>
+        </w:tc>
+      </w:tr>
+      <w:tr>
+        <w:tc>
+          <w:tcPr>
+            <w:tcW w:type="dxa" w:w="4200"/>
+          </w:tcPr>
+          <w:p>
+            <w:pPr>
+              <w:jc w:val="left"/>
+            </w:pPr>
+            <w:r>
+              <w:rPr>
+                <w:rFonts w:ascii="Bookman Old Style" w:cs="Bookman Old Style" w:eastAsia="Bookman Old Style" w:hAnsi="Bookman Old Style"/>
+                <w:sz w:val="18"/>
+                <w:szCs w:val="18"/>
+              </w:rPr>
+              <w:t xml:space="preserve">Material de consumo</w:t>
+            </w:r>
+          </w:p>
+        </w:tc>
+        <w:tc>
+          <w:tcPr>
+            <w:tcW w:type="dxa" w:w="2500"/>
+          </w:tcPr>
+          <w:p>
+            <w:pPr>
+              <w:jc w:val="left"/>
+            </w:pPr>
+            <w:r>
+              <w:rPr>
+                <w:rFonts w:ascii="Bookman Old Style" w:cs="Bookman Old Style" w:eastAsia="Bookman Old Style" w:hAnsi="Bookman Old Style"/>
+                <w:sz w:val="18"/>
+                <w:szCs w:val="18"/>
+              </w:rPr>
+              <w:t xml:space="preserve">previsto</w:t>
+            </w:r>
+          </w:p>
+        </w:tc>
+        <w:tc>
+          <w:tcPr>
+            <w:tcW w:type="dxa" w:w="2000"/>
+          </w:tcPr>
+          <w:p>
+            <w:pPr>
+              <w:jc w:val="right"/>
+            </w:pPr>
+            <w:r>
+              <w:rPr>
+                <w:rFonts w:ascii="Bookman Old Style" w:cs="Bookman Old Style" w:eastAsia="Bookman Old Style" w:hAnsi="Bookman Old Style"/>
+                <w:sz w:val="18"/>
+                <w:szCs w:val="18"/>
+              </w:rPr>
+              <w:t xml:space="preserve">R$ 58.000,00</w:t>
+            </w:r>
+          </w:p>
+        </w:tc>
+      </w:tr>
+      <w:tr>
+        <w:tc>
+          <w:tcPr>
+            <w:tcW w:type="dxa" w:w="4200"/>
+          </w:tcPr>
+          <w:p>
+            <w:pPr>
+              <w:jc w:val="left"/>
+            </w:pPr>
+            <w:r>
+              <w:rPr>
+                <w:rFonts w:ascii="Bookman Old Style" w:cs="Bookman Old Style" w:eastAsia="Bookman Old Style" w:hAnsi="Bookman Old Style"/>
+                <w:sz w:val="18"/>
+                <w:szCs w:val="18"/>
+              </w:rPr>
+              <w:t xml:space="preserve">Estrutura, equipamento e tecnologia</w:t>
+            </w:r>
+          </w:p>
+        </w:tc>
+        <w:tc>
+          <w:tcPr>
+            <w:tcW w:type="dxa" w:w="2500"/>
+          </w:tcPr>
+          <w:p>
+            <w:pPr>
+              <w:jc w:val="left"/>
+            </w:pPr>
+            <w:r>
+              <w:rPr>
+                <w:rFonts w:ascii="Bookman Old Style" w:cs="Bookman Old Style" w:eastAsia="Bookman Old Style" w:hAnsi="Bookman Old Style"/>
+                <w:sz w:val="18"/>
+                <w:szCs w:val="18"/>
+              </w:rPr>
+              <w:t xml:space="preserve">previsto</w:t>
+            </w:r>
+          </w:p>
+        </w:tc>
+        <w:tc>
+          <w:tcPr>
+            <w:tcW w:type="dxa" w:w="2000"/>
+          </w:tcPr>
+          <w:p>
+            <w:pPr>
+              <w:jc w:val="right"/>
+            </w:pPr>
+            <w:r>
+              <w:rPr>
+                <w:rFonts w:ascii="Bookman Old Style" w:cs="Bookman Old Style" w:eastAsia="Bookman Old Style" w:hAnsi="Bookman Old Style"/>
+                <w:sz w:val="18"/>
+                <w:szCs w:val="18"/>
+              </w:rPr>
+              <w:t xml:space="preserve">R$ 63.000,00</w:t>
+            </w:r>
+          </w:p>
+        </w:tc>
+      </w:tr>
+      <w:tr>
+        <w:tc>
+          <w:tcPr>
+            <w:tcW w:type="dxa" w:w="4200"/>
+          </w:tcPr>
+          <w:p>
+            <w:pPr>
+              <w:jc w:val="left"/>
+            </w:pPr>
+            <w:r>
+              <w:rPr>
+                <w:rFonts w:ascii="Bookman Old Style" w:cs="Bookman Old Style" w:eastAsia="Bookman Old Style" w:hAnsi="Bookman Old Style"/>
+                <w:sz w:val="18"/>
+                <w:szCs w:val="18"/>
+              </w:rPr>
+              <w:t xml:space="preserve">Serviços de terceiros</w:t>
+            </w:r>
+          </w:p>
+        </w:tc>
+        <w:tc>
+          <w:tcPr>
+            <w:tcW w:type="dxa" w:w="2500"/>
+          </w:tcPr>
+          <w:p>
+            <w:pPr>
+              <w:jc w:val="left"/>
+            </w:pPr>
+            <w:r>
+              <w:rPr>
+                <w:rFonts w:ascii="Bookman Old Style" w:cs="Bookman Old Style" w:eastAsia="Bookman Old Style" w:hAnsi="Bookman Old Style"/>
+                <w:sz w:val="18"/>
+                <w:szCs w:val="18"/>
+              </w:rPr>
+              <w:t xml:space="preserve">previsto</w:t>
+            </w:r>
+          </w:p>
+        </w:tc>
+        <w:tc>
+          <w:tcPr>
+            <w:tcW w:type="dxa" w:w="2000"/>
+          </w:tcPr>
+          <w:p>
+            <w:pPr>
+              <w:jc w:val="right"/>
+            </w:pPr>
+            <w:r>
+              <w:rPr>
+                <w:rFonts w:ascii="Bookman Old Style" w:cs="Bookman Old Style" w:eastAsia="Bookman Old Style" w:hAnsi="Bookman Old Style"/>
+                <w:sz w:val="18"/>
+                <w:szCs w:val="18"/>
+              </w:rPr>
+              <w:t xml:space="preserve">R$ 133.000,00</w:t>
+            </w:r>
+          </w:p>
+        </w:tc>
+      </w:tr>
+      <w:tr>
+        <w:tc>
+          <w:tcPr>
+            <w:tcW w:type="dxa" w:w="4200"/>
+          </w:tcPr>
+          <w:p>
+            <w:pPr>
+              <w:jc w:val="left"/>
+            </w:pPr>
+            <w:r>
+              <w:rPr>
+                <w:rFonts w:ascii="Bookman Old Style" w:cs="Bookman Old Style" w:eastAsia="Bookman Old Style" w:hAnsi="Bookman Old Style"/>
+                <w:sz w:val="18"/>
+                <w:szCs w:val="18"/>
+              </w:rPr>
+              <w:t xml:space="preserve">Diárias e passagens</w:t>
+            </w:r>
+          </w:p>
+        </w:tc>
+        <w:tc>
+          <w:tcPr>
+            <w:tcW w:type="dxa" w:w="2500"/>
+          </w:tcPr>
+          <w:p>
+            <w:pPr>
+              <w:jc w:val="left"/>
+            </w:pPr>
+            <w:r>
+              <w:rPr>
+                <w:rFonts w:ascii="Bookman Old Style" w:cs="Bookman Old Style" w:eastAsia="Bookman Old Style" w:hAnsi="Bookman Old Style"/>
+                <w:sz w:val="18"/>
+                <w:szCs w:val="18"/>
+              </w:rPr>
+              <w:t xml:space="preserve">AUSENTE</w:t>
+            </w:r>
+          </w:p>
+        </w:tc>
+        <w:tc>
+          <w:tcPr>
+            <w:tcW w:type="dxa" w:w="2000"/>
+          </w:tcPr>
+          <w:p>
+            <w:pPr>
+              <w:jc w:val="right"/>
+            </w:pPr>
+            <w:r>
+              <w:rPr>
+                <w:rFonts w:ascii="Bookman Old Style" w:cs="Bookman Old Style" w:eastAsia="Bookman Old Style" w:hAnsi="Bookman Old Style"/>
+                <w:sz w:val="18"/>
+                <w:szCs w:val="18"/>
+              </w:rPr>
+              <w:t xml:space="preserve">R$ 0,00</w:t>
+            </w:r>
+          </w:p>
+        </w:tc>
+      </w:tr>
+      <w:tr>
+        <w:tc>
+          <w:tcPr>
+            <w:tcW w:type="dxa" w:w="4200"/>
+          </w:tcPr>
+          <w:p>
+            <w:pPr>
+              <w:jc w:val="left"/>
+            </w:pPr>
+            <w:r>
+              <w:rPr>
+                <w:rFonts w:ascii="Bookman Old Style" w:cs="Bookman Old Style" w:eastAsia="Bookman Old Style" w:hAnsi="Bookman Old Style"/>
+                <w:sz w:val="18"/>
+                <w:szCs w:val="18"/>
+              </w:rPr>
+              <w:t xml:space="preserve">Auxílio financeiro ao conselheiro</w:t>
+            </w:r>
+          </w:p>
+        </w:tc>
+        <w:tc>
+          <w:tcPr>
+            <w:tcW w:type="dxa" w:w="2500"/>
+          </w:tcPr>
+          <w:p>
+            <w:pPr>
+              <w:jc w:val="left"/>
+            </w:pPr>
+            <w:r>
+              <w:rPr>
+                <w:rFonts w:ascii="Bookman Old Style" w:cs="Bookman Old Style" w:eastAsia="Bookman Old Style" w:hAnsi="Bookman Old Style"/>
+                <w:sz w:val="18"/>
+                <w:szCs w:val="18"/>
+              </w:rPr>
+              <w:t xml:space="preserve">AUSENTE</w:t>
+            </w:r>
+          </w:p>
+        </w:tc>
+        <w:tc>
+          <w:tcPr>
+            <w:tcW w:type="dxa" w:w="2000"/>
+          </w:tcPr>
+          <w:p>
+            <w:pPr>
+              <w:jc w:val="right"/>
+            </w:pPr>
+            <w:r>
+              <w:rPr>
+                <w:rFonts w:ascii="Bookman Old Style" w:cs="Bookman Old Style" w:eastAsia="Bookman Old Style" w:hAnsi="Bookman Old Style"/>
+                <w:sz w:val="18"/>
+                <w:szCs w:val="18"/>
+              </w:rPr>
+              <w:t xml:space="preserve">R$ 0,00</w:t>
+            </w:r>
+          </w:p>
+        </w:tc>
+      </w:tr>
+      <w:tr>
+        <w:tc>
+          <w:tcPr>
+            <w:tcW w:type="dxa" w:w="4200"/>
+          </w:tcPr>
+          <w:p>
+            <w:pPr>
+              <w:jc w:val="left"/>
+            </w:pPr>
+            <w:r>
+              <w:rPr>
+                <w:rFonts w:ascii="Bookman Old Style" w:cs="Bookman Old Style" w:eastAsia="Bookman Old Style" w:hAnsi="Bookman Old Style"/>
+                <w:sz w:val="18"/>
+                <w:szCs w:val="18"/>
+              </w:rPr>
+              <w:t xml:space="preserve">Consultoria e pessoal próprio</w:t>
+            </w:r>
+          </w:p>
+        </w:tc>
+        <w:tc>
+          <w:tcPr>
+            <w:tcW w:type="dxa" w:w="2500"/>
+          </w:tcPr>
+          <w:p>
+            <w:pPr>
+              <w:jc w:val="left"/>
+            </w:pPr>
+            <w:r>
+              <w:rPr>
+                <w:rFonts w:ascii="Bookman Old Style" w:cs="Bookman Old Style" w:eastAsia="Bookman Old Style" w:hAnsi="Bookman Old Style"/>
+                <w:sz w:val="18"/>
+                <w:szCs w:val="18"/>
+              </w:rPr>
+              <w:t xml:space="preserve">AUSENTE</w:t>
+            </w:r>
+          </w:p>
+        </w:tc>
+        <w:tc>
+          <w:tcPr>
+            <w:tcW w:type="dxa" w:w="2000"/>
+          </w:tcPr>
+          <w:p>
+            <w:pPr>
+              <w:jc w:val="right"/>
+            </w:pPr>
+            <w:r>
+              <w:rPr>
+                <w:rFonts w:ascii="Bookman Old Style" w:cs="Bookman Old Style" w:eastAsia="Bookman Old Style" w:hAnsi="Bookman Old Style"/>
+                <w:sz w:val="18"/>
+                <w:szCs w:val="18"/>
+              </w:rPr>
+              <w:t xml:space="preserve">R$ 0,00</w:t>
+            </w:r>
+          </w:p>
+        </w:tc>
+      </w:tr>
+    </w:tbl>
+    <w:p>
+      <w:pPr>
+        <w:spacing w:line="276"/>
+      </w:pPr>
+      <w:r>
+        <w:rPr>
+          <w:rFonts w:ascii="Bookman Old Style" w:cs="Bookman Old Style" w:eastAsia="Bookman Old Style" w:hAnsi="Bookman Old Style"/>
+          <w:sz w:val="22"/>
+          <w:szCs w:val="22"/>
+        </w:rPr>
+        <w:t xml:space="preserve"/>
+      </w:r>
+    </w:p>
+    <w:p>
+      <w:pPr>
+        <w:spacing w:line="276"/>
+        <w:ind w:firstLine="1133"/>
+        <w:jc w:val="both"/>
+      </w:pPr>
+      <w:r>
+        <w:rPr>
+          <w:rFonts w:ascii="Bookman Old Style" w:cs="Bookman Old Style" w:eastAsia="Bookman Old Style" w:hAnsi="Bookman Old Style"/>
+          <w:b/>
+          <w:bCs/>
+          <w:sz w:val="22"/>
+          <w:szCs w:val="22"/>
+        </w:rPr>
+        <w:t xml:space="preserve">Leitura. </w:t>
+      </w:r>
+      <w:r>
+        <w:rPr>
+          <w:rFonts w:ascii="Bookman Old Style" w:cs="Bookman Old Style" w:eastAsia="Bookman Old Style" w:hAnsi="Bookman Old Style"/>
+          <w:sz w:val="22"/>
+          <w:szCs w:val="22"/>
+        </w:rPr>
+        <w:t xml:space="preserve">O Conselho tem material, equipamento e serviços. Não tem diárias, não tem passagens, não tem auxílio financeiro ao conselheiro e não tem pessoal ou consultoria própria. Sem diárias e passagens, o conselheiro não participa de conferência fora do Município nem fiscaliza serviço in loco — duas atribuições que a lei lhe dá. Sem auxílio a pessoa física, a participação pesa desigualmente sobre o representante de usuário, que ocupa seis das quinze cadeiras da sociedade civil. E sem pessoal próprio, o apoio técnico depende inteiramente do órgão gestor, que é o fiscalizado.</w:t>
+      </w:r>
+    </w:p>
+    <w:p>
+      <w:r>
+        <w:br w:type="page"/>
+      </w:r>
+    </w:p>
+    <w:p>
+      <w:pPr>
+        <w:pStyle w:val="Heading1"/>
+        <w:spacing w:after="120" w:before="240"/>
+        <w:jc w:val="center"/>
+      </w:pPr>
+      <w:r>
+        <w:rPr>
+          <w:rFonts w:ascii="Bookman Old Style" w:cs="Bookman Old Style" w:eastAsia="Bookman Old Style" w:hAnsi="Bookman Old Style"/>
+          <w:b/>
+          <w:bCs/>
+          <w:sz w:val="26"/>
+          <w:szCs w:val="26"/>
+        </w:rPr>
+        <w:t xml:space="preserve">VII — Irregularidades Apuradas</w:t>
       </w:r>
     </w:p>
     <w:p>
@@ -5951,7 +7923,7 @@
         </w:rPr>
         <w:t xml:space="preserve">Diário Oficial do Município, Edição 8830, última edição publicada, 29/07/2026 — </w:t>
       </w:r>
-      <w:hyperlink w:history="1" r:id="rIdldfqw3n9l4etlgomkuxgm">
+      <w:hyperlink w:history="1" r:id="rId3kfvii1-s984i6ht4eh7z">
         <w:r>
           <w:rPr>
             <w:rStyle w:val="Hyperlink"/>
@@ -5979,7 +7951,7 @@
         </w:rPr>
         <w:t xml:space="preserve">Acervo do Diário Oficial coletado, 161 eventos entre 2025 e 2026, com digest de cada edição — </w:t>
       </w:r>
-      <w:hyperlink w:history="1" r:id="rIdwptu2na5iv2nqc2orhalc">
+      <w:hyperlink w:history="1" r:id="rIdn2ygo-t3cf-beghtntpc1">
         <w:r>
           <w:rPr>
             <w:rStyle w:val="Hyperlink"/>
@@ -6016,7 +7988,7 @@
         </w:rPr>
         <w:t xml:space="preserve">Onde deveria estar publicado. </w:t>
       </w:r>
-      <w:hyperlink w:history="1" r:id="rIdr1l5qggh9wm_vbn9yxibw">
+      <w:hyperlink w:history="1" r:id="rIdz_rwqxvpdo7v0bxngqngv">
         <w:r>
           <w:rPr>
             <w:rStyle w:val="Hyperlink"/>
@@ -6243,7 +8215,7 @@
         </w:rPr>
         <w:t xml:space="preserve">Acervo do Diário Oficial coletado, 161 eventos entre 2025 e 2026, com digest de cada edição — </w:t>
       </w:r>
-      <w:hyperlink w:history="1" r:id="rIdzafat3emtasi6-9lnkwkw">
+      <w:hyperlink w:history="1" r:id="rId0wggbda-axcr6wr-amufx">
         <w:r>
           <w:rPr>
             <w:rStyle w:val="Hyperlink"/>
@@ -6271,7 +8243,7 @@
         </w:rPr>
         <w:t xml:space="preserve">Sítio próprio do Conselho, sem documento posterior a dezembro de 2023 — </w:t>
       </w:r>
-      <w:hyperlink w:history="1" r:id="rIdoiw3d8i6_4tejbudtck3n">
+      <w:hyperlink w:history="1" r:id="rIdb10dq_bdncgwerh3e3fgc">
         <w:r>
           <w:rPr>
             <w:rStyle w:val="Hyperlink"/>
@@ -6308,7 +8280,7 @@
         </w:rPr>
         <w:t xml:space="preserve">Onde deveria estar publicado. </w:t>
       </w:r>
-      <w:hyperlink w:history="1" r:id="rIdbmc6ttc3xtmvpaumk4la4">
+      <w:hyperlink w:history="1" r:id="rIdxddg6vzgaueiitrgebyae">
         <w:r>
           <w:rPr>
             <w:rStyle w:val="Hyperlink"/>
@@ -6328,7 +8300,7 @@
         </w:rPr>
         <w:t xml:space="preserve">; </w:t>
       </w:r>
-      <w:hyperlink w:history="1" r:id="rIdbcl8tef7x6vqpwto6wmjj">
+      <w:hyperlink w:history="1" r:id="rIdq51qid80iylfkrkmbokmh">
         <w:r>
           <w:rPr>
             <w:rStyle w:val="Hyperlink"/>
@@ -6489,7 +8461,6 @@
           <w:sz w:val="24"/>
           <w:szCs w:val="24"/>
         </w:rPr>
-        <w:t xml:space="preserve">Receita e despesa</w:t>
       </w:r>
     </w:p>
     <w:p>
@@ -6506,6 +8477,193 @@
           <w:sz w:val="22"/>
           <w:szCs w:val="22"/>
         </w:rPr>
+        <w:t xml:space="preserve">CMAS-FIN-05 — Piso federal do Índice cumprido em 22,6%</w:t>
+      </w:r>
+    </w:p>
+    <w:p>
+      <w:pPr>
+        <w:spacing w:line="276"/>
+        <w:ind w:firstLine="1133"/>
+        <w:jc w:val="both"/>
+      </w:pPr>
+      <w:r>
+        <w:rPr>
+          <w:rFonts w:ascii="Bookman Old Style" w:cs="Bookman Old Style" w:eastAsia="Bookman Old Style" w:hAnsi="Bookman Old Style"/>
+          <w:b/>
+          <w:bCs/>
+          <w:sz w:val="22"/>
+          <w:szCs w:val="22"/>
+        </w:rPr>
+        <w:t xml:space="preserve">Valor envolvido. </w:t>
+      </w:r>
+      <w:r>
+        <w:rPr>
+          <w:rFonts w:ascii="Bookman Old Style" w:cs="Bookman Old Style" w:eastAsia="Bookman Old Style" w:hAnsi="Bookman Old Style"/>
+          <w:sz w:val="22"/>
+          <w:szCs w:val="22"/>
+        </w:rPr>
+        <w:t xml:space="preserve">Não quantificável sem os documentos faltantes.</w:t>
+      </w:r>
+      <w:r>
+        <w:rPr>
+          <w:rFonts w:ascii="Bookman Old Style" w:cs="Bookman Old Style" w:eastAsia="Bookman Old Style" w:hAnsi="Bookman Old Style"/>
+          <w:sz w:val="22"/>
+          <w:szCs w:val="22"/>
+        </w:rPr>
+        <w:t xml:space="preserve"/>
+      </w:r>
+    </w:p>
+    <w:p>
+      <w:pPr>
+        <w:spacing w:line="276"/>
+        <w:ind w:firstLine="1133"/>
+        <w:jc w:val="both"/>
+      </w:pPr>
+      <w:r>
+        <w:rPr>
+          <w:rFonts w:ascii="Bookman Old Style" w:cs="Bookman Old Style" w:eastAsia="Bookman Old Style" w:hAnsi="Bookman Old Style"/>
+          <w:b/>
+          <w:bCs/>
+          <w:sz w:val="22"/>
+          <w:szCs w:val="22"/>
+        </w:rPr>
+        <w:t xml:space="preserve">Documentos que faltam. </w:t>
+      </w:r>
+      <w:r>
+        <w:rPr>
+          <w:rFonts w:ascii="Bookman Old Style" w:cs="Bookman Old Style" w:eastAsia="Bookman Old Style" w:hAnsi="Bookman Old Style"/>
+          <w:sz w:val="22"/>
+          <w:szCs w:val="22"/>
+        </w:rPr>
+        <w:t xml:space="preserve">1) Consulta de Pagamentos do Fundo Nacional, por competência e bloco; 2) Extrato da conta específica do Índice de Gestão Descentralizada; 3) Prestação de contas quadrimestral prevista no artigo 6º, parágrafo 5º; 4) Quadro de Detalhamento com dotação identificada como fortalecimento do controle social.</w:t>
+      </w:r>
+    </w:p>
+    <w:p>
+      <w:pPr>
+        <w:spacing w:line="276"/>
+        <w:ind w:firstLine="1133"/>
+        <w:jc w:val="both"/>
+      </w:pPr>
+      <w:r>
+        <w:rPr>
+          <w:rFonts w:ascii="Bookman Old Style" w:cs="Bookman Old Style" w:eastAsia="Bookman Old Style" w:hAnsi="Bookman Old Style"/>
+          <w:b/>
+          <w:bCs/>
+          <w:sz w:val="22"/>
+          <w:szCs w:val="22"/>
+        </w:rPr>
+        <w:t xml:space="preserve">Justificativa. </w:t>
+      </w:r>
+      <w:r>
+        <w:rPr>
+          <w:rFonts w:ascii="Bookman Old Style" w:cs="Bookman Old Style" w:eastAsia="Bookman Old Style" w:hAnsi="Bookman Old Style"/>
+          <w:sz w:val="22"/>
+          <w:szCs w:val="22"/>
+        </w:rPr>
+        <w:t xml:space="preserve">Dos 256,000.00 da ação, apenas 16,000.00 vêm da fonte 1660, onde trafega o Índice de Gestão Descentralizada. O devido é 70,670.72. Os 240,000.00 de fonte estadual contam como outra fonte de financiamento, admitida na parte final do artigo 6º, mas não substituem o piso federal.</w:t>
+      </w:r>
+    </w:p>
+    <w:p>
+      <w:pPr>
+        <w:spacing w:line="276"/>
+        <w:ind w:firstLine="1133"/>
+        <w:jc w:val="both"/>
+      </w:pPr>
+      <w:r>
+        <w:rPr>
+          <w:rFonts w:ascii="Bookman Old Style" w:cs="Bookman Old Style" w:eastAsia="Bookman Old Style" w:hAnsi="Bookman Old Style"/>
+          <w:i/>
+          <w:iCs/>
+          <w:sz w:val="22"/>
+          <w:szCs w:val="22"/>
+        </w:rPr>
+        <w:t xml:space="preserve">Selo: </w:t>
+      </w:r>
+      <w:r>
+        <w:rPr>
+          <w:rFonts w:ascii="Bookman Old Style" w:cs="Bookman Old Style" w:eastAsia="Bookman Old Style" w:hAnsi="Bookman Old Style"/>
+          <w:i/>
+          <w:iCs/>
+          <w:sz w:val="22"/>
+          <w:szCs w:val="22"/>
+        </w:rPr>
+        <w:t xml:space="preserve">Confirmado</w:t>
+      </w:r>
+      <w:r>
+        <w:rPr>
+          <w:rFonts w:ascii="Bookman Old Style" w:cs="Bookman Old Style" w:eastAsia="Bookman Old Style" w:hAnsi="Bookman Old Style"/>
+          <w:i/>
+          <w:iCs/>
+          <w:sz w:val="22"/>
+          <w:szCs w:val="22"/>
+        </w:rPr>
+        <w:t xml:space="preserve">. Severidade: </w:t>
+      </w:r>
+      <w:r>
+        <w:rPr>
+          <w:rFonts w:ascii="Bookman Old Style" w:cs="Bookman Old Style" w:eastAsia="Bookman Old Style" w:hAnsi="Bookman Old Style"/>
+          <w:i/>
+          <w:iCs/>
+          <w:sz w:val="22"/>
+          <w:szCs w:val="22"/>
+        </w:rPr>
+        <w:t xml:space="preserve">Crítica</w:t>
+      </w:r>
+      <w:r>
+        <w:rPr>
+          <w:rFonts w:ascii="Bookman Old Style" w:cs="Bookman Old Style" w:eastAsia="Bookman Old Style" w:hAnsi="Bookman Old Style"/>
+          <w:i/>
+          <w:iCs/>
+          <w:sz w:val="22"/>
+          <w:szCs w:val="22"/>
+        </w:rPr>
+        <w:t xml:space="preserve">.</w:t>
+      </w:r>
+    </w:p>
+    <w:p>
+      <w:pPr>
+        <w:spacing w:line="276"/>
+      </w:pPr>
+      <w:r>
+        <w:rPr>
+          <w:rFonts w:ascii="Bookman Old Style" w:cs="Bookman Old Style" w:eastAsia="Bookman Old Style" w:hAnsi="Bookman Old Style"/>
+          <w:sz w:val="22"/>
+          <w:szCs w:val="22"/>
+        </w:rPr>
+        <w:t xml:space="preserve"/>
+      </w:r>
+    </w:p>
+    <w:p>
+      <w:pPr>
+        <w:pStyle w:val="Heading2"/>
+        <w:spacing w:after="120" w:before="240"/>
+        <w:jc w:val="center"/>
+      </w:pPr>
+      <w:r>
+        <w:rPr>
+          <w:rFonts w:ascii="Bookman Old Style" w:cs="Bookman Old Style" w:eastAsia="Bookman Old Style" w:hAnsi="Bookman Old Style"/>
+          <w:b/>
+          <w:bCs/>
+          <w:sz w:val="24"/>
+          <w:szCs w:val="24"/>
+        </w:rPr>
+        <w:t xml:space="preserve">Receita e despesa</w:t>
+      </w:r>
+    </w:p>
+    <w:p>
+      <w:pPr>
+        <w:pStyle w:val="Heading3"/>
+        <w:spacing w:after="100" w:before="220"/>
+        <w:jc w:val="center"/>
+      </w:pPr>
+      <w:r>
+        <w:rPr>
+          <w:rFonts w:ascii="Bookman Old Style" w:cs="Bookman Old Style" w:eastAsia="Bookman Old Style" w:hAnsi="Bookman Old Style"/>
+          <w:b/>
+          <w:bCs/>
+          <w:sz w:val="22"/>
+          <w:szCs w:val="22"/>
+        </w:rPr>
         <w:t xml:space="preserve">REC-01 — Aporte próprio do Município no Fundo é simbólico</w:t>
       </w:r>
     </w:p>
@@ -6568,7 +8726,7 @@
         </w:rPr>
         <w:t xml:space="preserve">Lei Orçamentária Anual 11.590/2026, anexos, Diário Oficial do Município, Edição 8697, de 09/01/2026, Edição Extra — </w:t>
       </w:r>
-      <w:hyperlink w:history="1" r:id="rIdxumzslnsjlhrpvqo5-q7f">
+      <w:hyperlink w:history="1" r:id="rIdesnnk-py-mdzz2kh44z5x">
         <w:r>
           <w:rPr>
             <w:rStyle w:val="Hyperlink"/>
@@ -6596,7 +8754,7 @@
         </w:rPr>
         <w:t xml:space="preserve">Lei Orçamentária Anual 11.315/2025, anexos, Diário Oficial do Município, de 07/01/2025 — </w:t>
       </w:r>
-      <w:hyperlink w:history="1" r:id="rIdeqf3iwaudx2ggcw6qmyrw">
+      <w:hyperlink w:history="1" r:id="rIdq12rzn73u_ytryrctlno1">
         <w:r>
           <w:rPr>
             <w:rStyle w:val="Hyperlink"/>
@@ -6633,7 +8791,7 @@
         </w:rPr>
         <w:t xml:space="preserve">Onde deveria estar publicado. </w:t>
       </w:r>
-      <w:hyperlink w:history="1" r:id="rIdmcqiw1-aouynpejpd-6a8">
+      <w:hyperlink w:history="1" r:id="rIdj9cipwhqudqr4lhmk6tlw">
         <w:r>
           <w:rPr>
             <w:rStyle w:val="Hyperlink"/>
@@ -6653,7 +8811,7 @@
         </w:rPr>
         <w:t xml:space="preserve">; </w:t>
       </w:r>
-      <w:hyperlink w:history="1" r:id="rId4cakhqkkkgicgfhse-qd3">
+      <w:hyperlink w:history="1" r:id="rIdxz9pl2x22e-cjfesq_bbi">
         <w:r>
           <w:rPr>
             <w:rStyle w:val="Hyperlink"/>
@@ -6882,7 +9040,7 @@
         </w:rPr>
         <w:t xml:space="preserve">Acervo do Diário Oficial coletado, 161 eventos entre 2025 e 2026, com digest de cada edição — </w:t>
       </w:r>
-      <w:hyperlink w:history="1" r:id="rId4bupqp5wn1d8y39dtgbub">
+      <w:hyperlink w:history="1" r:id="rIdnmg58-jgnvig8vtunft_f">
         <w:r>
           <w:rPr>
             <w:rStyle w:val="Hyperlink"/>
@@ -6919,7 +9077,7 @@
         </w:rPr>
         <w:t xml:space="preserve">Onde deveria estar publicado. </w:t>
       </w:r>
-      <w:hyperlink w:history="1" r:id="rIdenhsflcl2sjwk1mtzgizj">
+      <w:hyperlink w:history="1" r:id="rIdibhfbzcs2orssuxo6u2ri">
         <w:r>
           <w:rPr>
             <w:rStyle w:val="Hyperlink"/>
@@ -7154,7 +9312,7 @@
         </w:rPr>
         <w:t xml:space="preserve">Lei Orçamentária Anual 11.590/2026, anexos, Diário Oficial do Município, Edição 8697, de 09/01/2026, Edição Extra — </w:t>
       </w:r>
-      <w:hyperlink w:history="1" r:id="rId7tftvvn42rbhypw1wwsts">
+      <w:hyperlink w:history="1" r:id="rIdndpfxm7szmi8sn1xbhjmw">
         <w:r>
           <w:rPr>
             <w:rStyle w:val="Hyperlink"/>
@@ -7182,7 +9340,7 @@
         </w:rPr>
         <w:t xml:space="preserve">Lei municipal 7.531/1995 — </w:t>
       </w:r>
-      <w:hyperlink w:history="1" r:id="rId-gmez8onzlzzkegqjz34k">
+      <w:hyperlink w:history="1" r:id="rIds4ajo87s_afu2u99d9yny">
         <w:r>
           <w:rPr>
             <w:rStyle w:val="Hyperlink"/>
@@ -7219,7 +9377,7 @@
         </w:rPr>
         <w:t xml:space="preserve">Onde deveria estar publicado. </w:t>
       </w:r>
-      <w:hyperlink w:history="1" r:id="rIdnfz881yl2isiaog4rlk7n">
+      <w:hyperlink w:history="1" r:id="rIdebzrtxzmdckeobzusmimv">
         <w:r>
           <w:rPr>
             <w:rStyle w:val="Hyperlink"/>
@@ -7239,7 +9397,7 @@
         </w:rPr>
         <w:t xml:space="preserve">; </w:t>
       </w:r>
-      <w:hyperlink w:history="1" r:id="rIdzhfhvw6fv5kos-motjdis">
+      <w:hyperlink w:history="1" r:id="rIdapke3e_niyqb5rz56ssay">
         <w:r>
           <w:rPr>
             <w:rStyle w:val="Hyperlink"/>
@@ -7468,7 +9626,7 @@
         </w:rPr>
         <w:t xml:space="preserve">Lei Orçamentária Anual 11.590/2026, anexos, Diário Oficial do Município, Edição 8697, de 09/01/2026, Edição Extra — </w:t>
       </w:r>
-      <w:hyperlink w:history="1" r:id="rIdzgp9xtusmvll0bbj7exyp">
+      <w:hyperlink w:history="1" r:id="rIdrspr2lm9n7qcsv_kg35ek">
         <w:r>
           <w:rPr>
             <w:rStyle w:val="Hyperlink"/>
@@ -7496,7 +9654,7 @@
         </w:rPr>
         <w:t xml:space="preserve">Resolução CNAS/MDS 202/2025, Diário Oficial da União de 28/07/2025, Edição 140, Seção 1, Página 87 — </w:t>
       </w:r>
-      <w:hyperlink w:history="1" r:id="rIdl9aizxwncva83vm71twjm">
+      <w:hyperlink w:history="1" r:id="rIdki-dzqo0vwtjdico2bduf">
         <w:r>
           <w:rPr>
             <w:rStyle w:val="Hyperlink"/>
@@ -7533,7 +9691,7 @@
         </w:rPr>
         <w:t xml:space="preserve">Onde deveria estar publicado. </w:t>
       </w:r>
-      <w:hyperlink w:history="1" r:id="rIdohj6bvhtucrjnnoxf3wxy">
+      <w:hyperlink w:history="1" r:id="rIdp0xcqxquz8wskfliqjnqk">
         <w:r>
           <w:rPr>
             <w:rStyle w:val="Hyperlink"/>
@@ -7553,7 +9711,7 @@
         </w:rPr>
         <w:t xml:space="preserve">; </w:t>
       </w:r>
-      <w:hyperlink w:history="1" r:id="rIdxixiqsnuguf_gaj9l_caa">
+      <w:hyperlink w:history="1" r:id="rIdp28fclcdwmorldjup4q0l">
         <w:r>
           <w:rPr>
             <w:rStyle w:val="Hyperlink"/>
@@ -7805,7 +9963,7 @@
         </w:rPr>
         <w:t xml:space="preserve">Resolução CNAS/MDS 202/2025, Diário Oficial da União de 28/07/2025, Edição 140, Seção 1, Página 87 — </w:t>
       </w:r>
-      <w:hyperlink w:history="1" r:id="rIdlklus52wxq5wykijfrj0j">
+      <w:hyperlink w:history="1" r:id="rIdfha7evchviinf_vnogte6">
         <w:r>
           <w:rPr>
             <w:rStyle w:val="Hyperlink"/>
@@ -7842,7 +10000,7 @@
         </w:rPr>
         <w:t xml:space="preserve">Onde deveria estar publicado. </w:t>
       </w:r>
-      <w:hyperlink w:history="1" r:id="rIdiiklvogv6orxrlwtdrtdj">
+      <w:hyperlink w:history="1" r:id="rIdp14jkky8unl9kmkk-3cm-">
         <w:r>
           <w:rPr>
             <w:rStyle w:val="Hyperlink"/>
@@ -8080,7 +10238,7 @@
         </w:rPr>
         <w:t xml:space="preserve">Sítio próprio do Conselho, sem documento posterior a dezembro de 2023 — </w:t>
       </w:r>
-      <w:hyperlink w:history="1" r:id="rIdngso7-i5vzw1d1olv1ncw">
+      <w:hyperlink w:history="1" r:id="rIdfmluhbn1ieie3htoy96ep">
         <w:r>
           <w:rPr>
             <w:rStyle w:val="Hyperlink"/>
@@ -8117,7 +10275,7 @@
         </w:rPr>
         <w:t xml:space="preserve">Onde deveria estar publicado. </w:t>
       </w:r>
-      <w:hyperlink w:history="1" r:id="rId0yyaykz-mzxxjyrt7thyt">
+      <w:hyperlink w:history="1" r:id="rIdqcnx-z9ynnor_f-cpafxo">
         <w:r>
           <w:rPr>
             <w:rStyle w:val="Hyperlink"/>
@@ -8137,7 +10295,7 @@
         </w:rPr>
         <w:t xml:space="preserve">; </w:t>
       </w:r>
-      <w:hyperlink w:history="1" r:id="rIda8zv5rkjsrbxm2-mtva2a">
+      <w:hyperlink w:history="1" r:id="rIdy71wws-bdwiwlxa24ovwu">
         <w:r>
           <w:rPr>
             <w:rStyle w:val="Hyperlink"/>
@@ -8360,7 +10518,7 @@
         </w:rPr>
         <w:t xml:space="preserve">Acervo do Diário Oficial coletado, 161 eventos entre 2025 e 2026, com digest de cada edição — </w:t>
       </w:r>
-      <w:hyperlink w:history="1" r:id="rIdurrqodiidlkca-iyawf7i">
+      <w:hyperlink w:history="1" r:id="rId7azuuambqhfckfwksodtz">
         <w:r>
           <w:rPr>
             <w:rStyle w:val="Hyperlink"/>
@@ -8397,7 +10555,7 @@
         </w:rPr>
         <w:t xml:space="preserve">Onde deveria estar publicado. </w:t>
       </w:r>
-      <w:hyperlink w:history="1" r:id="rId9hoxyqnmamvqhafsgtymm">
+      <w:hyperlink w:history="1" r:id="rIdfu1isboktl0uwovc_04ih">
         <w:r>
           <w:rPr>
             <w:rStyle w:val="Hyperlink"/>
@@ -8417,7 +10575,7 @@
         </w:rPr>
         <w:t xml:space="preserve">; </w:t>
       </w:r>
-      <w:hyperlink w:history="1" r:id="rIdssyn2f7i3hgq6crmbev3b">
+      <w:hyperlink w:history="1" r:id="rIdb69uepofiqc5llgap5-be">
         <w:r>
           <w:rPr>
             <w:rStyle w:val="Hyperlink"/>
@@ -8640,7 +10798,7 @@
         </w:rPr>
         <w:t xml:space="preserve">Resolução CNAS/MDS 202/2025, Diário Oficial da União de 28/07/2025, Edição 140, Seção 1, Página 87 — </w:t>
       </w:r>
-      <w:hyperlink w:history="1" r:id="rIddiffv5yqjbh3swzmcshch">
+      <w:hyperlink w:history="1" r:id="rIddchxf48sykf5yzeixuxr7">
         <w:r>
           <w:rPr>
             <w:rStyle w:val="Hyperlink"/>
@@ -8677,7 +10835,7 @@
         </w:rPr>
         <w:t xml:space="preserve">Onde deveria estar publicado. </w:t>
       </w:r>
-      <w:hyperlink w:history="1" r:id="rIdmpw0wktsughzkljlfpeqq">
+      <w:hyperlink w:history="1" r:id="rIdsjwyxw1h40voreb9ssqxi">
         <w:r>
           <w:rPr>
             <w:rStyle w:val="Hyperlink"/>
@@ -8898,7 +11056,7 @@
         </w:rPr>
         <w:t xml:space="preserve">Acervo do Diário Oficial coletado, 161 eventos entre 2025 e 2026, com digest de cada edição — </w:t>
       </w:r>
-      <w:hyperlink w:history="1" r:id="rIdb9yc0beexrfj9ndf2r5mf">
+      <w:hyperlink w:history="1" r:id="rIdlmyoa37gmxd8690ovkwfu">
         <w:r>
           <w:rPr>
             <w:rStyle w:val="Hyperlink"/>
@@ -8935,7 +11093,7 @@
         </w:rPr>
         <w:t xml:space="preserve">Onde deveria estar publicado. </w:t>
       </w:r>
-      <w:hyperlink w:history="1" r:id="rIdh2wstm4nn22eds0dul2be">
+      <w:hyperlink w:history="1" r:id="rIdr39d99_iu9ymeiua69l-f">
         <w:r>
           <w:rPr>
             <w:rStyle w:val="Hyperlink"/>
@@ -9096,7 +11254,6 @@
           <w:sz w:val="24"/>
           <w:szCs w:val="24"/>
         </w:rPr>
-        <w:t xml:space="preserve">Receita e despesa</w:t>
       </w:r>
     </w:p>
     <w:p>
@@ -9113,6 +11270,703 @@
           <w:sz w:val="22"/>
           <w:szCs w:val="22"/>
         </w:rPr>
+        <w:t xml:space="preserve">CMAS-FIN-01 — Conselho sem dotação de diárias e passagens</w:t>
+      </w:r>
+    </w:p>
+    <w:p>
+      <w:pPr>
+        <w:spacing w:line="276"/>
+        <w:ind w:firstLine="1133"/>
+        <w:jc w:val="both"/>
+      </w:pPr>
+      <w:r>
+        <w:rPr>
+          <w:rFonts w:ascii="Bookman Old Style" w:cs="Bookman Old Style" w:eastAsia="Bookman Old Style" w:hAnsi="Bookman Old Style"/>
+          <w:b/>
+          <w:bCs/>
+          <w:sz w:val="22"/>
+          <w:szCs w:val="22"/>
+        </w:rPr>
+        <w:t xml:space="preserve">Valor envolvido. </w:t>
+      </w:r>
+      <w:r>
+        <w:rPr>
+          <w:rFonts w:ascii="Bookman Old Style" w:cs="Bookman Old Style" w:eastAsia="Bookman Old Style" w:hAnsi="Bookman Old Style"/>
+          <w:sz w:val="22"/>
+          <w:szCs w:val="22"/>
+        </w:rPr>
+        <w:t xml:space="preserve">Não quantificável sem os documentos faltantes.</w:t>
+      </w:r>
+      <w:r>
+        <w:rPr>
+          <w:rFonts w:ascii="Bookman Old Style" w:cs="Bookman Old Style" w:eastAsia="Bookman Old Style" w:hAnsi="Bookman Old Style"/>
+          <w:sz w:val="22"/>
+          <w:szCs w:val="22"/>
+        </w:rPr>
+        <w:t xml:space="preserve"/>
+      </w:r>
+    </w:p>
+    <w:p>
+      <w:pPr>
+        <w:spacing w:line="276"/>
+        <w:ind w:firstLine="1133"/>
+        <w:jc w:val="both"/>
+      </w:pPr>
+      <w:r>
+        <w:rPr>
+          <w:rFonts w:ascii="Bookman Old Style" w:cs="Bookman Old Style" w:eastAsia="Bookman Old Style" w:hAnsi="Bookman Old Style"/>
+          <w:b/>
+          <w:bCs/>
+          <w:sz w:val="22"/>
+          <w:szCs w:val="22"/>
+        </w:rPr>
+        <w:t xml:space="preserve">Documentos que faltam. </w:t>
+      </w:r>
+      <w:r>
+        <w:rPr>
+          <w:rFonts w:ascii="Bookman Old Style" w:cs="Bookman Old Style" w:eastAsia="Bookman Old Style" w:hAnsi="Bookman Old Style"/>
+          <w:sz w:val="22"/>
+          <w:szCs w:val="22"/>
+        </w:rPr>
+        <w:t xml:space="preserve">1) Relação de diárias e passagens concedidas a conselheiros em 2024, 2025 e 2026; 2) Atos de designação para conferências estaduais e nacionais; 3) Relatórios de fiscalização in loco de serviços realizados pelo Conselho.</w:t>
+      </w:r>
+    </w:p>
+    <w:p>
+      <w:pPr>
+        <w:spacing w:line="276"/>
+        <w:ind w:firstLine="1133"/>
+        <w:jc w:val="both"/>
+      </w:pPr>
+      <w:r>
+        <w:rPr>
+          <w:rFonts w:ascii="Bookman Old Style" w:cs="Bookman Old Style" w:eastAsia="Bookman Old Style" w:hAnsi="Bookman Old Style"/>
+          <w:b/>
+          <w:bCs/>
+          <w:sz w:val="22"/>
+          <w:szCs w:val="22"/>
+        </w:rPr>
+        <w:t xml:space="preserve">Justificativa. </w:t>
+      </w:r>
+      <w:r>
+        <w:rPr>
+          <w:rFonts w:ascii="Bookman Old Style" w:cs="Bookman Old Style" w:eastAsia="Bookman Old Style" w:hAnsi="Bookman Old Style"/>
+          <w:sz w:val="22"/>
+          <w:szCs w:val="22"/>
+        </w:rPr>
+        <w:t xml:space="preserve">A ação 3650.0824401082.591 não tem uma única linha de diárias (3.3.90.14) nem de passagens (3.3.90.33). O conselheiro não dispõe de meio orçamentário para participar de conferência fora do Município nem para fiscalizar serviços in loco. As duas atribuições estão na lei que criou o Conselho.</w:t>
+      </w:r>
+    </w:p>
+    <w:p>
+      <w:pPr>
+        <w:spacing w:line="276"/>
+        <w:ind w:firstLine="1133"/>
+        <w:jc w:val="both"/>
+      </w:pPr>
+      <w:r>
+        <w:rPr>
+          <w:rFonts w:ascii="Bookman Old Style" w:cs="Bookman Old Style" w:eastAsia="Bookman Old Style" w:hAnsi="Bookman Old Style"/>
+          <w:i/>
+          <w:iCs/>
+          <w:sz w:val="22"/>
+          <w:szCs w:val="22"/>
+        </w:rPr>
+        <w:t xml:space="preserve">Selo: </w:t>
+      </w:r>
+      <w:r>
+        <w:rPr>
+          <w:rFonts w:ascii="Bookman Old Style" w:cs="Bookman Old Style" w:eastAsia="Bookman Old Style" w:hAnsi="Bookman Old Style"/>
+          <w:i/>
+          <w:iCs/>
+          <w:sz w:val="22"/>
+          <w:szCs w:val="22"/>
+        </w:rPr>
+        <w:t xml:space="preserve">Confirmado</w:t>
+      </w:r>
+      <w:r>
+        <w:rPr>
+          <w:rFonts w:ascii="Bookman Old Style" w:cs="Bookman Old Style" w:eastAsia="Bookman Old Style" w:hAnsi="Bookman Old Style"/>
+          <w:i/>
+          <w:iCs/>
+          <w:sz w:val="22"/>
+          <w:szCs w:val="22"/>
+        </w:rPr>
+        <w:t xml:space="preserve">. Severidade: </w:t>
+      </w:r>
+      <w:r>
+        <w:rPr>
+          <w:rFonts w:ascii="Bookman Old Style" w:cs="Bookman Old Style" w:eastAsia="Bookman Old Style" w:hAnsi="Bookman Old Style"/>
+          <w:i/>
+          <w:iCs/>
+          <w:sz w:val="22"/>
+          <w:szCs w:val="22"/>
+        </w:rPr>
+        <w:t xml:space="preserve">Alta</w:t>
+      </w:r>
+      <w:r>
+        <w:rPr>
+          <w:rFonts w:ascii="Bookman Old Style" w:cs="Bookman Old Style" w:eastAsia="Bookman Old Style" w:hAnsi="Bookman Old Style"/>
+          <w:i/>
+          <w:iCs/>
+          <w:sz w:val="22"/>
+          <w:szCs w:val="22"/>
+        </w:rPr>
+        <w:t xml:space="preserve">.</w:t>
+      </w:r>
+    </w:p>
+    <w:p>
+      <w:pPr>
+        <w:spacing w:line="276"/>
+      </w:pPr>
+      <w:r>
+        <w:rPr>
+          <w:rFonts w:ascii="Bookman Old Style" w:cs="Bookman Old Style" w:eastAsia="Bookman Old Style" w:hAnsi="Bookman Old Style"/>
+          <w:sz w:val="22"/>
+          <w:szCs w:val="22"/>
+        </w:rPr>
+        <w:t xml:space="preserve"/>
+      </w:r>
+    </w:p>
+    <w:p>
+      <w:pPr>
+        <w:pStyle w:val="Heading3"/>
+        <w:spacing w:after="100" w:before="220"/>
+        <w:jc w:val="center"/>
+      </w:pPr>
+      <w:r>
+        <w:rPr>
+          <w:rFonts w:ascii="Bookman Old Style" w:cs="Bookman Old Style" w:eastAsia="Bookman Old Style" w:hAnsi="Bookman Old Style"/>
+          <w:b/>
+          <w:bCs/>
+          <w:sz w:val="22"/>
+          <w:szCs w:val="22"/>
+        </w:rPr>
+        <w:t xml:space="preserve">CMAS-FIN-02 — Nenhum apoio financeiro direto ao conselheiro</w:t>
+      </w:r>
+    </w:p>
+    <w:p>
+      <w:pPr>
+        <w:spacing w:line="276"/>
+        <w:ind w:firstLine="1133"/>
+        <w:jc w:val="both"/>
+      </w:pPr>
+      <w:r>
+        <w:rPr>
+          <w:rFonts w:ascii="Bookman Old Style" w:cs="Bookman Old Style" w:eastAsia="Bookman Old Style" w:hAnsi="Bookman Old Style"/>
+          <w:b/>
+          <w:bCs/>
+          <w:sz w:val="22"/>
+          <w:szCs w:val="22"/>
+        </w:rPr>
+        <w:t xml:space="preserve">Valor envolvido. </w:t>
+      </w:r>
+      <w:r>
+        <w:rPr>
+          <w:rFonts w:ascii="Bookman Old Style" w:cs="Bookman Old Style" w:eastAsia="Bookman Old Style" w:hAnsi="Bookman Old Style"/>
+          <w:sz w:val="22"/>
+          <w:szCs w:val="22"/>
+        </w:rPr>
+        <w:t xml:space="preserve">Não quantificável sem os documentos faltantes.</w:t>
+      </w:r>
+      <w:r>
+        <w:rPr>
+          <w:rFonts w:ascii="Bookman Old Style" w:cs="Bookman Old Style" w:eastAsia="Bookman Old Style" w:hAnsi="Bookman Old Style"/>
+          <w:sz w:val="22"/>
+          <w:szCs w:val="22"/>
+        </w:rPr>
+        <w:t xml:space="preserve"/>
+      </w:r>
+    </w:p>
+    <w:p>
+      <w:pPr>
+        <w:spacing w:line="276"/>
+        <w:ind w:firstLine="1133"/>
+        <w:jc w:val="both"/>
+      </w:pPr>
+      <w:r>
+        <w:rPr>
+          <w:rFonts w:ascii="Bookman Old Style" w:cs="Bookman Old Style" w:eastAsia="Bookman Old Style" w:hAnsi="Bookman Old Style"/>
+          <w:b/>
+          <w:bCs/>
+          <w:sz w:val="22"/>
+          <w:szCs w:val="22"/>
+        </w:rPr>
+        <w:t xml:space="preserve">Documentos que faltam. </w:t>
+      </w:r>
+      <w:r>
+        <w:rPr>
+          <w:rFonts w:ascii="Bookman Old Style" w:cs="Bookman Old Style" w:eastAsia="Bookman Old Style" w:hAnsi="Bookman Old Style"/>
+          <w:sz w:val="22"/>
+          <w:szCs w:val="22"/>
+        </w:rPr>
+        <w:t xml:space="preserve">1) Norma que disciplina o custeio da participação do conselheiro; 2) Demonstrativo de auxílio alimentação, transporte ou financeiro pago a conselheiro; 3) Listas de presença por segmento, de 2024 a 2026, para aferir a paridade efetiva.</w:t>
+      </w:r>
+    </w:p>
+    <w:p>
+      <w:pPr>
+        <w:spacing w:line="276"/>
+        <w:ind w:firstLine="1133"/>
+        <w:jc w:val="both"/>
+      </w:pPr>
+      <w:r>
+        <w:rPr>
+          <w:rFonts w:ascii="Bookman Old Style" w:cs="Bookman Old Style" w:eastAsia="Bookman Old Style" w:hAnsi="Bookman Old Style"/>
+          <w:b/>
+          <w:bCs/>
+          <w:sz w:val="22"/>
+          <w:szCs w:val="22"/>
+        </w:rPr>
+        <w:t xml:space="preserve">Justificativa. </w:t>
+      </w:r>
+      <w:r>
+        <w:rPr>
+          <w:rFonts w:ascii="Bookman Old Style" w:cs="Bookman Old Style" w:eastAsia="Bookman Old Style" w:hAnsi="Bookman Old Style"/>
+          <w:sz w:val="22"/>
+          <w:szCs w:val="22"/>
+        </w:rPr>
+        <w:t xml:space="preserve">Não há dotação de auxílio financeiro a pessoa física (3.3.90.48), de auxílio alimentação (3.3.90.46) nem de auxílio transporte (3.3.90.49). O mandato de conselheiro é gratuito, o que é legítimo, mas gratuidade do mandato não dispensa o custeio da participação. A ausência pesa de modo desigual sobre o representante de usuário, que ocupa seis das quinze cadeiras da sociedade civil.</w:t>
+      </w:r>
+    </w:p>
+    <w:p>
+      <w:pPr>
+        <w:spacing w:line="276"/>
+        <w:ind w:firstLine="1133"/>
+        <w:jc w:val="both"/>
+      </w:pPr>
+      <w:r>
+        <w:rPr>
+          <w:rFonts w:ascii="Bookman Old Style" w:cs="Bookman Old Style" w:eastAsia="Bookman Old Style" w:hAnsi="Bookman Old Style"/>
+          <w:i/>
+          <w:iCs/>
+          <w:sz w:val="22"/>
+          <w:szCs w:val="22"/>
+        </w:rPr>
+        <w:t xml:space="preserve">Selo: </w:t>
+      </w:r>
+      <w:r>
+        <w:rPr>
+          <w:rFonts w:ascii="Bookman Old Style" w:cs="Bookman Old Style" w:eastAsia="Bookman Old Style" w:hAnsi="Bookman Old Style"/>
+          <w:i/>
+          <w:iCs/>
+          <w:sz w:val="22"/>
+          <w:szCs w:val="22"/>
+        </w:rPr>
+        <w:t xml:space="preserve">Confirmado</w:t>
+      </w:r>
+      <w:r>
+        <w:rPr>
+          <w:rFonts w:ascii="Bookman Old Style" w:cs="Bookman Old Style" w:eastAsia="Bookman Old Style" w:hAnsi="Bookman Old Style"/>
+          <w:i/>
+          <w:iCs/>
+          <w:sz w:val="22"/>
+          <w:szCs w:val="22"/>
+        </w:rPr>
+        <w:t xml:space="preserve">. Severidade: </w:t>
+      </w:r>
+      <w:r>
+        <w:rPr>
+          <w:rFonts w:ascii="Bookman Old Style" w:cs="Bookman Old Style" w:eastAsia="Bookman Old Style" w:hAnsi="Bookman Old Style"/>
+          <w:i/>
+          <w:iCs/>
+          <w:sz w:val="22"/>
+          <w:szCs w:val="22"/>
+        </w:rPr>
+        <w:t xml:space="preserve">Alta</w:t>
+      </w:r>
+      <w:r>
+        <w:rPr>
+          <w:rFonts w:ascii="Bookman Old Style" w:cs="Bookman Old Style" w:eastAsia="Bookman Old Style" w:hAnsi="Bookman Old Style"/>
+          <w:i/>
+          <w:iCs/>
+          <w:sz w:val="22"/>
+          <w:szCs w:val="22"/>
+        </w:rPr>
+        <w:t xml:space="preserve">.</w:t>
+      </w:r>
+    </w:p>
+    <w:p>
+      <w:pPr>
+        <w:spacing w:line="276"/>
+      </w:pPr>
+      <w:r>
+        <w:rPr>
+          <w:rFonts w:ascii="Bookman Old Style" w:cs="Bookman Old Style" w:eastAsia="Bookman Old Style" w:hAnsi="Bookman Old Style"/>
+          <w:sz w:val="22"/>
+          <w:szCs w:val="22"/>
+        </w:rPr>
+        <w:t xml:space="preserve"/>
+      </w:r>
+    </w:p>
+    <w:p>
+      <w:pPr>
+        <w:pStyle w:val="Heading3"/>
+        <w:spacing w:after="100" w:before="220"/>
+        <w:jc w:val="center"/>
+      </w:pPr>
+      <w:r>
+        <w:rPr>
+          <w:rFonts w:ascii="Bookman Old Style" w:cs="Bookman Old Style" w:eastAsia="Bookman Old Style" w:hAnsi="Bookman Old Style"/>
+          <w:b/>
+          <w:bCs/>
+          <w:sz w:val="22"/>
+          <w:szCs w:val="22"/>
+        </w:rPr>
+        <w:t xml:space="preserve">CMAS-FIN-04 — Apoio técnico do Conselho depende integralmente do fiscalizado</w:t>
+      </w:r>
+    </w:p>
+    <w:p>
+      <w:pPr>
+        <w:spacing w:line="276"/>
+        <w:ind w:firstLine="1133"/>
+        <w:jc w:val="both"/>
+      </w:pPr>
+      <w:r>
+        <w:rPr>
+          <w:rFonts w:ascii="Bookman Old Style" w:cs="Bookman Old Style" w:eastAsia="Bookman Old Style" w:hAnsi="Bookman Old Style"/>
+          <w:b/>
+          <w:bCs/>
+          <w:sz w:val="22"/>
+          <w:szCs w:val="22"/>
+        </w:rPr>
+        <w:t xml:space="preserve">Valor envolvido. </w:t>
+      </w:r>
+      <w:r>
+        <w:rPr>
+          <w:rFonts w:ascii="Bookman Old Style" w:cs="Bookman Old Style" w:eastAsia="Bookman Old Style" w:hAnsi="Bookman Old Style"/>
+          <w:sz w:val="22"/>
+          <w:szCs w:val="22"/>
+        </w:rPr>
+        <w:t xml:space="preserve">Não quantificável sem os documentos faltantes.</w:t>
+      </w:r>
+      <w:r>
+        <w:rPr>
+          <w:rFonts w:ascii="Bookman Old Style" w:cs="Bookman Old Style" w:eastAsia="Bookman Old Style" w:hAnsi="Bookman Old Style"/>
+          <w:sz w:val="22"/>
+          <w:szCs w:val="22"/>
+        </w:rPr>
+        <w:t xml:space="preserve"/>
+      </w:r>
+    </w:p>
+    <w:p>
+      <w:pPr>
+        <w:spacing w:line="276"/>
+        <w:ind w:firstLine="1133"/>
+        <w:jc w:val="both"/>
+      </w:pPr>
+      <w:r>
+        <w:rPr>
+          <w:rFonts w:ascii="Bookman Old Style" w:cs="Bookman Old Style" w:eastAsia="Bookman Old Style" w:hAnsi="Bookman Old Style"/>
+          <w:b/>
+          <w:bCs/>
+          <w:sz w:val="22"/>
+          <w:szCs w:val="22"/>
+        </w:rPr>
+        <w:t xml:space="preserve">Documentos que faltam. </w:t>
+      </w:r>
+      <w:r>
+        <w:rPr>
+          <w:rFonts w:ascii="Bookman Old Style" w:cs="Bookman Old Style" w:eastAsia="Bookman Old Style" w:hAnsi="Bookman Old Style"/>
+          <w:sz w:val="22"/>
+          <w:szCs w:val="22"/>
+        </w:rPr>
+        <w:t xml:space="preserve">1) Atos de designação da Secretaria Executiva e do Corpo Técnico do Conselho; 2) Relação nominal dos servidores lotados no Conselho, com vínculo e fonte de custeio; 3) Convênios ou contratos de assessoria técnica ao Conselho.</w:t>
+      </w:r>
+    </w:p>
+    <w:p>
+      <w:pPr>
+        <w:spacing w:line="276"/>
+        <w:ind w:firstLine="1133"/>
+        <w:jc w:val="both"/>
+      </w:pPr>
+      <w:r>
+        <w:rPr>
+          <w:rFonts w:ascii="Bookman Old Style" w:cs="Bookman Old Style" w:eastAsia="Bookman Old Style" w:hAnsi="Bookman Old Style"/>
+          <w:b/>
+          <w:bCs/>
+          <w:sz w:val="22"/>
+          <w:szCs w:val="22"/>
+        </w:rPr>
+        <w:t xml:space="preserve">Justificativa. </w:t>
+      </w:r>
+      <w:r>
+        <w:rPr>
+          <w:rFonts w:ascii="Bookman Old Style" w:cs="Bookman Old Style" w:eastAsia="Bookman Old Style" w:hAnsi="Bookman Old Style"/>
+          <w:sz w:val="22"/>
+          <w:szCs w:val="22"/>
+        </w:rPr>
+        <w:t xml:space="preserve">Não há dotação de consultoria (3.3.90.35) nem de pessoal próprio (3.1.90.11) na ação do Conselho. A Secretaria Executiva e o Corpo Técnico são contratados e disponibilizados pelo órgão gestor, na forma da lei. O desenho é legal, mas produz dependência: quem fornece a estrutura de fiscalização é quem está sendo fiscalizado. Sem os atos de designação, não se sabe sequer se existem.</w:t>
+      </w:r>
+    </w:p>
+    <w:p>
+      <w:pPr>
+        <w:spacing w:line="276"/>
+        <w:ind w:firstLine="1133"/>
+        <w:jc w:val="both"/>
+      </w:pPr>
+      <w:r>
+        <w:rPr>
+          <w:rFonts w:ascii="Bookman Old Style" w:cs="Bookman Old Style" w:eastAsia="Bookman Old Style" w:hAnsi="Bookman Old Style"/>
+          <w:i/>
+          <w:iCs/>
+          <w:sz w:val="22"/>
+          <w:szCs w:val="22"/>
+        </w:rPr>
+        <w:t xml:space="preserve">Selo: </w:t>
+      </w:r>
+      <w:r>
+        <w:rPr>
+          <w:rFonts w:ascii="Bookman Old Style" w:cs="Bookman Old Style" w:eastAsia="Bookman Old Style" w:hAnsi="Bookman Old Style"/>
+          <w:i/>
+          <w:iCs/>
+          <w:sz w:val="22"/>
+          <w:szCs w:val="22"/>
+        </w:rPr>
+        <w:t xml:space="preserve">Confirmado</w:t>
+      </w:r>
+      <w:r>
+        <w:rPr>
+          <w:rFonts w:ascii="Bookman Old Style" w:cs="Bookman Old Style" w:eastAsia="Bookman Old Style" w:hAnsi="Bookman Old Style"/>
+          <w:i/>
+          <w:iCs/>
+          <w:sz w:val="22"/>
+          <w:szCs w:val="22"/>
+        </w:rPr>
+        <w:t xml:space="preserve">. Severidade: </w:t>
+      </w:r>
+      <w:r>
+        <w:rPr>
+          <w:rFonts w:ascii="Bookman Old Style" w:cs="Bookman Old Style" w:eastAsia="Bookman Old Style" w:hAnsi="Bookman Old Style"/>
+          <w:i/>
+          <w:iCs/>
+          <w:sz w:val="22"/>
+          <w:szCs w:val="22"/>
+        </w:rPr>
+        <w:t xml:space="preserve">Alta</w:t>
+      </w:r>
+      <w:r>
+        <w:rPr>
+          <w:rFonts w:ascii="Bookman Old Style" w:cs="Bookman Old Style" w:eastAsia="Bookman Old Style" w:hAnsi="Bookman Old Style"/>
+          <w:i/>
+          <w:iCs/>
+          <w:sz w:val="22"/>
+          <w:szCs w:val="22"/>
+        </w:rPr>
+        <w:t xml:space="preserve">.</w:t>
+      </w:r>
+    </w:p>
+    <w:p>
+      <w:pPr>
+        <w:spacing w:line="276"/>
+      </w:pPr>
+      <w:r>
+        <w:rPr>
+          <w:rFonts w:ascii="Bookman Old Style" w:cs="Bookman Old Style" w:eastAsia="Bookman Old Style" w:hAnsi="Bookman Old Style"/>
+          <w:sz w:val="22"/>
+          <w:szCs w:val="22"/>
+        </w:rPr>
+        <w:t xml:space="preserve"/>
+      </w:r>
+    </w:p>
+    <w:p>
+      <w:pPr>
+        <w:pStyle w:val="Heading3"/>
+        <w:spacing w:after="100" w:before="220"/>
+        <w:jc w:val="center"/>
+      </w:pPr>
+      <w:r>
+        <w:rPr>
+          <w:rFonts w:ascii="Bookman Old Style" w:cs="Bookman Old Style" w:eastAsia="Bookman Old Style" w:hAnsi="Bookman Old Style"/>
+          <w:b/>
+          <w:bCs/>
+          <w:sz w:val="22"/>
+          <w:szCs w:val="22"/>
+        </w:rPr>
+        <w:t xml:space="preserve">CMAS-FIN-07 — Execução da dotação do Conselho não publicada</w:t>
+      </w:r>
+    </w:p>
+    <w:p>
+      <w:pPr>
+        <w:spacing w:line="276"/>
+        <w:ind w:firstLine="1133"/>
+        <w:jc w:val="both"/>
+      </w:pPr>
+      <w:r>
+        <w:rPr>
+          <w:rFonts w:ascii="Bookman Old Style" w:cs="Bookman Old Style" w:eastAsia="Bookman Old Style" w:hAnsi="Bookman Old Style"/>
+          <w:b/>
+          <w:bCs/>
+          <w:sz w:val="22"/>
+          <w:szCs w:val="22"/>
+        </w:rPr>
+        <w:t xml:space="preserve">Valor envolvido. </w:t>
+      </w:r>
+      <w:r>
+        <w:rPr>
+          <w:rFonts w:ascii="Bookman Old Style" w:cs="Bookman Old Style" w:eastAsia="Bookman Old Style" w:hAnsi="Bookman Old Style"/>
+          <w:sz w:val="22"/>
+          <w:szCs w:val="22"/>
+        </w:rPr>
+        <w:t xml:space="preserve">Não quantificável sem os documentos faltantes.</w:t>
+      </w:r>
+      <w:r>
+        <w:rPr>
+          <w:rFonts w:ascii="Bookman Old Style" w:cs="Bookman Old Style" w:eastAsia="Bookman Old Style" w:hAnsi="Bookman Old Style"/>
+          <w:sz w:val="22"/>
+          <w:szCs w:val="22"/>
+        </w:rPr>
+        <w:t xml:space="preserve"/>
+      </w:r>
+    </w:p>
+    <w:p>
+      <w:pPr>
+        <w:spacing w:line="276"/>
+        <w:ind w:firstLine="1133"/>
+        <w:jc w:val="both"/>
+      </w:pPr>
+      <w:r>
+        <w:rPr>
+          <w:rFonts w:ascii="Bookman Old Style" w:cs="Bookman Old Style" w:eastAsia="Bookman Old Style" w:hAnsi="Bookman Old Style"/>
+          <w:b/>
+          <w:bCs/>
+          <w:sz w:val="22"/>
+          <w:szCs w:val="22"/>
+        </w:rPr>
+        <w:t xml:space="preserve">Documentos que faltam. </w:t>
+      </w:r>
+      <w:r>
+        <w:rPr>
+          <w:rFonts w:ascii="Bookman Old Style" w:cs="Bookman Old Style" w:eastAsia="Bookman Old Style" w:hAnsi="Bookman Old Style"/>
+          <w:sz w:val="22"/>
+          <w:szCs w:val="22"/>
+        </w:rPr>
+        <w:t xml:space="preserve">1) Execução orçamentária da ação 3650.0824401082.591 por estágio e por rubrica; 2) Notas de empenho e liquidação da ação; 3) Demonstrativo de bens patrimoniados na sede do Conselho.</w:t>
+      </w:r>
+    </w:p>
+    <w:p>
+      <w:pPr>
+        <w:spacing w:line="276"/>
+        <w:ind w:firstLine="1133"/>
+        <w:jc w:val="both"/>
+      </w:pPr>
+      <w:r>
+        <w:rPr>
+          <w:rFonts w:ascii="Bookman Old Style" w:cs="Bookman Old Style" w:eastAsia="Bookman Old Style" w:hAnsi="Bookman Old Style"/>
+          <w:b/>
+          <w:bCs/>
+          <w:sz w:val="22"/>
+          <w:szCs w:val="22"/>
+        </w:rPr>
+        <w:t xml:space="preserve">Justificativa. </w:t>
+      </w:r>
+      <w:r>
+        <w:rPr>
+          <w:rFonts w:ascii="Bookman Old Style" w:cs="Bookman Old Style" w:eastAsia="Bookman Old Style" w:hAnsi="Bookman Old Style"/>
+          <w:sz w:val="22"/>
+          <w:szCs w:val="22"/>
+        </w:rPr>
+        <w:t xml:space="preserve">A dotação de 256,000.00 é previsão. Não há empenho, liquidação nem pagamento publicados para a ação. Não se sabe se o Conselho recebeu, gastou ou devolveu.</w:t>
+      </w:r>
+    </w:p>
+    <w:p>
+      <w:pPr>
+        <w:spacing w:line="276"/>
+        <w:ind w:firstLine="1133"/>
+        <w:jc w:val="both"/>
+      </w:pPr>
+      <w:r>
+        <w:rPr>
+          <w:rFonts w:ascii="Bookman Old Style" w:cs="Bookman Old Style" w:eastAsia="Bookman Old Style" w:hAnsi="Bookman Old Style"/>
+          <w:i/>
+          <w:iCs/>
+          <w:sz w:val="22"/>
+          <w:szCs w:val="22"/>
+        </w:rPr>
+        <w:t xml:space="preserve">Selo: </w:t>
+      </w:r>
+      <w:r>
+        <w:rPr>
+          <w:rFonts w:ascii="Bookman Old Style" w:cs="Bookman Old Style" w:eastAsia="Bookman Old Style" w:hAnsi="Bookman Old Style"/>
+          <w:i/>
+          <w:iCs/>
+          <w:sz w:val="22"/>
+          <w:szCs w:val="22"/>
+        </w:rPr>
+        <w:t xml:space="preserve">Sem documento para avaliar</w:t>
+      </w:r>
+      <w:r>
+        <w:rPr>
+          <w:rFonts w:ascii="Bookman Old Style" w:cs="Bookman Old Style" w:eastAsia="Bookman Old Style" w:hAnsi="Bookman Old Style"/>
+          <w:i/>
+          <w:iCs/>
+          <w:sz w:val="22"/>
+          <w:szCs w:val="22"/>
+        </w:rPr>
+        <w:t xml:space="preserve">. Severidade: </w:t>
+      </w:r>
+      <w:r>
+        <w:rPr>
+          <w:rFonts w:ascii="Bookman Old Style" w:cs="Bookman Old Style" w:eastAsia="Bookman Old Style" w:hAnsi="Bookman Old Style"/>
+          <w:i/>
+          <w:iCs/>
+          <w:sz w:val="22"/>
+          <w:szCs w:val="22"/>
+        </w:rPr>
+        <w:t xml:space="preserve">Alta</w:t>
+      </w:r>
+      <w:r>
+        <w:rPr>
+          <w:rFonts w:ascii="Bookman Old Style" w:cs="Bookman Old Style" w:eastAsia="Bookman Old Style" w:hAnsi="Bookman Old Style"/>
+          <w:i/>
+          <w:iCs/>
+          <w:sz w:val="22"/>
+          <w:szCs w:val="22"/>
+        </w:rPr>
+        <w:t xml:space="preserve">.</w:t>
+      </w:r>
+    </w:p>
+    <w:p>
+      <w:pPr>
+        <w:spacing w:line="276"/>
+      </w:pPr>
+      <w:r>
+        <w:rPr>
+          <w:rFonts w:ascii="Bookman Old Style" w:cs="Bookman Old Style" w:eastAsia="Bookman Old Style" w:hAnsi="Bookman Old Style"/>
+          <w:sz w:val="22"/>
+          <w:szCs w:val="22"/>
+        </w:rPr>
+        <w:t xml:space="preserve"/>
+      </w:r>
+    </w:p>
+    <w:p>
+      <w:pPr>
+        <w:pStyle w:val="Heading2"/>
+        <w:spacing w:after="120" w:before="240"/>
+        <w:jc w:val="center"/>
+      </w:pPr>
+      <w:r>
+        <w:rPr>
+          <w:rFonts w:ascii="Bookman Old Style" w:cs="Bookman Old Style" w:eastAsia="Bookman Old Style" w:hAnsi="Bookman Old Style"/>
+          <w:b/>
+          <w:bCs/>
+          <w:sz w:val="24"/>
+          <w:szCs w:val="24"/>
+        </w:rPr>
+        <w:t xml:space="preserve">Receita e despesa</w:t>
+      </w:r>
+    </w:p>
+    <w:p>
+      <w:pPr>
+        <w:pStyle w:val="Heading3"/>
+        <w:spacing w:after="100" w:before="220"/>
+        <w:jc w:val="center"/>
+      </w:pPr>
+      <w:r>
+        <w:rPr>
+          <w:rFonts w:ascii="Bookman Old Style" w:cs="Bookman Old Style" w:eastAsia="Bookman Old Style" w:hAnsi="Bookman Old Style"/>
+          <w:b/>
+          <w:bCs/>
+          <w:sz w:val="22"/>
+          <w:szCs w:val="22"/>
+        </w:rPr>
         <w:t xml:space="preserve">REC-02 — Transferências sem ente de origem identificável</w:t>
       </w:r>
     </w:p>
@@ -9175,7 +12029,7 @@
         </w:rPr>
         <w:t xml:space="preserve">Lei Orçamentária Anual 11.590/2026, anexos, Diário Oficial do Município, Edição 8697, de 09/01/2026, Edição Extra — </w:t>
       </w:r>
-      <w:hyperlink w:history="1" r:id="rIdm4lvqmc3jlktyjeflavoc">
+      <w:hyperlink w:history="1" r:id="rIds6kotumbouvvthr93w7su">
         <w:r>
           <w:rPr>
             <w:rStyle w:val="Hyperlink"/>
@@ -9212,7 +12066,7 @@
         </w:rPr>
         <w:t xml:space="preserve">Onde deveria estar publicado. </w:t>
       </w:r>
-      <w:hyperlink w:history="1" r:id="rIdmae4mdkmo5oi1g284hchc">
+      <w:hyperlink w:history="1" r:id="rIduqtradkyowhf49hzctnnb">
         <w:r>
           <w:rPr>
             <w:rStyle w:val="Hyperlink"/>
@@ -9441,7 +12295,7 @@
         </w:rPr>
         <w:t xml:space="preserve">Lei Orçamentária Anual 11.590/2026, anexos, Diário Oficial do Município, Edição 8697, de 09/01/2026, Edição Extra — </w:t>
       </w:r>
-      <w:hyperlink w:history="1" r:id="rIdtbphra8m8xbecvtwwo6mr">
+      <w:hyperlink w:history="1" r:id="rId6aqg36epgqpizrm4in_5d">
         <w:r>
           <w:rPr>
             <w:rStyle w:val="Hyperlink"/>
@@ -9478,7 +12332,7 @@
         </w:rPr>
         <w:t xml:space="preserve">Onde deveria estar publicado. </w:t>
       </w:r>
-      <w:hyperlink w:history="1" r:id="rIdb_an1vrm6bw4vtmxi_siu">
+      <w:hyperlink w:history="1" r:id="rIdwlnbyojribskpfmc4ut08">
         <w:r>
           <w:rPr>
             <w:rStyle w:val="Hyperlink"/>
@@ -9701,7 +12555,7 @@
         </w:rPr>
         <w:t xml:space="preserve">Lei Orçamentária Anual 11.590/2026, anexos, Diário Oficial do Município, Edição 8697, de 09/01/2026, Edição Extra — </w:t>
       </w:r>
-      <w:hyperlink w:history="1" r:id="rIdp8mjjfjlrqsk_vikkyiip">
+      <w:hyperlink w:history="1" r:id="rIdry6w3ebutgh2r_k8sdvi9">
         <w:r>
           <w:rPr>
             <w:rStyle w:val="Hyperlink"/>
@@ -9729,7 +12583,7 @@
         </w:rPr>
         <w:t xml:space="preserve">Lei municipal 9.009/2010 — </w:t>
       </w:r>
-      <w:hyperlink w:history="1" r:id="rIdilq0x74g8jlfk7ijgx0dn">
+      <w:hyperlink w:history="1" r:id="rIda0bfrjidwzxy89gr2yece">
         <w:r>
           <w:rPr>
             <w:rStyle w:val="Hyperlink"/>
@@ -9766,7 +12620,7 @@
         </w:rPr>
         <w:t xml:space="preserve">Onde deveria estar publicado. </w:t>
       </w:r>
-      <w:hyperlink w:history="1" r:id="rIdlaqt8oynf3lahcsx8afbl">
+      <w:hyperlink w:history="1" r:id="rIdfp6r2bmjnzjuehmexkyn0">
         <w:r>
           <w:rPr>
             <w:rStyle w:val="Hyperlink"/>
@@ -9995,7 +12849,7 @@
         </w:rPr>
         <w:t xml:space="preserve">Lei Orçamentária Anual 11.590/2026, anexos, Diário Oficial do Município, Edição 8697, de 09/01/2026, Edição Extra — </w:t>
       </w:r>
-      <w:hyperlink w:history="1" r:id="rIdmxhdfkmpjmauloflmozda">
+      <w:hyperlink w:history="1" r:id="rIdbugqexqb7cv8jnptdjdln">
         <w:r>
           <w:rPr>
             <w:rStyle w:val="Hyperlink"/>
@@ -10032,7 +12886,7 @@
         </w:rPr>
         <w:t xml:space="preserve">Onde deveria estar publicado. </w:t>
       </w:r>
-      <w:hyperlink w:history="1" r:id="rIdbww8qldmclnbzpigfedt4">
+      <w:hyperlink w:history="1" r:id="rIdgrn5zwys5br6tetychxfo">
         <w:r>
           <w:rPr>
             <w:rStyle w:val="Hyperlink"/>
@@ -10276,7 +13130,7 @@
         </w:rPr>
         <w:t xml:space="preserve">Acervo do Diário Oficial coletado, 161 eventos entre 2025 e 2026, com digest de cada edição — </w:t>
       </w:r>
-      <w:hyperlink w:history="1" r:id="rIdklvzrstjmedxw4axdtoh2">
+      <w:hyperlink w:history="1" r:id="rId8ryll2jeccgv95rc635yq">
         <w:r>
           <w:rPr>
             <w:rStyle w:val="Hyperlink"/>
@@ -10313,7 +13167,7 @@
         </w:rPr>
         <w:t xml:space="preserve">Onde deveria estar publicado. </w:t>
       </w:r>
-      <w:hyperlink w:history="1" r:id="rIdrqvncm_qxio399yci8od5">
+      <w:hyperlink w:history="1" r:id="rIdbodd3zcmwh4brlzorlcci">
         <w:r>
           <w:rPr>
             <w:rStyle w:val="Hyperlink"/>
@@ -10540,7 +13394,7 @@
         </w:rPr>
         <w:t xml:space="preserve">Acervo do Diário Oficial coletado, 161 eventos entre 2025 e 2026, com digest de cada edição — </w:t>
       </w:r>
-      <w:hyperlink w:history="1" r:id="rIdxbqb68u4uj6wjwx_kjhfi">
+      <w:hyperlink w:history="1" r:id="rIdh0pidhf5rdcwa986ogfoi">
         <w:r>
           <w:rPr>
             <w:rStyle w:val="Hyperlink"/>
@@ -10577,7 +13431,7 @@
         </w:rPr>
         <w:t xml:space="preserve">Onde deveria estar publicado. </w:t>
       </w:r>
-      <w:hyperlink w:history="1" r:id="rIdgifvshia8zpr1zatpl9mk">
+      <w:hyperlink w:history="1" r:id="rId2ii74ohaydfxkcnxvb8cw">
         <w:r>
           <w:rPr>
             <w:rStyle w:val="Hyperlink"/>
@@ -10597,7 +13451,7 @@
         </w:rPr>
         <w:t xml:space="preserve">; </w:t>
       </w:r>
-      <w:hyperlink w:history="1" r:id="rId_11v0j8nqmk8v_jmgdfel">
+      <w:hyperlink w:history="1" r:id="rIdsmhhw9ucab3cantgvpsew">
         <w:r>
           <w:rPr>
             <w:rStyle w:val="Hyperlink"/>
@@ -10826,7 +13680,7 @@
         </w:rPr>
         <w:t xml:space="preserve">Lei municipal 7.531/1995 — </w:t>
       </w:r>
-      <w:hyperlink w:history="1" r:id="rIdmjtqfg42qzx7g6oppemzp">
+      <w:hyperlink w:history="1" r:id="rIdv3cjwmfcszl6-mify9sms">
         <w:r>
           <w:rPr>
             <w:rStyle w:val="Hyperlink"/>
@@ -10863,7 +13717,7 @@
         </w:rPr>
         <w:t xml:space="preserve">Onde deveria estar publicado. </w:t>
       </w:r>
-      <w:hyperlink w:history="1" r:id="rIdsdel5zxpu2zuatt61updd">
+      <w:hyperlink w:history="1" r:id="rIdji1ji0qvaj2qwf_c91gv_">
         <w:r>
           <w:rPr>
             <w:rStyle w:val="Hyperlink"/>
@@ -10883,7 +13737,7 @@
         </w:rPr>
         <w:t xml:space="preserve">; </w:t>
       </w:r>
-      <w:hyperlink w:history="1" r:id="rIdt03075ps7cexhaxn3u8j2">
+      <w:hyperlink w:history="1" r:id="rIdsrarboipwt7-t4oy7ztxm">
         <w:r>
           <w:rPr>
             <w:rStyle w:val="Hyperlink"/>
@@ -11104,7 +13958,7 @@
         </w:rPr>
         <w:t xml:space="preserve">Acervo do Diário Oficial coletado, 161 eventos entre 2025 e 2026, com digest de cada edição — </w:t>
       </w:r>
-      <w:hyperlink w:history="1" r:id="rIdtitlqypesbc-skptc3ofn">
+      <w:hyperlink w:history="1" r:id="rId13jx3hvedzjdiuce5r5ch">
         <w:r>
           <w:rPr>
             <w:rStyle w:val="Hyperlink"/>
@@ -11141,7 +13995,7 @@
         </w:rPr>
         <w:t xml:space="preserve">Onde deveria estar publicado. </w:t>
       </w:r>
-      <w:hyperlink w:history="1" r:id="rIdftcfr0uivsijan-m6iyxj">
+      <w:hyperlink w:history="1" r:id="rIde6kapr01jnlerw487oqhw">
         <w:r>
           <w:rPr>
             <w:rStyle w:val="Hyperlink"/>
@@ -11362,7 +14216,7 @@
         </w:rPr>
         <w:t xml:space="preserve">Acervo do Diário Oficial coletado, 161 eventos entre 2025 e 2026, com digest de cada edição — </w:t>
       </w:r>
-      <w:hyperlink w:history="1" r:id="rIdnflavqhhyikaufyej6_c_">
+      <w:hyperlink w:history="1" r:id="rIdzx7fhne0ivoo1fv2u1vm8">
         <w:r>
           <w:rPr>
             <w:rStyle w:val="Hyperlink"/>
@@ -11399,7 +14253,7 @@
         </w:rPr>
         <w:t xml:space="preserve">Onde deveria estar publicado. </w:t>
       </w:r>
-      <w:hyperlink w:history="1" r:id="rIdel-b2m7w1_2l7abr7zn9b">
+      <w:hyperlink w:history="1" r:id="rIdxlw4iiktv3knzglqvefeo">
         <w:r>
           <w:rPr>
             <w:rStyle w:val="Hyperlink"/>
@@ -11639,7 +14493,7 @@
         </w:rPr>
         <w:t xml:space="preserve">Acervo do Diário Oficial coletado, 161 eventos entre 2025 e 2026, com digest de cada edição — </w:t>
       </w:r>
-      <w:hyperlink w:history="1" r:id="rIdzafla8eogyiql5yu6gx70">
+      <w:hyperlink w:history="1" r:id="rIdjv0bgs_mhy5tdjymrw5fs">
         <w:r>
           <w:rPr>
             <w:rStyle w:val="Hyperlink"/>
@@ -11676,7 +14530,7 @@
         </w:rPr>
         <w:t xml:space="preserve">Onde deveria estar publicado. </w:t>
       </w:r>
-      <w:hyperlink w:history="1" r:id="rId2jgl1wbwm3sglihcfrqri">
+      <w:hyperlink w:history="1" r:id="rIdve1v_hg3krfouskag2dbz">
         <w:r>
           <w:rPr>
             <w:rStyle w:val="Hyperlink"/>
@@ -11897,7 +14751,7 @@
         </w:rPr>
         <w:t xml:space="preserve">Acervo do Diário Oficial coletado, 161 eventos entre 2025 e 2026, com digest de cada edição — </w:t>
       </w:r>
-      <w:hyperlink w:history="1" r:id="rIdq33pxs1khbq5e3khvijcr">
+      <w:hyperlink w:history="1" r:id="rId6bzhcyipuhrjot1mzxyjf">
         <w:r>
           <w:rPr>
             <w:rStyle w:val="Hyperlink"/>
@@ -11934,7 +14788,7 @@
         </w:rPr>
         <w:t xml:space="preserve">Onde deveria estar publicado. </w:t>
       </w:r>
-      <w:hyperlink w:history="1" r:id="rIdsqftuxsev1cxmmhaehjpi">
+      <w:hyperlink w:history="1" r:id="rIdro7kgtnjqqvtvcfcaw2dd">
         <w:r>
           <w:rPr>
             <w:rStyle w:val="Hyperlink"/>
@@ -12095,7 +14949,6 @@
           <w:sz w:val="24"/>
           <w:szCs w:val="24"/>
         </w:rPr>
-        <w:t xml:space="preserve">Receita e despesa</w:t>
       </w:r>
     </w:p>
     <w:p>
@@ -12112,6 +14965,363 @@
           <w:sz w:val="22"/>
           <w:szCs w:val="22"/>
         </w:rPr>
+        <w:t xml:space="preserve">CMAS-FIN-03 — 3 rubricas do Conselho são dotação simbólica</w:t>
+      </w:r>
+    </w:p>
+    <w:p>
+      <w:pPr>
+        <w:spacing w:line="276"/>
+        <w:ind w:firstLine="1133"/>
+        <w:jc w:val="both"/>
+      </w:pPr>
+      <w:r>
+        <w:rPr>
+          <w:rFonts w:ascii="Bookman Old Style" w:cs="Bookman Old Style" w:eastAsia="Bookman Old Style" w:hAnsi="Bookman Old Style"/>
+          <w:b/>
+          <w:bCs/>
+          <w:sz w:val="22"/>
+          <w:szCs w:val="22"/>
+        </w:rPr>
+        <w:t xml:space="preserve">Valor envolvido. </w:t>
+      </w:r>
+      <w:r>
+        <w:rPr>
+          <w:rFonts w:ascii="Bookman Old Style" w:cs="Bookman Old Style" w:eastAsia="Bookman Old Style" w:hAnsi="Bookman Old Style"/>
+          <w:sz w:val="22"/>
+          <w:szCs w:val="22"/>
+        </w:rPr>
+        <w:t xml:space="preserve">Não quantificável sem os documentos faltantes.</w:t>
+      </w:r>
+      <w:r>
+        <w:rPr>
+          <w:rFonts w:ascii="Bookman Old Style" w:cs="Bookman Old Style" w:eastAsia="Bookman Old Style" w:hAnsi="Bookman Old Style"/>
+          <w:sz w:val="22"/>
+          <w:szCs w:val="22"/>
+        </w:rPr>
+        <w:t xml:space="preserve"/>
+      </w:r>
+    </w:p>
+    <w:p>
+      <w:pPr>
+        <w:spacing w:line="276"/>
+        <w:ind w:firstLine="1133"/>
+        <w:jc w:val="both"/>
+      </w:pPr>
+      <w:r>
+        <w:rPr>
+          <w:rFonts w:ascii="Bookman Old Style" w:cs="Bookman Old Style" w:eastAsia="Bookman Old Style" w:hAnsi="Bookman Old Style"/>
+          <w:b/>
+          <w:bCs/>
+          <w:sz w:val="22"/>
+          <w:szCs w:val="22"/>
+        </w:rPr>
+        <w:t xml:space="preserve">Documentos que faltam. </w:t>
+      </w:r>
+      <w:r>
+        <w:rPr>
+          <w:rFonts w:ascii="Bookman Old Style" w:cs="Bookman Old Style" w:eastAsia="Bookman Old Style" w:hAnsi="Bookman Old Style"/>
+          <w:sz w:val="22"/>
+          <w:szCs w:val="22"/>
+        </w:rPr>
+        <w:t xml:space="preserve">1) Decretos de suplementação da ação 3650.0824401082.591; 2) Execução por rubrica, mostrando quais dotações simbólicas foram efetivamente ampliadas.</w:t>
+      </w:r>
+    </w:p>
+    <w:p>
+      <w:pPr>
+        <w:spacing w:line="276"/>
+        <w:ind w:firstLine="1133"/>
+        <w:jc w:val="both"/>
+      </w:pPr>
+      <w:r>
+        <w:rPr>
+          <w:rFonts w:ascii="Bookman Old Style" w:cs="Bookman Old Style" w:eastAsia="Bookman Old Style" w:hAnsi="Bookman Old Style"/>
+          <w:b/>
+          <w:bCs/>
+          <w:sz w:val="22"/>
+          <w:szCs w:val="22"/>
+        </w:rPr>
+        <w:t xml:space="preserve">Justificativa. </w:t>
+      </w:r>
+      <w:r>
+        <w:rPr>
+          <w:rFonts w:ascii="Bookman Old Style" w:cs="Bookman Old Style" w:eastAsia="Bookman Old Style" w:hAnsi="Bookman Old Style"/>
+          <w:sz w:val="22"/>
+          <w:szCs w:val="22"/>
+        </w:rPr>
+        <w:t xml:space="preserve">3 de 7 rubricas têm valor de até R$ 2.000,00, somando 5,000.00. Dotação nesse patamar não custeia atividade: existe para permitir suplementação por decreto sem abrir nova linha orçamentária. Contabilmente a rubrica existe; na prática, não financia nada enquanto não for suplementada.</w:t>
+      </w:r>
+    </w:p>
+    <w:p>
+      <w:pPr>
+        <w:spacing w:line="276"/>
+        <w:ind w:firstLine="1133"/>
+        <w:jc w:val="both"/>
+      </w:pPr>
+      <w:r>
+        <w:rPr>
+          <w:rFonts w:ascii="Bookman Old Style" w:cs="Bookman Old Style" w:eastAsia="Bookman Old Style" w:hAnsi="Bookman Old Style"/>
+          <w:i/>
+          <w:iCs/>
+          <w:sz w:val="22"/>
+          <w:szCs w:val="22"/>
+        </w:rPr>
+        <w:t xml:space="preserve">Selo: </w:t>
+      </w:r>
+      <w:r>
+        <w:rPr>
+          <w:rFonts w:ascii="Bookman Old Style" w:cs="Bookman Old Style" w:eastAsia="Bookman Old Style" w:hAnsi="Bookman Old Style"/>
+          <w:i/>
+          <w:iCs/>
+          <w:sz w:val="22"/>
+          <w:szCs w:val="22"/>
+        </w:rPr>
+        <w:t xml:space="preserve">Confirmado</w:t>
+      </w:r>
+      <w:r>
+        <w:rPr>
+          <w:rFonts w:ascii="Bookman Old Style" w:cs="Bookman Old Style" w:eastAsia="Bookman Old Style" w:hAnsi="Bookman Old Style"/>
+          <w:i/>
+          <w:iCs/>
+          <w:sz w:val="22"/>
+          <w:szCs w:val="22"/>
+        </w:rPr>
+        <w:t xml:space="preserve">. Severidade: </w:t>
+      </w:r>
+      <w:r>
+        <w:rPr>
+          <w:rFonts w:ascii="Bookman Old Style" w:cs="Bookman Old Style" w:eastAsia="Bookman Old Style" w:hAnsi="Bookman Old Style"/>
+          <w:i/>
+          <w:iCs/>
+          <w:sz w:val="22"/>
+          <w:szCs w:val="22"/>
+        </w:rPr>
+        <w:t xml:space="preserve">Média</w:t>
+      </w:r>
+      <w:r>
+        <w:rPr>
+          <w:rFonts w:ascii="Bookman Old Style" w:cs="Bookman Old Style" w:eastAsia="Bookman Old Style" w:hAnsi="Bookman Old Style"/>
+          <w:i/>
+          <w:iCs/>
+          <w:sz w:val="22"/>
+          <w:szCs w:val="22"/>
+        </w:rPr>
+        <w:t xml:space="preserve">.</w:t>
+      </w:r>
+    </w:p>
+    <w:p>
+      <w:pPr>
+        <w:spacing w:line="276"/>
+      </w:pPr>
+      <w:r>
+        <w:rPr>
+          <w:rFonts w:ascii="Bookman Old Style" w:cs="Bookman Old Style" w:eastAsia="Bookman Old Style" w:hAnsi="Bookman Old Style"/>
+          <w:sz w:val="22"/>
+          <w:szCs w:val="22"/>
+        </w:rPr>
+        <w:t xml:space="preserve"/>
+      </w:r>
+    </w:p>
+    <w:p>
+      <w:pPr>
+        <w:pStyle w:val="Heading3"/>
+        <w:spacing w:after="100" w:before="220"/>
+        <w:jc w:val="center"/>
+      </w:pPr>
+      <w:r>
+        <w:rPr>
+          <w:rFonts w:ascii="Bookman Old Style" w:cs="Bookman Old Style" w:eastAsia="Bookman Old Style" w:hAnsi="Bookman Old Style"/>
+          <w:b/>
+          <w:bCs/>
+          <w:sz w:val="22"/>
+          <w:szCs w:val="22"/>
+        </w:rPr>
+        <w:t xml:space="preserve">CMAS-FIN-06 — Conselho ausente das metas e prioridades da Lei de Diretrizes</w:t>
+      </w:r>
+    </w:p>
+    <w:p>
+      <w:pPr>
+        <w:spacing w:line="276"/>
+        <w:ind w:firstLine="1133"/>
+        <w:jc w:val="both"/>
+      </w:pPr>
+      <w:r>
+        <w:rPr>
+          <w:rFonts w:ascii="Bookman Old Style" w:cs="Bookman Old Style" w:eastAsia="Bookman Old Style" w:hAnsi="Bookman Old Style"/>
+          <w:b/>
+          <w:bCs/>
+          <w:sz w:val="22"/>
+          <w:szCs w:val="22"/>
+        </w:rPr>
+        <w:t xml:space="preserve">Valor envolvido. </w:t>
+      </w:r>
+      <w:r>
+        <w:rPr>
+          <w:rFonts w:ascii="Bookman Old Style" w:cs="Bookman Old Style" w:eastAsia="Bookman Old Style" w:hAnsi="Bookman Old Style"/>
+          <w:sz w:val="22"/>
+          <w:szCs w:val="22"/>
+        </w:rPr>
+        <w:t xml:space="preserve">Não quantificável sem os documentos faltantes.</w:t>
+      </w:r>
+      <w:r>
+        <w:rPr>
+          <w:rFonts w:ascii="Bookman Old Style" w:cs="Bookman Old Style" w:eastAsia="Bookman Old Style" w:hAnsi="Bookman Old Style"/>
+          <w:sz w:val="22"/>
+          <w:szCs w:val="22"/>
+        </w:rPr>
+        <w:t xml:space="preserve"/>
+      </w:r>
+    </w:p>
+    <w:p>
+      <w:pPr>
+        <w:spacing w:line="276"/>
+        <w:ind w:firstLine="1133"/>
+        <w:jc w:val="both"/>
+      </w:pPr>
+      <w:r>
+        <w:rPr>
+          <w:rFonts w:ascii="Bookman Old Style" w:cs="Bookman Old Style" w:eastAsia="Bookman Old Style" w:hAnsi="Bookman Old Style"/>
+          <w:b/>
+          <w:bCs/>
+          <w:sz w:val="22"/>
+          <w:szCs w:val="22"/>
+        </w:rPr>
+        <w:t xml:space="preserve">Documentos que faltam. </w:t>
+      </w:r>
+      <w:r>
+        <w:rPr>
+          <w:rFonts w:ascii="Bookman Old Style" w:cs="Bookman Old Style" w:eastAsia="Bookman Old Style" w:hAnsi="Bookman Old Style"/>
+          <w:sz w:val="22"/>
+          <w:szCs w:val="22"/>
+        </w:rPr>
+        <w:t xml:space="preserve">1) Plano Plurianual 2026-2029, na parte de assistência social; 2) Justificativa da inclusão de manutenção de cemitérios no setor de assistência social.</w:t>
+      </w:r>
+    </w:p>
+    <w:p>
+      <w:pPr>
+        <w:spacing w:line="276"/>
+        <w:ind w:firstLine="1133"/>
+        <w:jc w:val="both"/>
+      </w:pPr>
+      <w:r>
+        <w:rPr>
+          <w:rFonts w:ascii="Bookman Old Style" w:cs="Bookman Old Style" w:eastAsia="Bookman Old Style" w:hAnsi="Bookman Old Style"/>
+          <w:b/>
+          <w:bCs/>
+          <w:sz w:val="22"/>
+          <w:szCs w:val="22"/>
+        </w:rPr>
+        <w:t xml:space="preserve">Justificativa. </w:t>
+      </w:r>
+      <w:r>
+        <w:rPr>
+          <w:rFonts w:ascii="Bookman Old Style" w:cs="Bookman Old Style" w:eastAsia="Bookman Old Style" w:hAnsi="Bookman Old Style"/>
+          <w:sz w:val="22"/>
+          <w:szCs w:val="22"/>
+        </w:rPr>
+        <w:t xml:space="preserve">O Anexo III da Lei de Diretrizes Orçamentárias 11.589/2026 elenca, no setor de políticas para mulher, direitos humanos e assistência social, a meta de R$ 41.265.955,98, com cinco ações — inclusive manutenção de cemitérios. O Conselho não figura entre elas.</w:t>
+      </w:r>
+    </w:p>
+    <w:p>
+      <w:pPr>
+        <w:spacing w:line="276"/>
+        <w:ind w:firstLine="1133"/>
+        <w:jc w:val="both"/>
+      </w:pPr>
+      <w:r>
+        <w:rPr>
+          <w:rFonts w:ascii="Bookman Old Style" w:cs="Bookman Old Style" w:eastAsia="Bookman Old Style" w:hAnsi="Bookman Old Style"/>
+          <w:i/>
+          <w:iCs/>
+          <w:sz w:val="22"/>
+          <w:szCs w:val="22"/>
+        </w:rPr>
+        <w:t xml:space="preserve">Selo: </w:t>
+      </w:r>
+      <w:r>
+        <w:rPr>
+          <w:rFonts w:ascii="Bookman Old Style" w:cs="Bookman Old Style" w:eastAsia="Bookman Old Style" w:hAnsi="Bookman Old Style"/>
+          <w:i/>
+          <w:iCs/>
+          <w:sz w:val="22"/>
+          <w:szCs w:val="22"/>
+        </w:rPr>
+        <w:t xml:space="preserve">Confirmado</w:t>
+      </w:r>
+      <w:r>
+        <w:rPr>
+          <w:rFonts w:ascii="Bookman Old Style" w:cs="Bookman Old Style" w:eastAsia="Bookman Old Style" w:hAnsi="Bookman Old Style"/>
+          <w:i/>
+          <w:iCs/>
+          <w:sz w:val="22"/>
+          <w:szCs w:val="22"/>
+        </w:rPr>
+        <w:t xml:space="preserve">. Severidade: </w:t>
+      </w:r>
+      <w:r>
+        <w:rPr>
+          <w:rFonts w:ascii="Bookman Old Style" w:cs="Bookman Old Style" w:eastAsia="Bookman Old Style" w:hAnsi="Bookman Old Style"/>
+          <w:i/>
+          <w:iCs/>
+          <w:sz w:val="22"/>
+          <w:szCs w:val="22"/>
+        </w:rPr>
+        <w:t xml:space="preserve">Média</w:t>
+      </w:r>
+      <w:r>
+        <w:rPr>
+          <w:rFonts w:ascii="Bookman Old Style" w:cs="Bookman Old Style" w:eastAsia="Bookman Old Style" w:hAnsi="Bookman Old Style"/>
+          <w:i/>
+          <w:iCs/>
+          <w:sz w:val="22"/>
+          <w:szCs w:val="22"/>
+        </w:rPr>
+        <w:t xml:space="preserve">.</w:t>
+      </w:r>
+    </w:p>
+    <w:p>
+      <w:pPr>
+        <w:spacing w:line="276"/>
+      </w:pPr>
+      <w:r>
+        <w:rPr>
+          <w:rFonts w:ascii="Bookman Old Style" w:cs="Bookman Old Style" w:eastAsia="Bookman Old Style" w:hAnsi="Bookman Old Style"/>
+          <w:sz w:val="22"/>
+          <w:szCs w:val="22"/>
+        </w:rPr>
+        <w:t xml:space="preserve"/>
+      </w:r>
+    </w:p>
+    <w:p>
+      <w:pPr>
+        <w:pStyle w:val="Heading2"/>
+        <w:spacing w:after="120" w:before="240"/>
+        <w:jc w:val="center"/>
+      </w:pPr>
+      <w:r>
+        <w:rPr>
+          <w:rFonts w:ascii="Bookman Old Style" w:cs="Bookman Old Style" w:eastAsia="Bookman Old Style" w:hAnsi="Bookman Old Style"/>
+          <w:b/>
+          <w:bCs/>
+          <w:sz w:val="24"/>
+          <w:szCs w:val="24"/>
+        </w:rPr>
+        <w:t xml:space="preserve">Receita e despesa</w:t>
+      </w:r>
+    </w:p>
+    <w:p>
+      <w:pPr>
+        <w:pStyle w:val="Heading3"/>
+        <w:spacing w:after="100" w:before="220"/>
+        <w:jc w:val="center"/>
+      </w:pPr>
+      <w:r>
+        <w:rPr>
+          <w:rFonts w:ascii="Bookman Old Style" w:cs="Bookman Old Style" w:eastAsia="Bookman Old Style" w:hAnsi="Bookman Old Style"/>
+          <w:b/>
+          <w:bCs/>
+          <w:sz w:val="22"/>
+          <w:szCs w:val="22"/>
+        </w:rPr>
         <w:t xml:space="preserve">REC-03 — Rendimento de aplicação incompatível com execução regular</w:t>
       </w:r>
     </w:p>
@@ -12174,7 +15384,7 @@
         </w:rPr>
         <w:t xml:space="preserve">Lei Orçamentária Anual 11.590/2026, anexos, Diário Oficial do Município, Edição 8697, de 09/01/2026, Edição Extra — </w:t>
       </w:r>
-      <w:hyperlink w:history="1" r:id="rIdaqkjm6qm0mgpwhryacxy7">
+      <w:hyperlink w:history="1" r:id="rId_52vq4gchojjkl4r4gh7w">
         <w:r>
           <w:rPr>
             <w:rStyle w:val="Hyperlink"/>
@@ -12202,7 +15412,7 @@
         </w:rPr>
         <w:t xml:space="preserve">Acervo do Diário Oficial coletado, 161 eventos entre 2025 e 2026, com digest de cada edição — </w:t>
       </w:r>
-      <w:hyperlink w:history="1" r:id="rIde6crjndofji8zeb0p_szd">
+      <w:hyperlink w:history="1" r:id="rIda8ovaid4ooretzgk9ytuc">
         <w:r>
           <w:rPr>
             <w:rStyle w:val="Hyperlink"/>
@@ -12239,7 +15449,7 @@
         </w:rPr>
         <w:t xml:space="preserve">Onde deveria estar publicado. </w:t>
       </w:r>
-      <w:hyperlink w:history="1" r:id="rIdxc9lf1g26cl_f0vdltgrd">
+      <w:hyperlink w:history="1" r:id="rIddkohfd1bssmt5mphkjxal">
         <w:r>
           <w:rPr>
             <w:rStyle w:val="Hyperlink"/>
@@ -12483,7 +15693,7 @@
         </w:rPr>
         <w:t xml:space="preserve">Acervo do Diário Oficial coletado, 161 eventos entre 2025 e 2026, com digest de cada edição — </w:t>
       </w:r>
-      <w:hyperlink w:history="1" r:id="rIdmko3seiv4925y2pw0k8ul">
+      <w:hyperlink w:history="1" r:id="rIdw5ldgqm7tnzkdhrz8nfbf">
         <w:r>
           <w:rPr>
             <w:rStyle w:val="Hyperlink"/>
@@ -12520,7 +15730,7 @@
         </w:rPr>
         <w:t xml:space="preserve">Onde deveria estar publicado. </w:t>
       </w:r>
-      <w:hyperlink w:history="1" r:id="rIdvovbeu8zd5tpykfhisxp6">
+      <w:hyperlink w:history="1" r:id="rIdkpdfxqc3vkn90ka_wcgsq">
         <w:r>
           <w:rPr>
             <w:rStyle w:val="Hyperlink"/>
@@ -12758,7 +15968,7 @@
         </w:rPr>
         <w:t xml:space="preserve">Acervo do Diário Oficial coletado, 161 eventos entre 2025 e 2026, com digest de cada edição — </w:t>
       </w:r>
-      <w:hyperlink w:history="1" r:id="rIdpmc9bxziwaktil8_mipmu">
+      <w:hyperlink w:history="1" r:id="rIdl964kw0bteany1g8ukgfv">
         <w:r>
           <w:rPr>
             <w:rStyle w:val="Hyperlink"/>
@@ -12795,7 +16005,7 @@
         </w:rPr>
         <w:t xml:space="preserve">Onde deveria estar publicado. </w:t>
       </w:r>
-      <w:hyperlink w:history="1" r:id="rIdezeirvmj2brj0z_whggkn">
+      <w:hyperlink w:history="1" r:id="rIddcc0aadbf4o9wm1644u78">
         <w:r>
           <w:rPr>
             <w:rStyle w:val="Hyperlink"/>
@@ -12961,7 +16171,7 @@
           <w:sz w:val="26"/>
           <w:szCs w:val="26"/>
         </w:rPr>
-        <w:t xml:space="preserve">VI — Providências</w:t>
+        <w:t xml:space="preserve">VIII — Providências</w:t>
       </w:r>
     </w:p>
     <w:p>
@@ -12996,7 +16206,7 @@
         </w:rPr>
         <w:t xml:space="preserve"> Canal: </w:t>
       </w:r>
-      <w:hyperlink w:history="1" r:id="rIdyb2p2abl-hwdbxii0k_gs">
+      <w:hyperlink w:history="1" r:id="rIdui2yftmmjrcpa11k8jpsl">
         <w:r>
           <w:rPr>
             <w:rStyle w:val="Hyperlink"/>
@@ -13062,7 +16272,7 @@
         </w:rPr>
         <w:t xml:space="preserve"> Canal: </w:t>
       </w:r>
-      <w:hyperlink w:history="1" r:id="rIdxhxg-ci4lwmvbg-96iqks">
+      <w:hyperlink w:history="1" r:id="rIdvwgyl4dmmzhrqlabofxg_">
         <w:r>
           <w:rPr>
             <w:rStyle w:val="Hyperlink"/>
@@ -13166,7 +16376,7 @@
         </w:rPr>
         <w:t xml:space="preserve"> Canal: </w:t>
       </w:r>
-      <w:hyperlink w:history="1" r:id="rIdilvjg7t1tnt3hejoz3eim">
+      <w:hyperlink w:history="1" r:id="rIdbik_m0c4k0j9hwsbmcl9_">
         <w:r>
           <w:rPr>
             <w:rStyle w:val="Hyperlink"/>
@@ -13214,7 +16424,7 @@
           <w:sz w:val="26"/>
           <w:szCs w:val="26"/>
         </w:rPr>
-        <w:t xml:space="preserve">VII — Ressalva</w:t>
+        <w:t xml:space="preserve">IX — Ressalva</w:t>
       </w:r>
     </w:p>
     <w:p>

</xml_diff>

<commit_message>
achados do Conselho com fonte, destino e valor mapeados; formato brasileiro de moeda
</commit_message>
<xml_diff>
--- a/relatorios/Parecer_Fiscalizacao_2026.docx
+++ b/relatorios/Parecer_Fiscalizacao_2026.docx
@@ -291,7 +291,7 @@
         </w:rPr>
         <w:t xml:space="preserve">. Documento consultado em: </w:t>
       </w:r>
-      <w:hyperlink w:history="1" r:id="rIdzy1z_j9ih2tpxxvy8jckt">
+      <w:hyperlink w:history="1" r:id="rIdnuwbcxyeonmvhumtsysho">
         <w:r>
           <w:rPr>
             <w:rStyle w:val="Hyperlink"/>
@@ -2210,7 +2210,7 @@
         </w:rPr>
         <w:t xml:space="preserve">Deveria estar em: </w:t>
       </w:r>
-      <w:hyperlink w:history="1" r:id="rId894seod4qareloaxpvsic">
+      <w:hyperlink w:history="1" r:id="rIdykd8sfzerjvzgtacb_8zp">
         <w:r>
           <w:rPr>
             <w:rStyle w:val="Hyperlink"/>
@@ -2284,7 +2284,7 @@
         </w:rPr>
         <w:t xml:space="preserve">Deveria estar em: </w:t>
       </w:r>
-      <w:hyperlink w:history="1" r:id="rIdrjee5xsjokrbpcjlzbzlw">
+      <w:hyperlink w:history="1" r:id="rIdgbdrhm51af-ywu3qtjlyt">
         <w:r>
           <w:rPr>
             <w:rStyle w:val="Hyperlink"/>
@@ -2358,7 +2358,7 @@
         </w:rPr>
         <w:t xml:space="preserve">Deveria estar em: </w:t>
       </w:r>
-      <w:hyperlink w:history="1" r:id="rId4wptjuidmyohn-ndhh9qn">
+      <w:hyperlink w:history="1" r:id="rIdovamvdix0x71pjrbqifms">
         <w:r>
           <w:rPr>
             <w:rStyle w:val="Hyperlink"/>
@@ -2432,7 +2432,7 @@
         </w:rPr>
         <w:t xml:space="preserve">Deveria estar em: </w:t>
       </w:r>
-      <w:hyperlink w:history="1" r:id="rIdh73lq_fxcvsjcvw2gkozo">
+      <w:hyperlink w:history="1" r:id="rIdxfz2pqfvgy3u_lnuk68df">
         <w:r>
           <w:rPr>
             <w:rStyle w:val="Hyperlink"/>
@@ -2506,7 +2506,7 @@
         </w:rPr>
         <w:t xml:space="preserve">Deveria estar em: </w:t>
       </w:r>
-      <w:hyperlink w:history="1" r:id="rId5xdgn39v63gymdw2rok7r">
+      <w:hyperlink w:history="1" r:id="rIdtludpezosl4jziacxhj2w">
         <w:r>
           <w:rPr>
             <w:rStyle w:val="Hyperlink"/>
@@ -2580,7 +2580,7 @@
         </w:rPr>
         <w:t xml:space="preserve">Deveria estar em: </w:t>
       </w:r>
-      <w:hyperlink w:history="1" r:id="rIdtrauqdphxouqbjmf0ldao">
+      <w:hyperlink w:history="1" r:id="rIdftovjpw6x2defnvq0mbex">
         <w:r>
           <w:rPr>
             <w:rStyle w:val="Hyperlink"/>
@@ -4900,7 +4900,7 @@
         </w:rPr>
         <w:t xml:space="preserve">A versão interativa desta trilha, com o detalhe de cada contrato, está em </w:t>
       </w:r>
-      <w:hyperlink w:history="1" r:id="rIdkczr48e4xabpqh2eyfmwc">
+      <w:hyperlink w:history="1" r:id="rIdtxaedoqlfkpt54ydo9ocv">
         <w:r>
           <w:rPr>
             <w:rStyle w:val="Hyperlink"/>
@@ -5817,7 +5817,7 @@
         </w:rPr>
         <w:t xml:space="preserve">A versão didática desta trilha, feita para leitura por quem não é da área, está em </w:t>
       </w:r>
-      <w:hyperlink w:history="1" r:id="rIdtslix7gspearof4mhazpi">
+      <w:hyperlink w:history="1" r:id="rIdlwhj9tlq6n5kjjgxlfvsd">
         <w:r>
           <w:rPr>
             <w:rStyle w:val="Hyperlink"/>
@@ -7923,7 +7923,7 @@
         </w:rPr>
         <w:t xml:space="preserve">Diário Oficial do Município, Edição 8830, última edição publicada, 29/07/2026 — </w:t>
       </w:r>
-      <w:hyperlink w:history="1" r:id="rId3kfvii1-s984i6ht4eh7z">
+      <w:hyperlink w:history="1" r:id="rIdztmknvl3vhekeznqwsmfv">
         <w:r>
           <w:rPr>
             <w:rStyle w:val="Hyperlink"/>
@@ -7951,7 +7951,7 @@
         </w:rPr>
         <w:t xml:space="preserve">Acervo do Diário Oficial coletado, 161 eventos entre 2025 e 2026, com digest de cada edição — </w:t>
       </w:r>
-      <w:hyperlink w:history="1" r:id="rIdn2ygo-t3cf-beghtntpc1">
+      <w:hyperlink w:history="1" r:id="rIdrdz5crh72yaa9neneetu1">
         <w:r>
           <w:rPr>
             <w:rStyle w:val="Hyperlink"/>
@@ -7988,7 +7988,7 @@
         </w:rPr>
         <w:t xml:space="preserve">Onde deveria estar publicado. </w:t>
       </w:r>
-      <w:hyperlink w:history="1" r:id="rIdz_rwqxvpdo7v0bxngqngv">
+      <w:hyperlink w:history="1" r:id="rIdgvtaa1tzaw3hvvotvi-jr">
         <w:r>
           <w:rPr>
             <w:rStyle w:val="Hyperlink"/>
@@ -8215,7 +8215,7 @@
         </w:rPr>
         <w:t xml:space="preserve">Acervo do Diário Oficial coletado, 161 eventos entre 2025 e 2026, com digest de cada edição — </w:t>
       </w:r>
-      <w:hyperlink w:history="1" r:id="rId0wggbda-axcr6wr-amufx">
+      <w:hyperlink w:history="1" r:id="rIdl7y-t-tagip8okb4sqdj6">
         <w:r>
           <w:rPr>
             <w:rStyle w:val="Hyperlink"/>
@@ -8243,7 +8243,7 @@
         </w:rPr>
         <w:t xml:space="preserve">Sítio próprio do Conselho, sem documento posterior a dezembro de 2023 — </w:t>
       </w:r>
-      <w:hyperlink w:history="1" r:id="rIdb10dq_bdncgwerh3e3fgc">
+      <w:hyperlink w:history="1" r:id="rIdvh7b3r9btpm4wqu3jjnqv">
         <w:r>
           <w:rPr>
             <w:rStyle w:val="Hyperlink"/>
@@ -8280,7 +8280,7 @@
         </w:rPr>
         <w:t xml:space="preserve">Onde deveria estar publicado. </w:t>
       </w:r>
-      <w:hyperlink w:history="1" r:id="rIdxddg6vzgaueiitrgebyae">
+      <w:hyperlink w:history="1" r:id="rIdztvunmughqaog-yitnkep">
         <w:r>
           <w:rPr>
             <w:rStyle w:val="Hyperlink"/>
@@ -8300,7 +8300,7 @@
         </w:rPr>
         <w:t xml:space="preserve">; </w:t>
       </w:r>
-      <w:hyperlink w:history="1" r:id="rIdq51qid80iylfkrkmbokmh">
+      <w:hyperlink w:history="1" r:id="rIdcrq_yznivtvggds9uetad">
         <w:r>
           <w:rPr>
             <w:rStyle w:val="Hyperlink"/>
@@ -8499,207 +8499,20 @@
       <w:r>
         <w:rPr>
           <w:rFonts w:ascii="Bookman Old Style" w:cs="Bookman Old Style" w:eastAsia="Bookman Old Style" w:hAnsi="Bookman Old Style"/>
-          <w:sz w:val="22"/>
-          <w:szCs w:val="22"/>
-        </w:rPr>
-        <w:t xml:space="preserve">Não quantificável sem os documentos faltantes.</w:t>
-      </w:r>
-      <w:r>
-        <w:rPr>
-          <w:rFonts w:ascii="Bookman Old Style" w:cs="Bookman Old Style" w:eastAsia="Bookman Old Style" w:hAnsi="Bookman Old Style"/>
-          <w:sz w:val="22"/>
-          <w:szCs w:val="22"/>
-        </w:rPr>
-        <w:t xml:space="preserve"/>
-      </w:r>
-    </w:p>
-    <w:p>
-      <w:pPr>
-        <w:spacing w:line="276"/>
-        <w:ind w:firstLine="1133"/>
-        <w:jc w:val="both"/>
-      </w:pPr>
-      <w:r>
-        <w:rPr>
-          <w:rFonts w:ascii="Bookman Old Style" w:cs="Bookman Old Style" w:eastAsia="Bookman Old Style" w:hAnsi="Bookman Old Style"/>
-          <w:b/>
-          <w:bCs/>
-          <w:sz w:val="22"/>
-          <w:szCs w:val="22"/>
-        </w:rPr>
-        <w:t xml:space="preserve">Documentos que faltam. </w:t>
-      </w:r>
-      <w:r>
-        <w:rPr>
-          <w:rFonts w:ascii="Bookman Old Style" w:cs="Bookman Old Style" w:eastAsia="Bookman Old Style" w:hAnsi="Bookman Old Style"/>
-          <w:sz w:val="22"/>
-          <w:szCs w:val="22"/>
-        </w:rPr>
-        <w:t xml:space="preserve">1) Consulta de Pagamentos do Fundo Nacional, por competência e bloco; 2) Extrato da conta específica do Índice de Gestão Descentralizada; 3) Prestação de contas quadrimestral prevista no artigo 6º, parágrafo 5º; 4) Quadro de Detalhamento com dotação identificada como fortalecimento do controle social.</w:t>
-      </w:r>
-    </w:p>
-    <w:p>
-      <w:pPr>
-        <w:spacing w:line="276"/>
-        <w:ind w:firstLine="1133"/>
-        <w:jc w:val="both"/>
-      </w:pPr>
-      <w:r>
-        <w:rPr>
-          <w:rFonts w:ascii="Bookman Old Style" w:cs="Bookman Old Style" w:eastAsia="Bookman Old Style" w:hAnsi="Bookman Old Style"/>
-          <w:b/>
-          <w:bCs/>
-          <w:sz w:val="22"/>
-          <w:szCs w:val="22"/>
-        </w:rPr>
-        <w:t xml:space="preserve">Justificativa. </w:t>
-      </w:r>
-      <w:r>
-        <w:rPr>
-          <w:rFonts w:ascii="Bookman Old Style" w:cs="Bookman Old Style" w:eastAsia="Bookman Old Style" w:hAnsi="Bookman Old Style"/>
-          <w:sz w:val="22"/>
-          <w:szCs w:val="22"/>
-        </w:rPr>
-        <w:t xml:space="preserve">Dos 256,000.00 da ação, apenas 16,000.00 vêm da fonte 1660, onde trafega o Índice de Gestão Descentralizada. O devido é 70,670.72. Os 240,000.00 de fonte estadual contam como outra fonte de financiamento, admitida na parte final do artigo 6º, mas não substituem o piso federal.</w:t>
-      </w:r>
-    </w:p>
-    <w:p>
-      <w:pPr>
-        <w:spacing w:line="276"/>
-        <w:ind w:firstLine="1133"/>
-        <w:jc w:val="both"/>
-      </w:pPr>
-      <w:r>
-        <w:rPr>
-          <w:rFonts w:ascii="Bookman Old Style" w:cs="Bookman Old Style" w:eastAsia="Bookman Old Style" w:hAnsi="Bookman Old Style"/>
-          <w:i/>
-          <w:iCs/>
-          <w:sz w:val="22"/>
-          <w:szCs w:val="22"/>
-        </w:rPr>
-        <w:t xml:space="preserve">Selo: </w:t>
-      </w:r>
-      <w:r>
-        <w:rPr>
-          <w:rFonts w:ascii="Bookman Old Style" w:cs="Bookman Old Style" w:eastAsia="Bookman Old Style" w:hAnsi="Bookman Old Style"/>
-          <w:i/>
-          <w:iCs/>
-          <w:sz w:val="22"/>
-          <w:szCs w:val="22"/>
-        </w:rPr>
-        <w:t xml:space="preserve">Confirmado</w:t>
-      </w:r>
-      <w:r>
-        <w:rPr>
-          <w:rFonts w:ascii="Bookman Old Style" w:cs="Bookman Old Style" w:eastAsia="Bookman Old Style" w:hAnsi="Bookman Old Style"/>
-          <w:i/>
-          <w:iCs/>
-          <w:sz w:val="22"/>
-          <w:szCs w:val="22"/>
-        </w:rPr>
-        <w:t xml:space="preserve">. Severidade: </w:t>
-      </w:r>
-      <w:r>
-        <w:rPr>
-          <w:rFonts w:ascii="Bookman Old Style" w:cs="Bookman Old Style" w:eastAsia="Bookman Old Style" w:hAnsi="Bookman Old Style"/>
-          <w:i/>
-          <w:iCs/>
-          <w:sz w:val="22"/>
-          <w:szCs w:val="22"/>
-        </w:rPr>
-        <w:t xml:space="preserve">Crítica</w:t>
-      </w:r>
-      <w:r>
-        <w:rPr>
-          <w:rFonts w:ascii="Bookman Old Style" w:cs="Bookman Old Style" w:eastAsia="Bookman Old Style" w:hAnsi="Bookman Old Style"/>
-          <w:i/>
-          <w:iCs/>
-          <w:sz w:val="22"/>
-          <w:szCs w:val="22"/>
-        </w:rPr>
-        <w:t xml:space="preserve">.</w:t>
-      </w:r>
-    </w:p>
-    <w:p>
-      <w:pPr>
-        <w:spacing w:line="276"/>
-      </w:pPr>
-      <w:r>
-        <w:rPr>
-          <w:rFonts w:ascii="Bookman Old Style" w:cs="Bookman Old Style" w:eastAsia="Bookman Old Style" w:hAnsi="Bookman Old Style"/>
-          <w:sz w:val="22"/>
-          <w:szCs w:val="22"/>
-        </w:rPr>
-        <w:t xml:space="preserve"/>
-      </w:r>
-    </w:p>
-    <w:p>
-      <w:pPr>
-        <w:pStyle w:val="Heading2"/>
-        <w:spacing w:after="120" w:before="240"/>
-        <w:jc w:val="center"/>
-      </w:pPr>
-      <w:r>
-        <w:rPr>
-          <w:rFonts w:ascii="Bookman Old Style" w:cs="Bookman Old Style" w:eastAsia="Bookman Old Style" w:hAnsi="Bookman Old Style"/>
-          <w:b/>
-          <w:bCs/>
-          <w:sz w:val="24"/>
-          <w:szCs w:val="24"/>
-        </w:rPr>
-        <w:t xml:space="preserve">Receita e despesa</w:t>
-      </w:r>
-    </w:p>
-    <w:p>
-      <w:pPr>
-        <w:pStyle w:val="Heading3"/>
-        <w:spacing w:after="100" w:before="220"/>
-        <w:jc w:val="center"/>
-      </w:pPr>
-      <w:r>
-        <w:rPr>
-          <w:rFonts w:ascii="Bookman Old Style" w:cs="Bookman Old Style" w:eastAsia="Bookman Old Style" w:hAnsi="Bookman Old Style"/>
-          <w:b/>
-          <w:bCs/>
-          <w:sz w:val="22"/>
-          <w:szCs w:val="22"/>
-        </w:rPr>
-        <w:t xml:space="preserve">REC-01 — Aporte próprio do Município no Fundo é simbólico</w:t>
-      </w:r>
-    </w:p>
-    <w:p>
-      <w:pPr>
-        <w:spacing w:line="276"/>
-        <w:ind w:firstLine="1133"/>
-        <w:jc w:val="both"/>
-      </w:pPr>
-      <w:r>
-        <w:rPr>
-          <w:rFonts w:ascii="Bookman Old Style" w:cs="Bookman Old Style" w:eastAsia="Bookman Old Style" w:hAnsi="Bookman Old Style"/>
-          <w:b/>
-          <w:bCs/>
-          <w:sz w:val="22"/>
-          <w:szCs w:val="22"/>
-        </w:rPr>
-        <w:t xml:space="preserve">Valor envolvido. </w:t>
-      </w:r>
-      <w:r>
-        <w:rPr>
-          <w:rFonts w:ascii="Bookman Old Style" w:cs="Bookman Old Style" w:eastAsia="Bookman Old Style" w:hAnsi="Bookman Old Style"/>
-          <w:b/>
-          <w:bCs/>
-          <w:sz w:val="22"/>
-          <w:szCs w:val="22"/>
-        </w:rPr>
-        <w:t xml:space="preserve">R$ 9.000,00</w:t>
-      </w:r>
-      <w:r>
-        <w:rPr>
-          <w:rFonts w:ascii="Bookman Old Style" w:cs="Bookman Old Style" w:eastAsia="Bookman Old Style" w:hAnsi="Bookman Old Style"/>
-          <w:sz w:val="22"/>
-          <w:szCs w:val="22"/>
-        </w:rPr>
-        <w:t xml:space="preserve"> — aporte próprio do Município, contra R$ 17.354.000,00 recebidos da União e do Estado</w:t>
+          <w:b/>
+          <w:bCs/>
+          <w:sz w:val="22"/>
+          <w:szCs w:val="22"/>
+        </w:rPr>
+        <w:t xml:space="preserve">R$ 70.670,72</w:t>
+      </w:r>
+      <w:r>
+        <w:rPr>
+          <w:rFonts w:ascii="Bookman Old Style" w:cs="Bookman Old Style" w:eastAsia="Bookman Old Style" w:hAnsi="Bookman Old Style"/>
+          <w:sz w:val="22"/>
+          <w:szCs w:val="22"/>
+        </w:rPr>
+        <w:t xml:space="preserve"> — devidos ao controle social pelo piso federal do Índice</w:t>
       </w:r>
     </w:p>
     <w:p>
@@ -8724,9 +8537,9 @@
           <w:sz w:val="22"/>
           <w:szCs w:val="22"/>
         </w:rPr>
-        <w:t xml:space="preserve">Lei Orçamentária Anual 11.590/2026, anexos, Diário Oficial do Município, Edição 8697, de 09/01/2026, Edição Extra — </w:t>
-      </w:r>
-      <w:hyperlink w:history="1" r:id="rIdesnnk-py-mdzz2kh44z5x">
+        <w:t xml:space="preserve">Quadro de Detalhamento de Despesas 2026, anexos da Lei Orçamentária 11.590/2026, ação 3650.0824401082.591 — </w:t>
+      </w:r>
+      <w:hyperlink w:history="1" r:id="rIdrtpv2nmpplwk3ghfvpqhu">
         <w:r>
           <w:rPr>
             <w:rStyle w:val="Hyperlink"/>
@@ -8752,9 +8565,9 @@
           <w:sz w:val="22"/>
           <w:szCs w:val="22"/>
         </w:rPr>
-        <w:t xml:space="preserve">Lei Orçamentária Anual 11.315/2025, anexos, Diário Oficial do Município, de 07/01/2025 — </w:t>
-      </w:r>
-      <w:hyperlink w:history="1" r:id="rIdq12rzn73u_ytryrctlno1">
+        <w:t xml:space="preserve">Resolução CNAS/MDS 202/2025, Diário Oficial da União de 28/07/2025, Edição 140, Seção 1, Página 87 — </w:t>
+      </w:r>
+      <w:hyperlink w:history="1" r:id="rIdybdkozpvxnaxvpo49cvhe">
         <w:r>
           <w:rPr>
             <w:rStyle w:val="Hyperlink"/>
@@ -8791,7 +8604,326 @@
         </w:rPr>
         <w:t xml:space="preserve">Onde deveria estar publicado. </w:t>
       </w:r>
-      <w:hyperlink w:history="1" r:id="rIdj9cipwhqudqr4lhmk6tlw">
+      <w:hyperlink w:history="1" r:id="rIdbbgoorislfkzn6tkkvzri">
+        <w:r>
+          <w:rPr>
+            <w:rStyle w:val="Hyperlink"/>
+            <w:rFonts w:ascii="Bookman Old Style" w:cs="Bookman Old Style" w:eastAsia="Bookman Old Style" w:hAnsi="Bookman Old Style"/>
+            <w:sz w:val="20"/>
+            <w:szCs w:val="20"/>
+            <w:u w:val="single"/>
+          </w:rPr>
+          <w:t xml:space="preserve">Portal da Transparência, Despesas e Receitas</w:t>
+        </w:r>
+      </w:hyperlink>
+      <w:r>
+        <w:rPr>
+          <w:rFonts w:ascii="Bookman Old Style" w:cs="Bookman Old Style" w:eastAsia="Bookman Old Style" w:hAnsi="Bookman Old Style"/>
+          <w:sz w:val="22"/>
+          <w:szCs w:val="22"/>
+        </w:rPr>
+        <w:t xml:space="preserve">; </w:t>
+      </w:r>
+      <w:hyperlink w:history="1" r:id="rIdshsa2sdza4oodpt2mk_ub">
+        <w:r>
+          <w:rPr>
+            <w:rStyle w:val="Hyperlink"/>
+            <w:rFonts w:ascii="Bookman Old Style" w:cs="Bookman Old Style" w:eastAsia="Bookman Old Style" w:hAnsi="Bookman Old Style"/>
+            <w:sz w:val="20"/>
+            <w:szCs w:val="20"/>
+            <w:u w:val="single"/>
+          </w:rPr>
+          <w:t xml:space="preserve">Sítio do Conselho Municipal de Assistência Social</w:t>
+        </w:r>
+      </w:hyperlink>
+      <w:r>
+        <w:rPr>
+          <w:rFonts w:ascii="Bookman Old Style" w:cs="Bookman Old Style" w:eastAsia="Bookman Old Style" w:hAnsi="Bookman Old Style"/>
+          <w:sz w:val="22"/>
+          <w:szCs w:val="22"/>
+        </w:rPr>
+        <w:t xml:space="preserve">.</w:t>
+      </w:r>
+    </w:p>
+    <w:p>
+      <w:pPr>
+        <w:spacing w:line="276"/>
+        <w:ind w:firstLine="1133"/>
+        <w:jc w:val="both"/>
+      </w:pPr>
+      <w:r>
+        <w:rPr>
+          <w:rFonts w:ascii="Bookman Old Style" w:cs="Bookman Old Style" w:eastAsia="Bookman Old Style" w:hAnsi="Bookman Old Style"/>
+          <w:b/>
+          <w:bCs/>
+          <w:sz w:val="22"/>
+          <w:szCs w:val="22"/>
+        </w:rPr>
+        <w:t xml:space="preserve">Documentos que faltam. </w:t>
+      </w:r>
+      <w:r>
+        <w:rPr>
+          <w:rFonts w:ascii="Bookman Old Style" w:cs="Bookman Old Style" w:eastAsia="Bookman Old Style" w:hAnsi="Bookman Old Style"/>
+          <w:sz w:val="22"/>
+          <w:szCs w:val="22"/>
+        </w:rPr>
+        <w:t xml:space="preserve">1) Consulta de Pagamentos do Fundo Nacional, por competência e bloco; 2) Extrato da conta específica do Índice de Gestão Descentralizada; 3) Prestação de contas quadrimestral prevista no artigo 6º, parágrafo 5º; 4) Quadro de Detalhamento com dotação identificada como fortalecimento do controle social.</w:t>
+      </w:r>
+    </w:p>
+    <w:p>
+      <w:pPr>
+        <w:spacing w:line="276"/>
+        <w:ind w:firstLine="1133"/>
+        <w:jc w:val="both"/>
+      </w:pPr>
+      <w:r>
+        <w:rPr>
+          <w:rFonts w:ascii="Bookman Old Style" w:cs="Bookman Old Style" w:eastAsia="Bookman Old Style" w:hAnsi="Bookman Old Style"/>
+          <w:b/>
+          <w:bCs/>
+          <w:sz w:val="22"/>
+          <w:szCs w:val="22"/>
+        </w:rPr>
+        <w:t xml:space="preserve">Justificativa. </w:t>
+      </w:r>
+      <w:r>
+        <w:rPr>
+          <w:rFonts w:ascii="Bookman Old Style" w:cs="Bookman Old Style" w:eastAsia="Bookman Old Style" w:hAnsi="Bookman Old Style"/>
+          <w:sz w:val="22"/>
+          <w:szCs w:val="22"/>
+        </w:rPr>
+        <w:t xml:space="preserve">Dos R$ 256.000,00 da ação, apenas R$ 16.000,00 vêm da fonte 1660, onde trafega o Índice de Gestão Descentralizada. O devido é R$ 70.670,72. Os R$ 240.000,00 de fonte estadual contam como outra fonte de financiamento, admitida na parte final do artigo 6º, mas não substituem o piso federal.</w:t>
+      </w:r>
+    </w:p>
+    <w:p>
+      <w:pPr>
+        <w:spacing w:line="276"/>
+        <w:ind w:firstLine="1133"/>
+        <w:jc w:val="both"/>
+      </w:pPr>
+      <w:r>
+        <w:rPr>
+          <w:rFonts w:ascii="Bookman Old Style" w:cs="Bookman Old Style" w:eastAsia="Bookman Old Style" w:hAnsi="Bookman Old Style"/>
+          <w:i/>
+          <w:iCs/>
+          <w:sz w:val="22"/>
+          <w:szCs w:val="22"/>
+        </w:rPr>
+        <w:t xml:space="preserve">Selo: </w:t>
+      </w:r>
+      <w:r>
+        <w:rPr>
+          <w:rFonts w:ascii="Bookman Old Style" w:cs="Bookman Old Style" w:eastAsia="Bookman Old Style" w:hAnsi="Bookman Old Style"/>
+          <w:i/>
+          <w:iCs/>
+          <w:sz w:val="22"/>
+          <w:szCs w:val="22"/>
+        </w:rPr>
+        <w:t xml:space="preserve">Confirmado</w:t>
+      </w:r>
+      <w:r>
+        <w:rPr>
+          <w:rFonts w:ascii="Bookman Old Style" w:cs="Bookman Old Style" w:eastAsia="Bookman Old Style" w:hAnsi="Bookman Old Style"/>
+          <w:i/>
+          <w:iCs/>
+          <w:sz w:val="22"/>
+          <w:szCs w:val="22"/>
+        </w:rPr>
+        <w:t xml:space="preserve">. Severidade: </w:t>
+      </w:r>
+      <w:r>
+        <w:rPr>
+          <w:rFonts w:ascii="Bookman Old Style" w:cs="Bookman Old Style" w:eastAsia="Bookman Old Style" w:hAnsi="Bookman Old Style"/>
+          <w:i/>
+          <w:iCs/>
+          <w:sz w:val="22"/>
+          <w:szCs w:val="22"/>
+        </w:rPr>
+        <w:t xml:space="preserve">Crítica</w:t>
+      </w:r>
+      <w:r>
+        <w:rPr>
+          <w:rFonts w:ascii="Bookman Old Style" w:cs="Bookman Old Style" w:eastAsia="Bookman Old Style" w:hAnsi="Bookman Old Style"/>
+          <w:i/>
+          <w:iCs/>
+          <w:sz w:val="22"/>
+          <w:szCs w:val="22"/>
+        </w:rPr>
+        <w:t xml:space="preserve">.</w:t>
+      </w:r>
+    </w:p>
+    <w:p>
+      <w:pPr>
+        <w:spacing w:line="276"/>
+      </w:pPr>
+      <w:r>
+        <w:rPr>
+          <w:rFonts w:ascii="Bookman Old Style" w:cs="Bookman Old Style" w:eastAsia="Bookman Old Style" w:hAnsi="Bookman Old Style"/>
+          <w:sz w:val="22"/>
+          <w:szCs w:val="22"/>
+        </w:rPr>
+        <w:t xml:space="preserve"/>
+      </w:r>
+    </w:p>
+    <w:p>
+      <w:pPr>
+        <w:pStyle w:val="Heading2"/>
+        <w:spacing w:after="120" w:before="240"/>
+        <w:jc w:val="center"/>
+      </w:pPr>
+      <w:r>
+        <w:rPr>
+          <w:rFonts w:ascii="Bookman Old Style" w:cs="Bookman Old Style" w:eastAsia="Bookman Old Style" w:hAnsi="Bookman Old Style"/>
+          <w:b/>
+          <w:bCs/>
+          <w:sz w:val="24"/>
+          <w:szCs w:val="24"/>
+        </w:rPr>
+        <w:t xml:space="preserve">Receita e despesa</w:t>
+      </w:r>
+    </w:p>
+    <w:p>
+      <w:pPr>
+        <w:pStyle w:val="Heading3"/>
+        <w:spacing w:after="100" w:before="220"/>
+        <w:jc w:val="center"/>
+      </w:pPr>
+      <w:r>
+        <w:rPr>
+          <w:rFonts w:ascii="Bookman Old Style" w:cs="Bookman Old Style" w:eastAsia="Bookman Old Style" w:hAnsi="Bookman Old Style"/>
+          <w:b/>
+          <w:bCs/>
+          <w:sz w:val="22"/>
+          <w:szCs w:val="22"/>
+        </w:rPr>
+        <w:t xml:space="preserve">REC-01 — Aporte próprio do Município no Fundo é simbólico</w:t>
+      </w:r>
+    </w:p>
+    <w:p>
+      <w:pPr>
+        <w:spacing w:line="276"/>
+        <w:ind w:firstLine="1133"/>
+        <w:jc w:val="both"/>
+      </w:pPr>
+      <w:r>
+        <w:rPr>
+          <w:rFonts w:ascii="Bookman Old Style" w:cs="Bookman Old Style" w:eastAsia="Bookman Old Style" w:hAnsi="Bookman Old Style"/>
+          <w:b/>
+          <w:bCs/>
+          <w:sz w:val="22"/>
+          <w:szCs w:val="22"/>
+        </w:rPr>
+        <w:t xml:space="preserve">Valor envolvido. </w:t>
+      </w:r>
+      <w:r>
+        <w:rPr>
+          <w:rFonts w:ascii="Bookman Old Style" w:cs="Bookman Old Style" w:eastAsia="Bookman Old Style" w:hAnsi="Bookman Old Style"/>
+          <w:b/>
+          <w:bCs/>
+          <w:sz w:val="22"/>
+          <w:szCs w:val="22"/>
+        </w:rPr>
+        <w:t xml:space="preserve">R$ 9.000,00</w:t>
+      </w:r>
+      <w:r>
+        <w:rPr>
+          <w:rFonts w:ascii="Bookman Old Style" w:cs="Bookman Old Style" w:eastAsia="Bookman Old Style" w:hAnsi="Bookman Old Style"/>
+          <w:sz w:val="22"/>
+          <w:szCs w:val="22"/>
+        </w:rPr>
+        <w:t xml:space="preserve"> — aporte próprio do Município, contra R$ 17.354.000,00 recebidos da União e do Estado</w:t>
+      </w:r>
+    </w:p>
+    <w:p>
+      <w:pPr>
+        <w:spacing w:line="276"/>
+        <w:ind w:firstLine="1133"/>
+        <w:jc w:val="both"/>
+      </w:pPr>
+      <w:r>
+        <w:rPr>
+          <w:rFonts w:ascii="Bookman Old Style" w:cs="Bookman Old Style" w:eastAsia="Bookman Old Style" w:hAnsi="Bookman Old Style"/>
+          <w:b/>
+          <w:bCs/>
+          <w:sz w:val="22"/>
+          <w:szCs w:val="22"/>
+        </w:rPr>
+        <w:t xml:space="preserve">Onde o dado foi encontrado. </w:t>
+      </w:r>
+      <w:r>
+        <w:rPr>
+          <w:rFonts w:ascii="Bookman Old Style" w:cs="Bookman Old Style" w:eastAsia="Bookman Old Style" w:hAnsi="Bookman Old Style"/>
+          <w:sz w:val="22"/>
+          <w:szCs w:val="22"/>
+        </w:rPr>
+        <w:t xml:space="preserve">Lei Orçamentária Anual 11.590/2026, anexos, Diário Oficial do Município, Edição 8697, de 09/01/2026, Edição Extra — </w:t>
+      </w:r>
+      <w:hyperlink w:history="1" r:id="rIdiwkaqfebtdynbjl53lgwp">
+        <w:r>
+          <w:rPr>
+            <w:rStyle w:val="Hyperlink"/>
+            <w:rFonts w:ascii="Bookman Old Style" w:cs="Bookman Old Style" w:eastAsia="Bookman Old Style" w:hAnsi="Bookman Old Style"/>
+            <w:sz w:val="20"/>
+            <w:szCs w:val="20"/>
+            <w:u w:val="single"/>
+          </w:rPr>
+          <w:t xml:space="preserve">acessar</w:t>
+        </w:r>
+      </w:hyperlink>
+      <w:r>
+        <w:rPr>
+          <w:rFonts w:ascii="Bookman Old Style" w:cs="Bookman Old Style" w:eastAsia="Bookman Old Style" w:hAnsi="Bookman Old Style"/>
+          <w:sz w:val="22"/>
+          <w:szCs w:val="22"/>
+        </w:rPr>
+        <w:t xml:space="preserve">; </w:t>
+      </w:r>
+      <w:r>
+        <w:rPr>
+          <w:rFonts w:ascii="Bookman Old Style" w:cs="Bookman Old Style" w:eastAsia="Bookman Old Style" w:hAnsi="Bookman Old Style"/>
+          <w:sz w:val="22"/>
+          <w:szCs w:val="22"/>
+        </w:rPr>
+        <w:t xml:space="preserve">Lei Orçamentária Anual 11.315/2025, anexos, Diário Oficial do Município, de 07/01/2025 — </w:t>
+      </w:r>
+      <w:hyperlink w:history="1" r:id="rIdqxsryqbw36i0ibwzl34qu">
+        <w:r>
+          <w:rPr>
+            <w:rStyle w:val="Hyperlink"/>
+            <w:rFonts w:ascii="Bookman Old Style" w:cs="Bookman Old Style" w:eastAsia="Bookman Old Style" w:hAnsi="Bookman Old Style"/>
+            <w:sz w:val="20"/>
+            <w:szCs w:val="20"/>
+            <w:u w:val="single"/>
+          </w:rPr>
+          <w:t xml:space="preserve">acessar</w:t>
+        </w:r>
+      </w:hyperlink>
+      <w:r>
+        <w:rPr>
+          <w:rFonts w:ascii="Bookman Old Style" w:cs="Bookman Old Style" w:eastAsia="Bookman Old Style" w:hAnsi="Bookman Old Style"/>
+          <w:sz w:val="22"/>
+          <w:szCs w:val="22"/>
+        </w:rPr>
+        <w:t xml:space="preserve">.</w:t>
+      </w:r>
+    </w:p>
+    <w:p>
+      <w:pPr>
+        <w:spacing w:line="276"/>
+        <w:ind w:firstLine="1133"/>
+        <w:jc w:val="both"/>
+      </w:pPr>
+      <w:r>
+        <w:rPr>
+          <w:rFonts w:ascii="Bookman Old Style" w:cs="Bookman Old Style" w:eastAsia="Bookman Old Style" w:hAnsi="Bookman Old Style"/>
+          <w:b/>
+          <w:bCs/>
+          <w:sz w:val="22"/>
+          <w:szCs w:val="22"/>
+        </w:rPr>
+        <w:t xml:space="preserve">Onde deveria estar publicado. </w:t>
+      </w:r>
+      <w:hyperlink w:history="1" r:id="rIdntev-v7rksns36h0t9i38">
         <w:r>
           <w:rPr>
             <w:rStyle w:val="Hyperlink"/>
@@ -8811,7 +8943,7 @@
         </w:rPr>
         <w:t xml:space="preserve">; </w:t>
       </w:r>
-      <w:hyperlink w:history="1" r:id="rIdxz9pl2x22e-cjfesq_bbi">
+      <w:hyperlink w:history="1" r:id="rIdblrc4wchwpip0btzqtz8d">
         <w:r>
           <w:rPr>
             <w:rStyle w:val="Hyperlink"/>
@@ -9040,7 +9172,7 @@
         </w:rPr>
         <w:t xml:space="preserve">Acervo do Diário Oficial coletado, 161 eventos entre 2025 e 2026, com digest de cada edição — </w:t>
       </w:r>
-      <w:hyperlink w:history="1" r:id="rIdnmg58-jgnvig8vtunft_f">
+      <w:hyperlink w:history="1" r:id="rIdcshsy73wuoux5tpzv3wsv">
         <w:r>
           <w:rPr>
             <w:rStyle w:val="Hyperlink"/>
@@ -9077,7 +9209,7 @@
         </w:rPr>
         <w:t xml:space="preserve">Onde deveria estar publicado. </w:t>
       </w:r>
-      <w:hyperlink w:history="1" r:id="rIdibhfbzcs2orssuxo6u2ri">
+      <w:hyperlink w:history="1" r:id="rIdomowsx4xgofauljnauh2k">
         <w:r>
           <w:rPr>
             <w:rStyle w:val="Hyperlink"/>
@@ -9312,7 +9444,7 @@
         </w:rPr>
         <w:t xml:space="preserve">Lei Orçamentária Anual 11.590/2026, anexos, Diário Oficial do Município, Edição 8697, de 09/01/2026, Edição Extra — </w:t>
       </w:r>
-      <w:hyperlink w:history="1" r:id="rIdndpfxm7szmi8sn1xbhjmw">
+      <w:hyperlink w:history="1" r:id="rIdo9jmzs_rphesze8fpr5x9">
         <w:r>
           <w:rPr>
             <w:rStyle w:val="Hyperlink"/>
@@ -9340,7 +9472,7 @@
         </w:rPr>
         <w:t xml:space="preserve">Lei municipal 7.531/1995 — </w:t>
       </w:r>
-      <w:hyperlink w:history="1" r:id="rIds4ajo87s_afu2u99d9yny">
+      <w:hyperlink w:history="1" r:id="rIdrta3k8j7cwjstcg8hatex">
         <w:r>
           <w:rPr>
             <w:rStyle w:val="Hyperlink"/>
@@ -9377,7 +9509,7 @@
         </w:rPr>
         <w:t xml:space="preserve">Onde deveria estar publicado. </w:t>
       </w:r>
-      <w:hyperlink w:history="1" r:id="rIdebzrtxzmdckeobzusmimv">
+      <w:hyperlink w:history="1" r:id="rIdliwvr0fxa54ilcveszpp8">
         <w:r>
           <w:rPr>
             <w:rStyle w:val="Hyperlink"/>
@@ -9397,7 +9529,7 @@
         </w:rPr>
         <w:t xml:space="preserve">; </w:t>
       </w:r>
-      <w:hyperlink w:history="1" r:id="rIdapke3e_niyqb5rz56ssay">
+      <w:hyperlink w:history="1" r:id="rIdro-k3ngg8dpf_wptu6n-l">
         <w:r>
           <w:rPr>
             <w:rStyle w:val="Hyperlink"/>
@@ -9626,7 +9758,7 @@
         </w:rPr>
         <w:t xml:space="preserve">Lei Orçamentária Anual 11.590/2026, anexos, Diário Oficial do Município, Edição 8697, de 09/01/2026, Edição Extra — </w:t>
       </w:r>
-      <w:hyperlink w:history="1" r:id="rIdrspr2lm9n7qcsv_kg35ek">
+      <w:hyperlink w:history="1" r:id="rIdlowakpcfx98_gny3jzc4t">
         <w:r>
           <w:rPr>
             <w:rStyle w:val="Hyperlink"/>
@@ -9654,7 +9786,7 @@
         </w:rPr>
         <w:t xml:space="preserve">Resolução CNAS/MDS 202/2025, Diário Oficial da União de 28/07/2025, Edição 140, Seção 1, Página 87 — </w:t>
       </w:r>
-      <w:hyperlink w:history="1" r:id="rIdki-dzqo0vwtjdico2bduf">
+      <w:hyperlink w:history="1" r:id="rIdyw_ui7pdlwvl6x_ivysne">
         <w:r>
           <w:rPr>
             <w:rStyle w:val="Hyperlink"/>
@@ -9691,7 +9823,7 @@
         </w:rPr>
         <w:t xml:space="preserve">Onde deveria estar publicado. </w:t>
       </w:r>
-      <w:hyperlink w:history="1" r:id="rIdp0xcqxquz8wskfliqjnqk">
+      <w:hyperlink w:history="1" r:id="rIdsad2vjth4clkoa3ynxkfb">
         <w:r>
           <w:rPr>
             <w:rStyle w:val="Hyperlink"/>
@@ -9711,7 +9843,7 @@
         </w:rPr>
         <w:t xml:space="preserve">; </w:t>
       </w:r>
-      <w:hyperlink w:history="1" r:id="rIdp28fclcdwmorldjup4q0l">
+      <w:hyperlink w:history="1" r:id="rId8lcliotkv6r80scfp_nl0">
         <w:r>
           <w:rPr>
             <w:rStyle w:val="Hyperlink"/>
@@ -9963,7 +10095,7 @@
         </w:rPr>
         <w:t xml:space="preserve">Resolução CNAS/MDS 202/2025, Diário Oficial da União de 28/07/2025, Edição 140, Seção 1, Página 87 — </w:t>
       </w:r>
-      <w:hyperlink w:history="1" r:id="rIdfha7evchviinf_vnogte6">
+      <w:hyperlink w:history="1" r:id="rIdvfijc6jzzbssq7d8sp_t7">
         <w:r>
           <w:rPr>
             <w:rStyle w:val="Hyperlink"/>
@@ -10000,7 +10132,7 @@
         </w:rPr>
         <w:t xml:space="preserve">Onde deveria estar publicado. </w:t>
       </w:r>
-      <w:hyperlink w:history="1" r:id="rIdp14jkky8unl9kmkk-3cm-">
+      <w:hyperlink w:history="1" r:id="rIdhs8cpx7xw-xq1epv-5iaj">
         <w:r>
           <w:rPr>
             <w:rStyle w:val="Hyperlink"/>
@@ -10238,7 +10370,7 @@
         </w:rPr>
         <w:t xml:space="preserve">Sítio próprio do Conselho, sem documento posterior a dezembro de 2023 — </w:t>
       </w:r>
-      <w:hyperlink w:history="1" r:id="rIdfmluhbn1ieie3htoy96ep">
+      <w:hyperlink w:history="1" r:id="rIdgsyfyrwhlso_kf0u3iddb">
         <w:r>
           <w:rPr>
             <w:rStyle w:val="Hyperlink"/>
@@ -10275,7 +10407,7 @@
         </w:rPr>
         <w:t xml:space="preserve">Onde deveria estar publicado. </w:t>
       </w:r>
-      <w:hyperlink w:history="1" r:id="rIdqcnx-z9ynnor_f-cpafxo">
+      <w:hyperlink w:history="1" r:id="rIdczkeeaevwvqnnq0ifckzl">
         <w:r>
           <w:rPr>
             <w:rStyle w:val="Hyperlink"/>
@@ -10295,7 +10427,7 @@
         </w:rPr>
         <w:t xml:space="preserve">; </w:t>
       </w:r>
-      <w:hyperlink w:history="1" r:id="rIdy71wws-bdwiwlxa24ovwu">
+      <w:hyperlink w:history="1" r:id="rIdcc3rn6ysyskuxch-sv9sx">
         <w:r>
           <w:rPr>
             <w:rStyle w:val="Hyperlink"/>
@@ -10518,7 +10650,7 @@
         </w:rPr>
         <w:t xml:space="preserve">Acervo do Diário Oficial coletado, 161 eventos entre 2025 e 2026, com digest de cada edição — </w:t>
       </w:r>
-      <w:hyperlink w:history="1" r:id="rId7azuuambqhfckfwksodtz">
+      <w:hyperlink w:history="1" r:id="rIdzp3fwffqtxuyne1ffrh1z">
         <w:r>
           <w:rPr>
             <w:rStyle w:val="Hyperlink"/>
@@ -10555,7 +10687,7 @@
         </w:rPr>
         <w:t xml:space="preserve">Onde deveria estar publicado. </w:t>
       </w:r>
-      <w:hyperlink w:history="1" r:id="rIdfu1isboktl0uwovc_04ih">
+      <w:hyperlink w:history="1" r:id="rId4ehe7vhpkprgi3-fpzsno">
         <w:r>
           <w:rPr>
             <w:rStyle w:val="Hyperlink"/>
@@ -10575,7 +10707,7 @@
         </w:rPr>
         <w:t xml:space="preserve">; </w:t>
       </w:r>
-      <w:hyperlink w:history="1" r:id="rIdb69uepofiqc5llgap5-be">
+      <w:hyperlink w:history="1" r:id="rId-yg_bs7ystjk947rayfqf">
         <w:r>
           <w:rPr>
             <w:rStyle w:val="Hyperlink"/>
@@ -10798,7 +10930,7 @@
         </w:rPr>
         <w:t xml:space="preserve">Resolução CNAS/MDS 202/2025, Diário Oficial da União de 28/07/2025, Edição 140, Seção 1, Página 87 — </w:t>
       </w:r>
-      <w:hyperlink w:history="1" r:id="rIddchxf48sykf5yzeixuxr7">
+      <w:hyperlink w:history="1" r:id="rIdyaz8hcgmp1vkpdayifybp">
         <w:r>
           <w:rPr>
             <w:rStyle w:val="Hyperlink"/>
@@ -10835,7 +10967,7 @@
         </w:rPr>
         <w:t xml:space="preserve">Onde deveria estar publicado. </w:t>
       </w:r>
-      <w:hyperlink w:history="1" r:id="rIdsjwyxw1h40voreb9ssqxi">
+      <w:hyperlink w:history="1" r:id="rIdghz8_y97jkxo5gqpxnhvw">
         <w:r>
           <w:rPr>
             <w:rStyle w:val="Hyperlink"/>
@@ -11056,7 +11188,7 @@
         </w:rPr>
         <w:t xml:space="preserve">Acervo do Diário Oficial coletado, 161 eventos entre 2025 e 2026, com digest de cada edição — </w:t>
       </w:r>
-      <w:hyperlink w:history="1" r:id="rIdlmyoa37gmxd8690ovkwfu">
+      <w:hyperlink w:history="1" r:id="rIdfuov-cgaievhefyz0ft8r">
         <w:r>
           <w:rPr>
             <w:rStyle w:val="Hyperlink"/>
@@ -11093,7 +11225,7 @@
         </w:rPr>
         <w:t xml:space="preserve">Onde deveria estar publicado. </w:t>
       </w:r>
-      <w:hyperlink w:history="1" r:id="rIdr39d99_iu9ymeiua69l-f">
+      <w:hyperlink w:history="1" r:id="rIddfgn2sh9g1iqk9uxfmzh-">
         <w:r>
           <w:rPr>
             <w:rStyle w:val="Hyperlink"/>
@@ -11292,717 +11424,20 @@
       <w:r>
         <w:rPr>
           <w:rFonts w:ascii="Bookman Old Style" w:cs="Bookman Old Style" w:eastAsia="Bookman Old Style" w:hAnsi="Bookman Old Style"/>
-          <w:sz w:val="22"/>
-          <w:szCs w:val="22"/>
-        </w:rPr>
-        <w:t xml:space="preserve">Não quantificável sem os documentos faltantes.</w:t>
-      </w:r>
-      <w:r>
-        <w:rPr>
-          <w:rFonts w:ascii="Bookman Old Style" w:cs="Bookman Old Style" w:eastAsia="Bookman Old Style" w:hAnsi="Bookman Old Style"/>
-          <w:sz w:val="22"/>
-          <w:szCs w:val="22"/>
-        </w:rPr>
-        <w:t xml:space="preserve"/>
-      </w:r>
-    </w:p>
-    <w:p>
-      <w:pPr>
-        <w:spacing w:line="276"/>
-        <w:ind w:firstLine="1133"/>
-        <w:jc w:val="both"/>
-      </w:pPr>
-      <w:r>
-        <w:rPr>
-          <w:rFonts w:ascii="Bookman Old Style" w:cs="Bookman Old Style" w:eastAsia="Bookman Old Style" w:hAnsi="Bookman Old Style"/>
-          <w:b/>
-          <w:bCs/>
-          <w:sz w:val="22"/>
-          <w:szCs w:val="22"/>
-        </w:rPr>
-        <w:t xml:space="preserve">Documentos que faltam. </w:t>
-      </w:r>
-      <w:r>
-        <w:rPr>
-          <w:rFonts w:ascii="Bookman Old Style" w:cs="Bookman Old Style" w:eastAsia="Bookman Old Style" w:hAnsi="Bookman Old Style"/>
-          <w:sz w:val="22"/>
-          <w:szCs w:val="22"/>
-        </w:rPr>
-        <w:t xml:space="preserve">1) Relação de diárias e passagens concedidas a conselheiros em 2024, 2025 e 2026; 2) Atos de designação para conferências estaduais e nacionais; 3) Relatórios de fiscalização in loco de serviços realizados pelo Conselho.</w:t>
-      </w:r>
-    </w:p>
-    <w:p>
-      <w:pPr>
-        <w:spacing w:line="276"/>
-        <w:ind w:firstLine="1133"/>
-        <w:jc w:val="both"/>
-      </w:pPr>
-      <w:r>
-        <w:rPr>
-          <w:rFonts w:ascii="Bookman Old Style" w:cs="Bookman Old Style" w:eastAsia="Bookman Old Style" w:hAnsi="Bookman Old Style"/>
-          <w:b/>
-          <w:bCs/>
-          <w:sz w:val="22"/>
-          <w:szCs w:val="22"/>
-        </w:rPr>
-        <w:t xml:space="preserve">Justificativa. </w:t>
-      </w:r>
-      <w:r>
-        <w:rPr>
-          <w:rFonts w:ascii="Bookman Old Style" w:cs="Bookman Old Style" w:eastAsia="Bookman Old Style" w:hAnsi="Bookman Old Style"/>
-          <w:sz w:val="22"/>
-          <w:szCs w:val="22"/>
-        </w:rPr>
-        <w:t xml:space="preserve">A ação 3650.0824401082.591 não tem uma única linha de diárias (3.3.90.14) nem de passagens (3.3.90.33). O conselheiro não dispõe de meio orçamentário para participar de conferência fora do Município nem para fiscalizar serviços in loco. As duas atribuições estão na lei que criou o Conselho.</w:t>
-      </w:r>
-    </w:p>
-    <w:p>
-      <w:pPr>
-        <w:spacing w:line="276"/>
-        <w:ind w:firstLine="1133"/>
-        <w:jc w:val="both"/>
-      </w:pPr>
-      <w:r>
-        <w:rPr>
-          <w:rFonts w:ascii="Bookman Old Style" w:cs="Bookman Old Style" w:eastAsia="Bookman Old Style" w:hAnsi="Bookman Old Style"/>
-          <w:i/>
-          <w:iCs/>
-          <w:sz w:val="22"/>
-          <w:szCs w:val="22"/>
-        </w:rPr>
-        <w:t xml:space="preserve">Selo: </w:t>
-      </w:r>
-      <w:r>
-        <w:rPr>
-          <w:rFonts w:ascii="Bookman Old Style" w:cs="Bookman Old Style" w:eastAsia="Bookman Old Style" w:hAnsi="Bookman Old Style"/>
-          <w:i/>
-          <w:iCs/>
-          <w:sz w:val="22"/>
-          <w:szCs w:val="22"/>
-        </w:rPr>
-        <w:t xml:space="preserve">Confirmado</w:t>
-      </w:r>
-      <w:r>
-        <w:rPr>
-          <w:rFonts w:ascii="Bookman Old Style" w:cs="Bookman Old Style" w:eastAsia="Bookman Old Style" w:hAnsi="Bookman Old Style"/>
-          <w:i/>
-          <w:iCs/>
-          <w:sz w:val="22"/>
-          <w:szCs w:val="22"/>
-        </w:rPr>
-        <w:t xml:space="preserve">. Severidade: </w:t>
-      </w:r>
-      <w:r>
-        <w:rPr>
-          <w:rFonts w:ascii="Bookman Old Style" w:cs="Bookman Old Style" w:eastAsia="Bookman Old Style" w:hAnsi="Bookman Old Style"/>
-          <w:i/>
-          <w:iCs/>
-          <w:sz w:val="22"/>
-          <w:szCs w:val="22"/>
-        </w:rPr>
-        <w:t xml:space="preserve">Alta</w:t>
-      </w:r>
-      <w:r>
-        <w:rPr>
-          <w:rFonts w:ascii="Bookman Old Style" w:cs="Bookman Old Style" w:eastAsia="Bookman Old Style" w:hAnsi="Bookman Old Style"/>
-          <w:i/>
-          <w:iCs/>
-          <w:sz w:val="22"/>
-          <w:szCs w:val="22"/>
-        </w:rPr>
-        <w:t xml:space="preserve">.</w:t>
-      </w:r>
-    </w:p>
-    <w:p>
-      <w:pPr>
-        <w:spacing w:line="276"/>
-      </w:pPr>
-      <w:r>
-        <w:rPr>
-          <w:rFonts w:ascii="Bookman Old Style" w:cs="Bookman Old Style" w:eastAsia="Bookman Old Style" w:hAnsi="Bookman Old Style"/>
-          <w:sz w:val="22"/>
-          <w:szCs w:val="22"/>
-        </w:rPr>
-        <w:t xml:space="preserve"/>
-      </w:r>
-    </w:p>
-    <w:p>
-      <w:pPr>
-        <w:pStyle w:val="Heading3"/>
-        <w:spacing w:after="100" w:before="220"/>
-        <w:jc w:val="center"/>
-      </w:pPr>
-      <w:r>
-        <w:rPr>
-          <w:rFonts w:ascii="Bookman Old Style" w:cs="Bookman Old Style" w:eastAsia="Bookman Old Style" w:hAnsi="Bookman Old Style"/>
-          <w:b/>
-          <w:bCs/>
-          <w:sz w:val="22"/>
-          <w:szCs w:val="22"/>
-        </w:rPr>
-        <w:t xml:space="preserve">CMAS-FIN-02 — Nenhum apoio financeiro direto ao conselheiro</w:t>
-      </w:r>
-    </w:p>
-    <w:p>
-      <w:pPr>
-        <w:spacing w:line="276"/>
-        <w:ind w:firstLine="1133"/>
-        <w:jc w:val="both"/>
-      </w:pPr>
-      <w:r>
-        <w:rPr>
-          <w:rFonts w:ascii="Bookman Old Style" w:cs="Bookman Old Style" w:eastAsia="Bookman Old Style" w:hAnsi="Bookman Old Style"/>
-          <w:b/>
-          <w:bCs/>
-          <w:sz w:val="22"/>
-          <w:szCs w:val="22"/>
-        </w:rPr>
-        <w:t xml:space="preserve">Valor envolvido. </w:t>
-      </w:r>
-      <w:r>
-        <w:rPr>
-          <w:rFonts w:ascii="Bookman Old Style" w:cs="Bookman Old Style" w:eastAsia="Bookman Old Style" w:hAnsi="Bookman Old Style"/>
-          <w:sz w:val="22"/>
-          <w:szCs w:val="22"/>
-        </w:rPr>
-        <w:t xml:space="preserve">Não quantificável sem os documentos faltantes.</w:t>
-      </w:r>
-      <w:r>
-        <w:rPr>
-          <w:rFonts w:ascii="Bookman Old Style" w:cs="Bookman Old Style" w:eastAsia="Bookman Old Style" w:hAnsi="Bookman Old Style"/>
-          <w:sz w:val="22"/>
-          <w:szCs w:val="22"/>
-        </w:rPr>
-        <w:t xml:space="preserve"/>
-      </w:r>
-    </w:p>
-    <w:p>
-      <w:pPr>
-        <w:spacing w:line="276"/>
-        <w:ind w:firstLine="1133"/>
-        <w:jc w:val="both"/>
-      </w:pPr>
-      <w:r>
-        <w:rPr>
-          <w:rFonts w:ascii="Bookman Old Style" w:cs="Bookman Old Style" w:eastAsia="Bookman Old Style" w:hAnsi="Bookman Old Style"/>
-          <w:b/>
-          <w:bCs/>
-          <w:sz w:val="22"/>
-          <w:szCs w:val="22"/>
-        </w:rPr>
-        <w:t xml:space="preserve">Documentos que faltam. </w:t>
-      </w:r>
-      <w:r>
-        <w:rPr>
-          <w:rFonts w:ascii="Bookman Old Style" w:cs="Bookman Old Style" w:eastAsia="Bookman Old Style" w:hAnsi="Bookman Old Style"/>
-          <w:sz w:val="22"/>
-          <w:szCs w:val="22"/>
-        </w:rPr>
-        <w:t xml:space="preserve">1) Norma que disciplina o custeio da participação do conselheiro; 2) Demonstrativo de auxílio alimentação, transporte ou financeiro pago a conselheiro; 3) Listas de presença por segmento, de 2024 a 2026, para aferir a paridade efetiva.</w:t>
-      </w:r>
-    </w:p>
-    <w:p>
-      <w:pPr>
-        <w:spacing w:line="276"/>
-        <w:ind w:firstLine="1133"/>
-        <w:jc w:val="both"/>
-      </w:pPr>
-      <w:r>
-        <w:rPr>
-          <w:rFonts w:ascii="Bookman Old Style" w:cs="Bookman Old Style" w:eastAsia="Bookman Old Style" w:hAnsi="Bookman Old Style"/>
-          <w:b/>
-          <w:bCs/>
-          <w:sz w:val="22"/>
-          <w:szCs w:val="22"/>
-        </w:rPr>
-        <w:t xml:space="preserve">Justificativa. </w:t>
-      </w:r>
-      <w:r>
-        <w:rPr>
-          <w:rFonts w:ascii="Bookman Old Style" w:cs="Bookman Old Style" w:eastAsia="Bookman Old Style" w:hAnsi="Bookman Old Style"/>
-          <w:sz w:val="22"/>
-          <w:szCs w:val="22"/>
-        </w:rPr>
-        <w:t xml:space="preserve">Não há dotação de auxílio financeiro a pessoa física (3.3.90.48), de auxílio alimentação (3.3.90.46) nem de auxílio transporte (3.3.90.49). O mandato de conselheiro é gratuito, o que é legítimo, mas gratuidade do mandato não dispensa o custeio da participação. A ausência pesa de modo desigual sobre o representante de usuário, que ocupa seis das quinze cadeiras da sociedade civil.</w:t>
-      </w:r>
-    </w:p>
-    <w:p>
-      <w:pPr>
-        <w:spacing w:line="276"/>
-        <w:ind w:firstLine="1133"/>
-        <w:jc w:val="both"/>
-      </w:pPr>
-      <w:r>
-        <w:rPr>
-          <w:rFonts w:ascii="Bookman Old Style" w:cs="Bookman Old Style" w:eastAsia="Bookman Old Style" w:hAnsi="Bookman Old Style"/>
-          <w:i/>
-          <w:iCs/>
-          <w:sz w:val="22"/>
-          <w:szCs w:val="22"/>
-        </w:rPr>
-        <w:t xml:space="preserve">Selo: </w:t>
-      </w:r>
-      <w:r>
-        <w:rPr>
-          <w:rFonts w:ascii="Bookman Old Style" w:cs="Bookman Old Style" w:eastAsia="Bookman Old Style" w:hAnsi="Bookman Old Style"/>
-          <w:i/>
-          <w:iCs/>
-          <w:sz w:val="22"/>
-          <w:szCs w:val="22"/>
-        </w:rPr>
-        <w:t xml:space="preserve">Confirmado</w:t>
-      </w:r>
-      <w:r>
-        <w:rPr>
-          <w:rFonts w:ascii="Bookman Old Style" w:cs="Bookman Old Style" w:eastAsia="Bookman Old Style" w:hAnsi="Bookman Old Style"/>
-          <w:i/>
-          <w:iCs/>
-          <w:sz w:val="22"/>
-          <w:szCs w:val="22"/>
-        </w:rPr>
-        <w:t xml:space="preserve">. Severidade: </w:t>
-      </w:r>
-      <w:r>
-        <w:rPr>
-          <w:rFonts w:ascii="Bookman Old Style" w:cs="Bookman Old Style" w:eastAsia="Bookman Old Style" w:hAnsi="Bookman Old Style"/>
-          <w:i/>
-          <w:iCs/>
-          <w:sz w:val="22"/>
-          <w:szCs w:val="22"/>
-        </w:rPr>
-        <w:t xml:space="preserve">Alta</w:t>
-      </w:r>
-      <w:r>
-        <w:rPr>
-          <w:rFonts w:ascii="Bookman Old Style" w:cs="Bookman Old Style" w:eastAsia="Bookman Old Style" w:hAnsi="Bookman Old Style"/>
-          <w:i/>
-          <w:iCs/>
-          <w:sz w:val="22"/>
-          <w:szCs w:val="22"/>
-        </w:rPr>
-        <w:t xml:space="preserve">.</w:t>
-      </w:r>
-    </w:p>
-    <w:p>
-      <w:pPr>
-        <w:spacing w:line="276"/>
-      </w:pPr>
-      <w:r>
-        <w:rPr>
-          <w:rFonts w:ascii="Bookman Old Style" w:cs="Bookman Old Style" w:eastAsia="Bookman Old Style" w:hAnsi="Bookman Old Style"/>
-          <w:sz w:val="22"/>
-          <w:szCs w:val="22"/>
-        </w:rPr>
-        <w:t xml:space="preserve"/>
-      </w:r>
-    </w:p>
-    <w:p>
-      <w:pPr>
-        <w:pStyle w:val="Heading3"/>
-        <w:spacing w:after="100" w:before="220"/>
-        <w:jc w:val="center"/>
-      </w:pPr>
-      <w:r>
-        <w:rPr>
-          <w:rFonts w:ascii="Bookman Old Style" w:cs="Bookman Old Style" w:eastAsia="Bookman Old Style" w:hAnsi="Bookman Old Style"/>
-          <w:b/>
-          <w:bCs/>
-          <w:sz w:val="22"/>
-          <w:szCs w:val="22"/>
-        </w:rPr>
-        <w:t xml:space="preserve">CMAS-FIN-04 — Apoio técnico do Conselho depende integralmente do fiscalizado</w:t>
-      </w:r>
-    </w:p>
-    <w:p>
-      <w:pPr>
-        <w:spacing w:line="276"/>
-        <w:ind w:firstLine="1133"/>
-        <w:jc w:val="both"/>
-      </w:pPr>
-      <w:r>
-        <w:rPr>
-          <w:rFonts w:ascii="Bookman Old Style" w:cs="Bookman Old Style" w:eastAsia="Bookman Old Style" w:hAnsi="Bookman Old Style"/>
-          <w:b/>
-          <w:bCs/>
-          <w:sz w:val="22"/>
-          <w:szCs w:val="22"/>
-        </w:rPr>
-        <w:t xml:space="preserve">Valor envolvido. </w:t>
-      </w:r>
-      <w:r>
-        <w:rPr>
-          <w:rFonts w:ascii="Bookman Old Style" w:cs="Bookman Old Style" w:eastAsia="Bookman Old Style" w:hAnsi="Bookman Old Style"/>
-          <w:sz w:val="22"/>
-          <w:szCs w:val="22"/>
-        </w:rPr>
-        <w:t xml:space="preserve">Não quantificável sem os documentos faltantes.</w:t>
-      </w:r>
-      <w:r>
-        <w:rPr>
-          <w:rFonts w:ascii="Bookman Old Style" w:cs="Bookman Old Style" w:eastAsia="Bookman Old Style" w:hAnsi="Bookman Old Style"/>
-          <w:sz w:val="22"/>
-          <w:szCs w:val="22"/>
-        </w:rPr>
-        <w:t xml:space="preserve"/>
-      </w:r>
-    </w:p>
-    <w:p>
-      <w:pPr>
-        <w:spacing w:line="276"/>
-        <w:ind w:firstLine="1133"/>
-        <w:jc w:val="both"/>
-      </w:pPr>
-      <w:r>
-        <w:rPr>
-          <w:rFonts w:ascii="Bookman Old Style" w:cs="Bookman Old Style" w:eastAsia="Bookman Old Style" w:hAnsi="Bookman Old Style"/>
-          <w:b/>
-          <w:bCs/>
-          <w:sz w:val="22"/>
-          <w:szCs w:val="22"/>
-        </w:rPr>
-        <w:t xml:space="preserve">Documentos que faltam. </w:t>
-      </w:r>
-      <w:r>
-        <w:rPr>
-          <w:rFonts w:ascii="Bookman Old Style" w:cs="Bookman Old Style" w:eastAsia="Bookman Old Style" w:hAnsi="Bookman Old Style"/>
-          <w:sz w:val="22"/>
-          <w:szCs w:val="22"/>
-        </w:rPr>
-        <w:t xml:space="preserve">1) Atos de designação da Secretaria Executiva e do Corpo Técnico do Conselho; 2) Relação nominal dos servidores lotados no Conselho, com vínculo e fonte de custeio; 3) Convênios ou contratos de assessoria técnica ao Conselho.</w:t>
-      </w:r>
-    </w:p>
-    <w:p>
-      <w:pPr>
-        <w:spacing w:line="276"/>
-        <w:ind w:firstLine="1133"/>
-        <w:jc w:val="both"/>
-      </w:pPr>
-      <w:r>
-        <w:rPr>
-          <w:rFonts w:ascii="Bookman Old Style" w:cs="Bookman Old Style" w:eastAsia="Bookman Old Style" w:hAnsi="Bookman Old Style"/>
-          <w:b/>
-          <w:bCs/>
-          <w:sz w:val="22"/>
-          <w:szCs w:val="22"/>
-        </w:rPr>
-        <w:t xml:space="preserve">Justificativa. </w:t>
-      </w:r>
-      <w:r>
-        <w:rPr>
-          <w:rFonts w:ascii="Bookman Old Style" w:cs="Bookman Old Style" w:eastAsia="Bookman Old Style" w:hAnsi="Bookman Old Style"/>
-          <w:sz w:val="22"/>
-          <w:szCs w:val="22"/>
-        </w:rPr>
-        <w:t xml:space="preserve">Não há dotação de consultoria (3.3.90.35) nem de pessoal próprio (3.1.90.11) na ação do Conselho. A Secretaria Executiva e o Corpo Técnico são contratados e disponibilizados pelo órgão gestor, na forma da lei. O desenho é legal, mas produz dependência: quem fornece a estrutura de fiscalização é quem está sendo fiscalizado. Sem os atos de designação, não se sabe sequer se existem.</w:t>
-      </w:r>
-    </w:p>
-    <w:p>
-      <w:pPr>
-        <w:spacing w:line="276"/>
-        <w:ind w:firstLine="1133"/>
-        <w:jc w:val="both"/>
-      </w:pPr>
-      <w:r>
-        <w:rPr>
-          <w:rFonts w:ascii="Bookman Old Style" w:cs="Bookman Old Style" w:eastAsia="Bookman Old Style" w:hAnsi="Bookman Old Style"/>
-          <w:i/>
-          <w:iCs/>
-          <w:sz w:val="22"/>
-          <w:szCs w:val="22"/>
-        </w:rPr>
-        <w:t xml:space="preserve">Selo: </w:t>
-      </w:r>
-      <w:r>
-        <w:rPr>
-          <w:rFonts w:ascii="Bookman Old Style" w:cs="Bookman Old Style" w:eastAsia="Bookman Old Style" w:hAnsi="Bookman Old Style"/>
-          <w:i/>
-          <w:iCs/>
-          <w:sz w:val="22"/>
-          <w:szCs w:val="22"/>
-        </w:rPr>
-        <w:t xml:space="preserve">Confirmado</w:t>
-      </w:r>
-      <w:r>
-        <w:rPr>
-          <w:rFonts w:ascii="Bookman Old Style" w:cs="Bookman Old Style" w:eastAsia="Bookman Old Style" w:hAnsi="Bookman Old Style"/>
-          <w:i/>
-          <w:iCs/>
-          <w:sz w:val="22"/>
-          <w:szCs w:val="22"/>
-        </w:rPr>
-        <w:t xml:space="preserve">. Severidade: </w:t>
-      </w:r>
-      <w:r>
-        <w:rPr>
-          <w:rFonts w:ascii="Bookman Old Style" w:cs="Bookman Old Style" w:eastAsia="Bookman Old Style" w:hAnsi="Bookman Old Style"/>
-          <w:i/>
-          <w:iCs/>
-          <w:sz w:val="22"/>
-          <w:szCs w:val="22"/>
-        </w:rPr>
-        <w:t xml:space="preserve">Alta</w:t>
-      </w:r>
-      <w:r>
-        <w:rPr>
-          <w:rFonts w:ascii="Bookman Old Style" w:cs="Bookman Old Style" w:eastAsia="Bookman Old Style" w:hAnsi="Bookman Old Style"/>
-          <w:i/>
-          <w:iCs/>
-          <w:sz w:val="22"/>
-          <w:szCs w:val="22"/>
-        </w:rPr>
-        <w:t xml:space="preserve">.</w:t>
-      </w:r>
-    </w:p>
-    <w:p>
-      <w:pPr>
-        <w:spacing w:line="276"/>
-      </w:pPr>
-      <w:r>
-        <w:rPr>
-          <w:rFonts w:ascii="Bookman Old Style" w:cs="Bookman Old Style" w:eastAsia="Bookman Old Style" w:hAnsi="Bookman Old Style"/>
-          <w:sz w:val="22"/>
-          <w:szCs w:val="22"/>
-        </w:rPr>
-        <w:t xml:space="preserve"/>
-      </w:r>
-    </w:p>
-    <w:p>
-      <w:pPr>
-        <w:pStyle w:val="Heading3"/>
-        <w:spacing w:after="100" w:before="220"/>
-        <w:jc w:val="center"/>
-      </w:pPr>
-      <w:r>
-        <w:rPr>
-          <w:rFonts w:ascii="Bookman Old Style" w:cs="Bookman Old Style" w:eastAsia="Bookman Old Style" w:hAnsi="Bookman Old Style"/>
-          <w:b/>
-          <w:bCs/>
-          <w:sz w:val="22"/>
-          <w:szCs w:val="22"/>
-        </w:rPr>
-        <w:t xml:space="preserve">CMAS-FIN-07 — Execução da dotação do Conselho não publicada</w:t>
-      </w:r>
-    </w:p>
-    <w:p>
-      <w:pPr>
-        <w:spacing w:line="276"/>
-        <w:ind w:firstLine="1133"/>
-        <w:jc w:val="both"/>
-      </w:pPr>
-      <w:r>
-        <w:rPr>
-          <w:rFonts w:ascii="Bookman Old Style" w:cs="Bookman Old Style" w:eastAsia="Bookman Old Style" w:hAnsi="Bookman Old Style"/>
-          <w:b/>
-          <w:bCs/>
-          <w:sz w:val="22"/>
-          <w:szCs w:val="22"/>
-        </w:rPr>
-        <w:t xml:space="preserve">Valor envolvido. </w:t>
-      </w:r>
-      <w:r>
-        <w:rPr>
-          <w:rFonts w:ascii="Bookman Old Style" w:cs="Bookman Old Style" w:eastAsia="Bookman Old Style" w:hAnsi="Bookman Old Style"/>
-          <w:sz w:val="22"/>
-          <w:szCs w:val="22"/>
-        </w:rPr>
-        <w:t xml:space="preserve">Não quantificável sem os documentos faltantes.</w:t>
-      </w:r>
-      <w:r>
-        <w:rPr>
-          <w:rFonts w:ascii="Bookman Old Style" w:cs="Bookman Old Style" w:eastAsia="Bookman Old Style" w:hAnsi="Bookman Old Style"/>
-          <w:sz w:val="22"/>
-          <w:szCs w:val="22"/>
-        </w:rPr>
-        <w:t xml:space="preserve"/>
-      </w:r>
-    </w:p>
-    <w:p>
-      <w:pPr>
-        <w:spacing w:line="276"/>
-        <w:ind w:firstLine="1133"/>
-        <w:jc w:val="both"/>
-      </w:pPr>
-      <w:r>
-        <w:rPr>
-          <w:rFonts w:ascii="Bookman Old Style" w:cs="Bookman Old Style" w:eastAsia="Bookman Old Style" w:hAnsi="Bookman Old Style"/>
-          <w:b/>
-          <w:bCs/>
-          <w:sz w:val="22"/>
-          <w:szCs w:val="22"/>
-        </w:rPr>
-        <w:t xml:space="preserve">Documentos que faltam. </w:t>
-      </w:r>
-      <w:r>
-        <w:rPr>
-          <w:rFonts w:ascii="Bookman Old Style" w:cs="Bookman Old Style" w:eastAsia="Bookman Old Style" w:hAnsi="Bookman Old Style"/>
-          <w:sz w:val="22"/>
-          <w:szCs w:val="22"/>
-        </w:rPr>
-        <w:t xml:space="preserve">1) Execução orçamentária da ação 3650.0824401082.591 por estágio e por rubrica; 2) Notas de empenho e liquidação da ação; 3) Demonstrativo de bens patrimoniados na sede do Conselho.</w:t>
-      </w:r>
-    </w:p>
-    <w:p>
-      <w:pPr>
-        <w:spacing w:line="276"/>
-        <w:ind w:firstLine="1133"/>
-        <w:jc w:val="both"/>
-      </w:pPr>
-      <w:r>
-        <w:rPr>
-          <w:rFonts w:ascii="Bookman Old Style" w:cs="Bookman Old Style" w:eastAsia="Bookman Old Style" w:hAnsi="Bookman Old Style"/>
-          <w:b/>
-          <w:bCs/>
-          <w:sz w:val="22"/>
-          <w:szCs w:val="22"/>
-        </w:rPr>
-        <w:t xml:space="preserve">Justificativa. </w:t>
-      </w:r>
-      <w:r>
-        <w:rPr>
-          <w:rFonts w:ascii="Bookman Old Style" w:cs="Bookman Old Style" w:eastAsia="Bookman Old Style" w:hAnsi="Bookman Old Style"/>
-          <w:sz w:val="22"/>
-          <w:szCs w:val="22"/>
-        </w:rPr>
-        <w:t xml:space="preserve">A dotação de 256,000.00 é previsão. Não há empenho, liquidação nem pagamento publicados para a ação. Não se sabe se o Conselho recebeu, gastou ou devolveu.</w:t>
-      </w:r>
-    </w:p>
-    <w:p>
-      <w:pPr>
-        <w:spacing w:line="276"/>
-        <w:ind w:firstLine="1133"/>
-        <w:jc w:val="both"/>
-      </w:pPr>
-      <w:r>
-        <w:rPr>
-          <w:rFonts w:ascii="Bookman Old Style" w:cs="Bookman Old Style" w:eastAsia="Bookman Old Style" w:hAnsi="Bookman Old Style"/>
-          <w:i/>
-          <w:iCs/>
-          <w:sz w:val="22"/>
-          <w:szCs w:val="22"/>
-        </w:rPr>
-        <w:t xml:space="preserve">Selo: </w:t>
-      </w:r>
-      <w:r>
-        <w:rPr>
-          <w:rFonts w:ascii="Bookman Old Style" w:cs="Bookman Old Style" w:eastAsia="Bookman Old Style" w:hAnsi="Bookman Old Style"/>
-          <w:i/>
-          <w:iCs/>
-          <w:sz w:val="22"/>
-          <w:szCs w:val="22"/>
-        </w:rPr>
-        <w:t xml:space="preserve">Sem documento para avaliar</w:t>
-      </w:r>
-      <w:r>
-        <w:rPr>
-          <w:rFonts w:ascii="Bookman Old Style" w:cs="Bookman Old Style" w:eastAsia="Bookman Old Style" w:hAnsi="Bookman Old Style"/>
-          <w:i/>
-          <w:iCs/>
-          <w:sz w:val="22"/>
-          <w:szCs w:val="22"/>
-        </w:rPr>
-        <w:t xml:space="preserve">. Severidade: </w:t>
-      </w:r>
-      <w:r>
-        <w:rPr>
-          <w:rFonts w:ascii="Bookman Old Style" w:cs="Bookman Old Style" w:eastAsia="Bookman Old Style" w:hAnsi="Bookman Old Style"/>
-          <w:i/>
-          <w:iCs/>
-          <w:sz w:val="22"/>
-          <w:szCs w:val="22"/>
-        </w:rPr>
-        <w:t xml:space="preserve">Alta</w:t>
-      </w:r>
-      <w:r>
-        <w:rPr>
-          <w:rFonts w:ascii="Bookman Old Style" w:cs="Bookman Old Style" w:eastAsia="Bookman Old Style" w:hAnsi="Bookman Old Style"/>
-          <w:i/>
-          <w:iCs/>
-          <w:sz w:val="22"/>
-          <w:szCs w:val="22"/>
-        </w:rPr>
-        <w:t xml:space="preserve">.</w:t>
-      </w:r>
-    </w:p>
-    <w:p>
-      <w:pPr>
-        <w:spacing w:line="276"/>
-      </w:pPr>
-      <w:r>
-        <w:rPr>
-          <w:rFonts w:ascii="Bookman Old Style" w:cs="Bookman Old Style" w:eastAsia="Bookman Old Style" w:hAnsi="Bookman Old Style"/>
-          <w:sz w:val="22"/>
-          <w:szCs w:val="22"/>
-        </w:rPr>
-        <w:t xml:space="preserve"/>
-      </w:r>
-    </w:p>
-    <w:p>
-      <w:pPr>
-        <w:pStyle w:val="Heading2"/>
-        <w:spacing w:after="120" w:before="240"/>
-        <w:jc w:val="center"/>
-      </w:pPr>
-      <w:r>
-        <w:rPr>
-          <w:rFonts w:ascii="Bookman Old Style" w:cs="Bookman Old Style" w:eastAsia="Bookman Old Style" w:hAnsi="Bookman Old Style"/>
-          <w:b/>
-          <w:bCs/>
-          <w:sz w:val="24"/>
-          <w:szCs w:val="24"/>
-        </w:rPr>
-        <w:t xml:space="preserve">Receita e despesa</w:t>
-      </w:r>
-    </w:p>
-    <w:p>
-      <w:pPr>
-        <w:pStyle w:val="Heading3"/>
-        <w:spacing w:after="100" w:before="220"/>
-        <w:jc w:val="center"/>
-      </w:pPr>
-      <w:r>
-        <w:rPr>
-          <w:rFonts w:ascii="Bookman Old Style" w:cs="Bookman Old Style" w:eastAsia="Bookman Old Style" w:hAnsi="Bookman Old Style"/>
-          <w:b/>
-          <w:bCs/>
-          <w:sz w:val="22"/>
-          <w:szCs w:val="22"/>
-        </w:rPr>
-        <w:t xml:space="preserve">REC-02 — Transferências sem ente de origem identificável</w:t>
-      </w:r>
-    </w:p>
-    <w:p>
-      <w:pPr>
-        <w:spacing w:line="276"/>
-        <w:ind w:firstLine="1133"/>
-        <w:jc w:val="both"/>
-      </w:pPr>
-      <w:r>
-        <w:rPr>
-          <w:rFonts w:ascii="Bookman Old Style" w:cs="Bookman Old Style" w:eastAsia="Bookman Old Style" w:hAnsi="Bookman Old Style"/>
-          <w:b/>
-          <w:bCs/>
-          <w:sz w:val="22"/>
-          <w:szCs w:val="22"/>
-        </w:rPr>
-        <w:t xml:space="preserve">Valor envolvido. </w:t>
-      </w:r>
-      <w:r>
-        <w:rPr>
-          <w:rFonts w:ascii="Bookman Old Style" w:cs="Bookman Old Style" w:eastAsia="Bookman Old Style" w:hAnsi="Bookman Old Style"/>
-          <w:b/>
-          <w:bCs/>
-          <w:sz w:val="22"/>
-          <w:szCs w:val="22"/>
-        </w:rPr>
-        <w:t xml:space="preserve">R$ 2.071.000,00</w:t>
-      </w:r>
-      <w:r>
-        <w:rPr>
-          <w:rFonts w:ascii="Bookman Old Style" w:cs="Bookman Old Style" w:eastAsia="Bookman Old Style" w:hAnsi="Bookman Old Style"/>
-          <w:sz w:val="22"/>
-          <w:szCs w:val="22"/>
-        </w:rPr>
-        <w:t xml:space="preserve"> — transferências recebidas sem identificação do ente de origem</w:t>
+          <w:b/>
+          <w:bCs/>
+          <w:sz w:val="22"/>
+          <w:szCs w:val="22"/>
+        </w:rPr>
+        <w:t xml:space="preserve">R$ 0,00</w:t>
+      </w:r>
+      <w:r>
+        <w:rPr>
+          <w:rFonts w:ascii="Bookman Old Style" w:cs="Bookman Old Style" w:eastAsia="Bookman Old Style" w:hAnsi="Bookman Old Style"/>
+          <w:sz w:val="22"/>
+          <w:szCs w:val="22"/>
+        </w:rPr>
+        <w:t xml:space="preserve"> — nenhuma dotação de diárias ou passagens para o conselheiro</w:t>
       </w:r>
     </w:p>
     <w:p>
@@ -12027,9 +11462,9 @@
           <w:sz w:val="22"/>
           <w:szCs w:val="22"/>
         </w:rPr>
-        <w:t xml:space="preserve">Lei Orçamentária Anual 11.590/2026, anexos, Diário Oficial do Município, Edição 8697, de 09/01/2026, Edição Extra — </w:t>
-      </w:r>
-      <w:hyperlink w:history="1" r:id="rIds6kotumbouvvthr93w7su">
+        <w:t xml:space="preserve">Quadro de Detalhamento de Despesas 2026, anexos da Lei Orçamentária 11.590/2026, ação 3650.0824401082.591 — </w:t>
+      </w:r>
+      <w:hyperlink w:history="1" r:id="rIdvmvyjcxw0tmcovqzjjdy3">
         <w:r>
           <w:rPr>
             <w:rStyle w:val="Hyperlink"/>
@@ -12066,7 +11501,7 @@
         </w:rPr>
         <w:t xml:space="preserve">Onde deveria estar publicado. </w:t>
       </w:r>
-      <w:hyperlink w:history="1" r:id="rIduqtradkyowhf49hzctnnb">
+      <w:hyperlink w:history="1" r:id="rIdfratvwakqajafscesjl6l">
         <w:r>
           <w:rPr>
             <w:rStyle w:val="Hyperlink"/>
@@ -12084,6 +11519,26 @@
           <w:sz w:val="22"/>
           <w:szCs w:val="22"/>
         </w:rPr>
+        <w:t xml:space="preserve">; </w:t>
+      </w:r>
+      <w:hyperlink w:history="1" r:id="rIdpeuhlbmn40fhtyfjobf0d">
+        <w:r>
+          <w:rPr>
+            <w:rStyle w:val="Hyperlink"/>
+            <w:rFonts w:ascii="Bookman Old Style" w:cs="Bookman Old Style" w:eastAsia="Bookman Old Style" w:hAnsi="Bookman Old Style"/>
+            <w:sz w:val="20"/>
+            <w:szCs w:val="20"/>
+            <w:u w:val="single"/>
+          </w:rPr>
+          <w:t xml:space="preserve">Sítio do Conselho Municipal de Assistência Social</w:t>
+        </w:r>
+      </w:hyperlink>
+      <w:r>
+        <w:rPr>
+          <w:rFonts w:ascii="Bookman Old Style" w:cs="Bookman Old Style" w:eastAsia="Bookman Old Style" w:hAnsi="Bookman Old Style"/>
+          <w:sz w:val="22"/>
+          <w:szCs w:val="22"/>
+        </w:rPr>
         <w:t xml:space="preserve">.</w:t>
       </w:r>
     </w:p>
@@ -12109,7 +11564,7 @@
           <w:sz w:val="22"/>
           <w:szCs w:val="22"/>
         </w:rPr>
-        <w:t xml:space="preserve">1) Quadro de Detalhamento de Despesas de 2026, com o mapa completo de fontes de recursos; 2) Demonstrativo de receita por fonte e por ente de origem; 3) Termos de repasse ou instrumentos de transferência do Estado.</w:t>
+        <w:t xml:space="preserve">1) Relação de diárias e passagens concedidas a conselheiros em 2024, 2025 e 2026; 2) Atos de designação para conferências estaduais e nacionais; 3) Relatórios de fiscalização in loco de serviços realizados pelo Conselho.</w:t>
       </w:r>
     </w:p>
     <w:p>
@@ -12134,19 +11589,7 @@
           <w:sz w:val="22"/>
           <w:szCs w:val="22"/>
         </w:rPr>
-        <w:t xml:space="preserve">Transferências correntes de R$ 19.425.000,00 contra R$ 17.354.000,00 com fonte identificada. Diferença de R$ 2.071.000,00 sem origem. Rastreabilidade global do acervo: 17.57%.</w:t>
-      </w:r>
-      <w:r>
-        <w:rPr>
-          <w:rStyle w:val="FootnoteReference"/>
-        </w:rPr>
-        <w:footnoteReference w:id="7"/>
-      </w:r>
-      <w:r>
-        <w:rPr>
-          <w:rStyle w:val="FootnoteReference"/>
-        </w:rPr>
-        <w:footnoteReference w:id="6"/>
+        <w:t xml:space="preserve">A ação 3650.0824401082.591 não tem uma única linha de diárias (3.3.90.14) nem de passagens (3.3.90.33). O conselheiro não dispõe de meio orçamentário para participar de conferência fora do Município nem para fiscalizar serviços in loco. As duas atribuições estão na lei que criou o Conselho.</w:t>
       </w:r>
     </w:p>
     <w:p>
@@ -12233,7 +11676,7 @@
           <w:sz w:val="22"/>
           <w:szCs w:val="22"/>
         </w:rPr>
-        <w:t xml:space="preserve">DES-01 — Concentração numa ação genérica impede saber o destino</w:t>
+        <w:t xml:space="preserve">CMAS-FIN-02 — Nenhum apoio financeiro direto ao conselheiro</w:t>
       </w:r>
     </w:p>
     <w:p>
@@ -12260,15 +11703,15 @@
           <w:sz w:val="22"/>
           <w:szCs w:val="22"/>
         </w:rPr>
-        <w:t xml:space="preserve">R$ 19.913.000,00</w:t>
-      </w:r>
-      <w:r>
-        <w:rPr>
-          <w:rFonts w:ascii="Bookman Old Style" w:cs="Bookman Old Style" w:eastAsia="Bookman Old Style" w:hAnsi="Bookman Old Style"/>
-          <w:sz w:val="22"/>
-          <w:szCs w:val="22"/>
-        </w:rPr>
-        <w:t xml:space="preserve"> — concentrados numa única ação genérica, sem detalhamento de destino</w:t>
+        <w:t xml:space="preserve">R$ 0,00</w:t>
+      </w:r>
+      <w:r>
+        <w:rPr>
+          <w:rFonts w:ascii="Bookman Old Style" w:cs="Bookman Old Style" w:eastAsia="Bookman Old Style" w:hAnsi="Bookman Old Style"/>
+          <w:sz w:val="22"/>
+          <w:szCs w:val="22"/>
+        </w:rPr>
+        <w:t xml:space="preserve"> — nenhum auxílio financeiro, alimentação ou transporte ao conselheiro</w:t>
       </w:r>
     </w:p>
     <w:p>
@@ -12293,9 +11736,9 @@
           <w:sz w:val="22"/>
           <w:szCs w:val="22"/>
         </w:rPr>
-        <w:t xml:space="preserve">Lei Orçamentária Anual 11.590/2026, anexos, Diário Oficial do Município, Edição 8697, de 09/01/2026, Edição Extra — </w:t>
-      </w:r>
-      <w:hyperlink w:history="1" r:id="rId6aqg36epgqpizrm4in_5d">
+        <w:t xml:space="preserve">Quadro de Detalhamento de Despesas 2026, anexos da Lei Orçamentária 11.590/2026, ação 3650.0824401082.591 — </w:t>
+      </w:r>
+      <w:hyperlink w:history="1" r:id="rIdlzsotgrwilr3r4v82er-s">
         <w:r>
           <w:rPr>
             <w:rStyle w:val="Hyperlink"/>
@@ -12332,7 +11775,7 @@
         </w:rPr>
         <w:t xml:space="preserve">Onde deveria estar publicado. </w:t>
       </w:r>
-      <w:hyperlink w:history="1" r:id="rIdwlnbyojribskpfmc4ut08">
+      <w:hyperlink w:history="1" r:id="rIdh_zqvl6wp4h0o8j6zpkic">
         <w:r>
           <w:rPr>
             <w:rStyle w:val="Hyperlink"/>
@@ -12350,6 +11793,26 @@
           <w:sz w:val="22"/>
           <w:szCs w:val="22"/>
         </w:rPr>
+        <w:t xml:space="preserve">; </w:t>
+      </w:r>
+      <w:hyperlink w:history="1" r:id="rIdbmgwphn5gooz4jpqdvtwx">
+        <w:r>
+          <w:rPr>
+            <w:rStyle w:val="Hyperlink"/>
+            <w:rFonts w:ascii="Bookman Old Style" w:cs="Bookman Old Style" w:eastAsia="Bookman Old Style" w:hAnsi="Bookman Old Style"/>
+            <w:sz w:val="20"/>
+            <w:szCs w:val="20"/>
+            <w:u w:val="single"/>
+          </w:rPr>
+          <w:t xml:space="preserve">Sítio do Conselho Municipal de Assistência Social</w:t>
+        </w:r>
+      </w:hyperlink>
+      <w:r>
+        <w:rPr>
+          <w:rFonts w:ascii="Bookman Old Style" w:cs="Bookman Old Style" w:eastAsia="Bookman Old Style" w:hAnsi="Bookman Old Style"/>
+          <w:sz w:val="22"/>
+          <w:szCs w:val="22"/>
+        </w:rPr>
         <w:t xml:space="preserve">.</w:t>
       </w:r>
     </w:p>
@@ -12375,7 +11838,7 @@
           <w:sz w:val="22"/>
           <w:szCs w:val="22"/>
         </w:rPr>
-        <w:t xml:space="preserve">1) Detalhamento da ação 08.244.0108.2269 por subação, unidade e serviço tipificado; 2) Plano Municipal de Assistência Social vigente; 3) Demonstrativo de execução por unidade: cada CRAS, CREAS e Centro POP; 4) Relação de entidades beneficiadas pela ação, com valor individual.</w:t>
+        <w:t xml:space="preserve">1) Norma que disciplina o custeio da participação do conselheiro; 2) Demonstrativo de auxílio alimentação, transporte ou financeiro pago a conselheiro; 3) Listas de presença por segmento, de 2024 a 2026, para aferir a paridade efetiva.</w:t>
       </w:r>
     </w:p>
     <w:p>
@@ -12400,13 +11863,7 @@
           <w:sz w:val="22"/>
           <w:szCs w:val="22"/>
         </w:rPr>
-        <w:t xml:space="preserve">R$ 19.913.000,00 (85.8%) na acao 3650.0824401082269 'MANUTENCAO DOS SERVICOS E DA REDE', sem discriminação por unidade, serviço tipificado ou entidade.</w:t>
-      </w:r>
-      <w:r>
-        <w:rPr>
-          <w:rStyle w:val="FootnoteReference"/>
-        </w:rPr>
-        <w:footnoteReference w:id="8"/>
+        <w:t xml:space="preserve">Não há dotação de auxílio financeiro a pessoa física (3.3.90.48), de auxílio alimentação (3.3.90.46) nem de auxílio transporte (3.3.90.49). O mandato de conselheiro é gratuito, o que é legítimo, mas gratuidade do mandato não dispensa o custeio da participação. A ausência pesa de modo desigual sobre o representante de usuário, que ocupa seis das quinze cadeiras da sociedade civil.</w:t>
       </w:r>
     </w:p>
     <w:p>
@@ -12493,7 +11950,7 @@
           <w:sz w:val="22"/>
           <w:szCs w:val="22"/>
         </w:rPr>
-        <w:t xml:space="preserve">IGD-02 — Dotação do Conselho desproporcional ao fundo que fiscaliza</w:t>
+        <w:t xml:space="preserve">CMAS-FIN-04 — Apoio técnico do Conselho depende integralmente do fiscalizado</w:t>
       </w:r>
     </w:p>
     <w:p>
@@ -12520,15 +11977,15 @@
           <w:sz w:val="22"/>
           <w:szCs w:val="22"/>
         </w:rPr>
-        <w:t xml:space="preserve">R$ 256.000,00</w:t>
-      </w:r>
-      <w:r>
-        <w:rPr>
-          <w:rFonts w:ascii="Bookman Old Style" w:cs="Bookman Old Style" w:eastAsia="Bookman Old Style" w:hAnsi="Bookman Old Style"/>
-          <w:sz w:val="22"/>
-          <w:szCs w:val="22"/>
-        </w:rPr>
-        <w:t xml:space="preserve"> — dotação do Conselho na Lei Orçamentária, sem execução publicada</w:t>
+        <w:t xml:space="preserve">R$ 0,00</w:t>
+      </w:r>
+      <w:r>
+        <w:rPr>
+          <w:rFonts w:ascii="Bookman Old Style" w:cs="Bookman Old Style" w:eastAsia="Bookman Old Style" w:hAnsi="Bookman Old Style"/>
+          <w:sz w:val="22"/>
+          <w:szCs w:val="22"/>
+        </w:rPr>
+        <w:t xml:space="preserve"> — nenhuma dotação de consultoria ou pessoal próprio do Conselho</w:t>
       </w:r>
     </w:p>
     <w:p>
@@ -12553,9 +12010,9 @@
           <w:sz w:val="22"/>
           <w:szCs w:val="22"/>
         </w:rPr>
-        <w:t xml:space="preserve">Lei Orçamentária Anual 11.590/2026, anexos, Diário Oficial do Município, Edição 8697, de 09/01/2026, Edição Extra — </w:t>
-      </w:r>
-      <w:hyperlink w:history="1" r:id="rIdry6w3ebutgh2r_k8sdvi9">
+        <w:t xml:space="preserve">Quadro de Detalhamento de Despesas 2026, anexos da Lei Orçamentária 11.590/2026, ação 3650.0824401082.591 — </w:t>
+      </w:r>
+      <w:hyperlink w:history="1" r:id="rIdvubyd9g-jd8u-eii6gmlo">
         <w:r>
           <w:rPr>
             <w:rStyle w:val="Hyperlink"/>
@@ -12583,7 +12040,7 @@
         </w:rPr>
         <w:t xml:space="preserve">Lei municipal 9.009/2010 — </w:t>
       </w:r>
-      <w:hyperlink w:history="1" r:id="rIda0bfrjidwzxy89gr2yece">
+      <w:hyperlink w:history="1" r:id="rIdjmzmwxkw1lsf0xnbdgkb9">
         <w:r>
           <w:rPr>
             <w:rStyle w:val="Hyperlink"/>
@@ -12620,7 +12077,281 @@
         </w:rPr>
         <w:t xml:space="preserve">Onde deveria estar publicado. </w:t>
       </w:r>
-      <w:hyperlink w:history="1" r:id="rIdfp6r2bmjnzjuehmexkyn0">
+      <w:hyperlink w:history="1" r:id="rIdrdsv4bozlefn_hqcjekfb">
+        <w:r>
+          <w:rPr>
+            <w:rStyle w:val="Hyperlink"/>
+            <w:rFonts w:ascii="Bookman Old Style" w:cs="Bookman Old Style" w:eastAsia="Bookman Old Style" w:hAnsi="Bookman Old Style"/>
+            <w:sz w:val="20"/>
+            <w:szCs w:val="20"/>
+            <w:u w:val="single"/>
+          </w:rPr>
+          <w:t xml:space="preserve">Portal da Transparência, Recursos Humanos</w:t>
+        </w:r>
+      </w:hyperlink>
+      <w:r>
+        <w:rPr>
+          <w:rFonts w:ascii="Bookman Old Style" w:cs="Bookman Old Style" w:eastAsia="Bookman Old Style" w:hAnsi="Bookman Old Style"/>
+          <w:sz w:val="22"/>
+          <w:szCs w:val="22"/>
+        </w:rPr>
+        <w:t xml:space="preserve">; </w:t>
+      </w:r>
+      <w:hyperlink w:history="1" r:id="rIdlajjnzvg3o0qmnyeaiume">
+        <w:r>
+          <w:rPr>
+            <w:rStyle w:val="Hyperlink"/>
+            <w:rFonts w:ascii="Bookman Old Style" w:cs="Bookman Old Style" w:eastAsia="Bookman Old Style" w:hAnsi="Bookman Old Style"/>
+            <w:sz w:val="20"/>
+            <w:szCs w:val="20"/>
+            <w:u w:val="single"/>
+          </w:rPr>
+          <w:t xml:space="preserve">Sítio do Conselho Municipal de Assistência Social</w:t>
+        </w:r>
+      </w:hyperlink>
+      <w:r>
+        <w:rPr>
+          <w:rFonts w:ascii="Bookman Old Style" w:cs="Bookman Old Style" w:eastAsia="Bookman Old Style" w:hAnsi="Bookman Old Style"/>
+          <w:sz w:val="22"/>
+          <w:szCs w:val="22"/>
+        </w:rPr>
+        <w:t xml:space="preserve">.</w:t>
+      </w:r>
+    </w:p>
+    <w:p>
+      <w:pPr>
+        <w:spacing w:line="276"/>
+        <w:ind w:firstLine="1133"/>
+        <w:jc w:val="both"/>
+      </w:pPr>
+      <w:r>
+        <w:rPr>
+          <w:rFonts w:ascii="Bookman Old Style" w:cs="Bookman Old Style" w:eastAsia="Bookman Old Style" w:hAnsi="Bookman Old Style"/>
+          <w:b/>
+          <w:bCs/>
+          <w:sz w:val="22"/>
+          <w:szCs w:val="22"/>
+        </w:rPr>
+        <w:t xml:space="preserve">Documentos que faltam. </w:t>
+      </w:r>
+      <w:r>
+        <w:rPr>
+          <w:rFonts w:ascii="Bookman Old Style" w:cs="Bookman Old Style" w:eastAsia="Bookman Old Style" w:hAnsi="Bookman Old Style"/>
+          <w:sz w:val="22"/>
+          <w:szCs w:val="22"/>
+        </w:rPr>
+        <w:t xml:space="preserve">1) Atos de designação da Secretaria Executiva e do Corpo Técnico do Conselho; 2) Relação nominal dos servidores lotados no Conselho, com vínculo e fonte de custeio; 3) Convênios ou contratos de assessoria técnica ao Conselho.</w:t>
+      </w:r>
+    </w:p>
+    <w:p>
+      <w:pPr>
+        <w:spacing w:line="276"/>
+        <w:ind w:firstLine="1133"/>
+        <w:jc w:val="both"/>
+      </w:pPr>
+      <w:r>
+        <w:rPr>
+          <w:rFonts w:ascii="Bookman Old Style" w:cs="Bookman Old Style" w:eastAsia="Bookman Old Style" w:hAnsi="Bookman Old Style"/>
+          <w:b/>
+          <w:bCs/>
+          <w:sz w:val="22"/>
+          <w:szCs w:val="22"/>
+        </w:rPr>
+        <w:t xml:space="preserve">Justificativa. </w:t>
+      </w:r>
+      <w:r>
+        <w:rPr>
+          <w:rFonts w:ascii="Bookman Old Style" w:cs="Bookman Old Style" w:eastAsia="Bookman Old Style" w:hAnsi="Bookman Old Style"/>
+          <w:sz w:val="22"/>
+          <w:szCs w:val="22"/>
+        </w:rPr>
+        <w:t xml:space="preserve">Não há dotação de consultoria (3.3.90.35) nem de pessoal próprio (3.1.90.11) na ação do Conselho. A Secretaria Executiva e o Corpo Técnico são contratados e disponibilizados pelo órgão gestor, na forma da lei. O desenho é legal, mas produz dependência: quem fornece a estrutura de fiscalização é quem está sendo fiscalizado. Sem os atos de designação, não se sabe sequer se existem.</w:t>
+      </w:r>
+    </w:p>
+    <w:p>
+      <w:pPr>
+        <w:spacing w:line="276"/>
+        <w:ind w:firstLine="1133"/>
+        <w:jc w:val="both"/>
+      </w:pPr>
+      <w:r>
+        <w:rPr>
+          <w:rFonts w:ascii="Bookman Old Style" w:cs="Bookman Old Style" w:eastAsia="Bookman Old Style" w:hAnsi="Bookman Old Style"/>
+          <w:i/>
+          <w:iCs/>
+          <w:sz w:val="22"/>
+          <w:szCs w:val="22"/>
+        </w:rPr>
+        <w:t xml:space="preserve">Selo: </w:t>
+      </w:r>
+      <w:r>
+        <w:rPr>
+          <w:rFonts w:ascii="Bookman Old Style" w:cs="Bookman Old Style" w:eastAsia="Bookman Old Style" w:hAnsi="Bookman Old Style"/>
+          <w:i/>
+          <w:iCs/>
+          <w:sz w:val="22"/>
+          <w:szCs w:val="22"/>
+        </w:rPr>
+        <w:t xml:space="preserve">Confirmado</w:t>
+      </w:r>
+      <w:r>
+        <w:rPr>
+          <w:rFonts w:ascii="Bookman Old Style" w:cs="Bookman Old Style" w:eastAsia="Bookman Old Style" w:hAnsi="Bookman Old Style"/>
+          <w:i/>
+          <w:iCs/>
+          <w:sz w:val="22"/>
+          <w:szCs w:val="22"/>
+        </w:rPr>
+        <w:t xml:space="preserve">. Severidade: </w:t>
+      </w:r>
+      <w:r>
+        <w:rPr>
+          <w:rFonts w:ascii="Bookman Old Style" w:cs="Bookman Old Style" w:eastAsia="Bookman Old Style" w:hAnsi="Bookman Old Style"/>
+          <w:i/>
+          <w:iCs/>
+          <w:sz w:val="22"/>
+          <w:szCs w:val="22"/>
+        </w:rPr>
+        <w:t xml:space="preserve">Alta</w:t>
+      </w:r>
+      <w:r>
+        <w:rPr>
+          <w:rFonts w:ascii="Bookman Old Style" w:cs="Bookman Old Style" w:eastAsia="Bookman Old Style" w:hAnsi="Bookman Old Style"/>
+          <w:i/>
+          <w:iCs/>
+          <w:sz w:val="22"/>
+          <w:szCs w:val="22"/>
+        </w:rPr>
+        <w:t xml:space="preserve">.</w:t>
+      </w:r>
+    </w:p>
+    <w:p>
+      <w:pPr>
+        <w:spacing w:line="276"/>
+      </w:pPr>
+      <w:r>
+        <w:rPr>
+          <w:rFonts w:ascii="Bookman Old Style" w:cs="Bookman Old Style" w:eastAsia="Bookman Old Style" w:hAnsi="Bookman Old Style"/>
+          <w:sz w:val="22"/>
+          <w:szCs w:val="22"/>
+        </w:rPr>
+        <w:t xml:space="preserve"/>
+      </w:r>
+    </w:p>
+    <w:p>
+      <w:pPr>
+        <w:pStyle w:val="Heading3"/>
+        <w:spacing w:after="100" w:before="220"/>
+        <w:jc w:val="center"/>
+      </w:pPr>
+      <w:r>
+        <w:rPr>
+          <w:rFonts w:ascii="Bookman Old Style" w:cs="Bookman Old Style" w:eastAsia="Bookman Old Style" w:hAnsi="Bookman Old Style"/>
+          <w:b/>
+          <w:bCs/>
+          <w:sz w:val="22"/>
+          <w:szCs w:val="22"/>
+        </w:rPr>
+        <w:t xml:space="preserve">CMAS-FIN-07 — Execução da dotação do Conselho não publicada</w:t>
+      </w:r>
+    </w:p>
+    <w:p>
+      <w:pPr>
+        <w:spacing w:line="276"/>
+        <w:ind w:firstLine="1133"/>
+        <w:jc w:val="both"/>
+      </w:pPr>
+      <w:r>
+        <w:rPr>
+          <w:rFonts w:ascii="Bookman Old Style" w:cs="Bookman Old Style" w:eastAsia="Bookman Old Style" w:hAnsi="Bookman Old Style"/>
+          <w:b/>
+          <w:bCs/>
+          <w:sz w:val="22"/>
+          <w:szCs w:val="22"/>
+        </w:rPr>
+        <w:t xml:space="preserve">Valor envolvido. </w:t>
+      </w:r>
+      <w:r>
+        <w:rPr>
+          <w:rFonts w:ascii="Bookman Old Style" w:cs="Bookman Old Style" w:eastAsia="Bookman Old Style" w:hAnsi="Bookman Old Style"/>
+          <w:b/>
+          <w:bCs/>
+          <w:sz w:val="22"/>
+          <w:szCs w:val="22"/>
+        </w:rPr>
+        <w:t xml:space="preserve">R$ 256.000,00</w:t>
+      </w:r>
+      <w:r>
+        <w:rPr>
+          <w:rFonts w:ascii="Bookman Old Style" w:cs="Bookman Old Style" w:eastAsia="Bookman Old Style" w:hAnsi="Bookman Old Style"/>
+          <w:sz w:val="22"/>
+          <w:szCs w:val="22"/>
+        </w:rPr>
+        <w:t xml:space="preserve"> — dotação do Conselho, sem execução publicada</w:t>
+      </w:r>
+    </w:p>
+    <w:p>
+      <w:pPr>
+        <w:spacing w:line="276"/>
+        <w:ind w:firstLine="1133"/>
+        <w:jc w:val="both"/>
+      </w:pPr>
+      <w:r>
+        <w:rPr>
+          <w:rFonts w:ascii="Bookman Old Style" w:cs="Bookman Old Style" w:eastAsia="Bookman Old Style" w:hAnsi="Bookman Old Style"/>
+          <w:b/>
+          <w:bCs/>
+          <w:sz w:val="22"/>
+          <w:szCs w:val="22"/>
+        </w:rPr>
+        <w:t xml:space="preserve">Onde o dado foi encontrado. </w:t>
+      </w:r>
+      <w:r>
+        <w:rPr>
+          <w:rFonts w:ascii="Bookman Old Style" w:cs="Bookman Old Style" w:eastAsia="Bookman Old Style" w:hAnsi="Bookman Old Style"/>
+          <w:sz w:val="22"/>
+          <w:szCs w:val="22"/>
+        </w:rPr>
+        <w:t xml:space="preserve">Quadro de Detalhamento de Despesas 2026, anexos da Lei Orçamentária 11.590/2026, ação 3650.0824401082.591 — </w:t>
+      </w:r>
+      <w:hyperlink w:history="1" r:id="rIdxy45qeglcqmfnyatew4pc">
+        <w:r>
+          <w:rPr>
+            <w:rStyle w:val="Hyperlink"/>
+            <w:rFonts w:ascii="Bookman Old Style" w:cs="Bookman Old Style" w:eastAsia="Bookman Old Style" w:hAnsi="Bookman Old Style"/>
+            <w:sz w:val="20"/>
+            <w:szCs w:val="20"/>
+            <w:u w:val="single"/>
+          </w:rPr>
+          <w:t xml:space="preserve">acessar</w:t>
+        </w:r>
+      </w:hyperlink>
+      <w:r>
+        <w:rPr>
+          <w:rFonts w:ascii="Bookman Old Style" w:cs="Bookman Old Style" w:eastAsia="Bookman Old Style" w:hAnsi="Bookman Old Style"/>
+          <w:sz w:val="22"/>
+          <w:szCs w:val="22"/>
+        </w:rPr>
+        <w:t xml:space="preserve">.</w:t>
+      </w:r>
+    </w:p>
+    <w:p>
+      <w:pPr>
+        <w:spacing w:line="276"/>
+        <w:ind w:firstLine="1133"/>
+        <w:jc w:val="both"/>
+      </w:pPr>
+      <w:r>
+        <w:rPr>
+          <w:rFonts w:ascii="Bookman Old Style" w:cs="Bookman Old Style" w:eastAsia="Bookman Old Style" w:hAnsi="Bookman Old Style"/>
+          <w:b/>
+          <w:bCs/>
+          <w:sz w:val="22"/>
+          <w:szCs w:val="22"/>
+        </w:rPr>
+        <w:t xml:space="preserve">Onde deveria estar publicado. </w:t>
+      </w:r>
+      <w:hyperlink w:history="1" r:id="rIdfmnv6lr0wefxwikhndqya">
         <w:r>
           <w:rPr>
             <w:rStyle w:val="Hyperlink"/>
@@ -12663,7 +12394,7 @@
           <w:sz w:val="22"/>
           <w:szCs w:val="22"/>
         </w:rPr>
-        <w:t xml:space="preserve">1) Execução orçamentária da ação 08.244.0108.2591, por estágio; 2) Plano de trabalho do Conselho para o exercício; 3) Demonstrativo comparativo com a ação 08.244.0108.2592, do Conselho Municipal do Idoso; 4) Atos de designação da Secretaria Executiva e do Corpo Técnico do Conselho.</w:t>
+        <w:t xml:space="preserve">1) Execução orçamentária da ação 3650.0824401082.591 por estágio e por rubrica; 2) Notas de empenho e liquidação da ação; 3) Demonstrativo de bens patrimoniados na sede do Conselho.</w:t>
       </w:r>
     </w:p>
     <w:p>
@@ -12688,19 +12419,7 @@
           <w:sz w:val="22"/>
           <w:szCs w:val="22"/>
         </w:rPr>
-        <w:t xml:space="preserve">CMASGyn: R$ 256.000,00 para fiscalizar R$ 23.218.000,00 (1.1%). Conselho do Idoso, na mesma Secretaria: R$ 261.000,00 para R$ 2.615.000,00 (9.98%). Razão de 9.07 vezes. A dotação existe, mas não há execução publicada nem identificação como fortalecimento do controle social.</w:t>
-      </w:r>
-      <w:r>
-        <w:rPr>
-          <w:rStyle w:val="FootnoteReference"/>
-        </w:rPr>
-        <w:footnoteReference w:id="16"/>
-      </w:r>
-      <w:r>
-        <w:rPr>
-          <w:rStyle w:val="FootnoteReference"/>
-        </w:rPr>
-        <w:footnoteReference w:id="27"/>
+        <w:t xml:space="preserve">A dotação de R$ 256.000,00 é previsão. Não há empenho, liquidação nem pagamento publicados para a ação. Não se sabe se o Conselho recebeu, gastou ou devolveu.</w:t>
       </w:r>
     </w:p>
     <w:p>
@@ -12727,7 +12446,7 @@
           <w:sz w:val="22"/>
           <w:szCs w:val="22"/>
         </w:rPr>
-        <w:t xml:space="preserve">Confirmado</w:t>
+        <w:t xml:space="preserve">Sem documento para avaliar</w:t>
       </w:r>
       <w:r>
         <w:rPr>
@@ -12771,6 +12490,23 @@
           <w:szCs w:val="22"/>
         </w:rPr>
         <w:t xml:space="preserve"/>
+      </w:r>
+    </w:p>
+    <w:p>
+      <w:pPr>
+        <w:pStyle w:val="Heading2"/>
+        <w:spacing w:after="120" w:before="240"/>
+        <w:jc w:val="center"/>
+      </w:pPr>
+      <w:r>
+        <w:rPr>
+          <w:rFonts w:ascii="Bookman Old Style" w:cs="Bookman Old Style" w:eastAsia="Bookman Old Style" w:hAnsi="Bookman Old Style"/>
+          <w:b/>
+          <w:bCs/>
+          <w:sz w:val="24"/>
+          <w:szCs w:val="24"/>
+        </w:rPr>
+        <w:t xml:space="preserve">Receita e despesa</w:t>
       </w:r>
     </w:p>
     <w:p>
@@ -12787,7 +12523,7 @@
           <w:sz w:val="22"/>
           <w:szCs w:val="22"/>
         </w:rPr>
-        <w:t xml:space="preserve">EMD-01 — Canal de emendas rivaliza com a política pública</w:t>
+        <w:t xml:space="preserve">REC-02 — Transferências sem ente de origem identificável</w:t>
       </w:r>
     </w:p>
     <w:p>
@@ -12814,15 +12550,15 @@
           <w:sz w:val="22"/>
           <w:szCs w:val="22"/>
         </w:rPr>
-        <w:t xml:space="preserve">R$ 7.490.691,78</w:t>
-      </w:r>
-      <w:r>
-        <w:rPr>
-          <w:rFonts w:ascii="Bookman Old Style" w:cs="Bookman Old Style" w:eastAsia="Bookman Old Style" w:hAnsi="Bookman Old Style"/>
-          <w:sz w:val="22"/>
-          <w:szCs w:val="22"/>
-        </w:rPr>
-        <w:t xml:space="preserve"> — em emendas parlamentares destinadas à assistência social, sem plano de trabalho público</w:t>
+        <w:t xml:space="preserve">R$ 2.071.000,00</w:t>
+      </w:r>
+      <w:r>
+        <w:rPr>
+          <w:rFonts w:ascii="Bookman Old Style" w:cs="Bookman Old Style" w:eastAsia="Bookman Old Style" w:hAnsi="Bookman Old Style"/>
+          <w:sz w:val="22"/>
+          <w:szCs w:val="22"/>
+        </w:rPr>
+        <w:t xml:space="preserve"> — transferências recebidas sem identificação do ente de origem</w:t>
       </w:r>
     </w:p>
     <w:p>
@@ -12849,7 +12585,7 @@
         </w:rPr>
         <w:t xml:space="preserve">Lei Orçamentária Anual 11.590/2026, anexos, Diário Oficial do Município, Edição 8697, de 09/01/2026, Edição Extra — </w:t>
       </w:r>
-      <w:hyperlink w:history="1" r:id="rIdbugqexqb7cv8jnptdjdln">
+      <w:hyperlink w:history="1" r:id="rIdtbm8wjnm0mzv9zx1ok9mo">
         <w:r>
           <w:rPr>
             <w:rStyle w:val="Hyperlink"/>
@@ -12886,7 +12622,7 @@
         </w:rPr>
         <w:t xml:space="preserve">Onde deveria estar publicado. </w:t>
       </w:r>
-      <w:hyperlink w:history="1" r:id="rIdgrn5zwys5br6tetychxfo">
+      <w:hyperlink w:history="1" r:id="rId1zltcgjdi179xphirocqq">
         <w:r>
           <w:rPr>
             <w:rStyle w:val="Hyperlink"/>
@@ -12929,7 +12665,7 @@
           <w:sz w:val="22"/>
           <w:szCs w:val="22"/>
         </w:rPr>
-        <w:t xml:space="preserve">1) Relação das emendas impositivas de 2026 destinadas à função 08, com autor, entidade e valor; 2) Processos de execução de cada emenda; 3) Planos de trabalho e prestações de contas das parcerias decorrentes; 4) Atos de deliberação prévia do Conselho sobre cada parceria; 5) Justificativa de dispensa de chamamento público publicada.</w:t>
+        <w:t xml:space="preserve">1) Quadro de Detalhamento de Despesas de 2026, com o mapa completo de fontes de recursos; 2) Demonstrativo de receita por fonte e por ente de origem; 3) Termos de repasse ou instrumentos de transferência do Estado.</w:t>
       </w:r>
     </w:p>
     <w:p>
@@ -12954,19 +12690,19 @@
           <w:sz w:val="22"/>
           <w:szCs w:val="22"/>
         </w:rPr>
-        <w:t xml:space="preserve">938 emendas somando R$ 178.223.847,86. Em assistência social: 65 emendas, R$ 7.490.691,78 — 26.3% de toda a função 08, que é de R$ 28.440.000,00. Emenda dispensa chamamento, mas não dispensa plano de trabalho, prestação de contas nem apreciação prévia do Conselho.</w:t>
+        <w:t xml:space="preserve">Transferências correntes de R$ 19.425.000,00 contra R$ 17.354.000,00 com fonte identificada. Diferença de R$ 2.071.000,00 sem origem. Rastreabilidade global do acervo: 17.57%.</w:t>
       </w:r>
       <w:r>
         <w:rPr>
           <w:rStyle w:val="FootnoteReference"/>
         </w:rPr>
-        <w:footnoteReference w:id="28"/>
+        <w:footnoteReference w:id="7"/>
       </w:r>
       <w:r>
         <w:rPr>
           <w:rStyle w:val="FootnoteReference"/>
         </w:rPr>
-        <w:footnoteReference w:id="26"/>
+        <w:footnoteReference w:id="6"/>
       </w:r>
     </w:p>
     <w:p>
@@ -12993,7 +12729,7 @@
           <w:sz w:val="22"/>
           <w:szCs w:val="22"/>
         </w:rPr>
-        <w:t xml:space="preserve">Indiciário</w:t>
+        <w:t xml:space="preserve">Confirmado</w:t>
       </w:r>
       <w:r>
         <w:rPr>
@@ -13037,23 +12773,6 @@
           <w:szCs w:val="22"/>
         </w:rPr>
         <w:t xml:space="preserve"/>
-      </w:r>
-    </w:p>
-    <w:p>
-      <w:pPr>
-        <w:pStyle w:val="Heading2"/>
-        <w:spacing w:after="120" w:before="240"/>
-        <w:jc w:val="center"/>
-      </w:pPr>
-      <w:r>
-        <w:rPr>
-          <w:rFonts w:ascii="Bookman Old Style" w:cs="Bookman Old Style" w:eastAsia="Bookman Old Style" w:hAnsi="Bookman Old Style"/>
-          <w:b/>
-          <w:bCs/>
-          <w:sz w:val="24"/>
-          <w:szCs w:val="24"/>
-        </w:rPr>
-        <w:t xml:space="preserve">Pessoal e diárias</w:t>
       </w:r>
     </w:p>
     <w:p>
@@ -13070,7 +12789,7 @@
           <w:sz w:val="22"/>
           <w:szCs w:val="22"/>
         </w:rPr>
-        <w:t xml:space="preserve">PES-01 — Folha de pagamento invisível no acervo</w:t>
+        <w:t xml:space="preserve">DES-01 — Concentração numa ação genérica impede saber o destino</w:t>
       </w:r>
     </w:p>
     <w:p>
@@ -13092,18 +12811,20 @@
       <w:r>
         <w:rPr>
           <w:rFonts w:ascii="Bookman Old Style" w:cs="Bookman Old Style" w:eastAsia="Bookman Old Style" w:hAnsi="Bookman Old Style"/>
-          <w:sz w:val="22"/>
-          <w:szCs w:val="22"/>
-        </w:rPr>
-        <w:t xml:space="preserve">Não quantificável sem os documentos faltantes.</w:t>
-      </w:r>
-      <w:r>
-        <w:rPr>
-          <w:rFonts w:ascii="Bookman Old Style" w:cs="Bookman Old Style" w:eastAsia="Bookman Old Style" w:hAnsi="Bookman Old Style"/>
-          <w:sz w:val="22"/>
-          <w:szCs w:val="22"/>
-        </w:rPr>
-        <w:t xml:space="preserve"/>
+          <w:b/>
+          <w:bCs/>
+          <w:sz w:val="22"/>
+          <w:szCs w:val="22"/>
+        </w:rPr>
+        <w:t xml:space="preserve">R$ 19.913.000,00</w:t>
+      </w:r>
+      <w:r>
+        <w:rPr>
+          <w:rFonts w:ascii="Bookman Old Style" w:cs="Bookman Old Style" w:eastAsia="Bookman Old Style" w:hAnsi="Bookman Old Style"/>
+          <w:sz w:val="22"/>
+          <w:szCs w:val="22"/>
+        </w:rPr>
+        <w:t xml:space="preserve"> — concentrados numa única ação genérica, sem detalhamento de destino</w:t>
       </w:r>
     </w:p>
     <w:p>
@@ -13128,9 +12849,9 @@
           <w:sz w:val="22"/>
           <w:szCs w:val="22"/>
         </w:rPr>
-        <w:t xml:space="preserve">Acervo do Diário Oficial coletado, 161 eventos entre 2025 e 2026, com digest de cada edição — </w:t>
-      </w:r>
-      <w:hyperlink w:history="1" r:id="rId8ryll2jeccgv95rc635yq">
+        <w:t xml:space="preserve">Lei Orçamentária Anual 11.590/2026, anexos, Diário Oficial do Município, Edição 8697, de 09/01/2026, Edição Extra — </w:t>
+      </w:r>
+      <w:hyperlink w:history="1" r:id="rIdejfd9xacazj3ty1h26wg6">
         <w:r>
           <w:rPr>
             <w:rStyle w:val="Hyperlink"/>
@@ -13167,7 +12888,842 @@
         </w:rPr>
         <w:t xml:space="preserve">Onde deveria estar publicado. </w:t>
       </w:r>
-      <w:hyperlink w:history="1" r:id="rIdbodd3zcmwh4brlzorlcci">
+      <w:hyperlink w:history="1" r:id="rIdjpxglkb951t-kyiqbwo39">
+        <w:r>
+          <w:rPr>
+            <w:rStyle w:val="Hyperlink"/>
+            <w:rFonts w:ascii="Bookman Old Style" w:cs="Bookman Old Style" w:eastAsia="Bookman Old Style" w:hAnsi="Bookman Old Style"/>
+            <w:sz w:val="20"/>
+            <w:szCs w:val="20"/>
+            <w:u w:val="single"/>
+          </w:rPr>
+          <w:t xml:space="preserve">Portal da Transparência, Despesas e Receitas</w:t>
+        </w:r>
+      </w:hyperlink>
+      <w:r>
+        <w:rPr>
+          <w:rFonts w:ascii="Bookman Old Style" w:cs="Bookman Old Style" w:eastAsia="Bookman Old Style" w:hAnsi="Bookman Old Style"/>
+          <w:sz w:val="22"/>
+          <w:szCs w:val="22"/>
+        </w:rPr>
+        <w:t xml:space="preserve">.</w:t>
+      </w:r>
+    </w:p>
+    <w:p>
+      <w:pPr>
+        <w:spacing w:line="276"/>
+        <w:ind w:firstLine="1133"/>
+        <w:jc w:val="both"/>
+      </w:pPr>
+      <w:r>
+        <w:rPr>
+          <w:rFonts w:ascii="Bookman Old Style" w:cs="Bookman Old Style" w:eastAsia="Bookman Old Style" w:hAnsi="Bookman Old Style"/>
+          <w:b/>
+          <w:bCs/>
+          <w:sz w:val="22"/>
+          <w:szCs w:val="22"/>
+        </w:rPr>
+        <w:t xml:space="preserve">Documentos que faltam. </w:t>
+      </w:r>
+      <w:r>
+        <w:rPr>
+          <w:rFonts w:ascii="Bookman Old Style" w:cs="Bookman Old Style" w:eastAsia="Bookman Old Style" w:hAnsi="Bookman Old Style"/>
+          <w:sz w:val="22"/>
+          <w:szCs w:val="22"/>
+        </w:rPr>
+        <w:t xml:space="preserve">1) Detalhamento da ação 08.244.0108.2269 por subação, unidade e serviço tipificado; 2) Plano Municipal de Assistência Social vigente; 3) Demonstrativo de execução por unidade: cada CRAS, CREAS e Centro POP; 4) Relação de entidades beneficiadas pela ação, com valor individual.</w:t>
+      </w:r>
+    </w:p>
+    <w:p>
+      <w:pPr>
+        <w:spacing w:line="276"/>
+        <w:ind w:firstLine="1133"/>
+        <w:jc w:val="both"/>
+      </w:pPr>
+      <w:r>
+        <w:rPr>
+          <w:rFonts w:ascii="Bookman Old Style" w:cs="Bookman Old Style" w:eastAsia="Bookman Old Style" w:hAnsi="Bookman Old Style"/>
+          <w:b/>
+          <w:bCs/>
+          <w:sz w:val="22"/>
+          <w:szCs w:val="22"/>
+        </w:rPr>
+        <w:t xml:space="preserve">Justificativa. </w:t>
+      </w:r>
+      <w:r>
+        <w:rPr>
+          <w:rFonts w:ascii="Bookman Old Style" w:cs="Bookman Old Style" w:eastAsia="Bookman Old Style" w:hAnsi="Bookman Old Style"/>
+          <w:sz w:val="22"/>
+          <w:szCs w:val="22"/>
+        </w:rPr>
+        <w:t xml:space="preserve">R$ 19.913.000,00 (85.8%) na acao 3650.0824401082269 'MANUTENCAO DOS SERVICOS E DA REDE', sem discriminação por unidade, serviço tipificado ou entidade.</w:t>
+      </w:r>
+      <w:r>
+        <w:rPr>
+          <w:rStyle w:val="FootnoteReference"/>
+        </w:rPr>
+        <w:footnoteReference w:id="8"/>
+      </w:r>
+    </w:p>
+    <w:p>
+      <w:pPr>
+        <w:spacing w:line="276"/>
+        <w:ind w:firstLine="1133"/>
+        <w:jc w:val="both"/>
+      </w:pPr>
+      <w:r>
+        <w:rPr>
+          <w:rFonts w:ascii="Bookman Old Style" w:cs="Bookman Old Style" w:eastAsia="Bookman Old Style" w:hAnsi="Bookman Old Style"/>
+          <w:i/>
+          <w:iCs/>
+          <w:sz w:val="22"/>
+          <w:szCs w:val="22"/>
+        </w:rPr>
+        <w:t xml:space="preserve">Selo: </w:t>
+      </w:r>
+      <w:r>
+        <w:rPr>
+          <w:rFonts w:ascii="Bookman Old Style" w:cs="Bookman Old Style" w:eastAsia="Bookman Old Style" w:hAnsi="Bookman Old Style"/>
+          <w:i/>
+          <w:iCs/>
+          <w:sz w:val="22"/>
+          <w:szCs w:val="22"/>
+        </w:rPr>
+        <w:t xml:space="preserve">Confirmado</w:t>
+      </w:r>
+      <w:r>
+        <w:rPr>
+          <w:rFonts w:ascii="Bookman Old Style" w:cs="Bookman Old Style" w:eastAsia="Bookman Old Style" w:hAnsi="Bookman Old Style"/>
+          <w:i/>
+          <w:iCs/>
+          <w:sz w:val="22"/>
+          <w:szCs w:val="22"/>
+        </w:rPr>
+        <w:t xml:space="preserve">. Severidade: </w:t>
+      </w:r>
+      <w:r>
+        <w:rPr>
+          <w:rFonts w:ascii="Bookman Old Style" w:cs="Bookman Old Style" w:eastAsia="Bookman Old Style" w:hAnsi="Bookman Old Style"/>
+          <w:i/>
+          <w:iCs/>
+          <w:sz w:val="22"/>
+          <w:szCs w:val="22"/>
+        </w:rPr>
+        <w:t xml:space="preserve">Alta</w:t>
+      </w:r>
+      <w:r>
+        <w:rPr>
+          <w:rFonts w:ascii="Bookman Old Style" w:cs="Bookman Old Style" w:eastAsia="Bookman Old Style" w:hAnsi="Bookman Old Style"/>
+          <w:i/>
+          <w:iCs/>
+          <w:sz w:val="22"/>
+          <w:szCs w:val="22"/>
+        </w:rPr>
+        <w:t xml:space="preserve">.</w:t>
+      </w:r>
+    </w:p>
+    <w:p>
+      <w:pPr>
+        <w:spacing w:line="276"/>
+      </w:pPr>
+      <w:r>
+        <w:rPr>
+          <w:rFonts w:ascii="Bookman Old Style" w:cs="Bookman Old Style" w:eastAsia="Bookman Old Style" w:hAnsi="Bookman Old Style"/>
+          <w:sz w:val="22"/>
+          <w:szCs w:val="22"/>
+        </w:rPr>
+        <w:t xml:space="preserve"/>
+      </w:r>
+    </w:p>
+    <w:p>
+      <w:pPr>
+        <w:pStyle w:val="Heading3"/>
+        <w:spacing w:after="100" w:before="220"/>
+        <w:jc w:val="center"/>
+      </w:pPr>
+      <w:r>
+        <w:rPr>
+          <w:rFonts w:ascii="Bookman Old Style" w:cs="Bookman Old Style" w:eastAsia="Bookman Old Style" w:hAnsi="Bookman Old Style"/>
+          <w:b/>
+          <w:bCs/>
+          <w:sz w:val="22"/>
+          <w:szCs w:val="22"/>
+        </w:rPr>
+        <w:t xml:space="preserve">IGD-02 — Dotação do Conselho desproporcional ao fundo que fiscaliza</w:t>
+      </w:r>
+    </w:p>
+    <w:p>
+      <w:pPr>
+        <w:spacing w:line="276"/>
+        <w:ind w:firstLine="1133"/>
+        <w:jc w:val="both"/>
+      </w:pPr>
+      <w:r>
+        <w:rPr>
+          <w:rFonts w:ascii="Bookman Old Style" w:cs="Bookman Old Style" w:eastAsia="Bookman Old Style" w:hAnsi="Bookman Old Style"/>
+          <w:b/>
+          <w:bCs/>
+          <w:sz w:val="22"/>
+          <w:szCs w:val="22"/>
+        </w:rPr>
+        <w:t xml:space="preserve">Valor envolvido. </w:t>
+      </w:r>
+      <w:r>
+        <w:rPr>
+          <w:rFonts w:ascii="Bookman Old Style" w:cs="Bookman Old Style" w:eastAsia="Bookman Old Style" w:hAnsi="Bookman Old Style"/>
+          <w:b/>
+          <w:bCs/>
+          <w:sz w:val="22"/>
+          <w:szCs w:val="22"/>
+        </w:rPr>
+        <w:t xml:space="preserve">R$ 256.000,00</w:t>
+      </w:r>
+      <w:r>
+        <w:rPr>
+          <w:rFonts w:ascii="Bookman Old Style" w:cs="Bookman Old Style" w:eastAsia="Bookman Old Style" w:hAnsi="Bookman Old Style"/>
+          <w:sz w:val="22"/>
+          <w:szCs w:val="22"/>
+        </w:rPr>
+        <w:t xml:space="preserve"> — dotação do Conselho na Lei Orçamentária, sem execução publicada</w:t>
+      </w:r>
+    </w:p>
+    <w:p>
+      <w:pPr>
+        <w:spacing w:line="276"/>
+        <w:ind w:firstLine="1133"/>
+        <w:jc w:val="both"/>
+      </w:pPr>
+      <w:r>
+        <w:rPr>
+          <w:rFonts w:ascii="Bookman Old Style" w:cs="Bookman Old Style" w:eastAsia="Bookman Old Style" w:hAnsi="Bookman Old Style"/>
+          <w:b/>
+          <w:bCs/>
+          <w:sz w:val="22"/>
+          <w:szCs w:val="22"/>
+        </w:rPr>
+        <w:t xml:space="preserve">Onde o dado foi encontrado. </w:t>
+      </w:r>
+      <w:r>
+        <w:rPr>
+          <w:rFonts w:ascii="Bookman Old Style" w:cs="Bookman Old Style" w:eastAsia="Bookman Old Style" w:hAnsi="Bookman Old Style"/>
+          <w:sz w:val="22"/>
+          <w:szCs w:val="22"/>
+        </w:rPr>
+        <w:t xml:space="preserve">Lei Orçamentária Anual 11.590/2026, anexos, Diário Oficial do Município, Edição 8697, de 09/01/2026, Edição Extra — </w:t>
+      </w:r>
+      <w:hyperlink w:history="1" r:id="rId2qi7ostu7y9hupviyrjde">
+        <w:r>
+          <w:rPr>
+            <w:rStyle w:val="Hyperlink"/>
+            <w:rFonts w:ascii="Bookman Old Style" w:cs="Bookman Old Style" w:eastAsia="Bookman Old Style" w:hAnsi="Bookman Old Style"/>
+            <w:sz w:val="20"/>
+            <w:szCs w:val="20"/>
+            <w:u w:val="single"/>
+          </w:rPr>
+          <w:t xml:space="preserve">acessar</w:t>
+        </w:r>
+      </w:hyperlink>
+      <w:r>
+        <w:rPr>
+          <w:rFonts w:ascii="Bookman Old Style" w:cs="Bookman Old Style" w:eastAsia="Bookman Old Style" w:hAnsi="Bookman Old Style"/>
+          <w:sz w:val="22"/>
+          <w:szCs w:val="22"/>
+        </w:rPr>
+        <w:t xml:space="preserve">; </w:t>
+      </w:r>
+      <w:r>
+        <w:rPr>
+          <w:rFonts w:ascii="Bookman Old Style" w:cs="Bookman Old Style" w:eastAsia="Bookman Old Style" w:hAnsi="Bookman Old Style"/>
+          <w:sz w:val="22"/>
+          <w:szCs w:val="22"/>
+        </w:rPr>
+        <w:t xml:space="preserve">Lei municipal 9.009/2010 — </w:t>
+      </w:r>
+      <w:hyperlink w:history="1" r:id="rIdvnxc4nqc7lfvln9ek83tg">
+        <w:r>
+          <w:rPr>
+            <w:rStyle w:val="Hyperlink"/>
+            <w:rFonts w:ascii="Bookman Old Style" w:cs="Bookman Old Style" w:eastAsia="Bookman Old Style" w:hAnsi="Bookman Old Style"/>
+            <w:sz w:val="20"/>
+            <w:szCs w:val="20"/>
+            <w:u w:val="single"/>
+          </w:rPr>
+          <w:t xml:space="preserve">acessar</w:t>
+        </w:r>
+      </w:hyperlink>
+      <w:r>
+        <w:rPr>
+          <w:rFonts w:ascii="Bookman Old Style" w:cs="Bookman Old Style" w:eastAsia="Bookman Old Style" w:hAnsi="Bookman Old Style"/>
+          <w:sz w:val="22"/>
+          <w:szCs w:val="22"/>
+        </w:rPr>
+        <w:t xml:space="preserve">.</w:t>
+      </w:r>
+    </w:p>
+    <w:p>
+      <w:pPr>
+        <w:spacing w:line="276"/>
+        <w:ind w:firstLine="1133"/>
+        <w:jc w:val="both"/>
+      </w:pPr>
+      <w:r>
+        <w:rPr>
+          <w:rFonts w:ascii="Bookman Old Style" w:cs="Bookman Old Style" w:eastAsia="Bookman Old Style" w:hAnsi="Bookman Old Style"/>
+          <w:b/>
+          <w:bCs/>
+          <w:sz w:val="22"/>
+          <w:szCs w:val="22"/>
+        </w:rPr>
+        <w:t xml:space="preserve">Onde deveria estar publicado. </w:t>
+      </w:r>
+      <w:hyperlink w:history="1" r:id="rIdk5qq_lpkzfyrl21u4cbbs">
+        <w:r>
+          <w:rPr>
+            <w:rStyle w:val="Hyperlink"/>
+            <w:rFonts w:ascii="Bookman Old Style" w:cs="Bookman Old Style" w:eastAsia="Bookman Old Style" w:hAnsi="Bookman Old Style"/>
+            <w:sz w:val="20"/>
+            <w:szCs w:val="20"/>
+            <w:u w:val="single"/>
+          </w:rPr>
+          <w:t xml:space="preserve">Portal da Transparência, Despesas e Receitas</w:t>
+        </w:r>
+      </w:hyperlink>
+      <w:r>
+        <w:rPr>
+          <w:rFonts w:ascii="Bookman Old Style" w:cs="Bookman Old Style" w:eastAsia="Bookman Old Style" w:hAnsi="Bookman Old Style"/>
+          <w:sz w:val="22"/>
+          <w:szCs w:val="22"/>
+        </w:rPr>
+        <w:t xml:space="preserve">.</w:t>
+      </w:r>
+    </w:p>
+    <w:p>
+      <w:pPr>
+        <w:spacing w:line="276"/>
+        <w:ind w:firstLine="1133"/>
+        <w:jc w:val="both"/>
+      </w:pPr>
+      <w:r>
+        <w:rPr>
+          <w:rFonts w:ascii="Bookman Old Style" w:cs="Bookman Old Style" w:eastAsia="Bookman Old Style" w:hAnsi="Bookman Old Style"/>
+          <w:b/>
+          <w:bCs/>
+          <w:sz w:val="22"/>
+          <w:szCs w:val="22"/>
+        </w:rPr>
+        <w:t xml:space="preserve">Documentos que faltam. </w:t>
+      </w:r>
+      <w:r>
+        <w:rPr>
+          <w:rFonts w:ascii="Bookman Old Style" w:cs="Bookman Old Style" w:eastAsia="Bookman Old Style" w:hAnsi="Bookman Old Style"/>
+          <w:sz w:val="22"/>
+          <w:szCs w:val="22"/>
+        </w:rPr>
+        <w:t xml:space="preserve">1) Execução orçamentária da ação 08.244.0108.2591, por estágio; 2) Plano de trabalho do Conselho para o exercício; 3) Demonstrativo comparativo com a ação 08.244.0108.2592, do Conselho Municipal do Idoso; 4) Atos de designação da Secretaria Executiva e do Corpo Técnico do Conselho.</w:t>
+      </w:r>
+    </w:p>
+    <w:p>
+      <w:pPr>
+        <w:spacing w:line="276"/>
+        <w:ind w:firstLine="1133"/>
+        <w:jc w:val="both"/>
+      </w:pPr>
+      <w:r>
+        <w:rPr>
+          <w:rFonts w:ascii="Bookman Old Style" w:cs="Bookman Old Style" w:eastAsia="Bookman Old Style" w:hAnsi="Bookman Old Style"/>
+          <w:b/>
+          <w:bCs/>
+          <w:sz w:val="22"/>
+          <w:szCs w:val="22"/>
+        </w:rPr>
+        <w:t xml:space="preserve">Justificativa. </w:t>
+      </w:r>
+      <w:r>
+        <w:rPr>
+          <w:rFonts w:ascii="Bookman Old Style" w:cs="Bookman Old Style" w:eastAsia="Bookman Old Style" w:hAnsi="Bookman Old Style"/>
+          <w:sz w:val="22"/>
+          <w:szCs w:val="22"/>
+        </w:rPr>
+        <w:t xml:space="preserve">CMASGyn: R$ 256.000,00 para fiscalizar R$ 23.218.000,00 (1.1%). Conselho do Idoso, na mesma Secretaria: R$ 261.000,00 para R$ 2.615.000,00 (9.98%). Razão de 9.07 vezes. A dotação existe, mas não há execução publicada nem identificação como fortalecimento do controle social.</w:t>
+      </w:r>
+      <w:r>
+        <w:rPr>
+          <w:rStyle w:val="FootnoteReference"/>
+        </w:rPr>
+        <w:footnoteReference w:id="16"/>
+      </w:r>
+      <w:r>
+        <w:rPr>
+          <w:rStyle w:val="FootnoteReference"/>
+        </w:rPr>
+        <w:footnoteReference w:id="27"/>
+      </w:r>
+    </w:p>
+    <w:p>
+      <w:pPr>
+        <w:spacing w:line="276"/>
+        <w:ind w:firstLine="1133"/>
+        <w:jc w:val="both"/>
+      </w:pPr>
+      <w:r>
+        <w:rPr>
+          <w:rFonts w:ascii="Bookman Old Style" w:cs="Bookman Old Style" w:eastAsia="Bookman Old Style" w:hAnsi="Bookman Old Style"/>
+          <w:i/>
+          <w:iCs/>
+          <w:sz w:val="22"/>
+          <w:szCs w:val="22"/>
+        </w:rPr>
+        <w:t xml:space="preserve">Selo: </w:t>
+      </w:r>
+      <w:r>
+        <w:rPr>
+          <w:rFonts w:ascii="Bookman Old Style" w:cs="Bookman Old Style" w:eastAsia="Bookman Old Style" w:hAnsi="Bookman Old Style"/>
+          <w:i/>
+          <w:iCs/>
+          <w:sz w:val="22"/>
+          <w:szCs w:val="22"/>
+        </w:rPr>
+        <w:t xml:space="preserve">Confirmado</w:t>
+      </w:r>
+      <w:r>
+        <w:rPr>
+          <w:rFonts w:ascii="Bookman Old Style" w:cs="Bookman Old Style" w:eastAsia="Bookman Old Style" w:hAnsi="Bookman Old Style"/>
+          <w:i/>
+          <w:iCs/>
+          <w:sz w:val="22"/>
+          <w:szCs w:val="22"/>
+        </w:rPr>
+        <w:t xml:space="preserve">. Severidade: </w:t>
+      </w:r>
+      <w:r>
+        <w:rPr>
+          <w:rFonts w:ascii="Bookman Old Style" w:cs="Bookman Old Style" w:eastAsia="Bookman Old Style" w:hAnsi="Bookman Old Style"/>
+          <w:i/>
+          <w:iCs/>
+          <w:sz w:val="22"/>
+          <w:szCs w:val="22"/>
+        </w:rPr>
+        <w:t xml:space="preserve">Alta</w:t>
+      </w:r>
+      <w:r>
+        <w:rPr>
+          <w:rFonts w:ascii="Bookman Old Style" w:cs="Bookman Old Style" w:eastAsia="Bookman Old Style" w:hAnsi="Bookman Old Style"/>
+          <w:i/>
+          <w:iCs/>
+          <w:sz w:val="22"/>
+          <w:szCs w:val="22"/>
+        </w:rPr>
+        <w:t xml:space="preserve">.</w:t>
+      </w:r>
+    </w:p>
+    <w:p>
+      <w:pPr>
+        <w:spacing w:line="276"/>
+      </w:pPr>
+      <w:r>
+        <w:rPr>
+          <w:rFonts w:ascii="Bookman Old Style" w:cs="Bookman Old Style" w:eastAsia="Bookman Old Style" w:hAnsi="Bookman Old Style"/>
+          <w:sz w:val="22"/>
+          <w:szCs w:val="22"/>
+        </w:rPr>
+        <w:t xml:space="preserve"/>
+      </w:r>
+    </w:p>
+    <w:p>
+      <w:pPr>
+        <w:pStyle w:val="Heading3"/>
+        <w:spacing w:after="100" w:before="220"/>
+        <w:jc w:val="center"/>
+      </w:pPr>
+      <w:r>
+        <w:rPr>
+          <w:rFonts w:ascii="Bookman Old Style" w:cs="Bookman Old Style" w:eastAsia="Bookman Old Style" w:hAnsi="Bookman Old Style"/>
+          <w:b/>
+          <w:bCs/>
+          <w:sz w:val="22"/>
+          <w:szCs w:val="22"/>
+        </w:rPr>
+        <w:t xml:space="preserve">EMD-01 — Canal de emendas rivaliza com a política pública</w:t>
+      </w:r>
+    </w:p>
+    <w:p>
+      <w:pPr>
+        <w:spacing w:line="276"/>
+        <w:ind w:firstLine="1133"/>
+        <w:jc w:val="both"/>
+      </w:pPr>
+      <w:r>
+        <w:rPr>
+          <w:rFonts w:ascii="Bookman Old Style" w:cs="Bookman Old Style" w:eastAsia="Bookman Old Style" w:hAnsi="Bookman Old Style"/>
+          <w:b/>
+          <w:bCs/>
+          <w:sz w:val="22"/>
+          <w:szCs w:val="22"/>
+        </w:rPr>
+        <w:t xml:space="preserve">Valor envolvido. </w:t>
+      </w:r>
+      <w:r>
+        <w:rPr>
+          <w:rFonts w:ascii="Bookman Old Style" w:cs="Bookman Old Style" w:eastAsia="Bookman Old Style" w:hAnsi="Bookman Old Style"/>
+          <w:b/>
+          <w:bCs/>
+          <w:sz w:val="22"/>
+          <w:szCs w:val="22"/>
+        </w:rPr>
+        <w:t xml:space="preserve">R$ 7.490.691,78</w:t>
+      </w:r>
+      <w:r>
+        <w:rPr>
+          <w:rFonts w:ascii="Bookman Old Style" w:cs="Bookman Old Style" w:eastAsia="Bookman Old Style" w:hAnsi="Bookman Old Style"/>
+          <w:sz w:val="22"/>
+          <w:szCs w:val="22"/>
+        </w:rPr>
+        <w:t xml:space="preserve"> — em emendas parlamentares destinadas à assistência social, sem plano de trabalho público</w:t>
+      </w:r>
+    </w:p>
+    <w:p>
+      <w:pPr>
+        <w:spacing w:line="276"/>
+        <w:ind w:firstLine="1133"/>
+        <w:jc w:val="both"/>
+      </w:pPr>
+      <w:r>
+        <w:rPr>
+          <w:rFonts w:ascii="Bookman Old Style" w:cs="Bookman Old Style" w:eastAsia="Bookman Old Style" w:hAnsi="Bookman Old Style"/>
+          <w:b/>
+          <w:bCs/>
+          <w:sz w:val="22"/>
+          <w:szCs w:val="22"/>
+        </w:rPr>
+        <w:t xml:space="preserve">Onde o dado foi encontrado. </w:t>
+      </w:r>
+      <w:r>
+        <w:rPr>
+          <w:rFonts w:ascii="Bookman Old Style" w:cs="Bookman Old Style" w:eastAsia="Bookman Old Style" w:hAnsi="Bookman Old Style"/>
+          <w:sz w:val="22"/>
+          <w:szCs w:val="22"/>
+        </w:rPr>
+        <w:t xml:space="preserve">Lei Orçamentária Anual 11.590/2026, anexos, Diário Oficial do Município, Edição 8697, de 09/01/2026, Edição Extra — </w:t>
+      </w:r>
+      <w:hyperlink w:history="1" r:id="rIdjkoov3xxfr5rkbq3ssoih">
+        <w:r>
+          <w:rPr>
+            <w:rStyle w:val="Hyperlink"/>
+            <w:rFonts w:ascii="Bookman Old Style" w:cs="Bookman Old Style" w:eastAsia="Bookman Old Style" w:hAnsi="Bookman Old Style"/>
+            <w:sz w:val="20"/>
+            <w:szCs w:val="20"/>
+            <w:u w:val="single"/>
+          </w:rPr>
+          <w:t xml:space="preserve">acessar</w:t>
+        </w:r>
+      </w:hyperlink>
+      <w:r>
+        <w:rPr>
+          <w:rFonts w:ascii="Bookman Old Style" w:cs="Bookman Old Style" w:eastAsia="Bookman Old Style" w:hAnsi="Bookman Old Style"/>
+          <w:sz w:val="22"/>
+          <w:szCs w:val="22"/>
+        </w:rPr>
+        <w:t xml:space="preserve">.</w:t>
+      </w:r>
+    </w:p>
+    <w:p>
+      <w:pPr>
+        <w:spacing w:line="276"/>
+        <w:ind w:firstLine="1133"/>
+        <w:jc w:val="both"/>
+      </w:pPr>
+      <w:r>
+        <w:rPr>
+          <w:rFonts w:ascii="Bookman Old Style" w:cs="Bookman Old Style" w:eastAsia="Bookman Old Style" w:hAnsi="Bookman Old Style"/>
+          <w:b/>
+          <w:bCs/>
+          <w:sz w:val="22"/>
+          <w:szCs w:val="22"/>
+        </w:rPr>
+        <w:t xml:space="preserve">Onde deveria estar publicado. </w:t>
+      </w:r>
+      <w:hyperlink w:history="1" r:id="rIdecb6ccxpar7rvipvbkczl">
+        <w:r>
+          <w:rPr>
+            <w:rStyle w:val="Hyperlink"/>
+            <w:rFonts w:ascii="Bookman Old Style" w:cs="Bookman Old Style" w:eastAsia="Bookman Old Style" w:hAnsi="Bookman Old Style"/>
+            <w:sz w:val="20"/>
+            <w:szCs w:val="20"/>
+            <w:u w:val="single"/>
+          </w:rPr>
+          <w:t xml:space="preserve">Portal da Transparência, Despesas e Receitas</w:t>
+        </w:r>
+      </w:hyperlink>
+      <w:r>
+        <w:rPr>
+          <w:rFonts w:ascii="Bookman Old Style" w:cs="Bookman Old Style" w:eastAsia="Bookman Old Style" w:hAnsi="Bookman Old Style"/>
+          <w:sz w:val="22"/>
+          <w:szCs w:val="22"/>
+        </w:rPr>
+        <w:t xml:space="preserve">.</w:t>
+      </w:r>
+    </w:p>
+    <w:p>
+      <w:pPr>
+        <w:spacing w:line="276"/>
+        <w:ind w:firstLine="1133"/>
+        <w:jc w:val="both"/>
+      </w:pPr>
+      <w:r>
+        <w:rPr>
+          <w:rFonts w:ascii="Bookman Old Style" w:cs="Bookman Old Style" w:eastAsia="Bookman Old Style" w:hAnsi="Bookman Old Style"/>
+          <w:b/>
+          <w:bCs/>
+          <w:sz w:val="22"/>
+          <w:szCs w:val="22"/>
+        </w:rPr>
+        <w:t xml:space="preserve">Documentos que faltam. </w:t>
+      </w:r>
+      <w:r>
+        <w:rPr>
+          <w:rFonts w:ascii="Bookman Old Style" w:cs="Bookman Old Style" w:eastAsia="Bookman Old Style" w:hAnsi="Bookman Old Style"/>
+          <w:sz w:val="22"/>
+          <w:szCs w:val="22"/>
+        </w:rPr>
+        <w:t xml:space="preserve">1) Relação das emendas impositivas de 2026 destinadas à função 08, com autor, entidade e valor; 2) Processos de execução de cada emenda; 3) Planos de trabalho e prestações de contas das parcerias decorrentes; 4) Atos de deliberação prévia do Conselho sobre cada parceria; 5) Justificativa de dispensa de chamamento público publicada.</w:t>
+      </w:r>
+    </w:p>
+    <w:p>
+      <w:pPr>
+        <w:spacing w:line="276"/>
+        <w:ind w:firstLine="1133"/>
+        <w:jc w:val="both"/>
+      </w:pPr>
+      <w:r>
+        <w:rPr>
+          <w:rFonts w:ascii="Bookman Old Style" w:cs="Bookman Old Style" w:eastAsia="Bookman Old Style" w:hAnsi="Bookman Old Style"/>
+          <w:b/>
+          <w:bCs/>
+          <w:sz w:val="22"/>
+          <w:szCs w:val="22"/>
+        </w:rPr>
+        <w:t xml:space="preserve">Justificativa. </w:t>
+      </w:r>
+      <w:r>
+        <w:rPr>
+          <w:rFonts w:ascii="Bookman Old Style" w:cs="Bookman Old Style" w:eastAsia="Bookman Old Style" w:hAnsi="Bookman Old Style"/>
+          <w:sz w:val="22"/>
+          <w:szCs w:val="22"/>
+        </w:rPr>
+        <w:t xml:space="preserve">938 emendas somando R$ 178.223.847,86. Em assistência social: 65 emendas, R$ 7.490.691,78 — 26.3% de toda a função 08, que é de R$ 28.440.000,00. Emenda dispensa chamamento, mas não dispensa plano de trabalho, prestação de contas nem apreciação prévia do Conselho.</w:t>
+      </w:r>
+      <w:r>
+        <w:rPr>
+          <w:rStyle w:val="FootnoteReference"/>
+        </w:rPr>
+        <w:footnoteReference w:id="28"/>
+      </w:r>
+      <w:r>
+        <w:rPr>
+          <w:rStyle w:val="FootnoteReference"/>
+        </w:rPr>
+        <w:footnoteReference w:id="26"/>
+      </w:r>
+    </w:p>
+    <w:p>
+      <w:pPr>
+        <w:spacing w:line="276"/>
+        <w:ind w:firstLine="1133"/>
+        <w:jc w:val="both"/>
+      </w:pPr>
+      <w:r>
+        <w:rPr>
+          <w:rFonts w:ascii="Bookman Old Style" w:cs="Bookman Old Style" w:eastAsia="Bookman Old Style" w:hAnsi="Bookman Old Style"/>
+          <w:i/>
+          <w:iCs/>
+          <w:sz w:val="22"/>
+          <w:szCs w:val="22"/>
+        </w:rPr>
+        <w:t xml:space="preserve">Selo: </w:t>
+      </w:r>
+      <w:r>
+        <w:rPr>
+          <w:rFonts w:ascii="Bookman Old Style" w:cs="Bookman Old Style" w:eastAsia="Bookman Old Style" w:hAnsi="Bookman Old Style"/>
+          <w:i/>
+          <w:iCs/>
+          <w:sz w:val="22"/>
+          <w:szCs w:val="22"/>
+        </w:rPr>
+        <w:t xml:space="preserve">Indiciário</w:t>
+      </w:r>
+      <w:r>
+        <w:rPr>
+          <w:rFonts w:ascii="Bookman Old Style" w:cs="Bookman Old Style" w:eastAsia="Bookman Old Style" w:hAnsi="Bookman Old Style"/>
+          <w:i/>
+          <w:iCs/>
+          <w:sz w:val="22"/>
+          <w:szCs w:val="22"/>
+        </w:rPr>
+        <w:t xml:space="preserve">. Severidade: </w:t>
+      </w:r>
+      <w:r>
+        <w:rPr>
+          <w:rFonts w:ascii="Bookman Old Style" w:cs="Bookman Old Style" w:eastAsia="Bookman Old Style" w:hAnsi="Bookman Old Style"/>
+          <w:i/>
+          <w:iCs/>
+          <w:sz w:val="22"/>
+          <w:szCs w:val="22"/>
+        </w:rPr>
+        <w:t xml:space="preserve">Alta</w:t>
+      </w:r>
+      <w:r>
+        <w:rPr>
+          <w:rFonts w:ascii="Bookman Old Style" w:cs="Bookman Old Style" w:eastAsia="Bookman Old Style" w:hAnsi="Bookman Old Style"/>
+          <w:i/>
+          <w:iCs/>
+          <w:sz w:val="22"/>
+          <w:szCs w:val="22"/>
+        </w:rPr>
+        <w:t xml:space="preserve">.</w:t>
+      </w:r>
+    </w:p>
+    <w:p>
+      <w:pPr>
+        <w:spacing w:line="276"/>
+      </w:pPr>
+      <w:r>
+        <w:rPr>
+          <w:rFonts w:ascii="Bookman Old Style" w:cs="Bookman Old Style" w:eastAsia="Bookman Old Style" w:hAnsi="Bookman Old Style"/>
+          <w:sz w:val="22"/>
+          <w:szCs w:val="22"/>
+        </w:rPr>
+        <w:t xml:space="preserve"/>
+      </w:r>
+    </w:p>
+    <w:p>
+      <w:pPr>
+        <w:pStyle w:val="Heading2"/>
+        <w:spacing w:after="120" w:before="240"/>
+        <w:jc w:val="center"/>
+      </w:pPr>
+      <w:r>
+        <w:rPr>
+          <w:rFonts w:ascii="Bookman Old Style" w:cs="Bookman Old Style" w:eastAsia="Bookman Old Style" w:hAnsi="Bookman Old Style"/>
+          <w:b/>
+          <w:bCs/>
+          <w:sz w:val="24"/>
+          <w:szCs w:val="24"/>
+        </w:rPr>
+        <w:t xml:space="preserve">Pessoal e diárias</w:t>
+      </w:r>
+    </w:p>
+    <w:p>
+      <w:pPr>
+        <w:pStyle w:val="Heading3"/>
+        <w:spacing w:after="100" w:before="220"/>
+        <w:jc w:val="center"/>
+      </w:pPr>
+      <w:r>
+        <w:rPr>
+          <w:rFonts w:ascii="Bookman Old Style" w:cs="Bookman Old Style" w:eastAsia="Bookman Old Style" w:hAnsi="Bookman Old Style"/>
+          <w:b/>
+          <w:bCs/>
+          <w:sz w:val="22"/>
+          <w:szCs w:val="22"/>
+        </w:rPr>
+        <w:t xml:space="preserve">PES-01 — Folha de pagamento invisível no acervo</w:t>
+      </w:r>
+    </w:p>
+    <w:p>
+      <w:pPr>
+        <w:spacing w:line="276"/>
+        <w:ind w:firstLine="1133"/>
+        <w:jc w:val="both"/>
+      </w:pPr>
+      <w:r>
+        <w:rPr>
+          <w:rFonts w:ascii="Bookman Old Style" w:cs="Bookman Old Style" w:eastAsia="Bookman Old Style" w:hAnsi="Bookman Old Style"/>
+          <w:b/>
+          <w:bCs/>
+          <w:sz w:val="22"/>
+          <w:szCs w:val="22"/>
+        </w:rPr>
+        <w:t xml:space="preserve">Valor envolvido. </w:t>
+      </w:r>
+      <w:r>
+        <w:rPr>
+          <w:rFonts w:ascii="Bookman Old Style" w:cs="Bookman Old Style" w:eastAsia="Bookman Old Style" w:hAnsi="Bookman Old Style"/>
+          <w:sz w:val="22"/>
+          <w:szCs w:val="22"/>
+        </w:rPr>
+        <w:t xml:space="preserve">Não quantificável sem os documentos faltantes.</w:t>
+      </w:r>
+      <w:r>
+        <w:rPr>
+          <w:rFonts w:ascii="Bookman Old Style" w:cs="Bookman Old Style" w:eastAsia="Bookman Old Style" w:hAnsi="Bookman Old Style"/>
+          <w:sz w:val="22"/>
+          <w:szCs w:val="22"/>
+        </w:rPr>
+        <w:t xml:space="preserve"/>
+      </w:r>
+    </w:p>
+    <w:p>
+      <w:pPr>
+        <w:spacing w:line="276"/>
+        <w:ind w:firstLine="1133"/>
+        <w:jc w:val="both"/>
+      </w:pPr>
+      <w:r>
+        <w:rPr>
+          <w:rFonts w:ascii="Bookman Old Style" w:cs="Bookman Old Style" w:eastAsia="Bookman Old Style" w:hAnsi="Bookman Old Style"/>
+          <w:b/>
+          <w:bCs/>
+          <w:sz w:val="22"/>
+          <w:szCs w:val="22"/>
+        </w:rPr>
+        <w:t xml:space="preserve">Onde o dado foi encontrado. </w:t>
+      </w:r>
+      <w:r>
+        <w:rPr>
+          <w:rFonts w:ascii="Bookman Old Style" w:cs="Bookman Old Style" w:eastAsia="Bookman Old Style" w:hAnsi="Bookman Old Style"/>
+          <w:sz w:val="22"/>
+          <w:szCs w:val="22"/>
+        </w:rPr>
+        <w:t xml:space="preserve">Acervo do Diário Oficial coletado, 161 eventos entre 2025 e 2026, com digest de cada edição — </w:t>
+      </w:r>
+      <w:hyperlink w:history="1" r:id="rId77mkztxzhu9t3unbki5ez">
+        <w:r>
+          <w:rPr>
+            <w:rStyle w:val="Hyperlink"/>
+            <w:rFonts w:ascii="Bookman Old Style" w:cs="Bookman Old Style" w:eastAsia="Bookman Old Style" w:hAnsi="Bookman Old Style"/>
+            <w:sz w:val="20"/>
+            <w:szCs w:val="20"/>
+            <w:u w:val="single"/>
+          </w:rPr>
+          <w:t xml:space="preserve">acessar</w:t>
+        </w:r>
+      </w:hyperlink>
+      <w:r>
+        <w:rPr>
+          <w:rFonts w:ascii="Bookman Old Style" w:cs="Bookman Old Style" w:eastAsia="Bookman Old Style" w:hAnsi="Bookman Old Style"/>
+          <w:sz w:val="22"/>
+          <w:szCs w:val="22"/>
+        </w:rPr>
+        <w:t xml:space="preserve">.</w:t>
+      </w:r>
+    </w:p>
+    <w:p>
+      <w:pPr>
+        <w:spacing w:line="276"/>
+        <w:ind w:firstLine="1133"/>
+        <w:jc w:val="both"/>
+      </w:pPr>
+      <w:r>
+        <w:rPr>
+          <w:rFonts w:ascii="Bookman Old Style" w:cs="Bookman Old Style" w:eastAsia="Bookman Old Style" w:hAnsi="Bookman Old Style"/>
+          <w:b/>
+          <w:bCs/>
+          <w:sz w:val="22"/>
+          <w:szCs w:val="22"/>
+        </w:rPr>
+        <w:t xml:space="preserve">Onde deveria estar publicado. </w:t>
+      </w:r>
+      <w:hyperlink w:history="1" r:id="rId3j_q-w1pcdz5zt1jiyens">
         <w:r>
           <w:rPr>
             <w:rStyle w:val="Hyperlink"/>
@@ -13394,7 +13950,7 @@
         </w:rPr>
         <w:t xml:space="preserve">Acervo do Diário Oficial coletado, 161 eventos entre 2025 e 2026, com digest de cada edição — </w:t>
       </w:r>
-      <w:hyperlink w:history="1" r:id="rIdh0pidhf5rdcwa986ogfoi">
+      <w:hyperlink w:history="1" r:id="rIdaetau1-jniv4vs6poro0d">
         <w:r>
           <w:rPr>
             <w:rStyle w:val="Hyperlink"/>
@@ -13431,7 +13987,7 @@
         </w:rPr>
         <w:t xml:space="preserve">Onde deveria estar publicado. </w:t>
       </w:r>
-      <w:hyperlink w:history="1" r:id="rId2ii74ohaydfxkcnxvb8cw">
+      <w:hyperlink w:history="1" r:id="rIddk-ykpehbp7oa2awwjp_s">
         <w:r>
           <w:rPr>
             <w:rStyle w:val="Hyperlink"/>
@@ -13451,7 +14007,7 @@
         </w:rPr>
         <w:t xml:space="preserve">; </w:t>
       </w:r>
-      <w:hyperlink w:history="1" r:id="rIdsmhhw9ucab3cantgvpsew">
+      <w:hyperlink w:history="1" r:id="rIda9tdzlr5ih7edwox1e0l1">
         <w:r>
           <w:rPr>
             <w:rStyle w:val="Hyperlink"/>
@@ -13680,7 +14236,7 @@
         </w:rPr>
         <w:t xml:space="preserve">Lei municipal 7.531/1995 — </w:t>
       </w:r>
-      <w:hyperlink w:history="1" r:id="rIdv3cjwmfcszl6-mify9sms">
+      <w:hyperlink w:history="1" r:id="rIdwl2ietlqqttj2gvlduaye">
         <w:r>
           <w:rPr>
             <w:rStyle w:val="Hyperlink"/>
@@ -13717,7 +14273,7 @@
         </w:rPr>
         <w:t xml:space="preserve">Onde deveria estar publicado. </w:t>
       </w:r>
-      <w:hyperlink w:history="1" r:id="rIdji1ji0qvaj2qwf_c91gv_">
+      <w:hyperlink w:history="1" r:id="rIdvbxpxq_qhxbrkxh6z8atc">
         <w:r>
           <w:rPr>
             <w:rStyle w:val="Hyperlink"/>
@@ -13737,7 +14293,7 @@
         </w:rPr>
         <w:t xml:space="preserve">; </w:t>
       </w:r>
-      <w:hyperlink w:history="1" r:id="rIdsrarboipwt7-t4oy7ztxm">
+      <w:hyperlink w:history="1" r:id="rIdbxorvthos8fieivuwwq8d">
         <w:r>
           <w:rPr>
             <w:rStyle w:val="Hyperlink"/>
@@ -13958,7 +14514,7 @@
         </w:rPr>
         <w:t xml:space="preserve">Acervo do Diário Oficial coletado, 161 eventos entre 2025 e 2026, com digest de cada edição — </w:t>
       </w:r>
-      <w:hyperlink w:history="1" r:id="rId13jx3hvedzjdiuce5r5ch">
+      <w:hyperlink w:history="1" r:id="rIdowi3jjymtw4ibtj9l-zw0">
         <w:r>
           <w:rPr>
             <w:rStyle w:val="Hyperlink"/>
@@ -13995,7 +14551,7 @@
         </w:rPr>
         <w:t xml:space="preserve">Onde deveria estar publicado. </w:t>
       </w:r>
-      <w:hyperlink w:history="1" r:id="rIde6kapr01jnlerw487oqhw">
+      <w:hyperlink w:history="1" r:id="rIdguxs7t1jdmjsjfkxjv-kz">
         <w:r>
           <w:rPr>
             <w:rStyle w:val="Hyperlink"/>
@@ -14216,7 +14772,7 @@
         </w:rPr>
         <w:t xml:space="preserve">Acervo do Diário Oficial coletado, 161 eventos entre 2025 e 2026, com digest de cada edição — </w:t>
       </w:r>
-      <w:hyperlink w:history="1" r:id="rIdzx7fhne0ivoo1fv2u1vm8">
+      <w:hyperlink w:history="1" r:id="rIdxphvmsnnhv60hwbkk2tjn">
         <w:r>
           <w:rPr>
             <w:rStyle w:val="Hyperlink"/>
@@ -14253,7 +14809,7 @@
         </w:rPr>
         <w:t xml:space="preserve">Onde deveria estar publicado. </w:t>
       </w:r>
-      <w:hyperlink w:history="1" r:id="rIdxlw4iiktv3knzglqvefeo">
+      <w:hyperlink w:history="1" r:id="rIdrao9gjpdemvomhtzx-cgl">
         <w:r>
           <w:rPr>
             <w:rStyle w:val="Hyperlink"/>
@@ -14493,7 +15049,7 @@
         </w:rPr>
         <w:t xml:space="preserve">Acervo do Diário Oficial coletado, 161 eventos entre 2025 e 2026, com digest de cada edição — </w:t>
       </w:r>
-      <w:hyperlink w:history="1" r:id="rIdjv0bgs_mhy5tdjymrw5fs">
+      <w:hyperlink w:history="1" r:id="rIdvqsnkt9f7fhvlkct3e4pk">
         <w:r>
           <w:rPr>
             <w:rStyle w:val="Hyperlink"/>
@@ -14530,7 +15086,7 @@
         </w:rPr>
         <w:t xml:space="preserve">Onde deveria estar publicado. </w:t>
       </w:r>
-      <w:hyperlink w:history="1" r:id="rIdve1v_hg3krfouskag2dbz">
+      <w:hyperlink w:history="1" r:id="rId9gluukogemptkqdfkicqd">
         <w:r>
           <w:rPr>
             <w:rStyle w:val="Hyperlink"/>
@@ -14751,7 +15307,7 @@
         </w:rPr>
         <w:t xml:space="preserve">Acervo do Diário Oficial coletado, 161 eventos entre 2025 e 2026, com digest de cada edição — </w:t>
       </w:r>
-      <w:hyperlink w:history="1" r:id="rId6bzhcyipuhrjot1mzxyjf">
+      <w:hyperlink w:history="1" r:id="rIddr6hsvlv59f3_hovfvfcm">
         <w:r>
           <w:rPr>
             <w:rStyle w:val="Hyperlink"/>
@@ -14788,7 +15344,7 @@
         </w:rPr>
         <w:t xml:space="preserve">Onde deveria estar publicado. </w:t>
       </w:r>
-      <w:hyperlink w:history="1" r:id="rIdro7kgtnjqqvtvcfcaw2dd">
+      <w:hyperlink w:history="1" r:id="rIdfgh9oxn8-tbfbnrpref8r">
         <w:r>
           <w:rPr>
             <w:rStyle w:val="Hyperlink"/>
@@ -14987,377 +15543,20 @@
       <w:r>
         <w:rPr>
           <w:rFonts w:ascii="Bookman Old Style" w:cs="Bookman Old Style" w:eastAsia="Bookman Old Style" w:hAnsi="Bookman Old Style"/>
-          <w:sz w:val="22"/>
-          <w:szCs w:val="22"/>
-        </w:rPr>
-        <w:t xml:space="preserve">Não quantificável sem os documentos faltantes.</w:t>
-      </w:r>
-      <w:r>
-        <w:rPr>
-          <w:rFonts w:ascii="Bookman Old Style" w:cs="Bookman Old Style" w:eastAsia="Bookman Old Style" w:hAnsi="Bookman Old Style"/>
-          <w:sz w:val="22"/>
-          <w:szCs w:val="22"/>
-        </w:rPr>
-        <w:t xml:space="preserve"/>
-      </w:r>
-    </w:p>
-    <w:p>
-      <w:pPr>
-        <w:spacing w:line="276"/>
-        <w:ind w:firstLine="1133"/>
-        <w:jc w:val="both"/>
-      </w:pPr>
-      <w:r>
-        <w:rPr>
-          <w:rFonts w:ascii="Bookman Old Style" w:cs="Bookman Old Style" w:eastAsia="Bookman Old Style" w:hAnsi="Bookman Old Style"/>
-          <w:b/>
-          <w:bCs/>
-          <w:sz w:val="22"/>
-          <w:szCs w:val="22"/>
-        </w:rPr>
-        <w:t xml:space="preserve">Documentos que faltam. </w:t>
-      </w:r>
-      <w:r>
-        <w:rPr>
-          <w:rFonts w:ascii="Bookman Old Style" w:cs="Bookman Old Style" w:eastAsia="Bookman Old Style" w:hAnsi="Bookman Old Style"/>
-          <w:sz w:val="22"/>
-          <w:szCs w:val="22"/>
-        </w:rPr>
-        <w:t xml:space="preserve">1) Decretos de suplementação da ação 3650.0824401082.591; 2) Execução por rubrica, mostrando quais dotações simbólicas foram efetivamente ampliadas.</w:t>
-      </w:r>
-    </w:p>
-    <w:p>
-      <w:pPr>
-        <w:spacing w:line="276"/>
-        <w:ind w:firstLine="1133"/>
-        <w:jc w:val="both"/>
-      </w:pPr>
-      <w:r>
-        <w:rPr>
-          <w:rFonts w:ascii="Bookman Old Style" w:cs="Bookman Old Style" w:eastAsia="Bookman Old Style" w:hAnsi="Bookman Old Style"/>
-          <w:b/>
-          <w:bCs/>
-          <w:sz w:val="22"/>
-          <w:szCs w:val="22"/>
-        </w:rPr>
-        <w:t xml:space="preserve">Justificativa. </w:t>
-      </w:r>
-      <w:r>
-        <w:rPr>
-          <w:rFonts w:ascii="Bookman Old Style" w:cs="Bookman Old Style" w:eastAsia="Bookman Old Style" w:hAnsi="Bookman Old Style"/>
-          <w:sz w:val="22"/>
-          <w:szCs w:val="22"/>
-        </w:rPr>
-        <w:t xml:space="preserve">3 de 7 rubricas têm valor de até R$ 2.000,00, somando 5,000.00. Dotação nesse patamar não custeia atividade: existe para permitir suplementação por decreto sem abrir nova linha orçamentária. Contabilmente a rubrica existe; na prática, não financia nada enquanto não for suplementada.</w:t>
-      </w:r>
-    </w:p>
-    <w:p>
-      <w:pPr>
-        <w:spacing w:line="276"/>
-        <w:ind w:firstLine="1133"/>
-        <w:jc w:val="both"/>
-      </w:pPr>
-      <w:r>
-        <w:rPr>
-          <w:rFonts w:ascii="Bookman Old Style" w:cs="Bookman Old Style" w:eastAsia="Bookman Old Style" w:hAnsi="Bookman Old Style"/>
-          <w:i/>
-          <w:iCs/>
-          <w:sz w:val="22"/>
-          <w:szCs w:val="22"/>
-        </w:rPr>
-        <w:t xml:space="preserve">Selo: </w:t>
-      </w:r>
-      <w:r>
-        <w:rPr>
-          <w:rFonts w:ascii="Bookman Old Style" w:cs="Bookman Old Style" w:eastAsia="Bookman Old Style" w:hAnsi="Bookman Old Style"/>
-          <w:i/>
-          <w:iCs/>
-          <w:sz w:val="22"/>
-          <w:szCs w:val="22"/>
-        </w:rPr>
-        <w:t xml:space="preserve">Confirmado</w:t>
-      </w:r>
-      <w:r>
-        <w:rPr>
-          <w:rFonts w:ascii="Bookman Old Style" w:cs="Bookman Old Style" w:eastAsia="Bookman Old Style" w:hAnsi="Bookman Old Style"/>
-          <w:i/>
-          <w:iCs/>
-          <w:sz w:val="22"/>
-          <w:szCs w:val="22"/>
-        </w:rPr>
-        <w:t xml:space="preserve">. Severidade: </w:t>
-      </w:r>
-      <w:r>
-        <w:rPr>
-          <w:rFonts w:ascii="Bookman Old Style" w:cs="Bookman Old Style" w:eastAsia="Bookman Old Style" w:hAnsi="Bookman Old Style"/>
-          <w:i/>
-          <w:iCs/>
-          <w:sz w:val="22"/>
-          <w:szCs w:val="22"/>
-        </w:rPr>
-        <w:t xml:space="preserve">Média</w:t>
-      </w:r>
-      <w:r>
-        <w:rPr>
-          <w:rFonts w:ascii="Bookman Old Style" w:cs="Bookman Old Style" w:eastAsia="Bookman Old Style" w:hAnsi="Bookman Old Style"/>
-          <w:i/>
-          <w:iCs/>
-          <w:sz w:val="22"/>
-          <w:szCs w:val="22"/>
-        </w:rPr>
-        <w:t xml:space="preserve">.</w:t>
-      </w:r>
-    </w:p>
-    <w:p>
-      <w:pPr>
-        <w:spacing w:line="276"/>
-      </w:pPr>
-      <w:r>
-        <w:rPr>
-          <w:rFonts w:ascii="Bookman Old Style" w:cs="Bookman Old Style" w:eastAsia="Bookman Old Style" w:hAnsi="Bookman Old Style"/>
-          <w:sz w:val="22"/>
-          <w:szCs w:val="22"/>
-        </w:rPr>
-        <w:t xml:space="preserve"/>
-      </w:r>
-    </w:p>
-    <w:p>
-      <w:pPr>
-        <w:pStyle w:val="Heading3"/>
-        <w:spacing w:after="100" w:before="220"/>
-        <w:jc w:val="center"/>
-      </w:pPr>
-      <w:r>
-        <w:rPr>
-          <w:rFonts w:ascii="Bookman Old Style" w:cs="Bookman Old Style" w:eastAsia="Bookman Old Style" w:hAnsi="Bookman Old Style"/>
-          <w:b/>
-          <w:bCs/>
-          <w:sz w:val="22"/>
-          <w:szCs w:val="22"/>
-        </w:rPr>
-        <w:t xml:space="preserve">CMAS-FIN-06 — Conselho ausente das metas e prioridades da Lei de Diretrizes</w:t>
-      </w:r>
-    </w:p>
-    <w:p>
-      <w:pPr>
-        <w:spacing w:line="276"/>
-        <w:ind w:firstLine="1133"/>
-        <w:jc w:val="both"/>
-      </w:pPr>
-      <w:r>
-        <w:rPr>
-          <w:rFonts w:ascii="Bookman Old Style" w:cs="Bookman Old Style" w:eastAsia="Bookman Old Style" w:hAnsi="Bookman Old Style"/>
-          <w:b/>
-          <w:bCs/>
-          <w:sz w:val="22"/>
-          <w:szCs w:val="22"/>
-        </w:rPr>
-        <w:t xml:space="preserve">Valor envolvido. </w:t>
-      </w:r>
-      <w:r>
-        <w:rPr>
-          <w:rFonts w:ascii="Bookman Old Style" w:cs="Bookman Old Style" w:eastAsia="Bookman Old Style" w:hAnsi="Bookman Old Style"/>
-          <w:sz w:val="22"/>
-          <w:szCs w:val="22"/>
-        </w:rPr>
-        <w:t xml:space="preserve">Não quantificável sem os documentos faltantes.</w:t>
-      </w:r>
-      <w:r>
-        <w:rPr>
-          <w:rFonts w:ascii="Bookman Old Style" w:cs="Bookman Old Style" w:eastAsia="Bookman Old Style" w:hAnsi="Bookman Old Style"/>
-          <w:sz w:val="22"/>
-          <w:szCs w:val="22"/>
-        </w:rPr>
-        <w:t xml:space="preserve"/>
-      </w:r>
-    </w:p>
-    <w:p>
-      <w:pPr>
-        <w:spacing w:line="276"/>
-        <w:ind w:firstLine="1133"/>
-        <w:jc w:val="both"/>
-      </w:pPr>
-      <w:r>
-        <w:rPr>
-          <w:rFonts w:ascii="Bookman Old Style" w:cs="Bookman Old Style" w:eastAsia="Bookman Old Style" w:hAnsi="Bookman Old Style"/>
-          <w:b/>
-          <w:bCs/>
-          <w:sz w:val="22"/>
-          <w:szCs w:val="22"/>
-        </w:rPr>
-        <w:t xml:space="preserve">Documentos que faltam. </w:t>
-      </w:r>
-      <w:r>
-        <w:rPr>
-          <w:rFonts w:ascii="Bookman Old Style" w:cs="Bookman Old Style" w:eastAsia="Bookman Old Style" w:hAnsi="Bookman Old Style"/>
-          <w:sz w:val="22"/>
-          <w:szCs w:val="22"/>
-        </w:rPr>
-        <w:t xml:space="preserve">1) Plano Plurianual 2026-2029, na parte de assistência social; 2) Justificativa da inclusão de manutenção de cemitérios no setor de assistência social.</w:t>
-      </w:r>
-    </w:p>
-    <w:p>
-      <w:pPr>
-        <w:spacing w:line="276"/>
-        <w:ind w:firstLine="1133"/>
-        <w:jc w:val="both"/>
-      </w:pPr>
-      <w:r>
-        <w:rPr>
-          <w:rFonts w:ascii="Bookman Old Style" w:cs="Bookman Old Style" w:eastAsia="Bookman Old Style" w:hAnsi="Bookman Old Style"/>
-          <w:b/>
-          <w:bCs/>
-          <w:sz w:val="22"/>
-          <w:szCs w:val="22"/>
-        </w:rPr>
-        <w:t xml:space="preserve">Justificativa. </w:t>
-      </w:r>
-      <w:r>
-        <w:rPr>
-          <w:rFonts w:ascii="Bookman Old Style" w:cs="Bookman Old Style" w:eastAsia="Bookman Old Style" w:hAnsi="Bookman Old Style"/>
-          <w:sz w:val="22"/>
-          <w:szCs w:val="22"/>
-        </w:rPr>
-        <w:t xml:space="preserve">O Anexo III da Lei de Diretrizes Orçamentárias 11.589/2026 elenca, no setor de políticas para mulher, direitos humanos e assistência social, a meta de R$ 41.265.955,98, com cinco ações — inclusive manutenção de cemitérios. O Conselho não figura entre elas.</w:t>
-      </w:r>
-    </w:p>
-    <w:p>
-      <w:pPr>
-        <w:spacing w:line="276"/>
-        <w:ind w:firstLine="1133"/>
-        <w:jc w:val="both"/>
-      </w:pPr>
-      <w:r>
-        <w:rPr>
-          <w:rFonts w:ascii="Bookman Old Style" w:cs="Bookman Old Style" w:eastAsia="Bookman Old Style" w:hAnsi="Bookman Old Style"/>
-          <w:i/>
-          <w:iCs/>
-          <w:sz w:val="22"/>
-          <w:szCs w:val="22"/>
-        </w:rPr>
-        <w:t xml:space="preserve">Selo: </w:t>
-      </w:r>
-      <w:r>
-        <w:rPr>
-          <w:rFonts w:ascii="Bookman Old Style" w:cs="Bookman Old Style" w:eastAsia="Bookman Old Style" w:hAnsi="Bookman Old Style"/>
-          <w:i/>
-          <w:iCs/>
-          <w:sz w:val="22"/>
-          <w:szCs w:val="22"/>
-        </w:rPr>
-        <w:t xml:space="preserve">Confirmado</w:t>
-      </w:r>
-      <w:r>
-        <w:rPr>
-          <w:rFonts w:ascii="Bookman Old Style" w:cs="Bookman Old Style" w:eastAsia="Bookman Old Style" w:hAnsi="Bookman Old Style"/>
-          <w:i/>
-          <w:iCs/>
-          <w:sz w:val="22"/>
-          <w:szCs w:val="22"/>
-        </w:rPr>
-        <w:t xml:space="preserve">. Severidade: </w:t>
-      </w:r>
-      <w:r>
-        <w:rPr>
-          <w:rFonts w:ascii="Bookman Old Style" w:cs="Bookman Old Style" w:eastAsia="Bookman Old Style" w:hAnsi="Bookman Old Style"/>
-          <w:i/>
-          <w:iCs/>
-          <w:sz w:val="22"/>
-          <w:szCs w:val="22"/>
-        </w:rPr>
-        <w:t xml:space="preserve">Média</w:t>
-      </w:r>
-      <w:r>
-        <w:rPr>
-          <w:rFonts w:ascii="Bookman Old Style" w:cs="Bookman Old Style" w:eastAsia="Bookman Old Style" w:hAnsi="Bookman Old Style"/>
-          <w:i/>
-          <w:iCs/>
-          <w:sz w:val="22"/>
-          <w:szCs w:val="22"/>
-        </w:rPr>
-        <w:t xml:space="preserve">.</w:t>
-      </w:r>
-    </w:p>
-    <w:p>
-      <w:pPr>
-        <w:spacing w:line="276"/>
-      </w:pPr>
-      <w:r>
-        <w:rPr>
-          <w:rFonts w:ascii="Bookman Old Style" w:cs="Bookman Old Style" w:eastAsia="Bookman Old Style" w:hAnsi="Bookman Old Style"/>
-          <w:sz w:val="22"/>
-          <w:szCs w:val="22"/>
-        </w:rPr>
-        <w:t xml:space="preserve"/>
-      </w:r>
-    </w:p>
-    <w:p>
-      <w:pPr>
-        <w:pStyle w:val="Heading2"/>
-        <w:spacing w:after="120" w:before="240"/>
-        <w:jc w:val="center"/>
-      </w:pPr>
-      <w:r>
-        <w:rPr>
-          <w:rFonts w:ascii="Bookman Old Style" w:cs="Bookman Old Style" w:eastAsia="Bookman Old Style" w:hAnsi="Bookman Old Style"/>
-          <w:b/>
-          <w:bCs/>
-          <w:sz w:val="24"/>
-          <w:szCs w:val="24"/>
-        </w:rPr>
-        <w:t xml:space="preserve">Receita e despesa</w:t>
-      </w:r>
-    </w:p>
-    <w:p>
-      <w:pPr>
-        <w:pStyle w:val="Heading3"/>
-        <w:spacing w:after="100" w:before="220"/>
-        <w:jc w:val="center"/>
-      </w:pPr>
-      <w:r>
-        <w:rPr>
-          <w:rFonts w:ascii="Bookman Old Style" w:cs="Bookman Old Style" w:eastAsia="Bookman Old Style" w:hAnsi="Bookman Old Style"/>
-          <w:b/>
-          <w:bCs/>
-          <w:sz w:val="22"/>
-          <w:szCs w:val="22"/>
-        </w:rPr>
-        <w:t xml:space="preserve">REC-03 — Rendimento de aplicação incompatível com execução regular</w:t>
-      </w:r>
-    </w:p>
-    <w:p>
-      <w:pPr>
-        <w:spacing w:line="276"/>
-        <w:ind w:firstLine="1133"/>
-        <w:jc w:val="both"/>
-      </w:pPr>
-      <w:r>
-        <w:rPr>
-          <w:rFonts w:ascii="Bookman Old Style" w:cs="Bookman Old Style" w:eastAsia="Bookman Old Style" w:hAnsi="Bookman Old Style"/>
-          <w:b/>
-          <w:bCs/>
-          <w:sz w:val="22"/>
-          <w:szCs w:val="22"/>
-        </w:rPr>
-        <w:t xml:space="preserve">Valor envolvido. </w:t>
-      </w:r>
-      <w:r>
-        <w:rPr>
-          <w:rFonts w:ascii="Bookman Old Style" w:cs="Bookman Old Style" w:eastAsia="Bookman Old Style" w:hAnsi="Bookman Old Style"/>
-          <w:b/>
-          <w:bCs/>
-          <w:sz w:val="22"/>
-          <w:szCs w:val="22"/>
-        </w:rPr>
-        <w:t xml:space="preserve">R$ 2.574.000,00</w:t>
-      </w:r>
-      <w:r>
-        <w:rPr>
-          <w:rFonts w:ascii="Bookman Old Style" w:cs="Bookman Old Style" w:eastAsia="Bookman Old Style" w:hAnsi="Bookman Old Style"/>
-          <w:sz w:val="22"/>
-          <w:szCs w:val="22"/>
-        </w:rPr>
-        <w:t xml:space="preserve"> — rendimento de aplicação, indício de recurso parado sem execução</w:t>
+          <w:b/>
+          <w:bCs/>
+          <w:sz w:val="22"/>
+          <w:szCs w:val="22"/>
+        </w:rPr>
+        <w:t xml:space="preserve">R$ 5.000,00</w:t>
+      </w:r>
+      <w:r>
+        <w:rPr>
+          <w:rFonts w:ascii="Bookman Old Style" w:cs="Bookman Old Style" w:eastAsia="Bookman Old Style" w:hAnsi="Bookman Old Style"/>
+          <w:sz w:val="22"/>
+          <w:szCs w:val="22"/>
+        </w:rPr>
+        <w:t xml:space="preserve"> — em rubricas de valor simbólico, que não custeiam atividade</w:t>
       </w:r>
     </w:p>
     <w:p>
@@ -15382,9 +15581,9 @@
           <w:sz w:val="22"/>
           <w:szCs w:val="22"/>
         </w:rPr>
-        <w:t xml:space="preserve">Lei Orçamentária Anual 11.590/2026, anexos, Diário Oficial do Município, Edição 8697, de 09/01/2026, Edição Extra — </w:t>
-      </w:r>
-      <w:hyperlink w:history="1" r:id="rId_52vq4gchojjkl4r4gh7w">
+        <w:t xml:space="preserve">Quadro de Detalhamento de Despesas 2026, anexos da Lei Orçamentária 11.590/2026, ação 3650.0824401082.591 — </w:t>
+      </w:r>
+      <w:hyperlink w:history="1" r:id="rIdsj56tyfk__rh345i6im6d">
         <w:r>
           <w:rPr>
             <w:rStyle w:val="Hyperlink"/>
@@ -15402,17 +15601,243 @@
           <w:sz w:val="22"/>
           <w:szCs w:val="22"/>
         </w:rPr>
-        <w:t xml:space="preserve">; </w:t>
-      </w:r>
-      <w:r>
-        <w:rPr>
-          <w:rFonts w:ascii="Bookman Old Style" w:cs="Bookman Old Style" w:eastAsia="Bookman Old Style" w:hAnsi="Bookman Old Style"/>
-          <w:sz w:val="22"/>
-          <w:szCs w:val="22"/>
-        </w:rPr>
-        <w:t xml:space="preserve">Acervo do Diário Oficial coletado, 161 eventos entre 2025 e 2026, com digest de cada edição — </w:t>
-      </w:r>
-      <w:hyperlink w:history="1" r:id="rIda8ovaid4ooretzgk9ytuc">
+        <w:t xml:space="preserve">.</w:t>
+      </w:r>
+    </w:p>
+    <w:p>
+      <w:pPr>
+        <w:spacing w:line="276"/>
+        <w:ind w:firstLine="1133"/>
+        <w:jc w:val="both"/>
+      </w:pPr>
+      <w:r>
+        <w:rPr>
+          <w:rFonts w:ascii="Bookman Old Style" w:cs="Bookman Old Style" w:eastAsia="Bookman Old Style" w:hAnsi="Bookman Old Style"/>
+          <w:b/>
+          <w:bCs/>
+          <w:sz w:val="22"/>
+          <w:szCs w:val="22"/>
+        </w:rPr>
+        <w:t xml:space="preserve">Onde deveria estar publicado. </w:t>
+      </w:r>
+      <w:hyperlink w:history="1" r:id="rIdfvfbygtyugjda2duxmvmv">
+        <w:r>
+          <w:rPr>
+            <w:rStyle w:val="Hyperlink"/>
+            <w:rFonts w:ascii="Bookman Old Style" w:cs="Bookman Old Style" w:eastAsia="Bookman Old Style" w:hAnsi="Bookman Old Style"/>
+            <w:sz w:val="20"/>
+            <w:szCs w:val="20"/>
+            <w:u w:val="single"/>
+          </w:rPr>
+          <w:t xml:space="preserve">Portal da Transparência, Despesas e Receitas</w:t>
+        </w:r>
+      </w:hyperlink>
+      <w:r>
+        <w:rPr>
+          <w:rFonts w:ascii="Bookman Old Style" w:cs="Bookman Old Style" w:eastAsia="Bookman Old Style" w:hAnsi="Bookman Old Style"/>
+          <w:sz w:val="22"/>
+          <w:szCs w:val="22"/>
+        </w:rPr>
+        <w:t xml:space="preserve">.</w:t>
+      </w:r>
+    </w:p>
+    <w:p>
+      <w:pPr>
+        <w:spacing w:line="276"/>
+        <w:ind w:firstLine="1133"/>
+        <w:jc w:val="both"/>
+      </w:pPr>
+      <w:r>
+        <w:rPr>
+          <w:rFonts w:ascii="Bookman Old Style" w:cs="Bookman Old Style" w:eastAsia="Bookman Old Style" w:hAnsi="Bookman Old Style"/>
+          <w:b/>
+          <w:bCs/>
+          <w:sz w:val="22"/>
+          <w:szCs w:val="22"/>
+        </w:rPr>
+        <w:t xml:space="preserve">Documentos que faltam. </w:t>
+      </w:r>
+      <w:r>
+        <w:rPr>
+          <w:rFonts w:ascii="Bookman Old Style" w:cs="Bookman Old Style" w:eastAsia="Bookman Old Style" w:hAnsi="Bookman Old Style"/>
+          <w:sz w:val="22"/>
+          <w:szCs w:val="22"/>
+        </w:rPr>
+        <w:t xml:space="preserve">1) Decretos de suplementação da ação 3650.0824401082.591; 2) Execução por rubrica, mostrando quais dotações simbólicas foram efetivamente ampliadas.</w:t>
+      </w:r>
+    </w:p>
+    <w:p>
+      <w:pPr>
+        <w:spacing w:line="276"/>
+        <w:ind w:firstLine="1133"/>
+        <w:jc w:val="both"/>
+      </w:pPr>
+      <w:r>
+        <w:rPr>
+          <w:rFonts w:ascii="Bookman Old Style" w:cs="Bookman Old Style" w:eastAsia="Bookman Old Style" w:hAnsi="Bookman Old Style"/>
+          <w:b/>
+          <w:bCs/>
+          <w:sz w:val="22"/>
+          <w:szCs w:val="22"/>
+        </w:rPr>
+        <w:t xml:space="preserve">Justificativa. </w:t>
+      </w:r>
+      <w:r>
+        <w:rPr>
+          <w:rFonts w:ascii="Bookman Old Style" w:cs="Bookman Old Style" w:eastAsia="Bookman Old Style" w:hAnsi="Bookman Old Style"/>
+          <w:sz w:val="22"/>
+          <w:szCs w:val="22"/>
+        </w:rPr>
+        <w:t xml:space="preserve">3 de 7 rubricas têm valor de até R$ 2.000,00, somando R$ 5.000,00. Dotação nesse patamar não custeia atividade: existe para permitir suplementação por decreto sem abrir nova linha orçamentária. Contabilmente a rubrica existe; na prática, não financia nada enquanto não for suplementada.</w:t>
+      </w:r>
+    </w:p>
+    <w:p>
+      <w:pPr>
+        <w:spacing w:line="276"/>
+        <w:ind w:firstLine="1133"/>
+        <w:jc w:val="both"/>
+      </w:pPr>
+      <w:r>
+        <w:rPr>
+          <w:rFonts w:ascii="Bookman Old Style" w:cs="Bookman Old Style" w:eastAsia="Bookman Old Style" w:hAnsi="Bookman Old Style"/>
+          <w:i/>
+          <w:iCs/>
+          <w:sz w:val="22"/>
+          <w:szCs w:val="22"/>
+        </w:rPr>
+        <w:t xml:space="preserve">Selo: </w:t>
+      </w:r>
+      <w:r>
+        <w:rPr>
+          <w:rFonts w:ascii="Bookman Old Style" w:cs="Bookman Old Style" w:eastAsia="Bookman Old Style" w:hAnsi="Bookman Old Style"/>
+          <w:i/>
+          <w:iCs/>
+          <w:sz w:val="22"/>
+          <w:szCs w:val="22"/>
+        </w:rPr>
+        <w:t xml:space="preserve">Confirmado</w:t>
+      </w:r>
+      <w:r>
+        <w:rPr>
+          <w:rFonts w:ascii="Bookman Old Style" w:cs="Bookman Old Style" w:eastAsia="Bookman Old Style" w:hAnsi="Bookman Old Style"/>
+          <w:i/>
+          <w:iCs/>
+          <w:sz w:val="22"/>
+          <w:szCs w:val="22"/>
+        </w:rPr>
+        <w:t xml:space="preserve">. Severidade: </w:t>
+      </w:r>
+      <w:r>
+        <w:rPr>
+          <w:rFonts w:ascii="Bookman Old Style" w:cs="Bookman Old Style" w:eastAsia="Bookman Old Style" w:hAnsi="Bookman Old Style"/>
+          <w:i/>
+          <w:iCs/>
+          <w:sz w:val="22"/>
+          <w:szCs w:val="22"/>
+        </w:rPr>
+        <w:t xml:space="preserve">Média</w:t>
+      </w:r>
+      <w:r>
+        <w:rPr>
+          <w:rFonts w:ascii="Bookman Old Style" w:cs="Bookman Old Style" w:eastAsia="Bookman Old Style" w:hAnsi="Bookman Old Style"/>
+          <w:i/>
+          <w:iCs/>
+          <w:sz w:val="22"/>
+          <w:szCs w:val="22"/>
+        </w:rPr>
+        <w:t xml:space="preserve">.</w:t>
+      </w:r>
+    </w:p>
+    <w:p>
+      <w:pPr>
+        <w:spacing w:line="276"/>
+      </w:pPr>
+      <w:r>
+        <w:rPr>
+          <w:rFonts w:ascii="Bookman Old Style" w:cs="Bookman Old Style" w:eastAsia="Bookman Old Style" w:hAnsi="Bookman Old Style"/>
+          <w:sz w:val="22"/>
+          <w:szCs w:val="22"/>
+        </w:rPr>
+        <w:t xml:space="preserve"/>
+      </w:r>
+    </w:p>
+    <w:p>
+      <w:pPr>
+        <w:pStyle w:val="Heading3"/>
+        <w:spacing w:after="100" w:before="220"/>
+        <w:jc w:val="center"/>
+      </w:pPr>
+      <w:r>
+        <w:rPr>
+          <w:rFonts w:ascii="Bookman Old Style" w:cs="Bookman Old Style" w:eastAsia="Bookman Old Style" w:hAnsi="Bookman Old Style"/>
+          <w:b/>
+          <w:bCs/>
+          <w:sz w:val="22"/>
+          <w:szCs w:val="22"/>
+        </w:rPr>
+        <w:t xml:space="preserve">CMAS-FIN-06 — Conselho ausente das metas e prioridades da Lei de Diretrizes</w:t>
+      </w:r>
+    </w:p>
+    <w:p>
+      <w:pPr>
+        <w:spacing w:line="276"/>
+        <w:ind w:firstLine="1133"/>
+        <w:jc w:val="both"/>
+      </w:pPr>
+      <w:r>
+        <w:rPr>
+          <w:rFonts w:ascii="Bookman Old Style" w:cs="Bookman Old Style" w:eastAsia="Bookman Old Style" w:hAnsi="Bookman Old Style"/>
+          <w:b/>
+          <w:bCs/>
+          <w:sz w:val="22"/>
+          <w:szCs w:val="22"/>
+        </w:rPr>
+        <w:t xml:space="preserve">Valor envolvido. </w:t>
+      </w:r>
+      <w:r>
+        <w:rPr>
+          <w:rFonts w:ascii="Bookman Old Style" w:cs="Bookman Old Style" w:eastAsia="Bookman Old Style" w:hAnsi="Bookman Old Style"/>
+          <w:b/>
+          <w:bCs/>
+          <w:sz w:val="22"/>
+          <w:szCs w:val="22"/>
+        </w:rPr>
+        <w:t xml:space="preserve">R$ 41.265.955,98</w:t>
+      </w:r>
+      <w:r>
+        <w:rPr>
+          <w:rFonts w:ascii="Bookman Old Style" w:cs="Bookman Old Style" w:eastAsia="Bookman Old Style" w:hAnsi="Bookman Old Style"/>
+          <w:sz w:val="22"/>
+          <w:szCs w:val="22"/>
+        </w:rPr>
+        <w:t xml:space="preserve"> — meta do setor na Lei de Diretrizes, sem o Conselho entre as ações</w:t>
+      </w:r>
+    </w:p>
+    <w:p>
+      <w:pPr>
+        <w:spacing w:line="276"/>
+        <w:ind w:firstLine="1133"/>
+        <w:jc w:val="both"/>
+      </w:pPr>
+      <w:r>
+        <w:rPr>
+          <w:rFonts w:ascii="Bookman Old Style" w:cs="Bookman Old Style" w:eastAsia="Bookman Old Style" w:hAnsi="Bookman Old Style"/>
+          <w:b/>
+          <w:bCs/>
+          <w:sz w:val="22"/>
+          <w:szCs w:val="22"/>
+        </w:rPr>
+        <w:t xml:space="preserve">Onde o dado foi encontrado. </w:t>
+      </w:r>
+      <w:r>
+        <w:rPr>
+          <w:rFonts w:ascii="Bookman Old Style" w:cs="Bookman Old Style" w:eastAsia="Bookman Old Style" w:hAnsi="Bookman Old Style"/>
+          <w:sz w:val="22"/>
+          <w:szCs w:val="22"/>
+        </w:rPr>
+        <w:t xml:space="preserve">Lei de Diretrizes Orçamentárias 11.589/2026, Anexo III, Metas e Prioridades, setor de políticas para mulher, direitos humanos e assistência social — </w:t>
+      </w:r>
+      <w:hyperlink w:history="1" r:id="rIdakbhm40-iaf3lunqqv1vb">
         <w:r>
           <w:rPr>
             <w:rStyle w:val="Hyperlink"/>
@@ -15449,7 +15874,7 @@
         </w:rPr>
         <w:t xml:space="preserve">Onde deveria estar publicado. </w:t>
       </w:r>
-      <w:hyperlink w:history="1" r:id="rIddkohfd1bssmt5mphkjxal">
+      <w:hyperlink w:history="1" r:id="rId9kuyx0il37k2wbchunpwc">
         <w:r>
           <w:rPr>
             <w:rStyle w:val="Hyperlink"/>
@@ -15492,7 +15917,7 @@
           <w:sz w:val="22"/>
           <w:szCs w:val="22"/>
         </w:rPr>
-        <w:t xml:space="preserve">1) Balanço Patrimonial de 2025, com demonstrativo do superávit financeiro por fonte; 2) Extratos de aplicação financeira do Fundo, mês a mês; 3) Decretos de crédito adicional de 2026, com a respectiva fonte de recursos e memória de cálculo; 4) Demonstrativo de saldo por fonte ao fim de cada exercício.</w:t>
+        <w:t xml:space="preserve">1) Plano Plurianual 2026-2029, na parte de assistência social; 2) Justificativa da inclusão de manutenção de cemitérios no setor de assistência social.</w:t>
       </w:r>
     </w:p>
     <w:p>
@@ -15517,19 +15942,7 @@
           <w:sz w:val="22"/>
           <w:szCs w:val="22"/>
         </w:rPr>
-        <w:t xml:space="preserve">Receita patrimonial de R$ 2.574.000,00 sobre Fundo de R$ 23.218.000,00 — 11.1%. Pressupõe saldo médio aplicado próximo do orçamento anual inteiro. Confirmado pelo outro lado: R$ 33.059.000,00 em créditos de 2026 abertos contra fontes de exercícios anteriores.</w:t>
-      </w:r>
-      <w:r>
-        <w:rPr>
-          <w:rStyle w:val="FootnoteReference"/>
-        </w:rPr>
-        <w:footnoteReference w:id="9"/>
-      </w:r>
-      <w:r>
-        <w:rPr>
-          <w:rStyle w:val="FootnoteReference"/>
-        </w:rPr>
-        <w:footnoteReference w:id="5"/>
+        <w:t xml:space="preserve">O Anexo III da Lei de Diretrizes Orçamentárias 11.589/2026 elenca, no setor de políticas para mulher, direitos humanos e assistência social, a meta de R$ 41.265.955,98, com cinco ações — inclusive manutenção de cemitérios. O Conselho não figura entre elas.</w:t>
       </w:r>
     </w:p>
     <w:p>
@@ -15556,7 +15969,7 @@
           <w:sz w:val="22"/>
           <w:szCs w:val="22"/>
         </w:rPr>
-        <w:t xml:space="preserve">Indiciário</w:t>
+        <w:t xml:space="preserve">Confirmado</w:t>
       </w:r>
       <w:r>
         <w:rPr>
@@ -15616,7 +16029,7 @@
           <w:sz w:val="24"/>
           <w:szCs w:val="24"/>
         </w:rPr>
-        <w:t xml:space="preserve">Pessoal e diárias</w:t>
+        <w:t xml:space="preserve">Receita e despesa</w:t>
       </w:r>
     </w:p>
     <w:p>
@@ -15633,7 +16046,7 @@
           <w:sz w:val="22"/>
           <w:szCs w:val="22"/>
         </w:rPr>
-        <w:t xml:space="preserve">PES-04 — Prestação de contas de deslocamento não localizada</w:t>
+        <w:t xml:space="preserve">REC-03 — Rendimento de aplicação incompatível com execução regular</w:t>
       </w:r>
     </w:p>
     <w:p>
@@ -15655,18 +16068,20 @@
       <w:r>
         <w:rPr>
           <w:rFonts w:ascii="Bookman Old Style" w:cs="Bookman Old Style" w:eastAsia="Bookman Old Style" w:hAnsi="Bookman Old Style"/>
-          <w:sz w:val="22"/>
-          <w:szCs w:val="22"/>
-        </w:rPr>
-        <w:t xml:space="preserve">Não quantificável sem os documentos faltantes.</w:t>
-      </w:r>
-      <w:r>
-        <w:rPr>
-          <w:rFonts w:ascii="Bookman Old Style" w:cs="Bookman Old Style" w:eastAsia="Bookman Old Style" w:hAnsi="Bookman Old Style"/>
-          <w:sz w:val="22"/>
-          <w:szCs w:val="22"/>
-        </w:rPr>
-        <w:t xml:space="preserve"/>
+          <w:b/>
+          <w:bCs/>
+          <w:sz w:val="22"/>
+          <w:szCs w:val="22"/>
+        </w:rPr>
+        <w:t xml:space="preserve">R$ 2.574.000,00</w:t>
+      </w:r>
+      <w:r>
+        <w:rPr>
+          <w:rFonts w:ascii="Bookman Old Style" w:cs="Bookman Old Style" w:eastAsia="Bookman Old Style" w:hAnsi="Bookman Old Style"/>
+          <w:sz w:val="22"/>
+          <w:szCs w:val="22"/>
+        </w:rPr>
+        <w:t xml:space="preserve"> — rendimento de aplicação, indício de recurso parado sem execução</w:t>
       </w:r>
     </w:p>
     <w:p>
@@ -15691,9 +16106,9 @@
           <w:sz w:val="22"/>
           <w:szCs w:val="22"/>
         </w:rPr>
-        <w:t xml:space="preserve">Acervo do Diário Oficial coletado, 161 eventos entre 2025 e 2026, com digest de cada edição — </w:t>
-      </w:r>
-      <w:hyperlink w:history="1" r:id="rIdw5ldgqm7tnzkdhrz8nfbf">
+        <w:t xml:space="preserve">Lei Orçamentária Anual 11.590/2026, anexos, Diário Oficial do Município, Edição 8697, de 09/01/2026, Edição Extra — </w:t>
+      </w:r>
+      <w:hyperlink w:history="1" r:id="rId3zfeh_zjzwcz6ptdml0m_">
         <w:r>
           <w:rPr>
             <w:rStyle w:val="Hyperlink"/>
@@ -15711,6 +16126,34 @@
           <w:sz w:val="22"/>
           <w:szCs w:val="22"/>
         </w:rPr>
+        <w:t xml:space="preserve">; </w:t>
+      </w:r>
+      <w:r>
+        <w:rPr>
+          <w:rFonts w:ascii="Bookman Old Style" w:cs="Bookman Old Style" w:eastAsia="Bookman Old Style" w:hAnsi="Bookman Old Style"/>
+          <w:sz w:val="22"/>
+          <w:szCs w:val="22"/>
+        </w:rPr>
+        <w:t xml:space="preserve">Acervo do Diário Oficial coletado, 161 eventos entre 2025 e 2026, com digest de cada edição — </w:t>
+      </w:r>
+      <w:hyperlink w:history="1" r:id="rIdnanc2jwhgxam9x6wcjb4b">
+        <w:r>
+          <w:rPr>
+            <w:rStyle w:val="Hyperlink"/>
+            <w:rFonts w:ascii="Bookman Old Style" w:cs="Bookman Old Style" w:eastAsia="Bookman Old Style" w:hAnsi="Bookman Old Style"/>
+            <w:sz w:val="20"/>
+            <w:szCs w:val="20"/>
+            <w:u w:val="single"/>
+          </w:rPr>
+          <w:t xml:space="preserve">acessar</w:t>
+        </w:r>
+      </w:hyperlink>
+      <w:r>
+        <w:rPr>
+          <w:rFonts w:ascii="Bookman Old Style" w:cs="Bookman Old Style" w:eastAsia="Bookman Old Style" w:hAnsi="Bookman Old Style"/>
+          <w:sz w:val="22"/>
+          <w:szCs w:val="22"/>
+        </w:rPr>
         <w:t xml:space="preserve">.</w:t>
       </w:r>
     </w:p>
@@ -15730,7 +16173,288 @@
         </w:rPr>
         <w:t xml:space="preserve">Onde deveria estar publicado. </w:t>
       </w:r>
-      <w:hyperlink w:history="1" r:id="rIdkpdfxqc3vkn90ka_wcgsq">
+      <w:hyperlink w:history="1" r:id="rIddwwczw0kw7fzh_bz2h45t">
+        <w:r>
+          <w:rPr>
+            <w:rStyle w:val="Hyperlink"/>
+            <w:rFonts w:ascii="Bookman Old Style" w:cs="Bookman Old Style" w:eastAsia="Bookman Old Style" w:hAnsi="Bookman Old Style"/>
+            <w:sz w:val="20"/>
+            <w:szCs w:val="20"/>
+            <w:u w:val="single"/>
+          </w:rPr>
+          <w:t xml:space="preserve">Portal da Transparência, Responsabilidade Fiscal</w:t>
+        </w:r>
+      </w:hyperlink>
+      <w:r>
+        <w:rPr>
+          <w:rFonts w:ascii="Bookman Old Style" w:cs="Bookman Old Style" w:eastAsia="Bookman Old Style" w:hAnsi="Bookman Old Style"/>
+          <w:sz w:val="22"/>
+          <w:szCs w:val="22"/>
+        </w:rPr>
+        <w:t xml:space="preserve">.</w:t>
+      </w:r>
+    </w:p>
+    <w:p>
+      <w:pPr>
+        <w:spacing w:line="276"/>
+        <w:ind w:firstLine="1133"/>
+        <w:jc w:val="both"/>
+      </w:pPr>
+      <w:r>
+        <w:rPr>
+          <w:rFonts w:ascii="Bookman Old Style" w:cs="Bookman Old Style" w:eastAsia="Bookman Old Style" w:hAnsi="Bookman Old Style"/>
+          <w:b/>
+          <w:bCs/>
+          <w:sz w:val="22"/>
+          <w:szCs w:val="22"/>
+        </w:rPr>
+        <w:t xml:space="preserve">Documentos que faltam. </w:t>
+      </w:r>
+      <w:r>
+        <w:rPr>
+          <w:rFonts w:ascii="Bookman Old Style" w:cs="Bookman Old Style" w:eastAsia="Bookman Old Style" w:hAnsi="Bookman Old Style"/>
+          <w:sz w:val="22"/>
+          <w:szCs w:val="22"/>
+        </w:rPr>
+        <w:t xml:space="preserve">1) Balanço Patrimonial de 2025, com demonstrativo do superávit financeiro por fonte; 2) Extratos de aplicação financeira do Fundo, mês a mês; 3) Decretos de crédito adicional de 2026, com a respectiva fonte de recursos e memória de cálculo; 4) Demonstrativo de saldo por fonte ao fim de cada exercício.</w:t>
+      </w:r>
+    </w:p>
+    <w:p>
+      <w:pPr>
+        <w:spacing w:line="276"/>
+        <w:ind w:firstLine="1133"/>
+        <w:jc w:val="both"/>
+      </w:pPr>
+      <w:r>
+        <w:rPr>
+          <w:rFonts w:ascii="Bookman Old Style" w:cs="Bookman Old Style" w:eastAsia="Bookman Old Style" w:hAnsi="Bookman Old Style"/>
+          <w:b/>
+          <w:bCs/>
+          <w:sz w:val="22"/>
+          <w:szCs w:val="22"/>
+        </w:rPr>
+        <w:t xml:space="preserve">Justificativa. </w:t>
+      </w:r>
+      <w:r>
+        <w:rPr>
+          <w:rFonts w:ascii="Bookman Old Style" w:cs="Bookman Old Style" w:eastAsia="Bookman Old Style" w:hAnsi="Bookman Old Style"/>
+          <w:sz w:val="22"/>
+          <w:szCs w:val="22"/>
+        </w:rPr>
+        <w:t xml:space="preserve">Receita patrimonial de R$ 2.574.000,00 sobre Fundo de R$ 23.218.000,00 — 11.1%. Pressupõe saldo médio aplicado próximo do orçamento anual inteiro. Confirmado pelo outro lado: R$ 33.059.000,00 em créditos de 2026 abertos contra fontes de exercícios anteriores.</w:t>
+      </w:r>
+      <w:r>
+        <w:rPr>
+          <w:rStyle w:val="FootnoteReference"/>
+        </w:rPr>
+        <w:footnoteReference w:id="9"/>
+      </w:r>
+      <w:r>
+        <w:rPr>
+          <w:rStyle w:val="FootnoteReference"/>
+        </w:rPr>
+        <w:footnoteReference w:id="5"/>
+      </w:r>
+    </w:p>
+    <w:p>
+      <w:pPr>
+        <w:spacing w:line="276"/>
+        <w:ind w:firstLine="1133"/>
+        <w:jc w:val="both"/>
+      </w:pPr>
+      <w:r>
+        <w:rPr>
+          <w:rFonts w:ascii="Bookman Old Style" w:cs="Bookman Old Style" w:eastAsia="Bookman Old Style" w:hAnsi="Bookman Old Style"/>
+          <w:i/>
+          <w:iCs/>
+          <w:sz w:val="22"/>
+          <w:szCs w:val="22"/>
+        </w:rPr>
+        <w:t xml:space="preserve">Selo: </w:t>
+      </w:r>
+      <w:r>
+        <w:rPr>
+          <w:rFonts w:ascii="Bookman Old Style" w:cs="Bookman Old Style" w:eastAsia="Bookman Old Style" w:hAnsi="Bookman Old Style"/>
+          <w:i/>
+          <w:iCs/>
+          <w:sz w:val="22"/>
+          <w:szCs w:val="22"/>
+        </w:rPr>
+        <w:t xml:space="preserve">Indiciário</w:t>
+      </w:r>
+      <w:r>
+        <w:rPr>
+          <w:rFonts w:ascii="Bookman Old Style" w:cs="Bookman Old Style" w:eastAsia="Bookman Old Style" w:hAnsi="Bookman Old Style"/>
+          <w:i/>
+          <w:iCs/>
+          <w:sz w:val="22"/>
+          <w:szCs w:val="22"/>
+        </w:rPr>
+        <w:t xml:space="preserve">. Severidade: </w:t>
+      </w:r>
+      <w:r>
+        <w:rPr>
+          <w:rFonts w:ascii="Bookman Old Style" w:cs="Bookman Old Style" w:eastAsia="Bookman Old Style" w:hAnsi="Bookman Old Style"/>
+          <w:i/>
+          <w:iCs/>
+          <w:sz w:val="22"/>
+          <w:szCs w:val="22"/>
+        </w:rPr>
+        <w:t xml:space="preserve">Média</w:t>
+      </w:r>
+      <w:r>
+        <w:rPr>
+          <w:rFonts w:ascii="Bookman Old Style" w:cs="Bookman Old Style" w:eastAsia="Bookman Old Style" w:hAnsi="Bookman Old Style"/>
+          <w:i/>
+          <w:iCs/>
+          <w:sz w:val="22"/>
+          <w:szCs w:val="22"/>
+        </w:rPr>
+        <w:t xml:space="preserve">.</w:t>
+      </w:r>
+    </w:p>
+    <w:p>
+      <w:pPr>
+        <w:spacing w:line="276"/>
+      </w:pPr>
+      <w:r>
+        <w:rPr>
+          <w:rFonts w:ascii="Bookman Old Style" w:cs="Bookman Old Style" w:eastAsia="Bookman Old Style" w:hAnsi="Bookman Old Style"/>
+          <w:sz w:val="22"/>
+          <w:szCs w:val="22"/>
+        </w:rPr>
+        <w:t xml:space="preserve"/>
+      </w:r>
+    </w:p>
+    <w:p>
+      <w:pPr>
+        <w:pStyle w:val="Heading2"/>
+        <w:spacing w:after="120" w:before="240"/>
+        <w:jc w:val="center"/>
+      </w:pPr>
+      <w:r>
+        <w:rPr>
+          <w:rFonts w:ascii="Bookman Old Style" w:cs="Bookman Old Style" w:eastAsia="Bookman Old Style" w:hAnsi="Bookman Old Style"/>
+          <w:b/>
+          <w:bCs/>
+          <w:sz w:val="24"/>
+          <w:szCs w:val="24"/>
+        </w:rPr>
+        <w:t xml:space="preserve">Pessoal e diárias</w:t>
+      </w:r>
+    </w:p>
+    <w:p>
+      <w:pPr>
+        <w:pStyle w:val="Heading3"/>
+        <w:spacing w:after="100" w:before="220"/>
+        <w:jc w:val="center"/>
+      </w:pPr>
+      <w:r>
+        <w:rPr>
+          <w:rFonts w:ascii="Bookman Old Style" w:cs="Bookman Old Style" w:eastAsia="Bookman Old Style" w:hAnsi="Bookman Old Style"/>
+          <w:b/>
+          <w:bCs/>
+          <w:sz w:val="22"/>
+          <w:szCs w:val="22"/>
+        </w:rPr>
+        <w:t xml:space="preserve">PES-04 — Prestação de contas de deslocamento não localizada</w:t>
+      </w:r>
+    </w:p>
+    <w:p>
+      <w:pPr>
+        <w:spacing w:line="276"/>
+        <w:ind w:firstLine="1133"/>
+        <w:jc w:val="both"/>
+      </w:pPr>
+      <w:r>
+        <w:rPr>
+          <w:rFonts w:ascii="Bookman Old Style" w:cs="Bookman Old Style" w:eastAsia="Bookman Old Style" w:hAnsi="Bookman Old Style"/>
+          <w:b/>
+          <w:bCs/>
+          <w:sz w:val="22"/>
+          <w:szCs w:val="22"/>
+        </w:rPr>
+        <w:t xml:space="preserve">Valor envolvido. </w:t>
+      </w:r>
+      <w:r>
+        <w:rPr>
+          <w:rFonts w:ascii="Bookman Old Style" w:cs="Bookman Old Style" w:eastAsia="Bookman Old Style" w:hAnsi="Bookman Old Style"/>
+          <w:sz w:val="22"/>
+          <w:szCs w:val="22"/>
+        </w:rPr>
+        <w:t xml:space="preserve">Não quantificável sem os documentos faltantes.</w:t>
+      </w:r>
+      <w:r>
+        <w:rPr>
+          <w:rFonts w:ascii="Bookman Old Style" w:cs="Bookman Old Style" w:eastAsia="Bookman Old Style" w:hAnsi="Bookman Old Style"/>
+          <w:sz w:val="22"/>
+          <w:szCs w:val="22"/>
+        </w:rPr>
+        <w:t xml:space="preserve"/>
+      </w:r>
+    </w:p>
+    <w:p>
+      <w:pPr>
+        <w:spacing w:line="276"/>
+        <w:ind w:firstLine="1133"/>
+        <w:jc w:val="both"/>
+      </w:pPr>
+      <w:r>
+        <w:rPr>
+          <w:rFonts w:ascii="Bookman Old Style" w:cs="Bookman Old Style" w:eastAsia="Bookman Old Style" w:hAnsi="Bookman Old Style"/>
+          <w:b/>
+          <w:bCs/>
+          <w:sz w:val="22"/>
+          <w:szCs w:val="22"/>
+        </w:rPr>
+        <w:t xml:space="preserve">Onde o dado foi encontrado. </w:t>
+      </w:r>
+      <w:r>
+        <w:rPr>
+          <w:rFonts w:ascii="Bookman Old Style" w:cs="Bookman Old Style" w:eastAsia="Bookman Old Style" w:hAnsi="Bookman Old Style"/>
+          <w:sz w:val="22"/>
+          <w:szCs w:val="22"/>
+        </w:rPr>
+        <w:t xml:space="preserve">Acervo do Diário Oficial coletado, 161 eventos entre 2025 e 2026, com digest de cada edição — </w:t>
+      </w:r>
+      <w:hyperlink w:history="1" r:id="rIdzk3uyprsmna4qimq3_int">
+        <w:r>
+          <w:rPr>
+            <w:rStyle w:val="Hyperlink"/>
+            <w:rFonts w:ascii="Bookman Old Style" w:cs="Bookman Old Style" w:eastAsia="Bookman Old Style" w:hAnsi="Bookman Old Style"/>
+            <w:sz w:val="20"/>
+            <w:szCs w:val="20"/>
+            <w:u w:val="single"/>
+          </w:rPr>
+          <w:t xml:space="preserve">acessar</w:t>
+        </w:r>
+      </w:hyperlink>
+      <w:r>
+        <w:rPr>
+          <w:rFonts w:ascii="Bookman Old Style" w:cs="Bookman Old Style" w:eastAsia="Bookman Old Style" w:hAnsi="Bookman Old Style"/>
+          <w:sz w:val="22"/>
+          <w:szCs w:val="22"/>
+        </w:rPr>
+        <w:t xml:space="preserve">.</w:t>
+      </w:r>
+    </w:p>
+    <w:p>
+      <w:pPr>
+        <w:spacing w:line="276"/>
+        <w:ind w:firstLine="1133"/>
+        <w:jc w:val="both"/>
+      </w:pPr>
+      <w:r>
+        <w:rPr>
+          <w:rFonts w:ascii="Bookman Old Style" w:cs="Bookman Old Style" w:eastAsia="Bookman Old Style" w:hAnsi="Bookman Old Style"/>
+          <w:b/>
+          <w:bCs/>
+          <w:sz w:val="22"/>
+          <w:szCs w:val="22"/>
+        </w:rPr>
+        <w:t xml:space="preserve">Onde deveria estar publicado. </w:t>
+      </w:r>
+      <w:hyperlink w:history="1" r:id="rIdhdzd0dm72w75dkwpvhdd5">
         <w:r>
           <w:rPr>
             <w:rStyle w:val="Hyperlink"/>
@@ -15968,7 +16692,7 @@
         </w:rPr>
         <w:t xml:space="preserve">Acervo do Diário Oficial coletado, 161 eventos entre 2025 e 2026, com digest de cada edição — </w:t>
       </w:r>
-      <w:hyperlink w:history="1" r:id="rIdl964kw0bteany1g8ukgfv">
+      <w:hyperlink w:history="1" r:id="rIdbnb55npw3imnwvcp8iwzk">
         <w:r>
           <w:rPr>
             <w:rStyle w:val="Hyperlink"/>
@@ -16005,7 +16729,7 @@
         </w:rPr>
         <w:t xml:space="preserve">Onde deveria estar publicado. </w:t>
       </w:r>
-      <w:hyperlink w:history="1" r:id="rIddcc0aadbf4o9wm1644u78">
+      <w:hyperlink w:history="1" r:id="rIddfcfkd6hz6lest_hzoxmb">
         <w:r>
           <w:rPr>
             <w:rStyle w:val="Hyperlink"/>
@@ -16206,7 +16930,7 @@
         </w:rPr>
         <w:t xml:space="preserve"> Canal: </w:t>
       </w:r>
-      <w:hyperlink w:history="1" r:id="rIdui2yftmmjrcpa11k8jpsl">
+      <w:hyperlink w:history="1" r:id="rIdhzmeqruem1rem2njvqrx9">
         <w:r>
           <w:rPr>
             <w:rStyle w:val="Hyperlink"/>
@@ -16272,7 +16996,7 @@
         </w:rPr>
         <w:t xml:space="preserve"> Canal: </w:t>
       </w:r>
-      <w:hyperlink w:history="1" r:id="rIdvwgyl4dmmzhrqlabofxg_">
+      <w:hyperlink w:history="1" r:id="rId2dxrj4s9vhuazgbvjaxn6">
         <w:r>
           <w:rPr>
             <w:rStyle w:val="Hyperlink"/>
@@ -16376,7 +17100,7 @@
         </w:rPr>
         <w:t xml:space="preserve"> Canal: </w:t>
       </w:r>
-      <w:hyperlink w:history="1" r:id="rIdbik_m0c4k0j9hwsbmcl9_">
+      <w:hyperlink w:history="1" r:id="rId5_kipevx_utarifvcve9v">
         <w:r>
           <w:rPr>
             <w:rStyle w:val="Hyperlink"/>

</xml_diff>

<commit_message>
coleta federal de repasses fundo a fundo com ordem bancaria do SIAFI; piso de 10% aferido sobre repasse real competencia a competencia; destinatarios com razao social, nome fantasia, natureza juridica, periodicidade e acumulado no ano; mapa de portais federal, estadual e municipal; busca semanal amplia para despesas do Conselho e piso do IGD
</commit_message>
<xml_diff>
--- a/relatorios/Parecer_Fiscalizacao_2026.docx
+++ b/relatorios/Parecer_Fiscalizacao_2026.docx
@@ -291,7 +291,7 @@
         </w:rPr>
         <w:t xml:space="preserve">. Documento consultado em: </w:t>
       </w:r>
-      <w:hyperlink w:history="1" r:id="rIdnuwbcxyeonmvhumtsysho">
+      <w:hyperlink w:history="1" r:id="rIdcynz1e4wcq2zrqbnb1rpp">
         <w:r>
           <w:rPr>
             <w:rStyle w:val="Hyperlink"/>
@@ -2210,7 +2210,7 @@
         </w:rPr>
         <w:t xml:space="preserve">Deveria estar em: </w:t>
       </w:r>
-      <w:hyperlink w:history="1" r:id="rIdykd8sfzerjvzgtacb_8zp">
+      <w:hyperlink w:history="1" r:id="rIdbv4esj3sinuw5navge1up">
         <w:r>
           <w:rPr>
             <w:rStyle w:val="Hyperlink"/>
@@ -2284,7 +2284,7 @@
         </w:rPr>
         <w:t xml:space="preserve">Deveria estar em: </w:t>
       </w:r>
-      <w:hyperlink w:history="1" r:id="rIdgbdrhm51af-ywu3qtjlyt">
+      <w:hyperlink w:history="1" r:id="rIdnoa4qpmvddq4pecvhwp0e">
         <w:r>
           <w:rPr>
             <w:rStyle w:val="Hyperlink"/>
@@ -2358,7 +2358,7 @@
         </w:rPr>
         <w:t xml:space="preserve">Deveria estar em: </w:t>
       </w:r>
-      <w:hyperlink w:history="1" r:id="rIdovamvdix0x71pjrbqifms">
+      <w:hyperlink w:history="1" r:id="rIdl0hz10mvrtrevfc7s2s_1">
         <w:r>
           <w:rPr>
             <w:rStyle w:val="Hyperlink"/>
@@ -2432,7 +2432,7 @@
         </w:rPr>
         <w:t xml:space="preserve">Deveria estar em: </w:t>
       </w:r>
-      <w:hyperlink w:history="1" r:id="rIdxfz2pqfvgy3u_lnuk68df">
+      <w:hyperlink w:history="1" r:id="rIde0z_4jmfhcme0r9vjotoq">
         <w:r>
           <w:rPr>
             <w:rStyle w:val="Hyperlink"/>
@@ -2506,7 +2506,7 @@
         </w:rPr>
         <w:t xml:space="preserve">Deveria estar em: </w:t>
       </w:r>
-      <w:hyperlink w:history="1" r:id="rIdtludpezosl4jziacxhj2w">
+      <w:hyperlink w:history="1" r:id="rIdizbr9cxbcogcw64zmmywy">
         <w:r>
           <w:rPr>
             <w:rStyle w:val="Hyperlink"/>
@@ -2580,7 +2580,7 @@
         </w:rPr>
         <w:t xml:space="preserve">Deveria estar em: </w:t>
       </w:r>
-      <w:hyperlink w:history="1" r:id="rIdftovjpw6x2defnvq0mbex">
+      <w:hyperlink w:history="1" r:id="rIdctzu_ojlklsmy9w7wkv7_">
         <w:r>
           <w:rPr>
             <w:rStyle w:val="Hyperlink"/>
@@ -4900,7 +4900,7 @@
         </w:rPr>
         <w:t xml:space="preserve">A versão interativa desta trilha, com o detalhe de cada contrato, está em </w:t>
       </w:r>
-      <w:hyperlink w:history="1" r:id="rIdtxaedoqlfkpt54ydo9ocv">
+      <w:hyperlink w:history="1" r:id="rIdxvdl0la4cffwvwklplzep">
         <w:r>
           <w:rPr>
             <w:rStyle w:val="Hyperlink"/>
@@ -5817,7 +5817,7 @@
         </w:rPr>
         <w:t xml:space="preserve">A versão didática desta trilha, feita para leitura por quem não é da área, está em </w:t>
       </w:r>
-      <w:hyperlink w:history="1" r:id="rIdlwhj9tlq6n5kjjgxlfvsd">
+      <w:hyperlink w:history="1" r:id="rIdymway-c7nvieyj1qvbvru">
         <w:r>
           <w:rPr>
             <w:rStyle w:val="Hyperlink"/>
@@ -6682,7 +6682,7 @@
           <w:sz w:val="22"/>
           <w:szCs w:val="22"/>
         </w:rPr>
-        <w:t xml:space="preserve">R$ 5.889,23</w:t>
+        <w:t xml:space="preserve">R$ 14.062,52</w:t>
       </w:r>
       <w:r>
         <w:rPr>
@@ -7829,7 +7829,3814 @@
           <w:sz w:val="26"/>
           <w:szCs w:val="26"/>
         </w:rPr>
-        <w:t xml:space="preserve">VII — Irregularidades Apuradas</w:t>
+        <w:t xml:space="preserve">VII — Repasse Federal e o Piso de Dez por Cento, Competência a Competência</w:t>
+      </w:r>
+    </w:p>
+    <w:p>
+      <w:pPr>
+        <w:spacing w:line="276"/>
+        <w:ind w:firstLine="1133"/>
+        <w:jc w:val="both"/>
+      </w:pPr>
+      <w:r>
+        <w:rPr>
+          <w:rFonts w:ascii="Bookman Old Style" w:cs="Bookman Old Style" w:eastAsia="Bookman Old Style" w:hAnsi="Bookman Old Style"/>
+          <w:sz w:val="22"/>
+          <w:szCs w:val="22"/>
+        </w:rPr>
+        <w:t xml:space="preserve">O lado da União foi obtido na planilha oficial de repasses fundo a fundo do Fundo Nacional de Assistência Social, que traz bloco, programa, competência, valor e a ordem bancária do SIAFI. Em 2024 e 2025 o Município recebeu </w:t>
+      </w:r>
+      <w:r>
+        <w:rPr>
+          <w:rFonts w:ascii="Bookman Old Style" w:cs="Bookman Old Style" w:eastAsia="Bookman Old Style" w:hAnsi="Bookman Old Style"/>
+          <w:b/>
+          <w:bCs/>
+          <w:sz w:val="22"/>
+          <w:szCs w:val="22"/>
+        </w:rPr>
+        <w:t xml:space="preserve">R$ 29.395.626,18</w:t>
+      </w:r>
+      <w:r>
+        <w:rPr>
+          <w:rFonts w:ascii="Bookman Old Style" w:cs="Bookman Old Style" w:eastAsia="Bookman Old Style" w:hAnsi="Bookman Old Style"/>
+          <w:sz w:val="22"/>
+          <w:szCs w:val="22"/>
+        </w:rPr>
+        <w:t xml:space="preserve"> em </w:t>
+      </w:r>
+      <w:r>
+        <w:rPr>
+          <w:rFonts w:ascii="Bookman Old Style" w:cs="Bookman Old Style" w:eastAsia="Bookman Old Style" w:hAnsi="Bookman Old Style"/>
+          <w:b/>
+          <w:bCs/>
+          <w:sz w:val="22"/>
+          <w:szCs w:val="22"/>
+        </w:rPr>
+        <w:t xml:space="preserve">482</w:t>
+      </w:r>
+      <w:r>
+        <w:rPr>
+          <w:rFonts w:ascii="Bookman Old Style" w:cs="Bookman Old Style" w:eastAsia="Bookman Old Style" w:hAnsi="Bookman Old Style"/>
+          <w:sz w:val="22"/>
+          <w:szCs w:val="22"/>
+        </w:rPr>
+        <w:t xml:space="preserve"> repasses. Do Índice de Gestão Descentralizada vieram </w:t>
+      </w:r>
+      <w:r>
+        <w:rPr>
+          <w:rFonts w:ascii="Bookman Old Style" w:cs="Bookman Old Style" w:eastAsia="Bookman Old Style" w:hAnsi="Bookman Old Style"/>
+          <w:b/>
+          <w:bCs/>
+          <w:sz w:val="22"/>
+          <w:szCs w:val="22"/>
+        </w:rPr>
+        <w:t xml:space="preserve">R$ 4.291.851,57</w:t>
+      </w:r>
+      <w:r>
+        <w:rPr>
+          <w:rFonts w:ascii="Bookman Old Style" w:cs="Bookman Old Style" w:eastAsia="Bookman Old Style" w:hAnsi="Bookman Old Style"/>
+          <w:sz w:val="22"/>
+          <w:szCs w:val="22"/>
+        </w:rPr>
+        <w:t xml:space="preserve">, o que torna devido ao controle social </w:t>
+      </w:r>
+      <w:r>
+        <w:rPr>
+          <w:rFonts w:ascii="Bookman Old Style" w:cs="Bookman Old Style" w:eastAsia="Bookman Old Style" w:hAnsi="Bookman Old Style"/>
+          <w:b/>
+          <w:bCs/>
+          <w:sz w:val="22"/>
+          <w:szCs w:val="22"/>
+        </w:rPr>
+        <w:t xml:space="preserve">R$ 429.185,16</w:t>
+      </w:r>
+      <w:r>
+        <w:rPr>
+          <w:rFonts w:ascii="Bookman Old Style" w:cs="Bookman Old Style" w:eastAsia="Bookman Old Style" w:hAnsi="Bookman Old Style"/>
+          <w:sz w:val="22"/>
+          <w:szCs w:val="22"/>
+        </w:rPr>
+        <w:t xml:space="preserve">. Nenhuma das </w:t>
+      </w:r>
+      <w:r>
+        <w:rPr>
+          <w:rFonts w:ascii="Bookman Old Style" w:cs="Bookman Old Style" w:eastAsia="Bookman Old Style" w:hAnsi="Bookman Old Style"/>
+          <w:b/>
+          <w:bCs/>
+          <w:sz w:val="22"/>
+          <w:szCs w:val="22"/>
+        </w:rPr>
+        <w:t xml:space="preserve">23</w:t>
+      </w:r>
+      <w:r>
+        <w:rPr>
+          <w:rFonts w:ascii="Bookman Old Style" w:cs="Bookman Old Style" w:eastAsia="Bookman Old Style" w:hAnsi="Bookman Old Style"/>
+          <w:sz w:val="22"/>
+          <w:szCs w:val="22"/>
+        </w:rPr>
+        <w:t xml:space="preserve"> competências tem demonstrativo de aplicação publicado.</w:t>
+      </w:r>
+    </w:p>
+    <w:p>
+      <w:pPr>
+        <w:spacing w:line="276"/>
+      </w:pPr>
+      <w:r>
+        <w:rPr>
+          <w:rFonts w:ascii="Bookman Old Style" w:cs="Bookman Old Style" w:eastAsia="Bookman Old Style" w:hAnsi="Bookman Old Style"/>
+          <w:sz w:val="22"/>
+          <w:szCs w:val="22"/>
+        </w:rPr>
+        <w:t xml:space="preserve"/>
+      </w:r>
+    </w:p>
+    <w:p>
+      <w:pPr>
+        <w:spacing w:line="276"/>
+        <w:ind w:firstLine="1133"/>
+        <w:jc w:val="both"/>
+      </w:pPr>
+      <w:r>
+        <w:rPr>
+          <w:rFonts w:ascii="Bookman Old Style" w:cs="Bookman Old Style" w:eastAsia="Bookman Old Style" w:hAnsi="Bookman Old Style"/>
+          <w:sz w:val="22"/>
+          <w:szCs w:val="22"/>
+        </w:rPr>
+        <w:t xml:space="preserve">O registro importa: os endereços antigos do Ministério respondem erro há meses. O dado existe, em planilha aberta e sem autenticação, em endereço novo. Quem procurar apenas pelos endereços antigos conclui, equivocadamente, que a informação não está disponível.</w:t>
+      </w:r>
+    </w:p>
+    <w:p>
+      <w:pPr>
+        <w:spacing w:line="276"/>
+      </w:pPr>
+      <w:r>
+        <w:rPr>
+          <w:rFonts w:ascii="Bookman Old Style" w:cs="Bookman Old Style" w:eastAsia="Bookman Old Style" w:hAnsi="Bookman Old Style"/>
+          <w:sz w:val="22"/>
+          <w:szCs w:val="22"/>
+        </w:rPr>
+        <w:t xml:space="preserve"/>
+      </w:r>
+    </w:p>
+    <w:p>
+      <w:pPr>
+        <w:spacing w:after="60"/>
+        <w:jc w:val="center"/>
+      </w:pPr>
+      <w:r>
+        <w:rPr>
+          <w:rFonts w:ascii="Bookman Old Style" w:cs="Bookman Old Style" w:eastAsia="Bookman Old Style" w:hAnsi="Bookman Old Style"/>
+          <w:b/>
+          <w:bCs/>
+          <w:sz w:val="20"/>
+          <w:szCs w:val="20"/>
+        </w:rPr>
+        <w:t xml:space="preserve">Repasse federal por bloco</w:t>
+      </w:r>
+    </w:p>
+    <w:tbl>
+      <w:tblPr>
+        <w:tblW w:type="dxa" w:w="8700"/>
+        <w:tblBorders>
+          <w:top w:val="single" w:color="auto" w:sz="4"/>
+          <w:left w:val="single" w:color="auto" w:sz="4"/>
+          <w:bottom w:val="single" w:color="auto" w:sz="4"/>
+          <w:right w:val="single" w:color="auto" w:sz="4"/>
+          <w:insideH w:val="single" w:color="auto" w:sz="4"/>
+          <w:insideV w:val="single" w:color="auto" w:sz="4"/>
+        </w:tblBorders>
+      </w:tblPr>
+      <w:tblGrid>
+        <w:gridCol w:w="5600"/>
+        <w:gridCol w:w="3100"/>
+      </w:tblGrid>
+      <w:tr>
+        <w:tc>
+          <w:tcPr>
+            <w:tcW w:type="dxa" w:w="5600"/>
+            <w:shd w:fill="EAE6DC" w:val="clear"/>
+          </w:tcPr>
+          <w:p>
+            <w:pPr>
+              <w:jc w:val="left"/>
+            </w:pPr>
+            <w:r>
+              <w:rPr>
+                <w:rFonts w:ascii="Bookman Old Style" w:cs="Bookman Old Style" w:eastAsia="Bookman Old Style" w:hAnsi="Bookman Old Style"/>
+                <w:b/>
+                <w:bCs/>
+                <w:sz w:val="18"/>
+                <w:szCs w:val="18"/>
+              </w:rPr>
+              <w:t xml:space="preserve">Bloco de financiamento</w:t>
+            </w:r>
+          </w:p>
+        </w:tc>
+        <w:tc>
+          <w:tcPr>
+            <w:tcW w:type="dxa" w:w="3100"/>
+            <w:shd w:fill="EAE6DC" w:val="clear"/>
+          </w:tcPr>
+          <w:p>
+            <w:pPr>
+              <w:jc w:val="left"/>
+            </w:pPr>
+            <w:r>
+              <w:rPr>
+                <w:rFonts w:ascii="Bookman Old Style" w:cs="Bookman Old Style" w:eastAsia="Bookman Old Style" w:hAnsi="Bookman Old Style"/>
+                <w:b/>
+                <w:bCs/>
+                <w:sz w:val="18"/>
+                <w:szCs w:val="18"/>
+              </w:rPr>
+              <w:t xml:space="preserve">Valor repassado</w:t>
+            </w:r>
+          </w:p>
+        </w:tc>
+      </w:tr>
+      <w:tr>
+        <w:tc>
+          <w:tcPr>
+            <w:tcW w:type="dxa" w:w="5600"/>
+          </w:tcPr>
+          <w:p>
+            <w:pPr>
+              <w:jc w:val="left"/>
+            </w:pPr>
+            <w:r>
+              <w:rPr>
+                <w:rFonts w:ascii="Bookman Old Style" w:cs="Bookman Old Style" w:eastAsia="Bookman Old Style" w:hAnsi="Bookman Old Style"/>
+                <w:sz w:val="18"/>
+                <w:szCs w:val="18"/>
+              </w:rPr>
+              <w:t xml:space="preserve">SIGTV</w:t>
+            </w:r>
+          </w:p>
+        </w:tc>
+        <w:tc>
+          <w:tcPr>
+            <w:tcW w:type="dxa" w:w="3100"/>
+          </w:tcPr>
+          <w:p>
+            <w:pPr>
+              <w:jc w:val="right"/>
+            </w:pPr>
+            <w:r>
+              <w:rPr>
+                <w:rFonts w:ascii="Bookman Old Style" w:cs="Bookman Old Style" w:eastAsia="Bookman Old Style" w:hAnsi="Bookman Old Style"/>
+                <w:sz w:val="18"/>
+                <w:szCs w:val="18"/>
+              </w:rPr>
+              <w:t xml:space="preserve">R$ 7.997.821,00</w:t>
+            </w:r>
+          </w:p>
+        </w:tc>
+      </w:tr>
+      <w:tr>
+        <w:tc>
+          <w:tcPr>
+            <w:tcW w:type="dxa" w:w="5600"/>
+          </w:tcPr>
+          <w:p>
+            <w:pPr>
+              <w:jc w:val="left"/>
+            </w:pPr>
+            <w:r>
+              <w:rPr>
+                <w:rFonts w:ascii="Bookman Old Style" w:cs="Bookman Old Style" w:eastAsia="Bookman Old Style" w:hAnsi="Bookman Old Style"/>
+                <w:sz w:val="18"/>
+                <w:szCs w:val="18"/>
+              </w:rPr>
+              <w:t xml:space="preserve">BLOCO PSB</w:t>
+            </w:r>
+          </w:p>
+        </w:tc>
+        <w:tc>
+          <w:tcPr>
+            <w:tcW w:type="dxa" w:w="3100"/>
+          </w:tcPr>
+          <w:p>
+            <w:pPr>
+              <w:jc w:val="right"/>
+            </w:pPr>
+            <w:r>
+              <w:rPr>
+                <w:rFonts w:ascii="Bookman Old Style" w:cs="Bookman Old Style" w:eastAsia="Bookman Old Style" w:hAnsi="Bookman Old Style"/>
+                <w:sz w:val="18"/>
+                <w:szCs w:val="18"/>
+              </w:rPr>
+              <w:t xml:space="preserve">R$ 5.746.502,10</w:t>
+            </w:r>
+          </w:p>
+        </w:tc>
+      </w:tr>
+      <w:tr>
+        <w:tc>
+          <w:tcPr>
+            <w:tcW w:type="dxa" w:w="5600"/>
+          </w:tcPr>
+          <w:p>
+            <w:pPr>
+              <w:jc w:val="left"/>
+            </w:pPr>
+            <w:r>
+              <w:rPr>
+                <w:rFonts w:ascii="Bookman Old Style" w:cs="Bookman Old Style" w:eastAsia="Bookman Old Style" w:hAnsi="Bookman Old Style"/>
+                <w:sz w:val="18"/>
+                <w:szCs w:val="18"/>
+              </w:rPr>
+              <w:t xml:space="preserve">ESTRUTURASUAS</w:t>
+            </w:r>
+          </w:p>
+        </w:tc>
+        <w:tc>
+          <w:tcPr>
+            <w:tcW w:type="dxa" w:w="3100"/>
+          </w:tcPr>
+          <w:p>
+            <w:pPr>
+              <w:jc w:val="right"/>
+            </w:pPr>
+            <w:r>
+              <w:rPr>
+                <w:rFonts w:ascii="Bookman Old Style" w:cs="Bookman Old Style" w:eastAsia="Bookman Old Style" w:hAnsi="Bookman Old Style"/>
+                <w:sz w:val="18"/>
+                <w:szCs w:val="18"/>
+              </w:rPr>
+              <w:t xml:space="preserve">R$ 5.150.000,00</w:t>
+            </w:r>
+          </w:p>
+        </w:tc>
+      </w:tr>
+      <w:tr>
+        <w:tc>
+          <w:tcPr>
+            <w:tcW w:type="dxa" w:w="5600"/>
+          </w:tcPr>
+          <w:p>
+            <w:pPr>
+              <w:jc w:val="left"/>
+            </w:pPr>
+            <w:r>
+              <w:rPr>
+                <w:rFonts w:ascii="Bookman Old Style" w:cs="Bookman Old Style" w:eastAsia="Bookman Old Style" w:hAnsi="Bookman Old Style"/>
+                <w:sz w:val="18"/>
+                <w:szCs w:val="18"/>
+              </w:rPr>
+              <w:t xml:space="preserve">BLOCO IGDBF</w:t>
+            </w:r>
+          </w:p>
+        </w:tc>
+        <w:tc>
+          <w:tcPr>
+            <w:tcW w:type="dxa" w:w="3100"/>
+          </w:tcPr>
+          <w:p>
+            <w:pPr>
+              <w:jc w:val="right"/>
+            </w:pPr>
+            <w:r>
+              <w:rPr>
+                <w:rFonts w:ascii="Bookman Old Style" w:cs="Bookman Old Style" w:eastAsia="Bookman Old Style" w:hAnsi="Bookman Old Style"/>
+                <w:sz w:val="18"/>
+                <w:szCs w:val="18"/>
+              </w:rPr>
+              <w:t xml:space="preserve">R$ 4.291.851,57</w:t>
+            </w:r>
+          </w:p>
+        </w:tc>
+      </w:tr>
+      <w:tr>
+        <w:tc>
+          <w:tcPr>
+            <w:tcW w:type="dxa" w:w="5600"/>
+          </w:tcPr>
+          <w:p>
+            <w:pPr>
+              <w:jc w:val="left"/>
+            </w:pPr>
+            <w:r>
+              <w:rPr>
+                <w:rFonts w:ascii="Bookman Old Style" w:cs="Bookman Old Style" w:eastAsia="Bookman Old Style" w:hAnsi="Bookman Old Style"/>
+                <w:sz w:val="18"/>
+                <w:szCs w:val="18"/>
+              </w:rPr>
+              <w:t xml:space="preserve">BLOCO PSE-MC</w:t>
+            </w:r>
+          </w:p>
+        </w:tc>
+        <w:tc>
+          <w:tcPr>
+            <w:tcW w:type="dxa" w:w="3100"/>
+          </w:tcPr>
+          <w:p>
+            <w:pPr>
+              <w:jc w:val="right"/>
+            </w:pPr>
+            <w:r>
+              <w:rPr>
+                <w:rFonts w:ascii="Bookman Old Style" w:cs="Bookman Old Style" w:eastAsia="Bookman Old Style" w:hAnsi="Bookman Old Style"/>
+                <w:sz w:val="18"/>
+                <w:szCs w:val="18"/>
+              </w:rPr>
+              <w:t xml:space="preserve">R$ 4.272.210,49</w:t>
+            </w:r>
+          </w:p>
+        </w:tc>
+      </w:tr>
+      <w:tr>
+        <w:tc>
+          <w:tcPr>
+            <w:tcW w:type="dxa" w:w="5600"/>
+          </w:tcPr>
+          <w:p>
+            <w:pPr>
+              <w:jc w:val="left"/>
+            </w:pPr>
+            <w:r>
+              <w:rPr>
+                <w:rFonts w:ascii="Bookman Old Style" w:cs="Bookman Old Style" w:eastAsia="Bookman Old Style" w:hAnsi="Bookman Old Style"/>
+                <w:sz w:val="18"/>
+                <w:szCs w:val="18"/>
+              </w:rPr>
+              <w:t xml:space="preserve">BLOCO PSE-AC</w:t>
+            </w:r>
+          </w:p>
+        </w:tc>
+        <w:tc>
+          <w:tcPr>
+            <w:tcW w:type="dxa" w:w="3100"/>
+          </w:tcPr>
+          <w:p>
+            <w:pPr>
+              <w:jc w:val="right"/>
+            </w:pPr>
+            <w:r>
+              <w:rPr>
+                <w:rFonts w:ascii="Bookman Old Style" w:cs="Bookman Old Style" w:eastAsia="Bookman Old Style" w:hAnsi="Bookman Old Style"/>
+                <w:sz w:val="18"/>
+                <w:szCs w:val="18"/>
+              </w:rPr>
+              <w:t xml:space="preserve">R$ 1.934.295,02</w:t>
+            </w:r>
+          </w:p>
+        </w:tc>
+      </w:tr>
+      <w:tr>
+        <w:tc>
+          <w:tcPr>
+            <w:tcW w:type="dxa" w:w="5600"/>
+          </w:tcPr>
+          <w:p>
+            <w:pPr>
+              <w:jc w:val="left"/>
+            </w:pPr>
+            <w:r>
+              <w:rPr>
+                <w:rFonts w:ascii="Bookman Old Style" w:cs="Bookman Old Style" w:eastAsia="Bookman Old Style" w:hAnsi="Bookman Old Style"/>
+                <w:sz w:val="18"/>
+                <w:szCs w:val="18"/>
+              </w:rPr>
+              <w:t xml:space="preserve">CRIANÇA FELIZ</w:t>
+            </w:r>
+          </w:p>
+        </w:tc>
+        <w:tc>
+          <w:tcPr>
+            <w:tcW w:type="dxa" w:w="3100"/>
+          </w:tcPr>
+          <w:p>
+            <w:pPr>
+              <w:jc w:val="right"/>
+            </w:pPr>
+            <w:r>
+              <w:rPr>
+                <w:rFonts w:ascii="Bookman Old Style" w:cs="Bookman Old Style" w:eastAsia="Bookman Old Style" w:hAnsi="Bookman Old Style"/>
+                <w:sz w:val="18"/>
+                <w:szCs w:val="18"/>
+              </w:rPr>
+              <w:t xml:space="preserve">R$ 2.026,00</w:t>
+            </w:r>
+          </w:p>
+        </w:tc>
+      </w:tr>
+      <w:tr>
+        <w:tc>
+          <w:tcPr>
+            <w:tcW w:type="dxa" w:w="5600"/>
+          </w:tcPr>
+          <w:p>
+            <w:pPr>
+              <w:jc w:val="left"/>
+            </w:pPr>
+            <w:r>
+              <w:rPr>
+                <w:rFonts w:ascii="Bookman Old Style" w:cs="Bookman Old Style" w:eastAsia="Bookman Old Style" w:hAnsi="Bookman Old Style"/>
+                <w:sz w:val="18"/>
+                <w:szCs w:val="18"/>
+              </w:rPr>
+              <w:t xml:space="preserve">BPC ESCOLA</w:t>
+            </w:r>
+          </w:p>
+        </w:tc>
+        <w:tc>
+          <w:tcPr>
+            <w:tcW w:type="dxa" w:w="3100"/>
+          </w:tcPr>
+          <w:p>
+            <w:pPr>
+              <w:jc w:val="right"/>
+            </w:pPr>
+            <w:r>
+              <w:rPr>
+                <w:rFonts w:ascii="Bookman Old Style" w:cs="Bookman Old Style" w:eastAsia="Bookman Old Style" w:hAnsi="Bookman Old Style"/>
+                <w:sz w:val="18"/>
+                <w:szCs w:val="18"/>
+              </w:rPr>
+              <w:t xml:space="preserve">R$ 920,00</w:t>
+            </w:r>
+          </w:p>
+        </w:tc>
+      </w:tr>
+    </w:tbl>
+    <w:p>
+      <w:pPr>
+        <w:spacing w:line="276"/>
+      </w:pPr>
+      <w:r>
+        <w:rPr>
+          <w:rFonts w:ascii="Bookman Old Style" w:cs="Bookman Old Style" w:eastAsia="Bookman Old Style" w:hAnsi="Bookman Old Style"/>
+          <w:sz w:val="22"/>
+          <w:szCs w:val="22"/>
+        </w:rPr>
+        <w:t xml:space="preserve"/>
+      </w:r>
+    </w:p>
+    <w:p>
+      <w:pPr>
+        <w:spacing w:after="60"/>
+        <w:jc w:val="center"/>
+      </w:pPr>
+      <w:r>
+        <w:rPr>
+          <w:rFonts w:ascii="Bookman Old Style" w:cs="Bookman Old Style" w:eastAsia="Bookman Old Style" w:hAnsi="Bookman Old Style"/>
+          <w:b/>
+          <w:bCs/>
+          <w:sz w:val="20"/>
+          <w:szCs w:val="20"/>
+        </w:rPr>
+        <w:t xml:space="preserve">Piso de dez por cento, competência a competência</w:t>
+      </w:r>
+    </w:p>
+    <w:tbl>
+      <w:tblPr>
+        <w:tblW w:type="dxa" w:w="8700"/>
+        <w:tblBorders>
+          <w:top w:val="single" w:color="auto" w:sz="4"/>
+          <w:left w:val="single" w:color="auto" w:sz="4"/>
+          <w:bottom w:val="single" w:color="auto" w:sz="4"/>
+          <w:right w:val="single" w:color="auto" w:sz="4"/>
+          <w:insideH w:val="single" w:color="auto" w:sz="4"/>
+          <w:insideV w:val="single" w:color="auto" w:sz="4"/>
+        </w:tblBorders>
+      </w:tblPr>
+      <w:tblGrid>
+        <w:gridCol w:w="1800"/>
+        <w:gridCol w:w="2400"/>
+        <w:gridCol w:w="2400"/>
+        <w:gridCol w:w="2100"/>
+      </w:tblGrid>
+      <w:tr>
+        <w:tc>
+          <w:tcPr>
+            <w:tcW w:type="dxa" w:w="1800"/>
+            <w:shd w:fill="EAE6DC" w:val="clear"/>
+          </w:tcPr>
+          <w:p>
+            <w:pPr>
+              <w:jc w:val="left"/>
+            </w:pPr>
+            <w:r>
+              <w:rPr>
+                <w:rFonts w:ascii="Bookman Old Style" w:cs="Bookman Old Style" w:eastAsia="Bookman Old Style" w:hAnsi="Bookman Old Style"/>
+                <w:b/>
+                <w:bCs/>
+                <w:sz w:val="18"/>
+                <w:szCs w:val="18"/>
+              </w:rPr>
+              <w:t xml:space="preserve">Competência</w:t>
+            </w:r>
+          </w:p>
+        </w:tc>
+        <w:tc>
+          <w:tcPr>
+            <w:tcW w:type="dxa" w:w="2400"/>
+            <w:shd w:fill="EAE6DC" w:val="clear"/>
+          </w:tcPr>
+          <w:p>
+            <w:pPr>
+              <w:jc w:val="left"/>
+            </w:pPr>
+            <w:r>
+              <w:rPr>
+                <w:rFonts w:ascii="Bookman Old Style" w:cs="Bookman Old Style" w:eastAsia="Bookman Old Style" w:hAnsi="Bookman Old Style"/>
+                <w:b/>
+                <w:bCs/>
+                <w:sz w:val="18"/>
+                <w:szCs w:val="18"/>
+              </w:rPr>
+              <w:t xml:space="preserve">Índice repassado</w:t>
+            </w:r>
+          </w:p>
+        </w:tc>
+        <w:tc>
+          <w:tcPr>
+            <w:tcW w:type="dxa" w:w="2400"/>
+            <w:shd w:fill="EAE6DC" w:val="clear"/>
+          </w:tcPr>
+          <w:p>
+            <w:pPr>
+              <w:jc w:val="left"/>
+            </w:pPr>
+            <w:r>
+              <w:rPr>
+                <w:rFonts w:ascii="Bookman Old Style" w:cs="Bookman Old Style" w:eastAsia="Bookman Old Style" w:hAnsi="Bookman Old Style"/>
+                <w:b/>
+                <w:bCs/>
+                <w:sz w:val="18"/>
+                <w:szCs w:val="18"/>
+              </w:rPr>
+              <w:t xml:space="preserve">Devido ao Conselho</w:t>
+            </w:r>
+          </w:p>
+        </w:tc>
+        <w:tc>
+          <w:tcPr>
+            <w:tcW w:type="dxa" w:w="2100"/>
+            <w:shd w:fill="EAE6DC" w:val="clear"/>
+          </w:tcPr>
+          <w:p>
+            <w:pPr>
+              <w:jc w:val="left"/>
+            </w:pPr>
+            <w:r>
+              <w:rPr>
+                <w:rFonts w:ascii="Bookman Old Style" w:cs="Bookman Old Style" w:eastAsia="Bookman Old Style" w:hAnsi="Bookman Old Style"/>
+                <w:b/>
+                <w:bCs/>
+                <w:sz w:val="18"/>
+                <w:szCs w:val="18"/>
+              </w:rPr>
+              <w:t xml:space="preserve">Aplicado</w:t>
+            </w:r>
+          </w:p>
+        </w:tc>
+      </w:tr>
+      <w:tr>
+        <w:tc>
+          <w:tcPr>
+            <w:tcW w:type="dxa" w:w="1800"/>
+          </w:tcPr>
+          <w:p>
+            <w:pPr>
+              <w:jc w:val="left"/>
+            </w:pPr>
+            <w:r>
+              <w:rPr>
+                <w:rFonts w:ascii="Bookman Old Style" w:cs="Bookman Old Style" w:eastAsia="Bookman Old Style" w:hAnsi="Bookman Old Style"/>
+                <w:sz w:val="18"/>
+                <w:szCs w:val="18"/>
+              </w:rPr>
+              <w:t xml:space="preserve">2023-12</w:t>
+            </w:r>
+          </w:p>
+        </w:tc>
+        <w:tc>
+          <w:tcPr>
+            <w:tcW w:type="dxa" w:w="2400"/>
+          </w:tcPr>
+          <w:p>
+            <w:pPr>
+              <w:jc w:val="right"/>
+            </w:pPr>
+            <w:r>
+              <w:rPr>
+                <w:rFonts w:ascii="Bookman Old Style" w:cs="Bookman Old Style" w:eastAsia="Bookman Old Style" w:hAnsi="Bookman Old Style"/>
+                <w:sz w:val="18"/>
+                <w:szCs w:val="18"/>
+              </w:rPr>
+              <w:t xml:space="preserve">R$ 198.130,01</w:t>
+            </w:r>
+          </w:p>
+        </w:tc>
+        <w:tc>
+          <w:tcPr>
+            <w:tcW w:type="dxa" w:w="2400"/>
+          </w:tcPr>
+          <w:p>
+            <w:pPr>
+              <w:jc w:val="right"/>
+            </w:pPr>
+            <w:r>
+              <w:rPr>
+                <w:rFonts w:ascii="Bookman Old Style" w:cs="Bookman Old Style" w:eastAsia="Bookman Old Style" w:hAnsi="Bookman Old Style"/>
+                <w:sz w:val="18"/>
+                <w:szCs w:val="18"/>
+              </w:rPr>
+              <w:t xml:space="preserve">R$ 19.813,00</w:t>
+            </w:r>
+          </w:p>
+        </w:tc>
+        <w:tc>
+          <w:tcPr>
+            <w:tcW w:type="dxa" w:w="2100"/>
+          </w:tcPr>
+          <w:p>
+            <w:pPr>
+              <w:jc w:val="left"/>
+            </w:pPr>
+            <w:r>
+              <w:rPr>
+                <w:rFonts w:ascii="Bookman Old Style" w:cs="Bookman Old Style" w:eastAsia="Bookman Old Style" w:hAnsi="Bookman Old Style"/>
+                <w:sz w:val="18"/>
+                <w:szCs w:val="18"/>
+              </w:rPr>
+              <w:t xml:space="preserve">sem demonstrativo</w:t>
+            </w:r>
+          </w:p>
+        </w:tc>
+      </w:tr>
+      <w:tr>
+        <w:tc>
+          <w:tcPr>
+            <w:tcW w:type="dxa" w:w="1800"/>
+          </w:tcPr>
+          <w:p>
+            <w:pPr>
+              <w:jc w:val="left"/>
+            </w:pPr>
+            <w:r>
+              <w:rPr>
+                <w:rFonts w:ascii="Bookman Old Style" w:cs="Bookman Old Style" w:eastAsia="Bookman Old Style" w:hAnsi="Bookman Old Style"/>
+                <w:sz w:val="18"/>
+                <w:szCs w:val="18"/>
+              </w:rPr>
+              <w:t xml:space="preserve">2024-01</w:t>
+            </w:r>
+          </w:p>
+        </w:tc>
+        <w:tc>
+          <w:tcPr>
+            <w:tcW w:type="dxa" w:w="2400"/>
+          </w:tcPr>
+          <w:p>
+            <w:pPr>
+              <w:jc w:val="right"/>
+            </w:pPr>
+            <w:r>
+              <w:rPr>
+                <w:rFonts w:ascii="Bookman Old Style" w:cs="Bookman Old Style" w:eastAsia="Bookman Old Style" w:hAnsi="Bookman Old Style"/>
+                <w:sz w:val="18"/>
+                <w:szCs w:val="18"/>
+              </w:rPr>
+              <w:t xml:space="preserve">R$ 200.702,52</w:t>
+            </w:r>
+          </w:p>
+        </w:tc>
+        <w:tc>
+          <w:tcPr>
+            <w:tcW w:type="dxa" w:w="2400"/>
+          </w:tcPr>
+          <w:p>
+            <w:pPr>
+              <w:jc w:val="right"/>
+            </w:pPr>
+            <w:r>
+              <w:rPr>
+                <w:rFonts w:ascii="Bookman Old Style" w:cs="Bookman Old Style" w:eastAsia="Bookman Old Style" w:hAnsi="Bookman Old Style"/>
+                <w:sz w:val="18"/>
+                <w:szCs w:val="18"/>
+              </w:rPr>
+              <w:t xml:space="preserve">R$ 20.070,25</w:t>
+            </w:r>
+          </w:p>
+        </w:tc>
+        <w:tc>
+          <w:tcPr>
+            <w:tcW w:type="dxa" w:w="2100"/>
+          </w:tcPr>
+          <w:p>
+            <w:pPr>
+              <w:jc w:val="left"/>
+            </w:pPr>
+            <w:r>
+              <w:rPr>
+                <w:rFonts w:ascii="Bookman Old Style" w:cs="Bookman Old Style" w:eastAsia="Bookman Old Style" w:hAnsi="Bookman Old Style"/>
+                <w:sz w:val="18"/>
+                <w:szCs w:val="18"/>
+              </w:rPr>
+              <w:t xml:space="preserve">sem demonstrativo</w:t>
+            </w:r>
+          </w:p>
+        </w:tc>
+      </w:tr>
+      <w:tr>
+        <w:tc>
+          <w:tcPr>
+            <w:tcW w:type="dxa" w:w="1800"/>
+          </w:tcPr>
+          <w:p>
+            <w:pPr>
+              <w:jc w:val="left"/>
+            </w:pPr>
+            <w:r>
+              <w:rPr>
+                <w:rFonts w:ascii="Bookman Old Style" w:cs="Bookman Old Style" w:eastAsia="Bookman Old Style" w:hAnsi="Bookman Old Style"/>
+                <w:sz w:val="18"/>
+                <w:szCs w:val="18"/>
+              </w:rPr>
+              <w:t xml:space="preserve">2024-03</w:t>
+            </w:r>
+          </w:p>
+        </w:tc>
+        <w:tc>
+          <w:tcPr>
+            <w:tcW w:type="dxa" w:w="2400"/>
+          </w:tcPr>
+          <w:p>
+            <w:pPr>
+              <w:jc w:val="right"/>
+            </w:pPr>
+            <w:r>
+              <w:rPr>
+                <w:rFonts w:ascii="Bookman Old Style" w:cs="Bookman Old Style" w:eastAsia="Bookman Old Style" w:hAnsi="Bookman Old Style"/>
+                <w:sz w:val="18"/>
+                <w:szCs w:val="18"/>
+              </w:rPr>
+              <w:t xml:space="preserve">R$ 197.722,47</w:t>
+            </w:r>
+          </w:p>
+        </w:tc>
+        <w:tc>
+          <w:tcPr>
+            <w:tcW w:type="dxa" w:w="2400"/>
+          </w:tcPr>
+          <w:p>
+            <w:pPr>
+              <w:jc w:val="right"/>
+            </w:pPr>
+            <w:r>
+              <w:rPr>
+                <w:rFonts w:ascii="Bookman Old Style" w:cs="Bookman Old Style" w:eastAsia="Bookman Old Style" w:hAnsi="Bookman Old Style"/>
+                <w:sz w:val="18"/>
+                <w:szCs w:val="18"/>
+              </w:rPr>
+              <w:t xml:space="preserve">R$ 19.772,25</w:t>
+            </w:r>
+          </w:p>
+        </w:tc>
+        <w:tc>
+          <w:tcPr>
+            <w:tcW w:type="dxa" w:w="2100"/>
+          </w:tcPr>
+          <w:p>
+            <w:pPr>
+              <w:jc w:val="left"/>
+            </w:pPr>
+            <w:r>
+              <w:rPr>
+                <w:rFonts w:ascii="Bookman Old Style" w:cs="Bookman Old Style" w:eastAsia="Bookman Old Style" w:hAnsi="Bookman Old Style"/>
+                <w:sz w:val="18"/>
+                <w:szCs w:val="18"/>
+              </w:rPr>
+              <w:t xml:space="preserve">sem demonstrativo</w:t>
+            </w:r>
+          </w:p>
+        </w:tc>
+      </w:tr>
+      <w:tr>
+        <w:tc>
+          <w:tcPr>
+            <w:tcW w:type="dxa" w:w="1800"/>
+          </w:tcPr>
+          <w:p>
+            <w:pPr>
+              <w:jc w:val="left"/>
+            </w:pPr>
+            <w:r>
+              <w:rPr>
+                <w:rFonts w:ascii="Bookman Old Style" w:cs="Bookman Old Style" w:eastAsia="Bookman Old Style" w:hAnsi="Bookman Old Style"/>
+                <w:sz w:val="18"/>
+                <w:szCs w:val="18"/>
+              </w:rPr>
+              <w:t xml:space="preserve">2024-04</w:t>
+            </w:r>
+          </w:p>
+        </w:tc>
+        <w:tc>
+          <w:tcPr>
+            <w:tcW w:type="dxa" w:w="2400"/>
+          </w:tcPr>
+          <w:p>
+            <w:pPr>
+              <w:jc w:val="right"/>
+            </w:pPr>
+            <w:r>
+              <w:rPr>
+                <w:rFonts w:ascii="Bookman Old Style" w:cs="Bookman Old Style" w:eastAsia="Bookman Old Style" w:hAnsi="Bookman Old Style"/>
+                <w:sz w:val="18"/>
+                <w:szCs w:val="18"/>
+              </w:rPr>
+              <w:t xml:space="preserve">R$ 197.102,96</w:t>
+            </w:r>
+          </w:p>
+        </w:tc>
+        <w:tc>
+          <w:tcPr>
+            <w:tcW w:type="dxa" w:w="2400"/>
+          </w:tcPr>
+          <w:p>
+            <w:pPr>
+              <w:jc w:val="right"/>
+            </w:pPr>
+            <w:r>
+              <w:rPr>
+                <w:rFonts w:ascii="Bookman Old Style" w:cs="Bookman Old Style" w:eastAsia="Bookman Old Style" w:hAnsi="Bookman Old Style"/>
+                <w:sz w:val="18"/>
+                <w:szCs w:val="18"/>
+              </w:rPr>
+              <w:t xml:space="preserve">R$ 19.710,30</w:t>
+            </w:r>
+          </w:p>
+        </w:tc>
+        <w:tc>
+          <w:tcPr>
+            <w:tcW w:type="dxa" w:w="2100"/>
+          </w:tcPr>
+          <w:p>
+            <w:pPr>
+              <w:jc w:val="left"/>
+            </w:pPr>
+            <w:r>
+              <w:rPr>
+                <w:rFonts w:ascii="Bookman Old Style" w:cs="Bookman Old Style" w:eastAsia="Bookman Old Style" w:hAnsi="Bookman Old Style"/>
+                <w:sz w:val="18"/>
+                <w:szCs w:val="18"/>
+              </w:rPr>
+              <w:t xml:space="preserve">sem demonstrativo</w:t>
+            </w:r>
+          </w:p>
+        </w:tc>
+      </w:tr>
+      <w:tr>
+        <w:tc>
+          <w:tcPr>
+            <w:tcW w:type="dxa" w:w="1800"/>
+          </w:tcPr>
+          <w:p>
+            <w:pPr>
+              <w:jc w:val="left"/>
+            </w:pPr>
+            <w:r>
+              <w:rPr>
+                <w:rFonts w:ascii="Bookman Old Style" w:cs="Bookman Old Style" w:eastAsia="Bookman Old Style" w:hAnsi="Bookman Old Style"/>
+                <w:sz w:val="18"/>
+                <w:szCs w:val="18"/>
+              </w:rPr>
+              <w:t xml:space="preserve">2024-05</w:t>
+            </w:r>
+          </w:p>
+        </w:tc>
+        <w:tc>
+          <w:tcPr>
+            <w:tcW w:type="dxa" w:w="2400"/>
+          </w:tcPr>
+          <w:p>
+            <w:pPr>
+              <w:jc w:val="right"/>
+            </w:pPr>
+            <w:r>
+              <w:rPr>
+                <w:rFonts w:ascii="Bookman Old Style" w:cs="Bookman Old Style" w:eastAsia="Bookman Old Style" w:hAnsi="Bookman Old Style"/>
+                <w:sz w:val="18"/>
+                <w:szCs w:val="18"/>
+              </w:rPr>
+              <w:t xml:space="preserve">R$ 190.344,85</w:t>
+            </w:r>
+          </w:p>
+        </w:tc>
+        <w:tc>
+          <w:tcPr>
+            <w:tcW w:type="dxa" w:w="2400"/>
+          </w:tcPr>
+          <w:p>
+            <w:pPr>
+              <w:jc w:val="right"/>
+            </w:pPr>
+            <w:r>
+              <w:rPr>
+                <w:rFonts w:ascii="Bookman Old Style" w:cs="Bookman Old Style" w:eastAsia="Bookman Old Style" w:hAnsi="Bookman Old Style"/>
+                <w:sz w:val="18"/>
+                <w:szCs w:val="18"/>
+              </w:rPr>
+              <w:t xml:space="preserve">R$ 19.034,49</w:t>
+            </w:r>
+          </w:p>
+        </w:tc>
+        <w:tc>
+          <w:tcPr>
+            <w:tcW w:type="dxa" w:w="2100"/>
+          </w:tcPr>
+          <w:p>
+            <w:pPr>
+              <w:jc w:val="left"/>
+            </w:pPr>
+            <w:r>
+              <w:rPr>
+                <w:rFonts w:ascii="Bookman Old Style" w:cs="Bookman Old Style" w:eastAsia="Bookman Old Style" w:hAnsi="Bookman Old Style"/>
+                <w:sz w:val="18"/>
+                <w:szCs w:val="18"/>
+              </w:rPr>
+              <w:t xml:space="preserve">sem demonstrativo</w:t>
+            </w:r>
+          </w:p>
+        </w:tc>
+      </w:tr>
+      <w:tr>
+        <w:tc>
+          <w:tcPr>
+            <w:tcW w:type="dxa" w:w="1800"/>
+          </w:tcPr>
+          <w:p>
+            <w:pPr>
+              <w:jc w:val="left"/>
+            </w:pPr>
+            <w:r>
+              <w:rPr>
+                <w:rFonts w:ascii="Bookman Old Style" w:cs="Bookman Old Style" w:eastAsia="Bookman Old Style" w:hAnsi="Bookman Old Style"/>
+                <w:sz w:val="18"/>
+                <w:szCs w:val="18"/>
+              </w:rPr>
+              <w:t xml:space="preserve">2024-06</w:t>
+            </w:r>
+          </w:p>
+        </w:tc>
+        <w:tc>
+          <w:tcPr>
+            <w:tcW w:type="dxa" w:w="2400"/>
+          </w:tcPr>
+          <w:p>
+            <w:pPr>
+              <w:jc w:val="right"/>
+            </w:pPr>
+            <w:r>
+              <w:rPr>
+                <w:rFonts w:ascii="Bookman Old Style" w:cs="Bookman Old Style" w:eastAsia="Bookman Old Style" w:hAnsi="Bookman Old Style"/>
+                <w:sz w:val="18"/>
+                <w:szCs w:val="18"/>
+              </w:rPr>
+              <w:t xml:space="preserve">R$ 189.820,35</w:t>
+            </w:r>
+          </w:p>
+        </w:tc>
+        <w:tc>
+          <w:tcPr>
+            <w:tcW w:type="dxa" w:w="2400"/>
+          </w:tcPr>
+          <w:p>
+            <w:pPr>
+              <w:jc w:val="right"/>
+            </w:pPr>
+            <w:r>
+              <w:rPr>
+                <w:rFonts w:ascii="Bookman Old Style" w:cs="Bookman Old Style" w:eastAsia="Bookman Old Style" w:hAnsi="Bookman Old Style"/>
+                <w:sz w:val="18"/>
+                <w:szCs w:val="18"/>
+              </w:rPr>
+              <w:t xml:space="preserve">R$ 18.982,03</w:t>
+            </w:r>
+          </w:p>
+        </w:tc>
+        <w:tc>
+          <w:tcPr>
+            <w:tcW w:type="dxa" w:w="2100"/>
+          </w:tcPr>
+          <w:p>
+            <w:pPr>
+              <w:jc w:val="left"/>
+            </w:pPr>
+            <w:r>
+              <w:rPr>
+                <w:rFonts w:ascii="Bookman Old Style" w:cs="Bookman Old Style" w:eastAsia="Bookman Old Style" w:hAnsi="Bookman Old Style"/>
+                <w:sz w:val="18"/>
+                <w:szCs w:val="18"/>
+              </w:rPr>
+              <w:t xml:space="preserve">sem demonstrativo</w:t>
+            </w:r>
+          </w:p>
+        </w:tc>
+      </w:tr>
+      <w:tr>
+        <w:tc>
+          <w:tcPr>
+            <w:tcW w:type="dxa" w:w="1800"/>
+          </w:tcPr>
+          <w:p>
+            <w:pPr>
+              <w:jc w:val="left"/>
+            </w:pPr>
+            <w:r>
+              <w:rPr>
+                <w:rFonts w:ascii="Bookman Old Style" w:cs="Bookman Old Style" w:eastAsia="Bookman Old Style" w:hAnsi="Bookman Old Style"/>
+                <w:sz w:val="18"/>
+                <w:szCs w:val="18"/>
+              </w:rPr>
+              <w:t xml:space="preserve">2024-07</w:t>
+            </w:r>
+          </w:p>
+        </w:tc>
+        <w:tc>
+          <w:tcPr>
+            <w:tcW w:type="dxa" w:w="2400"/>
+          </w:tcPr>
+          <w:p>
+            <w:pPr>
+              <w:jc w:val="right"/>
+            </w:pPr>
+            <w:r>
+              <w:rPr>
+                <w:rFonts w:ascii="Bookman Old Style" w:cs="Bookman Old Style" w:eastAsia="Bookman Old Style" w:hAnsi="Bookman Old Style"/>
+                <w:sz w:val="18"/>
+                <w:szCs w:val="18"/>
+              </w:rPr>
+              <w:t xml:space="preserve">R$ 195.105,42</w:t>
+            </w:r>
+          </w:p>
+        </w:tc>
+        <w:tc>
+          <w:tcPr>
+            <w:tcW w:type="dxa" w:w="2400"/>
+          </w:tcPr>
+          <w:p>
+            <w:pPr>
+              <w:jc w:val="right"/>
+            </w:pPr>
+            <w:r>
+              <w:rPr>
+                <w:rFonts w:ascii="Bookman Old Style" w:cs="Bookman Old Style" w:eastAsia="Bookman Old Style" w:hAnsi="Bookman Old Style"/>
+                <w:sz w:val="18"/>
+                <w:szCs w:val="18"/>
+              </w:rPr>
+              <w:t xml:space="preserve">R$ 19.510,54</w:t>
+            </w:r>
+          </w:p>
+        </w:tc>
+        <w:tc>
+          <w:tcPr>
+            <w:tcW w:type="dxa" w:w="2100"/>
+          </w:tcPr>
+          <w:p>
+            <w:pPr>
+              <w:jc w:val="left"/>
+            </w:pPr>
+            <w:r>
+              <w:rPr>
+                <w:rFonts w:ascii="Bookman Old Style" w:cs="Bookman Old Style" w:eastAsia="Bookman Old Style" w:hAnsi="Bookman Old Style"/>
+                <w:sz w:val="18"/>
+                <w:szCs w:val="18"/>
+              </w:rPr>
+              <w:t xml:space="preserve">sem demonstrativo</w:t>
+            </w:r>
+          </w:p>
+        </w:tc>
+      </w:tr>
+      <w:tr>
+        <w:tc>
+          <w:tcPr>
+            <w:tcW w:type="dxa" w:w="1800"/>
+          </w:tcPr>
+          <w:p>
+            <w:pPr>
+              <w:jc w:val="left"/>
+            </w:pPr>
+            <w:r>
+              <w:rPr>
+                <w:rFonts w:ascii="Bookman Old Style" w:cs="Bookman Old Style" w:eastAsia="Bookman Old Style" w:hAnsi="Bookman Old Style"/>
+                <w:sz w:val="18"/>
+                <w:szCs w:val="18"/>
+              </w:rPr>
+              <w:t xml:space="preserve">2024-08</w:t>
+            </w:r>
+          </w:p>
+        </w:tc>
+        <w:tc>
+          <w:tcPr>
+            <w:tcW w:type="dxa" w:w="2400"/>
+          </w:tcPr>
+          <w:p>
+            <w:pPr>
+              <w:jc w:val="right"/>
+            </w:pPr>
+            <w:r>
+              <w:rPr>
+                <w:rFonts w:ascii="Bookman Old Style" w:cs="Bookman Old Style" w:eastAsia="Bookman Old Style" w:hAnsi="Bookman Old Style"/>
+                <w:sz w:val="18"/>
+                <w:szCs w:val="18"/>
+              </w:rPr>
+              <w:t xml:space="preserve">R$ 263.063,08</w:t>
+            </w:r>
+          </w:p>
+        </w:tc>
+        <w:tc>
+          <w:tcPr>
+            <w:tcW w:type="dxa" w:w="2400"/>
+          </w:tcPr>
+          <w:p>
+            <w:pPr>
+              <w:jc w:val="right"/>
+            </w:pPr>
+            <w:r>
+              <w:rPr>
+                <w:rFonts w:ascii="Bookman Old Style" w:cs="Bookman Old Style" w:eastAsia="Bookman Old Style" w:hAnsi="Bookman Old Style"/>
+                <w:sz w:val="18"/>
+                <w:szCs w:val="18"/>
+              </w:rPr>
+              <w:t xml:space="preserve">R$ 26.306,31</w:t>
+            </w:r>
+          </w:p>
+        </w:tc>
+        <w:tc>
+          <w:tcPr>
+            <w:tcW w:type="dxa" w:w="2100"/>
+          </w:tcPr>
+          <w:p>
+            <w:pPr>
+              <w:jc w:val="left"/>
+            </w:pPr>
+            <w:r>
+              <w:rPr>
+                <w:rFonts w:ascii="Bookman Old Style" w:cs="Bookman Old Style" w:eastAsia="Bookman Old Style" w:hAnsi="Bookman Old Style"/>
+                <w:sz w:val="18"/>
+                <w:szCs w:val="18"/>
+              </w:rPr>
+              <w:t xml:space="preserve">sem demonstrativo</w:t>
+            </w:r>
+          </w:p>
+        </w:tc>
+      </w:tr>
+      <w:tr>
+        <w:tc>
+          <w:tcPr>
+            <w:tcW w:type="dxa" w:w="1800"/>
+          </w:tcPr>
+          <w:p>
+            <w:pPr>
+              <w:jc w:val="left"/>
+            </w:pPr>
+            <w:r>
+              <w:rPr>
+                <w:rFonts w:ascii="Bookman Old Style" w:cs="Bookman Old Style" w:eastAsia="Bookman Old Style" w:hAnsi="Bookman Old Style"/>
+                <w:sz w:val="18"/>
+                <w:szCs w:val="18"/>
+              </w:rPr>
+              <w:t xml:space="preserve">2024-09</w:t>
+            </w:r>
+          </w:p>
+        </w:tc>
+        <w:tc>
+          <w:tcPr>
+            <w:tcW w:type="dxa" w:w="2400"/>
+          </w:tcPr>
+          <w:p>
+            <w:pPr>
+              <w:jc w:val="right"/>
+            </w:pPr>
+            <w:r>
+              <w:rPr>
+                <w:rFonts w:ascii="Bookman Old Style" w:cs="Bookman Old Style" w:eastAsia="Bookman Old Style" w:hAnsi="Bookman Old Style"/>
+                <w:sz w:val="18"/>
+                <w:szCs w:val="18"/>
+              </w:rPr>
+              <w:t xml:space="preserve">R$ 261.677,60</w:t>
+            </w:r>
+          </w:p>
+        </w:tc>
+        <w:tc>
+          <w:tcPr>
+            <w:tcW w:type="dxa" w:w="2400"/>
+          </w:tcPr>
+          <w:p>
+            <w:pPr>
+              <w:jc w:val="right"/>
+            </w:pPr>
+            <w:r>
+              <w:rPr>
+                <w:rFonts w:ascii="Bookman Old Style" w:cs="Bookman Old Style" w:eastAsia="Bookman Old Style" w:hAnsi="Bookman Old Style"/>
+                <w:sz w:val="18"/>
+                <w:szCs w:val="18"/>
+              </w:rPr>
+              <w:t xml:space="preserve">R$ 26.167,76</w:t>
+            </w:r>
+          </w:p>
+        </w:tc>
+        <w:tc>
+          <w:tcPr>
+            <w:tcW w:type="dxa" w:w="2100"/>
+          </w:tcPr>
+          <w:p>
+            <w:pPr>
+              <w:jc w:val="left"/>
+            </w:pPr>
+            <w:r>
+              <w:rPr>
+                <w:rFonts w:ascii="Bookman Old Style" w:cs="Bookman Old Style" w:eastAsia="Bookman Old Style" w:hAnsi="Bookman Old Style"/>
+                <w:sz w:val="18"/>
+                <w:szCs w:val="18"/>
+              </w:rPr>
+              <w:t xml:space="preserve">sem demonstrativo</w:t>
+            </w:r>
+          </w:p>
+        </w:tc>
+      </w:tr>
+      <w:tr>
+        <w:tc>
+          <w:tcPr>
+            <w:tcW w:type="dxa" w:w="1800"/>
+          </w:tcPr>
+          <w:p>
+            <w:pPr>
+              <w:jc w:val="left"/>
+            </w:pPr>
+            <w:r>
+              <w:rPr>
+                <w:rFonts w:ascii="Bookman Old Style" w:cs="Bookman Old Style" w:eastAsia="Bookman Old Style" w:hAnsi="Bookman Old Style"/>
+                <w:sz w:val="18"/>
+                <w:szCs w:val="18"/>
+              </w:rPr>
+              <w:t xml:space="preserve">2024-10</w:t>
+            </w:r>
+          </w:p>
+        </w:tc>
+        <w:tc>
+          <w:tcPr>
+            <w:tcW w:type="dxa" w:w="2400"/>
+          </w:tcPr>
+          <w:p>
+            <w:pPr>
+              <w:jc w:val="right"/>
+            </w:pPr>
+            <w:r>
+              <w:rPr>
+                <w:rFonts w:ascii="Bookman Old Style" w:cs="Bookman Old Style" w:eastAsia="Bookman Old Style" w:hAnsi="Bookman Old Style"/>
+                <w:sz w:val="18"/>
+                <w:szCs w:val="18"/>
+              </w:rPr>
+              <w:t xml:space="preserve">R$ 255.124,87</w:t>
+            </w:r>
+          </w:p>
+        </w:tc>
+        <w:tc>
+          <w:tcPr>
+            <w:tcW w:type="dxa" w:w="2400"/>
+          </w:tcPr>
+          <w:p>
+            <w:pPr>
+              <w:jc w:val="right"/>
+            </w:pPr>
+            <w:r>
+              <w:rPr>
+                <w:rFonts w:ascii="Bookman Old Style" w:cs="Bookman Old Style" w:eastAsia="Bookman Old Style" w:hAnsi="Bookman Old Style"/>
+                <w:sz w:val="18"/>
+                <w:szCs w:val="18"/>
+              </w:rPr>
+              <w:t xml:space="preserve">R$ 25.512,49</w:t>
+            </w:r>
+          </w:p>
+        </w:tc>
+        <w:tc>
+          <w:tcPr>
+            <w:tcW w:type="dxa" w:w="2100"/>
+          </w:tcPr>
+          <w:p>
+            <w:pPr>
+              <w:jc w:val="left"/>
+            </w:pPr>
+            <w:r>
+              <w:rPr>
+                <w:rFonts w:ascii="Bookman Old Style" w:cs="Bookman Old Style" w:eastAsia="Bookman Old Style" w:hAnsi="Bookman Old Style"/>
+                <w:sz w:val="18"/>
+                <w:szCs w:val="18"/>
+              </w:rPr>
+              <w:t xml:space="preserve">sem demonstrativo</w:t>
+            </w:r>
+          </w:p>
+        </w:tc>
+      </w:tr>
+      <w:tr>
+        <w:tc>
+          <w:tcPr>
+            <w:tcW w:type="dxa" w:w="1800"/>
+          </w:tcPr>
+          <w:p>
+            <w:pPr>
+              <w:jc w:val="left"/>
+            </w:pPr>
+            <w:r>
+              <w:rPr>
+                <w:rFonts w:ascii="Bookman Old Style" w:cs="Bookman Old Style" w:eastAsia="Bookman Old Style" w:hAnsi="Bookman Old Style"/>
+                <w:sz w:val="18"/>
+                <w:szCs w:val="18"/>
+              </w:rPr>
+              <w:t xml:space="preserve">2024-11</w:t>
+            </w:r>
+          </w:p>
+        </w:tc>
+        <w:tc>
+          <w:tcPr>
+            <w:tcW w:type="dxa" w:w="2400"/>
+          </w:tcPr>
+          <w:p>
+            <w:pPr>
+              <w:jc w:val="right"/>
+            </w:pPr>
+            <w:r>
+              <w:rPr>
+                <w:rFonts w:ascii="Bookman Old Style" w:cs="Bookman Old Style" w:eastAsia="Bookman Old Style" w:hAnsi="Bookman Old Style"/>
+                <w:sz w:val="18"/>
+                <w:szCs w:val="18"/>
+              </w:rPr>
+              <w:t xml:space="preserve">R$ 259.376,45</w:t>
+            </w:r>
+          </w:p>
+        </w:tc>
+        <w:tc>
+          <w:tcPr>
+            <w:tcW w:type="dxa" w:w="2400"/>
+          </w:tcPr>
+          <w:p>
+            <w:pPr>
+              <w:jc w:val="right"/>
+            </w:pPr>
+            <w:r>
+              <w:rPr>
+                <w:rFonts w:ascii="Bookman Old Style" w:cs="Bookman Old Style" w:eastAsia="Bookman Old Style" w:hAnsi="Bookman Old Style"/>
+                <w:sz w:val="18"/>
+                <w:szCs w:val="18"/>
+              </w:rPr>
+              <w:t xml:space="preserve">R$ 25.937,65</w:t>
+            </w:r>
+          </w:p>
+        </w:tc>
+        <w:tc>
+          <w:tcPr>
+            <w:tcW w:type="dxa" w:w="2100"/>
+          </w:tcPr>
+          <w:p>
+            <w:pPr>
+              <w:jc w:val="left"/>
+            </w:pPr>
+            <w:r>
+              <w:rPr>
+                <w:rFonts w:ascii="Bookman Old Style" w:cs="Bookman Old Style" w:eastAsia="Bookman Old Style" w:hAnsi="Bookman Old Style"/>
+                <w:sz w:val="18"/>
+                <w:szCs w:val="18"/>
+              </w:rPr>
+              <w:t xml:space="preserve">sem demonstrativo</w:t>
+            </w:r>
+          </w:p>
+        </w:tc>
+      </w:tr>
+      <w:tr>
+        <w:tc>
+          <w:tcPr>
+            <w:tcW w:type="dxa" w:w="1800"/>
+          </w:tcPr>
+          <w:p>
+            <w:pPr>
+              <w:jc w:val="left"/>
+            </w:pPr>
+            <w:r>
+              <w:rPr>
+                <w:rFonts w:ascii="Bookman Old Style" w:cs="Bookman Old Style" w:eastAsia="Bookman Old Style" w:hAnsi="Bookman Old Style"/>
+                <w:sz w:val="18"/>
+                <w:szCs w:val="18"/>
+              </w:rPr>
+              <w:t xml:space="preserve">2024-12</w:t>
+            </w:r>
+          </w:p>
+        </w:tc>
+        <w:tc>
+          <w:tcPr>
+            <w:tcW w:type="dxa" w:w="2400"/>
+          </w:tcPr>
+          <w:p>
+            <w:pPr>
+              <w:jc w:val="right"/>
+            </w:pPr>
+            <w:r>
+              <w:rPr>
+                <w:rFonts w:ascii="Bookman Old Style" w:cs="Bookman Old Style" w:eastAsia="Bookman Old Style" w:hAnsi="Bookman Old Style"/>
+                <w:sz w:val="18"/>
+                <w:szCs w:val="18"/>
+              </w:rPr>
+              <w:t xml:space="preserve">R$ 196.178,42</w:t>
+            </w:r>
+          </w:p>
+        </w:tc>
+        <w:tc>
+          <w:tcPr>
+            <w:tcW w:type="dxa" w:w="2400"/>
+          </w:tcPr>
+          <w:p>
+            <w:pPr>
+              <w:jc w:val="right"/>
+            </w:pPr>
+            <w:r>
+              <w:rPr>
+                <w:rFonts w:ascii="Bookman Old Style" w:cs="Bookman Old Style" w:eastAsia="Bookman Old Style" w:hAnsi="Bookman Old Style"/>
+                <w:sz w:val="18"/>
+                <w:szCs w:val="18"/>
+              </w:rPr>
+              <w:t xml:space="preserve">R$ 19.617,84</w:t>
+            </w:r>
+          </w:p>
+        </w:tc>
+        <w:tc>
+          <w:tcPr>
+            <w:tcW w:type="dxa" w:w="2100"/>
+          </w:tcPr>
+          <w:p>
+            <w:pPr>
+              <w:jc w:val="left"/>
+            </w:pPr>
+            <w:r>
+              <w:rPr>
+                <w:rFonts w:ascii="Bookman Old Style" w:cs="Bookman Old Style" w:eastAsia="Bookman Old Style" w:hAnsi="Bookman Old Style"/>
+                <w:sz w:val="18"/>
+                <w:szCs w:val="18"/>
+              </w:rPr>
+              <w:t xml:space="preserve">sem demonstrativo</w:t>
+            </w:r>
+          </w:p>
+        </w:tc>
+      </w:tr>
+      <w:tr>
+        <w:tc>
+          <w:tcPr>
+            <w:tcW w:type="dxa" w:w="1800"/>
+          </w:tcPr>
+          <w:p>
+            <w:pPr>
+              <w:jc w:val="left"/>
+            </w:pPr>
+            <w:r>
+              <w:rPr>
+                <w:rFonts w:ascii="Bookman Old Style" w:cs="Bookman Old Style" w:eastAsia="Bookman Old Style" w:hAnsi="Bookman Old Style"/>
+                <w:sz w:val="18"/>
+                <w:szCs w:val="18"/>
+              </w:rPr>
+              <w:t xml:space="preserve">2025-01</w:t>
+            </w:r>
+          </w:p>
+        </w:tc>
+        <w:tc>
+          <w:tcPr>
+            <w:tcW w:type="dxa" w:w="2400"/>
+          </w:tcPr>
+          <w:p>
+            <w:pPr>
+              <w:jc w:val="right"/>
+            </w:pPr>
+            <w:r>
+              <w:rPr>
+                <w:rFonts w:ascii="Bookman Old Style" w:cs="Bookman Old Style" w:eastAsia="Bookman Old Style" w:hAnsi="Bookman Old Style"/>
+                <w:sz w:val="18"/>
+                <w:szCs w:val="18"/>
+              </w:rPr>
+              <w:t xml:space="preserve">R$ 192.787,10</w:t>
+            </w:r>
+          </w:p>
+        </w:tc>
+        <w:tc>
+          <w:tcPr>
+            <w:tcW w:type="dxa" w:w="2400"/>
+          </w:tcPr>
+          <w:p>
+            <w:pPr>
+              <w:jc w:val="right"/>
+            </w:pPr>
+            <w:r>
+              <w:rPr>
+                <w:rFonts w:ascii="Bookman Old Style" w:cs="Bookman Old Style" w:eastAsia="Bookman Old Style" w:hAnsi="Bookman Old Style"/>
+                <w:sz w:val="18"/>
+                <w:szCs w:val="18"/>
+              </w:rPr>
+              <w:t xml:space="preserve">R$ 19.278,71</w:t>
+            </w:r>
+          </w:p>
+        </w:tc>
+        <w:tc>
+          <w:tcPr>
+            <w:tcW w:type="dxa" w:w="2100"/>
+          </w:tcPr>
+          <w:p>
+            <w:pPr>
+              <w:jc w:val="left"/>
+            </w:pPr>
+            <w:r>
+              <w:rPr>
+                <w:rFonts w:ascii="Bookman Old Style" w:cs="Bookman Old Style" w:eastAsia="Bookman Old Style" w:hAnsi="Bookman Old Style"/>
+                <w:sz w:val="18"/>
+                <w:szCs w:val="18"/>
+              </w:rPr>
+              <w:t xml:space="preserve">sem demonstrativo</w:t>
+            </w:r>
+          </w:p>
+        </w:tc>
+      </w:tr>
+      <w:tr>
+        <w:tc>
+          <w:tcPr>
+            <w:tcW w:type="dxa" w:w="1800"/>
+          </w:tcPr>
+          <w:p>
+            <w:pPr>
+              <w:jc w:val="left"/>
+            </w:pPr>
+            <w:r>
+              <w:rPr>
+                <w:rFonts w:ascii="Bookman Old Style" w:cs="Bookman Old Style" w:eastAsia="Bookman Old Style" w:hAnsi="Bookman Old Style"/>
+                <w:sz w:val="18"/>
+                <w:szCs w:val="18"/>
+              </w:rPr>
+              <w:t xml:space="preserve">2025-02</w:t>
+            </w:r>
+          </w:p>
+        </w:tc>
+        <w:tc>
+          <w:tcPr>
+            <w:tcW w:type="dxa" w:w="2400"/>
+          </w:tcPr>
+          <w:p>
+            <w:pPr>
+              <w:jc w:val="right"/>
+            </w:pPr>
+            <w:r>
+              <w:rPr>
+                <w:rFonts w:ascii="Bookman Old Style" w:cs="Bookman Old Style" w:eastAsia="Bookman Old Style" w:hAnsi="Bookman Old Style"/>
+                <w:sz w:val="18"/>
+                <w:szCs w:val="18"/>
+              </w:rPr>
+              <w:t xml:space="preserve">R$ 145.670,03</w:t>
+            </w:r>
+          </w:p>
+        </w:tc>
+        <w:tc>
+          <w:tcPr>
+            <w:tcW w:type="dxa" w:w="2400"/>
+          </w:tcPr>
+          <w:p>
+            <w:pPr>
+              <w:jc w:val="right"/>
+            </w:pPr>
+            <w:r>
+              <w:rPr>
+                <w:rFonts w:ascii="Bookman Old Style" w:cs="Bookman Old Style" w:eastAsia="Bookman Old Style" w:hAnsi="Bookman Old Style"/>
+                <w:sz w:val="18"/>
+                <w:szCs w:val="18"/>
+              </w:rPr>
+              <w:t xml:space="preserve">R$ 14.567,00</w:t>
+            </w:r>
+          </w:p>
+        </w:tc>
+        <w:tc>
+          <w:tcPr>
+            <w:tcW w:type="dxa" w:w="2100"/>
+          </w:tcPr>
+          <w:p>
+            <w:pPr>
+              <w:jc w:val="left"/>
+            </w:pPr>
+            <w:r>
+              <w:rPr>
+                <w:rFonts w:ascii="Bookman Old Style" w:cs="Bookman Old Style" w:eastAsia="Bookman Old Style" w:hAnsi="Bookman Old Style"/>
+                <w:sz w:val="18"/>
+                <w:szCs w:val="18"/>
+              </w:rPr>
+              <w:t xml:space="preserve">sem demonstrativo</w:t>
+            </w:r>
+          </w:p>
+        </w:tc>
+      </w:tr>
+      <w:tr>
+        <w:tc>
+          <w:tcPr>
+            <w:tcW w:type="dxa" w:w="1800"/>
+          </w:tcPr>
+          <w:p>
+            <w:pPr>
+              <w:jc w:val="left"/>
+            </w:pPr>
+            <w:r>
+              <w:rPr>
+                <w:rFonts w:ascii="Bookman Old Style" w:cs="Bookman Old Style" w:eastAsia="Bookman Old Style" w:hAnsi="Bookman Old Style"/>
+                <w:sz w:val="18"/>
+                <w:szCs w:val="18"/>
+              </w:rPr>
+              <w:t xml:space="preserve">2025-03</w:t>
+            </w:r>
+          </w:p>
+        </w:tc>
+        <w:tc>
+          <w:tcPr>
+            <w:tcW w:type="dxa" w:w="2400"/>
+          </w:tcPr>
+          <w:p>
+            <w:pPr>
+              <w:jc w:val="right"/>
+            </w:pPr>
+            <w:r>
+              <w:rPr>
+                <w:rFonts w:ascii="Bookman Old Style" w:cs="Bookman Old Style" w:eastAsia="Bookman Old Style" w:hAnsi="Bookman Old Style"/>
+                <w:sz w:val="18"/>
+                <w:szCs w:val="18"/>
+              </w:rPr>
+              <w:t xml:space="preserve">R$ 143.818,02</w:t>
+            </w:r>
+          </w:p>
+        </w:tc>
+        <w:tc>
+          <w:tcPr>
+            <w:tcW w:type="dxa" w:w="2400"/>
+          </w:tcPr>
+          <w:p>
+            <w:pPr>
+              <w:jc w:val="right"/>
+            </w:pPr>
+            <w:r>
+              <w:rPr>
+                <w:rFonts w:ascii="Bookman Old Style" w:cs="Bookman Old Style" w:eastAsia="Bookman Old Style" w:hAnsi="Bookman Old Style"/>
+                <w:sz w:val="18"/>
+                <w:szCs w:val="18"/>
+              </w:rPr>
+              <w:t xml:space="preserve">R$ 14.381,80</w:t>
+            </w:r>
+          </w:p>
+        </w:tc>
+        <w:tc>
+          <w:tcPr>
+            <w:tcW w:type="dxa" w:w="2100"/>
+          </w:tcPr>
+          <w:p>
+            <w:pPr>
+              <w:jc w:val="left"/>
+            </w:pPr>
+            <w:r>
+              <w:rPr>
+                <w:rFonts w:ascii="Bookman Old Style" w:cs="Bookman Old Style" w:eastAsia="Bookman Old Style" w:hAnsi="Bookman Old Style"/>
+                <w:sz w:val="18"/>
+                <w:szCs w:val="18"/>
+              </w:rPr>
+              <w:t xml:space="preserve">sem demonstrativo</w:t>
+            </w:r>
+          </w:p>
+        </w:tc>
+      </w:tr>
+      <w:tr>
+        <w:tc>
+          <w:tcPr>
+            <w:tcW w:type="dxa" w:w="1800"/>
+          </w:tcPr>
+          <w:p>
+            <w:pPr>
+              <w:jc w:val="left"/>
+            </w:pPr>
+            <w:r>
+              <w:rPr>
+                <w:rFonts w:ascii="Bookman Old Style" w:cs="Bookman Old Style" w:eastAsia="Bookman Old Style" w:hAnsi="Bookman Old Style"/>
+                <w:sz w:val="18"/>
+                <w:szCs w:val="18"/>
+              </w:rPr>
+              <w:t xml:space="preserve">2025-04</w:t>
+            </w:r>
+          </w:p>
+        </w:tc>
+        <w:tc>
+          <w:tcPr>
+            <w:tcW w:type="dxa" w:w="2400"/>
+          </w:tcPr>
+          <w:p>
+            <w:pPr>
+              <w:jc w:val="right"/>
+            </w:pPr>
+            <w:r>
+              <w:rPr>
+                <w:rFonts w:ascii="Bookman Old Style" w:cs="Bookman Old Style" w:eastAsia="Bookman Old Style" w:hAnsi="Bookman Old Style"/>
+                <w:sz w:val="18"/>
+                <w:szCs w:val="18"/>
+              </w:rPr>
+              <w:t xml:space="preserve">R$ 145.126,26</w:t>
+            </w:r>
+          </w:p>
+        </w:tc>
+        <w:tc>
+          <w:tcPr>
+            <w:tcW w:type="dxa" w:w="2400"/>
+          </w:tcPr>
+          <w:p>
+            <w:pPr>
+              <w:jc w:val="right"/>
+            </w:pPr>
+            <w:r>
+              <w:rPr>
+                <w:rFonts w:ascii="Bookman Old Style" w:cs="Bookman Old Style" w:eastAsia="Bookman Old Style" w:hAnsi="Bookman Old Style"/>
+                <w:sz w:val="18"/>
+                <w:szCs w:val="18"/>
+              </w:rPr>
+              <w:t xml:space="preserve">R$ 14.512,63</w:t>
+            </w:r>
+          </w:p>
+        </w:tc>
+        <w:tc>
+          <w:tcPr>
+            <w:tcW w:type="dxa" w:w="2100"/>
+          </w:tcPr>
+          <w:p>
+            <w:pPr>
+              <w:jc w:val="left"/>
+            </w:pPr>
+            <w:r>
+              <w:rPr>
+                <w:rFonts w:ascii="Bookman Old Style" w:cs="Bookman Old Style" w:eastAsia="Bookman Old Style" w:hAnsi="Bookman Old Style"/>
+                <w:sz w:val="18"/>
+                <w:szCs w:val="18"/>
+              </w:rPr>
+              <w:t xml:space="preserve">sem demonstrativo</w:t>
+            </w:r>
+          </w:p>
+        </w:tc>
+      </w:tr>
+      <w:tr>
+        <w:tc>
+          <w:tcPr>
+            <w:tcW w:type="dxa" w:w="1800"/>
+          </w:tcPr>
+          <w:p>
+            <w:pPr>
+              <w:jc w:val="left"/>
+            </w:pPr>
+            <w:r>
+              <w:rPr>
+                <w:rFonts w:ascii="Bookman Old Style" w:cs="Bookman Old Style" w:eastAsia="Bookman Old Style" w:hAnsi="Bookman Old Style"/>
+                <w:sz w:val="18"/>
+                <w:szCs w:val="18"/>
+              </w:rPr>
+              <w:t xml:space="preserve">2025-05</w:t>
+            </w:r>
+          </w:p>
+        </w:tc>
+        <w:tc>
+          <w:tcPr>
+            <w:tcW w:type="dxa" w:w="2400"/>
+          </w:tcPr>
+          <w:p>
+            <w:pPr>
+              <w:jc w:val="right"/>
+            </w:pPr>
+            <w:r>
+              <w:rPr>
+                <w:rFonts w:ascii="Bookman Old Style" w:cs="Bookman Old Style" w:eastAsia="Bookman Old Style" w:hAnsi="Bookman Old Style"/>
+                <w:sz w:val="18"/>
+                <w:szCs w:val="18"/>
+              </w:rPr>
+              <w:t xml:space="preserve">R$ 140.639,74</w:t>
+            </w:r>
+          </w:p>
+        </w:tc>
+        <w:tc>
+          <w:tcPr>
+            <w:tcW w:type="dxa" w:w="2400"/>
+          </w:tcPr>
+          <w:p>
+            <w:pPr>
+              <w:jc w:val="right"/>
+            </w:pPr>
+            <w:r>
+              <w:rPr>
+                <w:rFonts w:ascii="Bookman Old Style" w:cs="Bookman Old Style" w:eastAsia="Bookman Old Style" w:hAnsi="Bookman Old Style"/>
+                <w:sz w:val="18"/>
+                <w:szCs w:val="18"/>
+              </w:rPr>
+              <w:t xml:space="preserve">R$ 14.063,97</w:t>
+            </w:r>
+          </w:p>
+        </w:tc>
+        <w:tc>
+          <w:tcPr>
+            <w:tcW w:type="dxa" w:w="2100"/>
+          </w:tcPr>
+          <w:p>
+            <w:pPr>
+              <w:jc w:val="left"/>
+            </w:pPr>
+            <w:r>
+              <w:rPr>
+                <w:rFonts w:ascii="Bookman Old Style" w:cs="Bookman Old Style" w:eastAsia="Bookman Old Style" w:hAnsi="Bookman Old Style"/>
+                <w:sz w:val="18"/>
+                <w:szCs w:val="18"/>
+              </w:rPr>
+              <w:t xml:space="preserve">sem demonstrativo</w:t>
+            </w:r>
+          </w:p>
+        </w:tc>
+      </w:tr>
+      <w:tr>
+        <w:tc>
+          <w:tcPr>
+            <w:tcW w:type="dxa" w:w="1800"/>
+          </w:tcPr>
+          <w:p>
+            <w:pPr>
+              <w:jc w:val="left"/>
+            </w:pPr>
+            <w:r>
+              <w:rPr>
+                <w:rFonts w:ascii="Bookman Old Style" w:cs="Bookman Old Style" w:eastAsia="Bookman Old Style" w:hAnsi="Bookman Old Style"/>
+                <w:sz w:val="18"/>
+                <w:szCs w:val="18"/>
+              </w:rPr>
+              <w:t xml:space="preserve">2025-06</w:t>
+            </w:r>
+          </w:p>
+        </w:tc>
+        <w:tc>
+          <w:tcPr>
+            <w:tcW w:type="dxa" w:w="2400"/>
+          </w:tcPr>
+          <w:p>
+            <w:pPr>
+              <w:jc w:val="right"/>
+            </w:pPr>
+            <w:r>
+              <w:rPr>
+                <w:rFonts w:ascii="Bookman Old Style" w:cs="Bookman Old Style" w:eastAsia="Bookman Old Style" w:hAnsi="Bookman Old Style"/>
+                <w:sz w:val="18"/>
+                <w:szCs w:val="18"/>
+              </w:rPr>
+              <w:t xml:space="preserve">R$ 136.716,53</w:t>
+            </w:r>
+          </w:p>
+        </w:tc>
+        <w:tc>
+          <w:tcPr>
+            <w:tcW w:type="dxa" w:w="2400"/>
+          </w:tcPr>
+          <w:p>
+            <w:pPr>
+              <w:jc w:val="right"/>
+            </w:pPr>
+            <w:r>
+              <w:rPr>
+                <w:rFonts w:ascii="Bookman Old Style" w:cs="Bookman Old Style" w:eastAsia="Bookman Old Style" w:hAnsi="Bookman Old Style"/>
+                <w:sz w:val="18"/>
+                <w:szCs w:val="18"/>
+              </w:rPr>
+              <w:t xml:space="preserve">R$ 13.671,65</w:t>
+            </w:r>
+          </w:p>
+        </w:tc>
+        <w:tc>
+          <w:tcPr>
+            <w:tcW w:type="dxa" w:w="2100"/>
+          </w:tcPr>
+          <w:p>
+            <w:pPr>
+              <w:jc w:val="left"/>
+            </w:pPr>
+            <w:r>
+              <w:rPr>
+                <w:rFonts w:ascii="Bookman Old Style" w:cs="Bookman Old Style" w:eastAsia="Bookman Old Style" w:hAnsi="Bookman Old Style"/>
+                <w:sz w:val="18"/>
+                <w:szCs w:val="18"/>
+              </w:rPr>
+              <w:t xml:space="preserve">sem demonstrativo</w:t>
+            </w:r>
+          </w:p>
+        </w:tc>
+      </w:tr>
+      <w:tr>
+        <w:tc>
+          <w:tcPr>
+            <w:tcW w:type="dxa" w:w="1800"/>
+          </w:tcPr>
+          <w:p>
+            <w:pPr>
+              <w:jc w:val="left"/>
+            </w:pPr>
+            <w:r>
+              <w:rPr>
+                <w:rFonts w:ascii="Bookman Old Style" w:cs="Bookman Old Style" w:eastAsia="Bookman Old Style" w:hAnsi="Bookman Old Style"/>
+                <w:sz w:val="18"/>
+                <w:szCs w:val="18"/>
+              </w:rPr>
+              <w:t xml:space="preserve">2025-07</w:t>
+            </w:r>
+          </w:p>
+        </w:tc>
+        <w:tc>
+          <w:tcPr>
+            <w:tcW w:type="dxa" w:w="2400"/>
+          </w:tcPr>
+          <w:p>
+            <w:pPr>
+              <w:jc w:val="right"/>
+            </w:pPr>
+            <w:r>
+              <w:rPr>
+                <w:rFonts w:ascii="Bookman Old Style" w:cs="Bookman Old Style" w:eastAsia="Bookman Old Style" w:hAnsi="Bookman Old Style"/>
+                <w:sz w:val="18"/>
+                <w:szCs w:val="18"/>
+              </w:rPr>
+              <w:t xml:space="preserve">R$ 149.163,45</w:t>
+            </w:r>
+          </w:p>
+        </w:tc>
+        <w:tc>
+          <w:tcPr>
+            <w:tcW w:type="dxa" w:w="2400"/>
+          </w:tcPr>
+          <w:p>
+            <w:pPr>
+              <w:jc w:val="right"/>
+            </w:pPr>
+            <w:r>
+              <w:rPr>
+                <w:rFonts w:ascii="Bookman Old Style" w:cs="Bookman Old Style" w:eastAsia="Bookman Old Style" w:hAnsi="Bookman Old Style"/>
+                <w:sz w:val="18"/>
+                <w:szCs w:val="18"/>
+              </w:rPr>
+              <w:t xml:space="preserve">R$ 14.916,35</w:t>
+            </w:r>
+          </w:p>
+        </w:tc>
+        <w:tc>
+          <w:tcPr>
+            <w:tcW w:type="dxa" w:w="2100"/>
+          </w:tcPr>
+          <w:p>
+            <w:pPr>
+              <w:jc w:val="left"/>
+            </w:pPr>
+            <w:r>
+              <w:rPr>
+                <w:rFonts w:ascii="Bookman Old Style" w:cs="Bookman Old Style" w:eastAsia="Bookman Old Style" w:hAnsi="Bookman Old Style"/>
+                <w:sz w:val="18"/>
+                <w:szCs w:val="18"/>
+              </w:rPr>
+              <w:t xml:space="preserve">sem demonstrativo</w:t>
+            </w:r>
+          </w:p>
+        </w:tc>
+      </w:tr>
+      <w:tr>
+        <w:tc>
+          <w:tcPr>
+            <w:tcW w:type="dxa" w:w="1800"/>
+          </w:tcPr>
+          <w:p>
+            <w:pPr>
+              <w:jc w:val="left"/>
+            </w:pPr>
+            <w:r>
+              <w:rPr>
+                <w:rFonts w:ascii="Bookman Old Style" w:cs="Bookman Old Style" w:eastAsia="Bookman Old Style" w:hAnsi="Bookman Old Style"/>
+                <w:sz w:val="18"/>
+                <w:szCs w:val="18"/>
+              </w:rPr>
+              <w:t xml:space="preserve">2025-08</w:t>
+            </w:r>
+          </w:p>
+        </w:tc>
+        <w:tc>
+          <w:tcPr>
+            <w:tcW w:type="dxa" w:w="2400"/>
+          </w:tcPr>
+          <w:p>
+            <w:pPr>
+              <w:jc w:val="right"/>
+            </w:pPr>
+            <w:r>
+              <w:rPr>
+                <w:rFonts w:ascii="Bookman Old Style" w:cs="Bookman Old Style" w:eastAsia="Bookman Old Style" w:hAnsi="Bookman Old Style"/>
+                <w:sz w:val="18"/>
+                <w:szCs w:val="18"/>
+              </w:rPr>
+              <w:t xml:space="preserve">R$ 155.113,88</w:t>
+            </w:r>
+          </w:p>
+        </w:tc>
+        <w:tc>
+          <w:tcPr>
+            <w:tcW w:type="dxa" w:w="2400"/>
+          </w:tcPr>
+          <w:p>
+            <w:pPr>
+              <w:jc w:val="right"/>
+            </w:pPr>
+            <w:r>
+              <w:rPr>
+                <w:rFonts w:ascii="Bookman Old Style" w:cs="Bookman Old Style" w:eastAsia="Bookman Old Style" w:hAnsi="Bookman Old Style"/>
+                <w:sz w:val="18"/>
+                <w:szCs w:val="18"/>
+              </w:rPr>
+              <w:t xml:space="preserve">R$ 15.511,39</w:t>
+            </w:r>
+          </w:p>
+        </w:tc>
+        <w:tc>
+          <w:tcPr>
+            <w:tcW w:type="dxa" w:w="2100"/>
+          </w:tcPr>
+          <w:p>
+            <w:pPr>
+              <w:jc w:val="left"/>
+            </w:pPr>
+            <w:r>
+              <w:rPr>
+                <w:rFonts w:ascii="Bookman Old Style" w:cs="Bookman Old Style" w:eastAsia="Bookman Old Style" w:hAnsi="Bookman Old Style"/>
+                <w:sz w:val="18"/>
+                <w:szCs w:val="18"/>
+              </w:rPr>
+              <w:t xml:space="preserve">sem demonstrativo</w:t>
+            </w:r>
+          </w:p>
+        </w:tc>
+      </w:tr>
+      <w:tr>
+        <w:tc>
+          <w:tcPr>
+            <w:tcW w:type="dxa" w:w="1800"/>
+          </w:tcPr>
+          <w:p>
+            <w:pPr>
+              <w:jc w:val="left"/>
+            </w:pPr>
+            <w:r>
+              <w:rPr>
+                <w:rFonts w:ascii="Bookman Old Style" w:cs="Bookman Old Style" w:eastAsia="Bookman Old Style" w:hAnsi="Bookman Old Style"/>
+                <w:sz w:val="18"/>
+                <w:szCs w:val="18"/>
+              </w:rPr>
+              <w:t xml:space="preserve">2025-09</w:t>
+            </w:r>
+          </w:p>
+        </w:tc>
+        <w:tc>
+          <w:tcPr>
+            <w:tcW w:type="dxa" w:w="2400"/>
+          </w:tcPr>
+          <w:p>
+            <w:pPr>
+              <w:jc w:val="right"/>
+            </w:pPr>
+            <w:r>
+              <w:rPr>
+                <w:rFonts w:ascii="Bookman Old Style" w:cs="Bookman Old Style" w:eastAsia="Bookman Old Style" w:hAnsi="Bookman Old Style"/>
+                <w:sz w:val="18"/>
+                <w:szCs w:val="18"/>
+              </w:rPr>
+              <w:t xml:space="preserve">R$ 159.044,89</w:t>
+            </w:r>
+          </w:p>
+        </w:tc>
+        <w:tc>
+          <w:tcPr>
+            <w:tcW w:type="dxa" w:w="2400"/>
+          </w:tcPr>
+          <w:p>
+            <w:pPr>
+              <w:jc w:val="right"/>
+            </w:pPr>
+            <w:r>
+              <w:rPr>
+                <w:rFonts w:ascii="Bookman Old Style" w:cs="Bookman Old Style" w:eastAsia="Bookman Old Style" w:hAnsi="Bookman Old Style"/>
+                <w:sz w:val="18"/>
+                <w:szCs w:val="18"/>
+              </w:rPr>
+              <w:t xml:space="preserve">R$ 15.904,49</w:t>
+            </w:r>
+          </w:p>
+        </w:tc>
+        <w:tc>
+          <w:tcPr>
+            <w:tcW w:type="dxa" w:w="2100"/>
+          </w:tcPr>
+          <w:p>
+            <w:pPr>
+              <w:jc w:val="left"/>
+            </w:pPr>
+            <w:r>
+              <w:rPr>
+                <w:rFonts w:ascii="Bookman Old Style" w:cs="Bookman Old Style" w:eastAsia="Bookman Old Style" w:hAnsi="Bookman Old Style"/>
+                <w:sz w:val="18"/>
+                <w:szCs w:val="18"/>
+              </w:rPr>
+              <w:t xml:space="preserve">sem demonstrativo</w:t>
+            </w:r>
+          </w:p>
+        </w:tc>
+      </w:tr>
+      <w:tr>
+        <w:tc>
+          <w:tcPr>
+            <w:tcW w:type="dxa" w:w="1800"/>
+          </w:tcPr>
+          <w:p>
+            <w:pPr>
+              <w:jc w:val="left"/>
+            </w:pPr>
+            <w:r>
+              <w:rPr>
+                <w:rFonts w:ascii="Bookman Old Style" w:cs="Bookman Old Style" w:eastAsia="Bookman Old Style" w:hAnsi="Bookman Old Style"/>
+                <w:sz w:val="18"/>
+                <w:szCs w:val="18"/>
+              </w:rPr>
+              <w:t xml:space="preserve">2025-10</w:t>
+            </w:r>
+          </w:p>
+        </w:tc>
+        <w:tc>
+          <w:tcPr>
+            <w:tcW w:type="dxa" w:w="2400"/>
+          </w:tcPr>
+          <w:p>
+            <w:pPr>
+              <w:jc w:val="right"/>
+            </w:pPr>
+            <w:r>
+              <w:rPr>
+                <w:rFonts w:ascii="Bookman Old Style" w:cs="Bookman Old Style" w:eastAsia="Bookman Old Style" w:hAnsi="Bookman Old Style"/>
+                <w:sz w:val="18"/>
+                <w:szCs w:val="18"/>
+              </w:rPr>
+              <w:t xml:space="preserve">R$ 158.643,58</w:t>
+            </w:r>
+          </w:p>
+        </w:tc>
+        <w:tc>
+          <w:tcPr>
+            <w:tcW w:type="dxa" w:w="2400"/>
+          </w:tcPr>
+          <w:p>
+            <w:pPr>
+              <w:jc w:val="right"/>
+            </w:pPr>
+            <w:r>
+              <w:rPr>
+                <w:rFonts w:ascii="Bookman Old Style" w:cs="Bookman Old Style" w:eastAsia="Bookman Old Style" w:hAnsi="Bookman Old Style"/>
+                <w:sz w:val="18"/>
+                <w:szCs w:val="18"/>
+              </w:rPr>
+              <w:t xml:space="preserve">R$ 15.864,36</w:t>
+            </w:r>
+          </w:p>
+        </w:tc>
+        <w:tc>
+          <w:tcPr>
+            <w:tcW w:type="dxa" w:w="2100"/>
+          </w:tcPr>
+          <w:p>
+            <w:pPr>
+              <w:jc w:val="left"/>
+            </w:pPr>
+            <w:r>
+              <w:rPr>
+                <w:rFonts w:ascii="Bookman Old Style" w:cs="Bookman Old Style" w:eastAsia="Bookman Old Style" w:hAnsi="Bookman Old Style"/>
+                <w:sz w:val="18"/>
+                <w:szCs w:val="18"/>
+              </w:rPr>
+              <w:t xml:space="preserve">sem demonstrativo</w:t>
+            </w:r>
+          </w:p>
+        </w:tc>
+      </w:tr>
+      <w:tr>
+        <w:tc>
+          <w:tcPr>
+            <w:tcW w:type="dxa" w:w="1800"/>
+          </w:tcPr>
+          <w:p>
+            <w:pPr>
+              <w:jc w:val="left"/>
+            </w:pPr>
+            <w:r>
+              <w:rPr>
+                <w:rFonts w:ascii="Bookman Old Style" w:cs="Bookman Old Style" w:eastAsia="Bookman Old Style" w:hAnsi="Bookman Old Style"/>
+                <w:sz w:val="18"/>
+                <w:szCs w:val="18"/>
+              </w:rPr>
+              <w:t xml:space="preserve">2025-11</w:t>
+            </w:r>
+          </w:p>
+        </w:tc>
+        <w:tc>
+          <w:tcPr>
+            <w:tcW w:type="dxa" w:w="2400"/>
+          </w:tcPr>
+          <w:p>
+            <w:pPr>
+              <w:jc w:val="right"/>
+            </w:pPr>
+            <w:r>
+              <w:rPr>
+                <w:rFonts w:ascii="Bookman Old Style" w:cs="Bookman Old Style" w:eastAsia="Bookman Old Style" w:hAnsi="Bookman Old Style"/>
+                <w:sz w:val="18"/>
+                <w:szCs w:val="18"/>
+              </w:rPr>
+              <w:t xml:space="preserve">R$ 160.779,09</w:t>
+            </w:r>
+          </w:p>
+        </w:tc>
+        <w:tc>
+          <w:tcPr>
+            <w:tcW w:type="dxa" w:w="2400"/>
+          </w:tcPr>
+          <w:p>
+            <w:pPr>
+              <w:jc w:val="right"/>
+            </w:pPr>
+            <w:r>
+              <w:rPr>
+                <w:rFonts w:ascii="Bookman Old Style" w:cs="Bookman Old Style" w:eastAsia="Bookman Old Style" w:hAnsi="Bookman Old Style"/>
+                <w:sz w:val="18"/>
+                <w:szCs w:val="18"/>
+              </w:rPr>
+              <w:t xml:space="preserve">R$ 16.077,91</w:t>
+            </w:r>
+          </w:p>
+        </w:tc>
+        <w:tc>
+          <w:tcPr>
+            <w:tcW w:type="dxa" w:w="2100"/>
+          </w:tcPr>
+          <w:p>
+            <w:pPr>
+              <w:jc w:val="left"/>
+            </w:pPr>
+            <w:r>
+              <w:rPr>
+                <w:rFonts w:ascii="Bookman Old Style" w:cs="Bookman Old Style" w:eastAsia="Bookman Old Style" w:hAnsi="Bookman Old Style"/>
+                <w:sz w:val="18"/>
+                <w:szCs w:val="18"/>
+              </w:rPr>
+              <w:t xml:space="preserve">sem demonstrativo</w:t>
+            </w:r>
+          </w:p>
+        </w:tc>
+      </w:tr>
+    </w:tbl>
+    <w:p>
+      <w:pPr>
+        <w:spacing w:line="276"/>
+      </w:pPr>
+      <w:r>
+        <w:rPr>
+          <w:rFonts w:ascii="Bookman Old Style" w:cs="Bookman Old Style" w:eastAsia="Bookman Old Style" w:hAnsi="Bookman Old Style"/>
+          <w:sz w:val="22"/>
+          <w:szCs w:val="22"/>
+        </w:rPr>
+        <w:t xml:space="preserve"/>
+      </w:r>
+    </w:p>
+    <w:p>
+      <w:pPr>
+        <w:spacing w:line="276"/>
+        <w:ind w:firstLine="1133"/>
+        <w:jc w:val="both"/>
+      </w:pPr>
+      <w:r>
+        <w:rPr>
+          <w:rFonts w:ascii="Bookman Old Style" w:cs="Bookman Old Style" w:eastAsia="Bookman Old Style" w:hAnsi="Bookman Old Style"/>
+          <w:sz w:val="22"/>
+          <w:szCs w:val="22"/>
+        </w:rPr>
+        <w:t xml:space="preserve">O piso incide sobre o valor repassado em cada competência, não sobre o acumulado do ano. Aplicar o percentual apenas ao final do exercício não satisfaz a norma: descumpre-se em cada mês sem aplicação.</w:t>
+      </w:r>
+    </w:p>
+    <w:p>
+      <w:r>
+        <w:br w:type="page"/>
+      </w:r>
+    </w:p>
+    <w:p>
+      <w:pPr>
+        <w:pStyle w:val="Heading1"/>
+        <w:spacing w:after="120" w:before="240"/>
+        <w:jc w:val="center"/>
+      </w:pPr>
+      <w:r>
+        <w:rPr>
+          <w:rFonts w:ascii="Bookman Old Style" w:cs="Bookman Old Style" w:eastAsia="Bookman Old Style" w:hAnsi="Bookman Old Style"/>
+          <w:b/>
+          <w:bCs/>
+          <w:sz w:val="26"/>
+          <w:szCs w:val="26"/>
+        </w:rPr>
+        <w:t xml:space="preserve">VIII — Destinatários dos Recursos</w:t>
+      </w:r>
+    </w:p>
+    <w:p>
+      <w:pPr>
+        <w:spacing w:line="276"/>
+        <w:ind w:firstLine="1133"/>
+        <w:jc w:val="both"/>
+      </w:pPr>
+      <w:r>
+        <w:rPr>
+          <w:rFonts w:ascii="Bookman Old Style" w:cs="Bookman Old Style" w:eastAsia="Bookman Old Style" w:hAnsi="Bookman Old Style"/>
+          <w:sz w:val="22"/>
+          <w:szCs w:val="22"/>
+        </w:rPr>
+        <w:t xml:space="preserve">Cada inscrição foi enriquecida com razão social, nome fantasia, natureza jurídica e atividade econômica, consultadas em base pública. São </w:t>
+      </w:r>
+      <w:r>
+        <w:rPr>
+          <w:rFonts w:ascii="Bookman Old Style" w:cs="Bookman Old Style" w:eastAsia="Bookman Old Style" w:hAnsi="Bookman Old Style"/>
+          <w:b/>
+          <w:bCs/>
+          <w:sz w:val="22"/>
+          <w:szCs w:val="22"/>
+        </w:rPr>
+        <w:t xml:space="preserve">11</w:t>
+      </w:r>
+      <w:r>
+        <w:rPr>
+          <w:rFonts w:ascii="Bookman Old Style" w:cs="Bookman Old Style" w:eastAsia="Bookman Old Style" w:hAnsi="Bookman Old Style"/>
+          <w:sz w:val="22"/>
+          <w:szCs w:val="22"/>
+        </w:rPr>
+        <w:t xml:space="preserve"> destinatários, somando </w:t>
+      </w:r>
+      <w:r>
+        <w:rPr>
+          <w:rFonts w:ascii="Bookman Old Style" w:cs="Bookman Old Style" w:eastAsia="Bookman Old Style" w:hAnsi="Bookman Old Style"/>
+          <w:b/>
+          <w:bCs/>
+          <w:sz w:val="22"/>
+          <w:szCs w:val="22"/>
+        </w:rPr>
+        <w:t xml:space="preserve">R$ 2.360.980,54</w:t>
+      </w:r>
+      <w:r>
+        <w:rPr>
+          <w:rFonts w:ascii="Bookman Old Style" w:cs="Bookman Old Style" w:eastAsia="Bookman Old Style" w:hAnsi="Bookman Old Style"/>
+          <w:sz w:val="22"/>
+          <w:szCs w:val="22"/>
+        </w:rPr>
+        <w:t xml:space="preserve">, dos quais </w:t>
+      </w:r>
+      <w:r>
+        <w:rPr>
+          <w:rFonts w:ascii="Bookman Old Style" w:cs="Bookman Old Style" w:eastAsia="Bookman Old Style" w:hAnsi="Bookman Old Style"/>
+          <w:b/>
+          <w:bCs/>
+          <w:sz w:val="22"/>
+          <w:szCs w:val="22"/>
+        </w:rPr>
+        <w:t xml:space="preserve">4</w:t>
+      </w:r>
+      <w:r>
+        <w:rPr>
+          <w:rFonts w:ascii="Bookman Old Style" w:cs="Bookman Old Style" w:eastAsia="Bookman Old Style" w:hAnsi="Bookman Old Style"/>
+          <w:sz w:val="22"/>
+          <w:szCs w:val="22"/>
+        </w:rPr>
+        <w:t xml:space="preserve"> têm instrumento publicado. Nenhum apresenta padrão de pagamento mensal: todos são ocorrência única no exercício, o que reflete a ausência de empenhos publicados, e não a inexistência de despesa continuada.</w:t>
+      </w:r>
+    </w:p>
+    <w:p>
+      <w:pPr>
+        <w:spacing w:line="276"/>
+      </w:pPr>
+      <w:r>
+        <w:rPr>
+          <w:rFonts w:ascii="Bookman Old Style" w:cs="Bookman Old Style" w:eastAsia="Bookman Old Style" w:hAnsi="Bookman Old Style"/>
+          <w:sz w:val="22"/>
+          <w:szCs w:val="22"/>
+        </w:rPr>
+        <w:t xml:space="preserve"/>
+      </w:r>
+    </w:p>
+    <w:tbl>
+      <w:tblPr>
+        <w:tblW w:type="dxa" w:w="8700"/>
+        <w:tblBorders>
+          <w:top w:val="single" w:color="auto" w:sz="4"/>
+          <w:left w:val="single" w:color="auto" w:sz="4"/>
+          <w:bottom w:val="single" w:color="auto" w:sz="4"/>
+          <w:right w:val="single" w:color="auto" w:sz="4"/>
+          <w:insideH w:val="single" w:color="auto" w:sz="4"/>
+          <w:insideV w:val="single" w:color="auto" w:sz="4"/>
+        </w:tblBorders>
+      </w:tblPr>
+      <w:tblGrid>
+        <w:gridCol w:w="3200"/>
+        <w:gridCol w:w="1600"/>
+        <w:gridCol w:w="1700"/>
+        <w:gridCol w:w="2200"/>
+      </w:tblGrid>
+      <w:tr>
+        <w:tc>
+          <w:tcPr>
+            <w:tcW w:type="dxa" w:w="3200"/>
+            <w:shd w:fill="EAE6DC" w:val="clear"/>
+          </w:tcPr>
+          <w:p>
+            <w:pPr>
+              <w:jc w:val="left"/>
+            </w:pPr>
+            <w:r>
+              <w:rPr>
+                <w:rFonts w:ascii="Bookman Old Style" w:cs="Bookman Old Style" w:eastAsia="Bookman Old Style" w:hAnsi="Bookman Old Style"/>
+                <w:b/>
+                <w:bCs/>
+                <w:sz w:val="18"/>
+                <w:szCs w:val="18"/>
+              </w:rPr>
+              <w:t xml:space="preserve">Destinatário</w:t>
+            </w:r>
+          </w:p>
+        </w:tc>
+        <w:tc>
+          <w:tcPr>
+            <w:tcW w:type="dxa" w:w="1600"/>
+            <w:shd w:fill="EAE6DC" w:val="clear"/>
+          </w:tcPr>
+          <w:p>
+            <w:pPr>
+              <w:jc w:val="left"/>
+            </w:pPr>
+            <w:r>
+              <w:rPr>
+                <w:rFonts w:ascii="Bookman Old Style" w:cs="Bookman Old Style" w:eastAsia="Bookman Old Style" w:hAnsi="Bookman Old Style"/>
+                <w:b/>
+                <w:bCs/>
+                <w:sz w:val="18"/>
+                <w:szCs w:val="18"/>
+              </w:rPr>
+              <w:t xml:space="preserve">Valor</w:t>
+            </w:r>
+          </w:p>
+        </w:tc>
+        <w:tc>
+          <w:tcPr>
+            <w:tcW w:type="dxa" w:w="1700"/>
+            <w:shd w:fill="EAE6DC" w:val="clear"/>
+          </w:tcPr>
+          <w:p>
+            <w:pPr>
+              <w:jc w:val="left"/>
+            </w:pPr>
+            <w:r>
+              <w:rPr>
+                <w:rFonts w:ascii="Bookman Old Style" w:cs="Bookman Old Style" w:eastAsia="Bookman Old Style" w:hAnsi="Bookman Old Style"/>
+                <w:b/>
+                <w:bCs/>
+                <w:sz w:val="18"/>
+                <w:szCs w:val="18"/>
+              </w:rPr>
+              <w:t xml:space="preserve">Periodicidade</w:t>
+            </w:r>
+          </w:p>
+        </w:tc>
+        <w:tc>
+          <w:tcPr>
+            <w:tcW w:type="dxa" w:w="2200"/>
+            <w:shd w:fill="EAE6DC" w:val="clear"/>
+          </w:tcPr>
+          <w:p>
+            <w:pPr>
+              <w:jc w:val="left"/>
+            </w:pPr>
+            <w:r>
+              <w:rPr>
+                <w:rFonts w:ascii="Bookman Old Style" w:cs="Bookman Old Style" w:eastAsia="Bookman Old Style" w:hAnsi="Bookman Old Style"/>
+                <w:b/>
+                <w:bCs/>
+                <w:sz w:val="18"/>
+                <w:szCs w:val="18"/>
+              </w:rPr>
+              <w:t xml:space="preserve">Instrumento</w:t>
+            </w:r>
+          </w:p>
+        </w:tc>
+      </w:tr>
+      <w:tr>
+        <w:tc>
+          <w:tcPr>
+            <w:tcW w:type="dxa" w:w="3200"/>
+          </w:tcPr>
+          <w:p>
+            <w:pPr>
+              <w:jc w:val="left"/>
+            </w:pPr>
+            <w:r>
+              <w:rPr>
+                <w:rFonts w:ascii="Bookman Old Style" w:cs="Bookman Old Style" w:eastAsia="Bookman Old Style" w:hAnsi="Bookman Old Style"/>
+                <w:sz w:val="18"/>
+                <w:szCs w:val="18"/>
+              </w:rPr>
+              <w:t xml:space="preserve">15.649.514/0001-40 — FNS CONSTRUTORA E CONSULTORIA LTDA (FNS CONSTRUTORA E CONSULTORIA)</w:t>
+            </w:r>
+          </w:p>
+        </w:tc>
+        <w:tc>
+          <w:tcPr>
+            <w:tcW w:type="dxa" w:w="1600"/>
+          </w:tcPr>
+          <w:p>
+            <w:pPr>
+              <w:jc w:val="right"/>
+            </w:pPr>
+            <w:r>
+              <w:rPr>
+                <w:rFonts w:ascii="Bookman Old Style" w:cs="Bookman Old Style" w:eastAsia="Bookman Old Style" w:hAnsi="Bookman Old Style"/>
+                <w:sz w:val="18"/>
+                <w:szCs w:val="18"/>
+              </w:rPr>
+              <w:t xml:space="preserve">R$ 1.054.025,52</w:t>
+            </w:r>
+          </w:p>
+        </w:tc>
+        <w:tc>
+          <w:tcPr>
+            <w:tcW w:type="dxa" w:w="1700"/>
+          </w:tcPr>
+          <w:p>
+            <w:pPr>
+              <w:jc w:val="left"/>
+            </w:pPr>
+            <w:r>
+              <w:rPr>
+                <w:rFonts w:ascii="Bookman Old Style" w:cs="Bookman Old Style" w:eastAsia="Bookman Old Style" w:hAnsi="Bookman Old Style"/>
+                <w:sz w:val="18"/>
+                <w:szCs w:val="18"/>
+              </w:rPr>
+              <w:t xml:space="preserve">ANUAL OU PONTUAL</w:t>
+            </w:r>
+          </w:p>
+        </w:tc>
+        <w:tc>
+          <w:tcPr>
+            <w:tcW w:type="dxa" w:w="2200"/>
+          </w:tcPr>
+          <w:p>
+            <w:pPr>
+              <w:jc w:val="left"/>
+            </w:pPr>
+            <w:r>
+              <w:rPr>
+                <w:rFonts w:ascii="Bookman Old Style" w:cs="Bookman Old Style" w:eastAsia="Bookman Old Style" w:hAnsi="Bookman Old Style"/>
+                <w:sz w:val="18"/>
+                <w:szCs w:val="18"/>
+              </w:rPr>
+              <w:t xml:space="preserve">CONTRATO 08/2026 · CONTRATO 61/2026 · TERMO DE FOMENTO 008/2024</w:t>
+            </w:r>
+          </w:p>
+        </w:tc>
+      </w:tr>
+      <w:tr>
+        <w:tc>
+          <w:tcPr>
+            <w:tcW w:type="dxa" w:w="3200"/>
+          </w:tcPr>
+          <w:p>
+            <w:pPr>
+              <w:jc w:val="left"/>
+            </w:pPr>
+            <w:r>
+              <w:rPr>
+                <w:rFonts w:ascii="Bookman Old Style" w:cs="Bookman Old Style" w:eastAsia="Bookman Old Style" w:hAnsi="Bookman Old Style"/>
+                <w:sz w:val="18"/>
+                <w:szCs w:val="18"/>
+              </w:rPr>
+              <w:t xml:space="preserve">17.439.987/0001-48 — ASSOCIACAO DE SERVOS SAGRADA FAMILIA (ASSOCIACAO DE SERVOS SAGRADA FAMILIA)</w:t>
+            </w:r>
+          </w:p>
+        </w:tc>
+        <w:tc>
+          <w:tcPr>
+            <w:tcW w:type="dxa" w:w="1600"/>
+          </w:tcPr>
+          <w:p>
+            <w:pPr>
+              <w:jc w:val="right"/>
+            </w:pPr>
+            <w:r>
+              <w:rPr>
+                <w:rFonts w:ascii="Bookman Old Style" w:cs="Bookman Old Style" w:eastAsia="Bookman Old Style" w:hAnsi="Bookman Old Style"/>
+                <w:sz w:val="18"/>
+                <w:szCs w:val="18"/>
+              </w:rPr>
+              <w:t xml:space="preserve">R$ 300.000,00</w:t>
+            </w:r>
+          </w:p>
+        </w:tc>
+        <w:tc>
+          <w:tcPr>
+            <w:tcW w:type="dxa" w:w="1700"/>
+          </w:tcPr>
+          <w:p>
+            <w:pPr>
+              <w:jc w:val="left"/>
+            </w:pPr>
+            <w:r>
+              <w:rPr>
+                <w:rFonts w:ascii="Bookman Old Style" w:cs="Bookman Old Style" w:eastAsia="Bookman Old Style" w:hAnsi="Bookman Old Style"/>
+                <w:sz w:val="18"/>
+                <w:szCs w:val="18"/>
+              </w:rPr>
+              <w:t xml:space="preserve">ANUAL OU PONTUAL</w:t>
+            </w:r>
+          </w:p>
+        </w:tc>
+        <w:tc>
+          <w:tcPr>
+            <w:tcW w:type="dxa" w:w="2200"/>
+          </w:tcPr>
+          <w:p>
+            <w:pPr>
+              <w:jc w:val="left"/>
+            </w:pPr>
+            <w:r>
+              <w:rPr>
+                <w:rFonts w:ascii="Bookman Old Style" w:cs="Bookman Old Style" w:eastAsia="Bookman Old Style" w:hAnsi="Bookman Old Style"/>
+                <w:sz w:val="18"/>
+                <w:szCs w:val="18"/>
+              </w:rPr>
+              <w:t xml:space="preserve">sem vínculo</w:t>
+            </w:r>
+          </w:p>
+        </w:tc>
+      </w:tr>
+      <w:tr>
+        <w:tc>
+          <w:tcPr>
+            <w:tcW w:type="dxa" w:w="3200"/>
+          </w:tcPr>
+          <w:p>
+            <w:pPr>
+              <w:jc w:val="left"/>
+            </w:pPr>
+            <w:r>
+              <w:rPr>
+                <w:rFonts w:ascii="Bookman Old Style" w:cs="Bookman Old Style" w:eastAsia="Bookman Old Style" w:hAnsi="Bookman Old Style"/>
+                <w:sz w:val="18"/>
+                <w:szCs w:val="18"/>
+              </w:rPr>
+              <w:t xml:space="preserve">55.390.465/0001-98 — CONSTRULUZ COMERCIO E IMPORTACAO DE MATERIAIS DE CONSTRUCAO E ILUMINACAO LTDA (CONSTRULUZ)</w:t>
+            </w:r>
+          </w:p>
+        </w:tc>
+        <w:tc>
+          <w:tcPr>
+            <w:tcW w:type="dxa" w:w="1600"/>
+          </w:tcPr>
+          <w:p>
+            <w:pPr>
+              <w:jc w:val="right"/>
+            </w:pPr>
+            <w:r>
+              <w:rPr>
+                <w:rFonts w:ascii="Bookman Old Style" w:cs="Bookman Old Style" w:eastAsia="Bookman Old Style" w:hAnsi="Bookman Old Style"/>
+                <w:sz w:val="18"/>
+                <w:szCs w:val="18"/>
+              </w:rPr>
+              <w:t xml:space="preserve">R$ 257.040,00</w:t>
+            </w:r>
+          </w:p>
+        </w:tc>
+        <w:tc>
+          <w:tcPr>
+            <w:tcW w:type="dxa" w:w="1700"/>
+          </w:tcPr>
+          <w:p>
+            <w:pPr>
+              <w:jc w:val="left"/>
+            </w:pPr>
+            <w:r>
+              <w:rPr>
+                <w:rFonts w:ascii="Bookman Old Style" w:cs="Bookman Old Style" w:eastAsia="Bookman Old Style" w:hAnsi="Bookman Old Style"/>
+                <w:sz w:val="18"/>
+                <w:szCs w:val="18"/>
+              </w:rPr>
+              <w:t xml:space="preserve">ANUAL OU PONTUAL</w:t>
+            </w:r>
+          </w:p>
+        </w:tc>
+        <w:tc>
+          <w:tcPr>
+            <w:tcW w:type="dxa" w:w="2200"/>
+          </w:tcPr>
+          <w:p>
+            <w:pPr>
+              <w:jc w:val="left"/>
+            </w:pPr>
+            <w:r>
+              <w:rPr>
+                <w:rFonts w:ascii="Bookman Old Style" w:cs="Bookman Old Style" w:eastAsia="Bookman Old Style" w:hAnsi="Bookman Old Style"/>
+                <w:sz w:val="18"/>
+                <w:szCs w:val="18"/>
+              </w:rPr>
+              <w:t xml:space="preserve">sem vínculo</w:t>
+            </w:r>
+          </w:p>
+        </w:tc>
+      </w:tr>
+      <w:tr>
+        <w:tc>
+          <w:tcPr>
+            <w:tcW w:type="dxa" w:w="3200"/>
+          </w:tcPr>
+          <w:p>
+            <w:pPr>
+              <w:jc w:val="left"/>
+            </w:pPr>
+            <w:r>
+              <w:rPr>
+                <w:rFonts w:ascii="Bookman Old Style" w:cs="Bookman Old Style" w:eastAsia="Bookman Old Style" w:hAnsi="Bookman Old Style"/>
+                <w:sz w:val="18"/>
+                <w:szCs w:val="18"/>
+              </w:rPr>
+              <w:t xml:space="preserve">01.682.475/0001-78 — CENTRO DE REABILITACAO SAO PAULO APOSTOLO CRESPA (CRESPA)</w:t>
+            </w:r>
+          </w:p>
+        </w:tc>
+        <w:tc>
+          <w:tcPr>
+            <w:tcW w:type="dxa" w:w="1600"/>
+          </w:tcPr>
+          <w:p>
+            <w:pPr>
+              <w:jc w:val="right"/>
+            </w:pPr>
+            <w:r>
+              <w:rPr>
+                <w:rFonts w:ascii="Bookman Old Style" w:cs="Bookman Old Style" w:eastAsia="Bookman Old Style" w:hAnsi="Bookman Old Style"/>
+                <w:sz w:val="18"/>
+                <w:szCs w:val="18"/>
+              </w:rPr>
+              <w:t xml:space="preserve">R$ 200.000,00</w:t>
+            </w:r>
+          </w:p>
+        </w:tc>
+        <w:tc>
+          <w:tcPr>
+            <w:tcW w:type="dxa" w:w="1700"/>
+          </w:tcPr>
+          <w:p>
+            <w:pPr>
+              <w:jc w:val="left"/>
+            </w:pPr>
+            <w:r>
+              <w:rPr>
+                <w:rFonts w:ascii="Bookman Old Style" w:cs="Bookman Old Style" w:eastAsia="Bookman Old Style" w:hAnsi="Bookman Old Style"/>
+                <w:sz w:val="18"/>
+                <w:szCs w:val="18"/>
+              </w:rPr>
+              <w:t xml:space="preserve">ANUAL OU PONTUAL</w:t>
+            </w:r>
+          </w:p>
+        </w:tc>
+        <w:tc>
+          <w:tcPr>
+            <w:tcW w:type="dxa" w:w="2200"/>
+          </w:tcPr>
+          <w:p>
+            <w:pPr>
+              <w:jc w:val="left"/>
+            </w:pPr>
+            <w:r>
+              <w:rPr>
+                <w:rFonts w:ascii="Bookman Old Style" w:cs="Bookman Old Style" w:eastAsia="Bookman Old Style" w:hAnsi="Bookman Old Style"/>
+                <w:sz w:val="18"/>
+                <w:szCs w:val="18"/>
+              </w:rPr>
+              <w:t xml:space="preserve">sem vínculo</w:t>
+            </w:r>
+          </w:p>
+        </w:tc>
+      </w:tr>
+      <w:tr>
+        <w:tc>
+          <w:tcPr>
+            <w:tcW w:type="dxa" w:w="3200"/>
+          </w:tcPr>
+          <w:p>
+            <w:pPr>
+              <w:jc w:val="left"/>
+            </w:pPr>
+            <w:r>
+              <w:rPr>
+                <w:rFonts w:ascii="Bookman Old Style" w:cs="Bookman Old Style" w:eastAsia="Bookman Old Style" w:hAnsi="Bookman Old Style"/>
+                <w:sz w:val="18"/>
+                <w:szCs w:val="18"/>
+              </w:rPr>
+              <w:t xml:space="preserve">33.931.327/0001-36 — ESPLENDOR SERVICOS ADMINISTRATIVOS E COMERCIO DE FRIOS LTDA (ESPLENDOR SERVICOS E COMERCIO)</w:t>
+            </w:r>
+          </w:p>
+        </w:tc>
+        <w:tc>
+          <w:tcPr>
+            <w:tcW w:type="dxa" w:w="1600"/>
+          </w:tcPr>
+          <w:p>
+            <w:pPr>
+              <w:jc w:val="right"/>
+            </w:pPr>
+            <w:r>
+              <w:rPr>
+                <w:rFonts w:ascii="Bookman Old Style" w:cs="Bookman Old Style" w:eastAsia="Bookman Old Style" w:hAnsi="Bookman Old Style"/>
+                <w:sz w:val="18"/>
+                <w:szCs w:val="18"/>
+              </w:rPr>
+              <w:t xml:space="preserve">R$ 200.000,00</w:t>
+            </w:r>
+          </w:p>
+        </w:tc>
+        <w:tc>
+          <w:tcPr>
+            <w:tcW w:type="dxa" w:w="1700"/>
+          </w:tcPr>
+          <w:p>
+            <w:pPr>
+              <w:jc w:val="left"/>
+            </w:pPr>
+            <w:r>
+              <w:rPr>
+                <w:rFonts w:ascii="Bookman Old Style" w:cs="Bookman Old Style" w:eastAsia="Bookman Old Style" w:hAnsi="Bookman Old Style"/>
+                <w:sz w:val="18"/>
+                <w:szCs w:val="18"/>
+              </w:rPr>
+              <w:t xml:space="preserve">ANUAL OU PONTUAL</w:t>
+            </w:r>
+          </w:p>
+        </w:tc>
+        <w:tc>
+          <w:tcPr>
+            <w:tcW w:type="dxa" w:w="2200"/>
+          </w:tcPr>
+          <w:p>
+            <w:pPr>
+              <w:jc w:val="left"/>
+            </w:pPr>
+            <w:r>
+              <w:rPr>
+                <w:rFonts w:ascii="Bookman Old Style" w:cs="Bookman Old Style" w:eastAsia="Bookman Old Style" w:hAnsi="Bookman Old Style"/>
+                <w:sz w:val="18"/>
+                <w:szCs w:val="18"/>
+              </w:rPr>
+              <w:t xml:space="preserve">TERMO DE FOMENTO 017/2026</w:t>
+            </w:r>
+          </w:p>
+        </w:tc>
+      </w:tr>
+      <w:tr>
+        <w:tc>
+          <w:tcPr>
+            <w:tcW w:type="dxa" w:w="3200"/>
+          </w:tcPr>
+          <w:p>
+            <w:pPr>
+              <w:jc w:val="left"/>
+            </w:pPr>
+            <w:r>
+              <w:rPr>
+                <w:rFonts w:ascii="Bookman Old Style" w:cs="Bookman Old Style" w:eastAsia="Bookman Old Style" w:hAnsi="Bookman Old Style"/>
+                <w:sz w:val="18"/>
+                <w:szCs w:val="18"/>
+              </w:rPr>
+              <w:t xml:space="preserve">04.369.147/0001-04 — ABA MED S.A. (ABA MEDICAL)</w:t>
+            </w:r>
+          </w:p>
+        </w:tc>
+        <w:tc>
+          <w:tcPr>
+            <w:tcW w:type="dxa" w:w="1600"/>
+          </w:tcPr>
+          <w:p>
+            <w:pPr>
+              <w:jc w:val="right"/>
+            </w:pPr>
+            <w:r>
+              <w:rPr>
+                <w:rFonts w:ascii="Bookman Old Style" w:cs="Bookman Old Style" w:eastAsia="Bookman Old Style" w:hAnsi="Bookman Old Style"/>
+                <w:sz w:val="18"/>
+                <w:szCs w:val="18"/>
+              </w:rPr>
+              <w:t xml:space="preserve">R$ 122.384,42</w:t>
+            </w:r>
+          </w:p>
+        </w:tc>
+        <w:tc>
+          <w:tcPr>
+            <w:tcW w:type="dxa" w:w="1700"/>
+          </w:tcPr>
+          <w:p>
+            <w:pPr>
+              <w:jc w:val="left"/>
+            </w:pPr>
+            <w:r>
+              <w:rPr>
+                <w:rFonts w:ascii="Bookman Old Style" w:cs="Bookman Old Style" w:eastAsia="Bookman Old Style" w:hAnsi="Bookman Old Style"/>
+                <w:sz w:val="18"/>
+                <w:szCs w:val="18"/>
+              </w:rPr>
+              <w:t xml:space="preserve">ANUAL OU PONTUAL</w:t>
+            </w:r>
+          </w:p>
+        </w:tc>
+        <w:tc>
+          <w:tcPr>
+            <w:tcW w:type="dxa" w:w="2200"/>
+          </w:tcPr>
+          <w:p>
+            <w:pPr>
+              <w:jc w:val="left"/>
+            </w:pPr>
+            <w:r>
+              <w:rPr>
+                <w:rFonts w:ascii="Bookman Old Style" w:cs="Bookman Old Style" w:eastAsia="Bookman Old Style" w:hAnsi="Bookman Old Style"/>
+                <w:sz w:val="18"/>
+                <w:szCs w:val="18"/>
+              </w:rPr>
+              <w:t xml:space="preserve">CONTRATO 065/2026 · TERMO DE FOMENTO 055/2025 · Termo de Fomento 055/2025</w:t>
+            </w:r>
+          </w:p>
+        </w:tc>
+      </w:tr>
+      <w:tr>
+        <w:tc>
+          <w:tcPr>
+            <w:tcW w:type="dxa" w:w="3200"/>
+          </w:tcPr>
+          <w:p>
+            <w:pPr>
+              <w:jc w:val="left"/>
+            </w:pPr>
+            <w:r>
+              <w:rPr>
+                <w:rFonts w:ascii="Bookman Old Style" w:cs="Bookman Old Style" w:eastAsia="Bookman Old Style" w:hAnsi="Bookman Old Style"/>
+                <w:sz w:val="18"/>
+                <w:szCs w:val="18"/>
+              </w:rPr>
+              <w:t xml:space="preserve">97.546.623/0001-04 — JR AGUAS LTDA (JR AGUAS)</w:t>
+            </w:r>
+          </w:p>
+        </w:tc>
+        <w:tc>
+          <w:tcPr>
+            <w:tcW w:type="dxa" w:w="1600"/>
+          </w:tcPr>
+          <w:p>
+            <w:pPr>
+              <w:jc w:val="right"/>
+            </w:pPr>
+            <w:r>
+              <w:rPr>
+                <w:rFonts w:ascii="Bookman Old Style" w:cs="Bookman Old Style" w:eastAsia="Bookman Old Style" w:hAnsi="Bookman Old Style"/>
+                <w:sz w:val="18"/>
+                <w:szCs w:val="18"/>
+              </w:rPr>
+              <w:t xml:space="preserve">R$ 69.744,00</w:t>
+            </w:r>
+          </w:p>
+        </w:tc>
+        <w:tc>
+          <w:tcPr>
+            <w:tcW w:type="dxa" w:w="1700"/>
+          </w:tcPr>
+          <w:p>
+            <w:pPr>
+              <w:jc w:val="left"/>
+            </w:pPr>
+            <w:r>
+              <w:rPr>
+                <w:rFonts w:ascii="Bookman Old Style" w:cs="Bookman Old Style" w:eastAsia="Bookman Old Style" w:hAnsi="Bookman Old Style"/>
+                <w:sz w:val="18"/>
+                <w:szCs w:val="18"/>
+              </w:rPr>
+              <w:t xml:space="preserve">ANUAL OU PONTUAL</w:t>
+            </w:r>
+          </w:p>
+        </w:tc>
+        <w:tc>
+          <w:tcPr>
+            <w:tcW w:type="dxa" w:w="2200"/>
+          </w:tcPr>
+          <w:p>
+            <w:pPr>
+              <w:jc w:val="left"/>
+            </w:pPr>
+            <w:r>
+              <w:rPr>
+                <w:rFonts w:ascii="Bookman Old Style" w:cs="Bookman Old Style" w:eastAsia="Bookman Old Style" w:hAnsi="Bookman Old Style"/>
+                <w:sz w:val="18"/>
+                <w:szCs w:val="18"/>
+              </w:rPr>
+              <w:t xml:space="preserve">sem vínculo</w:t>
+            </w:r>
+          </w:p>
+        </w:tc>
+      </w:tr>
+      <w:tr>
+        <w:tc>
+          <w:tcPr>
+            <w:tcW w:type="dxa" w:w="3200"/>
+          </w:tcPr>
+          <w:p>
+            <w:pPr>
+              <w:jc w:val="left"/>
+            </w:pPr>
+            <w:r>
+              <w:rPr>
+                <w:rFonts w:ascii="Bookman Old Style" w:cs="Bookman Old Style" w:eastAsia="Bookman Old Style" w:hAnsi="Bookman Old Style"/>
+                <w:sz w:val="18"/>
+                <w:szCs w:val="18"/>
+              </w:rPr>
+              <w:t xml:space="preserve">58.600.411/0001-06 — GUERRA COMERCIO E SERVICOS LTDA</w:t>
+            </w:r>
+          </w:p>
+        </w:tc>
+        <w:tc>
+          <w:tcPr>
+            <w:tcW w:type="dxa" w:w="1600"/>
+          </w:tcPr>
+          <w:p>
+            <w:pPr>
+              <w:jc w:val="right"/>
+            </w:pPr>
+            <w:r>
+              <w:rPr>
+                <w:rFonts w:ascii="Bookman Old Style" w:cs="Bookman Old Style" w:eastAsia="Bookman Old Style" w:hAnsi="Bookman Old Style"/>
+                <w:sz w:val="18"/>
+                <w:szCs w:val="18"/>
+              </w:rPr>
+              <w:t xml:space="preserve">R$ 55.750,50</w:t>
+            </w:r>
+          </w:p>
+        </w:tc>
+        <w:tc>
+          <w:tcPr>
+            <w:tcW w:type="dxa" w:w="1700"/>
+          </w:tcPr>
+          <w:p>
+            <w:pPr>
+              <w:jc w:val="left"/>
+            </w:pPr>
+            <w:r>
+              <w:rPr>
+                <w:rFonts w:ascii="Bookman Old Style" w:cs="Bookman Old Style" w:eastAsia="Bookman Old Style" w:hAnsi="Bookman Old Style"/>
+                <w:sz w:val="18"/>
+                <w:szCs w:val="18"/>
+              </w:rPr>
+              <w:t xml:space="preserve">ANUAL OU PONTUAL</w:t>
+            </w:r>
+          </w:p>
+        </w:tc>
+        <w:tc>
+          <w:tcPr>
+            <w:tcW w:type="dxa" w:w="2200"/>
+          </w:tcPr>
+          <w:p>
+            <w:pPr>
+              <w:jc w:val="left"/>
+            </w:pPr>
+            <w:r>
+              <w:rPr>
+                <w:rFonts w:ascii="Bookman Old Style" w:cs="Bookman Old Style" w:eastAsia="Bookman Old Style" w:hAnsi="Bookman Old Style"/>
+                <w:sz w:val="18"/>
+                <w:szCs w:val="18"/>
+              </w:rPr>
+              <w:t xml:space="preserve">sem vínculo</w:t>
+            </w:r>
+          </w:p>
+        </w:tc>
+      </w:tr>
+      <w:tr>
+        <w:tc>
+          <w:tcPr>
+            <w:tcW w:type="dxa" w:w="3200"/>
+          </w:tcPr>
+          <w:p>
+            <w:pPr>
+              <w:jc w:val="left"/>
+            </w:pPr>
+            <w:r>
+              <w:rPr>
+                <w:rFonts w:ascii="Bookman Old Style" w:cs="Bookman Old Style" w:eastAsia="Bookman Old Style" w:hAnsi="Bookman Old Style"/>
+                <w:sz w:val="18"/>
+                <w:szCs w:val="18"/>
+              </w:rPr>
+              <w:t xml:space="preserve">42.619.993/0001-24 — CAFE COLISEU LTDA</w:t>
+            </w:r>
+          </w:p>
+        </w:tc>
+        <w:tc>
+          <w:tcPr>
+            <w:tcW w:type="dxa" w:w="1600"/>
+          </w:tcPr>
+          <w:p>
+            <w:pPr>
+              <w:jc w:val="right"/>
+            </w:pPr>
+            <w:r>
+              <w:rPr>
+                <w:rFonts w:ascii="Bookman Old Style" w:cs="Bookman Old Style" w:eastAsia="Bookman Old Style" w:hAnsi="Bookman Old Style"/>
+                <w:sz w:val="18"/>
+                <w:szCs w:val="18"/>
+              </w:rPr>
+              <w:t xml:space="preserve">R$ 46.200,00</w:t>
+            </w:r>
+          </w:p>
+        </w:tc>
+        <w:tc>
+          <w:tcPr>
+            <w:tcW w:type="dxa" w:w="1700"/>
+          </w:tcPr>
+          <w:p>
+            <w:pPr>
+              <w:jc w:val="left"/>
+            </w:pPr>
+            <w:r>
+              <w:rPr>
+                <w:rFonts w:ascii="Bookman Old Style" w:cs="Bookman Old Style" w:eastAsia="Bookman Old Style" w:hAnsi="Bookman Old Style"/>
+                <w:sz w:val="18"/>
+                <w:szCs w:val="18"/>
+              </w:rPr>
+              <w:t xml:space="preserve">ANUAL OU PONTUAL</w:t>
+            </w:r>
+          </w:p>
+        </w:tc>
+        <w:tc>
+          <w:tcPr>
+            <w:tcW w:type="dxa" w:w="2200"/>
+          </w:tcPr>
+          <w:p>
+            <w:pPr>
+              <w:jc w:val="left"/>
+            </w:pPr>
+            <w:r>
+              <w:rPr>
+                <w:rFonts w:ascii="Bookman Old Style" w:cs="Bookman Old Style" w:eastAsia="Bookman Old Style" w:hAnsi="Bookman Old Style"/>
+                <w:sz w:val="18"/>
+                <w:szCs w:val="18"/>
+              </w:rPr>
+              <w:t xml:space="preserve">TERMO DE FOMENTO 102/2026 · Termo de Fomento 052/2023</w:t>
+            </w:r>
+          </w:p>
+        </w:tc>
+      </w:tr>
+      <w:tr>
+        <w:tc>
+          <w:tcPr>
+            <w:tcW w:type="dxa" w:w="3200"/>
+          </w:tcPr>
+          <w:p>
+            <w:pPr>
+              <w:jc w:val="left"/>
+            </w:pPr>
+            <w:r>
+              <w:rPr>
+                <w:rFonts w:ascii="Bookman Old Style" w:cs="Bookman Old Style" w:eastAsia="Bookman Old Style" w:hAnsi="Bookman Old Style"/>
+                <w:sz w:val="18"/>
+                <w:szCs w:val="18"/>
+              </w:rPr>
+              <w:t xml:space="preserve">44.728.295/0001-92 — K R MARCONDES DISTRIBUIDORA (2K DISTRIBUIDORA)</w:t>
+            </w:r>
+          </w:p>
+        </w:tc>
+        <w:tc>
+          <w:tcPr>
+            <w:tcW w:type="dxa" w:w="1600"/>
+          </w:tcPr>
+          <w:p>
+            <w:pPr>
+              <w:jc w:val="right"/>
+            </w:pPr>
+            <w:r>
+              <w:rPr>
+                <w:rFonts w:ascii="Bookman Old Style" w:cs="Bookman Old Style" w:eastAsia="Bookman Old Style" w:hAnsi="Bookman Old Style"/>
+                <w:sz w:val="18"/>
+                <w:szCs w:val="18"/>
+              </w:rPr>
+              <w:t xml:space="preserve">R$ 42.250,00</w:t>
+            </w:r>
+          </w:p>
+        </w:tc>
+        <w:tc>
+          <w:tcPr>
+            <w:tcW w:type="dxa" w:w="1700"/>
+          </w:tcPr>
+          <w:p>
+            <w:pPr>
+              <w:jc w:val="left"/>
+            </w:pPr>
+            <w:r>
+              <w:rPr>
+                <w:rFonts w:ascii="Bookman Old Style" w:cs="Bookman Old Style" w:eastAsia="Bookman Old Style" w:hAnsi="Bookman Old Style"/>
+                <w:sz w:val="18"/>
+                <w:szCs w:val="18"/>
+              </w:rPr>
+              <w:t xml:space="preserve">ANUAL OU PONTUAL</w:t>
+            </w:r>
+          </w:p>
+        </w:tc>
+        <w:tc>
+          <w:tcPr>
+            <w:tcW w:type="dxa" w:w="2200"/>
+          </w:tcPr>
+          <w:p>
+            <w:pPr>
+              <w:jc w:val="left"/>
+            </w:pPr>
+            <w:r>
+              <w:rPr>
+                <w:rFonts w:ascii="Bookman Old Style" w:cs="Bookman Old Style" w:eastAsia="Bookman Old Style" w:hAnsi="Bookman Old Style"/>
+                <w:sz w:val="18"/>
+                <w:szCs w:val="18"/>
+              </w:rPr>
+              <w:t xml:space="preserve">sem vínculo</w:t>
+            </w:r>
+          </w:p>
+        </w:tc>
+      </w:tr>
+      <w:tr>
+        <w:tc>
+          <w:tcPr>
+            <w:tcW w:type="dxa" w:w="3200"/>
+          </w:tcPr>
+          <w:p>
+            <w:pPr>
+              <w:jc w:val="left"/>
+            </w:pPr>
+            <w:r>
+              <w:rPr>
+                <w:rFonts w:ascii="Bookman Old Style" w:cs="Bookman Old Style" w:eastAsia="Bookman Old Style" w:hAnsi="Bookman Old Style"/>
+                <w:sz w:val="18"/>
+                <w:szCs w:val="18"/>
+              </w:rPr>
+              <w:t xml:space="preserve">03.647.755/0001-70 — VASCONCELOS ALIMENTOS S.A. (ARROZ VASCONCELOS)</w:t>
+            </w:r>
+          </w:p>
+        </w:tc>
+        <w:tc>
+          <w:tcPr>
+            <w:tcW w:type="dxa" w:w="1600"/>
+          </w:tcPr>
+          <w:p>
+            <w:pPr>
+              <w:jc w:val="right"/>
+            </w:pPr>
+            <w:r>
+              <w:rPr>
+                <w:rFonts w:ascii="Bookman Old Style" w:cs="Bookman Old Style" w:eastAsia="Bookman Old Style" w:hAnsi="Bookman Old Style"/>
+                <w:sz w:val="18"/>
+                <w:szCs w:val="18"/>
+              </w:rPr>
+              <w:t xml:space="preserve">R$ 13.586,10</w:t>
+            </w:r>
+          </w:p>
+        </w:tc>
+        <w:tc>
+          <w:tcPr>
+            <w:tcW w:type="dxa" w:w="1700"/>
+          </w:tcPr>
+          <w:p>
+            <w:pPr>
+              <w:jc w:val="left"/>
+            </w:pPr>
+            <w:r>
+              <w:rPr>
+                <w:rFonts w:ascii="Bookman Old Style" w:cs="Bookman Old Style" w:eastAsia="Bookman Old Style" w:hAnsi="Bookman Old Style"/>
+                <w:sz w:val="18"/>
+                <w:szCs w:val="18"/>
+              </w:rPr>
+              <w:t xml:space="preserve">ANUAL OU PONTUAL</w:t>
+            </w:r>
+          </w:p>
+        </w:tc>
+        <w:tc>
+          <w:tcPr>
+            <w:tcW w:type="dxa" w:w="2200"/>
+          </w:tcPr>
+          <w:p>
+            <w:pPr>
+              <w:jc w:val="left"/>
+            </w:pPr>
+            <w:r>
+              <w:rPr>
+                <w:rFonts w:ascii="Bookman Old Style" w:cs="Bookman Old Style" w:eastAsia="Bookman Old Style" w:hAnsi="Bookman Old Style"/>
+                <w:sz w:val="18"/>
+                <w:szCs w:val="18"/>
+              </w:rPr>
+              <w:t xml:space="preserve">sem vínculo</w:t>
+            </w:r>
+          </w:p>
+        </w:tc>
+      </w:tr>
+    </w:tbl>
+    <w:p>
+      <w:pPr>
+        <w:spacing w:line="276"/>
+      </w:pPr>
+      <w:r>
+        <w:rPr>
+          <w:rFonts w:ascii="Bookman Old Style" w:cs="Bookman Old Style" w:eastAsia="Bookman Old Style" w:hAnsi="Bookman Old Style"/>
+          <w:sz w:val="22"/>
+          <w:szCs w:val="22"/>
+        </w:rPr>
+        <w:t xml:space="preserve"/>
+      </w:r>
+    </w:p>
+    <w:p>
+      <w:pPr>
+        <w:spacing w:line="276"/>
+        <w:ind w:firstLine="1133"/>
+        <w:jc w:val="both"/>
+      </w:pPr>
+      <w:r>
+        <w:rPr>
+          <w:rFonts w:ascii="Bookman Old Style" w:cs="Bookman Old Style" w:eastAsia="Bookman Old Style" w:hAnsi="Bookman Old Style"/>
+          <w:b/>
+          <w:bCs/>
+          <w:sz w:val="22"/>
+          <w:szCs w:val="22"/>
+        </w:rPr>
+        <w:t xml:space="preserve">Alerta de incompatibilidade. </w:t>
+      </w:r>
+      <w:r>
+        <w:rPr>
+          <w:rFonts w:ascii="Bookman Old Style" w:cs="Bookman Old Style" w:eastAsia="Bookman Old Style" w:hAnsi="Bookman Old Style"/>
+          <w:sz w:val="22"/>
+          <w:szCs w:val="22"/>
+        </w:rPr>
+        <w:t xml:space="preserve">4 destinatários aparecem associados a termo de fomento ou de colaboração, mas têm natureza jurídica de sociedade empresária com fins lucrativos. Termo de fomento é instrumento de parceria com organização da sociedade civil. Duas leituras são possíveis, e só o processo administrativo desempata: ou o instrumento foi celebrado com quem não podia celebrá-lo, ou a inscrição não é a beneficiária daquele ato — a página do Diário reúne vários atos, e a extração captura todas as inscrições da página. Por isso cada vínculo nasce com selo a conferir.</w:t>
+      </w:r>
+    </w:p>
+    <w:p>
+      <w:pPr>
+        <w:spacing w:line="276"/>
+      </w:pPr>
+      <w:r>
+        <w:rPr>
+          <w:rFonts w:ascii="Bookman Old Style" w:cs="Bookman Old Style" w:eastAsia="Bookman Old Style" w:hAnsi="Bookman Old Style"/>
+          <w:sz w:val="22"/>
+          <w:szCs w:val="22"/>
+        </w:rPr>
+        <w:t xml:space="preserve"/>
+      </w:r>
+    </w:p>
+    <w:tbl>
+      <w:tblPr>
+        <w:tblW w:type="dxa" w:w="8700"/>
+        <w:tblBorders>
+          <w:top w:val="single" w:color="auto" w:sz="4"/>
+          <w:left w:val="single" w:color="auto" w:sz="4"/>
+          <w:bottom w:val="single" w:color="auto" w:sz="4"/>
+          <w:right w:val="single" w:color="auto" w:sz="4"/>
+          <w:insideH w:val="single" w:color="auto" w:sz="4"/>
+          <w:insideV w:val="single" w:color="auto" w:sz="4"/>
+        </w:tblBorders>
+      </w:tblPr>
+      <w:tblGrid>
+        <w:gridCol w:w="3000"/>
+        <w:gridCol w:w="1700"/>
+        <w:gridCol w:w="4000"/>
+      </w:tblGrid>
+      <w:tr>
+        <w:tc>
+          <w:tcPr>
+            <w:tcW w:type="dxa" w:w="3000"/>
+            <w:shd w:fill="EAE6DC" w:val="clear"/>
+          </w:tcPr>
+          <w:p>
+            <w:pPr>
+              <w:jc w:val="left"/>
+            </w:pPr>
+            <w:r>
+              <w:rPr>
+                <w:rFonts w:ascii="Bookman Old Style" w:cs="Bookman Old Style" w:eastAsia="Bookman Old Style" w:hAnsi="Bookman Old Style"/>
+                <w:b/>
+                <w:bCs/>
+                <w:sz w:val="18"/>
+                <w:szCs w:val="18"/>
+              </w:rPr>
+              <w:t xml:space="preserve">Destinatário</w:t>
+            </w:r>
+          </w:p>
+        </w:tc>
+        <w:tc>
+          <w:tcPr>
+            <w:tcW w:type="dxa" w:w="1700"/>
+            <w:shd w:fill="EAE6DC" w:val="clear"/>
+          </w:tcPr>
+          <w:p>
+            <w:pPr>
+              <w:jc w:val="left"/>
+            </w:pPr>
+            <w:r>
+              <w:rPr>
+                <w:rFonts w:ascii="Bookman Old Style" w:cs="Bookman Old Style" w:eastAsia="Bookman Old Style" w:hAnsi="Bookman Old Style"/>
+                <w:b/>
+                <w:bCs/>
+                <w:sz w:val="18"/>
+                <w:szCs w:val="18"/>
+              </w:rPr>
+              <w:t xml:space="preserve">Natureza jurídica</w:t>
+            </w:r>
+          </w:p>
+        </w:tc>
+        <w:tc>
+          <w:tcPr>
+            <w:tcW w:type="dxa" w:w="4000"/>
+            <w:shd w:fill="EAE6DC" w:val="clear"/>
+          </w:tcPr>
+          <w:p>
+            <w:pPr>
+              <w:jc w:val="left"/>
+            </w:pPr>
+            <w:r>
+              <w:rPr>
+                <w:rFonts w:ascii="Bookman Old Style" w:cs="Bookman Old Style" w:eastAsia="Bookman Old Style" w:hAnsi="Bookman Old Style"/>
+                <w:b/>
+                <w:bCs/>
+                <w:sz w:val="18"/>
+                <w:szCs w:val="18"/>
+              </w:rPr>
+              <w:t xml:space="preserve">Atividade econômica</w:t>
+            </w:r>
+          </w:p>
+        </w:tc>
+      </w:tr>
+      <w:tr>
+        <w:tc>
+          <w:tcPr>
+            <w:tcW w:type="dxa" w:w="3000"/>
+          </w:tcPr>
+          <w:p>
+            <w:pPr>
+              <w:jc w:val="left"/>
+            </w:pPr>
+            <w:r>
+              <w:rPr>
+                <w:rFonts w:ascii="Bookman Old Style" w:cs="Bookman Old Style" w:eastAsia="Bookman Old Style" w:hAnsi="Bookman Old Style"/>
+                <w:sz w:val="18"/>
+                <w:szCs w:val="18"/>
+              </w:rPr>
+              <w:t xml:space="preserve">FNS CONSTRUTORA E CONSULTORIA LTDA</w:t>
+            </w:r>
+          </w:p>
+        </w:tc>
+        <w:tc>
+          <w:tcPr>
+            <w:tcW w:type="dxa" w:w="1700"/>
+          </w:tcPr>
+          <w:p>
+            <w:pPr>
+              <w:jc w:val="right"/>
+            </w:pPr>
+            <w:r>
+              <w:rPr>
+                <w:rFonts w:ascii="Bookman Old Style" w:cs="Bookman Old Style" w:eastAsia="Bookman Old Style" w:hAnsi="Bookman Old Style"/>
+                <w:sz w:val="18"/>
+                <w:szCs w:val="18"/>
+              </w:rPr>
+              <w:t xml:space="preserve">2062</w:t>
+            </w:r>
+          </w:p>
+        </w:tc>
+        <w:tc>
+          <w:tcPr>
+            <w:tcW w:type="dxa" w:w="4000"/>
+          </w:tcPr>
+          <w:p>
+            <w:pPr>
+              <w:jc w:val="left"/>
+            </w:pPr>
+            <w:r>
+              <w:rPr>
+                <w:rFonts w:ascii="Bookman Old Style" w:cs="Bookman Old Style" w:eastAsia="Bookman Old Style" w:hAnsi="Bookman Old Style"/>
+                <w:sz w:val="18"/>
+                <w:szCs w:val="18"/>
+              </w:rPr>
+              <w:t xml:space="preserve">Obras de terraplenagem</w:t>
+            </w:r>
+          </w:p>
+        </w:tc>
+      </w:tr>
+      <w:tr>
+        <w:tc>
+          <w:tcPr>
+            <w:tcW w:type="dxa" w:w="3000"/>
+          </w:tcPr>
+          <w:p>
+            <w:pPr>
+              <w:jc w:val="left"/>
+            </w:pPr>
+            <w:r>
+              <w:rPr>
+                <w:rFonts w:ascii="Bookman Old Style" w:cs="Bookman Old Style" w:eastAsia="Bookman Old Style" w:hAnsi="Bookman Old Style"/>
+                <w:sz w:val="18"/>
+                <w:szCs w:val="18"/>
+              </w:rPr>
+              <w:t xml:space="preserve">ESPLENDOR SERVICOS ADMINISTRATIVOS E COMERCIO DE FRIOS LTDA</w:t>
+            </w:r>
+          </w:p>
+        </w:tc>
+        <w:tc>
+          <w:tcPr>
+            <w:tcW w:type="dxa" w:w="1700"/>
+          </w:tcPr>
+          <w:p>
+            <w:pPr>
+              <w:jc w:val="right"/>
+            </w:pPr>
+            <w:r>
+              <w:rPr>
+                <w:rFonts w:ascii="Bookman Old Style" w:cs="Bookman Old Style" w:eastAsia="Bookman Old Style" w:hAnsi="Bookman Old Style"/>
+                <w:sz w:val="18"/>
+                <w:szCs w:val="18"/>
+              </w:rPr>
+              <w:t xml:space="preserve">2062</w:t>
+            </w:r>
+          </w:p>
+        </w:tc>
+        <w:tc>
+          <w:tcPr>
+            <w:tcW w:type="dxa" w:w="4000"/>
+          </w:tcPr>
+          <w:p>
+            <w:pPr>
+              <w:jc w:val="left"/>
+            </w:pPr>
+            <w:r>
+              <w:rPr>
+                <w:rFonts w:ascii="Bookman Old Style" w:cs="Bookman Old Style" w:eastAsia="Bookman Old Style" w:hAnsi="Bookman Old Style"/>
+                <w:sz w:val="18"/>
+                <w:szCs w:val="18"/>
+              </w:rPr>
+              <w:t xml:space="preserve">Serviços combinados de escritório e apoio administrativo</w:t>
+            </w:r>
+          </w:p>
+        </w:tc>
+      </w:tr>
+      <w:tr>
+        <w:tc>
+          <w:tcPr>
+            <w:tcW w:type="dxa" w:w="3000"/>
+          </w:tcPr>
+          <w:p>
+            <w:pPr>
+              <w:jc w:val="left"/>
+            </w:pPr>
+            <w:r>
+              <w:rPr>
+                <w:rFonts w:ascii="Bookman Old Style" w:cs="Bookman Old Style" w:eastAsia="Bookman Old Style" w:hAnsi="Bookman Old Style"/>
+                <w:sz w:val="18"/>
+                <w:szCs w:val="18"/>
+              </w:rPr>
+              <w:t xml:space="preserve">ABA MED S.A.</w:t>
+            </w:r>
+          </w:p>
+        </w:tc>
+        <w:tc>
+          <w:tcPr>
+            <w:tcW w:type="dxa" w:w="1700"/>
+          </w:tcPr>
+          <w:p>
+            <w:pPr>
+              <w:jc w:val="right"/>
+            </w:pPr>
+            <w:r>
+              <w:rPr>
+                <w:rFonts w:ascii="Bookman Old Style" w:cs="Bookman Old Style" w:eastAsia="Bookman Old Style" w:hAnsi="Bookman Old Style"/>
+                <w:sz w:val="18"/>
+                <w:szCs w:val="18"/>
+              </w:rPr>
+              <w:t xml:space="preserve">2054</w:t>
+            </w:r>
+          </w:p>
+        </w:tc>
+        <w:tc>
+          <w:tcPr>
+            <w:tcW w:type="dxa" w:w="4000"/>
+          </w:tcPr>
+          <w:p>
+            <w:pPr>
+              <w:jc w:val="left"/>
+            </w:pPr>
+            <w:r>
+              <w:rPr>
+                <w:rFonts w:ascii="Bookman Old Style" w:cs="Bookman Old Style" w:eastAsia="Bookman Old Style" w:hAnsi="Bookman Old Style"/>
+                <w:sz w:val="18"/>
+                <w:szCs w:val="18"/>
+              </w:rPr>
+              <w:t xml:space="preserve">Comércio atacadista de instrumentos e materiais para uso médico, cirúrgico, hospitalar e de laboratórios</w:t>
+            </w:r>
+          </w:p>
+        </w:tc>
+      </w:tr>
+      <w:tr>
+        <w:tc>
+          <w:tcPr>
+            <w:tcW w:type="dxa" w:w="3000"/>
+          </w:tcPr>
+          <w:p>
+            <w:pPr>
+              <w:jc w:val="left"/>
+            </w:pPr>
+            <w:r>
+              <w:rPr>
+                <w:rFonts w:ascii="Bookman Old Style" w:cs="Bookman Old Style" w:eastAsia="Bookman Old Style" w:hAnsi="Bookman Old Style"/>
+                <w:sz w:val="18"/>
+                <w:szCs w:val="18"/>
+              </w:rPr>
+              <w:t xml:space="preserve">CAFE COLISEU LTDA</w:t>
+            </w:r>
+          </w:p>
+        </w:tc>
+        <w:tc>
+          <w:tcPr>
+            <w:tcW w:type="dxa" w:w="1700"/>
+          </w:tcPr>
+          <w:p>
+            <w:pPr>
+              <w:jc w:val="right"/>
+            </w:pPr>
+            <w:r>
+              <w:rPr>
+                <w:rFonts w:ascii="Bookman Old Style" w:cs="Bookman Old Style" w:eastAsia="Bookman Old Style" w:hAnsi="Bookman Old Style"/>
+                <w:sz w:val="18"/>
+                <w:szCs w:val="18"/>
+              </w:rPr>
+              <w:t xml:space="preserve">2062</w:t>
+            </w:r>
+          </w:p>
+        </w:tc>
+        <w:tc>
+          <w:tcPr>
+            <w:tcW w:type="dxa" w:w="4000"/>
+          </w:tcPr>
+          <w:p>
+            <w:pPr>
+              <w:jc w:val="left"/>
+            </w:pPr>
+            <w:r>
+              <w:rPr>
+                <w:rFonts w:ascii="Bookman Old Style" w:cs="Bookman Old Style" w:eastAsia="Bookman Old Style" w:hAnsi="Bookman Old Style"/>
+                <w:sz w:val="18"/>
+                <w:szCs w:val="18"/>
+              </w:rPr>
+              <w:t xml:space="preserve">Torrefação e moagem de café</w:t>
+            </w:r>
+          </w:p>
+        </w:tc>
+      </w:tr>
+    </w:tbl>
+    <w:p>
+      <w:pPr>
+        <w:spacing w:line="276"/>
+      </w:pPr>
+      <w:r>
+        <w:rPr>
+          <w:rFonts w:ascii="Bookman Old Style" w:cs="Bookman Old Style" w:eastAsia="Bookman Old Style" w:hAnsi="Bookman Old Style"/>
+          <w:sz w:val="22"/>
+          <w:szCs w:val="22"/>
+        </w:rPr>
+        <w:t xml:space="preserve"/>
+      </w:r>
+    </w:p>
+    <w:p>
+      <w:r>
+        <w:br w:type="page"/>
+      </w:r>
+    </w:p>
+    <w:p>
+      <w:pPr>
+        <w:pStyle w:val="Heading1"/>
+        <w:spacing w:after="120" w:before="240"/>
+        <w:jc w:val="center"/>
+      </w:pPr>
+      <w:r>
+        <w:rPr>
+          <w:rFonts w:ascii="Bookman Old Style" w:cs="Bookman Old Style" w:eastAsia="Bookman Old Style" w:hAnsi="Bookman Old Style"/>
+          <w:b/>
+          <w:bCs/>
+          <w:sz w:val="26"/>
+          <w:szCs w:val="26"/>
+        </w:rPr>
+        <w:t xml:space="preserve">IX — Irregularidades Apuradas</w:t>
       </w:r>
     </w:p>
     <w:p>
@@ -7923,7 +11730,7 @@
         </w:rPr>
         <w:t xml:space="preserve">Diário Oficial do Município, Edição 8830, última edição publicada, 29/07/2026 — </w:t>
       </w:r>
-      <w:hyperlink w:history="1" r:id="rIdztmknvl3vhekeznqwsmfv">
+      <w:hyperlink w:history="1" r:id="rIdjp8vhxbk9abakbiqmiont">
         <w:r>
           <w:rPr>
             <w:rStyle w:val="Hyperlink"/>
@@ -7951,7 +11758,7 @@
         </w:rPr>
         <w:t xml:space="preserve">Acervo do Diário Oficial coletado, 161 eventos entre 2025 e 2026, com digest de cada edição — </w:t>
       </w:r>
-      <w:hyperlink w:history="1" r:id="rIdrdz5crh72yaa9neneetu1">
+      <w:hyperlink w:history="1" r:id="rIdarctzytzix0srdydu4erw">
         <w:r>
           <w:rPr>
             <w:rStyle w:val="Hyperlink"/>
@@ -7988,7 +11795,7 @@
         </w:rPr>
         <w:t xml:space="preserve">Onde deveria estar publicado. </w:t>
       </w:r>
-      <w:hyperlink w:history="1" r:id="rIdgvtaa1tzaw3hvvotvi-jr">
+      <w:hyperlink w:history="1" r:id="rIdnqz0n-nl7iuzafogihoum">
         <w:r>
           <w:rPr>
             <w:rStyle w:val="Hyperlink"/>
@@ -8215,7 +12022,7 @@
         </w:rPr>
         <w:t xml:space="preserve">Acervo do Diário Oficial coletado, 161 eventos entre 2025 e 2026, com digest de cada edição — </w:t>
       </w:r>
-      <w:hyperlink w:history="1" r:id="rIdl7y-t-tagip8okb4sqdj6">
+      <w:hyperlink w:history="1" r:id="rIdpl9zzgkqdglr6q-ky9rwt">
         <w:r>
           <w:rPr>
             <w:rStyle w:val="Hyperlink"/>
@@ -8243,7 +12050,7 @@
         </w:rPr>
         <w:t xml:space="preserve">Sítio próprio do Conselho, sem documento posterior a dezembro de 2023 — </w:t>
       </w:r>
-      <w:hyperlink w:history="1" r:id="rIdvh7b3r9btpm4wqu3jjnqv">
+      <w:hyperlink w:history="1" r:id="rIduhe-ot-mn8e04qkhpamcb">
         <w:r>
           <w:rPr>
             <w:rStyle w:val="Hyperlink"/>
@@ -8280,7 +12087,7 @@
         </w:rPr>
         <w:t xml:space="preserve">Onde deveria estar publicado. </w:t>
       </w:r>
-      <w:hyperlink w:history="1" r:id="rIdztvunmughqaog-yitnkep">
+      <w:hyperlink w:history="1" r:id="rIdrpm32f2-fvcvgie7dwmm4">
         <w:r>
           <w:rPr>
             <w:rStyle w:val="Hyperlink"/>
@@ -8300,7 +12107,7 @@
         </w:rPr>
         <w:t xml:space="preserve">; </w:t>
       </w:r>
-      <w:hyperlink w:history="1" r:id="rIdcrq_yznivtvggds9uetad">
+      <w:hyperlink w:history="1" r:id="rIdkrunzmy57puvklz5y3zet">
         <w:r>
           <w:rPr>
             <w:rStyle w:val="Hyperlink"/>
@@ -8539,7 +12346,7 @@
         </w:rPr>
         <w:t xml:space="preserve">Quadro de Detalhamento de Despesas 2026, anexos da Lei Orçamentária 11.590/2026, ação 3650.0824401082.591 — </w:t>
       </w:r>
-      <w:hyperlink w:history="1" r:id="rIdrtpv2nmpplwk3ghfvpqhu">
+      <w:hyperlink w:history="1" r:id="rId5beu7w1uxsqbkxfvaxtxf">
         <w:r>
           <w:rPr>
             <w:rStyle w:val="Hyperlink"/>
@@ -8567,7 +12374,7 @@
         </w:rPr>
         <w:t xml:space="preserve">Resolução CNAS/MDS 202/2025, Diário Oficial da União de 28/07/2025, Edição 140, Seção 1, Página 87 — </w:t>
       </w:r>
-      <w:hyperlink w:history="1" r:id="rIdybdkozpvxnaxvpo49cvhe">
+      <w:hyperlink w:history="1" r:id="rIdlcys6hzmg-4x3n8gtdzyz">
         <w:r>
           <w:rPr>
             <w:rStyle w:val="Hyperlink"/>
@@ -8604,7 +12411,7 @@
         </w:rPr>
         <w:t xml:space="preserve">Onde deveria estar publicado. </w:t>
       </w:r>
-      <w:hyperlink w:history="1" r:id="rIdbbgoorislfkzn6tkkvzri">
+      <w:hyperlink w:history="1" r:id="rId9p7zqo4lvq7y1zviw7j7r">
         <w:r>
           <w:rPr>
             <w:rStyle w:val="Hyperlink"/>
@@ -8624,7 +12431,7 @@
         </w:rPr>
         <w:t xml:space="preserve">; </w:t>
       </w:r>
-      <w:hyperlink w:history="1" r:id="rIdshsa2sdza4oodpt2mk_ub">
+      <w:hyperlink w:history="1" r:id="rIdcjdzpxd3eee8hlr2xtwvf">
         <w:r>
           <w:rPr>
             <w:rStyle w:val="Hyperlink"/>
@@ -8692,7 +12499,7 @@
           <w:sz w:val="22"/>
           <w:szCs w:val="22"/>
         </w:rPr>
-        <w:t xml:space="preserve">Dos R$ 256.000,00 da ação, apenas R$ 16.000,00 vêm da fonte 1660, onde trafega o Índice de Gestão Descentralizada. O devido é R$ 70.670,72. Os R$ 240.000,00 de fonte estadual contam como outra fonte de financiamento, admitida na parte final do artigo 6º, mas não substituem o piso federal.</w:t>
+        <w:t xml:space="preserve">Dos R$ 256.000,00 da ação, apenas R$ 16.000,00 vêm da fonte 1660, onde trafega o Índice de Gestão Descentralizada. O devido é R$ 168.750,26. Os R$ 240.000,00 de fonte estadual contam como outra fonte de financiamento, admitida na parte final do artigo 6º, mas não substituem o piso federal.</w:t>
       </w:r>
     </w:p>
     <w:p>
@@ -8858,7 +12665,7 @@
         </w:rPr>
         <w:t xml:space="preserve">Lei Orçamentária Anual 11.590/2026, anexos, Diário Oficial do Município, Edição 8697, de 09/01/2026, Edição Extra — </w:t>
       </w:r>
-      <w:hyperlink w:history="1" r:id="rIdiwkaqfebtdynbjl53lgwp">
+      <w:hyperlink w:history="1" r:id="rId8cshdhwytc0hkd5_fyt9d">
         <w:r>
           <w:rPr>
             <w:rStyle w:val="Hyperlink"/>
@@ -8886,7 +12693,7 @@
         </w:rPr>
         <w:t xml:space="preserve">Lei Orçamentária Anual 11.315/2025, anexos, Diário Oficial do Município, de 07/01/2025 — </w:t>
       </w:r>
-      <w:hyperlink w:history="1" r:id="rIdqxsryqbw36i0ibwzl34qu">
+      <w:hyperlink w:history="1" r:id="rIdjkikdyv0fgyd0qoli47od">
         <w:r>
           <w:rPr>
             <w:rStyle w:val="Hyperlink"/>
@@ -8923,7 +12730,7 @@
         </w:rPr>
         <w:t xml:space="preserve">Onde deveria estar publicado. </w:t>
       </w:r>
-      <w:hyperlink w:history="1" r:id="rIdntev-v7rksns36h0t9i38">
+      <w:hyperlink w:history="1" r:id="rIdgqzv0ojuvsmpwfvi1e31f">
         <w:r>
           <w:rPr>
             <w:rStyle w:val="Hyperlink"/>
@@ -8943,7 +12750,7 @@
         </w:rPr>
         <w:t xml:space="preserve">; </w:t>
       </w:r>
-      <w:hyperlink w:history="1" r:id="rIdblrc4wchwpip0btzqtz8d">
+      <w:hyperlink w:history="1" r:id="rIdp_7hxexvzflw3uxhm2bar">
         <w:r>
           <w:rPr>
             <w:rStyle w:val="Hyperlink"/>
@@ -9172,7 +12979,7 @@
         </w:rPr>
         <w:t xml:space="preserve">Acervo do Diário Oficial coletado, 161 eventos entre 2025 e 2026, com digest de cada edição — </w:t>
       </w:r>
-      <w:hyperlink w:history="1" r:id="rIdcshsy73wuoux5tpzv3wsv">
+      <w:hyperlink w:history="1" r:id="rId3ls1dwwibma3hnhzlhlca">
         <w:r>
           <w:rPr>
             <w:rStyle w:val="Hyperlink"/>
@@ -9209,7 +13016,7 @@
         </w:rPr>
         <w:t xml:space="preserve">Onde deveria estar publicado. </w:t>
       </w:r>
-      <w:hyperlink w:history="1" r:id="rIdomowsx4xgofauljnauh2k">
+      <w:hyperlink w:history="1" r:id="rIdhaehbkd6fipgsl20o1_rj">
         <w:r>
           <w:rPr>
             <w:rStyle w:val="Hyperlink"/>
@@ -9444,7 +13251,7 @@
         </w:rPr>
         <w:t xml:space="preserve">Lei Orçamentária Anual 11.590/2026, anexos, Diário Oficial do Município, Edição 8697, de 09/01/2026, Edição Extra — </w:t>
       </w:r>
-      <w:hyperlink w:history="1" r:id="rIdo9jmzs_rphesze8fpr5x9">
+      <w:hyperlink w:history="1" r:id="rIdz0gaudjxrhklt32cl83kk">
         <w:r>
           <w:rPr>
             <w:rStyle w:val="Hyperlink"/>
@@ -9472,7 +13279,7 @@
         </w:rPr>
         <w:t xml:space="preserve">Lei municipal 7.531/1995 — </w:t>
       </w:r>
-      <w:hyperlink w:history="1" r:id="rIdrta3k8j7cwjstcg8hatex">
+      <w:hyperlink w:history="1" r:id="rIdzadq4vbtemym0z56f8ur1">
         <w:r>
           <w:rPr>
             <w:rStyle w:val="Hyperlink"/>
@@ -9509,7 +13316,7 @@
         </w:rPr>
         <w:t xml:space="preserve">Onde deveria estar publicado. </w:t>
       </w:r>
-      <w:hyperlink w:history="1" r:id="rIdliwvr0fxa54ilcveszpp8">
+      <w:hyperlink w:history="1" r:id="rIdiawiloze9liczmb5vrmd2">
         <w:r>
           <w:rPr>
             <w:rStyle w:val="Hyperlink"/>
@@ -9529,7 +13336,7 @@
         </w:rPr>
         <w:t xml:space="preserve">; </w:t>
       </w:r>
-      <w:hyperlink w:history="1" r:id="rIdro-k3ngg8dpf_wptu6n-l">
+      <w:hyperlink w:history="1" r:id="rId6k0ka7ylo3vbvpjqb0_wn">
         <w:r>
           <w:rPr>
             <w:rStyle w:val="Hyperlink"/>
@@ -9696,7 +13503,7 @@
           <w:sz w:val="22"/>
           <w:szCs w:val="22"/>
         </w:rPr>
-        <w:t xml:space="preserve">IGD-01 — Piso de 10% do Índice de Gestão Descentralizada cumprido em apenas 22.6%</w:t>
+        <w:t xml:space="preserve">IGD-01 — Piso de 10% do Índice de Gestão Descentralizada cumprido em apenas 9.5%</w:t>
       </w:r>
     </w:p>
     <w:p>
@@ -9758,7 +13565,7 @@
         </w:rPr>
         <w:t xml:space="preserve">Lei Orçamentária Anual 11.590/2026, anexos, Diário Oficial do Município, Edição 8697, de 09/01/2026, Edição Extra — </w:t>
       </w:r>
-      <w:hyperlink w:history="1" r:id="rIdlowakpcfx98_gny3jzc4t">
+      <w:hyperlink w:history="1" r:id="rIdso1mzdglzq77lob07-isq">
         <w:r>
           <w:rPr>
             <w:rStyle w:val="Hyperlink"/>
@@ -9786,7 +13593,7 @@
         </w:rPr>
         <w:t xml:space="preserve">Resolução CNAS/MDS 202/2025, Diário Oficial da União de 28/07/2025, Edição 140, Seção 1, Página 87 — </w:t>
       </w:r>
-      <w:hyperlink w:history="1" r:id="rIdyw_ui7pdlwvl6x_ivysne">
+      <w:hyperlink w:history="1" r:id="rIdxywti2q2sbbyzy5nfabbb">
         <w:r>
           <w:rPr>
             <w:rStyle w:val="Hyperlink"/>
@@ -9823,7 +13630,7 @@
         </w:rPr>
         <w:t xml:space="preserve">Onde deveria estar publicado. </w:t>
       </w:r>
-      <w:hyperlink w:history="1" r:id="rIdsad2vjth4clkoa3ynxkfb">
+      <w:hyperlink w:history="1" r:id="rIdeocrn2tbmzqyipcyelmoz">
         <w:r>
           <w:rPr>
             <w:rStyle w:val="Hyperlink"/>
@@ -9843,7 +13650,7 @@
         </w:rPr>
         <w:t xml:space="preserve">; </w:t>
       </w:r>
-      <w:hyperlink w:history="1" r:id="rId8lcliotkv6r80scfp_nl0">
+      <w:hyperlink w:history="1" r:id="rIdjycwwd7xqciz9zjmvyngs">
         <w:r>
           <w:rPr>
             <w:rStyle w:val="Hyperlink"/>
@@ -9911,7 +13718,7 @@
           <w:sz w:val="22"/>
           <w:szCs w:val="22"/>
         </w:rPr>
-        <w:t xml:space="preserve">Base do Índice: R$ 706.707,15. Devido ao controle social: R$ 70.670,72. O Quadro de Detalhamento de Despesas reserva ao Conselho R$ 256.000,00 na ação 3650.0824401082.591, mas apenas R$ 16.000,00 na fonte 1660, que é a fonte federal onde o Índice trafega; R$ 240.000,00 vêm da fonte estadual 1661. Faltam R$ 54.670,72. O artigo 6º admite outras fontes de financiamento, mas elas não substituem o piso federal. E o percentual incide sobre o repasse mensal, não sobre o total anual: não há demonstrativo mensal publicado.</w:t>
+        <w:t xml:space="preserve">Base do Índice: R$ 1.687.502,57. Devido ao controle social: R$ 168.750,26. O Quadro de Detalhamento de Despesas reserva ao Conselho R$ 256.000,00 na ação 3650.0824401082.591, mas apenas R$ 16.000,00 na fonte 1660, que é a fonte federal onde o Índice trafega; R$ 240.000,00 vêm da fonte estadual 1661. Faltam R$ 152.750,26. O artigo 6º admite outras fontes de financiamento, mas elas não substituem o piso federal. E o percentual incide sobre o repasse mensal, não sobre o total anual: não há demonstrativo mensal publicado.</w:t>
       </w:r>
       <w:r>
         <w:rPr>
@@ -10095,7 +13902,7 @@
         </w:rPr>
         <w:t xml:space="preserve">Resolução CNAS/MDS 202/2025, Diário Oficial da União de 28/07/2025, Edição 140, Seção 1, Página 87 — </w:t>
       </w:r>
-      <w:hyperlink w:history="1" r:id="rIdvfijc6jzzbssq7d8sp_t7">
+      <w:hyperlink w:history="1" r:id="rId2bbdarveuvjt-txmwocmg">
         <w:r>
           <w:rPr>
             <w:rStyle w:val="Hyperlink"/>
@@ -10132,7 +13939,7 @@
         </w:rPr>
         <w:t xml:space="preserve">Onde deveria estar publicado. </w:t>
       </w:r>
-      <w:hyperlink w:history="1" r:id="rIdhs8cpx7xw-xq1epv-5iaj">
+      <w:hyperlink w:history="1" r:id="rIdxldop_xftbzb5trdni6mi">
         <w:r>
           <w:rPr>
             <w:rStyle w:val="Hyperlink"/>
@@ -10370,7 +14177,7 @@
         </w:rPr>
         <w:t xml:space="preserve">Sítio próprio do Conselho, sem documento posterior a dezembro de 2023 — </w:t>
       </w:r>
-      <w:hyperlink w:history="1" r:id="rIdgsyfyrwhlso_kf0u3iddb">
+      <w:hyperlink w:history="1" r:id="rIdj5jttpdkh2y10mtldjrem">
         <w:r>
           <w:rPr>
             <w:rStyle w:val="Hyperlink"/>
@@ -10407,7 +14214,7 @@
         </w:rPr>
         <w:t xml:space="preserve">Onde deveria estar publicado. </w:t>
       </w:r>
-      <w:hyperlink w:history="1" r:id="rIdczkeeaevwvqnnq0ifckzl">
+      <w:hyperlink w:history="1" r:id="rIdua5hdmf6-a1klldkfp-oq">
         <w:r>
           <w:rPr>
             <w:rStyle w:val="Hyperlink"/>
@@ -10427,7 +14234,7 @@
         </w:rPr>
         <w:t xml:space="preserve">; </w:t>
       </w:r>
-      <w:hyperlink w:history="1" r:id="rIdcc3rn6ysyskuxch-sv9sx">
+      <w:hyperlink w:history="1" r:id="rId1cqhzc-7k_wv1xxxfgkwz">
         <w:r>
           <w:rPr>
             <w:rStyle w:val="Hyperlink"/>
@@ -10650,7 +14457,7 @@
         </w:rPr>
         <w:t xml:space="preserve">Acervo do Diário Oficial coletado, 161 eventos entre 2025 e 2026, com digest de cada edição — </w:t>
       </w:r>
-      <w:hyperlink w:history="1" r:id="rIdzp3fwffqtxuyne1ffrh1z">
+      <w:hyperlink w:history="1" r:id="rIdf6zvx80di7mkh9ollvh86">
         <w:r>
           <w:rPr>
             <w:rStyle w:val="Hyperlink"/>
@@ -10687,7 +14494,7 @@
         </w:rPr>
         <w:t xml:space="preserve">Onde deveria estar publicado. </w:t>
       </w:r>
-      <w:hyperlink w:history="1" r:id="rId4ehe7vhpkprgi3-fpzsno">
+      <w:hyperlink w:history="1" r:id="rIdikgljeq06nuxtxi0fumnq">
         <w:r>
           <w:rPr>
             <w:rStyle w:val="Hyperlink"/>
@@ -10707,7 +14514,7 @@
         </w:rPr>
         <w:t xml:space="preserve">; </w:t>
       </w:r>
-      <w:hyperlink w:history="1" r:id="rId-yg_bs7ystjk947rayfqf">
+      <w:hyperlink w:history="1" r:id="rIdn9_pu8a6hxzx0y1rtolx5">
         <w:r>
           <w:rPr>
             <w:rStyle w:val="Hyperlink"/>
@@ -10930,7 +14737,7 @@
         </w:rPr>
         <w:t xml:space="preserve">Resolução CNAS/MDS 202/2025, Diário Oficial da União de 28/07/2025, Edição 140, Seção 1, Página 87 — </w:t>
       </w:r>
-      <w:hyperlink w:history="1" r:id="rIdyaz8hcgmp1vkpdayifybp">
+      <w:hyperlink w:history="1" r:id="rIdlihcnejal5tjxp2ss5b11">
         <w:r>
           <w:rPr>
             <w:rStyle w:val="Hyperlink"/>
@@ -10967,7 +14774,7 @@
         </w:rPr>
         <w:t xml:space="preserve">Onde deveria estar publicado. </w:t>
       </w:r>
-      <w:hyperlink w:history="1" r:id="rIdghz8_y97jkxo5gqpxnhvw">
+      <w:hyperlink w:history="1" r:id="rIdozksmsaliesswveuesqh2">
         <w:r>
           <w:rPr>
             <w:rStyle w:val="Hyperlink"/>
@@ -11188,7 +14995,7 @@
         </w:rPr>
         <w:t xml:space="preserve">Acervo do Diário Oficial coletado, 161 eventos entre 2025 e 2026, com digest de cada edição — </w:t>
       </w:r>
-      <w:hyperlink w:history="1" r:id="rIdfuov-cgaievhefyz0ft8r">
+      <w:hyperlink w:history="1" r:id="rIds3tciuthgn4luufrx_-a3">
         <w:r>
           <w:rPr>
             <w:rStyle w:val="Hyperlink"/>
@@ -11225,7 +15032,7 @@
         </w:rPr>
         <w:t xml:space="preserve">Onde deveria estar publicado. </w:t>
       </w:r>
-      <w:hyperlink w:history="1" r:id="rIddfgn2sh9g1iqk9uxfmzh-">
+      <w:hyperlink w:history="1" r:id="rIdfnoaubuaxomxzxsfrnuyf">
         <w:r>
           <w:rPr>
             <w:rStyle w:val="Hyperlink"/>
@@ -11464,7 +15271,7 @@
         </w:rPr>
         <w:t xml:space="preserve">Quadro de Detalhamento de Despesas 2026, anexos da Lei Orçamentária 11.590/2026, ação 3650.0824401082.591 — </w:t>
       </w:r>
-      <w:hyperlink w:history="1" r:id="rIdvmvyjcxw0tmcovqzjjdy3">
+      <w:hyperlink w:history="1" r:id="rIdbkbcnn4r93vh56lu8j4_r">
         <w:r>
           <w:rPr>
             <w:rStyle w:val="Hyperlink"/>
@@ -11501,7 +15308,7 @@
         </w:rPr>
         <w:t xml:space="preserve">Onde deveria estar publicado. </w:t>
       </w:r>
-      <w:hyperlink w:history="1" r:id="rIdfratvwakqajafscesjl6l">
+      <w:hyperlink w:history="1" r:id="rIdhaekkwrbnobuexjd1cuut">
         <w:r>
           <w:rPr>
             <w:rStyle w:val="Hyperlink"/>
@@ -11521,7 +15328,7 @@
         </w:rPr>
         <w:t xml:space="preserve">; </w:t>
       </w:r>
-      <w:hyperlink w:history="1" r:id="rIdpeuhlbmn40fhtyfjobf0d">
+      <w:hyperlink w:history="1" r:id="rIdh-1zgoqjxgqx4cuk3mrql">
         <w:r>
           <w:rPr>
             <w:rStyle w:val="Hyperlink"/>
@@ -11738,7 +15545,7 @@
         </w:rPr>
         <w:t xml:space="preserve">Quadro de Detalhamento de Despesas 2026, anexos da Lei Orçamentária 11.590/2026, ação 3650.0824401082.591 — </w:t>
       </w:r>
-      <w:hyperlink w:history="1" r:id="rIdlzsotgrwilr3r4v82er-s">
+      <w:hyperlink w:history="1" r:id="rIdoqx57ha7-tjgjdew4epr0">
         <w:r>
           <w:rPr>
             <w:rStyle w:val="Hyperlink"/>
@@ -11775,7 +15582,7 @@
         </w:rPr>
         <w:t xml:space="preserve">Onde deveria estar publicado. </w:t>
       </w:r>
-      <w:hyperlink w:history="1" r:id="rIdh_zqvl6wp4h0o8j6zpkic">
+      <w:hyperlink w:history="1" r:id="rIdcirzb7jfrqsbuv60xv-wx">
         <w:r>
           <w:rPr>
             <w:rStyle w:val="Hyperlink"/>
@@ -11795,7 +15602,7 @@
         </w:rPr>
         <w:t xml:space="preserve">; </w:t>
       </w:r>
-      <w:hyperlink w:history="1" r:id="rIdbmgwphn5gooz4jpqdvtwx">
+      <w:hyperlink w:history="1" r:id="rIdnxi5sgek7-j6hqpaz4nql">
         <w:r>
           <w:rPr>
             <w:rStyle w:val="Hyperlink"/>
@@ -12012,7 +15819,7 @@
         </w:rPr>
         <w:t xml:space="preserve">Quadro de Detalhamento de Despesas 2026, anexos da Lei Orçamentária 11.590/2026, ação 3650.0824401082.591 — </w:t>
       </w:r>
-      <w:hyperlink w:history="1" r:id="rIdvubyd9g-jd8u-eii6gmlo">
+      <w:hyperlink w:history="1" r:id="rIdpigj49vaaq4ucpw84sjeu">
         <w:r>
           <w:rPr>
             <w:rStyle w:val="Hyperlink"/>
@@ -12040,7 +15847,7 @@
         </w:rPr>
         <w:t xml:space="preserve">Lei municipal 9.009/2010 — </w:t>
       </w:r>
-      <w:hyperlink w:history="1" r:id="rIdjmzmwxkw1lsf0xnbdgkb9">
+      <w:hyperlink w:history="1" r:id="rIdyiskx_wdgpca1715u0r-h">
         <w:r>
           <w:rPr>
             <w:rStyle w:val="Hyperlink"/>
@@ -12077,7 +15884,7 @@
         </w:rPr>
         <w:t xml:space="preserve">Onde deveria estar publicado. </w:t>
       </w:r>
-      <w:hyperlink w:history="1" r:id="rIdrdsv4bozlefn_hqcjekfb">
+      <w:hyperlink w:history="1" r:id="rIdi-i7vcnqvzypspx6segc_">
         <w:r>
           <w:rPr>
             <w:rStyle w:val="Hyperlink"/>
@@ -12097,7 +15904,7 @@
         </w:rPr>
         <w:t xml:space="preserve">; </w:t>
       </w:r>
-      <w:hyperlink w:history="1" r:id="rIdlajjnzvg3o0qmnyeaiume">
+      <w:hyperlink w:history="1" r:id="rIdptr-2ek3eqv7bmzp1hw5w">
         <w:r>
           <w:rPr>
             <w:rStyle w:val="Hyperlink"/>
@@ -12314,7 +16121,7 @@
         </w:rPr>
         <w:t xml:space="preserve">Quadro de Detalhamento de Despesas 2026, anexos da Lei Orçamentária 11.590/2026, ação 3650.0824401082.591 — </w:t>
       </w:r>
-      <w:hyperlink w:history="1" r:id="rIdxy45qeglcqmfnyatew4pc">
+      <w:hyperlink w:history="1" r:id="rIdn9eusmj1s-nqupg7xuwj0">
         <w:r>
           <w:rPr>
             <w:rStyle w:val="Hyperlink"/>
@@ -12351,7 +16158,7 @@
         </w:rPr>
         <w:t xml:space="preserve">Onde deveria estar publicado. </w:t>
       </w:r>
-      <w:hyperlink w:history="1" r:id="rIdfmnv6lr0wefxwikhndqya">
+      <w:hyperlink w:history="1" r:id="rIdjiyiwur4hyo9vcl0ehj-f">
         <w:r>
           <w:rPr>
             <w:rStyle w:val="Hyperlink"/>
@@ -12585,7 +16392,7 @@
         </w:rPr>
         <w:t xml:space="preserve">Lei Orçamentária Anual 11.590/2026, anexos, Diário Oficial do Município, Edição 8697, de 09/01/2026, Edição Extra — </w:t>
       </w:r>
-      <w:hyperlink w:history="1" r:id="rIdtbm8wjnm0mzv9zx1ok9mo">
+      <w:hyperlink w:history="1" r:id="rIdrupnu4pykjvqxztq2i9wt">
         <w:r>
           <w:rPr>
             <w:rStyle w:val="Hyperlink"/>
@@ -12622,7 +16429,7 @@
         </w:rPr>
         <w:t xml:space="preserve">Onde deveria estar publicado. </w:t>
       </w:r>
-      <w:hyperlink w:history="1" r:id="rId1zltcgjdi179xphirocqq">
+      <w:hyperlink w:history="1" r:id="rIdnfgiqzz2lgzhcgqekqrcp">
         <w:r>
           <w:rPr>
             <w:rStyle w:val="Hyperlink"/>
@@ -12851,7 +16658,7 @@
         </w:rPr>
         <w:t xml:space="preserve">Lei Orçamentária Anual 11.590/2026, anexos, Diário Oficial do Município, Edição 8697, de 09/01/2026, Edição Extra — </w:t>
       </w:r>
-      <w:hyperlink w:history="1" r:id="rIdejfd9xacazj3ty1h26wg6">
+      <w:hyperlink w:history="1" r:id="rIds3e8p9cl72oep-am4l7xs">
         <w:r>
           <w:rPr>
             <w:rStyle w:val="Hyperlink"/>
@@ -12888,7 +16695,7 @@
         </w:rPr>
         <w:t xml:space="preserve">Onde deveria estar publicado. </w:t>
       </w:r>
-      <w:hyperlink w:history="1" r:id="rIdjpxglkb951t-kyiqbwo39">
+      <w:hyperlink w:history="1" r:id="rIdg2qv-rapbmkzerwpbs1kf">
         <w:r>
           <w:rPr>
             <w:rStyle w:val="Hyperlink"/>
@@ -13111,7 +16918,7 @@
         </w:rPr>
         <w:t xml:space="preserve">Lei Orçamentária Anual 11.590/2026, anexos, Diário Oficial do Município, Edição 8697, de 09/01/2026, Edição Extra — </w:t>
       </w:r>
-      <w:hyperlink w:history="1" r:id="rId2qi7ostu7y9hupviyrjde">
+      <w:hyperlink w:history="1" r:id="rIdsjt0st5v3uaqkmx8pglhi">
         <w:r>
           <w:rPr>
             <w:rStyle w:val="Hyperlink"/>
@@ -13139,7 +16946,7 @@
         </w:rPr>
         <w:t xml:space="preserve">Lei municipal 9.009/2010 — </w:t>
       </w:r>
-      <w:hyperlink w:history="1" r:id="rIdvnxc4nqc7lfvln9ek83tg">
+      <w:hyperlink w:history="1" r:id="rIdyehmp2kj9ffbntia5st3o">
         <w:r>
           <w:rPr>
             <w:rStyle w:val="Hyperlink"/>
@@ -13176,7 +16983,7 @@
         </w:rPr>
         <w:t xml:space="preserve">Onde deveria estar publicado. </w:t>
       </w:r>
-      <w:hyperlink w:history="1" r:id="rIdk5qq_lpkzfyrl21u4cbbs">
+      <w:hyperlink w:history="1" r:id="rIdub2nhqhzp25t2xcpqf_gn">
         <w:r>
           <w:rPr>
             <w:rStyle w:val="Hyperlink"/>
@@ -13405,7 +17212,7 @@
         </w:rPr>
         <w:t xml:space="preserve">Lei Orçamentária Anual 11.590/2026, anexos, Diário Oficial do Município, Edição 8697, de 09/01/2026, Edição Extra — </w:t>
       </w:r>
-      <w:hyperlink w:history="1" r:id="rIdjkoov3xxfr5rkbq3ssoih">
+      <w:hyperlink w:history="1" r:id="rIdq-3q_axy9zkdaeojdgjfo">
         <w:r>
           <w:rPr>
             <w:rStyle w:val="Hyperlink"/>
@@ -13442,7 +17249,7 @@
         </w:rPr>
         <w:t xml:space="preserve">Onde deveria estar publicado. </w:t>
       </w:r>
-      <w:hyperlink w:history="1" r:id="rIdecb6ccxpar7rvipvbkczl">
+      <w:hyperlink w:history="1" r:id="rIdp5xig6vtuzavxmsg0oswe">
         <w:r>
           <w:rPr>
             <w:rStyle w:val="Hyperlink"/>
@@ -13686,7 +17493,7 @@
         </w:rPr>
         <w:t xml:space="preserve">Acervo do Diário Oficial coletado, 161 eventos entre 2025 e 2026, com digest de cada edição — </w:t>
       </w:r>
-      <w:hyperlink w:history="1" r:id="rId77mkztxzhu9t3unbki5ez">
+      <w:hyperlink w:history="1" r:id="rIdz6ezvacll4iojah7iqpg5">
         <w:r>
           <w:rPr>
             <w:rStyle w:val="Hyperlink"/>
@@ -13723,7 +17530,7 @@
         </w:rPr>
         <w:t xml:space="preserve">Onde deveria estar publicado. </w:t>
       </w:r>
-      <w:hyperlink w:history="1" r:id="rId3j_q-w1pcdz5zt1jiyens">
+      <w:hyperlink w:history="1" r:id="rIds9hmxgrgwhh3-bx2uha7l">
         <w:r>
           <w:rPr>
             <w:rStyle w:val="Hyperlink"/>
@@ -13950,7 +17757,7 @@
         </w:rPr>
         <w:t xml:space="preserve">Acervo do Diário Oficial coletado, 161 eventos entre 2025 e 2026, com digest de cada edição — </w:t>
       </w:r>
-      <w:hyperlink w:history="1" r:id="rIdaetau1-jniv4vs6poro0d">
+      <w:hyperlink w:history="1" r:id="rIdyh4nrz__vjqvnz9fp70dj">
         <w:r>
           <w:rPr>
             <w:rStyle w:val="Hyperlink"/>
@@ -13987,7 +17794,7 @@
         </w:rPr>
         <w:t xml:space="preserve">Onde deveria estar publicado. </w:t>
       </w:r>
-      <w:hyperlink w:history="1" r:id="rIddk-ykpehbp7oa2awwjp_s">
+      <w:hyperlink w:history="1" r:id="rIdy8za8ljdcgzlpuz1p4btr">
         <w:r>
           <w:rPr>
             <w:rStyle w:val="Hyperlink"/>
@@ -14007,7 +17814,7 @@
         </w:rPr>
         <w:t xml:space="preserve">; </w:t>
       </w:r>
-      <w:hyperlink w:history="1" r:id="rIda9tdzlr5ih7edwox1e0l1">
+      <w:hyperlink w:history="1" r:id="rIdgadnoqz_t7yuf-ujkkw7v">
         <w:r>
           <w:rPr>
             <w:rStyle w:val="Hyperlink"/>
@@ -14236,7 +18043,7 @@
         </w:rPr>
         <w:t xml:space="preserve">Lei municipal 7.531/1995 — </w:t>
       </w:r>
-      <w:hyperlink w:history="1" r:id="rIdwl2ietlqqttj2gvlduaye">
+      <w:hyperlink w:history="1" r:id="rIdswt3tcn0a83etp8lvdngo">
         <w:r>
           <w:rPr>
             <w:rStyle w:val="Hyperlink"/>
@@ -14273,7 +18080,7 @@
         </w:rPr>
         <w:t xml:space="preserve">Onde deveria estar publicado. </w:t>
       </w:r>
-      <w:hyperlink w:history="1" r:id="rIdvbxpxq_qhxbrkxh6z8atc">
+      <w:hyperlink w:history="1" r:id="rIdoqaaw0kwg5ufcefkm9zqo">
         <w:r>
           <w:rPr>
             <w:rStyle w:val="Hyperlink"/>
@@ -14293,7 +18100,7 @@
         </w:rPr>
         <w:t xml:space="preserve">; </w:t>
       </w:r>
-      <w:hyperlink w:history="1" r:id="rIdbxorvthos8fieivuwwq8d">
+      <w:hyperlink w:history="1" r:id="rIdksqj5rljwajcnqmw9_dw9">
         <w:r>
           <w:rPr>
             <w:rStyle w:val="Hyperlink"/>
@@ -14514,7 +18321,7 @@
         </w:rPr>
         <w:t xml:space="preserve">Acervo do Diário Oficial coletado, 161 eventos entre 2025 e 2026, com digest de cada edição — </w:t>
       </w:r>
-      <w:hyperlink w:history="1" r:id="rIdowi3jjymtw4ibtj9l-zw0">
+      <w:hyperlink w:history="1" r:id="rIdlibo2cjxvukqhh3gunzip">
         <w:r>
           <w:rPr>
             <w:rStyle w:val="Hyperlink"/>
@@ -14551,7 +18358,7 @@
         </w:rPr>
         <w:t xml:space="preserve">Onde deveria estar publicado. </w:t>
       </w:r>
-      <w:hyperlink w:history="1" r:id="rIdguxs7t1jdmjsjfkxjv-kz">
+      <w:hyperlink w:history="1" r:id="rIdsbelviav2frp_-gbfvklr">
         <w:r>
           <w:rPr>
             <w:rStyle w:val="Hyperlink"/>
@@ -14772,7 +18579,7 @@
         </w:rPr>
         <w:t xml:space="preserve">Acervo do Diário Oficial coletado, 161 eventos entre 2025 e 2026, com digest de cada edição — </w:t>
       </w:r>
-      <w:hyperlink w:history="1" r:id="rIdxphvmsnnhv60hwbkk2tjn">
+      <w:hyperlink w:history="1" r:id="rIdtlrcuspmleglctdlmdkro">
         <w:r>
           <w:rPr>
             <w:rStyle w:val="Hyperlink"/>
@@ -14809,7 +18616,7 @@
         </w:rPr>
         <w:t xml:space="preserve">Onde deveria estar publicado. </w:t>
       </w:r>
-      <w:hyperlink w:history="1" r:id="rIdrao9gjpdemvomhtzx-cgl">
+      <w:hyperlink w:history="1" r:id="rId2m5oi2ynckg9h_mmmfl5u">
         <w:r>
           <w:rPr>
             <w:rStyle w:val="Hyperlink"/>
@@ -15049,7 +18856,7 @@
         </w:rPr>
         <w:t xml:space="preserve">Acervo do Diário Oficial coletado, 161 eventos entre 2025 e 2026, com digest de cada edição — </w:t>
       </w:r>
-      <w:hyperlink w:history="1" r:id="rIdvqsnkt9f7fhvlkct3e4pk">
+      <w:hyperlink w:history="1" r:id="rIdvwp_gnntjoudwp9ojl7js">
         <w:r>
           <w:rPr>
             <w:rStyle w:val="Hyperlink"/>
@@ -15086,7 +18893,7 @@
         </w:rPr>
         <w:t xml:space="preserve">Onde deveria estar publicado. </w:t>
       </w:r>
-      <w:hyperlink w:history="1" r:id="rId9gluukogemptkqdfkicqd">
+      <w:hyperlink w:history="1" r:id="rIdxjn0tj8paw2nfknwasea2">
         <w:r>
           <w:rPr>
             <w:rStyle w:val="Hyperlink"/>
@@ -15307,7 +19114,7 @@
         </w:rPr>
         <w:t xml:space="preserve">Acervo do Diário Oficial coletado, 161 eventos entre 2025 e 2026, com digest de cada edição — </w:t>
       </w:r>
-      <w:hyperlink w:history="1" r:id="rIddr6hsvlv59f3_hovfvfcm">
+      <w:hyperlink w:history="1" r:id="rIdtygpzhl83l_swi2cdaupy">
         <w:r>
           <w:rPr>
             <w:rStyle w:val="Hyperlink"/>
@@ -15344,7 +19151,7 @@
         </w:rPr>
         <w:t xml:space="preserve">Onde deveria estar publicado. </w:t>
       </w:r>
-      <w:hyperlink w:history="1" r:id="rIdfgh9oxn8-tbfbnrpref8r">
+      <w:hyperlink w:history="1" r:id="rIdangudgn8qjuxtlrhuixxf">
         <w:r>
           <w:rPr>
             <w:rStyle w:val="Hyperlink"/>
@@ -15583,7 +19390,7 @@
         </w:rPr>
         <w:t xml:space="preserve">Quadro de Detalhamento de Despesas 2026, anexos da Lei Orçamentária 11.590/2026, ação 3650.0824401082.591 — </w:t>
       </w:r>
-      <w:hyperlink w:history="1" r:id="rIdsj56tyfk__rh345i6im6d">
+      <w:hyperlink w:history="1" r:id="rId1fk4l-wvw-i3cxo_bgsei">
         <w:r>
           <w:rPr>
             <w:rStyle w:val="Hyperlink"/>
@@ -15620,7 +19427,7 @@
         </w:rPr>
         <w:t xml:space="preserve">Onde deveria estar publicado. </w:t>
       </w:r>
-      <w:hyperlink w:history="1" r:id="rIdfvfbygtyugjda2duxmvmv">
+      <w:hyperlink w:history="1" r:id="rIdbtyfwehwng2x19apw8quu">
         <w:r>
           <w:rPr>
             <w:rStyle w:val="Hyperlink"/>
@@ -15837,7 +19644,7 @@
         </w:rPr>
         <w:t xml:space="preserve">Lei de Diretrizes Orçamentárias 11.589/2026, Anexo III, Metas e Prioridades, setor de políticas para mulher, direitos humanos e assistência social — </w:t>
       </w:r>
-      <w:hyperlink w:history="1" r:id="rIdakbhm40-iaf3lunqqv1vb">
+      <w:hyperlink w:history="1" r:id="rIdqxpavajss-rzj9g89ta2f">
         <w:r>
           <w:rPr>
             <w:rStyle w:val="Hyperlink"/>
@@ -15874,7 +19681,7 @@
         </w:rPr>
         <w:t xml:space="preserve">Onde deveria estar publicado. </w:t>
       </w:r>
-      <w:hyperlink w:history="1" r:id="rId9kuyx0il37k2wbchunpwc">
+      <w:hyperlink w:history="1" r:id="rId-jywpitmbkyvet54fv5qf">
         <w:r>
           <w:rPr>
             <w:rStyle w:val="Hyperlink"/>
@@ -16108,7 +19915,7 @@
         </w:rPr>
         <w:t xml:space="preserve">Lei Orçamentária Anual 11.590/2026, anexos, Diário Oficial do Município, Edição 8697, de 09/01/2026, Edição Extra — </w:t>
       </w:r>
-      <w:hyperlink w:history="1" r:id="rId3zfeh_zjzwcz6ptdml0m_">
+      <w:hyperlink w:history="1" r:id="rIdzx4sx775yf1adnlvhfmvd">
         <w:r>
           <w:rPr>
             <w:rStyle w:val="Hyperlink"/>
@@ -16136,7 +19943,7 @@
         </w:rPr>
         <w:t xml:space="preserve">Acervo do Diário Oficial coletado, 161 eventos entre 2025 e 2026, com digest de cada edição — </w:t>
       </w:r>
-      <w:hyperlink w:history="1" r:id="rIdnanc2jwhgxam9x6wcjb4b">
+      <w:hyperlink w:history="1" r:id="rIdgnj0ery212ucvgqa78gip">
         <w:r>
           <w:rPr>
             <w:rStyle w:val="Hyperlink"/>
@@ -16173,7 +19980,7 @@
         </w:rPr>
         <w:t xml:space="preserve">Onde deveria estar publicado. </w:t>
       </w:r>
-      <w:hyperlink w:history="1" r:id="rIddwwczw0kw7fzh_bz2h45t">
+      <w:hyperlink w:history="1" r:id="rIdv65xromt2lhxlsgizetu-">
         <w:r>
           <w:rPr>
             <w:rStyle w:val="Hyperlink"/>
@@ -16417,7 +20224,7 @@
         </w:rPr>
         <w:t xml:space="preserve">Acervo do Diário Oficial coletado, 161 eventos entre 2025 e 2026, com digest de cada edição — </w:t>
       </w:r>
-      <w:hyperlink w:history="1" r:id="rIdzk3uyprsmna4qimq3_int">
+      <w:hyperlink w:history="1" r:id="rIdagtcaf7lvuwmpjfc4cqra">
         <w:r>
           <w:rPr>
             <w:rStyle w:val="Hyperlink"/>
@@ -16454,7 +20261,7 @@
         </w:rPr>
         <w:t xml:space="preserve">Onde deveria estar publicado. </w:t>
       </w:r>
-      <w:hyperlink w:history="1" r:id="rIdhdzd0dm72w75dkwpvhdd5">
+      <w:hyperlink w:history="1" r:id="rIdnmzdxftcglj-bwyl4kfxe">
         <w:r>
           <w:rPr>
             <w:rStyle w:val="Hyperlink"/>
@@ -16692,7 +20499,7 @@
         </w:rPr>
         <w:t xml:space="preserve">Acervo do Diário Oficial coletado, 161 eventos entre 2025 e 2026, com digest de cada edição — </w:t>
       </w:r>
-      <w:hyperlink w:history="1" r:id="rIdbnb55npw3imnwvcp8iwzk">
+      <w:hyperlink w:history="1" r:id="rId45zeqixfu8plde6vjnga3">
         <w:r>
           <w:rPr>
             <w:rStyle w:val="Hyperlink"/>
@@ -16729,7 +20536,7 @@
         </w:rPr>
         <w:t xml:space="preserve">Onde deveria estar publicado. </w:t>
       </w:r>
-      <w:hyperlink w:history="1" r:id="rIddfcfkd6hz6lest_hzoxmb">
+      <w:hyperlink w:history="1" r:id="rIdsx1ixjqudjnblfvxqre_g">
         <w:r>
           <w:rPr>
             <w:rStyle w:val="Hyperlink"/>
@@ -16895,7 +20702,7 @@
           <w:sz w:val="26"/>
           <w:szCs w:val="26"/>
         </w:rPr>
-        <w:t xml:space="preserve">VIII — Providências</w:t>
+        <w:t xml:space="preserve">X — Providências</w:t>
       </w:r>
     </w:p>
     <w:p>
@@ -16930,7 +20737,7 @@
         </w:rPr>
         <w:t xml:space="preserve"> Canal: </w:t>
       </w:r>
-      <w:hyperlink w:history="1" r:id="rIdhzmeqruem1rem2njvqrx9">
+      <w:hyperlink w:history="1" r:id="rIdcfdtv3wa_bww1eaqtimb0">
         <w:r>
           <w:rPr>
             <w:rStyle w:val="Hyperlink"/>
@@ -16996,7 +20803,7 @@
         </w:rPr>
         <w:t xml:space="preserve"> Canal: </w:t>
       </w:r>
-      <w:hyperlink w:history="1" r:id="rId2dxrj4s9vhuazgbvjaxn6">
+      <w:hyperlink w:history="1" r:id="rIdlguvwcalqtcn6lsyxz_ee">
         <w:r>
           <w:rPr>
             <w:rStyle w:val="Hyperlink"/>
@@ -17100,7 +20907,7 @@
         </w:rPr>
         <w:t xml:space="preserve"> Canal: </w:t>
       </w:r>
-      <w:hyperlink w:history="1" r:id="rId5_kipevx_utarifvcve9v">
+      <w:hyperlink w:history="1" r:id="rIdqvoyzseghzfgukjjhtyq4">
         <w:r>
           <w:rPr>
             <w:rStyle w:val="Hyperlink"/>
@@ -17148,7 +20955,7 @@
           <w:sz w:val="26"/>
           <w:szCs w:val="26"/>
         </w:rPr>
-        <w:t xml:space="preserve">IX — Ressalva</w:t>
+        <w:t xml:space="preserve">XI — Ressalva</w:t>
       </w:r>
     </w:p>
     <w:p>

</xml_diff>

<commit_message>
corpus v2.0 com controle externo (TCM-GO, TCE-GO, MP-GO, MPF, CNMP) e 18 itens quebrados corrigidos; padroes de qualidade com niveis de prova, 6 cruzamentos entre niveis de governo e 5 fechamentos aritmeticos; auditoria de dupla etapa condicional a suspeita; fluxograma com setas e pizzas por estagio; workflows consolidados em semanal de atos e mensal de contas e leis
</commit_message>
<xml_diff>
--- a/relatorios/Parecer_Fiscalizacao_2026.docx
+++ b/relatorios/Parecer_Fiscalizacao_2026.docx
@@ -291,7 +291,7 @@
         </w:rPr>
         <w:t xml:space="preserve">. Documento consultado em: </w:t>
       </w:r>
-      <w:hyperlink w:history="1" r:id="rIdcynz1e4wcq2zrqbnb1rpp">
+      <w:hyperlink w:history="1" r:id="rIdv4rkaencljietjux0_qeh">
         <w:r>
           <w:rPr>
             <w:rStyle w:val="Hyperlink"/>
@@ -2210,7 +2210,7 @@
         </w:rPr>
         <w:t xml:space="preserve">Deveria estar em: </w:t>
       </w:r>
-      <w:hyperlink w:history="1" r:id="rIdbv4esj3sinuw5navge1up">
+      <w:hyperlink w:history="1" r:id="rId0y8jb97yrtfu6mpqcjnq3">
         <w:r>
           <w:rPr>
             <w:rStyle w:val="Hyperlink"/>
@@ -2284,7 +2284,7 @@
         </w:rPr>
         <w:t xml:space="preserve">Deveria estar em: </w:t>
       </w:r>
-      <w:hyperlink w:history="1" r:id="rIdnoa4qpmvddq4pecvhwp0e">
+      <w:hyperlink w:history="1" r:id="rIdt4rabro5a1ximf2ee7kvp">
         <w:r>
           <w:rPr>
             <w:rStyle w:val="Hyperlink"/>
@@ -2358,7 +2358,7 @@
         </w:rPr>
         <w:t xml:space="preserve">Deveria estar em: </w:t>
       </w:r>
-      <w:hyperlink w:history="1" r:id="rIdl0hz10mvrtrevfc7s2s_1">
+      <w:hyperlink w:history="1" r:id="rIdsvctf77nln9yjn3fkfu6a">
         <w:r>
           <w:rPr>
             <w:rStyle w:val="Hyperlink"/>
@@ -2432,7 +2432,7 @@
         </w:rPr>
         <w:t xml:space="preserve">Deveria estar em: </w:t>
       </w:r>
-      <w:hyperlink w:history="1" r:id="rIde0z_4jmfhcme0r9vjotoq">
+      <w:hyperlink w:history="1" r:id="rIdwrjoj1z6tosc_w5yzq0aj">
         <w:r>
           <w:rPr>
             <w:rStyle w:val="Hyperlink"/>
@@ -2506,7 +2506,7 @@
         </w:rPr>
         <w:t xml:space="preserve">Deveria estar em: </w:t>
       </w:r>
-      <w:hyperlink w:history="1" r:id="rIdizbr9cxbcogcw64zmmywy">
+      <w:hyperlink w:history="1" r:id="rId7tso7q_-hr3qk3zninhxp">
         <w:r>
           <w:rPr>
             <w:rStyle w:val="Hyperlink"/>
@@ -2580,7 +2580,7 @@
         </w:rPr>
         <w:t xml:space="preserve">Deveria estar em: </w:t>
       </w:r>
-      <w:hyperlink w:history="1" r:id="rIdctzu_ojlklsmy9w7wkv7_">
+      <w:hyperlink w:history="1" r:id="rIdzsrvuo9ugtsivtnoaph89">
         <w:r>
           <w:rPr>
             <w:rStyle w:val="Hyperlink"/>
@@ -4900,7 +4900,7 @@
         </w:rPr>
         <w:t xml:space="preserve">A versão interativa desta trilha, com o detalhe de cada contrato, está em </w:t>
       </w:r>
-      <w:hyperlink w:history="1" r:id="rIdxvdl0la4cffwvwklplzep">
+      <w:hyperlink w:history="1" r:id="rIduwmtroafpznztjv9vcna6">
         <w:r>
           <w:rPr>
             <w:rStyle w:val="Hyperlink"/>
@@ -5817,7 +5817,7 @@
         </w:rPr>
         <w:t xml:space="preserve">A versão didática desta trilha, feita para leitura por quem não é da área, está em </w:t>
       </w:r>
-      <w:hyperlink w:history="1" r:id="rIdymway-c7nvieyj1qvbvru">
+      <w:hyperlink w:history="1" r:id="rIdnbrdsphgcsaomhm8q7id5">
         <w:r>
           <w:rPr>
             <w:rStyle w:val="Hyperlink"/>
@@ -11730,7 +11730,7 @@
         </w:rPr>
         <w:t xml:space="preserve">Diário Oficial do Município, Edição 8830, última edição publicada, 29/07/2026 — </w:t>
       </w:r>
-      <w:hyperlink w:history="1" r:id="rIdjp8vhxbk9abakbiqmiont">
+      <w:hyperlink w:history="1" r:id="rIdlvixqtfbp-_diukvsoglq">
         <w:r>
           <w:rPr>
             <w:rStyle w:val="Hyperlink"/>
@@ -11758,7 +11758,7 @@
         </w:rPr>
         <w:t xml:space="preserve">Acervo do Diário Oficial coletado, 161 eventos entre 2025 e 2026, com digest de cada edição — </w:t>
       </w:r>
-      <w:hyperlink w:history="1" r:id="rIdarctzytzix0srdydu4erw">
+      <w:hyperlink w:history="1" r:id="rIdtw7xyfvgwjyusmod6add6">
         <w:r>
           <w:rPr>
             <w:rStyle w:val="Hyperlink"/>
@@ -11795,7 +11795,7 @@
         </w:rPr>
         <w:t xml:space="preserve">Onde deveria estar publicado. </w:t>
       </w:r>
-      <w:hyperlink w:history="1" r:id="rIdnqz0n-nl7iuzafogihoum">
+      <w:hyperlink w:history="1" r:id="rIdspm6hstyboay1ioagmxh2">
         <w:r>
           <w:rPr>
             <w:rStyle w:val="Hyperlink"/>
@@ -12022,7 +12022,7 @@
         </w:rPr>
         <w:t xml:space="preserve">Acervo do Diário Oficial coletado, 161 eventos entre 2025 e 2026, com digest de cada edição — </w:t>
       </w:r>
-      <w:hyperlink w:history="1" r:id="rIdpl9zzgkqdglr6q-ky9rwt">
+      <w:hyperlink w:history="1" r:id="rIdi092ytwhdnnki7lx_wbch">
         <w:r>
           <w:rPr>
             <w:rStyle w:val="Hyperlink"/>
@@ -12050,7 +12050,7 @@
         </w:rPr>
         <w:t xml:space="preserve">Sítio próprio do Conselho, sem documento posterior a dezembro de 2023 — </w:t>
       </w:r>
-      <w:hyperlink w:history="1" r:id="rIduhe-ot-mn8e04qkhpamcb">
+      <w:hyperlink w:history="1" r:id="rIda67wwd3mpiqdsfi9acelo">
         <w:r>
           <w:rPr>
             <w:rStyle w:val="Hyperlink"/>
@@ -12087,7 +12087,7 @@
         </w:rPr>
         <w:t xml:space="preserve">Onde deveria estar publicado. </w:t>
       </w:r>
-      <w:hyperlink w:history="1" r:id="rIdrpm32f2-fvcvgie7dwmm4">
+      <w:hyperlink w:history="1" r:id="rIdh-nxpih_cs1qdamjjqxeu">
         <w:r>
           <w:rPr>
             <w:rStyle w:val="Hyperlink"/>
@@ -12107,7 +12107,7 @@
         </w:rPr>
         <w:t xml:space="preserve">; </w:t>
       </w:r>
-      <w:hyperlink w:history="1" r:id="rIdkrunzmy57puvklz5y3zet">
+      <w:hyperlink w:history="1" r:id="rIdbxma958tocjtklbib4tl8">
         <w:r>
           <w:rPr>
             <w:rStyle w:val="Hyperlink"/>
@@ -12346,7 +12346,7 @@
         </w:rPr>
         <w:t xml:space="preserve">Quadro de Detalhamento de Despesas 2026, anexos da Lei Orçamentária 11.590/2026, ação 3650.0824401082.591 — </w:t>
       </w:r>
-      <w:hyperlink w:history="1" r:id="rId5beu7w1uxsqbkxfvaxtxf">
+      <w:hyperlink w:history="1" r:id="rIdxepgot0jhjz_pbhpefhdi">
         <w:r>
           <w:rPr>
             <w:rStyle w:val="Hyperlink"/>
@@ -12374,7 +12374,7 @@
         </w:rPr>
         <w:t xml:space="preserve">Resolução CNAS/MDS 202/2025, Diário Oficial da União de 28/07/2025, Edição 140, Seção 1, Página 87 — </w:t>
       </w:r>
-      <w:hyperlink w:history="1" r:id="rIdlcys6hzmg-4x3n8gtdzyz">
+      <w:hyperlink w:history="1" r:id="rId3fp6dtnvn9mmmdjtniy4b">
         <w:r>
           <w:rPr>
             <w:rStyle w:val="Hyperlink"/>
@@ -12411,7 +12411,7 @@
         </w:rPr>
         <w:t xml:space="preserve">Onde deveria estar publicado. </w:t>
       </w:r>
-      <w:hyperlink w:history="1" r:id="rId9p7zqo4lvq7y1zviw7j7r">
+      <w:hyperlink w:history="1" r:id="rId7zxnloeixnpmfxn0xblmg">
         <w:r>
           <w:rPr>
             <w:rStyle w:val="Hyperlink"/>
@@ -12431,7 +12431,7 @@
         </w:rPr>
         <w:t xml:space="preserve">; </w:t>
       </w:r>
-      <w:hyperlink w:history="1" r:id="rIdcjdzpxd3eee8hlr2xtwvf">
+      <w:hyperlink w:history="1" r:id="rIdskcllr05rc4lt-xhvmpu9">
         <w:r>
           <w:rPr>
             <w:rStyle w:val="Hyperlink"/>
@@ -12665,7 +12665,7 @@
         </w:rPr>
         <w:t xml:space="preserve">Lei Orçamentária Anual 11.590/2026, anexos, Diário Oficial do Município, Edição 8697, de 09/01/2026, Edição Extra — </w:t>
       </w:r>
-      <w:hyperlink w:history="1" r:id="rId8cshdhwytc0hkd5_fyt9d">
+      <w:hyperlink w:history="1" r:id="rIdleytfjs69hezrmzc_yutm">
         <w:r>
           <w:rPr>
             <w:rStyle w:val="Hyperlink"/>
@@ -12693,7 +12693,7 @@
         </w:rPr>
         <w:t xml:space="preserve">Lei Orçamentária Anual 11.315/2025, anexos, Diário Oficial do Município, de 07/01/2025 — </w:t>
       </w:r>
-      <w:hyperlink w:history="1" r:id="rIdjkikdyv0fgyd0qoli47od">
+      <w:hyperlink w:history="1" r:id="rIdiog93lh5ua0vewxsyamhc">
         <w:r>
           <w:rPr>
             <w:rStyle w:val="Hyperlink"/>
@@ -12730,7 +12730,7 @@
         </w:rPr>
         <w:t xml:space="preserve">Onde deveria estar publicado. </w:t>
       </w:r>
-      <w:hyperlink w:history="1" r:id="rIdgqzv0ojuvsmpwfvi1e31f">
+      <w:hyperlink w:history="1" r:id="rIdpukbsgrby54qj5f06o39-">
         <w:r>
           <w:rPr>
             <w:rStyle w:val="Hyperlink"/>
@@ -12750,7 +12750,7 @@
         </w:rPr>
         <w:t xml:space="preserve">; </w:t>
       </w:r>
-      <w:hyperlink w:history="1" r:id="rIdp_7hxexvzflw3uxhm2bar">
+      <w:hyperlink w:history="1" r:id="rIdq8k9dzsulaxxnrmrcdi5u">
         <w:r>
           <w:rPr>
             <w:rStyle w:val="Hyperlink"/>
@@ -12979,7 +12979,7 @@
         </w:rPr>
         <w:t xml:space="preserve">Acervo do Diário Oficial coletado, 161 eventos entre 2025 e 2026, com digest de cada edição — </w:t>
       </w:r>
-      <w:hyperlink w:history="1" r:id="rId3ls1dwwibma3hnhzlhlca">
+      <w:hyperlink w:history="1" r:id="rId2dnbkcyqgiq_vj4yjuz4s">
         <w:r>
           <w:rPr>
             <w:rStyle w:val="Hyperlink"/>
@@ -13016,7 +13016,7 @@
         </w:rPr>
         <w:t xml:space="preserve">Onde deveria estar publicado. </w:t>
       </w:r>
-      <w:hyperlink w:history="1" r:id="rIdhaehbkd6fipgsl20o1_rj">
+      <w:hyperlink w:history="1" r:id="rIdo0gvbswpivel9yciebfvu">
         <w:r>
           <w:rPr>
             <w:rStyle w:val="Hyperlink"/>
@@ -13251,7 +13251,7 @@
         </w:rPr>
         <w:t xml:space="preserve">Lei Orçamentária Anual 11.590/2026, anexos, Diário Oficial do Município, Edição 8697, de 09/01/2026, Edição Extra — </w:t>
       </w:r>
-      <w:hyperlink w:history="1" r:id="rIdz0gaudjxrhklt32cl83kk">
+      <w:hyperlink w:history="1" r:id="rIdam2rvjvf4kkk8rokaq8ez">
         <w:r>
           <w:rPr>
             <w:rStyle w:val="Hyperlink"/>
@@ -13279,7 +13279,7 @@
         </w:rPr>
         <w:t xml:space="preserve">Lei municipal 7.531/1995 — </w:t>
       </w:r>
-      <w:hyperlink w:history="1" r:id="rIdzadq4vbtemym0z56f8ur1">
+      <w:hyperlink w:history="1" r:id="rIdlkhzbn6mz7mqiy5kcin_z">
         <w:r>
           <w:rPr>
             <w:rStyle w:val="Hyperlink"/>
@@ -13316,7 +13316,7 @@
         </w:rPr>
         <w:t xml:space="preserve">Onde deveria estar publicado. </w:t>
       </w:r>
-      <w:hyperlink w:history="1" r:id="rIdiawiloze9liczmb5vrmd2">
+      <w:hyperlink w:history="1" r:id="rIdukujhmp1p5lhk8q3lfn5q">
         <w:r>
           <w:rPr>
             <w:rStyle w:val="Hyperlink"/>
@@ -13336,7 +13336,7 @@
         </w:rPr>
         <w:t xml:space="preserve">; </w:t>
       </w:r>
-      <w:hyperlink w:history="1" r:id="rId6k0ka7ylo3vbvpjqb0_wn">
+      <w:hyperlink w:history="1" r:id="rIdolhhzyu2cj00vloere6u7">
         <w:r>
           <w:rPr>
             <w:rStyle w:val="Hyperlink"/>
@@ -13565,7 +13565,7 @@
         </w:rPr>
         <w:t xml:space="preserve">Lei Orçamentária Anual 11.590/2026, anexos, Diário Oficial do Município, Edição 8697, de 09/01/2026, Edição Extra — </w:t>
       </w:r>
-      <w:hyperlink w:history="1" r:id="rIdso1mzdglzq77lob07-isq">
+      <w:hyperlink w:history="1" r:id="rIdxjd_krbk3xflkarnplv1w">
         <w:r>
           <w:rPr>
             <w:rStyle w:val="Hyperlink"/>
@@ -13593,7 +13593,7 @@
         </w:rPr>
         <w:t xml:space="preserve">Resolução CNAS/MDS 202/2025, Diário Oficial da União de 28/07/2025, Edição 140, Seção 1, Página 87 — </w:t>
       </w:r>
-      <w:hyperlink w:history="1" r:id="rIdxywti2q2sbbyzy5nfabbb">
+      <w:hyperlink w:history="1" r:id="rIdjrq2cajvrpueuobgg-y_2">
         <w:r>
           <w:rPr>
             <w:rStyle w:val="Hyperlink"/>
@@ -13630,7 +13630,7 @@
         </w:rPr>
         <w:t xml:space="preserve">Onde deveria estar publicado. </w:t>
       </w:r>
-      <w:hyperlink w:history="1" r:id="rIdeocrn2tbmzqyipcyelmoz">
+      <w:hyperlink w:history="1" r:id="rIduwatgjulu9zjv2tkdwtsr">
         <w:r>
           <w:rPr>
             <w:rStyle w:val="Hyperlink"/>
@@ -13650,7 +13650,7 @@
         </w:rPr>
         <w:t xml:space="preserve">; </w:t>
       </w:r>
-      <w:hyperlink w:history="1" r:id="rIdjycwwd7xqciz9zjmvyngs">
+      <w:hyperlink w:history="1" r:id="rIdq6supznzzn8lcb8apaqte">
         <w:r>
           <w:rPr>
             <w:rStyle w:val="Hyperlink"/>
@@ -13902,7 +13902,7 @@
         </w:rPr>
         <w:t xml:space="preserve">Resolução CNAS/MDS 202/2025, Diário Oficial da União de 28/07/2025, Edição 140, Seção 1, Página 87 — </w:t>
       </w:r>
-      <w:hyperlink w:history="1" r:id="rId2bbdarveuvjt-txmwocmg">
+      <w:hyperlink w:history="1" r:id="rIdxrlvbcahpfvyftickfp44">
         <w:r>
           <w:rPr>
             <w:rStyle w:val="Hyperlink"/>
@@ -13939,7 +13939,7 @@
         </w:rPr>
         <w:t xml:space="preserve">Onde deveria estar publicado. </w:t>
       </w:r>
-      <w:hyperlink w:history="1" r:id="rIdxldop_xftbzb5trdni6mi">
+      <w:hyperlink w:history="1" r:id="rIdwyyhprs0fh1lq8ga2j89m">
         <w:r>
           <w:rPr>
             <w:rStyle w:val="Hyperlink"/>
@@ -14177,7 +14177,7 @@
         </w:rPr>
         <w:t xml:space="preserve">Sítio próprio do Conselho, sem documento posterior a dezembro de 2023 — </w:t>
       </w:r>
-      <w:hyperlink w:history="1" r:id="rIdj5jttpdkh2y10mtldjrem">
+      <w:hyperlink w:history="1" r:id="rIdupljkx3szeu3dqhl8kh3a">
         <w:r>
           <w:rPr>
             <w:rStyle w:val="Hyperlink"/>
@@ -14214,7 +14214,7 @@
         </w:rPr>
         <w:t xml:space="preserve">Onde deveria estar publicado. </w:t>
       </w:r>
-      <w:hyperlink w:history="1" r:id="rIdua5hdmf6-a1klldkfp-oq">
+      <w:hyperlink w:history="1" r:id="rIdnyc6itc0is0hqq7hrx_-y">
         <w:r>
           <w:rPr>
             <w:rStyle w:val="Hyperlink"/>
@@ -14234,7 +14234,7 @@
         </w:rPr>
         <w:t xml:space="preserve">; </w:t>
       </w:r>
-      <w:hyperlink w:history="1" r:id="rId1cqhzc-7k_wv1xxxfgkwz">
+      <w:hyperlink w:history="1" r:id="rId3io3lxcmea2jm6j0p_m9z">
         <w:r>
           <w:rPr>
             <w:rStyle w:val="Hyperlink"/>
@@ -14457,7 +14457,7 @@
         </w:rPr>
         <w:t xml:space="preserve">Acervo do Diário Oficial coletado, 161 eventos entre 2025 e 2026, com digest de cada edição — </w:t>
       </w:r>
-      <w:hyperlink w:history="1" r:id="rIdf6zvx80di7mkh9ollvh86">
+      <w:hyperlink w:history="1" r:id="rIdemtumm92lrfy5onebnzhv">
         <w:r>
           <w:rPr>
             <w:rStyle w:val="Hyperlink"/>
@@ -14494,7 +14494,7 @@
         </w:rPr>
         <w:t xml:space="preserve">Onde deveria estar publicado. </w:t>
       </w:r>
-      <w:hyperlink w:history="1" r:id="rIdikgljeq06nuxtxi0fumnq">
+      <w:hyperlink w:history="1" r:id="rIdiirmljzrnxrvvohkv3su6">
         <w:r>
           <w:rPr>
             <w:rStyle w:val="Hyperlink"/>
@@ -14514,7 +14514,7 @@
         </w:rPr>
         <w:t xml:space="preserve">; </w:t>
       </w:r>
-      <w:hyperlink w:history="1" r:id="rIdn9_pu8a6hxzx0y1rtolx5">
+      <w:hyperlink w:history="1" r:id="rIdbcu-6pzmep2i5oq3f2i1j">
         <w:r>
           <w:rPr>
             <w:rStyle w:val="Hyperlink"/>
@@ -14737,7 +14737,7 @@
         </w:rPr>
         <w:t xml:space="preserve">Resolução CNAS/MDS 202/2025, Diário Oficial da União de 28/07/2025, Edição 140, Seção 1, Página 87 — </w:t>
       </w:r>
-      <w:hyperlink w:history="1" r:id="rIdlihcnejal5tjxp2ss5b11">
+      <w:hyperlink w:history="1" r:id="rIdmev8vsrduyt3_6ozwwkly">
         <w:r>
           <w:rPr>
             <w:rStyle w:val="Hyperlink"/>
@@ -14774,7 +14774,7 @@
         </w:rPr>
         <w:t xml:space="preserve">Onde deveria estar publicado. </w:t>
       </w:r>
-      <w:hyperlink w:history="1" r:id="rIdozksmsaliesswveuesqh2">
+      <w:hyperlink w:history="1" r:id="rIdxnjj-gmqyjwxcvpnx7jas">
         <w:r>
           <w:rPr>
             <w:rStyle w:val="Hyperlink"/>
@@ -14995,7 +14995,7 @@
         </w:rPr>
         <w:t xml:space="preserve">Acervo do Diário Oficial coletado, 161 eventos entre 2025 e 2026, com digest de cada edição — </w:t>
       </w:r>
-      <w:hyperlink w:history="1" r:id="rIds3tciuthgn4luufrx_-a3">
+      <w:hyperlink w:history="1" r:id="rIdivfnpzkemfgd_-3onte3j">
         <w:r>
           <w:rPr>
             <w:rStyle w:val="Hyperlink"/>
@@ -15032,7 +15032,7 @@
         </w:rPr>
         <w:t xml:space="preserve">Onde deveria estar publicado. </w:t>
       </w:r>
-      <w:hyperlink w:history="1" r:id="rIdfnoaubuaxomxzxsfrnuyf">
+      <w:hyperlink w:history="1" r:id="rIdsldw4mvuataeki4wlu9kj">
         <w:r>
           <w:rPr>
             <w:rStyle w:val="Hyperlink"/>
@@ -15271,7 +15271,7 @@
         </w:rPr>
         <w:t xml:space="preserve">Quadro de Detalhamento de Despesas 2026, anexos da Lei Orçamentária 11.590/2026, ação 3650.0824401082.591 — </w:t>
       </w:r>
-      <w:hyperlink w:history="1" r:id="rIdbkbcnn4r93vh56lu8j4_r">
+      <w:hyperlink w:history="1" r:id="rIdpauk0c2jgd-68sehw4i23">
         <w:r>
           <w:rPr>
             <w:rStyle w:val="Hyperlink"/>
@@ -15308,7 +15308,7 @@
         </w:rPr>
         <w:t xml:space="preserve">Onde deveria estar publicado. </w:t>
       </w:r>
-      <w:hyperlink w:history="1" r:id="rIdhaekkwrbnobuexjd1cuut">
+      <w:hyperlink w:history="1" r:id="rIdwxztbb3swu2vzb_1ye0si">
         <w:r>
           <w:rPr>
             <w:rStyle w:val="Hyperlink"/>
@@ -15328,7 +15328,7 @@
         </w:rPr>
         <w:t xml:space="preserve">; </w:t>
       </w:r>
-      <w:hyperlink w:history="1" r:id="rIdh-1zgoqjxgqx4cuk3mrql">
+      <w:hyperlink w:history="1" r:id="rIdml5wqgjufok7cedqsyccx">
         <w:r>
           <w:rPr>
             <w:rStyle w:val="Hyperlink"/>
@@ -15545,7 +15545,7 @@
         </w:rPr>
         <w:t xml:space="preserve">Quadro de Detalhamento de Despesas 2026, anexos da Lei Orçamentária 11.590/2026, ação 3650.0824401082.591 — </w:t>
       </w:r>
-      <w:hyperlink w:history="1" r:id="rIdoqx57ha7-tjgjdew4epr0">
+      <w:hyperlink w:history="1" r:id="rIdhio7cm8b5iamq4qihbq1v">
         <w:r>
           <w:rPr>
             <w:rStyle w:val="Hyperlink"/>
@@ -15582,7 +15582,7 @@
         </w:rPr>
         <w:t xml:space="preserve">Onde deveria estar publicado. </w:t>
       </w:r>
-      <w:hyperlink w:history="1" r:id="rIdcirzb7jfrqsbuv60xv-wx">
+      <w:hyperlink w:history="1" r:id="rIdbcc-yap6yvswkvt9mhed5">
         <w:r>
           <w:rPr>
             <w:rStyle w:val="Hyperlink"/>
@@ -15602,7 +15602,7 @@
         </w:rPr>
         <w:t xml:space="preserve">; </w:t>
       </w:r>
-      <w:hyperlink w:history="1" r:id="rIdnxi5sgek7-j6hqpaz4nql">
+      <w:hyperlink w:history="1" r:id="rIdhfbyikbvqib9mm1il2hx0">
         <w:r>
           <w:rPr>
             <w:rStyle w:val="Hyperlink"/>
@@ -15819,7 +15819,7 @@
         </w:rPr>
         <w:t xml:space="preserve">Quadro de Detalhamento de Despesas 2026, anexos da Lei Orçamentária 11.590/2026, ação 3650.0824401082.591 — </w:t>
       </w:r>
-      <w:hyperlink w:history="1" r:id="rIdpigj49vaaq4ucpw84sjeu">
+      <w:hyperlink w:history="1" r:id="rIdft8w3byoqkzyq5dqrrajx">
         <w:r>
           <w:rPr>
             <w:rStyle w:val="Hyperlink"/>
@@ -15847,7 +15847,7 @@
         </w:rPr>
         <w:t xml:space="preserve">Lei municipal 9.009/2010 — </w:t>
       </w:r>
-      <w:hyperlink w:history="1" r:id="rIdyiskx_wdgpca1715u0r-h">
+      <w:hyperlink w:history="1" r:id="rIdzcfppbadxlrklctjcxxc8">
         <w:r>
           <w:rPr>
             <w:rStyle w:val="Hyperlink"/>
@@ -15884,7 +15884,7 @@
         </w:rPr>
         <w:t xml:space="preserve">Onde deveria estar publicado. </w:t>
       </w:r>
-      <w:hyperlink w:history="1" r:id="rIdi-i7vcnqvzypspx6segc_">
+      <w:hyperlink w:history="1" r:id="rId4p5w1si4ayvjo_g8srwzm">
         <w:r>
           <w:rPr>
             <w:rStyle w:val="Hyperlink"/>
@@ -15904,7 +15904,7 @@
         </w:rPr>
         <w:t xml:space="preserve">; </w:t>
       </w:r>
-      <w:hyperlink w:history="1" r:id="rIdptr-2ek3eqv7bmzp1hw5w">
+      <w:hyperlink w:history="1" r:id="rId2ugh9rs2chtaoq8gfqjbg">
         <w:r>
           <w:rPr>
             <w:rStyle w:val="Hyperlink"/>
@@ -16121,7 +16121,7 @@
         </w:rPr>
         <w:t xml:space="preserve">Quadro de Detalhamento de Despesas 2026, anexos da Lei Orçamentária 11.590/2026, ação 3650.0824401082.591 — </w:t>
       </w:r>
-      <w:hyperlink w:history="1" r:id="rIdn9eusmj1s-nqupg7xuwj0">
+      <w:hyperlink w:history="1" r:id="rId3uxywqpc6tkbeojiychs3">
         <w:r>
           <w:rPr>
             <w:rStyle w:val="Hyperlink"/>
@@ -16158,7 +16158,7 @@
         </w:rPr>
         <w:t xml:space="preserve">Onde deveria estar publicado. </w:t>
       </w:r>
-      <w:hyperlink w:history="1" r:id="rIdjiyiwur4hyo9vcl0ehj-f">
+      <w:hyperlink w:history="1" r:id="rIdb293f9p-ghebyas-6wy6l">
         <w:r>
           <w:rPr>
             <w:rStyle w:val="Hyperlink"/>
@@ -16392,7 +16392,7 @@
         </w:rPr>
         <w:t xml:space="preserve">Lei Orçamentária Anual 11.590/2026, anexos, Diário Oficial do Município, Edição 8697, de 09/01/2026, Edição Extra — </w:t>
       </w:r>
-      <w:hyperlink w:history="1" r:id="rIdrupnu4pykjvqxztq2i9wt">
+      <w:hyperlink w:history="1" r:id="rIdeaw-vc5fc-lpagrtydjdu">
         <w:r>
           <w:rPr>
             <w:rStyle w:val="Hyperlink"/>
@@ -16429,7 +16429,7 @@
         </w:rPr>
         <w:t xml:space="preserve">Onde deveria estar publicado. </w:t>
       </w:r>
-      <w:hyperlink w:history="1" r:id="rIdnfgiqzz2lgzhcgqekqrcp">
+      <w:hyperlink w:history="1" r:id="rIdekxdrjq8nvlwsnlexcfyc">
         <w:r>
           <w:rPr>
             <w:rStyle w:val="Hyperlink"/>
@@ -16658,7 +16658,7 @@
         </w:rPr>
         <w:t xml:space="preserve">Lei Orçamentária Anual 11.590/2026, anexos, Diário Oficial do Município, Edição 8697, de 09/01/2026, Edição Extra — </w:t>
       </w:r>
-      <w:hyperlink w:history="1" r:id="rIds3e8p9cl72oep-am4l7xs">
+      <w:hyperlink w:history="1" r:id="rIdsrmhj6uzl1mdkf3wox-ak">
         <w:r>
           <w:rPr>
             <w:rStyle w:val="Hyperlink"/>
@@ -16695,7 +16695,7 @@
         </w:rPr>
         <w:t xml:space="preserve">Onde deveria estar publicado. </w:t>
       </w:r>
-      <w:hyperlink w:history="1" r:id="rIdg2qv-rapbmkzerwpbs1kf">
+      <w:hyperlink w:history="1" r:id="rIddnjc9zwibq2rvac9fcmht">
         <w:r>
           <w:rPr>
             <w:rStyle w:val="Hyperlink"/>
@@ -16918,7 +16918,7 @@
         </w:rPr>
         <w:t xml:space="preserve">Lei Orçamentária Anual 11.590/2026, anexos, Diário Oficial do Município, Edição 8697, de 09/01/2026, Edição Extra — </w:t>
       </w:r>
-      <w:hyperlink w:history="1" r:id="rIdsjt0st5v3uaqkmx8pglhi">
+      <w:hyperlink w:history="1" r:id="rIdhkxj0hwxbdqu7wbuenu_o">
         <w:r>
           <w:rPr>
             <w:rStyle w:val="Hyperlink"/>
@@ -16946,7 +16946,7 @@
         </w:rPr>
         <w:t xml:space="preserve">Lei municipal 9.009/2010 — </w:t>
       </w:r>
-      <w:hyperlink w:history="1" r:id="rIdyehmp2kj9ffbntia5st3o">
+      <w:hyperlink w:history="1" r:id="rIdsehmhd-o79okak_giwtkb">
         <w:r>
           <w:rPr>
             <w:rStyle w:val="Hyperlink"/>
@@ -16983,7 +16983,7 @@
         </w:rPr>
         <w:t xml:space="preserve">Onde deveria estar publicado. </w:t>
       </w:r>
-      <w:hyperlink w:history="1" r:id="rIdub2nhqhzp25t2xcpqf_gn">
+      <w:hyperlink w:history="1" r:id="rIdgymdx6w7qqqwgh3h1s1is">
         <w:r>
           <w:rPr>
             <w:rStyle w:val="Hyperlink"/>
@@ -17212,7 +17212,7 @@
         </w:rPr>
         <w:t xml:space="preserve">Lei Orçamentária Anual 11.590/2026, anexos, Diário Oficial do Município, Edição 8697, de 09/01/2026, Edição Extra — </w:t>
       </w:r>
-      <w:hyperlink w:history="1" r:id="rIdq-3q_axy9zkdaeojdgjfo">
+      <w:hyperlink w:history="1" r:id="rIda65t3ebzibuax1bhrkamn">
         <w:r>
           <w:rPr>
             <w:rStyle w:val="Hyperlink"/>
@@ -17249,7 +17249,7 @@
         </w:rPr>
         <w:t xml:space="preserve">Onde deveria estar publicado. </w:t>
       </w:r>
-      <w:hyperlink w:history="1" r:id="rIdp5xig6vtuzavxmsg0oswe">
+      <w:hyperlink w:history="1" r:id="rIdx5pejimfvp5aaag4bvewe">
         <w:r>
           <w:rPr>
             <w:rStyle w:val="Hyperlink"/>
@@ -17493,7 +17493,7 @@
         </w:rPr>
         <w:t xml:space="preserve">Acervo do Diário Oficial coletado, 161 eventos entre 2025 e 2026, com digest de cada edição — </w:t>
       </w:r>
-      <w:hyperlink w:history="1" r:id="rIdz6ezvacll4iojah7iqpg5">
+      <w:hyperlink w:history="1" r:id="rIdgza_dbscqa44xqch-jim7">
         <w:r>
           <w:rPr>
             <w:rStyle w:val="Hyperlink"/>
@@ -17530,7 +17530,7 @@
         </w:rPr>
         <w:t xml:space="preserve">Onde deveria estar publicado. </w:t>
       </w:r>
-      <w:hyperlink w:history="1" r:id="rIds9hmxgrgwhh3-bx2uha7l">
+      <w:hyperlink w:history="1" r:id="rId_g2ddhzycjee11yp2lzbo">
         <w:r>
           <w:rPr>
             <w:rStyle w:val="Hyperlink"/>
@@ -17757,7 +17757,7 @@
         </w:rPr>
         <w:t xml:space="preserve">Acervo do Diário Oficial coletado, 161 eventos entre 2025 e 2026, com digest de cada edição — </w:t>
       </w:r>
-      <w:hyperlink w:history="1" r:id="rIdyh4nrz__vjqvnz9fp70dj">
+      <w:hyperlink w:history="1" r:id="rId1vpanxo2q1u4nt4io3jkb">
         <w:r>
           <w:rPr>
             <w:rStyle w:val="Hyperlink"/>
@@ -17794,7 +17794,7 @@
         </w:rPr>
         <w:t xml:space="preserve">Onde deveria estar publicado. </w:t>
       </w:r>
-      <w:hyperlink w:history="1" r:id="rIdy8za8ljdcgzlpuz1p4btr">
+      <w:hyperlink w:history="1" r:id="rIds2vvg_xnksh8itkbngw-m">
         <w:r>
           <w:rPr>
             <w:rStyle w:val="Hyperlink"/>
@@ -17814,7 +17814,7 @@
         </w:rPr>
         <w:t xml:space="preserve">; </w:t>
       </w:r>
-      <w:hyperlink w:history="1" r:id="rIdgadnoqz_t7yuf-ujkkw7v">
+      <w:hyperlink w:history="1" r:id="rIdo-heq3-ovlh7aca-1tzzv">
         <w:r>
           <w:rPr>
             <w:rStyle w:val="Hyperlink"/>
@@ -18043,7 +18043,7 @@
         </w:rPr>
         <w:t xml:space="preserve">Lei municipal 7.531/1995 — </w:t>
       </w:r>
-      <w:hyperlink w:history="1" r:id="rIdswt3tcn0a83etp8lvdngo">
+      <w:hyperlink w:history="1" r:id="rIdo7rsswnirsq7per_fxnjy">
         <w:r>
           <w:rPr>
             <w:rStyle w:val="Hyperlink"/>
@@ -18080,7 +18080,7 @@
         </w:rPr>
         <w:t xml:space="preserve">Onde deveria estar publicado. </w:t>
       </w:r>
-      <w:hyperlink w:history="1" r:id="rIdoqaaw0kwg5ufcefkm9zqo">
+      <w:hyperlink w:history="1" r:id="rIdkmrk-lldvq8vc09kki9hm">
         <w:r>
           <w:rPr>
             <w:rStyle w:val="Hyperlink"/>
@@ -18100,7 +18100,7 @@
         </w:rPr>
         <w:t xml:space="preserve">; </w:t>
       </w:r>
-      <w:hyperlink w:history="1" r:id="rIdksqj5rljwajcnqmw9_dw9">
+      <w:hyperlink w:history="1" r:id="rIdg1j1t7lbzpeeritlbqzyw">
         <w:r>
           <w:rPr>
             <w:rStyle w:val="Hyperlink"/>
@@ -18321,7 +18321,7 @@
         </w:rPr>
         <w:t xml:space="preserve">Acervo do Diário Oficial coletado, 161 eventos entre 2025 e 2026, com digest de cada edição — </w:t>
       </w:r>
-      <w:hyperlink w:history="1" r:id="rIdlibo2cjxvukqhh3gunzip">
+      <w:hyperlink w:history="1" r:id="rIdikv6nzmh7oi2pxbfmatqe">
         <w:r>
           <w:rPr>
             <w:rStyle w:val="Hyperlink"/>
@@ -18358,7 +18358,7 @@
         </w:rPr>
         <w:t xml:space="preserve">Onde deveria estar publicado. </w:t>
       </w:r>
-      <w:hyperlink w:history="1" r:id="rIdsbelviav2frp_-gbfvklr">
+      <w:hyperlink w:history="1" r:id="rIduhspuxhutwu9vbrzyyq_r">
         <w:r>
           <w:rPr>
             <w:rStyle w:val="Hyperlink"/>
@@ -18579,7 +18579,7 @@
         </w:rPr>
         <w:t xml:space="preserve">Acervo do Diário Oficial coletado, 161 eventos entre 2025 e 2026, com digest de cada edição — </w:t>
       </w:r>
-      <w:hyperlink w:history="1" r:id="rIdtlrcuspmleglctdlmdkro">
+      <w:hyperlink w:history="1" r:id="rIda8fngmqk5mzwldghbioud">
         <w:r>
           <w:rPr>
             <w:rStyle w:val="Hyperlink"/>
@@ -18616,7 +18616,7 @@
         </w:rPr>
         <w:t xml:space="preserve">Onde deveria estar publicado. </w:t>
       </w:r>
-      <w:hyperlink w:history="1" r:id="rId2m5oi2ynckg9h_mmmfl5u">
+      <w:hyperlink w:history="1" r:id="rIdn_litjxdk6s2yzp782qax">
         <w:r>
           <w:rPr>
             <w:rStyle w:val="Hyperlink"/>
@@ -18856,7 +18856,7 @@
         </w:rPr>
         <w:t xml:space="preserve">Acervo do Diário Oficial coletado, 161 eventos entre 2025 e 2026, com digest de cada edição — </w:t>
       </w:r>
-      <w:hyperlink w:history="1" r:id="rIdvwp_gnntjoudwp9ojl7js">
+      <w:hyperlink w:history="1" r:id="rIdxjkvrphdrhevyj6obdvii">
         <w:r>
           <w:rPr>
             <w:rStyle w:val="Hyperlink"/>
@@ -18893,7 +18893,7 @@
         </w:rPr>
         <w:t xml:space="preserve">Onde deveria estar publicado. </w:t>
       </w:r>
-      <w:hyperlink w:history="1" r:id="rIdxjn0tj8paw2nfknwasea2">
+      <w:hyperlink w:history="1" r:id="rIderdz-x8mimtatgnj42qtb">
         <w:r>
           <w:rPr>
             <w:rStyle w:val="Hyperlink"/>
@@ -19114,7 +19114,7 @@
         </w:rPr>
         <w:t xml:space="preserve">Acervo do Diário Oficial coletado, 161 eventos entre 2025 e 2026, com digest de cada edição — </w:t>
       </w:r>
-      <w:hyperlink w:history="1" r:id="rIdtygpzhl83l_swi2cdaupy">
+      <w:hyperlink w:history="1" r:id="rIdvqeh4xh_jrrzkp3furjcl">
         <w:r>
           <w:rPr>
             <w:rStyle w:val="Hyperlink"/>
@@ -19151,7 +19151,7 @@
         </w:rPr>
         <w:t xml:space="preserve">Onde deveria estar publicado. </w:t>
       </w:r>
-      <w:hyperlink w:history="1" r:id="rIdangudgn8qjuxtlrhuixxf">
+      <w:hyperlink w:history="1" r:id="rIdoln9efloosi3pl_wo52tq">
         <w:r>
           <w:rPr>
             <w:rStyle w:val="Hyperlink"/>
@@ -19390,7 +19390,7 @@
         </w:rPr>
         <w:t xml:space="preserve">Quadro de Detalhamento de Despesas 2026, anexos da Lei Orçamentária 11.590/2026, ação 3650.0824401082.591 — </w:t>
       </w:r>
-      <w:hyperlink w:history="1" r:id="rId1fk4l-wvw-i3cxo_bgsei">
+      <w:hyperlink w:history="1" r:id="rIdhy0qavnz48-k2j06oq1t3">
         <w:r>
           <w:rPr>
             <w:rStyle w:val="Hyperlink"/>
@@ -19427,7 +19427,7 @@
         </w:rPr>
         <w:t xml:space="preserve">Onde deveria estar publicado. </w:t>
       </w:r>
-      <w:hyperlink w:history="1" r:id="rIdbtyfwehwng2x19apw8quu">
+      <w:hyperlink w:history="1" r:id="rIdnd0b9m-fbnb3tjymasesm">
         <w:r>
           <w:rPr>
             <w:rStyle w:val="Hyperlink"/>
@@ -19644,7 +19644,7 @@
         </w:rPr>
         <w:t xml:space="preserve">Lei de Diretrizes Orçamentárias 11.589/2026, Anexo III, Metas e Prioridades, setor de políticas para mulher, direitos humanos e assistência social — </w:t>
       </w:r>
-      <w:hyperlink w:history="1" r:id="rIdqxpavajss-rzj9g89ta2f">
+      <w:hyperlink w:history="1" r:id="rIdvmjwtc5ejrdfqdibhmd3v">
         <w:r>
           <w:rPr>
             <w:rStyle w:val="Hyperlink"/>
@@ -19681,7 +19681,7 @@
         </w:rPr>
         <w:t xml:space="preserve">Onde deveria estar publicado. </w:t>
       </w:r>
-      <w:hyperlink w:history="1" r:id="rId-jywpitmbkyvet54fv5qf">
+      <w:hyperlink w:history="1" r:id="rIdf5r8fb-xngqgge1zl4ihq">
         <w:r>
           <w:rPr>
             <w:rStyle w:val="Hyperlink"/>
@@ -19915,7 +19915,7 @@
         </w:rPr>
         <w:t xml:space="preserve">Lei Orçamentária Anual 11.590/2026, anexos, Diário Oficial do Município, Edição 8697, de 09/01/2026, Edição Extra — </w:t>
       </w:r>
-      <w:hyperlink w:history="1" r:id="rIdzx4sx775yf1adnlvhfmvd">
+      <w:hyperlink w:history="1" r:id="rIdgjrlkir8xg-tbqry8z1xu">
         <w:r>
           <w:rPr>
             <w:rStyle w:val="Hyperlink"/>
@@ -19943,7 +19943,7 @@
         </w:rPr>
         <w:t xml:space="preserve">Acervo do Diário Oficial coletado, 161 eventos entre 2025 e 2026, com digest de cada edição — </w:t>
       </w:r>
-      <w:hyperlink w:history="1" r:id="rIdgnj0ery212ucvgqa78gip">
+      <w:hyperlink w:history="1" r:id="rIdfn1nci2rh46d0wynbm7mt">
         <w:r>
           <w:rPr>
             <w:rStyle w:val="Hyperlink"/>
@@ -19980,7 +19980,7 @@
         </w:rPr>
         <w:t xml:space="preserve">Onde deveria estar publicado. </w:t>
       </w:r>
-      <w:hyperlink w:history="1" r:id="rIdv65xromt2lhxlsgizetu-">
+      <w:hyperlink w:history="1" r:id="rIdlstb0akeefd032vuxxsvg">
         <w:r>
           <w:rPr>
             <w:rStyle w:val="Hyperlink"/>
@@ -20224,7 +20224,7 @@
         </w:rPr>
         <w:t xml:space="preserve">Acervo do Diário Oficial coletado, 161 eventos entre 2025 e 2026, com digest de cada edição — </w:t>
       </w:r>
-      <w:hyperlink w:history="1" r:id="rIdagtcaf7lvuwmpjfc4cqra">
+      <w:hyperlink w:history="1" r:id="rIdho9cptwwkqhnd2fh5su3o">
         <w:r>
           <w:rPr>
             <w:rStyle w:val="Hyperlink"/>
@@ -20261,7 +20261,7 @@
         </w:rPr>
         <w:t xml:space="preserve">Onde deveria estar publicado. </w:t>
       </w:r>
-      <w:hyperlink w:history="1" r:id="rIdnmzdxftcglj-bwyl4kfxe">
+      <w:hyperlink w:history="1" r:id="rIdtuqgbzmhxlvgud4kyt8xa">
         <w:r>
           <w:rPr>
             <w:rStyle w:val="Hyperlink"/>
@@ -20499,7 +20499,7 @@
         </w:rPr>
         <w:t xml:space="preserve">Acervo do Diário Oficial coletado, 161 eventos entre 2025 e 2026, com digest de cada edição — </w:t>
       </w:r>
-      <w:hyperlink w:history="1" r:id="rId45zeqixfu8plde6vjnga3">
+      <w:hyperlink w:history="1" r:id="rIdqry_kzhgu7vav6slgjps5">
         <w:r>
           <w:rPr>
             <w:rStyle w:val="Hyperlink"/>
@@ -20536,7 +20536,7 @@
         </w:rPr>
         <w:t xml:space="preserve">Onde deveria estar publicado. </w:t>
       </w:r>
-      <w:hyperlink w:history="1" r:id="rIdsx1ixjqudjnblfvxqre_g">
+      <w:hyperlink w:history="1" r:id="rIddxzkeeuz8f2hqct_4fpwm">
         <w:r>
           <w:rPr>
             <w:rStyle w:val="Hyperlink"/>
@@ -20737,7 +20737,7 @@
         </w:rPr>
         <w:t xml:space="preserve"> Canal: </w:t>
       </w:r>
-      <w:hyperlink w:history="1" r:id="rIdcfdtv3wa_bww1eaqtimb0">
+      <w:hyperlink w:history="1" r:id="rIdqstt_de6o9fix0vx8bcik">
         <w:r>
           <w:rPr>
             <w:rStyle w:val="Hyperlink"/>
@@ -20803,7 +20803,7 @@
         </w:rPr>
         <w:t xml:space="preserve"> Canal: </w:t>
       </w:r>
-      <w:hyperlink w:history="1" r:id="rIdlguvwcalqtcn6lsyxz_ee">
+      <w:hyperlink w:history="1" r:id="rIdncmcqax0uryngodqkagln">
         <w:r>
           <w:rPr>
             <w:rStyle w:val="Hyperlink"/>
@@ -20907,7 +20907,7 @@
         </w:rPr>
         <w:t xml:space="preserve"> Canal: </w:t>
       </w:r>
-      <w:hyperlink w:history="1" r:id="rIdqvoyzseghzfgukjjhtyq4">
+      <w:hyperlink w:history="1" r:id="rIdpgoc_a9n-82tsk0hub2jl">
         <w:r>
           <w:rPr>
             <w:rStyle w:val="Hyperlink"/>

</xml_diff>

<commit_message>
handoff: endereco do repositorio atualizado apos renomeacao
</commit_message>
<xml_diff>
--- a/relatorios/Parecer_Fiscalizacao_2026.docx
+++ b/relatorios/Parecer_Fiscalizacao_2026.docx
@@ -291,7 +291,7 @@
         </w:rPr>
         <w:t xml:space="preserve">. Documento consultado em: </w:t>
       </w:r>
-      <w:hyperlink w:history="1" r:id="rIdv4rkaencljietjux0_qeh">
+      <w:hyperlink w:history="1" r:id="rIduvx0hcymcz-comodiv_vs">
         <w:r>
           <w:rPr>
             <w:rStyle w:val="Hyperlink"/>
@@ -2210,7 +2210,7 @@
         </w:rPr>
         <w:t xml:space="preserve">Deveria estar em: </w:t>
       </w:r>
-      <w:hyperlink w:history="1" r:id="rId0y8jb97yrtfu6mpqcjnq3">
+      <w:hyperlink w:history="1" r:id="rIdoygbaijje7mngr1uqugqe">
         <w:r>
           <w:rPr>
             <w:rStyle w:val="Hyperlink"/>
@@ -2284,7 +2284,7 @@
         </w:rPr>
         <w:t xml:space="preserve">Deveria estar em: </w:t>
       </w:r>
-      <w:hyperlink w:history="1" r:id="rIdt4rabro5a1ximf2ee7kvp">
+      <w:hyperlink w:history="1" r:id="rIdjii2mariw14p2nnn26led">
         <w:r>
           <w:rPr>
             <w:rStyle w:val="Hyperlink"/>
@@ -2358,7 +2358,7 @@
         </w:rPr>
         <w:t xml:space="preserve">Deveria estar em: </w:t>
       </w:r>
-      <w:hyperlink w:history="1" r:id="rIdsvctf77nln9yjn3fkfu6a">
+      <w:hyperlink w:history="1" r:id="rIdvd1xwqhwdd4yjbfs_e8q3">
         <w:r>
           <w:rPr>
             <w:rStyle w:val="Hyperlink"/>
@@ -2432,7 +2432,7 @@
         </w:rPr>
         <w:t xml:space="preserve">Deveria estar em: </w:t>
       </w:r>
-      <w:hyperlink w:history="1" r:id="rIdwrjoj1z6tosc_w5yzq0aj">
+      <w:hyperlink w:history="1" r:id="rIdzeysjr_tggzgzcxy6touc">
         <w:r>
           <w:rPr>
             <w:rStyle w:val="Hyperlink"/>
@@ -2506,7 +2506,7 @@
         </w:rPr>
         <w:t xml:space="preserve">Deveria estar em: </w:t>
       </w:r>
-      <w:hyperlink w:history="1" r:id="rId7tso7q_-hr3qk3zninhxp">
+      <w:hyperlink w:history="1" r:id="rIdpejpwn3swsbbu9l0baivz">
         <w:r>
           <w:rPr>
             <w:rStyle w:val="Hyperlink"/>
@@ -2580,7 +2580,7 @@
         </w:rPr>
         <w:t xml:space="preserve">Deveria estar em: </w:t>
       </w:r>
-      <w:hyperlink w:history="1" r:id="rIdzsrvuo9ugtsivtnoaph89">
+      <w:hyperlink w:history="1" r:id="rId2vxuo7jivop45tfv8xatb">
         <w:r>
           <w:rPr>
             <w:rStyle w:val="Hyperlink"/>
@@ -4900,7 +4900,7 @@
         </w:rPr>
         <w:t xml:space="preserve">A versão interativa desta trilha, com o detalhe de cada contrato, está em </w:t>
       </w:r>
-      <w:hyperlink w:history="1" r:id="rIduwmtroafpznztjv9vcna6">
+      <w:hyperlink w:history="1" r:id="rIdqst5gz5puvyb5nwsoxhuj">
         <w:r>
           <w:rPr>
             <w:rStyle w:val="Hyperlink"/>
@@ -5817,7 +5817,7 @@
         </w:rPr>
         <w:t xml:space="preserve">A versão didática desta trilha, feita para leitura por quem não é da área, está em </w:t>
       </w:r>
-      <w:hyperlink w:history="1" r:id="rIdnbrdsphgcsaomhm8q7id5">
+      <w:hyperlink w:history="1" r:id="rIdurmrfkxas5xl3feuqmjgr">
         <w:r>
           <w:rPr>
             <w:rStyle w:val="Hyperlink"/>
@@ -11730,7 +11730,7 @@
         </w:rPr>
         <w:t xml:space="preserve">Diário Oficial do Município, Edição 8830, última edição publicada, 29/07/2026 — </w:t>
       </w:r>
-      <w:hyperlink w:history="1" r:id="rIdlvixqtfbp-_diukvsoglq">
+      <w:hyperlink w:history="1" r:id="rIdhk1jwyk7lxpmesa1ya4zf">
         <w:r>
           <w:rPr>
             <w:rStyle w:val="Hyperlink"/>
@@ -11758,7 +11758,7 @@
         </w:rPr>
         <w:t xml:space="preserve">Acervo do Diário Oficial coletado, 161 eventos entre 2025 e 2026, com digest de cada edição — </w:t>
       </w:r>
-      <w:hyperlink w:history="1" r:id="rIdtw7xyfvgwjyusmod6add6">
+      <w:hyperlink w:history="1" r:id="rIdusxqss9fwlcqlhrgp5c50">
         <w:r>
           <w:rPr>
             <w:rStyle w:val="Hyperlink"/>
@@ -11795,7 +11795,7 @@
         </w:rPr>
         <w:t xml:space="preserve">Onde deveria estar publicado. </w:t>
       </w:r>
-      <w:hyperlink w:history="1" r:id="rIdspm6hstyboay1ioagmxh2">
+      <w:hyperlink w:history="1" r:id="rIde-6ude9lfu62oq5nshzc1">
         <w:r>
           <w:rPr>
             <w:rStyle w:val="Hyperlink"/>
@@ -12022,7 +12022,7 @@
         </w:rPr>
         <w:t xml:space="preserve">Acervo do Diário Oficial coletado, 161 eventos entre 2025 e 2026, com digest de cada edição — </w:t>
       </w:r>
-      <w:hyperlink w:history="1" r:id="rIdi092ytwhdnnki7lx_wbch">
+      <w:hyperlink w:history="1" r:id="rId4d-tpvxxdutntkl_eea2n">
         <w:r>
           <w:rPr>
             <w:rStyle w:val="Hyperlink"/>
@@ -12050,7 +12050,7 @@
         </w:rPr>
         <w:t xml:space="preserve">Sítio próprio do Conselho, sem documento posterior a dezembro de 2023 — </w:t>
       </w:r>
-      <w:hyperlink w:history="1" r:id="rIda67wwd3mpiqdsfi9acelo">
+      <w:hyperlink w:history="1" r:id="rId6rem0__-ahdtafb4rpdln">
         <w:r>
           <w:rPr>
             <w:rStyle w:val="Hyperlink"/>
@@ -12087,7 +12087,7 @@
         </w:rPr>
         <w:t xml:space="preserve">Onde deveria estar publicado. </w:t>
       </w:r>
-      <w:hyperlink w:history="1" r:id="rIdh-nxpih_cs1qdamjjqxeu">
+      <w:hyperlink w:history="1" r:id="rId4_8ikt3xi0ygrjxuvhzjv">
         <w:r>
           <w:rPr>
             <w:rStyle w:val="Hyperlink"/>
@@ -12107,7 +12107,7 @@
         </w:rPr>
         <w:t xml:space="preserve">; </w:t>
       </w:r>
-      <w:hyperlink w:history="1" r:id="rIdbxma958tocjtklbib4tl8">
+      <w:hyperlink w:history="1" r:id="rIdmf1o3xm7n9civwdfpt6wr">
         <w:r>
           <w:rPr>
             <w:rStyle w:val="Hyperlink"/>
@@ -12346,7 +12346,7 @@
         </w:rPr>
         <w:t xml:space="preserve">Quadro de Detalhamento de Despesas 2026, anexos da Lei Orçamentária 11.590/2026, ação 3650.0824401082.591 — </w:t>
       </w:r>
-      <w:hyperlink w:history="1" r:id="rIdxepgot0jhjz_pbhpefhdi">
+      <w:hyperlink w:history="1" r:id="rId9gpz1gv-za5cgcck-dmwi">
         <w:r>
           <w:rPr>
             <w:rStyle w:val="Hyperlink"/>
@@ -12374,7 +12374,7 @@
         </w:rPr>
         <w:t xml:space="preserve">Resolução CNAS/MDS 202/2025, Diário Oficial da União de 28/07/2025, Edição 140, Seção 1, Página 87 — </w:t>
       </w:r>
-      <w:hyperlink w:history="1" r:id="rId3fp6dtnvn9mmmdjtniy4b">
+      <w:hyperlink w:history="1" r:id="rIdp3spavqrq6kxfwc8qwgoi">
         <w:r>
           <w:rPr>
             <w:rStyle w:val="Hyperlink"/>
@@ -12411,7 +12411,7 @@
         </w:rPr>
         <w:t xml:space="preserve">Onde deveria estar publicado. </w:t>
       </w:r>
-      <w:hyperlink w:history="1" r:id="rId7zxnloeixnpmfxn0xblmg">
+      <w:hyperlink w:history="1" r:id="rIdork0f6z3kjutwx9fwg79t">
         <w:r>
           <w:rPr>
             <w:rStyle w:val="Hyperlink"/>
@@ -12431,7 +12431,7 @@
         </w:rPr>
         <w:t xml:space="preserve">; </w:t>
       </w:r>
-      <w:hyperlink w:history="1" r:id="rIdskcllr05rc4lt-xhvmpu9">
+      <w:hyperlink w:history="1" r:id="rIdbxnjw6fhfpwjvucwom59o">
         <w:r>
           <w:rPr>
             <w:rStyle w:val="Hyperlink"/>
@@ -12665,7 +12665,7 @@
         </w:rPr>
         <w:t xml:space="preserve">Lei Orçamentária Anual 11.590/2026, anexos, Diário Oficial do Município, Edição 8697, de 09/01/2026, Edição Extra — </w:t>
       </w:r>
-      <w:hyperlink w:history="1" r:id="rIdleytfjs69hezrmzc_yutm">
+      <w:hyperlink w:history="1" r:id="rIdj0pf8kpygfcopfkzdkvzu">
         <w:r>
           <w:rPr>
             <w:rStyle w:val="Hyperlink"/>
@@ -12693,7 +12693,7 @@
         </w:rPr>
         <w:t xml:space="preserve">Lei Orçamentária Anual 11.315/2025, anexos, Diário Oficial do Município, de 07/01/2025 — </w:t>
       </w:r>
-      <w:hyperlink w:history="1" r:id="rIdiog93lh5ua0vewxsyamhc">
+      <w:hyperlink w:history="1" r:id="rIdkot8_8thqrzzsonu1ahw4">
         <w:r>
           <w:rPr>
             <w:rStyle w:val="Hyperlink"/>
@@ -12730,7 +12730,7 @@
         </w:rPr>
         <w:t xml:space="preserve">Onde deveria estar publicado. </w:t>
       </w:r>
-      <w:hyperlink w:history="1" r:id="rIdpukbsgrby54qj5f06o39-">
+      <w:hyperlink w:history="1" r:id="rIdmubdwpods0stxcfxhaga7">
         <w:r>
           <w:rPr>
             <w:rStyle w:val="Hyperlink"/>
@@ -12750,7 +12750,7 @@
         </w:rPr>
         <w:t xml:space="preserve">; </w:t>
       </w:r>
-      <w:hyperlink w:history="1" r:id="rIdq8k9dzsulaxxnrmrcdi5u">
+      <w:hyperlink w:history="1" r:id="rIdhy7zcndopjqtreqtvniza">
         <w:r>
           <w:rPr>
             <w:rStyle w:val="Hyperlink"/>
@@ -12979,7 +12979,7 @@
         </w:rPr>
         <w:t xml:space="preserve">Acervo do Diário Oficial coletado, 161 eventos entre 2025 e 2026, com digest de cada edição — </w:t>
       </w:r>
-      <w:hyperlink w:history="1" r:id="rId2dnbkcyqgiq_vj4yjuz4s">
+      <w:hyperlink w:history="1" r:id="rId5ohh2m81xkzfol9hhejgs">
         <w:r>
           <w:rPr>
             <w:rStyle w:val="Hyperlink"/>
@@ -13016,7 +13016,7 @@
         </w:rPr>
         <w:t xml:space="preserve">Onde deveria estar publicado. </w:t>
       </w:r>
-      <w:hyperlink w:history="1" r:id="rIdo0gvbswpivel9yciebfvu">
+      <w:hyperlink w:history="1" r:id="rId2dxhrqxepzfx3y0utf725">
         <w:r>
           <w:rPr>
             <w:rStyle w:val="Hyperlink"/>
@@ -13251,7 +13251,7 @@
         </w:rPr>
         <w:t xml:space="preserve">Lei Orçamentária Anual 11.590/2026, anexos, Diário Oficial do Município, Edição 8697, de 09/01/2026, Edição Extra — </w:t>
       </w:r>
-      <w:hyperlink w:history="1" r:id="rIdam2rvjvf4kkk8rokaq8ez">
+      <w:hyperlink w:history="1" r:id="rId7stj8hmis62fgc0ac4j7p">
         <w:r>
           <w:rPr>
             <w:rStyle w:val="Hyperlink"/>
@@ -13279,7 +13279,7 @@
         </w:rPr>
         <w:t xml:space="preserve">Lei municipal 7.531/1995 — </w:t>
       </w:r>
-      <w:hyperlink w:history="1" r:id="rIdlkhzbn6mz7mqiy5kcin_z">
+      <w:hyperlink w:history="1" r:id="rIdsy893rjznap1yptodavk3">
         <w:r>
           <w:rPr>
             <w:rStyle w:val="Hyperlink"/>
@@ -13316,7 +13316,7 @@
         </w:rPr>
         <w:t xml:space="preserve">Onde deveria estar publicado. </w:t>
       </w:r>
-      <w:hyperlink w:history="1" r:id="rIdukujhmp1p5lhk8q3lfn5q">
+      <w:hyperlink w:history="1" r:id="rIduf5vnbl0-3vq60oeenr3r">
         <w:r>
           <w:rPr>
             <w:rStyle w:val="Hyperlink"/>
@@ -13336,7 +13336,7 @@
         </w:rPr>
         <w:t xml:space="preserve">; </w:t>
       </w:r>
-      <w:hyperlink w:history="1" r:id="rIdolhhzyu2cj00vloere6u7">
+      <w:hyperlink w:history="1" r:id="rIdopurf1ibtnskxkbdrjjdy">
         <w:r>
           <w:rPr>
             <w:rStyle w:val="Hyperlink"/>
@@ -13565,7 +13565,7 @@
         </w:rPr>
         <w:t xml:space="preserve">Lei Orçamentária Anual 11.590/2026, anexos, Diário Oficial do Município, Edição 8697, de 09/01/2026, Edição Extra — </w:t>
       </w:r>
-      <w:hyperlink w:history="1" r:id="rIdxjd_krbk3xflkarnplv1w">
+      <w:hyperlink w:history="1" r:id="rIdxcxdjlhhf_3afp7hr8ndn">
         <w:r>
           <w:rPr>
             <w:rStyle w:val="Hyperlink"/>
@@ -13593,7 +13593,7 @@
         </w:rPr>
         <w:t xml:space="preserve">Resolução CNAS/MDS 202/2025, Diário Oficial da União de 28/07/2025, Edição 140, Seção 1, Página 87 — </w:t>
       </w:r>
-      <w:hyperlink w:history="1" r:id="rIdjrq2cajvrpueuobgg-y_2">
+      <w:hyperlink w:history="1" r:id="rIdtbg5l0u0cfq-qcgmdledx">
         <w:r>
           <w:rPr>
             <w:rStyle w:val="Hyperlink"/>
@@ -13630,7 +13630,7 @@
         </w:rPr>
         <w:t xml:space="preserve">Onde deveria estar publicado. </w:t>
       </w:r>
-      <w:hyperlink w:history="1" r:id="rIduwatgjulu9zjv2tkdwtsr">
+      <w:hyperlink w:history="1" r:id="rIdrh2alfiholrwgv73p4xle">
         <w:r>
           <w:rPr>
             <w:rStyle w:val="Hyperlink"/>
@@ -13650,7 +13650,7 @@
         </w:rPr>
         <w:t xml:space="preserve">; </w:t>
       </w:r>
-      <w:hyperlink w:history="1" r:id="rIdq6supznzzn8lcb8apaqte">
+      <w:hyperlink w:history="1" r:id="rIda7ot2orjeez38zht5xqg7">
         <w:r>
           <w:rPr>
             <w:rStyle w:val="Hyperlink"/>
@@ -13902,7 +13902,7 @@
         </w:rPr>
         <w:t xml:space="preserve">Resolução CNAS/MDS 202/2025, Diário Oficial da União de 28/07/2025, Edição 140, Seção 1, Página 87 — </w:t>
       </w:r>
-      <w:hyperlink w:history="1" r:id="rIdxrlvbcahpfvyftickfp44">
+      <w:hyperlink w:history="1" r:id="rIdyuwf4osdiyafalvvr36wi">
         <w:r>
           <w:rPr>
             <w:rStyle w:val="Hyperlink"/>
@@ -13939,7 +13939,7 @@
         </w:rPr>
         <w:t xml:space="preserve">Onde deveria estar publicado. </w:t>
       </w:r>
-      <w:hyperlink w:history="1" r:id="rIdwyyhprs0fh1lq8ga2j89m">
+      <w:hyperlink w:history="1" r:id="rIdr3ojrlmp5zu50zlsykkzr">
         <w:r>
           <w:rPr>
             <w:rStyle w:val="Hyperlink"/>
@@ -14177,7 +14177,7 @@
         </w:rPr>
         <w:t xml:space="preserve">Sítio próprio do Conselho, sem documento posterior a dezembro de 2023 — </w:t>
       </w:r>
-      <w:hyperlink w:history="1" r:id="rIdupljkx3szeu3dqhl8kh3a">
+      <w:hyperlink w:history="1" r:id="rId5j88hgyb5raqls7je1-cl">
         <w:r>
           <w:rPr>
             <w:rStyle w:val="Hyperlink"/>
@@ -14214,7 +14214,7 @@
         </w:rPr>
         <w:t xml:space="preserve">Onde deveria estar publicado. </w:t>
       </w:r>
-      <w:hyperlink w:history="1" r:id="rIdnyc6itc0is0hqq7hrx_-y">
+      <w:hyperlink w:history="1" r:id="rIdu_uvciex_0z0ajcog99xz">
         <w:r>
           <w:rPr>
             <w:rStyle w:val="Hyperlink"/>
@@ -14234,7 +14234,7 @@
         </w:rPr>
         <w:t xml:space="preserve">; </w:t>
       </w:r>
-      <w:hyperlink w:history="1" r:id="rId3io3lxcmea2jm6j0p_m9z">
+      <w:hyperlink w:history="1" r:id="rIdnhvjw4ofmzsi69d3pfwwh">
         <w:r>
           <w:rPr>
             <w:rStyle w:val="Hyperlink"/>
@@ -14457,7 +14457,7 @@
         </w:rPr>
         <w:t xml:space="preserve">Acervo do Diário Oficial coletado, 161 eventos entre 2025 e 2026, com digest de cada edição — </w:t>
       </w:r>
-      <w:hyperlink w:history="1" r:id="rIdemtumm92lrfy5onebnzhv">
+      <w:hyperlink w:history="1" r:id="rId3moqgrbfuctsrxrac9pgs">
         <w:r>
           <w:rPr>
             <w:rStyle w:val="Hyperlink"/>
@@ -14494,7 +14494,7 @@
         </w:rPr>
         <w:t xml:space="preserve">Onde deveria estar publicado. </w:t>
       </w:r>
-      <w:hyperlink w:history="1" r:id="rIdiirmljzrnxrvvohkv3su6">
+      <w:hyperlink w:history="1" r:id="rIddwxbtl3yzvxuy4luvkq0j">
         <w:r>
           <w:rPr>
             <w:rStyle w:val="Hyperlink"/>
@@ -14514,7 +14514,7 @@
         </w:rPr>
         <w:t xml:space="preserve">; </w:t>
       </w:r>
-      <w:hyperlink w:history="1" r:id="rIdbcu-6pzmep2i5oq3f2i1j">
+      <w:hyperlink w:history="1" r:id="rIdubyzkbc5t1u_anaj98swg">
         <w:r>
           <w:rPr>
             <w:rStyle w:val="Hyperlink"/>
@@ -14737,7 +14737,7 @@
         </w:rPr>
         <w:t xml:space="preserve">Resolução CNAS/MDS 202/2025, Diário Oficial da União de 28/07/2025, Edição 140, Seção 1, Página 87 — </w:t>
       </w:r>
-      <w:hyperlink w:history="1" r:id="rIdmev8vsrduyt3_6ozwwkly">
+      <w:hyperlink w:history="1" r:id="rId6cvatibfmjxhxurgasfww">
         <w:r>
           <w:rPr>
             <w:rStyle w:val="Hyperlink"/>
@@ -14774,7 +14774,7 @@
         </w:rPr>
         <w:t xml:space="preserve">Onde deveria estar publicado. </w:t>
       </w:r>
-      <w:hyperlink w:history="1" r:id="rIdxnjj-gmqyjwxcvpnx7jas">
+      <w:hyperlink w:history="1" r:id="rIdgpgm3bbdtyhb3w7o5yg1n">
         <w:r>
           <w:rPr>
             <w:rStyle w:val="Hyperlink"/>
@@ -14995,7 +14995,7 @@
         </w:rPr>
         <w:t xml:space="preserve">Acervo do Diário Oficial coletado, 161 eventos entre 2025 e 2026, com digest de cada edição — </w:t>
       </w:r>
-      <w:hyperlink w:history="1" r:id="rIdivfnpzkemfgd_-3onte3j">
+      <w:hyperlink w:history="1" r:id="rIdbhmpab2f-khkqhz0zdpy2">
         <w:r>
           <w:rPr>
             <w:rStyle w:val="Hyperlink"/>
@@ -15032,7 +15032,7 @@
         </w:rPr>
         <w:t xml:space="preserve">Onde deveria estar publicado. </w:t>
       </w:r>
-      <w:hyperlink w:history="1" r:id="rIdsldw4mvuataeki4wlu9kj">
+      <w:hyperlink w:history="1" r:id="rIdl2kxvuiujxg5dk4osldos">
         <w:r>
           <w:rPr>
             <w:rStyle w:val="Hyperlink"/>
@@ -15271,7 +15271,7 @@
         </w:rPr>
         <w:t xml:space="preserve">Quadro de Detalhamento de Despesas 2026, anexos da Lei Orçamentária 11.590/2026, ação 3650.0824401082.591 — </w:t>
       </w:r>
-      <w:hyperlink w:history="1" r:id="rIdpauk0c2jgd-68sehw4i23">
+      <w:hyperlink w:history="1" r:id="rIdrkeyz1kpdbnkzseugiio4">
         <w:r>
           <w:rPr>
             <w:rStyle w:val="Hyperlink"/>
@@ -15308,7 +15308,7 @@
         </w:rPr>
         <w:t xml:space="preserve">Onde deveria estar publicado. </w:t>
       </w:r>
-      <w:hyperlink w:history="1" r:id="rIdwxztbb3swu2vzb_1ye0si">
+      <w:hyperlink w:history="1" r:id="rId5lmfjkam3yrfqotgmgc3m">
         <w:r>
           <w:rPr>
             <w:rStyle w:val="Hyperlink"/>
@@ -15328,7 +15328,7 @@
         </w:rPr>
         <w:t xml:space="preserve">; </w:t>
       </w:r>
-      <w:hyperlink w:history="1" r:id="rIdml5wqgjufok7cedqsyccx">
+      <w:hyperlink w:history="1" r:id="rIdm3mqpnmxeazmokutavi-0">
         <w:r>
           <w:rPr>
             <w:rStyle w:val="Hyperlink"/>
@@ -15545,7 +15545,7 @@
         </w:rPr>
         <w:t xml:space="preserve">Quadro de Detalhamento de Despesas 2026, anexos da Lei Orçamentária 11.590/2026, ação 3650.0824401082.591 — </w:t>
       </w:r>
-      <w:hyperlink w:history="1" r:id="rIdhio7cm8b5iamq4qihbq1v">
+      <w:hyperlink w:history="1" r:id="rIdd3uszn_-h0_vsqz8ymhnl">
         <w:r>
           <w:rPr>
             <w:rStyle w:val="Hyperlink"/>
@@ -15582,7 +15582,7 @@
         </w:rPr>
         <w:t xml:space="preserve">Onde deveria estar publicado. </w:t>
       </w:r>
-      <w:hyperlink w:history="1" r:id="rIdbcc-yap6yvswkvt9mhed5">
+      <w:hyperlink w:history="1" r:id="rIdtdf7hehw0ds_obrb4efqt">
         <w:r>
           <w:rPr>
             <w:rStyle w:val="Hyperlink"/>
@@ -15602,7 +15602,7 @@
         </w:rPr>
         <w:t xml:space="preserve">; </w:t>
       </w:r>
-      <w:hyperlink w:history="1" r:id="rIdhfbyikbvqib9mm1il2hx0">
+      <w:hyperlink w:history="1" r:id="rIdnruffrt9w5p_lt4zc-c1b">
         <w:r>
           <w:rPr>
             <w:rStyle w:val="Hyperlink"/>
@@ -15819,7 +15819,7 @@
         </w:rPr>
         <w:t xml:space="preserve">Quadro de Detalhamento de Despesas 2026, anexos da Lei Orçamentária 11.590/2026, ação 3650.0824401082.591 — </w:t>
       </w:r>
-      <w:hyperlink w:history="1" r:id="rIdft8w3byoqkzyq5dqrrajx">
+      <w:hyperlink w:history="1" r:id="rIdgewzs2qycw5akreecxeb9">
         <w:r>
           <w:rPr>
             <w:rStyle w:val="Hyperlink"/>
@@ -15847,7 +15847,7 @@
         </w:rPr>
         <w:t xml:space="preserve">Lei municipal 9.009/2010 — </w:t>
       </w:r>
-      <w:hyperlink w:history="1" r:id="rIdzcfppbadxlrklctjcxxc8">
+      <w:hyperlink w:history="1" r:id="rIdak3citgqu35ug0ob3oo56">
         <w:r>
           <w:rPr>
             <w:rStyle w:val="Hyperlink"/>
@@ -15884,7 +15884,7 @@
         </w:rPr>
         <w:t xml:space="preserve">Onde deveria estar publicado. </w:t>
       </w:r>
-      <w:hyperlink w:history="1" r:id="rId4p5w1si4ayvjo_g8srwzm">
+      <w:hyperlink w:history="1" r:id="rIdqggpyrq0uorgqm8o9s3rw">
         <w:r>
           <w:rPr>
             <w:rStyle w:val="Hyperlink"/>
@@ -15904,7 +15904,7 @@
         </w:rPr>
         <w:t xml:space="preserve">; </w:t>
       </w:r>
-      <w:hyperlink w:history="1" r:id="rId2ugh9rs2chtaoq8gfqjbg">
+      <w:hyperlink w:history="1" r:id="rId1voprk3h1ueogy_klbkf0">
         <w:r>
           <w:rPr>
             <w:rStyle w:val="Hyperlink"/>
@@ -16121,7 +16121,7 @@
         </w:rPr>
         <w:t xml:space="preserve">Quadro de Detalhamento de Despesas 2026, anexos da Lei Orçamentária 11.590/2026, ação 3650.0824401082.591 — </w:t>
       </w:r>
-      <w:hyperlink w:history="1" r:id="rId3uxywqpc6tkbeojiychs3">
+      <w:hyperlink w:history="1" r:id="rIdiox2xzs60jm2dq6un0ftr">
         <w:r>
           <w:rPr>
             <w:rStyle w:val="Hyperlink"/>
@@ -16158,7 +16158,7 @@
         </w:rPr>
         <w:t xml:space="preserve">Onde deveria estar publicado. </w:t>
       </w:r>
-      <w:hyperlink w:history="1" r:id="rIdb293f9p-ghebyas-6wy6l">
+      <w:hyperlink w:history="1" r:id="rIdjrtcf73frmemgl2mg1yfq">
         <w:r>
           <w:rPr>
             <w:rStyle w:val="Hyperlink"/>
@@ -16392,7 +16392,7 @@
         </w:rPr>
         <w:t xml:space="preserve">Lei Orçamentária Anual 11.590/2026, anexos, Diário Oficial do Município, Edição 8697, de 09/01/2026, Edição Extra — </w:t>
       </w:r>
-      <w:hyperlink w:history="1" r:id="rIdeaw-vc5fc-lpagrtydjdu">
+      <w:hyperlink w:history="1" r:id="rIdt-tkg5_lbx8sutv7lqj_e">
         <w:r>
           <w:rPr>
             <w:rStyle w:val="Hyperlink"/>
@@ -16429,7 +16429,7 @@
         </w:rPr>
         <w:t xml:space="preserve">Onde deveria estar publicado. </w:t>
       </w:r>
-      <w:hyperlink w:history="1" r:id="rIdekxdrjq8nvlwsnlexcfyc">
+      <w:hyperlink w:history="1" r:id="rIdh82mvvkstsvofw2mg29_w">
         <w:r>
           <w:rPr>
             <w:rStyle w:val="Hyperlink"/>
@@ -16658,7 +16658,7 @@
         </w:rPr>
         <w:t xml:space="preserve">Lei Orçamentária Anual 11.590/2026, anexos, Diário Oficial do Município, Edição 8697, de 09/01/2026, Edição Extra — </w:t>
       </w:r>
-      <w:hyperlink w:history="1" r:id="rIdsrmhj6uzl1mdkf3wox-ak">
+      <w:hyperlink w:history="1" r:id="rId4vgjtotzzuzdoh4fonunc">
         <w:r>
           <w:rPr>
             <w:rStyle w:val="Hyperlink"/>
@@ -16695,7 +16695,7 @@
         </w:rPr>
         <w:t xml:space="preserve">Onde deveria estar publicado. </w:t>
       </w:r>
-      <w:hyperlink w:history="1" r:id="rIddnjc9zwibq2rvac9fcmht">
+      <w:hyperlink w:history="1" r:id="rIdtxctst7hpns85j-sbcnbp">
         <w:r>
           <w:rPr>
             <w:rStyle w:val="Hyperlink"/>
@@ -16918,7 +16918,7 @@
         </w:rPr>
         <w:t xml:space="preserve">Lei Orçamentária Anual 11.590/2026, anexos, Diário Oficial do Município, Edição 8697, de 09/01/2026, Edição Extra — </w:t>
       </w:r>
-      <w:hyperlink w:history="1" r:id="rIdhkxj0hwxbdqu7wbuenu_o">
+      <w:hyperlink w:history="1" r:id="rIdxkwneu_6pg_sj0ckfrqt2">
         <w:r>
           <w:rPr>
             <w:rStyle w:val="Hyperlink"/>
@@ -16946,7 +16946,7 @@
         </w:rPr>
         <w:t xml:space="preserve">Lei municipal 9.009/2010 — </w:t>
       </w:r>
-      <w:hyperlink w:history="1" r:id="rIdsehmhd-o79okak_giwtkb">
+      <w:hyperlink w:history="1" r:id="rId-6c4ekwjwjmrlcib4ls0j">
         <w:r>
           <w:rPr>
             <w:rStyle w:val="Hyperlink"/>
@@ -16983,7 +16983,7 @@
         </w:rPr>
         <w:t xml:space="preserve">Onde deveria estar publicado. </w:t>
       </w:r>
-      <w:hyperlink w:history="1" r:id="rIdgymdx6w7qqqwgh3h1s1is">
+      <w:hyperlink w:history="1" r:id="rIdq6ry9fe-a4u2mw3oqrz2w">
         <w:r>
           <w:rPr>
             <w:rStyle w:val="Hyperlink"/>
@@ -17212,7 +17212,7 @@
         </w:rPr>
         <w:t xml:space="preserve">Lei Orçamentária Anual 11.590/2026, anexos, Diário Oficial do Município, Edição 8697, de 09/01/2026, Edição Extra — </w:t>
       </w:r>
-      <w:hyperlink w:history="1" r:id="rIda65t3ebzibuax1bhrkamn">
+      <w:hyperlink w:history="1" r:id="rIdrfwewgpwuramzko7hxfg6">
         <w:r>
           <w:rPr>
             <w:rStyle w:val="Hyperlink"/>
@@ -17249,7 +17249,7 @@
         </w:rPr>
         <w:t xml:space="preserve">Onde deveria estar publicado. </w:t>
       </w:r>
-      <w:hyperlink w:history="1" r:id="rIdx5pejimfvp5aaag4bvewe">
+      <w:hyperlink w:history="1" r:id="rIdpff0pg-uds2ebwzmxopu5">
         <w:r>
           <w:rPr>
             <w:rStyle w:val="Hyperlink"/>
@@ -17493,7 +17493,7 @@
         </w:rPr>
         <w:t xml:space="preserve">Acervo do Diário Oficial coletado, 161 eventos entre 2025 e 2026, com digest de cada edição — </w:t>
       </w:r>
-      <w:hyperlink w:history="1" r:id="rIdgza_dbscqa44xqch-jim7">
+      <w:hyperlink w:history="1" r:id="rId0dabuhiofngpyothsyprs">
         <w:r>
           <w:rPr>
             <w:rStyle w:val="Hyperlink"/>
@@ -17530,7 +17530,7 @@
         </w:rPr>
         <w:t xml:space="preserve">Onde deveria estar publicado. </w:t>
       </w:r>
-      <w:hyperlink w:history="1" r:id="rId_g2ddhzycjee11yp2lzbo">
+      <w:hyperlink w:history="1" r:id="rIdvzxphvfwuikpwlfnislqj">
         <w:r>
           <w:rPr>
             <w:rStyle w:val="Hyperlink"/>
@@ -17757,7 +17757,7 @@
         </w:rPr>
         <w:t xml:space="preserve">Acervo do Diário Oficial coletado, 161 eventos entre 2025 e 2026, com digest de cada edição — </w:t>
       </w:r>
-      <w:hyperlink w:history="1" r:id="rId1vpanxo2q1u4nt4io3jkb">
+      <w:hyperlink w:history="1" r:id="rId07m9qtzwcxx3gmgsb9_f0">
         <w:r>
           <w:rPr>
             <w:rStyle w:val="Hyperlink"/>
@@ -17794,7 +17794,7 @@
         </w:rPr>
         <w:t xml:space="preserve">Onde deveria estar publicado. </w:t>
       </w:r>
-      <w:hyperlink w:history="1" r:id="rIds2vvg_xnksh8itkbngw-m">
+      <w:hyperlink w:history="1" r:id="rId6m-bjqjrbiqn4of0gjsdg">
         <w:r>
           <w:rPr>
             <w:rStyle w:val="Hyperlink"/>
@@ -17814,7 +17814,7 @@
         </w:rPr>
         <w:t xml:space="preserve">; </w:t>
       </w:r>
-      <w:hyperlink w:history="1" r:id="rIdo-heq3-ovlh7aca-1tzzv">
+      <w:hyperlink w:history="1" r:id="rIdidrcu-rmhu9w3gblyb2u6">
         <w:r>
           <w:rPr>
             <w:rStyle w:val="Hyperlink"/>
@@ -18043,7 +18043,7 @@
         </w:rPr>
         <w:t xml:space="preserve">Lei municipal 7.531/1995 — </w:t>
       </w:r>
-      <w:hyperlink w:history="1" r:id="rIdo7rsswnirsq7per_fxnjy">
+      <w:hyperlink w:history="1" r:id="rIdytsyooholswzgniepvizf">
         <w:r>
           <w:rPr>
             <w:rStyle w:val="Hyperlink"/>
@@ -18080,7 +18080,7 @@
         </w:rPr>
         <w:t xml:space="preserve">Onde deveria estar publicado. </w:t>
       </w:r>
-      <w:hyperlink w:history="1" r:id="rIdkmrk-lldvq8vc09kki9hm">
+      <w:hyperlink w:history="1" r:id="rIdyjihkid_lgpmddwpxtk5u">
         <w:r>
           <w:rPr>
             <w:rStyle w:val="Hyperlink"/>
@@ -18100,7 +18100,7 @@
         </w:rPr>
         <w:t xml:space="preserve">; </w:t>
       </w:r>
-      <w:hyperlink w:history="1" r:id="rIdg1j1t7lbzpeeritlbqzyw">
+      <w:hyperlink w:history="1" r:id="rId1b67cim-zpl_54igk-vy9">
         <w:r>
           <w:rPr>
             <w:rStyle w:val="Hyperlink"/>
@@ -18321,7 +18321,7 @@
         </w:rPr>
         <w:t xml:space="preserve">Acervo do Diário Oficial coletado, 161 eventos entre 2025 e 2026, com digest de cada edição — </w:t>
       </w:r>
-      <w:hyperlink w:history="1" r:id="rIdikv6nzmh7oi2pxbfmatqe">
+      <w:hyperlink w:history="1" r:id="rIdbaaxbzes8zdlyrlcjd_oy">
         <w:r>
           <w:rPr>
             <w:rStyle w:val="Hyperlink"/>
@@ -18358,7 +18358,7 @@
         </w:rPr>
         <w:t xml:space="preserve">Onde deveria estar publicado. </w:t>
       </w:r>
-      <w:hyperlink w:history="1" r:id="rIduhspuxhutwu9vbrzyyq_r">
+      <w:hyperlink w:history="1" r:id="rIdztnecb6wqpooq2udoel6w">
         <w:r>
           <w:rPr>
             <w:rStyle w:val="Hyperlink"/>
@@ -18579,7 +18579,7 @@
         </w:rPr>
         <w:t xml:space="preserve">Acervo do Diário Oficial coletado, 161 eventos entre 2025 e 2026, com digest de cada edição — </w:t>
       </w:r>
-      <w:hyperlink w:history="1" r:id="rIda8fngmqk5mzwldghbioud">
+      <w:hyperlink w:history="1" r:id="rIdbn4isziy9be7h7sdxhl3o">
         <w:r>
           <w:rPr>
             <w:rStyle w:val="Hyperlink"/>
@@ -18616,7 +18616,7 @@
         </w:rPr>
         <w:t xml:space="preserve">Onde deveria estar publicado. </w:t>
       </w:r>
-      <w:hyperlink w:history="1" r:id="rIdn_litjxdk6s2yzp782qax">
+      <w:hyperlink w:history="1" r:id="rIdi1f0dg5xx_m2zxyz456lq">
         <w:r>
           <w:rPr>
             <w:rStyle w:val="Hyperlink"/>
@@ -18856,7 +18856,7 @@
         </w:rPr>
         <w:t xml:space="preserve">Acervo do Diário Oficial coletado, 161 eventos entre 2025 e 2026, com digest de cada edição — </w:t>
       </w:r>
-      <w:hyperlink w:history="1" r:id="rIdxjkvrphdrhevyj6obdvii">
+      <w:hyperlink w:history="1" r:id="rIdk4tt1zw1jako1_3qvr4hq">
         <w:r>
           <w:rPr>
             <w:rStyle w:val="Hyperlink"/>
@@ -18893,7 +18893,7 @@
         </w:rPr>
         <w:t xml:space="preserve">Onde deveria estar publicado. </w:t>
       </w:r>
-      <w:hyperlink w:history="1" r:id="rIderdz-x8mimtatgnj42qtb">
+      <w:hyperlink w:history="1" r:id="rIdzqhkn1ykhkiuqk0inmsah">
         <w:r>
           <w:rPr>
             <w:rStyle w:val="Hyperlink"/>
@@ -19114,7 +19114,7 @@
         </w:rPr>
         <w:t xml:space="preserve">Acervo do Diário Oficial coletado, 161 eventos entre 2025 e 2026, com digest de cada edição — </w:t>
       </w:r>
-      <w:hyperlink w:history="1" r:id="rIdvqeh4xh_jrrzkp3furjcl">
+      <w:hyperlink w:history="1" r:id="rIdje9asfq3u9tiknp4mel6i">
         <w:r>
           <w:rPr>
             <w:rStyle w:val="Hyperlink"/>
@@ -19151,7 +19151,7 @@
         </w:rPr>
         <w:t xml:space="preserve">Onde deveria estar publicado. </w:t>
       </w:r>
-      <w:hyperlink w:history="1" r:id="rIdoln9efloosi3pl_wo52tq">
+      <w:hyperlink w:history="1" r:id="rIdpfk7bhzbmeoofssgosfct">
         <w:r>
           <w:rPr>
             <w:rStyle w:val="Hyperlink"/>
@@ -19390,7 +19390,7 @@
         </w:rPr>
         <w:t xml:space="preserve">Quadro de Detalhamento de Despesas 2026, anexos da Lei Orçamentária 11.590/2026, ação 3650.0824401082.591 — </w:t>
       </w:r>
-      <w:hyperlink w:history="1" r:id="rIdhy0qavnz48-k2j06oq1t3">
+      <w:hyperlink w:history="1" r:id="rIdwojeltveqysbdpxnvgddm">
         <w:r>
           <w:rPr>
             <w:rStyle w:val="Hyperlink"/>
@@ -19427,7 +19427,7 @@
         </w:rPr>
         <w:t xml:space="preserve">Onde deveria estar publicado. </w:t>
       </w:r>
-      <w:hyperlink w:history="1" r:id="rIdnd0b9m-fbnb3tjymasesm">
+      <w:hyperlink w:history="1" r:id="rIda-w0vtdregnbj7shkymwj">
         <w:r>
           <w:rPr>
             <w:rStyle w:val="Hyperlink"/>
@@ -19644,7 +19644,7 @@
         </w:rPr>
         <w:t xml:space="preserve">Lei de Diretrizes Orçamentárias 11.589/2026, Anexo III, Metas e Prioridades, setor de políticas para mulher, direitos humanos e assistência social — </w:t>
       </w:r>
-      <w:hyperlink w:history="1" r:id="rIdvmjwtc5ejrdfqdibhmd3v">
+      <w:hyperlink w:history="1" r:id="rIdswoevcymthnngtehfcwnl">
         <w:r>
           <w:rPr>
             <w:rStyle w:val="Hyperlink"/>
@@ -19681,7 +19681,7 @@
         </w:rPr>
         <w:t xml:space="preserve">Onde deveria estar publicado. </w:t>
       </w:r>
-      <w:hyperlink w:history="1" r:id="rIdf5r8fb-xngqgge1zl4ihq">
+      <w:hyperlink w:history="1" r:id="rIdpsycd1ijjmermmhhp73gp">
         <w:r>
           <w:rPr>
             <w:rStyle w:val="Hyperlink"/>
@@ -19915,7 +19915,7 @@
         </w:rPr>
         <w:t xml:space="preserve">Lei Orçamentária Anual 11.590/2026, anexos, Diário Oficial do Município, Edição 8697, de 09/01/2026, Edição Extra — </w:t>
       </w:r>
-      <w:hyperlink w:history="1" r:id="rIdgjrlkir8xg-tbqry8z1xu">
+      <w:hyperlink w:history="1" r:id="rIdpmpzshvnppserizq95til">
         <w:r>
           <w:rPr>
             <w:rStyle w:val="Hyperlink"/>
@@ -19943,7 +19943,7 @@
         </w:rPr>
         <w:t xml:space="preserve">Acervo do Diário Oficial coletado, 161 eventos entre 2025 e 2026, com digest de cada edição — </w:t>
       </w:r>
-      <w:hyperlink w:history="1" r:id="rIdfn1nci2rh46d0wynbm7mt">
+      <w:hyperlink w:history="1" r:id="rIdjrl8ormbaevo0xxggsl2y">
         <w:r>
           <w:rPr>
             <w:rStyle w:val="Hyperlink"/>
@@ -19980,7 +19980,7 @@
         </w:rPr>
         <w:t xml:space="preserve">Onde deveria estar publicado. </w:t>
       </w:r>
-      <w:hyperlink w:history="1" r:id="rIdlstb0akeefd032vuxxsvg">
+      <w:hyperlink w:history="1" r:id="rIdabgxzcknorw3ptpsu-3w7">
         <w:r>
           <w:rPr>
             <w:rStyle w:val="Hyperlink"/>
@@ -20224,7 +20224,7 @@
         </w:rPr>
         <w:t xml:space="preserve">Acervo do Diário Oficial coletado, 161 eventos entre 2025 e 2026, com digest de cada edição — </w:t>
       </w:r>
-      <w:hyperlink w:history="1" r:id="rIdho9cptwwkqhnd2fh5su3o">
+      <w:hyperlink w:history="1" r:id="rIdq8y4zfbhfnrft2r2mf87r">
         <w:r>
           <w:rPr>
             <w:rStyle w:val="Hyperlink"/>
@@ -20261,7 +20261,7 @@
         </w:rPr>
         <w:t xml:space="preserve">Onde deveria estar publicado. </w:t>
       </w:r>
-      <w:hyperlink w:history="1" r:id="rIdtuqgbzmhxlvgud4kyt8xa">
+      <w:hyperlink w:history="1" r:id="rIdk3jm3qlexpu9z3wjud25y">
         <w:r>
           <w:rPr>
             <w:rStyle w:val="Hyperlink"/>
@@ -20499,7 +20499,7 @@
         </w:rPr>
         <w:t xml:space="preserve">Acervo do Diário Oficial coletado, 161 eventos entre 2025 e 2026, com digest de cada edição — </w:t>
       </w:r>
-      <w:hyperlink w:history="1" r:id="rIdqry_kzhgu7vav6slgjps5">
+      <w:hyperlink w:history="1" r:id="rIdo1fhg0oroiny9n3wkpxax">
         <w:r>
           <w:rPr>
             <w:rStyle w:val="Hyperlink"/>
@@ -20536,7 +20536,7 @@
         </w:rPr>
         <w:t xml:space="preserve">Onde deveria estar publicado. </w:t>
       </w:r>
-      <w:hyperlink w:history="1" r:id="rIddxzkeeuz8f2hqct_4fpwm">
+      <w:hyperlink w:history="1" r:id="rIdl41up3-lfdfnfn53yfhkq">
         <w:r>
           <w:rPr>
             <w:rStyle w:val="Hyperlink"/>
@@ -20737,7 +20737,7 @@
         </w:rPr>
         <w:t xml:space="preserve"> Canal: </w:t>
       </w:r>
-      <w:hyperlink w:history="1" r:id="rIdqstt_de6o9fix0vx8bcik">
+      <w:hyperlink w:history="1" r:id="rIdiq6oo67xwq6btf5vmq02s">
         <w:r>
           <w:rPr>
             <w:rStyle w:val="Hyperlink"/>
@@ -20803,7 +20803,7 @@
         </w:rPr>
         <w:t xml:space="preserve"> Canal: </w:t>
       </w:r>
-      <w:hyperlink w:history="1" r:id="rIdncmcqax0uryngodqkagln">
+      <w:hyperlink w:history="1" r:id="rIdzjqxigauzrp_y-mseyrpq">
         <w:r>
           <w:rPr>
             <w:rStyle w:val="Hyperlink"/>
@@ -20907,7 +20907,7 @@
         </w:rPr>
         <w:t xml:space="preserve"> Canal: </w:t>
       </w:r>
-      <w:hyperlink w:history="1" r:id="rIdpgoc_a9n-82tsk0hub2jl">
+      <w:hyperlink w:history="1" r:id="rId3iacuyicbk9aeusst6dwp">
         <w:r>
           <w:rPr>
             <w:rStyle w:val="Hyperlink"/>

</xml_diff>